<commit_message>
docs(user-guide): rebuild role manuals for 2.0.1
Only the version on the cover and in the page header changes.

Co-Authored-By: Claude Opus 5.5 <noreply@anthropic.com>
</commit_message>
<xml_diff>
--- a/discoverer-neo/docs/user-guide/manual/Discoverer-Neo-ADMIN-Guide-Full-en.docx
+++ b/discoverer-neo/docs/user-guide/manual/Discoverer-Neo-ADMIN-Guide-Full-en.docx
@@ -54,7 +54,7 @@
           <w:sz w:val="22"/>
           <w:szCs w:val="22"/>
         </w:rPr>
-        <w:t>Version 2.0.0</w:t>
+        <w:t>Version 2.0.1</w:t>
       </w:r>
     </w:p>
     <w:p>
@@ -74,7 +74,7 @@
     <w:sdt>
       <w:sdtPr>
         <w:alias w:val="Contents"/>
-        <w:id w:val="2009168612"/>
+        <w:id w:val="-886726541"/>
       </w:sdtPr>
       <w:sdtEndPr/>
       <w:sdtContent>
@@ -102,7 +102,7 @@
           <w:r>
             <w:fldChar w:fldCharType="separate"/>
           </w:r>
-          <w:hyperlink w:anchor="_Toc241667923" w:history="1">
+          <w:hyperlink w:anchor="_Toc241670454" w:history="1">
             <w:r>
               <w:rPr>
                 <w:rStyle w:val="Hiperligao"/>
@@ -126,7 +126,7 @@
               <w:rPr>
                 <w:noProof/>
               </w:rPr>
-              <w:instrText xml:space="preserve"> PAGEREF _Toc241667923 \h </w:instrText>
+              <w:instrText xml:space="preserve"> PAGEREF _Toc241670454 \h </w:instrText>
             </w:r>
             <w:r>
               <w:rPr>
@@ -168,7 +168,7 @@
               <w14:ligatures w14:val="standardContextual"/>
             </w:rPr>
           </w:pPr>
-          <w:hyperlink w:anchor="_Toc241667924" w:history="1">
+          <w:hyperlink w:anchor="_Toc241670455" w:history="1">
             <w:r>
               <w:rPr>
                 <w:rStyle w:val="Hiperligao"/>
@@ -192,7 +192,7 @@
               <w:rPr>
                 <w:noProof/>
               </w:rPr>
-              <w:instrText xml:space="preserve"> PAGEREF _Toc241667924 \h </w:instrText>
+              <w:instrText xml:space="preserve"> PAGEREF _Toc241670455 \h </w:instrText>
             </w:r>
             <w:r>
               <w:rPr>
@@ -234,7 +234,7 @@
               <w14:ligatures w14:val="standardContextual"/>
             </w:rPr>
           </w:pPr>
-          <w:hyperlink w:anchor="_Toc241667925" w:history="1">
+          <w:hyperlink w:anchor="_Toc241670456" w:history="1">
             <w:r>
               <w:rPr>
                 <w:rStyle w:val="Hiperligao"/>
@@ -258,7 +258,7 @@
               <w:rPr>
                 <w:noProof/>
               </w:rPr>
-              <w:instrText xml:space="preserve"> PAGEREF _Toc241667925 \h </w:instrText>
+              <w:instrText xml:space="preserve"> PAGEREF _Toc241670456 \h </w:instrText>
             </w:r>
             <w:r>
               <w:rPr>
@@ -300,7 +300,7 @@
               <w14:ligatures w14:val="standardContextual"/>
             </w:rPr>
           </w:pPr>
-          <w:hyperlink w:anchor="_Toc241667926" w:history="1">
+          <w:hyperlink w:anchor="_Toc241670457" w:history="1">
             <w:r>
               <w:rPr>
                 <w:rStyle w:val="Hiperligao"/>
@@ -324,7 +324,7 @@
               <w:rPr>
                 <w:noProof/>
               </w:rPr>
-              <w:instrText xml:space="preserve"> PAGEREF _Toc241667926 \h </w:instrText>
+              <w:instrText xml:space="preserve"> PAGEREF _Toc241670457 \h </w:instrText>
             </w:r>
             <w:r>
               <w:rPr>
@@ -366,7 +366,7 @@
               <w14:ligatures w14:val="standardContextual"/>
             </w:rPr>
           </w:pPr>
-          <w:hyperlink w:anchor="_Toc241667927" w:history="1">
+          <w:hyperlink w:anchor="_Toc241670458" w:history="1">
             <w:r>
               <w:rPr>
                 <w:rStyle w:val="Hiperligao"/>
@@ -390,7 +390,7 @@
               <w:rPr>
                 <w:noProof/>
               </w:rPr>
-              <w:instrText xml:space="preserve"> PAGEREF _Toc241667927 \h </w:instrText>
+              <w:instrText xml:space="preserve"> PAGEREF _Toc241670458 \h </w:instrText>
             </w:r>
             <w:r>
               <w:rPr>
@@ -432,7 +432,7 @@
               <w14:ligatures w14:val="standardContextual"/>
             </w:rPr>
           </w:pPr>
-          <w:hyperlink w:anchor="_Toc241667928" w:history="1">
+          <w:hyperlink w:anchor="_Toc241670459" w:history="1">
             <w:r>
               <w:rPr>
                 <w:rStyle w:val="Hiperligao"/>
@@ -456,7 +456,7 @@
               <w:rPr>
                 <w:noProof/>
               </w:rPr>
-              <w:instrText xml:space="preserve"> PAGEREF _Toc241667928 \h </w:instrText>
+              <w:instrText xml:space="preserve"> PAGEREF _Toc241670459 \h </w:instrText>
             </w:r>
             <w:r>
               <w:rPr>
@@ -498,7 +498,7 @@
               <w14:ligatures w14:val="standardContextual"/>
             </w:rPr>
           </w:pPr>
-          <w:hyperlink w:anchor="_Toc241667929" w:history="1">
+          <w:hyperlink w:anchor="_Toc241670460" w:history="1">
             <w:r>
               <w:rPr>
                 <w:rStyle w:val="Hiperligao"/>
@@ -522,7 +522,7 @@
               <w:rPr>
                 <w:noProof/>
               </w:rPr>
-              <w:instrText xml:space="preserve"> PAGEREF _Toc241667929 \h </w:instrText>
+              <w:instrText xml:space="preserve"> PAGEREF _Toc241670460 \h </w:instrText>
             </w:r>
             <w:r>
               <w:rPr>
@@ -564,7 +564,7 @@
               <w14:ligatures w14:val="standardContextual"/>
             </w:rPr>
           </w:pPr>
-          <w:hyperlink w:anchor="_Toc241667930" w:history="1">
+          <w:hyperlink w:anchor="_Toc241670461" w:history="1">
             <w:r>
               <w:rPr>
                 <w:rStyle w:val="Hiperligao"/>
@@ -588,7 +588,7 @@
               <w:rPr>
                 <w:noProof/>
               </w:rPr>
-              <w:instrText xml:space="preserve"> PAGEREF _Toc241667930 \h </w:instrText>
+              <w:instrText xml:space="preserve"> PAGEREF _Toc241670461 \h </w:instrText>
             </w:r>
             <w:r>
               <w:rPr>
@@ -630,7 +630,7 @@
               <w14:ligatures w14:val="standardContextual"/>
             </w:rPr>
           </w:pPr>
-          <w:hyperlink w:anchor="_Toc241667931" w:history="1">
+          <w:hyperlink w:anchor="_Toc241670462" w:history="1">
             <w:r>
               <w:rPr>
                 <w:rStyle w:val="Hiperligao"/>
@@ -654,7 +654,7 @@
               <w:rPr>
                 <w:noProof/>
               </w:rPr>
-              <w:instrText xml:space="preserve"> PAGEREF _Toc241667931 \h </w:instrText>
+              <w:instrText xml:space="preserve"> PAGEREF _Toc241670462 \h </w:instrText>
             </w:r>
             <w:r>
               <w:rPr>
@@ -696,7 +696,7 @@
               <w14:ligatures w14:val="standardContextual"/>
             </w:rPr>
           </w:pPr>
-          <w:hyperlink w:anchor="_Toc241667932" w:history="1">
+          <w:hyperlink w:anchor="_Toc241670463" w:history="1">
             <w:r>
               <w:rPr>
                 <w:rStyle w:val="Hiperligao"/>
@@ -720,7 +720,7 @@
               <w:rPr>
                 <w:noProof/>
               </w:rPr>
-              <w:instrText xml:space="preserve"> PAGEREF _Toc241667932 \h </w:instrText>
+              <w:instrText xml:space="preserve"> PAGEREF _Toc241670463 \h </w:instrText>
             </w:r>
             <w:r>
               <w:rPr>
@@ -762,7 +762,7 @@
               <w14:ligatures w14:val="standardContextual"/>
             </w:rPr>
           </w:pPr>
-          <w:hyperlink w:anchor="_Toc241667933" w:history="1">
+          <w:hyperlink w:anchor="_Toc241670464" w:history="1">
             <w:r>
               <w:rPr>
                 <w:rStyle w:val="Hiperligao"/>
@@ -786,7 +786,7 @@
               <w:rPr>
                 <w:noProof/>
               </w:rPr>
-              <w:instrText xml:space="preserve"> PAGEREF _Toc241667933 \h </w:instrText>
+              <w:instrText xml:space="preserve"> PAGEREF _Toc241670464 \h </w:instrText>
             </w:r>
             <w:r>
               <w:rPr>
@@ -828,7 +828,7 @@
               <w14:ligatures w14:val="standardContextual"/>
             </w:rPr>
           </w:pPr>
-          <w:hyperlink w:anchor="_Toc241667934" w:history="1">
+          <w:hyperlink w:anchor="_Toc241670465" w:history="1">
             <w:r>
               <w:rPr>
                 <w:rStyle w:val="Hiperligao"/>
@@ -852,7 +852,7 @@
               <w:rPr>
                 <w:noProof/>
               </w:rPr>
-              <w:instrText xml:space="preserve"> PAGEREF _Toc241667934 \h </w:instrText>
+              <w:instrText xml:space="preserve"> PAGEREF _Toc241670465 \h </w:instrText>
             </w:r>
             <w:r>
               <w:rPr>
@@ -894,7 +894,7 @@
               <w14:ligatures w14:val="standardContextual"/>
             </w:rPr>
           </w:pPr>
-          <w:hyperlink w:anchor="_Toc241667935" w:history="1">
+          <w:hyperlink w:anchor="_Toc241670466" w:history="1">
             <w:r>
               <w:rPr>
                 <w:rStyle w:val="Hiperligao"/>
@@ -918,7 +918,7 @@
               <w:rPr>
                 <w:noProof/>
               </w:rPr>
-              <w:instrText xml:space="preserve"> PAGEREF _Toc241667935 \h </w:instrText>
+              <w:instrText xml:space="preserve"> PAGEREF _Toc241670466 \h </w:instrText>
             </w:r>
             <w:r>
               <w:rPr>
@@ -960,7 +960,7 @@
               <w14:ligatures w14:val="standardContextual"/>
             </w:rPr>
           </w:pPr>
-          <w:hyperlink w:anchor="_Toc241667936" w:history="1">
+          <w:hyperlink w:anchor="_Toc241670467" w:history="1">
             <w:r>
               <w:rPr>
                 <w:rStyle w:val="Hiperligao"/>
@@ -984,7 +984,7 @@
               <w:rPr>
                 <w:noProof/>
               </w:rPr>
-              <w:instrText xml:space="preserve"> PAGEREF _Toc241667936 \h </w:instrText>
+              <w:instrText xml:space="preserve"> PAGEREF _Toc241670467 \h </w:instrText>
             </w:r>
             <w:r>
               <w:rPr>
@@ -1026,7 +1026,7 @@
               <w14:ligatures w14:val="standardContextual"/>
             </w:rPr>
           </w:pPr>
-          <w:hyperlink w:anchor="_Toc241667937" w:history="1">
+          <w:hyperlink w:anchor="_Toc241670468" w:history="1">
             <w:r>
               <w:rPr>
                 <w:rStyle w:val="Hiperligao"/>
@@ -1050,7 +1050,7 @@
               <w:rPr>
                 <w:noProof/>
               </w:rPr>
-              <w:instrText xml:space="preserve"> PAGEREF _Toc241667937 \h </w:instrText>
+              <w:instrText xml:space="preserve"> PAGEREF _Toc241670468 \h </w:instrText>
             </w:r>
             <w:r>
               <w:rPr>
@@ -1092,7 +1092,7 @@
               <w14:ligatures w14:val="standardContextual"/>
             </w:rPr>
           </w:pPr>
-          <w:hyperlink w:anchor="_Toc241667938" w:history="1">
+          <w:hyperlink w:anchor="_Toc241670469" w:history="1">
             <w:r>
               <w:rPr>
                 <w:rStyle w:val="Hiperligao"/>
@@ -1116,7 +1116,7 @@
               <w:rPr>
                 <w:noProof/>
               </w:rPr>
-              <w:instrText xml:space="preserve"> PAGEREF _Toc241667938 \h </w:instrText>
+              <w:instrText xml:space="preserve"> PAGEREF _Toc241670469 \h </w:instrText>
             </w:r>
             <w:r>
               <w:rPr>
@@ -1158,7 +1158,7 @@
               <w14:ligatures w14:val="standardContextual"/>
             </w:rPr>
           </w:pPr>
-          <w:hyperlink w:anchor="_Toc241667939" w:history="1">
+          <w:hyperlink w:anchor="_Toc241670470" w:history="1">
             <w:r>
               <w:rPr>
                 <w:rStyle w:val="Hiperligao"/>
@@ -1182,7 +1182,7 @@
               <w:rPr>
                 <w:noProof/>
               </w:rPr>
-              <w:instrText xml:space="preserve"> PAGEREF _Toc241667939 \h </w:instrText>
+              <w:instrText xml:space="preserve"> PAGEREF _Toc241670470 \h </w:instrText>
             </w:r>
             <w:r>
               <w:rPr>
@@ -1224,7 +1224,7 @@
               <w14:ligatures w14:val="standardContextual"/>
             </w:rPr>
           </w:pPr>
-          <w:hyperlink w:anchor="_Toc241667940" w:history="1">
+          <w:hyperlink w:anchor="_Toc241670471" w:history="1">
             <w:r>
               <w:rPr>
                 <w:rStyle w:val="Hiperligao"/>
@@ -1248,7 +1248,7 @@
               <w:rPr>
                 <w:noProof/>
               </w:rPr>
-              <w:instrText xml:space="preserve"> PAGEREF _Toc241667940 \h </w:instrText>
+              <w:instrText xml:space="preserve"> PAGEREF _Toc241670471 \h </w:instrText>
             </w:r>
             <w:r>
               <w:rPr>
@@ -1290,7 +1290,7 @@
               <w14:ligatures w14:val="standardContextual"/>
             </w:rPr>
           </w:pPr>
-          <w:hyperlink w:anchor="_Toc241667941" w:history="1">
+          <w:hyperlink w:anchor="_Toc241670472" w:history="1">
             <w:r>
               <w:rPr>
                 <w:rStyle w:val="Hiperligao"/>
@@ -1314,7 +1314,7 @@
               <w:rPr>
                 <w:noProof/>
               </w:rPr>
-              <w:instrText xml:space="preserve"> PAGEREF _Toc241667941 \h </w:instrText>
+              <w:instrText xml:space="preserve"> PAGEREF _Toc241670472 \h </w:instrText>
             </w:r>
             <w:r>
               <w:rPr>
@@ -1356,7 +1356,7 @@
               <w14:ligatures w14:val="standardContextual"/>
             </w:rPr>
           </w:pPr>
-          <w:hyperlink w:anchor="_Toc241667942" w:history="1">
+          <w:hyperlink w:anchor="_Toc241670473" w:history="1">
             <w:r>
               <w:rPr>
                 <w:rStyle w:val="Hiperligao"/>
@@ -1380,7 +1380,7 @@
               <w:rPr>
                 <w:noProof/>
               </w:rPr>
-              <w:instrText xml:space="preserve"> PAGEREF _Toc241667942 \h </w:instrText>
+              <w:instrText xml:space="preserve"> PAGEREF _Toc241670473 \h </w:instrText>
             </w:r>
             <w:r>
               <w:rPr>
@@ -1422,7 +1422,7 @@
               <w14:ligatures w14:val="standardContextual"/>
             </w:rPr>
           </w:pPr>
-          <w:hyperlink w:anchor="_Toc241667943" w:history="1">
+          <w:hyperlink w:anchor="_Toc241670474" w:history="1">
             <w:r>
               <w:rPr>
                 <w:rStyle w:val="Hiperligao"/>
@@ -1446,7 +1446,7 @@
               <w:rPr>
                 <w:noProof/>
               </w:rPr>
-              <w:instrText xml:space="preserve"> PAGEREF _Toc241667943 \h </w:instrText>
+              <w:instrText xml:space="preserve"> PAGEREF _Toc241670474 \h </w:instrText>
             </w:r>
             <w:r>
               <w:rPr>
@@ -1488,7 +1488,7 @@
               <w14:ligatures w14:val="standardContextual"/>
             </w:rPr>
           </w:pPr>
-          <w:hyperlink w:anchor="_Toc241667944" w:history="1">
+          <w:hyperlink w:anchor="_Toc241670475" w:history="1">
             <w:r>
               <w:rPr>
                 <w:rStyle w:val="Hiperligao"/>
@@ -1512,7 +1512,7 @@
               <w:rPr>
                 <w:noProof/>
               </w:rPr>
-              <w:instrText xml:space="preserve"> PAGEREF _Toc241667944 \h </w:instrText>
+              <w:instrText xml:space="preserve"> PAGEREF _Toc241670475 \h </w:instrText>
             </w:r>
             <w:r>
               <w:rPr>
@@ -1554,7 +1554,7 @@
               <w14:ligatures w14:val="standardContextual"/>
             </w:rPr>
           </w:pPr>
-          <w:hyperlink w:anchor="_Toc241667945" w:history="1">
+          <w:hyperlink w:anchor="_Toc241670476" w:history="1">
             <w:r>
               <w:rPr>
                 <w:rStyle w:val="Hiperligao"/>
@@ -1578,7 +1578,7 @@
               <w:rPr>
                 <w:noProof/>
               </w:rPr>
-              <w:instrText xml:space="preserve"> PAGEREF _Toc241667945 \h </w:instrText>
+              <w:instrText xml:space="preserve"> PAGEREF _Toc241670476 \h </w:instrText>
             </w:r>
             <w:r>
               <w:rPr>
@@ -1620,7 +1620,7 @@
               <w14:ligatures w14:val="standardContextual"/>
             </w:rPr>
           </w:pPr>
-          <w:hyperlink w:anchor="_Toc241667946" w:history="1">
+          <w:hyperlink w:anchor="_Toc241670477" w:history="1">
             <w:r>
               <w:rPr>
                 <w:rStyle w:val="Hiperligao"/>
@@ -1644,7 +1644,7 @@
               <w:rPr>
                 <w:noProof/>
               </w:rPr>
-              <w:instrText xml:space="preserve"> PAGEREF _Toc241667946 \h </w:instrText>
+              <w:instrText xml:space="preserve"> PAGEREF _Toc241670477 \h </w:instrText>
             </w:r>
             <w:r>
               <w:rPr>
@@ -1686,7 +1686,7 @@
               <w14:ligatures w14:val="standardContextual"/>
             </w:rPr>
           </w:pPr>
-          <w:hyperlink w:anchor="_Toc241667947" w:history="1">
+          <w:hyperlink w:anchor="_Toc241670478" w:history="1">
             <w:r>
               <w:rPr>
                 <w:rStyle w:val="Hiperligao"/>
@@ -1710,7 +1710,7 @@
               <w:rPr>
                 <w:noProof/>
               </w:rPr>
-              <w:instrText xml:space="preserve"> PAGEREF _Toc241667947 \h </w:instrText>
+              <w:instrText xml:space="preserve"> PAGEREF _Toc241670478 \h </w:instrText>
             </w:r>
             <w:r>
               <w:rPr>
@@ -1752,7 +1752,7 @@
               <w14:ligatures w14:val="standardContextual"/>
             </w:rPr>
           </w:pPr>
-          <w:hyperlink w:anchor="_Toc241667948" w:history="1">
+          <w:hyperlink w:anchor="_Toc241670479" w:history="1">
             <w:r>
               <w:rPr>
                 <w:rStyle w:val="Hiperligao"/>
@@ -1776,7 +1776,7 @@
               <w:rPr>
                 <w:noProof/>
               </w:rPr>
-              <w:instrText xml:space="preserve"> PAGEREF _Toc241667948 \h </w:instrText>
+              <w:instrText xml:space="preserve"> PAGEREF _Toc241670479 \h </w:instrText>
             </w:r>
             <w:r>
               <w:rPr>
@@ -1818,7 +1818,7 @@
               <w14:ligatures w14:val="standardContextual"/>
             </w:rPr>
           </w:pPr>
-          <w:hyperlink w:anchor="_Toc241667949" w:history="1">
+          <w:hyperlink w:anchor="_Toc241670480" w:history="1">
             <w:r>
               <w:rPr>
                 <w:rStyle w:val="Hiperligao"/>
@@ -1842,7 +1842,7 @@
               <w:rPr>
                 <w:noProof/>
               </w:rPr>
-              <w:instrText xml:space="preserve"> PAGEREF _Toc241667949 \h </w:instrText>
+              <w:instrText xml:space="preserve"> PAGEREF _Toc241670480 \h </w:instrText>
             </w:r>
             <w:r>
               <w:rPr>
@@ -1884,7 +1884,7 @@
               <w14:ligatures w14:val="standardContextual"/>
             </w:rPr>
           </w:pPr>
-          <w:hyperlink w:anchor="_Toc241667950" w:history="1">
+          <w:hyperlink w:anchor="_Toc241670481" w:history="1">
             <w:r>
               <w:rPr>
                 <w:rStyle w:val="Hiperligao"/>
@@ -1908,7 +1908,7 @@
               <w:rPr>
                 <w:noProof/>
               </w:rPr>
-              <w:instrText xml:space="preserve"> PAGEREF _Toc241667950 \h </w:instrText>
+              <w:instrText xml:space="preserve"> PAGEREF _Toc241670481 \h </w:instrText>
             </w:r>
             <w:r>
               <w:rPr>
@@ -1950,7 +1950,7 @@
               <w14:ligatures w14:val="standardContextual"/>
             </w:rPr>
           </w:pPr>
-          <w:hyperlink w:anchor="_Toc241667951" w:history="1">
+          <w:hyperlink w:anchor="_Toc241670482" w:history="1">
             <w:r>
               <w:rPr>
                 <w:rStyle w:val="Hiperligao"/>
@@ -1974,7 +1974,7 @@
               <w:rPr>
                 <w:noProof/>
               </w:rPr>
-              <w:instrText xml:space="preserve"> PAGEREF _Toc241667951 \h </w:instrText>
+              <w:instrText xml:space="preserve"> PAGEREF _Toc241670482 \h </w:instrText>
             </w:r>
             <w:r>
               <w:rPr>
@@ -2016,7 +2016,7 @@
               <w14:ligatures w14:val="standardContextual"/>
             </w:rPr>
           </w:pPr>
-          <w:hyperlink w:anchor="_Toc241667952" w:history="1">
+          <w:hyperlink w:anchor="_Toc241670483" w:history="1">
             <w:r>
               <w:rPr>
                 <w:rStyle w:val="Hiperligao"/>
@@ -2040,7 +2040,7 @@
               <w:rPr>
                 <w:noProof/>
               </w:rPr>
-              <w:instrText xml:space="preserve"> PAGEREF _Toc241667952 \h </w:instrText>
+              <w:instrText xml:space="preserve"> PAGEREF _Toc241670483 \h </w:instrText>
             </w:r>
             <w:r>
               <w:rPr>
@@ -2082,7 +2082,7 @@
               <w14:ligatures w14:val="standardContextual"/>
             </w:rPr>
           </w:pPr>
-          <w:hyperlink w:anchor="_Toc241667953" w:history="1">
+          <w:hyperlink w:anchor="_Toc241670484" w:history="1">
             <w:r>
               <w:rPr>
                 <w:rStyle w:val="Hiperligao"/>
@@ -2106,7 +2106,7 @@
               <w:rPr>
                 <w:noProof/>
               </w:rPr>
-              <w:instrText xml:space="preserve"> PAGEREF _Toc241667953 \h </w:instrText>
+              <w:instrText xml:space="preserve"> PAGEREF _Toc241670484 \h </w:instrText>
             </w:r>
             <w:r>
               <w:rPr>
@@ -2148,7 +2148,7 @@
               <w14:ligatures w14:val="standardContextual"/>
             </w:rPr>
           </w:pPr>
-          <w:hyperlink w:anchor="_Toc241667954" w:history="1">
+          <w:hyperlink w:anchor="_Toc241670485" w:history="1">
             <w:r>
               <w:rPr>
                 <w:rStyle w:val="Hiperligao"/>
@@ -2172,7 +2172,7 @@
               <w:rPr>
                 <w:noProof/>
               </w:rPr>
-              <w:instrText xml:space="preserve"> PAGEREF _Toc241667954 \h </w:instrText>
+              <w:instrText xml:space="preserve"> PAGEREF _Toc241670485 \h </w:instrText>
             </w:r>
             <w:r>
               <w:rPr>
@@ -2214,7 +2214,7 @@
               <w14:ligatures w14:val="standardContextual"/>
             </w:rPr>
           </w:pPr>
-          <w:hyperlink w:anchor="_Toc241667955" w:history="1">
+          <w:hyperlink w:anchor="_Toc241670486" w:history="1">
             <w:r>
               <w:rPr>
                 <w:rStyle w:val="Hiperligao"/>
@@ -2238,7 +2238,7 @@
               <w:rPr>
                 <w:noProof/>
               </w:rPr>
-              <w:instrText xml:space="preserve"> PAGEREF _Toc241667955 \h </w:instrText>
+              <w:instrText xml:space="preserve"> PAGEREF _Toc241670486 \h </w:instrText>
             </w:r>
             <w:r>
               <w:rPr>
@@ -2280,7 +2280,7 @@
               <w14:ligatures w14:val="standardContextual"/>
             </w:rPr>
           </w:pPr>
-          <w:hyperlink w:anchor="_Toc241667956" w:history="1">
+          <w:hyperlink w:anchor="_Toc241670487" w:history="1">
             <w:r>
               <w:rPr>
                 <w:rStyle w:val="Hiperligao"/>
@@ -2304,7 +2304,7 @@
               <w:rPr>
                 <w:noProof/>
               </w:rPr>
-              <w:instrText xml:space="preserve"> PAGEREF _Toc241667956 \h </w:instrText>
+              <w:instrText xml:space="preserve"> PAGEREF _Toc241670487 \h </w:instrText>
             </w:r>
             <w:r>
               <w:rPr>
@@ -2346,7 +2346,7 @@
               <w14:ligatures w14:val="standardContextual"/>
             </w:rPr>
           </w:pPr>
-          <w:hyperlink w:anchor="_Toc241667957" w:history="1">
+          <w:hyperlink w:anchor="_Toc241670488" w:history="1">
             <w:r>
               <w:rPr>
                 <w:rStyle w:val="Hiperligao"/>
@@ -2370,7 +2370,7 @@
               <w:rPr>
                 <w:noProof/>
               </w:rPr>
-              <w:instrText xml:space="preserve"> PAGEREF _Toc241667957 \h </w:instrText>
+              <w:instrText xml:space="preserve"> PAGEREF _Toc241670488 \h </w:instrText>
             </w:r>
             <w:r>
               <w:rPr>
@@ -2412,7 +2412,7 @@
               <w14:ligatures w14:val="standardContextual"/>
             </w:rPr>
           </w:pPr>
-          <w:hyperlink w:anchor="_Toc241667958" w:history="1">
+          <w:hyperlink w:anchor="_Toc241670489" w:history="1">
             <w:r>
               <w:rPr>
                 <w:rStyle w:val="Hiperligao"/>
@@ -2436,7 +2436,7 @@
               <w:rPr>
                 <w:noProof/>
               </w:rPr>
-              <w:instrText xml:space="preserve"> PAGEREF _Toc241667958 \h </w:instrText>
+              <w:instrText xml:space="preserve"> PAGEREF _Toc241670489 \h </w:instrText>
             </w:r>
             <w:r>
               <w:rPr>
@@ -2478,7 +2478,7 @@
               <w14:ligatures w14:val="standardContextual"/>
             </w:rPr>
           </w:pPr>
-          <w:hyperlink w:anchor="_Toc241667959" w:history="1">
+          <w:hyperlink w:anchor="_Toc241670490" w:history="1">
             <w:r>
               <w:rPr>
                 <w:rStyle w:val="Hiperligao"/>
@@ -2502,7 +2502,7 @@
               <w:rPr>
                 <w:noProof/>
               </w:rPr>
-              <w:instrText xml:space="preserve"> PAGEREF _Toc241667959 \h </w:instrText>
+              <w:instrText xml:space="preserve"> PAGEREF _Toc241670490 \h </w:instrText>
             </w:r>
             <w:r>
               <w:rPr>
@@ -2544,7 +2544,7 @@
               <w14:ligatures w14:val="standardContextual"/>
             </w:rPr>
           </w:pPr>
-          <w:hyperlink w:anchor="_Toc241667960" w:history="1">
+          <w:hyperlink w:anchor="_Toc241670491" w:history="1">
             <w:r>
               <w:rPr>
                 <w:rStyle w:val="Hiperligao"/>
@@ -2568,7 +2568,7 @@
               <w:rPr>
                 <w:noProof/>
               </w:rPr>
-              <w:instrText xml:space="preserve"> PAGEREF _Toc241667960 \h </w:instrText>
+              <w:instrText xml:space="preserve"> PAGEREF _Toc241670491 \h </w:instrText>
             </w:r>
             <w:r>
               <w:rPr>
@@ -2610,7 +2610,7 @@
               <w14:ligatures w14:val="standardContextual"/>
             </w:rPr>
           </w:pPr>
-          <w:hyperlink w:anchor="_Toc241667961" w:history="1">
+          <w:hyperlink w:anchor="_Toc241670492" w:history="1">
             <w:r>
               <w:rPr>
                 <w:rStyle w:val="Hiperligao"/>
@@ -2634,7 +2634,7 @@
               <w:rPr>
                 <w:noProof/>
               </w:rPr>
-              <w:instrText xml:space="preserve"> PAGEREF _Toc241667961 \h </w:instrText>
+              <w:instrText xml:space="preserve"> PAGEREF _Toc241670492 \h </w:instrText>
             </w:r>
             <w:r>
               <w:rPr>
@@ -2676,7 +2676,7 @@
               <w14:ligatures w14:val="standardContextual"/>
             </w:rPr>
           </w:pPr>
-          <w:hyperlink w:anchor="_Toc241667962" w:history="1">
+          <w:hyperlink w:anchor="_Toc241670493" w:history="1">
             <w:r>
               <w:rPr>
                 <w:rStyle w:val="Hiperligao"/>
@@ -2700,7 +2700,7 @@
               <w:rPr>
                 <w:noProof/>
               </w:rPr>
-              <w:instrText xml:space="preserve"> PAGEREF _Toc241667962 \h </w:instrText>
+              <w:instrText xml:space="preserve"> PAGEREF _Toc241670493 \h </w:instrText>
             </w:r>
             <w:r>
               <w:rPr>
@@ -2742,7 +2742,7 @@
               <w14:ligatures w14:val="standardContextual"/>
             </w:rPr>
           </w:pPr>
-          <w:hyperlink w:anchor="_Toc241667963" w:history="1">
+          <w:hyperlink w:anchor="_Toc241670494" w:history="1">
             <w:r>
               <w:rPr>
                 <w:rStyle w:val="Hiperligao"/>
@@ -2766,7 +2766,7 @@
               <w:rPr>
                 <w:noProof/>
               </w:rPr>
-              <w:instrText xml:space="preserve"> PAGEREF _Toc241667963 \h </w:instrText>
+              <w:instrText xml:space="preserve"> PAGEREF _Toc241670494 \h </w:instrText>
             </w:r>
             <w:r>
               <w:rPr>
@@ -2808,7 +2808,7 @@
               <w14:ligatures w14:val="standardContextual"/>
             </w:rPr>
           </w:pPr>
-          <w:hyperlink w:anchor="_Toc241667964" w:history="1">
+          <w:hyperlink w:anchor="_Toc241670495" w:history="1">
             <w:r>
               <w:rPr>
                 <w:rStyle w:val="Hiperligao"/>
@@ -2832,7 +2832,7 @@
               <w:rPr>
                 <w:noProof/>
               </w:rPr>
-              <w:instrText xml:space="preserve"> PAGEREF _Toc241667964 \h </w:instrText>
+              <w:instrText xml:space="preserve"> PAGEREF _Toc241670495 \h </w:instrText>
             </w:r>
             <w:r>
               <w:rPr>
@@ -2874,7 +2874,7 @@
               <w14:ligatures w14:val="standardContextual"/>
             </w:rPr>
           </w:pPr>
-          <w:hyperlink w:anchor="_Toc241667965" w:history="1">
+          <w:hyperlink w:anchor="_Toc241670496" w:history="1">
             <w:r>
               <w:rPr>
                 <w:rStyle w:val="Hiperligao"/>
@@ -2898,7 +2898,7 @@
               <w:rPr>
                 <w:noProof/>
               </w:rPr>
-              <w:instrText xml:space="preserve"> PAGEREF _Toc241667965 \h </w:instrText>
+              <w:instrText xml:space="preserve"> PAGEREF _Toc241670496 \h </w:instrText>
             </w:r>
             <w:r>
               <w:rPr>
@@ -2940,7 +2940,7 @@
               <w14:ligatures w14:val="standardContextual"/>
             </w:rPr>
           </w:pPr>
-          <w:hyperlink w:anchor="_Toc241667966" w:history="1">
+          <w:hyperlink w:anchor="_Toc241670497" w:history="1">
             <w:r>
               <w:rPr>
                 <w:rStyle w:val="Hiperligao"/>
@@ -2964,7 +2964,7 @@
               <w:rPr>
                 <w:noProof/>
               </w:rPr>
-              <w:instrText xml:space="preserve"> PAGEREF _Toc241667966 \h </w:instrText>
+              <w:instrText xml:space="preserve"> PAGEREF _Toc241670497 \h </w:instrText>
             </w:r>
             <w:r>
               <w:rPr>
@@ -3006,7 +3006,7 @@
               <w14:ligatures w14:val="standardContextual"/>
             </w:rPr>
           </w:pPr>
-          <w:hyperlink w:anchor="_Toc241667967" w:history="1">
+          <w:hyperlink w:anchor="_Toc241670498" w:history="1">
             <w:r>
               <w:rPr>
                 <w:rStyle w:val="Hiperligao"/>
@@ -3030,7 +3030,7 @@
               <w:rPr>
                 <w:noProof/>
               </w:rPr>
-              <w:instrText xml:space="preserve"> PAGEREF _Toc241667967 \h </w:instrText>
+              <w:instrText xml:space="preserve"> PAGEREF _Toc241670498 \h </w:instrText>
             </w:r>
             <w:r>
               <w:rPr>
@@ -3072,7 +3072,7 @@
               <w14:ligatures w14:val="standardContextual"/>
             </w:rPr>
           </w:pPr>
-          <w:hyperlink w:anchor="_Toc241667968" w:history="1">
+          <w:hyperlink w:anchor="_Toc241670499" w:history="1">
             <w:r>
               <w:rPr>
                 <w:rStyle w:val="Hiperligao"/>
@@ -3096,7 +3096,7 @@
               <w:rPr>
                 <w:noProof/>
               </w:rPr>
-              <w:instrText xml:space="preserve"> PAGEREF _Toc241667968 \h </w:instrText>
+              <w:instrText xml:space="preserve"> PAGEREF _Toc241670499 \h </w:instrText>
             </w:r>
             <w:r>
               <w:rPr>
@@ -3138,7 +3138,7 @@
               <w14:ligatures w14:val="standardContextual"/>
             </w:rPr>
           </w:pPr>
-          <w:hyperlink w:anchor="_Toc241667969" w:history="1">
+          <w:hyperlink w:anchor="_Toc241670500" w:history="1">
             <w:r>
               <w:rPr>
                 <w:rStyle w:val="Hiperligao"/>
@@ -3162,7 +3162,7 @@
               <w:rPr>
                 <w:noProof/>
               </w:rPr>
-              <w:instrText xml:space="preserve"> PAGEREF _Toc241667969 \h </w:instrText>
+              <w:instrText xml:space="preserve"> PAGEREF _Toc241670500 \h </w:instrText>
             </w:r>
             <w:r>
               <w:rPr>
@@ -3204,7 +3204,7 @@
               <w14:ligatures w14:val="standardContextual"/>
             </w:rPr>
           </w:pPr>
-          <w:hyperlink w:anchor="_Toc241667970" w:history="1">
+          <w:hyperlink w:anchor="_Toc241670501" w:history="1">
             <w:r>
               <w:rPr>
                 <w:rStyle w:val="Hiperligao"/>
@@ -3228,7 +3228,7 @@
               <w:rPr>
                 <w:noProof/>
               </w:rPr>
-              <w:instrText xml:space="preserve"> PAGEREF _Toc241667970 \h </w:instrText>
+              <w:instrText xml:space="preserve"> PAGEREF _Toc241670501 \h </w:instrText>
             </w:r>
             <w:r>
               <w:rPr>
@@ -3270,7 +3270,7 @@
               <w14:ligatures w14:val="standardContextual"/>
             </w:rPr>
           </w:pPr>
-          <w:hyperlink w:anchor="_Toc241667971" w:history="1">
+          <w:hyperlink w:anchor="_Toc241670502" w:history="1">
             <w:r>
               <w:rPr>
                 <w:rStyle w:val="Hiperligao"/>
@@ -3294,7 +3294,7 @@
               <w:rPr>
                 <w:noProof/>
               </w:rPr>
-              <w:instrText xml:space="preserve"> PAGEREF _Toc241667971 \h </w:instrText>
+              <w:instrText xml:space="preserve"> PAGEREF _Toc241670502 \h </w:instrText>
             </w:r>
             <w:r>
               <w:rPr>
@@ -3336,7 +3336,7 @@
               <w14:ligatures w14:val="standardContextual"/>
             </w:rPr>
           </w:pPr>
-          <w:hyperlink w:anchor="_Toc241667972" w:history="1">
+          <w:hyperlink w:anchor="_Toc241670503" w:history="1">
             <w:r>
               <w:rPr>
                 <w:rStyle w:val="Hiperligao"/>
@@ -3360,7 +3360,7 @@
               <w:rPr>
                 <w:noProof/>
               </w:rPr>
-              <w:instrText xml:space="preserve"> PAGEREF _Toc241667972 \h </w:instrText>
+              <w:instrText xml:space="preserve"> PAGEREF _Toc241670503 \h </w:instrText>
             </w:r>
             <w:r>
               <w:rPr>
@@ -3402,7 +3402,7 @@
               <w14:ligatures w14:val="standardContextual"/>
             </w:rPr>
           </w:pPr>
-          <w:hyperlink w:anchor="_Toc241667973" w:history="1">
+          <w:hyperlink w:anchor="_Toc241670504" w:history="1">
             <w:r>
               <w:rPr>
                 <w:rStyle w:val="Hiperligao"/>
@@ -3426,7 +3426,7 @@
               <w:rPr>
                 <w:noProof/>
               </w:rPr>
-              <w:instrText xml:space="preserve"> PAGEREF _Toc241667973 \h </w:instrText>
+              <w:instrText xml:space="preserve"> PAGEREF _Toc241670504 \h </w:instrText>
             </w:r>
             <w:r>
               <w:rPr>
@@ -3468,7 +3468,7 @@
               <w14:ligatures w14:val="standardContextual"/>
             </w:rPr>
           </w:pPr>
-          <w:hyperlink w:anchor="_Toc241667974" w:history="1">
+          <w:hyperlink w:anchor="_Toc241670505" w:history="1">
             <w:r>
               <w:rPr>
                 <w:rStyle w:val="Hiperligao"/>
@@ -3492,7 +3492,7 @@
               <w:rPr>
                 <w:noProof/>
               </w:rPr>
-              <w:instrText xml:space="preserve"> PAGEREF _Toc241667974 \h </w:instrText>
+              <w:instrText xml:space="preserve"> PAGEREF _Toc241670505 \h </w:instrText>
             </w:r>
             <w:r>
               <w:rPr>
@@ -3534,7 +3534,7 @@
               <w14:ligatures w14:val="standardContextual"/>
             </w:rPr>
           </w:pPr>
-          <w:hyperlink w:anchor="_Toc241667975" w:history="1">
+          <w:hyperlink w:anchor="_Toc241670506" w:history="1">
             <w:r>
               <w:rPr>
                 <w:rStyle w:val="Hiperligao"/>
@@ -3558,7 +3558,7 @@
               <w:rPr>
                 <w:noProof/>
               </w:rPr>
-              <w:instrText xml:space="preserve"> PAGEREF _Toc241667975 \h </w:instrText>
+              <w:instrText xml:space="preserve"> PAGEREF _Toc241670506 \h </w:instrText>
             </w:r>
             <w:r>
               <w:rPr>
@@ -3600,7 +3600,7 @@
               <w14:ligatures w14:val="standardContextual"/>
             </w:rPr>
           </w:pPr>
-          <w:hyperlink w:anchor="_Toc241667976" w:history="1">
+          <w:hyperlink w:anchor="_Toc241670507" w:history="1">
             <w:r>
               <w:rPr>
                 <w:rStyle w:val="Hiperligao"/>
@@ -3624,7 +3624,7 @@
               <w:rPr>
                 <w:noProof/>
               </w:rPr>
-              <w:instrText xml:space="preserve"> PAGEREF _Toc241667976 \h </w:instrText>
+              <w:instrText xml:space="preserve"> PAGEREF _Toc241670507 \h </w:instrText>
             </w:r>
             <w:r>
               <w:rPr>
@@ -3666,7 +3666,7 @@
               <w14:ligatures w14:val="standardContextual"/>
             </w:rPr>
           </w:pPr>
-          <w:hyperlink w:anchor="_Toc241667977" w:history="1">
+          <w:hyperlink w:anchor="_Toc241670508" w:history="1">
             <w:r>
               <w:rPr>
                 <w:rStyle w:val="Hiperligao"/>
@@ -3690,7 +3690,7 @@
               <w:rPr>
                 <w:noProof/>
               </w:rPr>
-              <w:instrText xml:space="preserve"> PAGEREF _Toc241667977 \h </w:instrText>
+              <w:instrText xml:space="preserve"> PAGEREF _Toc241670508 \h </w:instrText>
             </w:r>
             <w:r>
               <w:rPr>
@@ -3732,7 +3732,7 @@
               <w14:ligatures w14:val="standardContextual"/>
             </w:rPr>
           </w:pPr>
-          <w:hyperlink w:anchor="_Toc241667978" w:history="1">
+          <w:hyperlink w:anchor="_Toc241670509" w:history="1">
             <w:r>
               <w:rPr>
                 <w:rStyle w:val="Hiperligao"/>
@@ -3756,7 +3756,7 @@
               <w:rPr>
                 <w:noProof/>
               </w:rPr>
-              <w:instrText xml:space="preserve"> PAGEREF _Toc241667978 \h </w:instrText>
+              <w:instrText xml:space="preserve"> PAGEREF _Toc241670509 \h </w:instrText>
             </w:r>
             <w:r>
               <w:rPr>
@@ -3798,7 +3798,7 @@
               <w14:ligatures w14:val="standardContextual"/>
             </w:rPr>
           </w:pPr>
-          <w:hyperlink w:anchor="_Toc241667979" w:history="1">
+          <w:hyperlink w:anchor="_Toc241670510" w:history="1">
             <w:r>
               <w:rPr>
                 <w:rStyle w:val="Hiperligao"/>
@@ -3822,7 +3822,7 @@
               <w:rPr>
                 <w:noProof/>
               </w:rPr>
-              <w:instrText xml:space="preserve"> PAGEREF _Toc241667979 \h </w:instrText>
+              <w:instrText xml:space="preserve"> PAGEREF _Toc241670510 \h </w:instrText>
             </w:r>
             <w:r>
               <w:rPr>
@@ -3864,7 +3864,7 @@
               <w14:ligatures w14:val="standardContextual"/>
             </w:rPr>
           </w:pPr>
-          <w:hyperlink w:anchor="_Toc241667980" w:history="1">
+          <w:hyperlink w:anchor="_Toc241670511" w:history="1">
             <w:r>
               <w:rPr>
                 <w:rStyle w:val="Hiperligao"/>
@@ -3888,7 +3888,7 @@
               <w:rPr>
                 <w:noProof/>
               </w:rPr>
-              <w:instrText xml:space="preserve"> PAGEREF _Toc241667980 \h </w:instrText>
+              <w:instrText xml:space="preserve"> PAGEREF _Toc241670511 \h </w:instrText>
             </w:r>
             <w:r>
               <w:rPr>
@@ -3930,7 +3930,7 @@
               <w14:ligatures w14:val="standardContextual"/>
             </w:rPr>
           </w:pPr>
-          <w:hyperlink w:anchor="_Toc241667981" w:history="1">
+          <w:hyperlink w:anchor="_Toc241670512" w:history="1">
             <w:r>
               <w:rPr>
                 <w:rStyle w:val="Hiperligao"/>
@@ -3954,7 +3954,7 @@
               <w:rPr>
                 <w:noProof/>
               </w:rPr>
-              <w:instrText xml:space="preserve"> PAGEREF _Toc241667981 \h </w:instrText>
+              <w:instrText xml:space="preserve"> PAGEREF _Toc241670512 \h </w:instrText>
             </w:r>
             <w:r>
               <w:rPr>
@@ -3996,7 +3996,7 @@
               <w14:ligatures w14:val="standardContextual"/>
             </w:rPr>
           </w:pPr>
-          <w:hyperlink w:anchor="_Toc241667982" w:history="1">
+          <w:hyperlink w:anchor="_Toc241670513" w:history="1">
             <w:r>
               <w:rPr>
                 <w:rStyle w:val="Hiperligao"/>
@@ -4020,7 +4020,7 @@
               <w:rPr>
                 <w:noProof/>
               </w:rPr>
-              <w:instrText xml:space="preserve"> PAGEREF _Toc241667982 \h </w:instrText>
+              <w:instrText xml:space="preserve"> PAGEREF _Toc241670513 \h </w:instrText>
             </w:r>
             <w:r>
               <w:rPr>
@@ -4062,7 +4062,7 @@
               <w14:ligatures w14:val="standardContextual"/>
             </w:rPr>
           </w:pPr>
-          <w:hyperlink w:anchor="_Toc241667983" w:history="1">
+          <w:hyperlink w:anchor="_Toc241670514" w:history="1">
             <w:r>
               <w:rPr>
                 <w:rStyle w:val="Hiperligao"/>
@@ -4086,7 +4086,7 @@
               <w:rPr>
                 <w:noProof/>
               </w:rPr>
-              <w:instrText xml:space="preserve"> PAGEREF _Toc241667983 \h </w:instrText>
+              <w:instrText xml:space="preserve"> PAGEREF _Toc241670514 \h </w:instrText>
             </w:r>
             <w:r>
               <w:rPr>
@@ -4128,7 +4128,7 @@
               <w14:ligatures w14:val="standardContextual"/>
             </w:rPr>
           </w:pPr>
-          <w:hyperlink w:anchor="_Toc241667984" w:history="1">
+          <w:hyperlink w:anchor="_Toc241670515" w:history="1">
             <w:r>
               <w:rPr>
                 <w:rStyle w:val="Hiperligao"/>
@@ -4152,7 +4152,7 @@
               <w:rPr>
                 <w:noProof/>
               </w:rPr>
-              <w:instrText xml:space="preserve"> PAGEREF _Toc241667984 \h </w:instrText>
+              <w:instrText xml:space="preserve"> PAGEREF _Toc241670515 \h </w:instrText>
             </w:r>
             <w:r>
               <w:rPr>
@@ -4194,7 +4194,7 @@
               <w14:ligatures w14:val="standardContextual"/>
             </w:rPr>
           </w:pPr>
-          <w:hyperlink w:anchor="_Toc241667985" w:history="1">
+          <w:hyperlink w:anchor="_Toc241670516" w:history="1">
             <w:r>
               <w:rPr>
                 <w:rStyle w:val="Hiperligao"/>
@@ -4218,7 +4218,7 @@
               <w:rPr>
                 <w:noProof/>
               </w:rPr>
-              <w:instrText xml:space="preserve"> PAGEREF _Toc241667985 \h </w:instrText>
+              <w:instrText xml:space="preserve"> PAGEREF _Toc241670516 \h </w:instrText>
             </w:r>
             <w:r>
               <w:rPr>
@@ -4266,7 +4266,7 @@
       <w:pPr>
         <w:pStyle w:val="Ttulo1"/>
       </w:pPr>
-      <w:bookmarkStart w:id="0" w:name="_Toc241667923"/>
+      <w:bookmarkStart w:id="0" w:name="_Toc241670454"/>
       <w:r>
         <w:lastRenderedPageBreak/>
         <w:t>Your role at a glance</w:t>
@@ -4347,7 +4347,7 @@
       <w:pPr>
         <w:pStyle w:val="Ttulo2"/>
       </w:pPr>
-      <w:bookmarkStart w:id="1" w:name="_Toc241667924"/>
+      <w:bookmarkStart w:id="1" w:name="_Toc241670455"/>
       <w:r>
         <w:t>You can / You cannot</w:t>
       </w:r>
@@ -5195,7 +5195,7 @@
       <w:pPr>
         <w:pStyle w:val="Ttulo2"/>
       </w:pPr>
-      <w:bookmarkStart w:id="2" w:name="_Toc241667925"/>
+      <w:bookmarkStart w:id="2" w:name="_Toc241670456"/>
       <w:r>
         <w:t>Where your access comes from</w:t>
       </w:r>
@@ -5305,7 +5305,7 @@
       <w:pPr>
         <w:pStyle w:val="Ttulo2"/>
       </w:pPr>
-      <w:bookmarkStart w:id="3" w:name="_Toc241667926"/>
+      <w:bookmarkStart w:id="3" w:name="_Toc241670457"/>
       <w:r>
         <w:t>How to sign in, change your password, and sign out</w:t>
       </w:r>
@@ -5419,7 +5419,7 @@
           <w:noProof/>
         </w:rPr>
         <w:drawing>
-          <wp:inline distT="0" distB="0" distL="0" distR="0" wp14:anchorId="3B2D25F0" wp14:editId="4E153C68">
+          <wp:inline distT="0" distB="0" distL="0" distR="0" wp14:anchorId="299539B9" wp14:editId="5CD443A0">
             <wp:extent cx="5715000" cy="3571875"/>
             <wp:effectExtent l="0" t="0" r="0" b="0"/>
             <wp:docPr id="1" name="01-login.png" descr="The sign-in page with Email, Password, Remember me and the Sign in button." title="The sign-in page with Email, Password, Remember me and the Sign in button."/>
@@ -5534,7 +5534,7 @@
         </w:rPr>
         <w:lastRenderedPageBreak/>
         <w:drawing>
-          <wp:inline distT="0" distB="0" distL="0" distR="0" wp14:anchorId="1FBB41EB" wp14:editId="6DDC8991">
+          <wp:inline distT="0" distB="0" distL="0" distR="0" wp14:anchorId="56332DA9" wp14:editId="046B92C0">
             <wp:extent cx="5715000" cy="3571875"/>
             <wp:effectExtent l="0" t="0" r="0" b="0"/>
             <wp:docPr id="2" name="03-user-menu.png" descr="The account menu open, with Settings and Log out." title="The account menu open, with Settings and Log out."/>
@@ -5586,7 +5586,7 @@
       <w:pPr>
         <w:pStyle w:val="Ttulo2"/>
       </w:pPr>
-      <w:bookmarkStart w:id="4" w:name="_Toc241667927"/>
+      <w:bookmarkStart w:id="4" w:name="_Toc241670458"/>
       <w:r>
         <w:t>The sidebar</w:t>
       </w:r>
@@ -6127,7 +6127,7 @@
         </w:rPr>
         <w:lastRenderedPageBreak/>
         <w:drawing>
-          <wp:inline distT="0" distB="0" distL="0" distR="0" wp14:anchorId="40967E88" wp14:editId="6880EED0">
+          <wp:inline distT="0" distB="0" distL="0" distR="0" wp14:anchorId="2DE987DF" wp14:editId="730E51B9">
             <wp:extent cx="5715000" cy="5133975"/>
             <wp:effectExtent l="0" t="0" r="0" b="0"/>
             <wp:docPr id="3" name="01-dashboard-sidebar.png" descr="The full Administrator sidebar, including Data Modeling and Migration." title="The full Administrator sidebar, including Data Modeling and Migration."/>
@@ -6180,7 +6180,7 @@
         <w:pStyle w:val="Ttulo1"/>
         <w:pageBreakBefore/>
       </w:pPr>
-      <w:bookmarkStart w:id="5" w:name="_Toc241667928"/>
+      <w:bookmarkStart w:id="5" w:name="_Toc241670459"/>
       <w:r>
         <w:lastRenderedPageBreak/>
         <w:t>Settings</w:t>
@@ -6210,7 +6210,7 @@
           <w:noProof/>
         </w:rPr>
         <w:drawing>
-          <wp:inline distT="0" distB="0" distL="0" distR="0" wp14:anchorId="35567F60" wp14:editId="5261493C">
+          <wp:inline distT="0" distB="0" distL="0" distR="0" wp14:anchorId="07620CA3" wp14:editId="578B8861">
             <wp:extent cx="5715000" cy="3571875"/>
             <wp:effectExtent l="0" t="0" r="0" b="0"/>
             <wp:docPr id="4" name="04-settings.png" descr="The Settings page with the Language, Theme and Color palette cards." title="The Settings page with the Language, Theme and Color palette cards."/>
@@ -7559,7 +7559,7 @@
         <w:pStyle w:val="Ttulo1"/>
         <w:pageBreakBefore/>
       </w:pPr>
-      <w:bookmarkStart w:id="6" w:name="_Toc241667929"/>
+      <w:bookmarkStart w:id="6" w:name="_Toc241670460"/>
       <w:r>
         <w:lastRenderedPageBreak/>
         <w:t>Dashboard</w:t>
@@ -7592,7 +7592,7 @@
           <w:noProof/>
         </w:rPr>
         <w:drawing>
-          <wp:inline distT="0" distB="0" distL="0" distR="0" wp14:anchorId="794367F2" wp14:editId="29F7B75C">
+          <wp:inline distT="0" distB="0" distL="0" distR="0" wp14:anchorId="1EFBCFCD" wp14:editId="3D5FA7CA">
             <wp:extent cx="5715000" cy="5133975"/>
             <wp:effectExtent l="0" t="0" r="0" b="0"/>
             <wp:docPr id="5" name="01-dashboard-sidebar.png" descr="The Administrator dashboard with summary cards and the Recent Maps list." title="The Administrator dashboard with summary cards and the Recent Maps list."/>
@@ -8101,7 +8101,7 @@
         <w:pStyle w:val="Ttulo1"/>
         <w:pageBreakBefore/>
       </w:pPr>
-      <w:bookmarkStart w:id="7" w:name="_Toc241667930"/>
+      <w:bookmarkStart w:id="7" w:name="_Toc241670461"/>
       <w:r>
         <w:lastRenderedPageBreak/>
         <w:t>Maps</w:t>
@@ -8131,7 +8131,7 @@
           <w:noProof/>
         </w:rPr>
         <w:drawing>
-          <wp:inline distT="0" distB="0" distL="0" distR="0" wp14:anchorId="1F42156C" wp14:editId="453C9146">
+          <wp:inline distT="0" distB="0" distL="0" distR="0" wp14:anchorId="19B4D2B1" wp14:editId="49038FC4">
             <wp:extent cx="5715000" cy="3429000"/>
             <wp:effectExtent l="0" t="0" r="0" b="0"/>
             <wp:docPr id="6" name="02-maps-all.png" descr="The Maps list, All tab, with every row icon and the Workbooks section above." title="The Maps list, All tab, with every row icon and the Workbooks section above."/>
@@ -8183,7 +8183,7 @@
       <w:pPr>
         <w:pStyle w:val="Ttulo2"/>
       </w:pPr>
-      <w:bookmarkStart w:id="8" w:name="_Toc241667931"/>
+      <w:bookmarkStart w:id="8" w:name="_Toc241670462"/>
       <w:r>
         <w:t>The list</w:t>
       </w:r>
@@ -9387,7 +9387,7 @@
       <w:pPr>
         <w:pStyle w:val="Ttulo2"/>
       </w:pPr>
-      <w:bookmarkStart w:id="9" w:name="_Toc241667932"/>
+      <w:bookmarkStart w:id="9" w:name="_Toc241670463"/>
       <w:r>
         <w:t>Workbooks</w:t>
       </w:r>
@@ -9801,7 +9801,7 @@
       <w:pPr>
         <w:pStyle w:val="Ttulo2"/>
       </w:pPr>
-      <w:bookmarkStart w:id="10" w:name="_Toc241667933"/>
+      <w:bookmarkStart w:id="10" w:name="_Toc241670464"/>
       <w:r>
         <w:t>Share a map</w:t>
       </w:r>
@@ -9824,7 +9824,7 @@
         </w:rPr>
         <w:lastRenderedPageBreak/>
         <w:drawing>
-          <wp:inline distT="0" distB="0" distL="0" distR="0" wp14:anchorId="3F9DF762" wp14:editId="2A2832FC">
+          <wp:inline distT="0" distB="0" distL="0" distR="0" wp14:anchorId="28AF2646" wp14:editId="625C1DA0">
             <wp:extent cx="3743325" cy="3895725"/>
             <wp:effectExtent l="0" t="0" r="0" b="0"/>
             <wp:docPr id="7" name="03-share-dialog.png" descr="The Share map dialog with a search box and Can view, Can export and Can edit buttons." title="The Share map dialog with a search box and Can view, Can export and Can edit buttons."/>
@@ -10301,7 +10301,7 @@
       <w:pPr>
         <w:pStyle w:val="Ttulo2"/>
       </w:pPr>
-      <w:bookmarkStart w:id="11" w:name="_Toc241667934"/>
+      <w:bookmarkStart w:id="11" w:name="_Toc241670465"/>
       <w:r>
         <w:lastRenderedPageBreak/>
         <w:t>Share a whole workbook</w:t>
@@ -10357,7 +10357,7 @@
       <w:pPr>
         <w:pStyle w:val="Ttulo2"/>
       </w:pPr>
-      <w:bookmarkStart w:id="12" w:name="_Toc241667935"/>
+      <w:bookmarkStart w:id="12" w:name="_Toc241670466"/>
       <w:r>
         <w:t>Copy a map</w:t>
       </w:r>
@@ -10372,7 +10372,7 @@
       <w:pPr>
         <w:pStyle w:val="Ttulo2"/>
       </w:pPr>
-      <w:bookmarkStart w:id="13" w:name="_Toc241667936"/>
+      <w:bookmarkStart w:id="13" w:name="_Toc241670467"/>
       <w:r>
         <w:t>Example: give a colleague read access</w:t>
       </w:r>
@@ -10503,7 +10503,7 @@
         <w:pStyle w:val="Ttulo1"/>
         <w:pageBreakBefore/>
       </w:pPr>
-      <w:bookmarkStart w:id="14" w:name="_Toc241667937"/>
+      <w:bookmarkStart w:id="14" w:name="_Toc241670468"/>
       <w:r>
         <w:lastRenderedPageBreak/>
         <w:t>Map builder</w:t>
@@ -10536,7 +10536,7 @@
           <w:noProof/>
         </w:rPr>
         <w:drawing>
-          <wp:inline distT="0" distB="0" distL="0" distR="0" wp14:anchorId="6338B2DB" wp14:editId="11325613">
+          <wp:inline distT="0" distB="0" distL="0" distR="0" wp14:anchorId="02E966EF" wp14:editId="4F1E9034">
             <wp:extent cx="5715000" cy="3571875"/>
             <wp:effectExtent l="0" t="0" r="0" b="0"/>
             <wp:docPr id="8" name="05-builder-overview.png" descr="The map builder with the Business Areas tree, the columns canvas and the Properties panel." title="The map builder with the Business Areas tree, the columns canvas and the Properties panel."/>
@@ -10588,7 +10588,7 @@
       <w:pPr>
         <w:pStyle w:val="Ttulo2"/>
       </w:pPr>
-      <w:bookmarkStart w:id="15" w:name="_Toc241667938"/>
+      <w:bookmarkStart w:id="15" w:name="_Toc241670469"/>
       <w:r>
         <w:t>The screen</w:t>
       </w:r>
@@ -10748,7 +10748,7 @@
       <w:pPr>
         <w:pStyle w:val="Ttulo2"/>
       </w:pPr>
-      <w:bookmarkStart w:id="16" w:name="_Toc241667939"/>
+      <w:bookmarkStart w:id="16" w:name="_Toc241670470"/>
       <w:r>
         <w:t>The toolbar</w:t>
       </w:r>
@@ -11964,7 +11964,7 @@
       <w:pPr>
         <w:pStyle w:val="Ttulo2"/>
       </w:pPr>
-      <w:bookmarkStart w:id="17" w:name="_Toc241667940"/>
+      <w:bookmarkStart w:id="17" w:name="_Toc241670471"/>
       <w:r>
         <w:t>Build a map</w:t>
       </w:r>
@@ -12171,7 +12171,7 @@
       <w:pPr>
         <w:pStyle w:val="Ttulo2"/>
       </w:pPr>
-      <w:bookmarkStart w:id="18" w:name="_Toc241667941"/>
+      <w:bookmarkStart w:id="18" w:name="_Toc241670472"/>
       <w:r>
         <w:lastRenderedPageBreak/>
         <w:t>Configure a column</w:t>
@@ -14990,7 +14990,7 @@
           <w:noProof/>
         </w:rPr>
         <w:drawing>
-          <wp:inline distT="0" distB="0" distL="0" distR="0" wp14:anchorId="531CDA90" wp14:editId="14F9A0FB">
+          <wp:inline distT="0" distB="0" distL="0" distR="0" wp14:anchorId="628EE944" wp14:editId="1F97C666">
             <wp:extent cx="5715000" cy="3571875"/>
             <wp:effectExtent l="0" t="0" r="0" b="0"/>
             <wp:docPr id="9" name="08-builder-column-aggregation.png" descr="The Configure column dialog with the Aggregation list open." title="The Configure column dialog with the Aggregation list open."/>
@@ -15042,7 +15042,7 @@
       <w:pPr>
         <w:pStyle w:val="Ttulo2"/>
       </w:pPr>
-      <w:bookmarkStart w:id="19" w:name="_Toc241667942"/>
+      <w:bookmarkStart w:id="19" w:name="_Toc241670473"/>
       <w:r>
         <w:lastRenderedPageBreak/>
         <w:t>The Properties tab</w:t>
@@ -15890,7 +15890,7 @@
       <w:pPr>
         <w:pStyle w:val="Ttulo2"/>
       </w:pPr>
-      <w:bookmarkStart w:id="20" w:name="_Toc241667943"/>
+      <w:bookmarkStart w:id="20" w:name="_Toc241670474"/>
       <w:r>
         <w:t>The Conditions tab</w:t>
       </w:r>
@@ -17433,7 +17433,7 @@
       <w:pPr>
         <w:pStyle w:val="Ttulo2"/>
       </w:pPr>
-      <w:bookmarkStart w:id="21" w:name="_Toc241667944"/>
+      <w:bookmarkStart w:id="21" w:name="_Toc241670475"/>
       <w:r>
         <w:t>The Sort tab</w:t>
       </w:r>
@@ -17878,7 +17878,7 @@
       <w:pPr>
         <w:pStyle w:val="Ttulo2"/>
       </w:pPr>
-      <w:bookmarkStart w:id="22" w:name="_Toc241667945"/>
+      <w:bookmarkStart w:id="22" w:name="_Toc241670476"/>
       <w:r>
         <w:t>The Parameters tab</w:t>
       </w:r>
@@ -18788,7 +18788,7 @@
       <w:pPr>
         <w:pStyle w:val="Ttulo2"/>
       </w:pPr>
-      <w:bookmarkStart w:id="23" w:name="_Toc241667946"/>
+      <w:bookmarkStart w:id="23" w:name="_Toc241670477"/>
       <w:r>
         <w:t>The Calculated Fields tab</w:t>
       </w:r>
@@ -19686,7 +19686,7 @@
       <w:pPr>
         <w:pStyle w:val="Ttulo2"/>
       </w:pPr>
-      <w:bookmarkStart w:id="24" w:name="_Toc241667947"/>
+      <w:bookmarkStart w:id="24" w:name="_Toc241670478"/>
       <w:r>
         <w:t>Conditional formatting</w:t>
       </w:r>
@@ -21080,7 +21080,7 @@
       <w:pPr>
         <w:pStyle w:val="Ttulo2"/>
       </w:pPr>
-      <w:bookmarkStart w:id="25" w:name="_Toc241667948"/>
+      <w:bookmarkStart w:id="25" w:name="_Toc241670479"/>
       <w:r>
         <w:t>Run a map and read the result</w:t>
       </w:r>
@@ -22149,7 +22149,7 @@
           <w:noProof/>
         </w:rPr>
         <w:drawing>
-          <wp:inline distT="0" distB="0" distL="0" distR="0" wp14:anchorId="47A1686B" wp14:editId="162FA34C">
+          <wp:inline distT="0" distB="0" distL="0" distR="0" wp14:anchorId="1CA2F1BA" wp14:editId="322028AA">
             <wp:extent cx="5715000" cy="3571875"/>
             <wp:effectExtent l="0" t="0" r="0" b="0"/>
             <wp:docPr id="10" name="03-viewer-results.png" descr="Run results with the SQL and Plan buttons beside the Excel, CSV and PDF buttons." title="Run results with the SQL and Plan buttons beside the Excel, CSV and PDF buttons."/>
@@ -22216,7 +22216,7 @@
       <w:pPr>
         <w:pStyle w:val="Ttulo2"/>
       </w:pPr>
-      <w:bookmarkStart w:id="26" w:name="_Toc241667949"/>
+      <w:bookmarkStart w:id="26" w:name="_Toc241670480"/>
       <w:r>
         <w:t>Refusals and errors</w:t>
       </w:r>
@@ -22855,7 +22855,7 @@
         <w:pStyle w:val="Ttulo1"/>
         <w:pageBreakBefore/>
       </w:pPr>
-      <w:bookmarkStart w:id="27" w:name="_Toc241667950"/>
+      <w:bookmarkStart w:id="27" w:name="_Toc241670481"/>
       <w:r>
         <w:lastRenderedPageBreak/>
         <w:t>The map viewer</w:t>
@@ -22888,7 +22888,7 @@
           <w:noProof/>
         </w:rPr>
         <w:drawing>
-          <wp:inline distT="0" distB="0" distL="0" distR="0" wp14:anchorId="3C984698" wp14:editId="38D90099">
+          <wp:inline distT="0" distB="0" distL="0" distR="0" wp14:anchorId="16C4CF29" wp14:editId="174C23BA">
             <wp:extent cx="5715000" cy="3571875"/>
             <wp:effectExtent l="0" t="0" r="0" b="0"/>
             <wp:docPr id="11" name="25-viewer-results.png" descr="The map viewer after a completed run, with the results grid and export buttons." title="The map viewer after a completed run, with the results grid and export buttons."/>
@@ -23493,7 +23493,7 @@
         <w:pStyle w:val="Ttulo1"/>
         <w:pageBreakBefore/>
       </w:pPr>
-      <w:bookmarkStart w:id="28" w:name="_Toc241667951"/>
+      <w:bookmarkStart w:id="28" w:name="_Toc241670482"/>
       <w:r>
         <w:lastRenderedPageBreak/>
         <w:t>Runs</w:t>
@@ -23523,7 +23523,7 @@
           <w:noProof/>
         </w:rPr>
         <w:drawing>
-          <wp:inline distT="0" distB="0" distL="0" distR="0" wp14:anchorId="77F8BD14" wp14:editId="1C7A9DC1">
+          <wp:inline distT="0" distB="0" distL="0" distR="0" wp14:anchorId="5F034327" wp14:editId="1B340BEF">
             <wp:extent cx="5715000" cy="3571875"/>
             <wp:effectExtent l="0" t="0" r="0" b="0"/>
             <wp:docPr id="12" name="04-runs-every-user.png" descr="The Runs page with every user's runs shown." title="The Runs page with every user's runs shown."/>
@@ -24853,7 +24853,7 @@
         <w:pStyle w:val="Ttulo1"/>
         <w:pageBreakBefore/>
       </w:pPr>
-      <w:bookmarkStart w:id="29" w:name="_Toc241667952"/>
+      <w:bookmarkStart w:id="29" w:name="_Toc241670483"/>
       <w:r>
         <w:lastRenderedPageBreak/>
         <w:t>Exports</w:t>
@@ -24883,7 +24883,7 @@
           <w:noProof/>
         </w:rPr>
         <w:drawing>
-          <wp:inline distT="0" distB="0" distL="0" distR="0" wp14:anchorId="2702C7C3" wp14:editId="30B644BB">
+          <wp:inline distT="0" distB="0" distL="0" distR="0" wp14:anchorId="36BA7E5B" wp14:editId="2B8E3B2E">
             <wp:extent cx="5715000" cy="3571875"/>
             <wp:effectExtent l="0" t="0" r="0" b="0"/>
             <wp:docPr id="13" name="05-exports.png" descr="The Exports page listing export jobs with their status and download buttons." title="The Exports page listing export jobs with their status and download buttons."/>
@@ -25564,7 +25564,7 @@
         <w:pStyle w:val="Ttulo1"/>
         <w:pageBreakBefore/>
       </w:pPr>
-      <w:bookmarkStart w:id="30" w:name="_Toc241667953"/>
+      <w:bookmarkStart w:id="30" w:name="_Toc241670484"/>
       <w:r>
         <w:lastRenderedPageBreak/>
         <w:t>Schedules</w:t>
@@ -25597,7 +25597,7 @@
           <w:noProof/>
         </w:rPr>
         <w:drawing>
-          <wp:inline distT="0" distB="0" distL="0" distR="0" wp14:anchorId="5B7778F2" wp14:editId="1167D2E7">
+          <wp:inline distT="0" distB="0" distL="0" distR="0" wp14:anchorId="0A81308D" wp14:editId="193046B9">
             <wp:extent cx="5715000" cy="3571875"/>
             <wp:effectExtent l="0" t="0" r="0" b="0"/>
             <wp:docPr id="14" name="38-schedules-list.png" descr="The Schedules page with a paused schedule and its action icons." title="The Schedules page with a paused schedule and its action icons."/>
@@ -26304,7 +26304,7 @@
       <w:pPr>
         <w:pStyle w:val="Ttulo2"/>
       </w:pPr>
-      <w:bookmarkStart w:id="31" w:name="_Toc241667954"/>
+      <w:bookmarkStart w:id="31" w:name="_Toc241670485"/>
       <w:r>
         <w:lastRenderedPageBreak/>
         <w:t>New Schedule and Edit Schedule</w:t>
@@ -27740,7 +27740,7 @@
         </w:rPr>
         <w:lastRenderedPageBreak/>
         <w:drawing>
-          <wp:inline distT="0" distB="0" distL="0" distR="0" wp14:anchorId="5712AC7A" wp14:editId="026FA5E2">
+          <wp:inline distT="0" distB="0" distL="0" distR="0" wp14:anchorId="6C15F534" wp14:editId="216CCF78">
             <wp:extent cx="3743325" cy="4676775"/>
             <wp:effectExtent l="0" t="0" r="0" b="0"/>
             <wp:docPr id="15" name="34-schedule-custom-cron.png" descr="The New Schedule dialog with a custom frequency and the cron expression field." title="The New Schedule dialog with a custom frequency and the cron expression field."/>
@@ -27792,7 +27792,7 @@
       <w:pPr>
         <w:pStyle w:val="Ttulo2"/>
       </w:pPr>
-      <w:bookmarkStart w:id="32" w:name="_Toc241667955"/>
+      <w:bookmarkStart w:id="32" w:name="_Toc241670486"/>
       <w:r>
         <w:t>Execution History</w:t>
       </w:r>
@@ -28241,7 +28241,7 @@
       <w:pPr>
         <w:pStyle w:val="Ttulo2"/>
       </w:pPr>
-      <w:bookmarkStart w:id="33" w:name="_Toc241667956"/>
+      <w:bookmarkStart w:id="33" w:name="_Toc241670487"/>
       <w:r>
         <w:t>Example: a weekly result</w:t>
       </w:r>
@@ -28447,7 +28447,7 @@
         <w:pStyle w:val="Ttulo1"/>
         <w:pageBreakBefore/>
       </w:pPr>
-      <w:bookmarkStart w:id="34" w:name="_Toc241667957"/>
+      <w:bookmarkStart w:id="34" w:name="_Toc241670488"/>
       <w:r>
         <w:lastRenderedPageBreak/>
         <w:t>Business Areas</w:t>
@@ -28480,7 +28480,7 @@
           <w:noProof/>
         </w:rPr>
         <w:drawing>
-          <wp:inline distT="0" distB="0" distL="0" distR="0" wp14:anchorId="103B6F40" wp14:editId="53279ACE">
+          <wp:inline distT="0" distB="0" distL="0" distR="0" wp14:anchorId="665FE092" wp14:editId="073720CD">
             <wp:extent cx="5715000" cy="3571875"/>
             <wp:effectExtent l="0" t="0" r="0" b="0"/>
             <wp:docPr id="16" name="06-business-areas.png" descr="The Business Areas page listing areas, with the New Business Area button and row icons." title="The Business Areas page listing areas, with the New Business Area button and row icons."/>
@@ -28994,7 +28994,7 @@
         </w:rPr>
         <w:lastRenderedPageBreak/>
         <w:drawing>
-          <wp:inline distT="0" distB="0" distL="0" distR="0" wp14:anchorId="316AB64A" wp14:editId="65E00C79">
+          <wp:inline distT="0" distB="0" distL="0" distR="0" wp14:anchorId="68F21131" wp14:editId="298A71E6">
             <wp:extent cx="3324225" cy="2047875"/>
             <wp:effectExtent l="0" t="0" r="0" b="0"/>
             <wp:docPr id="17" name="07-business-areas-new.png" descr="The New Business Area dialog with Name and Description fields." title="The New Business Area dialog with Name and Description fields."/>
@@ -29046,7 +29046,7 @@
       <w:pPr>
         <w:pStyle w:val="Ttulo2"/>
       </w:pPr>
-      <w:bookmarkStart w:id="35" w:name="_Toc241667958"/>
+      <w:bookmarkStart w:id="35" w:name="_Toc241670489"/>
       <w:r>
         <w:t>Create a business area</w:t>
       </w:r>
@@ -29150,7 +29150,7 @@
       <w:pPr>
         <w:pStyle w:val="Ttulo2"/>
       </w:pPr>
-      <w:bookmarkStart w:id="36" w:name="_Toc241667959"/>
+      <w:bookmarkStart w:id="36" w:name="_Toc241670490"/>
       <w:r>
         <w:t>Grants</w:t>
       </w:r>
@@ -29182,7 +29182,7 @@
           <w:noProof/>
         </w:rPr>
         <w:drawing>
-          <wp:inline distT="0" distB="0" distL="0" distR="0" wp14:anchorId="5F4B64C2" wp14:editId="6A654868">
+          <wp:inline distT="0" distB="0" distL="0" distR="0" wp14:anchorId="3F404A03" wp14:editId="20643D8B">
             <wp:extent cx="5715000" cy="3571875"/>
             <wp:effectExtent l="0" t="0" r="0" b="0"/>
             <wp:docPr id="18" name="09-business-areas-grants-permission.png" descr="The Manage grants dialog with the Permission list open." title="The Manage grants dialog with the Permission list open."/>
@@ -30418,7 +30418,7 @@
         <w:pStyle w:val="Ttulo1"/>
         <w:pageBreakBefore/>
       </w:pPr>
-      <w:bookmarkStart w:id="37" w:name="_Toc241667960"/>
+      <w:bookmarkStart w:id="37" w:name="_Toc241670491"/>
       <w:r>
         <w:lastRenderedPageBreak/>
         <w:t>Folders</w:t>
@@ -30481,7 +30481,7 @@
           <w:noProof/>
         </w:rPr>
         <w:drawing>
-          <wp:inline distT="0" distB="0" distL="0" distR="0" wp14:anchorId="4A97A721" wp14:editId="36F385AA">
+          <wp:inline distT="0" distB="0" distL="0" distR="0" wp14:anchorId="4099B8EA" wp14:editId="6457C46B">
             <wp:extent cx="5715000" cy="3571875"/>
             <wp:effectExtent l="0" t="0" r="0" b="0"/>
             <wp:docPr id="19" name="11-folders.png" descr="The Folders page with a business area chosen, showing the folder table and row icons." title="The Folders page with a business area chosen, showing the folder table and row icons."/>
@@ -31260,7 +31260,7 @@
       <w:pPr>
         <w:pStyle w:val="Ttulo2"/>
       </w:pPr>
-      <w:bookmarkStart w:id="38" w:name="_Toc241667961"/>
+      <w:bookmarkStart w:id="38" w:name="_Toc241670492"/>
       <w:r>
         <w:t>The folder wizard</w:t>
       </w:r>
@@ -32689,7 +32689,7 @@
         </w:rPr>
         <w:lastRenderedPageBreak/>
         <w:drawing>
-          <wp:inline distT="0" distB="0" distL="0" distR="0" wp14:anchorId="375B9B15" wp14:editId="505943AD">
+          <wp:inline distT="0" distB="0" distL="0" distR="0" wp14:anchorId="16172DCA" wp14:editId="12446DF6">
             <wp:extent cx="2238375" cy="5905500"/>
             <wp:effectExtent l="0" t="0" r="0" b="0"/>
             <wp:docPr id="20" name="15-folders-picked.png" descr="The New Folder dialog with a table picked and the Items to create checklist." title="The New Folder dialog with a table picked and the Items to create checklist."/>
@@ -32876,7 +32876,7 @@
       <w:pPr>
         <w:pStyle w:val="Ttulo2"/>
       </w:pPr>
-      <w:bookmarkStart w:id="39" w:name="_Toc241667962"/>
+      <w:bookmarkStart w:id="39" w:name="_Toc241670493"/>
       <w:r>
         <w:t>Share a folder into another business area</w:t>
       </w:r>
@@ -32986,7 +32986,7 @@
           <w:noProof/>
         </w:rPr>
         <w:drawing>
-          <wp:inline distT="0" distB="0" distL="0" distR="0" wp14:anchorId="0B8635E4" wp14:editId="36CE30D7">
+          <wp:inline distT="0" distB="0" distL="0" distR="0" wp14:anchorId="663B2618" wp14:editId="06315B9C">
             <wp:extent cx="3324225" cy="1638300"/>
             <wp:effectExtent l="0" t="0" r="0" b="0"/>
             <wp:docPr id="21" name="16-folders-sharing.png" descr="The folder sharing dialog with the owner badge and the Share into list." title="The folder sharing dialog with the owner badge and the Share into list."/>
@@ -33039,7 +33039,7 @@
         <w:pStyle w:val="Ttulo1"/>
         <w:pageBreakBefore/>
       </w:pPr>
-      <w:bookmarkStart w:id="40" w:name="_Toc241667963"/>
+      <w:bookmarkStart w:id="40" w:name="_Toc241670494"/>
       <w:r>
         <w:lastRenderedPageBreak/>
         <w:t>Items</w:t>
@@ -33092,7 +33092,7 @@
           <w:noProof/>
         </w:rPr>
         <w:drawing>
-          <wp:inline distT="0" distB="0" distL="0" distR="0" wp14:anchorId="1F3466BF" wp14:editId="38568188">
+          <wp:inline distT="0" distB="0" distL="0" distR="0" wp14:anchorId="2E9430F0" wp14:editId="062622AF">
             <wp:extent cx="5715000" cy="3571875"/>
             <wp:effectExtent l="0" t="0" r="0" b="0"/>
             <wp:docPr id="22" name="17-items.png" descr="The Items page for a chosen folder, with Type, Column, Data Type and Aggregation columns." title="The Items page for a chosen folder, with Type, Column, Data Type and Aggregation columns."/>
@@ -35031,7 +35031,7 @@
         </w:rPr>
         <w:lastRenderedPageBreak/>
         <w:drawing>
-          <wp:inline distT="0" distB="0" distL="0" distR="0" wp14:anchorId="69B41792" wp14:editId="3CF91BB9">
+          <wp:inline distT="0" distB="0" distL="0" distR="0" wp14:anchorId="000D4F99" wp14:editId="19B340A7">
             <wp:extent cx="5715000" cy="3571875"/>
             <wp:effectExtent l="0" t="0" r="0" b="0"/>
             <wp:docPr id="23" name="19-items-type-open.png" descr="The New Item dialog with the Item Type list open showing the item types." title="The New Item dialog with the Item Type list open showing the item types."/>
@@ -35084,7 +35084,7 @@
         <w:pStyle w:val="Ttulo1"/>
         <w:pageBreakBefore/>
       </w:pPr>
-      <w:bookmarkStart w:id="41" w:name="_Toc241667964"/>
+      <w:bookmarkStart w:id="41" w:name="_Toc241670495"/>
       <w:r>
         <w:lastRenderedPageBreak/>
         <w:t>Joins</w:t>
@@ -35117,7 +35117,7 @@
           <w:noProof/>
         </w:rPr>
         <w:drawing>
-          <wp:inline distT="0" distB="0" distL="0" distR="0" wp14:anchorId="3BA96053" wp14:editId="6BE11B01">
+          <wp:inline distT="0" distB="0" distL="0" distR="0" wp14:anchorId="0CC4169F" wp14:editId="59A48BA0">
             <wp:extent cx="5715000" cy="3571875"/>
             <wp:effectExtent l="0" t="0" r="0" b="0"/>
             <wp:docPr id="24" name="20-joins.png" descr="The Joins page, including joins made of several column pairs." title="The Joins page, including joins made of several column pairs."/>
@@ -36772,7 +36772,7 @@
           <w:noProof/>
         </w:rPr>
         <w:drawing>
-          <wp:inline distT="0" distB="0" distL="0" distR="0" wp14:anchorId="35D5E0D0" wp14:editId="691E5152">
+          <wp:inline distT="0" distB="0" distL="0" distR="0" wp14:anchorId="188D53CF" wp14:editId="00D4F5EF">
             <wp:extent cx="5715000" cy="3571875"/>
             <wp:effectExtent l="0" t="0" r="0" b="0"/>
             <wp:docPr id="25" name="23-joins-select-open.png" descr="The New Join dialog with a select list open." title="The New Join dialog with a select list open."/>
@@ -36943,7 +36943,7 @@
         <w:pStyle w:val="Ttulo1"/>
         <w:pageBreakBefore/>
       </w:pPr>
-      <w:bookmarkStart w:id="42" w:name="_Toc241667965"/>
+      <w:bookmarkStart w:id="42" w:name="_Toc241670496"/>
       <w:r>
         <w:lastRenderedPageBreak/>
         <w:t>Hierarchies</w:t>
@@ -36976,7 +36976,7 @@
           <w:noProof/>
         </w:rPr>
         <w:drawing>
-          <wp:inline distT="0" distB="0" distL="0" distR="0" wp14:anchorId="4B2294C0" wp14:editId="08B15B0D">
+          <wp:inline distT="0" distB="0" distL="0" distR="0" wp14:anchorId="04EB7B1D" wp14:editId="58DEBE3C">
             <wp:extent cx="5715000" cy="3571875"/>
             <wp:effectExtent l="0" t="0" r="0" b="0"/>
             <wp:docPr id="26" name="24-hierarchies.png" descr="The Hierarchies page with the table showing the number of levels." title="The Hierarchies page with the table showing the number of levels."/>
@@ -38036,7 +38036,7 @@
           <w:noProof/>
         </w:rPr>
         <w:drawing>
-          <wp:inline distT="0" distB="0" distL="0" distR="0" wp14:anchorId="16FEB846" wp14:editId="44F011E6">
+          <wp:inline distT="0" distB="0" distL="0" distR="0" wp14:anchorId="7434D9B2" wp14:editId="2A9070B6">
             <wp:extent cx="4362450" cy="2762250"/>
             <wp:effectExtent l="0" t="0" r="0" b="0"/>
             <wp:docPr id="27" name="26-hierarchies-level-added.png" descr="The New Hierarchy dialog after adding a level, with folder and item selects." title="The New Hierarchy dialog after adding a level, with folder and item selects."/>
@@ -38089,7 +38089,7 @@
         <w:pStyle w:val="Ttulo1"/>
         <w:pageBreakBefore/>
       </w:pPr>
-      <w:bookmarkStart w:id="43" w:name="_Toc241667966"/>
+      <w:bookmarkStart w:id="43" w:name="_Toc241670497"/>
       <w:r>
         <w:lastRenderedPageBreak/>
         <w:t>Custom Functions</w:t>
@@ -38122,7 +38122,7 @@
           <w:noProof/>
         </w:rPr>
         <w:drawing>
-          <wp:inline distT="0" distB="0" distL="0" distR="0" wp14:anchorId="48EB6E6F" wp14:editId="0AF875EA">
+          <wp:inline distT="0" distB="0" distL="0" distR="0" wp14:anchorId="0240B117" wp14:editId="06D670F6">
             <wp:extent cx="5715000" cy="3571875"/>
             <wp:effectExtent l="0" t="0" r="0" b="0"/>
             <wp:docPr id="28" name="27-custom-functions.png" descr="The Custom Functions page with filter box, Refresh all, New Function and the function table." title="The Custom Functions page with filter box, Refresh all, New Function and the function table."/>
@@ -38842,7 +38842,7 @@
       <w:pPr>
         <w:pStyle w:val="Ttulo2"/>
       </w:pPr>
-      <w:bookmarkStart w:id="44" w:name="_Toc241667967"/>
+      <w:bookmarkStart w:id="44" w:name="_Toc241670498"/>
       <w:r>
         <w:lastRenderedPageBreak/>
         <w:t>The function form</w:t>
@@ -39813,7 +39813,7 @@
         </w:rPr>
         <w:lastRenderedPageBreak/>
         <w:drawing>
-          <wp:inline distT="0" distB="0" distL="0" distR="0" wp14:anchorId="78D04076" wp14:editId="6845E062">
+          <wp:inline distT="0" distB="0" distL="0" distR="0" wp14:anchorId="6BB84A49" wp14:editId="1806B6D8">
             <wp:extent cx="4076700" cy="5905500"/>
             <wp:effectExtent l="0" t="0" r="0" b="0"/>
             <wp:docPr id="29" name="29-custom-functions-search-results.png" descr="The New Custom Function dialog listing database functions that match the search." title="The New Custom Function dialog listing database functions that match the search."/>
@@ -39866,7 +39866,7 @@
         <w:pStyle w:val="Ttulo1"/>
         <w:pageBreakBefore/>
       </w:pPr>
-      <w:bookmarkStart w:id="45" w:name="_Toc241667968"/>
+      <w:bookmarkStart w:id="45" w:name="_Toc241670499"/>
       <w:r>
         <w:lastRenderedPageBreak/>
         <w:t>Data Sources</w:t>
@@ -39899,7 +39899,7 @@
           <w:noProof/>
         </w:rPr>
         <w:drawing>
-          <wp:inline distT="0" distB="0" distL="0" distR="0" wp14:anchorId="5BBDF0A2" wp14:editId="20C5594F">
+          <wp:inline distT="0" distB="0" distL="0" distR="0" wp14:anchorId="54A1290D" wp14:editId="45B0B47C">
             <wp:extent cx="5715000" cy="3571875"/>
             <wp:effectExtent l="0" t="0" r="0" b="0"/>
             <wp:docPr id="30" name="30-data-sources.png" descr="The Data Sources page with a table of connections and five row icons." title="The Data Sources page with a table of connections and five row icons."/>
@@ -41279,7 +41279,7 @@
       <w:pPr>
         <w:pStyle w:val="Ttulo2"/>
       </w:pPr>
-      <w:bookmarkStart w:id="46" w:name="_Toc241667969"/>
+      <w:bookmarkStart w:id="46" w:name="_Toc241670500"/>
       <w:r>
         <w:t>Import tables</w:t>
       </w:r>
@@ -41441,7 +41441,7 @@
           <w:noProof/>
         </w:rPr>
         <w:drawing>
-          <wp:inline distT="0" distB="0" distL="0" distR="0" wp14:anchorId="4DFFF91A" wp14:editId="70042645">
+          <wp:inline distT="0" distB="0" distL="0" distR="0" wp14:anchorId="2708CDF1" wp14:editId="17D168AD">
             <wp:extent cx="3324225" cy="2286000"/>
             <wp:effectExtent l="0" t="0" r="0" b="0"/>
             <wp:docPr id="31" name="34-data-sources-import-dialog.png" descr="The Import Tables dialog with the Discover Tables button, before any table is found." title="The Import Tables dialog with the Discover Tables button, before any table is found."/>
@@ -41494,7 +41494,7 @@
         <w:pStyle w:val="Ttulo1"/>
         <w:pageBreakBefore/>
       </w:pPr>
-      <w:bookmarkStart w:id="47" w:name="_Toc241667970"/>
+      <w:bookmarkStart w:id="47" w:name="_Toc241670501"/>
       <w:r>
         <w:lastRenderedPageBreak/>
         <w:t>Users</w:t>
@@ -41524,7 +41524,7 @@
           <w:noProof/>
         </w:rPr>
         <w:drawing>
-          <wp:inline distT="0" distB="0" distL="0" distR="0" wp14:anchorId="6A3D1E60" wp14:editId="45C325B6">
+          <wp:inline distT="0" distB="0" distL="0" distR="0" wp14:anchorId="57A96B52" wp14:editId="198704A7">
             <wp:extent cx="5715000" cy="3571875"/>
             <wp:effectExtent l="0" t="0" r="0" b="0"/>
             <wp:docPr id="32" name="35-users.png" descr="The Users page with the Credentials file and New User buttons and row icons." title="The Users page with the Credentials file and New User buttons and row icons."/>
@@ -42223,7 +42223,7 @@
       <w:pPr>
         <w:pStyle w:val="Ttulo2"/>
       </w:pPr>
-      <w:bookmarkStart w:id="48" w:name="_Toc241667971"/>
+      <w:bookmarkStart w:id="48" w:name="_Toc241670502"/>
       <w:r>
         <w:lastRenderedPageBreak/>
         <w:t>Create or change a user</w:t>
@@ -43041,7 +43041,7 @@
         </w:rPr>
         <w:lastRenderedPageBreak/>
         <w:drawing>
-          <wp:inline distT="0" distB="0" distL="0" distR="0" wp14:anchorId="6A8A92FA" wp14:editId="6135752F">
+          <wp:inline distT="0" distB="0" distL="0" distR="0" wp14:anchorId="6BCA48AA" wp14:editId="4A52A555">
             <wp:extent cx="5715000" cy="3571875"/>
             <wp:effectExtent l="0" t="0" r="0" b="0"/>
             <wp:docPr id="33" name="37-users-role-open.png" descr="The New User dialog with the Role list open and each role described." title="The New User dialog with the Role list open and each role described."/>
@@ -43093,7 +43093,7 @@
       <w:pPr>
         <w:pStyle w:val="Ttulo2"/>
       </w:pPr>
-      <w:bookmarkStart w:id="49" w:name="_Toc241667972"/>
+      <w:bookmarkStart w:id="49" w:name="_Toc241670503"/>
       <w:r>
         <w:t>Deactivate, activate or delete</w:t>
       </w:r>
@@ -43185,7 +43185,7 @@
           <w:noProof/>
         </w:rPr>
         <w:drawing>
-          <wp:inline distT="0" distB="0" distL="0" distR="0" wp14:anchorId="5ADD6949" wp14:editId="7B1CEDDB">
+          <wp:inline distT="0" distB="0" distL="0" distR="0" wp14:anchorId="5F9D8638" wp14:editId="3932F21A">
             <wp:extent cx="3324225" cy="1076325"/>
             <wp:effectExtent l="0" t="0" r="0" b="0"/>
             <wp:docPr id="34" name="39-users-deactivate-dialog.png" descr="The confirmation dialog shown before deactivating a user." title="The confirmation dialog shown before deactivating a user."/>
@@ -43277,7 +43277,7 @@
       <w:pPr>
         <w:pStyle w:val="Ttulo2"/>
       </w:pPr>
-      <w:bookmarkStart w:id="50" w:name="_Toc241667973"/>
+      <w:bookmarkStart w:id="50" w:name="_Toc241670504"/>
       <w:r>
         <w:t>The credentials file</w:t>
       </w:r>
@@ -43302,7 +43302,7 @@
       <w:pPr>
         <w:pStyle w:val="Ttulo2"/>
       </w:pPr>
-      <w:bookmarkStart w:id="51" w:name="_Toc241667974"/>
+      <w:bookmarkStart w:id="51" w:name="_Toc241670505"/>
       <w:r>
         <w:lastRenderedPageBreak/>
         <w:t>Maps this user can open</w:t>
@@ -43345,7 +43345,7 @@
           <w:noProof/>
         </w:rPr>
         <w:drawing>
-          <wp:inline distT="0" distB="0" distL="0" distR="0" wp14:anchorId="1FDDF0AF" wp14:editId="20672272">
+          <wp:inline distT="0" distB="0" distL="0" distR="0" wp14:anchorId="727EAE87" wp14:editId="00FA5E25">
             <wp:extent cx="4362450" cy="2190750"/>
             <wp:effectExtent l="0" t="0" r="0" b="0"/>
             <wp:docPr id="35" name="41-users-maps-dialog.png" descr="The Maps dialog for a user, with source badges and share-level selects." title="The Maps dialog for a user, with source badges and share-level selects."/>
@@ -44287,7 +44287,7 @@
         <w:pStyle w:val="Ttulo1"/>
         <w:pageBreakBefore/>
       </w:pPr>
-      <w:bookmarkStart w:id="52" w:name="_Toc241667975"/>
+      <w:bookmarkStart w:id="52" w:name="_Toc241670506"/>
       <w:r>
         <w:lastRenderedPageBreak/>
         <w:t>Security Policies</w:t>
@@ -44347,7 +44347,7 @@
           <w:noProof/>
         </w:rPr>
         <w:drawing>
-          <wp:inline distT="0" distB="0" distL="0" distR="0" wp14:anchorId="2FA14416" wp14:editId="58BDBD35">
+          <wp:inline distT="0" distB="0" distL="0" distR="0" wp14:anchorId="1FFA508A" wp14:editId="60F08038">
             <wp:extent cx="5715000" cy="3571875"/>
             <wp:effectExtent l="0" t="0" r="0" b="0"/>
             <wp:docPr id="36" name="43-security.png" descr="The Security Policies page with the Test and New Policy buttons." title="The Security Policies page with the Test and New Policy buttons."/>
@@ -44974,7 +44974,7 @@
       <w:pPr>
         <w:pStyle w:val="Ttulo2"/>
       </w:pPr>
-      <w:bookmarkStart w:id="53" w:name="_Toc241667976"/>
+      <w:bookmarkStart w:id="53" w:name="_Toc241670507"/>
       <w:r>
         <w:lastRenderedPageBreak/>
         <w:t>Write a policy</w:t>
@@ -46030,7 +46030,7 @@
         </w:rPr>
         <w:lastRenderedPageBreak/>
         <w:drawing>
-          <wp:inline distT="0" distB="0" distL="0" distR="0" wp14:anchorId="02108375" wp14:editId="4E8FD3E1">
+          <wp:inline distT="0" distB="0" distL="0" distR="0" wp14:anchorId="0573D1A1" wp14:editId="473DD139">
             <wp:extent cx="3324225" cy="4638675"/>
             <wp:effectExtent l="0" t="0" r="0" b="0"/>
             <wp:docPr id="37" name="46-security-validate.png" descr="The New Policy dialog after pressing Validate on a predicate." title="The New Policy dialog after pressing Validate on a predicate."/>
@@ -46082,7 +46082,7 @@
       <w:pPr>
         <w:pStyle w:val="Ttulo2"/>
       </w:pPr>
-      <w:bookmarkStart w:id="54" w:name="_Toc241667977"/>
+      <w:bookmarkStart w:id="54" w:name="_Toc241670508"/>
       <w:r>
         <w:t>Assign a policy</w:t>
       </w:r>
@@ -46472,7 +46472,7 @@
       <w:pPr>
         <w:pStyle w:val="Ttulo2"/>
       </w:pPr>
-      <w:bookmarkStart w:id="55" w:name="_Toc241667978"/>
+      <w:bookmarkStart w:id="55" w:name="_Toc241670509"/>
       <w:r>
         <w:lastRenderedPageBreak/>
         <w:t>Test a policy</w:t>
@@ -46547,7 +46547,7 @@
         <w:pStyle w:val="Ttulo1"/>
         <w:pageBreakBefore/>
       </w:pPr>
-      <w:bookmarkStart w:id="56" w:name="_Toc241667979"/>
+      <w:bookmarkStart w:id="56" w:name="_Toc241670510"/>
       <w:r>
         <w:lastRenderedPageBreak/>
         <w:t>Audit Log</w:t>
@@ -46580,7 +46580,7 @@
           <w:noProof/>
         </w:rPr>
         <w:drawing>
-          <wp:inline distT="0" distB="0" distL="0" distR="0" wp14:anchorId="7EC0374D" wp14:editId="2F1690A4">
+          <wp:inline distT="0" distB="0" distL="0" distR="0" wp14:anchorId="29905957" wp14:editId="21C02C15">
             <wp:extent cx="5715000" cy="3571875"/>
             <wp:effectExtent l="0" t="0" r="0" b="0"/>
             <wp:docPr id="38" name="47-audit.png" descr="The Audit Log page with export button, statistic cards, daily chart and filters." title="The Audit Log page with export button, statistic cards, daily chart and filters."/>
@@ -47441,7 +47441,7 @@
         <w:pStyle w:val="Ttulo1"/>
         <w:pageBreakBefore/>
       </w:pPr>
-      <w:bookmarkStart w:id="57" w:name="_Toc241667980"/>
+      <w:bookmarkStart w:id="57" w:name="_Toc241670511"/>
       <w:r>
         <w:lastRenderedPageBreak/>
         <w:t>Migration</w:t>
@@ -47521,7 +47521,7 @@
           <w:noProof/>
         </w:rPr>
         <w:drawing>
-          <wp:inline distT="0" distB="0" distL="0" distR="0" wp14:anchorId="0FB7AD3C" wp14:editId="147D9F7B">
+          <wp:inline distT="0" distB="0" distL="0" distR="0" wp14:anchorId="6467F46C" wp14:editId="0318C86D">
             <wp:extent cx="5715000" cy="3571875"/>
             <wp:effectExtent l="0" t="0" r="0" b="0"/>
             <wp:docPr id="39" name="50-migration.png" descr="The Migration page with the Source card, its buttons and help text." title="The Migration page with the Source card, its buttons and help text."/>
@@ -47598,7 +47598,7 @@
       <w:pPr>
         <w:pStyle w:val="Ttulo2"/>
       </w:pPr>
-      <w:bookmarkStart w:id="58" w:name="_Toc241667981"/>
+      <w:bookmarkStart w:id="58" w:name="_Toc241670512"/>
       <w:r>
         <w:t>Choose the source</w:t>
       </w:r>
@@ -48719,7 +48719,7 @@
       <w:pPr>
         <w:pStyle w:val="Ttulo2"/>
       </w:pPr>
-      <w:bookmarkStart w:id="59" w:name="_Toc241667982"/>
+      <w:bookmarkStart w:id="59" w:name="_Toc241670513"/>
       <w:r>
         <w:t>What each action does</w:t>
       </w:r>
@@ -49120,7 +49120,7 @@
       <w:pPr>
         <w:pStyle w:val="Ttulo2"/>
       </w:pPr>
-      <w:bookmarkStart w:id="60" w:name="_Toc241667983"/>
+      <w:bookmarkStart w:id="60" w:name="_Toc241670514"/>
       <w:r>
         <w:t>Do a migration safely</w:t>
       </w:r>
@@ -49362,7 +49362,7 @@
         <w:pStyle w:val="Ttulo1"/>
         <w:pageBreakBefore/>
       </w:pPr>
-      <w:bookmarkStart w:id="61" w:name="_Toc241667984"/>
+      <w:bookmarkStart w:id="61" w:name="_Toc241670515"/>
       <w:r>
         <w:lastRenderedPageBreak/>
         <w:t>Common questions</w:t>
@@ -49653,7 +49653,7 @@
       <w:pPr>
         <w:pStyle w:val="Ttulo2"/>
       </w:pPr>
-      <w:bookmarkStart w:id="62" w:name="_Toc241667985"/>
+      <w:bookmarkStart w:id="62" w:name="_Toc241670516"/>
       <w:r>
         <w:t>Glossary</w:t>
       </w:r>
@@ -50978,7 +50978,7 @@
         <w:sz w:val="16"/>
         <w:szCs w:val="16"/>
       </w:rPr>
-      <w:t>Discoverer Neo 2.0.0 · Complete guide · ADMIN</w:t>
+      <w:t>Discoverer Neo 2.0.1 · Complete guide · ADMIN</w:t>
     </w:r>
   </w:p>
 </w:hdr>
@@ -50987,10 +50987,10 @@
 <file path=word/numbering.xml><?xml version="1.0" encoding="utf-8"?>
 <w:numbering xmlns:wpc="http://schemas.microsoft.com/office/word/2010/wordprocessingCanvas" xmlns:cx="http://schemas.microsoft.com/office/drawing/2014/chartex" xmlns:cx1="http://schemas.microsoft.com/office/drawing/2015/9/8/chartex" xmlns:cx2="http://schemas.microsoft.com/office/drawing/2015/10/21/chartex" xmlns:cx3="http://schemas.microsoft.com/office/drawing/2016/5/9/chartex" xmlns:cx4="http://schemas.microsoft.com/office/drawing/2016/5/10/chartex" xmlns:cx5="http://schemas.microsoft.com/office/drawing/2016/5/11/chartex" xmlns:cx6="http://schemas.microsoft.com/office/drawing/2016/5/12/chartex" xmlns:cx7="http://schemas.microsoft.com/office/drawing/2016/5/13/chartex" xmlns:cx8="http://schemas.microsoft.com/office/drawing/2016/5/14/chartex" xmlns:mc="http://schemas.openxmlformats.org/markup-compatibility/2006" xmlns:aink="http://schemas.microsoft.com/office/drawing/2016/ink" xmlns:am3d="http://schemas.microsoft.com/office/drawing/2017/model3d" xmlns:o="urn:schemas-microsoft-com:office:office" xmlns:oel="http://schemas.microsoft.com/office/2019/extlst" xmlns:r="http://schemas.openxmlformats.org/officeDocument/2006/relationships" xmlns:m="http://schemas.openxmlformats.org/officeDocument/2006/math" xmlns:v="urn:schemas-microsoft-com:vml" xmlns:wp14="http://schemas.microsoft.com/office/word/2010/wordprocessingDrawing" xmlns:wp="http://schemas.openxmlformats.org/drawingml/2006/wordprocessingDrawing" xmlns:w10="urn:schemas-microsoft-com:office:word" xmlns:w="http://schemas.openxmlformats.org/wordprocessingml/2006/main" xmlns:w14="http://schemas.microsoft.com/office/word/2010/wordml" xmlns:w15="http://schemas.microsoft.com/office/word/2012/wordml" xmlns:w16cex="http://schemas.microsoft.com/office/word/2018/wordml/cex" xmlns:w16cid="http://schemas.microsoft.com/office/word/2016/wordml/cid" xmlns:w16="http://schemas.microsoft.com/office/word/2018/wordml" xmlns:w16sdtdh="http://schemas.microsoft.com/office/word/2020/wordml/sdtdatahash" xmlns:w16se="http://schemas.microsoft.com/office/word/2015/wordml/symex" xmlns:wpg="http://schemas.microsoft.com/office/word/2010/wordprocessingGroup" xmlns:wpi="http://schemas.microsoft.com/office/word/2010/wordprocessingInk" xmlns:wne="http://schemas.microsoft.com/office/word/2006/wordml" xmlns:wps="http://schemas.microsoft.com/office/word/2010/wordprocessingShape" mc:Ignorable="w14 w15 w16se w16cid w16 w16cex w16sdtdh wp14">
   <w:abstractNum w:abstractNumId="0" w15:restartNumberingAfterBreak="0">
-    <w:nsid w:val="084F6738"/>
+    <w:nsid w:val="088F18DB"/>
     <w:multiLevelType w:val="hybridMultilevel"/>
-    <w:tmpl w:val="12BC24FA"/>
-    <w:lvl w:ilvl="0" w:tplc="D7CC2B56">
+    <w:tmpl w:val="8FEA78CE"/>
+    <w:lvl w:ilvl="0" w:tplc="F392E72E">
       <w:start w:val="1"/>
       <w:numFmt w:val="decimal"/>
       <w:lvlText w:val="%1."/>
@@ -50999,7 +50999,7 @@
         <w:ind w:left="360" w:hanging="300"/>
       </w:pPr>
     </w:lvl>
-    <w:lvl w:ilvl="1" w:tplc="D71ABF48" w:tentative="1">
+    <w:lvl w:ilvl="1" w:tplc="9062A3F8" w:tentative="1">
       <w:start w:val="1"/>
       <w:numFmt w:val="lowerLetter"/>
       <w:lvlText w:val="%2."/>
@@ -51008,47 +51008,47 @@
         <w:ind w:left="720" w:hanging="300"/>
       </w:pPr>
     </w:lvl>
-    <w:lvl w:ilvl="2" w:tplc="B34CDF68">
+    <w:lvl w:ilvl="2" w:tplc="C958A76E">
       <w:numFmt w:val="decimal"/>
       <w:lvlText w:val=""/>
       <w:lvlJc w:val="left"/>
     </w:lvl>
-    <w:lvl w:ilvl="3" w:tplc="126E4430">
+    <w:lvl w:ilvl="3" w:tplc="93FE00CA">
       <w:numFmt w:val="decimal"/>
       <w:lvlText w:val=""/>
       <w:lvlJc w:val="left"/>
     </w:lvl>
-    <w:lvl w:ilvl="4" w:tplc="532414CC">
+    <w:lvl w:ilvl="4" w:tplc="AC723F24">
       <w:numFmt w:val="decimal"/>
       <w:lvlText w:val=""/>
       <w:lvlJc w:val="left"/>
     </w:lvl>
-    <w:lvl w:ilvl="5" w:tplc="1D243D9C">
+    <w:lvl w:ilvl="5" w:tplc="DCDA34CA">
       <w:numFmt w:val="decimal"/>
       <w:lvlText w:val=""/>
       <w:lvlJc w:val="left"/>
     </w:lvl>
-    <w:lvl w:ilvl="6" w:tplc="076CFACA">
+    <w:lvl w:ilvl="6" w:tplc="898EAE9A">
       <w:numFmt w:val="decimal"/>
       <w:lvlText w:val=""/>
       <w:lvlJc w:val="left"/>
     </w:lvl>
-    <w:lvl w:ilvl="7" w:tplc="A5AC4D44">
+    <w:lvl w:ilvl="7" w:tplc="DC22ACFC">
       <w:numFmt w:val="decimal"/>
       <w:lvlText w:val=""/>
       <w:lvlJc w:val="left"/>
     </w:lvl>
-    <w:lvl w:ilvl="8" w:tplc="B06CA4B4">
+    <w:lvl w:ilvl="8" w:tplc="C0CABE5E">
       <w:numFmt w:val="decimal"/>
       <w:lvlText w:val=""/>
       <w:lvlJc w:val="left"/>
     </w:lvl>
   </w:abstractNum>
   <w:abstractNum w:abstractNumId="1" w15:restartNumberingAfterBreak="0">
-    <w:nsid w:val="0D39699D"/>
+    <w:nsid w:val="0AFA5350"/>
     <w:multiLevelType w:val="hybridMultilevel"/>
-    <w:tmpl w:val="DC00ADCC"/>
-    <w:lvl w:ilvl="0" w:tplc="FF90CAE0">
+    <w:tmpl w:val="F47CDBCA"/>
+    <w:lvl w:ilvl="0" w:tplc="76180CD4">
       <w:start w:val="1"/>
       <w:numFmt w:val="decimal"/>
       <w:lvlText w:val="%1."/>
@@ -51057,7 +51057,7 @@
         <w:ind w:left="360" w:hanging="300"/>
       </w:pPr>
     </w:lvl>
-    <w:lvl w:ilvl="1" w:tplc="9604BDE0" w:tentative="1">
+    <w:lvl w:ilvl="1" w:tplc="97DA1488" w:tentative="1">
       <w:start w:val="1"/>
       <w:numFmt w:val="lowerLetter"/>
       <w:lvlText w:val="%2."/>
@@ -51066,47 +51066,47 @@
         <w:ind w:left="720" w:hanging="300"/>
       </w:pPr>
     </w:lvl>
-    <w:lvl w:ilvl="2" w:tplc="D6BEF768">
+    <w:lvl w:ilvl="2" w:tplc="FAA29D50">
       <w:numFmt w:val="decimal"/>
       <w:lvlText w:val=""/>
       <w:lvlJc w:val="left"/>
     </w:lvl>
-    <w:lvl w:ilvl="3" w:tplc="F7E841A2">
+    <w:lvl w:ilvl="3" w:tplc="B7A6F922">
       <w:numFmt w:val="decimal"/>
       <w:lvlText w:val=""/>
       <w:lvlJc w:val="left"/>
     </w:lvl>
-    <w:lvl w:ilvl="4" w:tplc="3F12287C">
+    <w:lvl w:ilvl="4" w:tplc="58DA0658">
       <w:numFmt w:val="decimal"/>
       <w:lvlText w:val=""/>
       <w:lvlJc w:val="left"/>
     </w:lvl>
-    <w:lvl w:ilvl="5" w:tplc="6BBC8AC4">
+    <w:lvl w:ilvl="5" w:tplc="D8720F22">
       <w:numFmt w:val="decimal"/>
       <w:lvlText w:val=""/>
       <w:lvlJc w:val="left"/>
     </w:lvl>
-    <w:lvl w:ilvl="6" w:tplc="046AADB0">
+    <w:lvl w:ilvl="6" w:tplc="F1749590">
       <w:numFmt w:val="decimal"/>
       <w:lvlText w:val=""/>
       <w:lvlJc w:val="left"/>
     </w:lvl>
-    <w:lvl w:ilvl="7" w:tplc="AC04BEC6">
+    <w:lvl w:ilvl="7" w:tplc="63ECCF54">
       <w:numFmt w:val="decimal"/>
       <w:lvlText w:val=""/>
       <w:lvlJc w:val="left"/>
     </w:lvl>
-    <w:lvl w:ilvl="8" w:tplc="323ECE40">
+    <w:lvl w:ilvl="8" w:tplc="539041D8">
       <w:numFmt w:val="decimal"/>
       <w:lvlText w:val=""/>
       <w:lvlJc w:val="left"/>
     </w:lvl>
   </w:abstractNum>
   <w:abstractNum w:abstractNumId="2" w15:restartNumberingAfterBreak="0">
-    <w:nsid w:val="302115DE"/>
+    <w:nsid w:val="0E492FA5"/>
     <w:multiLevelType w:val="hybridMultilevel"/>
-    <w:tmpl w:val="2AC2A7D2"/>
-    <w:lvl w:ilvl="0" w:tplc="95AC55B0">
+    <w:tmpl w:val="06F2D736"/>
+    <w:lvl w:ilvl="0" w:tplc="F2BA7452">
       <w:start w:val="1"/>
       <w:numFmt w:val="decimal"/>
       <w:lvlText w:val="%1."/>
@@ -51115,7 +51115,7 @@
         <w:ind w:left="360" w:hanging="300"/>
       </w:pPr>
     </w:lvl>
-    <w:lvl w:ilvl="1" w:tplc="A2D6655E" w:tentative="1">
+    <w:lvl w:ilvl="1" w:tplc="D640E31E" w:tentative="1">
       <w:start w:val="1"/>
       <w:numFmt w:val="lowerLetter"/>
       <w:lvlText w:val="%2."/>
@@ -51124,47 +51124,47 @@
         <w:ind w:left="720" w:hanging="300"/>
       </w:pPr>
     </w:lvl>
-    <w:lvl w:ilvl="2" w:tplc="43602086">
+    <w:lvl w:ilvl="2" w:tplc="BBA8AC4C">
       <w:numFmt w:val="decimal"/>
       <w:lvlText w:val=""/>
       <w:lvlJc w:val="left"/>
     </w:lvl>
-    <w:lvl w:ilvl="3" w:tplc="1020FCE6">
+    <w:lvl w:ilvl="3" w:tplc="8778A3A2">
       <w:numFmt w:val="decimal"/>
       <w:lvlText w:val=""/>
       <w:lvlJc w:val="left"/>
     </w:lvl>
-    <w:lvl w:ilvl="4" w:tplc="B7023C92">
+    <w:lvl w:ilvl="4" w:tplc="E9FC0C96">
       <w:numFmt w:val="decimal"/>
       <w:lvlText w:val=""/>
       <w:lvlJc w:val="left"/>
     </w:lvl>
-    <w:lvl w:ilvl="5" w:tplc="11B23D94">
+    <w:lvl w:ilvl="5" w:tplc="3556A654">
       <w:numFmt w:val="decimal"/>
       <w:lvlText w:val=""/>
       <w:lvlJc w:val="left"/>
     </w:lvl>
-    <w:lvl w:ilvl="6" w:tplc="B3507494">
+    <w:lvl w:ilvl="6" w:tplc="5AE69A0E">
       <w:numFmt w:val="decimal"/>
       <w:lvlText w:val=""/>
       <w:lvlJc w:val="left"/>
     </w:lvl>
-    <w:lvl w:ilvl="7" w:tplc="B21ECA0A">
+    <w:lvl w:ilvl="7" w:tplc="B8D444C4">
       <w:numFmt w:val="decimal"/>
       <w:lvlText w:val=""/>
       <w:lvlJc w:val="left"/>
     </w:lvl>
-    <w:lvl w:ilvl="8" w:tplc="961ACC0C">
+    <w:lvl w:ilvl="8" w:tplc="7C3EB5E6">
       <w:numFmt w:val="decimal"/>
       <w:lvlText w:val=""/>
       <w:lvlJc w:val="left"/>
     </w:lvl>
   </w:abstractNum>
   <w:abstractNum w:abstractNumId="3" w15:restartNumberingAfterBreak="0">
-    <w:nsid w:val="33964BEE"/>
+    <w:nsid w:val="197C538F"/>
     <w:multiLevelType w:val="hybridMultilevel"/>
-    <w:tmpl w:val="5DF2884E"/>
-    <w:lvl w:ilvl="0" w:tplc="B6C41FBC">
+    <w:tmpl w:val="B748F90A"/>
+    <w:lvl w:ilvl="0" w:tplc="AE301114">
       <w:start w:val="1"/>
       <w:numFmt w:val="decimal"/>
       <w:lvlText w:val="%1."/>
@@ -51173,7 +51173,7 @@
         <w:ind w:left="360" w:hanging="300"/>
       </w:pPr>
     </w:lvl>
-    <w:lvl w:ilvl="1" w:tplc="E7265C96" w:tentative="1">
+    <w:lvl w:ilvl="1" w:tplc="A8B24D6C" w:tentative="1">
       <w:start w:val="1"/>
       <w:numFmt w:val="lowerLetter"/>
       <w:lvlText w:val="%2."/>
@@ -51182,47 +51182,47 @@
         <w:ind w:left="720" w:hanging="300"/>
       </w:pPr>
     </w:lvl>
-    <w:lvl w:ilvl="2" w:tplc="62B67B82">
+    <w:lvl w:ilvl="2" w:tplc="8D06C408">
       <w:numFmt w:val="decimal"/>
       <w:lvlText w:val=""/>
       <w:lvlJc w:val="left"/>
     </w:lvl>
-    <w:lvl w:ilvl="3" w:tplc="88B4D4E2">
+    <w:lvl w:ilvl="3" w:tplc="E5C2011C">
       <w:numFmt w:val="decimal"/>
       <w:lvlText w:val=""/>
       <w:lvlJc w:val="left"/>
     </w:lvl>
-    <w:lvl w:ilvl="4" w:tplc="67D4CBCA">
+    <w:lvl w:ilvl="4" w:tplc="D632B882">
       <w:numFmt w:val="decimal"/>
       <w:lvlText w:val=""/>
       <w:lvlJc w:val="left"/>
     </w:lvl>
-    <w:lvl w:ilvl="5" w:tplc="AC20D072">
+    <w:lvl w:ilvl="5" w:tplc="EB467E5E">
       <w:numFmt w:val="decimal"/>
       <w:lvlText w:val=""/>
       <w:lvlJc w:val="left"/>
     </w:lvl>
-    <w:lvl w:ilvl="6" w:tplc="5BF2C356">
+    <w:lvl w:ilvl="6" w:tplc="42DE99A2">
       <w:numFmt w:val="decimal"/>
       <w:lvlText w:val=""/>
       <w:lvlJc w:val="left"/>
     </w:lvl>
-    <w:lvl w:ilvl="7" w:tplc="6FFC8AE6">
+    <w:lvl w:ilvl="7" w:tplc="5816D8EE">
       <w:numFmt w:val="decimal"/>
       <w:lvlText w:val=""/>
       <w:lvlJc w:val="left"/>
     </w:lvl>
-    <w:lvl w:ilvl="8" w:tplc="019AB14A">
+    <w:lvl w:ilvl="8" w:tplc="A2EE2A64">
       <w:numFmt w:val="decimal"/>
       <w:lvlText w:val=""/>
       <w:lvlJc w:val="left"/>
     </w:lvl>
   </w:abstractNum>
   <w:abstractNum w:abstractNumId="4" w15:restartNumberingAfterBreak="0">
-    <w:nsid w:val="3C942D2A"/>
+    <w:nsid w:val="289A65B7"/>
     <w:multiLevelType w:val="hybridMultilevel"/>
-    <w:tmpl w:val="A2F633C6"/>
-    <w:lvl w:ilvl="0" w:tplc="953825D8">
+    <w:tmpl w:val="F1B2E7D4"/>
+    <w:lvl w:ilvl="0" w:tplc="6E368D06">
       <w:start w:val="1"/>
       <w:numFmt w:val="decimal"/>
       <w:lvlText w:val="%1."/>
@@ -51231,7 +51231,7 @@
         <w:ind w:left="360" w:hanging="300"/>
       </w:pPr>
     </w:lvl>
-    <w:lvl w:ilvl="1" w:tplc="34BC90EE" w:tentative="1">
+    <w:lvl w:ilvl="1" w:tplc="ABA2F4A6" w:tentative="1">
       <w:start w:val="1"/>
       <w:numFmt w:val="lowerLetter"/>
       <w:lvlText w:val="%2."/>
@@ -51240,47 +51240,47 @@
         <w:ind w:left="720" w:hanging="300"/>
       </w:pPr>
     </w:lvl>
-    <w:lvl w:ilvl="2" w:tplc="A1E6A2F0">
+    <w:lvl w:ilvl="2" w:tplc="1F649188">
       <w:numFmt w:val="decimal"/>
       <w:lvlText w:val=""/>
       <w:lvlJc w:val="left"/>
     </w:lvl>
-    <w:lvl w:ilvl="3" w:tplc="5562FB08">
+    <w:lvl w:ilvl="3" w:tplc="759EB91C">
       <w:numFmt w:val="decimal"/>
       <w:lvlText w:val=""/>
       <w:lvlJc w:val="left"/>
     </w:lvl>
-    <w:lvl w:ilvl="4" w:tplc="F8C67DEE">
+    <w:lvl w:ilvl="4" w:tplc="D51C424A">
       <w:numFmt w:val="decimal"/>
       <w:lvlText w:val=""/>
       <w:lvlJc w:val="left"/>
     </w:lvl>
-    <w:lvl w:ilvl="5" w:tplc="9D6E1AC4">
+    <w:lvl w:ilvl="5" w:tplc="733EB6D6">
       <w:numFmt w:val="decimal"/>
       <w:lvlText w:val=""/>
       <w:lvlJc w:val="left"/>
     </w:lvl>
-    <w:lvl w:ilvl="6" w:tplc="4C5CFAC8">
+    <w:lvl w:ilvl="6" w:tplc="D6CE5B5C">
       <w:numFmt w:val="decimal"/>
       <w:lvlText w:val=""/>
       <w:lvlJc w:val="left"/>
     </w:lvl>
-    <w:lvl w:ilvl="7" w:tplc="58C622AE">
+    <w:lvl w:ilvl="7" w:tplc="6E9E2F84">
       <w:numFmt w:val="decimal"/>
       <w:lvlText w:val=""/>
       <w:lvlJc w:val="left"/>
     </w:lvl>
-    <w:lvl w:ilvl="8" w:tplc="C332CDA2">
+    <w:lvl w:ilvl="8" w:tplc="32764AA4">
       <w:numFmt w:val="decimal"/>
       <w:lvlText w:val=""/>
       <w:lvlJc w:val="left"/>
     </w:lvl>
   </w:abstractNum>
   <w:abstractNum w:abstractNumId="5" w15:restartNumberingAfterBreak="0">
-    <w:nsid w:val="4B66411B"/>
+    <w:nsid w:val="30403CBD"/>
     <w:multiLevelType w:val="hybridMultilevel"/>
-    <w:tmpl w:val="E048AB2C"/>
-    <w:lvl w:ilvl="0" w:tplc="2076B5EE">
+    <w:tmpl w:val="C7BAC4C8"/>
+    <w:lvl w:ilvl="0" w:tplc="CDCC9B6C">
       <w:start w:val="1"/>
       <w:numFmt w:val="decimal"/>
       <w:lvlText w:val="%1."/>
@@ -51289,7 +51289,7 @@
         <w:ind w:left="360" w:hanging="300"/>
       </w:pPr>
     </w:lvl>
-    <w:lvl w:ilvl="1" w:tplc="1D8CFDEE" w:tentative="1">
+    <w:lvl w:ilvl="1" w:tplc="EBB288B0" w:tentative="1">
       <w:start w:val="1"/>
       <w:numFmt w:val="lowerLetter"/>
       <w:lvlText w:val="%2."/>
@@ -51298,47 +51298,47 @@
         <w:ind w:left="720" w:hanging="300"/>
       </w:pPr>
     </w:lvl>
-    <w:lvl w:ilvl="2" w:tplc="3F90CDF2">
+    <w:lvl w:ilvl="2" w:tplc="66B8274E">
       <w:numFmt w:val="decimal"/>
       <w:lvlText w:val=""/>
       <w:lvlJc w:val="left"/>
     </w:lvl>
-    <w:lvl w:ilvl="3" w:tplc="4EEC2370">
+    <w:lvl w:ilvl="3" w:tplc="46AA66F0">
       <w:numFmt w:val="decimal"/>
       <w:lvlText w:val=""/>
       <w:lvlJc w:val="left"/>
     </w:lvl>
-    <w:lvl w:ilvl="4" w:tplc="E284A574">
+    <w:lvl w:ilvl="4" w:tplc="88FC9D78">
       <w:numFmt w:val="decimal"/>
       <w:lvlText w:val=""/>
       <w:lvlJc w:val="left"/>
     </w:lvl>
-    <w:lvl w:ilvl="5" w:tplc="C18818D2">
+    <w:lvl w:ilvl="5" w:tplc="9A1A656C">
       <w:numFmt w:val="decimal"/>
       <w:lvlText w:val=""/>
       <w:lvlJc w:val="left"/>
     </w:lvl>
-    <w:lvl w:ilvl="6" w:tplc="A486434C">
+    <w:lvl w:ilvl="6" w:tplc="3F16B79E">
       <w:numFmt w:val="decimal"/>
       <w:lvlText w:val=""/>
       <w:lvlJc w:val="left"/>
     </w:lvl>
-    <w:lvl w:ilvl="7" w:tplc="17E88B1C">
+    <w:lvl w:ilvl="7" w:tplc="CEDEC578">
       <w:numFmt w:val="decimal"/>
       <w:lvlText w:val=""/>
       <w:lvlJc w:val="left"/>
     </w:lvl>
-    <w:lvl w:ilvl="8" w:tplc="276253E4">
+    <w:lvl w:ilvl="8" w:tplc="2252240C">
       <w:numFmt w:val="decimal"/>
       <w:lvlText w:val=""/>
       <w:lvlJc w:val="left"/>
     </w:lvl>
   </w:abstractNum>
   <w:abstractNum w:abstractNumId="6" w15:restartNumberingAfterBreak="0">
-    <w:nsid w:val="4FE36DFE"/>
+    <w:nsid w:val="383B5C6E"/>
     <w:multiLevelType w:val="hybridMultilevel"/>
-    <w:tmpl w:val="F5A42B56"/>
-    <w:lvl w:ilvl="0" w:tplc="DB142974">
+    <w:tmpl w:val="4D38E320"/>
+    <w:lvl w:ilvl="0" w:tplc="FB242A4A">
       <w:start w:val="1"/>
       <w:numFmt w:val="decimal"/>
       <w:lvlText w:val="%1."/>
@@ -51347,7 +51347,7 @@
         <w:ind w:left="360" w:hanging="300"/>
       </w:pPr>
     </w:lvl>
-    <w:lvl w:ilvl="1" w:tplc="A87A021E" w:tentative="1">
+    <w:lvl w:ilvl="1" w:tplc="DE80614A" w:tentative="1">
       <w:start w:val="1"/>
       <w:numFmt w:val="lowerLetter"/>
       <w:lvlText w:val="%2."/>
@@ -51356,47 +51356,47 @@
         <w:ind w:left="720" w:hanging="300"/>
       </w:pPr>
     </w:lvl>
-    <w:lvl w:ilvl="2" w:tplc="A290E8FE">
+    <w:lvl w:ilvl="2" w:tplc="AEFEB6D2">
       <w:numFmt w:val="decimal"/>
       <w:lvlText w:val=""/>
       <w:lvlJc w:val="left"/>
     </w:lvl>
-    <w:lvl w:ilvl="3" w:tplc="14B4AB06">
+    <w:lvl w:ilvl="3" w:tplc="06900C3A">
       <w:numFmt w:val="decimal"/>
       <w:lvlText w:val=""/>
       <w:lvlJc w:val="left"/>
     </w:lvl>
-    <w:lvl w:ilvl="4" w:tplc="AC72FCA2">
+    <w:lvl w:ilvl="4" w:tplc="757EF75C">
       <w:numFmt w:val="decimal"/>
       <w:lvlText w:val=""/>
       <w:lvlJc w:val="left"/>
     </w:lvl>
-    <w:lvl w:ilvl="5" w:tplc="55BA2436">
+    <w:lvl w:ilvl="5" w:tplc="2918F362">
       <w:numFmt w:val="decimal"/>
       <w:lvlText w:val=""/>
       <w:lvlJc w:val="left"/>
     </w:lvl>
-    <w:lvl w:ilvl="6" w:tplc="9050E220">
+    <w:lvl w:ilvl="6" w:tplc="A352F028">
       <w:numFmt w:val="decimal"/>
       <w:lvlText w:val=""/>
       <w:lvlJc w:val="left"/>
     </w:lvl>
-    <w:lvl w:ilvl="7" w:tplc="A32A1F64">
+    <w:lvl w:ilvl="7" w:tplc="E43A16FE">
       <w:numFmt w:val="decimal"/>
       <w:lvlText w:val=""/>
       <w:lvlJc w:val="left"/>
     </w:lvl>
-    <w:lvl w:ilvl="8" w:tplc="8D9E4DCA">
+    <w:lvl w:ilvl="8" w:tplc="550C3902">
       <w:numFmt w:val="decimal"/>
       <w:lvlText w:val=""/>
       <w:lvlJc w:val="left"/>
     </w:lvl>
   </w:abstractNum>
   <w:abstractNum w:abstractNumId="7" w15:restartNumberingAfterBreak="0">
-    <w:nsid w:val="524451A6"/>
+    <w:nsid w:val="478212B4"/>
     <w:multiLevelType w:val="hybridMultilevel"/>
-    <w:tmpl w:val="31B0929C"/>
-    <w:lvl w:ilvl="0" w:tplc="DB4A427A">
+    <w:tmpl w:val="57747616"/>
+    <w:lvl w:ilvl="0" w:tplc="ACBC2346">
       <w:start w:val="1"/>
       <w:numFmt w:val="decimal"/>
       <w:lvlText w:val="%1."/>
@@ -51405,7 +51405,7 @@
         <w:ind w:left="360" w:hanging="300"/>
       </w:pPr>
     </w:lvl>
-    <w:lvl w:ilvl="1" w:tplc="937202DE" w:tentative="1">
+    <w:lvl w:ilvl="1" w:tplc="A7DAEAEE" w:tentative="1">
       <w:start w:val="1"/>
       <w:numFmt w:val="lowerLetter"/>
       <w:lvlText w:val="%2."/>
@@ -51414,105 +51414,47 @@
         <w:ind w:left="720" w:hanging="300"/>
       </w:pPr>
     </w:lvl>
-    <w:lvl w:ilvl="2" w:tplc="3B768B96">
+    <w:lvl w:ilvl="2" w:tplc="60E4871A">
       <w:numFmt w:val="decimal"/>
       <w:lvlText w:val=""/>
       <w:lvlJc w:val="left"/>
     </w:lvl>
-    <w:lvl w:ilvl="3" w:tplc="7AE6710C">
+    <w:lvl w:ilvl="3" w:tplc="6EAE8088">
       <w:numFmt w:val="decimal"/>
       <w:lvlText w:val=""/>
       <w:lvlJc w:val="left"/>
     </w:lvl>
-    <w:lvl w:ilvl="4" w:tplc="36443FCA">
+    <w:lvl w:ilvl="4" w:tplc="835CE932">
       <w:numFmt w:val="decimal"/>
       <w:lvlText w:val=""/>
       <w:lvlJc w:val="left"/>
     </w:lvl>
-    <w:lvl w:ilvl="5" w:tplc="862848B8">
+    <w:lvl w:ilvl="5" w:tplc="CD4EE738">
       <w:numFmt w:val="decimal"/>
       <w:lvlText w:val=""/>
       <w:lvlJc w:val="left"/>
     </w:lvl>
-    <w:lvl w:ilvl="6" w:tplc="2794AFB4">
+    <w:lvl w:ilvl="6" w:tplc="E368C554">
       <w:numFmt w:val="decimal"/>
       <w:lvlText w:val=""/>
       <w:lvlJc w:val="left"/>
     </w:lvl>
-    <w:lvl w:ilvl="7" w:tplc="FB2C64FE">
+    <w:lvl w:ilvl="7" w:tplc="E4808FAC">
       <w:numFmt w:val="decimal"/>
       <w:lvlText w:val=""/>
       <w:lvlJc w:val="left"/>
     </w:lvl>
-    <w:lvl w:ilvl="8" w:tplc="CE7E2D6A">
+    <w:lvl w:ilvl="8" w:tplc="56C408F8">
       <w:numFmt w:val="decimal"/>
       <w:lvlText w:val=""/>
       <w:lvlJc w:val="left"/>
     </w:lvl>
   </w:abstractNum>
   <w:abstractNum w:abstractNumId="8" w15:restartNumberingAfterBreak="0">
-    <w:nsid w:val="614F4D02"/>
+    <w:nsid w:val="4FC051ED"/>
     <w:multiLevelType w:val="hybridMultilevel"/>
-    <w:tmpl w:val="1C7281C0"/>
-    <w:lvl w:ilvl="0" w:tplc="447CCCD6">
-      <w:start w:val="1"/>
-      <w:numFmt w:val="bullet"/>
-      <w:lvlText w:val="•"/>
-      <w:lvlJc w:val="left"/>
-      <w:pPr>
-        <w:ind w:left="360" w:hanging="260"/>
-      </w:pPr>
-    </w:lvl>
-    <w:lvl w:ilvl="1" w:tplc="A356C456" w:tentative="1">
-      <w:start w:val="1"/>
-      <w:numFmt w:val="bullet"/>
-      <w:lvlText w:val="–"/>
-      <w:lvlJc w:val="left"/>
-      <w:pPr>
-        <w:ind w:left="720" w:hanging="260"/>
-      </w:pPr>
-    </w:lvl>
-    <w:lvl w:ilvl="2" w:tplc="C748B610">
-      <w:numFmt w:val="decimal"/>
-      <w:lvlText w:val=""/>
-      <w:lvlJc w:val="left"/>
-    </w:lvl>
-    <w:lvl w:ilvl="3" w:tplc="236C3200">
-      <w:numFmt w:val="decimal"/>
-      <w:lvlText w:val=""/>
-      <w:lvlJc w:val="left"/>
-    </w:lvl>
-    <w:lvl w:ilvl="4" w:tplc="9E2446C6">
-      <w:numFmt w:val="decimal"/>
-      <w:lvlText w:val=""/>
-      <w:lvlJc w:val="left"/>
-    </w:lvl>
-    <w:lvl w:ilvl="5" w:tplc="967CBB32">
-      <w:numFmt w:val="decimal"/>
-      <w:lvlText w:val=""/>
-      <w:lvlJc w:val="left"/>
-    </w:lvl>
-    <w:lvl w:ilvl="6" w:tplc="DE726A7C">
-      <w:numFmt w:val="decimal"/>
-      <w:lvlText w:val=""/>
-      <w:lvlJc w:val="left"/>
-    </w:lvl>
-    <w:lvl w:ilvl="7" w:tplc="981A8C60">
-      <w:numFmt w:val="decimal"/>
-      <w:lvlText w:val=""/>
-      <w:lvlJc w:val="left"/>
-    </w:lvl>
-    <w:lvl w:ilvl="8" w:tplc="CC126F2C">
-      <w:numFmt w:val="decimal"/>
-      <w:lvlText w:val=""/>
-      <w:lvlJc w:val="left"/>
-    </w:lvl>
-  </w:abstractNum>
-  <w:abstractNum w:abstractNumId="9" w15:restartNumberingAfterBreak="0">
-    <w:nsid w:val="661A30A2"/>
-    <w:multiLevelType w:val="hybridMultilevel"/>
-    <w:tmpl w:val="CABE5EE6"/>
-    <w:lvl w:ilvl="0" w:tplc="16FC0FCE">
+    <w:tmpl w:val="58C2882A"/>
+    <w:lvl w:ilvl="0" w:tplc="57D60F88">
       <w:start w:val="1"/>
       <w:numFmt w:val="decimal"/>
       <w:lvlText w:val="%1."/>
@@ -51521,7 +51463,7 @@
         <w:ind w:left="360" w:hanging="300"/>
       </w:pPr>
     </w:lvl>
-    <w:lvl w:ilvl="1" w:tplc="B36A748C" w:tentative="1">
+    <w:lvl w:ilvl="1" w:tplc="3EE2F96E" w:tentative="1">
       <w:start w:val="1"/>
       <w:numFmt w:val="lowerLetter"/>
       <w:lvlText w:val="%2."/>
@@ -51530,47 +51472,47 @@
         <w:ind w:left="720" w:hanging="300"/>
       </w:pPr>
     </w:lvl>
-    <w:lvl w:ilvl="2" w:tplc="C15EC1B4">
+    <w:lvl w:ilvl="2" w:tplc="9BE64F54">
       <w:numFmt w:val="decimal"/>
       <w:lvlText w:val=""/>
       <w:lvlJc w:val="left"/>
     </w:lvl>
-    <w:lvl w:ilvl="3" w:tplc="B30EBCBA">
+    <w:lvl w:ilvl="3" w:tplc="9BDAA300">
       <w:numFmt w:val="decimal"/>
       <w:lvlText w:val=""/>
       <w:lvlJc w:val="left"/>
     </w:lvl>
-    <w:lvl w:ilvl="4" w:tplc="A02AEF7C">
+    <w:lvl w:ilvl="4" w:tplc="B2F25BE4">
       <w:numFmt w:val="decimal"/>
       <w:lvlText w:val=""/>
       <w:lvlJc w:val="left"/>
     </w:lvl>
-    <w:lvl w:ilvl="5" w:tplc="23EC8FE8">
+    <w:lvl w:ilvl="5" w:tplc="D62AB202">
       <w:numFmt w:val="decimal"/>
       <w:lvlText w:val=""/>
       <w:lvlJc w:val="left"/>
     </w:lvl>
-    <w:lvl w:ilvl="6" w:tplc="245421FE">
+    <w:lvl w:ilvl="6" w:tplc="68FA9D7C">
       <w:numFmt w:val="decimal"/>
       <w:lvlText w:val=""/>
       <w:lvlJc w:val="left"/>
     </w:lvl>
-    <w:lvl w:ilvl="7" w:tplc="83FA7FD0">
+    <w:lvl w:ilvl="7" w:tplc="21D0A1A2">
       <w:numFmt w:val="decimal"/>
       <w:lvlText w:val=""/>
       <w:lvlJc w:val="left"/>
     </w:lvl>
-    <w:lvl w:ilvl="8" w:tplc="EEEEB5DA">
+    <w:lvl w:ilvl="8" w:tplc="6C0453AC">
       <w:numFmt w:val="decimal"/>
       <w:lvlText w:val=""/>
       <w:lvlJc w:val="left"/>
     </w:lvl>
   </w:abstractNum>
-  <w:abstractNum w:abstractNumId="10" w15:restartNumberingAfterBreak="0">
-    <w:nsid w:val="6A8413FD"/>
+  <w:abstractNum w:abstractNumId="9" w15:restartNumberingAfterBreak="0">
+    <w:nsid w:val="50E52B15"/>
     <w:multiLevelType w:val="hybridMultilevel"/>
-    <w:tmpl w:val="2AD804AA"/>
-    <w:lvl w:ilvl="0" w:tplc="2C6CA820">
+    <w:tmpl w:val="1318EB14"/>
+    <w:lvl w:ilvl="0" w:tplc="168C649C">
       <w:start w:val="1"/>
       <w:numFmt w:val="decimal"/>
       <w:lvlText w:val="%1."/>
@@ -51579,7 +51521,7 @@
         <w:ind w:left="360" w:hanging="300"/>
       </w:pPr>
     </w:lvl>
-    <w:lvl w:ilvl="1" w:tplc="6FB85888" w:tentative="1">
+    <w:lvl w:ilvl="1" w:tplc="092E7472" w:tentative="1">
       <w:start w:val="1"/>
       <w:numFmt w:val="lowerLetter"/>
       <w:lvlText w:val="%2."/>
@@ -51588,105 +51530,47 @@
         <w:ind w:left="720" w:hanging="300"/>
       </w:pPr>
     </w:lvl>
-    <w:lvl w:ilvl="2" w:tplc="C980ED20">
+    <w:lvl w:ilvl="2" w:tplc="B86213A0">
       <w:numFmt w:val="decimal"/>
       <w:lvlText w:val=""/>
       <w:lvlJc w:val="left"/>
     </w:lvl>
-    <w:lvl w:ilvl="3" w:tplc="9E5CA0A2">
+    <w:lvl w:ilvl="3" w:tplc="397EFA8E">
       <w:numFmt w:val="decimal"/>
       <w:lvlText w:val=""/>
       <w:lvlJc w:val="left"/>
     </w:lvl>
-    <w:lvl w:ilvl="4" w:tplc="DF2896FC">
+    <w:lvl w:ilvl="4" w:tplc="AF2CD98A">
       <w:numFmt w:val="decimal"/>
       <w:lvlText w:val=""/>
       <w:lvlJc w:val="left"/>
     </w:lvl>
-    <w:lvl w:ilvl="5" w:tplc="C504A1C0">
+    <w:lvl w:ilvl="5" w:tplc="25B60274">
       <w:numFmt w:val="decimal"/>
       <w:lvlText w:val=""/>
       <w:lvlJc w:val="left"/>
     </w:lvl>
-    <w:lvl w:ilvl="6" w:tplc="BB2C3524">
+    <w:lvl w:ilvl="6" w:tplc="90D24742">
       <w:numFmt w:val="decimal"/>
       <w:lvlText w:val=""/>
       <w:lvlJc w:val="left"/>
     </w:lvl>
-    <w:lvl w:ilvl="7" w:tplc="24227592">
+    <w:lvl w:ilvl="7" w:tplc="01F0A8FA">
       <w:numFmt w:val="decimal"/>
       <w:lvlText w:val=""/>
       <w:lvlJc w:val="left"/>
     </w:lvl>
-    <w:lvl w:ilvl="8" w:tplc="BFB658F8">
+    <w:lvl w:ilvl="8" w:tplc="1C2AD052">
       <w:numFmt w:val="decimal"/>
       <w:lvlText w:val=""/>
       <w:lvlJc w:val="left"/>
     </w:lvl>
   </w:abstractNum>
-  <w:abstractNum w:abstractNumId="11" w15:restartNumberingAfterBreak="0">
-    <w:nsid w:val="6D7A34DD"/>
+  <w:abstractNum w:abstractNumId="10" w15:restartNumberingAfterBreak="0">
+    <w:nsid w:val="54CF5D01"/>
     <w:multiLevelType w:val="hybridMultilevel"/>
-    <w:tmpl w:val="5B32EC78"/>
-    <w:lvl w:ilvl="0" w:tplc="7CF401FE">
-      <w:start w:val="1"/>
-      <w:numFmt w:val="decimal"/>
-      <w:lvlText w:val="%1."/>
-      <w:lvlJc w:val="left"/>
-      <w:pPr>
-        <w:ind w:left="360" w:hanging="300"/>
-      </w:pPr>
-    </w:lvl>
-    <w:lvl w:ilvl="1" w:tplc="B4908722" w:tentative="1">
-      <w:start w:val="1"/>
-      <w:numFmt w:val="lowerLetter"/>
-      <w:lvlText w:val="%2."/>
-      <w:lvlJc w:val="left"/>
-      <w:pPr>
-        <w:ind w:left="720" w:hanging="300"/>
-      </w:pPr>
-    </w:lvl>
-    <w:lvl w:ilvl="2" w:tplc="97007A38">
-      <w:numFmt w:val="decimal"/>
-      <w:lvlText w:val=""/>
-      <w:lvlJc w:val="left"/>
-    </w:lvl>
-    <w:lvl w:ilvl="3" w:tplc="2E328FFC">
-      <w:numFmt w:val="decimal"/>
-      <w:lvlText w:val=""/>
-      <w:lvlJc w:val="left"/>
-    </w:lvl>
-    <w:lvl w:ilvl="4" w:tplc="629C8F0A">
-      <w:numFmt w:val="decimal"/>
-      <w:lvlText w:val=""/>
-      <w:lvlJc w:val="left"/>
-    </w:lvl>
-    <w:lvl w:ilvl="5" w:tplc="03F2D06A">
-      <w:numFmt w:val="decimal"/>
-      <w:lvlText w:val=""/>
-      <w:lvlJc w:val="left"/>
-    </w:lvl>
-    <w:lvl w:ilvl="6" w:tplc="172E9FE4">
-      <w:numFmt w:val="decimal"/>
-      <w:lvlText w:val=""/>
-      <w:lvlJc w:val="left"/>
-    </w:lvl>
-    <w:lvl w:ilvl="7" w:tplc="5D0A9AEA">
-      <w:numFmt w:val="decimal"/>
-      <w:lvlText w:val=""/>
-      <w:lvlJc w:val="left"/>
-    </w:lvl>
-    <w:lvl w:ilvl="8" w:tplc="78A48976">
-      <w:numFmt w:val="decimal"/>
-      <w:lvlText w:val=""/>
-      <w:lvlJc w:val="left"/>
-    </w:lvl>
-  </w:abstractNum>
-  <w:abstractNum w:abstractNumId="12" w15:restartNumberingAfterBreak="0">
-    <w:nsid w:val="7E9A2217"/>
-    <w:multiLevelType w:val="hybridMultilevel"/>
-    <w:tmpl w:val="25128C14"/>
-    <w:lvl w:ilvl="0" w:tplc="4BF8E3C2" w:tentative="1">
+    <w:tmpl w:val="87B8FD8C"/>
+    <w:lvl w:ilvl="0" w:tplc="7ED4F46A" w:tentative="1">
       <w:start w:val="1"/>
       <w:numFmt w:val="bullet"/>
       <w:lvlText w:val="●"/>
@@ -51695,7 +51579,7 @@
         <w:ind w:left="720" w:hanging="360"/>
       </w:pPr>
     </w:lvl>
-    <w:lvl w:ilvl="1" w:tplc="163C67DE" w:tentative="1">
+    <w:lvl w:ilvl="1" w:tplc="09F6A438" w:tentative="1">
       <w:start w:val="1"/>
       <w:numFmt w:val="bullet"/>
       <w:lvlText w:val="○"/>
@@ -51704,7 +51588,7 @@
         <w:ind w:left="1440" w:hanging="360"/>
       </w:pPr>
     </w:lvl>
-    <w:lvl w:ilvl="2" w:tplc="3EAA5762" w:tentative="1">
+    <w:lvl w:ilvl="2" w:tplc="9E0A8370" w:tentative="1">
       <w:start w:val="1"/>
       <w:numFmt w:val="bullet"/>
       <w:lvlText w:val="■"/>
@@ -51713,7 +51597,7 @@
         <w:ind w:left="2160" w:hanging="360"/>
       </w:pPr>
     </w:lvl>
-    <w:lvl w:ilvl="3" w:tplc="C81ED0DE" w:tentative="1">
+    <w:lvl w:ilvl="3" w:tplc="F8940452" w:tentative="1">
       <w:start w:val="1"/>
       <w:numFmt w:val="bullet"/>
       <w:lvlText w:val="●"/>
@@ -51722,7 +51606,7 @@
         <w:ind w:left="2880" w:hanging="360"/>
       </w:pPr>
     </w:lvl>
-    <w:lvl w:ilvl="4" w:tplc="5BECF366" w:tentative="1">
+    <w:lvl w:ilvl="4" w:tplc="03D07A42" w:tentative="1">
       <w:start w:val="1"/>
       <w:numFmt w:val="bullet"/>
       <w:lvlText w:val="○"/>
@@ -51731,7 +51615,7 @@
         <w:ind w:left="3600" w:hanging="360"/>
       </w:pPr>
     </w:lvl>
-    <w:lvl w:ilvl="5" w:tplc="52DC56AE" w:tentative="1">
+    <w:lvl w:ilvl="5" w:tplc="9252CC32" w:tentative="1">
       <w:start w:val="1"/>
       <w:numFmt w:val="bullet"/>
       <w:lvlText w:val="■"/>
@@ -51740,7 +51624,7 @@
         <w:ind w:left="4320" w:hanging="360"/>
       </w:pPr>
     </w:lvl>
-    <w:lvl w:ilvl="6" w:tplc="E20C88D0" w:tentative="1">
+    <w:lvl w:ilvl="6" w:tplc="224E8CC6" w:tentative="1">
       <w:start w:val="1"/>
       <w:numFmt w:val="bullet"/>
       <w:lvlText w:val="●"/>
@@ -51749,7 +51633,7 @@
         <w:ind w:left="5040" w:hanging="360"/>
       </w:pPr>
     </w:lvl>
-    <w:lvl w:ilvl="7" w:tplc="1D582110" w:tentative="1">
+    <w:lvl w:ilvl="7" w:tplc="EB942D58" w:tentative="1">
       <w:start w:val="1"/>
       <w:numFmt w:val="bullet"/>
       <w:lvlText w:val="●"/>
@@ -51758,7 +51642,7 @@
         <w:ind w:left="5760" w:hanging="360"/>
       </w:pPr>
     </w:lvl>
-    <w:lvl w:ilvl="8" w:tplc="C7208A6C" w:tentative="1">
+    <w:lvl w:ilvl="8" w:tplc="FBA824A8" w:tentative="1">
       <w:start w:val="1"/>
       <w:numFmt w:val="bullet"/>
       <w:lvlText w:val="●"/>
@@ -51768,11 +51652,11 @@
       </w:pPr>
     </w:lvl>
   </w:abstractNum>
-  <w:abstractNum w:abstractNumId="13" w15:restartNumberingAfterBreak="0">
-    <w:nsid w:val="7F140258"/>
+  <w:abstractNum w:abstractNumId="11" w15:restartNumberingAfterBreak="0">
+    <w:nsid w:val="64FB4929"/>
     <w:multiLevelType w:val="hybridMultilevel"/>
-    <w:tmpl w:val="25743416"/>
-    <w:lvl w:ilvl="0" w:tplc="96887F5A">
+    <w:tmpl w:val="E468FE0E"/>
+    <w:lvl w:ilvl="0" w:tplc="1A7E9A82">
       <w:start w:val="1"/>
       <w:numFmt w:val="decimal"/>
       <w:lvlText w:val="%1."/>
@@ -51781,7 +51665,7 @@
         <w:ind w:left="360" w:hanging="300"/>
       </w:pPr>
     </w:lvl>
-    <w:lvl w:ilvl="1" w:tplc="1D9896AC" w:tentative="1">
+    <w:lvl w:ilvl="1" w:tplc="E310757E" w:tentative="1">
       <w:start w:val="1"/>
       <w:numFmt w:val="lowerLetter"/>
       <w:lvlText w:val="%2."/>
@@ -51790,47 +51674,105 @@
         <w:ind w:left="720" w:hanging="300"/>
       </w:pPr>
     </w:lvl>
-    <w:lvl w:ilvl="2" w:tplc="C53AD258">
+    <w:lvl w:ilvl="2" w:tplc="ED4AE120">
       <w:numFmt w:val="decimal"/>
       <w:lvlText w:val=""/>
       <w:lvlJc w:val="left"/>
     </w:lvl>
-    <w:lvl w:ilvl="3" w:tplc="3A2ABEF6">
+    <w:lvl w:ilvl="3" w:tplc="2EFCDBC0">
       <w:numFmt w:val="decimal"/>
       <w:lvlText w:val=""/>
       <w:lvlJc w:val="left"/>
     </w:lvl>
-    <w:lvl w:ilvl="4" w:tplc="6B122754">
+    <w:lvl w:ilvl="4" w:tplc="EE24684E">
       <w:numFmt w:val="decimal"/>
       <w:lvlText w:val=""/>
       <w:lvlJc w:val="left"/>
     </w:lvl>
-    <w:lvl w:ilvl="5" w:tplc="0FBA8ECC">
+    <w:lvl w:ilvl="5" w:tplc="DCC4092E">
       <w:numFmt w:val="decimal"/>
       <w:lvlText w:val=""/>
       <w:lvlJc w:val="left"/>
     </w:lvl>
-    <w:lvl w:ilvl="6" w:tplc="924271B0">
+    <w:lvl w:ilvl="6" w:tplc="7ECE2A02">
       <w:numFmt w:val="decimal"/>
       <w:lvlText w:val=""/>
       <w:lvlJc w:val="left"/>
     </w:lvl>
-    <w:lvl w:ilvl="7" w:tplc="D5C2F142">
+    <w:lvl w:ilvl="7" w:tplc="DCA8BAC6">
       <w:numFmt w:val="decimal"/>
       <w:lvlText w:val=""/>
       <w:lvlJc w:val="left"/>
     </w:lvl>
-    <w:lvl w:ilvl="8" w:tplc="F1026B58">
+    <w:lvl w:ilvl="8" w:tplc="CCAEEA08">
       <w:numFmt w:val="decimal"/>
       <w:lvlText w:val=""/>
       <w:lvlJc w:val="left"/>
     </w:lvl>
   </w:abstractNum>
-  <w:abstractNum w:abstractNumId="14" w15:restartNumberingAfterBreak="0">
-    <w:nsid w:val="7FE12511"/>
+  <w:abstractNum w:abstractNumId="12" w15:restartNumberingAfterBreak="0">
+    <w:nsid w:val="6795088F"/>
     <w:multiLevelType w:val="hybridMultilevel"/>
-    <w:tmpl w:val="64B280EA"/>
-    <w:lvl w:ilvl="0" w:tplc="11125AE0">
+    <w:tmpl w:val="082AAD64"/>
+    <w:lvl w:ilvl="0" w:tplc="85CEDA5C">
+      <w:start w:val="1"/>
+      <w:numFmt w:val="bullet"/>
+      <w:lvlText w:val="•"/>
+      <w:lvlJc w:val="left"/>
+      <w:pPr>
+        <w:ind w:left="360" w:hanging="260"/>
+      </w:pPr>
+    </w:lvl>
+    <w:lvl w:ilvl="1" w:tplc="B8040218" w:tentative="1">
+      <w:start w:val="1"/>
+      <w:numFmt w:val="bullet"/>
+      <w:lvlText w:val="–"/>
+      <w:lvlJc w:val="left"/>
+      <w:pPr>
+        <w:ind w:left="720" w:hanging="260"/>
+      </w:pPr>
+    </w:lvl>
+    <w:lvl w:ilvl="2" w:tplc="8DF69462">
+      <w:numFmt w:val="decimal"/>
+      <w:lvlText w:val=""/>
+      <w:lvlJc w:val="left"/>
+    </w:lvl>
+    <w:lvl w:ilvl="3" w:tplc="EFE81D48">
+      <w:numFmt w:val="decimal"/>
+      <w:lvlText w:val=""/>
+      <w:lvlJc w:val="left"/>
+    </w:lvl>
+    <w:lvl w:ilvl="4" w:tplc="9E164926">
+      <w:numFmt w:val="decimal"/>
+      <w:lvlText w:val=""/>
+      <w:lvlJc w:val="left"/>
+    </w:lvl>
+    <w:lvl w:ilvl="5" w:tplc="B3F0AF0A">
+      <w:numFmt w:val="decimal"/>
+      <w:lvlText w:val=""/>
+      <w:lvlJc w:val="left"/>
+    </w:lvl>
+    <w:lvl w:ilvl="6" w:tplc="8A1A71A2">
+      <w:numFmt w:val="decimal"/>
+      <w:lvlText w:val=""/>
+      <w:lvlJc w:val="left"/>
+    </w:lvl>
+    <w:lvl w:ilvl="7" w:tplc="B33E023C">
+      <w:numFmt w:val="decimal"/>
+      <w:lvlText w:val=""/>
+      <w:lvlJc w:val="left"/>
+    </w:lvl>
+    <w:lvl w:ilvl="8" w:tplc="FEBAC25E">
+      <w:numFmt w:val="decimal"/>
+      <w:lvlText w:val=""/>
+      <w:lvlJc w:val="left"/>
+    </w:lvl>
+  </w:abstractNum>
+  <w:abstractNum w:abstractNumId="13" w15:restartNumberingAfterBreak="0">
+    <w:nsid w:val="6B417E09"/>
+    <w:multiLevelType w:val="hybridMultilevel"/>
+    <w:tmpl w:val="F5461762"/>
+    <w:lvl w:ilvl="0" w:tplc="5D96C20E">
       <w:start w:val="1"/>
       <w:numFmt w:val="decimal"/>
       <w:lvlText w:val="%1."/>
@@ -51839,7 +51781,7 @@
         <w:ind w:left="360" w:hanging="300"/>
       </w:pPr>
     </w:lvl>
-    <w:lvl w:ilvl="1" w:tplc="A442FB2A" w:tentative="1">
+    <w:lvl w:ilvl="1" w:tplc="3A94A266" w:tentative="1">
       <w:start w:val="1"/>
       <w:numFmt w:val="lowerLetter"/>
       <w:lvlText w:val="%2."/>
@@ -51848,128 +51790,186 @@
         <w:ind w:left="720" w:hanging="300"/>
       </w:pPr>
     </w:lvl>
-    <w:lvl w:ilvl="2" w:tplc="29724CC2">
+    <w:lvl w:ilvl="2" w:tplc="93D847D8">
       <w:numFmt w:val="decimal"/>
       <w:lvlText w:val=""/>
       <w:lvlJc w:val="left"/>
     </w:lvl>
-    <w:lvl w:ilvl="3" w:tplc="2024522E">
+    <w:lvl w:ilvl="3" w:tplc="BD2CD634">
       <w:numFmt w:val="decimal"/>
       <w:lvlText w:val=""/>
       <w:lvlJc w:val="left"/>
     </w:lvl>
-    <w:lvl w:ilvl="4" w:tplc="43568F82">
+    <w:lvl w:ilvl="4" w:tplc="11540490">
       <w:numFmt w:val="decimal"/>
       <w:lvlText w:val=""/>
       <w:lvlJc w:val="left"/>
     </w:lvl>
-    <w:lvl w:ilvl="5" w:tplc="EEB2A13A">
+    <w:lvl w:ilvl="5" w:tplc="6C9E4254">
       <w:numFmt w:val="decimal"/>
       <w:lvlText w:val=""/>
       <w:lvlJc w:val="left"/>
     </w:lvl>
-    <w:lvl w:ilvl="6" w:tplc="A6047F64">
+    <w:lvl w:ilvl="6" w:tplc="0D0CD8B4">
       <w:numFmt w:val="decimal"/>
       <w:lvlText w:val=""/>
       <w:lvlJc w:val="left"/>
     </w:lvl>
-    <w:lvl w:ilvl="7" w:tplc="A01A9532">
+    <w:lvl w:ilvl="7" w:tplc="FC6C8526">
       <w:numFmt w:val="decimal"/>
       <w:lvlText w:val=""/>
       <w:lvlJc w:val="left"/>
     </w:lvl>
-    <w:lvl w:ilvl="8" w:tplc="4ADC4D1C">
+    <w:lvl w:ilvl="8" w:tplc="71E6F428">
       <w:numFmt w:val="decimal"/>
       <w:lvlText w:val=""/>
       <w:lvlJc w:val="left"/>
     </w:lvl>
   </w:abstractNum>
-  <w:num w:numId="1" w16cid:durableId="1501195877">
+  <w:abstractNum w:abstractNumId="14" w15:restartNumberingAfterBreak="0">
+    <w:nsid w:val="6CF307F5"/>
+    <w:multiLevelType w:val="hybridMultilevel"/>
+    <w:tmpl w:val="CA72FC16"/>
+    <w:lvl w:ilvl="0" w:tplc="97587FA0">
+      <w:start w:val="1"/>
+      <w:numFmt w:val="decimal"/>
+      <w:lvlText w:val="%1."/>
+      <w:lvlJc w:val="left"/>
+      <w:pPr>
+        <w:ind w:left="360" w:hanging="300"/>
+      </w:pPr>
+    </w:lvl>
+    <w:lvl w:ilvl="1" w:tplc="86A4AA70" w:tentative="1">
+      <w:start w:val="1"/>
+      <w:numFmt w:val="lowerLetter"/>
+      <w:lvlText w:val="%2."/>
+      <w:lvlJc w:val="left"/>
+      <w:pPr>
+        <w:ind w:left="720" w:hanging="300"/>
+      </w:pPr>
+    </w:lvl>
+    <w:lvl w:ilvl="2" w:tplc="394A572E">
+      <w:numFmt w:val="decimal"/>
+      <w:lvlText w:val=""/>
+      <w:lvlJc w:val="left"/>
+    </w:lvl>
+    <w:lvl w:ilvl="3" w:tplc="E1808D16">
+      <w:numFmt w:val="decimal"/>
+      <w:lvlText w:val=""/>
+      <w:lvlJc w:val="left"/>
+    </w:lvl>
+    <w:lvl w:ilvl="4" w:tplc="F8C66BB8">
+      <w:numFmt w:val="decimal"/>
+      <w:lvlText w:val=""/>
+      <w:lvlJc w:val="left"/>
+    </w:lvl>
+    <w:lvl w:ilvl="5" w:tplc="0D640056">
+      <w:numFmt w:val="decimal"/>
+      <w:lvlText w:val=""/>
+      <w:lvlJc w:val="left"/>
+    </w:lvl>
+    <w:lvl w:ilvl="6" w:tplc="46DCE4EE">
+      <w:numFmt w:val="decimal"/>
+      <w:lvlText w:val=""/>
+      <w:lvlJc w:val="left"/>
+    </w:lvl>
+    <w:lvl w:ilvl="7" w:tplc="2D50CC8E">
+      <w:numFmt w:val="decimal"/>
+      <w:lvlText w:val=""/>
+      <w:lvlJc w:val="left"/>
+    </w:lvl>
+    <w:lvl w:ilvl="8" w:tplc="F448114E">
+      <w:numFmt w:val="decimal"/>
+      <w:lvlText w:val=""/>
+      <w:lvlJc w:val="left"/>
+    </w:lvl>
+  </w:abstractNum>
+  <w:num w:numId="1" w16cid:durableId="1155684681">
+    <w:abstractNumId w:val="10"/>
+    <w:lvlOverride w:ilvl="0">
+      <w:startOverride w:val="1"/>
+    </w:lvlOverride>
+  </w:num>
+  <w:num w:numId="2" w16cid:durableId="1133988337">
     <w:abstractNumId w:val="12"/>
     <w:lvlOverride w:ilvl="0">
       <w:startOverride w:val="1"/>
     </w:lvlOverride>
   </w:num>
-  <w:num w:numId="2" w16cid:durableId="556018725">
+  <w:num w:numId="3" w16cid:durableId="372732216">
+    <w:abstractNumId w:val="7"/>
+    <w:lvlOverride w:ilvl="0">
+      <w:startOverride w:val="1"/>
+    </w:lvlOverride>
+  </w:num>
+  <w:num w:numId="4" w16cid:durableId="1977251182">
+    <w:abstractNumId w:val="3"/>
+    <w:lvlOverride w:ilvl="0">
+      <w:startOverride w:val="1"/>
+    </w:lvlOverride>
+  </w:num>
+  <w:num w:numId="5" w16cid:durableId="1903978585">
+    <w:abstractNumId w:val="14"/>
+    <w:lvlOverride w:ilvl="0">
+      <w:startOverride w:val="1"/>
+    </w:lvlOverride>
+  </w:num>
+  <w:num w:numId="6" w16cid:durableId="1029646535">
+    <w:abstractNumId w:val="5"/>
+    <w:lvlOverride w:ilvl="0">
+      <w:startOverride w:val="1"/>
+    </w:lvlOverride>
+  </w:num>
+  <w:num w:numId="7" w16cid:durableId="544025264">
+    <w:abstractNumId w:val="0"/>
+    <w:lvlOverride w:ilvl="0">
+      <w:startOverride w:val="1"/>
+    </w:lvlOverride>
+  </w:num>
+  <w:num w:numId="8" w16cid:durableId="310260262">
+    <w:abstractNumId w:val="11"/>
+    <w:lvlOverride w:ilvl="0">
+      <w:startOverride w:val="1"/>
+    </w:lvlOverride>
+  </w:num>
+  <w:num w:numId="9" w16cid:durableId="1374430279">
+    <w:abstractNumId w:val="13"/>
+    <w:lvlOverride w:ilvl="0">
+      <w:startOverride w:val="1"/>
+    </w:lvlOverride>
+  </w:num>
+  <w:num w:numId="10" w16cid:durableId="2002854380">
+    <w:abstractNumId w:val="4"/>
+    <w:lvlOverride w:ilvl="0">
+      <w:startOverride w:val="1"/>
+    </w:lvlOverride>
+  </w:num>
+  <w:num w:numId="11" w16cid:durableId="2070810240">
+    <w:abstractNumId w:val="1"/>
+    <w:lvlOverride w:ilvl="0">
+      <w:startOverride w:val="1"/>
+    </w:lvlOverride>
+  </w:num>
+  <w:num w:numId="12" w16cid:durableId="2016154026">
+    <w:abstractNumId w:val="9"/>
+    <w:lvlOverride w:ilvl="0">
+      <w:startOverride w:val="1"/>
+    </w:lvlOverride>
+  </w:num>
+  <w:num w:numId="13" w16cid:durableId="307050990">
+    <w:abstractNumId w:val="2"/>
+    <w:lvlOverride w:ilvl="0">
+      <w:startOverride w:val="1"/>
+    </w:lvlOverride>
+  </w:num>
+  <w:num w:numId="14" w16cid:durableId="436608397">
     <w:abstractNumId w:val="8"/>
     <w:lvlOverride w:ilvl="0">
       <w:startOverride w:val="1"/>
     </w:lvlOverride>
   </w:num>
-  <w:num w:numId="3" w16cid:durableId="1884291817">
-    <w:abstractNumId w:val="9"/>
-    <w:lvlOverride w:ilvl="0">
-      <w:startOverride w:val="1"/>
-    </w:lvlOverride>
-  </w:num>
-  <w:num w:numId="4" w16cid:durableId="755245339">
-    <w:abstractNumId w:val="5"/>
-    <w:lvlOverride w:ilvl="0">
-      <w:startOverride w:val="1"/>
-    </w:lvlOverride>
-  </w:num>
-  <w:num w:numId="5" w16cid:durableId="1944920640">
-    <w:abstractNumId w:val="1"/>
-    <w:lvlOverride w:ilvl="0">
-      <w:startOverride w:val="1"/>
-    </w:lvlOverride>
-  </w:num>
-  <w:num w:numId="6" w16cid:durableId="1476069421">
-    <w:abstractNumId w:val="0"/>
-    <w:lvlOverride w:ilvl="0">
-      <w:startOverride w:val="1"/>
-    </w:lvlOverride>
-  </w:num>
-  <w:num w:numId="7" w16cid:durableId="325209918">
+  <w:num w:numId="15" w16cid:durableId="400100524">
     <w:abstractNumId w:val="6"/>
-    <w:lvlOverride w:ilvl="0">
-      <w:startOverride w:val="1"/>
-    </w:lvlOverride>
-  </w:num>
-  <w:num w:numId="8" w16cid:durableId="1416315974">
-    <w:abstractNumId w:val="14"/>
-    <w:lvlOverride w:ilvl="0">
-      <w:startOverride w:val="1"/>
-    </w:lvlOverride>
-  </w:num>
-  <w:num w:numId="9" w16cid:durableId="340667126">
-    <w:abstractNumId w:val="7"/>
-    <w:lvlOverride w:ilvl="0">
-      <w:startOverride w:val="1"/>
-    </w:lvlOverride>
-  </w:num>
-  <w:num w:numId="10" w16cid:durableId="40982733">
-    <w:abstractNumId w:val="10"/>
-    <w:lvlOverride w:ilvl="0">
-      <w:startOverride w:val="1"/>
-    </w:lvlOverride>
-  </w:num>
-  <w:num w:numId="11" w16cid:durableId="470294865">
-    <w:abstractNumId w:val="13"/>
-    <w:lvlOverride w:ilvl="0">
-      <w:startOverride w:val="1"/>
-    </w:lvlOverride>
-  </w:num>
-  <w:num w:numId="12" w16cid:durableId="920019823">
-    <w:abstractNumId w:val="2"/>
-    <w:lvlOverride w:ilvl="0">
-      <w:startOverride w:val="1"/>
-    </w:lvlOverride>
-  </w:num>
-  <w:num w:numId="13" w16cid:durableId="2047489632">
-    <w:abstractNumId w:val="11"/>
-    <w:lvlOverride w:ilvl="0">
-      <w:startOverride w:val="1"/>
-    </w:lvlOverride>
-  </w:num>
-  <w:num w:numId="14" w16cid:durableId="26375466">
-    <w:abstractNumId w:val="4"/>
-    <w:lvlOverride w:ilvl="0">
-      <w:startOverride w:val="1"/>
-    </w:lvlOverride>
-  </w:num>
-  <w:num w:numId="15" w16cid:durableId="428090641">
-    <w:abstractNumId w:val="3"/>
     <w:lvlOverride w:ilvl="0">
       <w:startOverride w:val="1"/>
     </w:lvlOverride>
@@ -52649,7 +52649,7 @@
     <w:autoRedefine/>
     <w:uiPriority w:val="39"/>
     <w:unhideWhenUsed/>
-    <w:rsid w:val="00E51421"/>
+    <w:rsid w:val="00B63419"/>
     <w:pPr>
       <w:spacing w:after="100"/>
     </w:pPr>
@@ -52661,7 +52661,7 @@
     <w:autoRedefine/>
     <w:uiPriority w:val="39"/>
     <w:unhideWhenUsed/>
-    <w:rsid w:val="00E51421"/>
+    <w:rsid w:val="00B63419"/>
     <w:pPr>
       <w:spacing w:after="100"/>
       <w:ind w:left="210"/>

</xml_diff>

<commit_message>
docs: MANAGER no longer models the data
Follows ded6ac8. The role tables (admin guide, README, API auth,
architecture) and CAPABILITIES.md now say a MANAGER cannot change business
areas, folders, items, joins or hierarchies, whatever grant they hold. The
MANAGER manuals lose their five modelling chapters in all four locales, and
the ADMIN manuals say what a grant means for a MANAGER. The manager
business-areas shot is gone from the shot script and the later manager shots
are renumbered to match. The 16 ADMIN and MANAGER .docx files are rebuilt.
CHANGELOG gets an Unreleased entry.

Co-Authored-By: Claude Opus 5.5 <noreply@anthropic.com>
</commit_message>
<xml_diff>
--- a/discoverer-neo/docs/user-guide/manual/Discoverer-Neo-ADMIN-Guide-Full-en.docx
+++ b/discoverer-neo/docs/user-guide/manual/Discoverer-Neo-ADMIN-Guide-Full-en.docx
@@ -74,7 +74,7 @@
     <w:sdt>
       <w:sdtPr>
         <w:alias w:val="Contents"/>
-        <w:id w:val="-886726541"/>
+        <w:id w:val="-1280724178"/>
       </w:sdtPr>
       <w:sdtEndPr/>
       <w:sdtContent>
@@ -102,7 +102,7 @@
           <w:r>
             <w:fldChar w:fldCharType="separate"/>
           </w:r>
-          <w:hyperlink w:anchor="_Toc241670454" w:history="1">
+          <w:hyperlink w:anchor="_Toc241691995" w:history="1">
             <w:r>
               <w:rPr>
                 <w:rStyle w:val="Hiperligao"/>
@@ -126,7 +126,7 @@
               <w:rPr>
                 <w:noProof/>
               </w:rPr>
-              <w:instrText xml:space="preserve"> PAGEREF _Toc241670454 \h </w:instrText>
+              <w:instrText xml:space="preserve"> PAGEREF _Toc241691995 \h </w:instrText>
             </w:r>
             <w:r>
               <w:rPr>
@@ -168,7 +168,7 @@
               <w14:ligatures w14:val="standardContextual"/>
             </w:rPr>
           </w:pPr>
-          <w:hyperlink w:anchor="_Toc241670455" w:history="1">
+          <w:hyperlink w:anchor="_Toc241691996" w:history="1">
             <w:r>
               <w:rPr>
                 <w:rStyle w:val="Hiperligao"/>
@@ -192,7 +192,7 @@
               <w:rPr>
                 <w:noProof/>
               </w:rPr>
-              <w:instrText xml:space="preserve"> PAGEREF _Toc241670455 \h </w:instrText>
+              <w:instrText xml:space="preserve"> PAGEREF _Toc241691996 \h </w:instrText>
             </w:r>
             <w:r>
               <w:rPr>
@@ -234,7 +234,7 @@
               <w14:ligatures w14:val="standardContextual"/>
             </w:rPr>
           </w:pPr>
-          <w:hyperlink w:anchor="_Toc241670456" w:history="1">
+          <w:hyperlink w:anchor="_Toc241691997" w:history="1">
             <w:r>
               <w:rPr>
                 <w:rStyle w:val="Hiperligao"/>
@@ -258,7 +258,7 @@
               <w:rPr>
                 <w:noProof/>
               </w:rPr>
-              <w:instrText xml:space="preserve"> PAGEREF _Toc241670456 \h </w:instrText>
+              <w:instrText xml:space="preserve"> PAGEREF _Toc241691997 \h </w:instrText>
             </w:r>
             <w:r>
               <w:rPr>
@@ -300,7 +300,7 @@
               <w14:ligatures w14:val="standardContextual"/>
             </w:rPr>
           </w:pPr>
-          <w:hyperlink w:anchor="_Toc241670457" w:history="1">
+          <w:hyperlink w:anchor="_Toc241691998" w:history="1">
             <w:r>
               <w:rPr>
                 <w:rStyle w:val="Hiperligao"/>
@@ -324,7 +324,7 @@
               <w:rPr>
                 <w:noProof/>
               </w:rPr>
-              <w:instrText xml:space="preserve"> PAGEREF _Toc241670457 \h </w:instrText>
+              <w:instrText xml:space="preserve"> PAGEREF _Toc241691998 \h </w:instrText>
             </w:r>
             <w:r>
               <w:rPr>
@@ -366,7 +366,7 @@
               <w14:ligatures w14:val="standardContextual"/>
             </w:rPr>
           </w:pPr>
-          <w:hyperlink w:anchor="_Toc241670458" w:history="1">
+          <w:hyperlink w:anchor="_Toc241691999" w:history="1">
             <w:r>
               <w:rPr>
                 <w:rStyle w:val="Hiperligao"/>
@@ -390,7 +390,7 @@
               <w:rPr>
                 <w:noProof/>
               </w:rPr>
-              <w:instrText xml:space="preserve"> PAGEREF _Toc241670458 \h </w:instrText>
+              <w:instrText xml:space="preserve"> PAGEREF _Toc241691999 \h </w:instrText>
             </w:r>
             <w:r>
               <w:rPr>
@@ -432,7 +432,7 @@
               <w14:ligatures w14:val="standardContextual"/>
             </w:rPr>
           </w:pPr>
-          <w:hyperlink w:anchor="_Toc241670459" w:history="1">
+          <w:hyperlink w:anchor="_Toc241692000" w:history="1">
             <w:r>
               <w:rPr>
                 <w:rStyle w:val="Hiperligao"/>
@@ -456,7 +456,7 @@
               <w:rPr>
                 <w:noProof/>
               </w:rPr>
-              <w:instrText xml:space="preserve"> PAGEREF _Toc241670459 \h </w:instrText>
+              <w:instrText xml:space="preserve"> PAGEREF _Toc241692000 \h </w:instrText>
             </w:r>
             <w:r>
               <w:rPr>
@@ -498,7 +498,7 @@
               <w14:ligatures w14:val="standardContextual"/>
             </w:rPr>
           </w:pPr>
-          <w:hyperlink w:anchor="_Toc241670460" w:history="1">
+          <w:hyperlink w:anchor="_Toc241692001" w:history="1">
             <w:r>
               <w:rPr>
                 <w:rStyle w:val="Hiperligao"/>
@@ -522,7 +522,7 @@
               <w:rPr>
                 <w:noProof/>
               </w:rPr>
-              <w:instrText xml:space="preserve"> PAGEREF _Toc241670460 \h </w:instrText>
+              <w:instrText xml:space="preserve"> PAGEREF _Toc241692001 \h </w:instrText>
             </w:r>
             <w:r>
               <w:rPr>
@@ -564,7 +564,7 @@
               <w14:ligatures w14:val="standardContextual"/>
             </w:rPr>
           </w:pPr>
-          <w:hyperlink w:anchor="_Toc241670461" w:history="1">
+          <w:hyperlink w:anchor="_Toc241692002" w:history="1">
             <w:r>
               <w:rPr>
                 <w:rStyle w:val="Hiperligao"/>
@@ -588,7 +588,7 @@
               <w:rPr>
                 <w:noProof/>
               </w:rPr>
-              <w:instrText xml:space="preserve"> PAGEREF _Toc241670461 \h </w:instrText>
+              <w:instrText xml:space="preserve"> PAGEREF _Toc241692002 \h </w:instrText>
             </w:r>
             <w:r>
               <w:rPr>
@@ -630,7 +630,7 @@
               <w14:ligatures w14:val="standardContextual"/>
             </w:rPr>
           </w:pPr>
-          <w:hyperlink w:anchor="_Toc241670462" w:history="1">
+          <w:hyperlink w:anchor="_Toc241692003" w:history="1">
             <w:r>
               <w:rPr>
                 <w:rStyle w:val="Hiperligao"/>
@@ -654,7 +654,7 @@
               <w:rPr>
                 <w:noProof/>
               </w:rPr>
-              <w:instrText xml:space="preserve"> PAGEREF _Toc241670462 \h </w:instrText>
+              <w:instrText xml:space="preserve"> PAGEREF _Toc241692003 \h </w:instrText>
             </w:r>
             <w:r>
               <w:rPr>
@@ -696,7 +696,7 @@
               <w14:ligatures w14:val="standardContextual"/>
             </w:rPr>
           </w:pPr>
-          <w:hyperlink w:anchor="_Toc241670463" w:history="1">
+          <w:hyperlink w:anchor="_Toc241692004" w:history="1">
             <w:r>
               <w:rPr>
                 <w:rStyle w:val="Hiperligao"/>
@@ -720,7 +720,7 @@
               <w:rPr>
                 <w:noProof/>
               </w:rPr>
-              <w:instrText xml:space="preserve"> PAGEREF _Toc241670463 \h </w:instrText>
+              <w:instrText xml:space="preserve"> PAGEREF _Toc241692004 \h </w:instrText>
             </w:r>
             <w:r>
               <w:rPr>
@@ -762,7 +762,7 @@
               <w14:ligatures w14:val="standardContextual"/>
             </w:rPr>
           </w:pPr>
-          <w:hyperlink w:anchor="_Toc241670464" w:history="1">
+          <w:hyperlink w:anchor="_Toc241692005" w:history="1">
             <w:r>
               <w:rPr>
                 <w:rStyle w:val="Hiperligao"/>
@@ -786,7 +786,7 @@
               <w:rPr>
                 <w:noProof/>
               </w:rPr>
-              <w:instrText xml:space="preserve"> PAGEREF _Toc241670464 \h </w:instrText>
+              <w:instrText xml:space="preserve"> PAGEREF _Toc241692005 \h </w:instrText>
             </w:r>
             <w:r>
               <w:rPr>
@@ -828,7 +828,7 @@
               <w14:ligatures w14:val="standardContextual"/>
             </w:rPr>
           </w:pPr>
-          <w:hyperlink w:anchor="_Toc241670465" w:history="1">
+          <w:hyperlink w:anchor="_Toc241692006" w:history="1">
             <w:r>
               <w:rPr>
                 <w:rStyle w:val="Hiperligao"/>
@@ -852,7 +852,7 @@
               <w:rPr>
                 <w:noProof/>
               </w:rPr>
-              <w:instrText xml:space="preserve"> PAGEREF _Toc241670465 \h </w:instrText>
+              <w:instrText xml:space="preserve"> PAGEREF _Toc241692006 \h </w:instrText>
             </w:r>
             <w:r>
               <w:rPr>
@@ -894,7 +894,7 @@
               <w14:ligatures w14:val="standardContextual"/>
             </w:rPr>
           </w:pPr>
-          <w:hyperlink w:anchor="_Toc241670466" w:history="1">
+          <w:hyperlink w:anchor="_Toc241692007" w:history="1">
             <w:r>
               <w:rPr>
                 <w:rStyle w:val="Hiperligao"/>
@@ -918,7 +918,7 @@
               <w:rPr>
                 <w:noProof/>
               </w:rPr>
-              <w:instrText xml:space="preserve"> PAGEREF _Toc241670466 \h </w:instrText>
+              <w:instrText xml:space="preserve"> PAGEREF _Toc241692007 \h </w:instrText>
             </w:r>
             <w:r>
               <w:rPr>
@@ -960,7 +960,7 @@
               <w14:ligatures w14:val="standardContextual"/>
             </w:rPr>
           </w:pPr>
-          <w:hyperlink w:anchor="_Toc241670467" w:history="1">
+          <w:hyperlink w:anchor="_Toc241692008" w:history="1">
             <w:r>
               <w:rPr>
                 <w:rStyle w:val="Hiperligao"/>
@@ -984,7 +984,7 @@
               <w:rPr>
                 <w:noProof/>
               </w:rPr>
-              <w:instrText xml:space="preserve"> PAGEREF _Toc241670467 \h </w:instrText>
+              <w:instrText xml:space="preserve"> PAGEREF _Toc241692008 \h </w:instrText>
             </w:r>
             <w:r>
               <w:rPr>
@@ -1026,7 +1026,7 @@
               <w14:ligatures w14:val="standardContextual"/>
             </w:rPr>
           </w:pPr>
-          <w:hyperlink w:anchor="_Toc241670468" w:history="1">
+          <w:hyperlink w:anchor="_Toc241692009" w:history="1">
             <w:r>
               <w:rPr>
                 <w:rStyle w:val="Hiperligao"/>
@@ -1050,7 +1050,7 @@
               <w:rPr>
                 <w:noProof/>
               </w:rPr>
-              <w:instrText xml:space="preserve"> PAGEREF _Toc241670468 \h </w:instrText>
+              <w:instrText xml:space="preserve"> PAGEREF _Toc241692009 \h </w:instrText>
             </w:r>
             <w:r>
               <w:rPr>
@@ -1092,7 +1092,7 @@
               <w14:ligatures w14:val="standardContextual"/>
             </w:rPr>
           </w:pPr>
-          <w:hyperlink w:anchor="_Toc241670469" w:history="1">
+          <w:hyperlink w:anchor="_Toc241692010" w:history="1">
             <w:r>
               <w:rPr>
                 <w:rStyle w:val="Hiperligao"/>
@@ -1116,7 +1116,7 @@
               <w:rPr>
                 <w:noProof/>
               </w:rPr>
-              <w:instrText xml:space="preserve"> PAGEREF _Toc241670469 \h </w:instrText>
+              <w:instrText xml:space="preserve"> PAGEREF _Toc241692010 \h </w:instrText>
             </w:r>
             <w:r>
               <w:rPr>
@@ -1158,7 +1158,7 @@
               <w14:ligatures w14:val="standardContextual"/>
             </w:rPr>
           </w:pPr>
-          <w:hyperlink w:anchor="_Toc241670470" w:history="1">
+          <w:hyperlink w:anchor="_Toc241692011" w:history="1">
             <w:r>
               <w:rPr>
                 <w:rStyle w:val="Hiperligao"/>
@@ -1182,7 +1182,7 @@
               <w:rPr>
                 <w:noProof/>
               </w:rPr>
-              <w:instrText xml:space="preserve"> PAGEREF _Toc241670470 \h </w:instrText>
+              <w:instrText xml:space="preserve"> PAGEREF _Toc241692011 \h </w:instrText>
             </w:r>
             <w:r>
               <w:rPr>
@@ -1224,7 +1224,7 @@
               <w14:ligatures w14:val="standardContextual"/>
             </w:rPr>
           </w:pPr>
-          <w:hyperlink w:anchor="_Toc241670471" w:history="1">
+          <w:hyperlink w:anchor="_Toc241692012" w:history="1">
             <w:r>
               <w:rPr>
                 <w:rStyle w:val="Hiperligao"/>
@@ -1248,7 +1248,7 @@
               <w:rPr>
                 <w:noProof/>
               </w:rPr>
-              <w:instrText xml:space="preserve"> PAGEREF _Toc241670471 \h </w:instrText>
+              <w:instrText xml:space="preserve"> PAGEREF _Toc241692012 \h </w:instrText>
             </w:r>
             <w:r>
               <w:rPr>
@@ -1290,7 +1290,7 @@
               <w14:ligatures w14:val="standardContextual"/>
             </w:rPr>
           </w:pPr>
-          <w:hyperlink w:anchor="_Toc241670472" w:history="1">
+          <w:hyperlink w:anchor="_Toc241692013" w:history="1">
             <w:r>
               <w:rPr>
                 <w:rStyle w:val="Hiperligao"/>
@@ -1314,7 +1314,7 @@
               <w:rPr>
                 <w:noProof/>
               </w:rPr>
-              <w:instrText xml:space="preserve"> PAGEREF _Toc241670472 \h </w:instrText>
+              <w:instrText xml:space="preserve"> PAGEREF _Toc241692013 \h </w:instrText>
             </w:r>
             <w:r>
               <w:rPr>
@@ -1356,7 +1356,7 @@
               <w14:ligatures w14:val="standardContextual"/>
             </w:rPr>
           </w:pPr>
-          <w:hyperlink w:anchor="_Toc241670473" w:history="1">
+          <w:hyperlink w:anchor="_Toc241692014" w:history="1">
             <w:r>
               <w:rPr>
                 <w:rStyle w:val="Hiperligao"/>
@@ -1380,7 +1380,7 @@
               <w:rPr>
                 <w:noProof/>
               </w:rPr>
-              <w:instrText xml:space="preserve"> PAGEREF _Toc241670473 \h </w:instrText>
+              <w:instrText xml:space="preserve"> PAGEREF _Toc241692014 \h </w:instrText>
             </w:r>
             <w:r>
               <w:rPr>
@@ -1422,7 +1422,7 @@
               <w14:ligatures w14:val="standardContextual"/>
             </w:rPr>
           </w:pPr>
-          <w:hyperlink w:anchor="_Toc241670474" w:history="1">
+          <w:hyperlink w:anchor="_Toc241692015" w:history="1">
             <w:r>
               <w:rPr>
                 <w:rStyle w:val="Hiperligao"/>
@@ -1446,7 +1446,7 @@
               <w:rPr>
                 <w:noProof/>
               </w:rPr>
-              <w:instrText xml:space="preserve"> PAGEREF _Toc241670474 \h </w:instrText>
+              <w:instrText xml:space="preserve"> PAGEREF _Toc241692015 \h </w:instrText>
             </w:r>
             <w:r>
               <w:rPr>
@@ -1488,7 +1488,7 @@
               <w14:ligatures w14:val="standardContextual"/>
             </w:rPr>
           </w:pPr>
-          <w:hyperlink w:anchor="_Toc241670475" w:history="1">
+          <w:hyperlink w:anchor="_Toc241692016" w:history="1">
             <w:r>
               <w:rPr>
                 <w:rStyle w:val="Hiperligao"/>
@@ -1512,7 +1512,7 @@
               <w:rPr>
                 <w:noProof/>
               </w:rPr>
-              <w:instrText xml:space="preserve"> PAGEREF _Toc241670475 \h </w:instrText>
+              <w:instrText xml:space="preserve"> PAGEREF _Toc241692016 \h </w:instrText>
             </w:r>
             <w:r>
               <w:rPr>
@@ -1554,7 +1554,7 @@
               <w14:ligatures w14:val="standardContextual"/>
             </w:rPr>
           </w:pPr>
-          <w:hyperlink w:anchor="_Toc241670476" w:history="1">
+          <w:hyperlink w:anchor="_Toc241692017" w:history="1">
             <w:r>
               <w:rPr>
                 <w:rStyle w:val="Hiperligao"/>
@@ -1578,7 +1578,7 @@
               <w:rPr>
                 <w:noProof/>
               </w:rPr>
-              <w:instrText xml:space="preserve"> PAGEREF _Toc241670476 \h </w:instrText>
+              <w:instrText xml:space="preserve"> PAGEREF _Toc241692017 \h </w:instrText>
             </w:r>
             <w:r>
               <w:rPr>
@@ -1620,7 +1620,7 @@
               <w14:ligatures w14:val="standardContextual"/>
             </w:rPr>
           </w:pPr>
-          <w:hyperlink w:anchor="_Toc241670477" w:history="1">
+          <w:hyperlink w:anchor="_Toc241692018" w:history="1">
             <w:r>
               <w:rPr>
                 <w:rStyle w:val="Hiperligao"/>
@@ -1644,7 +1644,7 @@
               <w:rPr>
                 <w:noProof/>
               </w:rPr>
-              <w:instrText xml:space="preserve"> PAGEREF _Toc241670477 \h </w:instrText>
+              <w:instrText xml:space="preserve"> PAGEREF _Toc241692018 \h </w:instrText>
             </w:r>
             <w:r>
               <w:rPr>
@@ -1686,7 +1686,7 @@
               <w14:ligatures w14:val="standardContextual"/>
             </w:rPr>
           </w:pPr>
-          <w:hyperlink w:anchor="_Toc241670478" w:history="1">
+          <w:hyperlink w:anchor="_Toc241692019" w:history="1">
             <w:r>
               <w:rPr>
                 <w:rStyle w:val="Hiperligao"/>
@@ -1710,7 +1710,7 @@
               <w:rPr>
                 <w:noProof/>
               </w:rPr>
-              <w:instrText xml:space="preserve"> PAGEREF _Toc241670478 \h </w:instrText>
+              <w:instrText xml:space="preserve"> PAGEREF _Toc241692019 \h </w:instrText>
             </w:r>
             <w:r>
               <w:rPr>
@@ -1752,7 +1752,7 @@
               <w14:ligatures w14:val="standardContextual"/>
             </w:rPr>
           </w:pPr>
-          <w:hyperlink w:anchor="_Toc241670479" w:history="1">
+          <w:hyperlink w:anchor="_Toc241692020" w:history="1">
             <w:r>
               <w:rPr>
                 <w:rStyle w:val="Hiperligao"/>
@@ -1776,7 +1776,7 @@
               <w:rPr>
                 <w:noProof/>
               </w:rPr>
-              <w:instrText xml:space="preserve"> PAGEREF _Toc241670479 \h </w:instrText>
+              <w:instrText xml:space="preserve"> PAGEREF _Toc241692020 \h </w:instrText>
             </w:r>
             <w:r>
               <w:rPr>
@@ -1818,7 +1818,7 @@
               <w14:ligatures w14:val="standardContextual"/>
             </w:rPr>
           </w:pPr>
-          <w:hyperlink w:anchor="_Toc241670480" w:history="1">
+          <w:hyperlink w:anchor="_Toc241692021" w:history="1">
             <w:r>
               <w:rPr>
                 <w:rStyle w:val="Hiperligao"/>
@@ -1842,7 +1842,7 @@
               <w:rPr>
                 <w:noProof/>
               </w:rPr>
-              <w:instrText xml:space="preserve"> PAGEREF _Toc241670480 \h </w:instrText>
+              <w:instrText xml:space="preserve"> PAGEREF _Toc241692021 \h </w:instrText>
             </w:r>
             <w:r>
               <w:rPr>
@@ -1884,7 +1884,7 @@
               <w14:ligatures w14:val="standardContextual"/>
             </w:rPr>
           </w:pPr>
-          <w:hyperlink w:anchor="_Toc241670481" w:history="1">
+          <w:hyperlink w:anchor="_Toc241692022" w:history="1">
             <w:r>
               <w:rPr>
                 <w:rStyle w:val="Hiperligao"/>
@@ -1908,7 +1908,7 @@
               <w:rPr>
                 <w:noProof/>
               </w:rPr>
-              <w:instrText xml:space="preserve"> PAGEREF _Toc241670481 \h </w:instrText>
+              <w:instrText xml:space="preserve"> PAGEREF _Toc241692022 \h </w:instrText>
             </w:r>
             <w:r>
               <w:rPr>
@@ -1950,7 +1950,7 @@
               <w14:ligatures w14:val="standardContextual"/>
             </w:rPr>
           </w:pPr>
-          <w:hyperlink w:anchor="_Toc241670482" w:history="1">
+          <w:hyperlink w:anchor="_Toc241692023" w:history="1">
             <w:r>
               <w:rPr>
                 <w:rStyle w:val="Hiperligao"/>
@@ -1974,7 +1974,7 @@
               <w:rPr>
                 <w:noProof/>
               </w:rPr>
-              <w:instrText xml:space="preserve"> PAGEREF _Toc241670482 \h </w:instrText>
+              <w:instrText xml:space="preserve"> PAGEREF _Toc241692023 \h </w:instrText>
             </w:r>
             <w:r>
               <w:rPr>
@@ -2016,7 +2016,7 @@
               <w14:ligatures w14:val="standardContextual"/>
             </w:rPr>
           </w:pPr>
-          <w:hyperlink w:anchor="_Toc241670483" w:history="1">
+          <w:hyperlink w:anchor="_Toc241692024" w:history="1">
             <w:r>
               <w:rPr>
                 <w:rStyle w:val="Hiperligao"/>
@@ -2040,7 +2040,7 @@
               <w:rPr>
                 <w:noProof/>
               </w:rPr>
-              <w:instrText xml:space="preserve"> PAGEREF _Toc241670483 \h </w:instrText>
+              <w:instrText xml:space="preserve"> PAGEREF _Toc241692024 \h </w:instrText>
             </w:r>
             <w:r>
               <w:rPr>
@@ -2082,7 +2082,7 @@
               <w14:ligatures w14:val="standardContextual"/>
             </w:rPr>
           </w:pPr>
-          <w:hyperlink w:anchor="_Toc241670484" w:history="1">
+          <w:hyperlink w:anchor="_Toc241692025" w:history="1">
             <w:r>
               <w:rPr>
                 <w:rStyle w:val="Hiperligao"/>
@@ -2106,7 +2106,7 @@
               <w:rPr>
                 <w:noProof/>
               </w:rPr>
-              <w:instrText xml:space="preserve"> PAGEREF _Toc241670484 \h </w:instrText>
+              <w:instrText xml:space="preserve"> PAGEREF _Toc241692025 \h </w:instrText>
             </w:r>
             <w:r>
               <w:rPr>
@@ -2148,7 +2148,7 @@
               <w14:ligatures w14:val="standardContextual"/>
             </w:rPr>
           </w:pPr>
-          <w:hyperlink w:anchor="_Toc241670485" w:history="1">
+          <w:hyperlink w:anchor="_Toc241692026" w:history="1">
             <w:r>
               <w:rPr>
                 <w:rStyle w:val="Hiperligao"/>
@@ -2172,7 +2172,7 @@
               <w:rPr>
                 <w:noProof/>
               </w:rPr>
-              <w:instrText xml:space="preserve"> PAGEREF _Toc241670485 \h </w:instrText>
+              <w:instrText xml:space="preserve"> PAGEREF _Toc241692026 \h </w:instrText>
             </w:r>
             <w:r>
               <w:rPr>
@@ -2214,7 +2214,7 @@
               <w14:ligatures w14:val="standardContextual"/>
             </w:rPr>
           </w:pPr>
-          <w:hyperlink w:anchor="_Toc241670486" w:history="1">
+          <w:hyperlink w:anchor="_Toc241692027" w:history="1">
             <w:r>
               <w:rPr>
                 <w:rStyle w:val="Hiperligao"/>
@@ -2238,7 +2238,7 @@
               <w:rPr>
                 <w:noProof/>
               </w:rPr>
-              <w:instrText xml:space="preserve"> PAGEREF _Toc241670486 \h </w:instrText>
+              <w:instrText xml:space="preserve"> PAGEREF _Toc241692027 \h </w:instrText>
             </w:r>
             <w:r>
               <w:rPr>
@@ -2280,7 +2280,7 @@
               <w14:ligatures w14:val="standardContextual"/>
             </w:rPr>
           </w:pPr>
-          <w:hyperlink w:anchor="_Toc241670487" w:history="1">
+          <w:hyperlink w:anchor="_Toc241692028" w:history="1">
             <w:r>
               <w:rPr>
                 <w:rStyle w:val="Hiperligao"/>
@@ -2304,7 +2304,7 @@
               <w:rPr>
                 <w:noProof/>
               </w:rPr>
-              <w:instrText xml:space="preserve"> PAGEREF _Toc241670487 \h </w:instrText>
+              <w:instrText xml:space="preserve"> PAGEREF _Toc241692028 \h </w:instrText>
             </w:r>
             <w:r>
               <w:rPr>
@@ -2346,7 +2346,7 @@
               <w14:ligatures w14:val="standardContextual"/>
             </w:rPr>
           </w:pPr>
-          <w:hyperlink w:anchor="_Toc241670488" w:history="1">
+          <w:hyperlink w:anchor="_Toc241692029" w:history="1">
             <w:r>
               <w:rPr>
                 <w:rStyle w:val="Hiperligao"/>
@@ -2370,7 +2370,7 @@
               <w:rPr>
                 <w:noProof/>
               </w:rPr>
-              <w:instrText xml:space="preserve"> PAGEREF _Toc241670488 \h </w:instrText>
+              <w:instrText xml:space="preserve"> PAGEREF _Toc241692029 \h </w:instrText>
             </w:r>
             <w:r>
               <w:rPr>
@@ -2412,7 +2412,7 @@
               <w14:ligatures w14:val="standardContextual"/>
             </w:rPr>
           </w:pPr>
-          <w:hyperlink w:anchor="_Toc241670489" w:history="1">
+          <w:hyperlink w:anchor="_Toc241692030" w:history="1">
             <w:r>
               <w:rPr>
                 <w:rStyle w:val="Hiperligao"/>
@@ -2436,7 +2436,7 @@
               <w:rPr>
                 <w:noProof/>
               </w:rPr>
-              <w:instrText xml:space="preserve"> PAGEREF _Toc241670489 \h </w:instrText>
+              <w:instrText xml:space="preserve"> PAGEREF _Toc241692030 \h </w:instrText>
             </w:r>
             <w:r>
               <w:rPr>
@@ -2478,7 +2478,7 @@
               <w14:ligatures w14:val="standardContextual"/>
             </w:rPr>
           </w:pPr>
-          <w:hyperlink w:anchor="_Toc241670490" w:history="1">
+          <w:hyperlink w:anchor="_Toc241692031" w:history="1">
             <w:r>
               <w:rPr>
                 <w:rStyle w:val="Hiperligao"/>
@@ -2502,7 +2502,7 @@
               <w:rPr>
                 <w:noProof/>
               </w:rPr>
-              <w:instrText xml:space="preserve"> PAGEREF _Toc241670490 \h </w:instrText>
+              <w:instrText xml:space="preserve"> PAGEREF _Toc241692031 \h </w:instrText>
             </w:r>
             <w:r>
               <w:rPr>
@@ -2544,7 +2544,7 @@
               <w14:ligatures w14:val="standardContextual"/>
             </w:rPr>
           </w:pPr>
-          <w:hyperlink w:anchor="_Toc241670491" w:history="1">
+          <w:hyperlink w:anchor="_Toc241692032" w:history="1">
             <w:r>
               <w:rPr>
                 <w:rStyle w:val="Hiperligao"/>
@@ -2568,7 +2568,7 @@
               <w:rPr>
                 <w:noProof/>
               </w:rPr>
-              <w:instrText xml:space="preserve"> PAGEREF _Toc241670491 \h </w:instrText>
+              <w:instrText xml:space="preserve"> PAGEREF _Toc241692032 \h </w:instrText>
             </w:r>
             <w:r>
               <w:rPr>
@@ -2585,7 +2585,7 @@
               <w:rPr>
                 <w:noProof/>
               </w:rPr>
-              <w:t>34</w:t>
+              <w:t>35</w:t>
             </w:r>
             <w:r>
               <w:rPr>
@@ -2610,7 +2610,7 @@
               <w14:ligatures w14:val="standardContextual"/>
             </w:rPr>
           </w:pPr>
-          <w:hyperlink w:anchor="_Toc241670492" w:history="1">
+          <w:hyperlink w:anchor="_Toc241692033" w:history="1">
             <w:r>
               <w:rPr>
                 <w:rStyle w:val="Hiperligao"/>
@@ -2634,7 +2634,7 @@
               <w:rPr>
                 <w:noProof/>
               </w:rPr>
-              <w:instrText xml:space="preserve"> PAGEREF _Toc241670492 \h </w:instrText>
+              <w:instrText xml:space="preserve"> PAGEREF _Toc241692033 \h </w:instrText>
             </w:r>
             <w:r>
               <w:rPr>
@@ -2651,7 +2651,7 @@
               <w:rPr>
                 <w:noProof/>
               </w:rPr>
-              <w:t>35</w:t>
+              <w:t>36</w:t>
             </w:r>
             <w:r>
               <w:rPr>
@@ -2676,7 +2676,7 @@
               <w14:ligatures w14:val="standardContextual"/>
             </w:rPr>
           </w:pPr>
-          <w:hyperlink w:anchor="_Toc241670493" w:history="1">
+          <w:hyperlink w:anchor="_Toc241692034" w:history="1">
             <w:r>
               <w:rPr>
                 <w:rStyle w:val="Hiperligao"/>
@@ -2700,7 +2700,7 @@
               <w:rPr>
                 <w:noProof/>
               </w:rPr>
-              <w:instrText xml:space="preserve"> PAGEREF _Toc241670493 \h </w:instrText>
+              <w:instrText xml:space="preserve"> PAGEREF _Toc241692034 \h </w:instrText>
             </w:r>
             <w:r>
               <w:rPr>
@@ -2717,7 +2717,7 @@
               <w:rPr>
                 <w:noProof/>
               </w:rPr>
-              <w:t>36</w:t>
+              <w:t>37</w:t>
             </w:r>
             <w:r>
               <w:rPr>
@@ -2742,7 +2742,7 @@
               <w14:ligatures w14:val="standardContextual"/>
             </w:rPr>
           </w:pPr>
-          <w:hyperlink w:anchor="_Toc241670494" w:history="1">
+          <w:hyperlink w:anchor="_Toc241692035" w:history="1">
             <w:r>
               <w:rPr>
                 <w:rStyle w:val="Hiperligao"/>
@@ -2766,7 +2766,7 @@
               <w:rPr>
                 <w:noProof/>
               </w:rPr>
-              <w:instrText xml:space="preserve"> PAGEREF _Toc241670494 \h </w:instrText>
+              <w:instrText xml:space="preserve"> PAGEREF _Toc241692035 \h </w:instrText>
             </w:r>
             <w:r>
               <w:rPr>
@@ -2783,7 +2783,7 @@
               <w:rPr>
                 <w:noProof/>
               </w:rPr>
-              <w:t>38</w:t>
+              <w:t>39</w:t>
             </w:r>
             <w:r>
               <w:rPr>
@@ -2808,7 +2808,7 @@
               <w14:ligatures w14:val="standardContextual"/>
             </w:rPr>
           </w:pPr>
-          <w:hyperlink w:anchor="_Toc241670495" w:history="1">
+          <w:hyperlink w:anchor="_Toc241692036" w:history="1">
             <w:r>
               <w:rPr>
                 <w:rStyle w:val="Hiperligao"/>
@@ -2832,7 +2832,7 @@
               <w:rPr>
                 <w:noProof/>
               </w:rPr>
-              <w:instrText xml:space="preserve"> PAGEREF _Toc241670495 \h </w:instrText>
+              <w:instrText xml:space="preserve"> PAGEREF _Toc241692036 \h </w:instrText>
             </w:r>
             <w:r>
               <w:rPr>
@@ -2849,7 +2849,7 @@
               <w:rPr>
                 <w:noProof/>
               </w:rPr>
-              <w:t>41</w:t>
+              <w:t>42</w:t>
             </w:r>
             <w:r>
               <w:rPr>
@@ -2874,7 +2874,7 @@
               <w14:ligatures w14:val="standardContextual"/>
             </w:rPr>
           </w:pPr>
-          <w:hyperlink w:anchor="_Toc241670496" w:history="1">
+          <w:hyperlink w:anchor="_Toc241692037" w:history="1">
             <w:r>
               <w:rPr>
                 <w:rStyle w:val="Hiperligao"/>
@@ -2898,7 +2898,7 @@
               <w:rPr>
                 <w:noProof/>
               </w:rPr>
-              <w:instrText xml:space="preserve"> PAGEREF _Toc241670496 \h </w:instrText>
+              <w:instrText xml:space="preserve"> PAGEREF _Toc241692037 \h </w:instrText>
             </w:r>
             <w:r>
               <w:rPr>
@@ -2915,7 +2915,7 @@
               <w:rPr>
                 <w:noProof/>
               </w:rPr>
-              <w:t>44</w:t>
+              <w:t>45</w:t>
             </w:r>
             <w:r>
               <w:rPr>
@@ -2940,7 +2940,7 @@
               <w14:ligatures w14:val="standardContextual"/>
             </w:rPr>
           </w:pPr>
-          <w:hyperlink w:anchor="_Toc241670497" w:history="1">
+          <w:hyperlink w:anchor="_Toc241692038" w:history="1">
             <w:r>
               <w:rPr>
                 <w:rStyle w:val="Hiperligao"/>
@@ -2964,7 +2964,7 @@
               <w:rPr>
                 <w:noProof/>
               </w:rPr>
-              <w:instrText xml:space="preserve"> PAGEREF _Toc241670497 \h </w:instrText>
+              <w:instrText xml:space="preserve"> PAGEREF _Toc241692038 \h </w:instrText>
             </w:r>
             <w:r>
               <w:rPr>
@@ -2981,7 +2981,7 @@
               <w:rPr>
                 <w:noProof/>
               </w:rPr>
-              <w:t>46</w:t>
+              <w:t>47</w:t>
             </w:r>
             <w:r>
               <w:rPr>
@@ -3006,7 +3006,7 @@
               <w14:ligatures w14:val="standardContextual"/>
             </w:rPr>
           </w:pPr>
-          <w:hyperlink w:anchor="_Toc241670498" w:history="1">
+          <w:hyperlink w:anchor="_Toc241692039" w:history="1">
             <w:r>
               <w:rPr>
                 <w:rStyle w:val="Hiperligao"/>
@@ -3030,7 +3030,7 @@
               <w:rPr>
                 <w:noProof/>
               </w:rPr>
-              <w:instrText xml:space="preserve"> PAGEREF _Toc241670498 \h </w:instrText>
+              <w:instrText xml:space="preserve"> PAGEREF _Toc241692039 \h </w:instrText>
             </w:r>
             <w:r>
               <w:rPr>
@@ -3047,7 +3047,7 @@
               <w:rPr>
                 <w:noProof/>
               </w:rPr>
-              <w:t>47</w:t>
+              <w:t>48</w:t>
             </w:r>
             <w:r>
               <w:rPr>
@@ -3072,7 +3072,7 @@
               <w14:ligatures w14:val="standardContextual"/>
             </w:rPr>
           </w:pPr>
-          <w:hyperlink w:anchor="_Toc241670499" w:history="1">
+          <w:hyperlink w:anchor="_Toc241692040" w:history="1">
             <w:r>
               <w:rPr>
                 <w:rStyle w:val="Hiperligao"/>
@@ -3096,7 +3096,7 @@
               <w:rPr>
                 <w:noProof/>
               </w:rPr>
-              <w:instrText xml:space="preserve"> PAGEREF _Toc241670499 \h </w:instrText>
+              <w:instrText xml:space="preserve"> PAGEREF _Toc241692040 \h </w:instrText>
             </w:r>
             <w:r>
               <w:rPr>
@@ -3113,7 +3113,7 @@
               <w:rPr>
                 <w:noProof/>
               </w:rPr>
-              <w:t>49</w:t>
+              <w:t>50</w:t>
             </w:r>
             <w:r>
               <w:rPr>
@@ -3138,7 +3138,7 @@
               <w14:ligatures w14:val="standardContextual"/>
             </w:rPr>
           </w:pPr>
-          <w:hyperlink w:anchor="_Toc241670500" w:history="1">
+          <w:hyperlink w:anchor="_Toc241692041" w:history="1">
             <w:r>
               <w:rPr>
                 <w:rStyle w:val="Hiperligao"/>
@@ -3162,7 +3162,7 @@
               <w:rPr>
                 <w:noProof/>
               </w:rPr>
-              <w:instrText xml:space="preserve"> PAGEREF _Toc241670500 \h </w:instrText>
+              <w:instrText xml:space="preserve"> PAGEREF _Toc241692041 \h </w:instrText>
             </w:r>
             <w:r>
               <w:rPr>
@@ -3179,7 +3179,7 @@
               <w:rPr>
                 <w:noProof/>
               </w:rPr>
-              <w:t>50</w:t>
+              <w:t>51</w:t>
             </w:r>
             <w:r>
               <w:rPr>
@@ -3204,7 +3204,7 @@
               <w14:ligatures w14:val="standardContextual"/>
             </w:rPr>
           </w:pPr>
-          <w:hyperlink w:anchor="_Toc241670501" w:history="1">
+          <w:hyperlink w:anchor="_Toc241692042" w:history="1">
             <w:r>
               <w:rPr>
                 <w:rStyle w:val="Hiperligao"/>
@@ -3228,7 +3228,7 @@
               <w:rPr>
                 <w:noProof/>
               </w:rPr>
-              <w:instrText xml:space="preserve"> PAGEREF _Toc241670501 \h </w:instrText>
+              <w:instrText xml:space="preserve"> PAGEREF _Toc241692042 \h </w:instrText>
             </w:r>
             <w:r>
               <w:rPr>
@@ -3245,7 +3245,7 @@
               <w:rPr>
                 <w:noProof/>
               </w:rPr>
-              <w:t>51</w:t>
+              <w:t>52</w:t>
             </w:r>
             <w:r>
               <w:rPr>
@@ -3270,7 +3270,7 @@
               <w14:ligatures w14:val="standardContextual"/>
             </w:rPr>
           </w:pPr>
-          <w:hyperlink w:anchor="_Toc241670502" w:history="1">
+          <w:hyperlink w:anchor="_Toc241692043" w:history="1">
             <w:r>
               <w:rPr>
                 <w:rStyle w:val="Hiperligao"/>
@@ -3294,7 +3294,7 @@
               <w:rPr>
                 <w:noProof/>
               </w:rPr>
-              <w:instrText xml:space="preserve"> PAGEREF _Toc241670502 \h </w:instrText>
+              <w:instrText xml:space="preserve"> PAGEREF _Toc241692043 \h </w:instrText>
             </w:r>
             <w:r>
               <w:rPr>
@@ -3311,7 +3311,7 @@
               <w:rPr>
                 <w:noProof/>
               </w:rPr>
-              <w:t>52</w:t>
+              <w:t>53</w:t>
             </w:r>
             <w:r>
               <w:rPr>
@@ -3336,7 +3336,7 @@
               <w14:ligatures w14:val="standardContextual"/>
             </w:rPr>
           </w:pPr>
-          <w:hyperlink w:anchor="_Toc241670503" w:history="1">
+          <w:hyperlink w:anchor="_Toc241692044" w:history="1">
             <w:r>
               <w:rPr>
                 <w:rStyle w:val="Hiperligao"/>
@@ -3360,7 +3360,7 @@
               <w:rPr>
                 <w:noProof/>
               </w:rPr>
-              <w:instrText xml:space="preserve"> PAGEREF _Toc241670503 \h </w:instrText>
+              <w:instrText xml:space="preserve"> PAGEREF _Toc241692044 \h </w:instrText>
             </w:r>
             <w:r>
               <w:rPr>
@@ -3377,7 +3377,7 @@
               <w:rPr>
                 <w:noProof/>
               </w:rPr>
-              <w:t>53</w:t>
+              <w:t>54</w:t>
             </w:r>
             <w:r>
               <w:rPr>
@@ -3402,7 +3402,7 @@
               <w14:ligatures w14:val="standardContextual"/>
             </w:rPr>
           </w:pPr>
-          <w:hyperlink w:anchor="_Toc241670504" w:history="1">
+          <w:hyperlink w:anchor="_Toc241692045" w:history="1">
             <w:r>
               <w:rPr>
                 <w:rStyle w:val="Hiperligao"/>
@@ -3426,7 +3426,7 @@
               <w:rPr>
                 <w:noProof/>
               </w:rPr>
-              <w:instrText xml:space="preserve"> PAGEREF _Toc241670504 \h </w:instrText>
+              <w:instrText xml:space="preserve"> PAGEREF _Toc241692045 \h </w:instrText>
             </w:r>
             <w:r>
               <w:rPr>
@@ -3443,7 +3443,7 @@
               <w:rPr>
                 <w:noProof/>
               </w:rPr>
-              <w:t>53</w:t>
+              <w:t>54</w:t>
             </w:r>
             <w:r>
               <w:rPr>
@@ -3468,7 +3468,7 @@
               <w14:ligatures w14:val="standardContextual"/>
             </w:rPr>
           </w:pPr>
-          <w:hyperlink w:anchor="_Toc241670505" w:history="1">
+          <w:hyperlink w:anchor="_Toc241692046" w:history="1">
             <w:r>
               <w:rPr>
                 <w:rStyle w:val="Hiperligao"/>
@@ -3492,7 +3492,7 @@
               <w:rPr>
                 <w:noProof/>
               </w:rPr>
-              <w:instrText xml:space="preserve"> PAGEREF _Toc241670505 \h </w:instrText>
+              <w:instrText xml:space="preserve"> PAGEREF _Toc241692046 \h </w:instrText>
             </w:r>
             <w:r>
               <w:rPr>
@@ -3509,7 +3509,7 @@
               <w:rPr>
                 <w:noProof/>
               </w:rPr>
-              <w:t>54</w:t>
+              <w:t>55</w:t>
             </w:r>
             <w:r>
               <w:rPr>
@@ -3534,7 +3534,7 @@
               <w14:ligatures w14:val="standardContextual"/>
             </w:rPr>
           </w:pPr>
-          <w:hyperlink w:anchor="_Toc241670506" w:history="1">
+          <w:hyperlink w:anchor="_Toc241692047" w:history="1">
             <w:r>
               <w:rPr>
                 <w:rStyle w:val="Hiperligao"/>
@@ -3558,7 +3558,7 @@
               <w:rPr>
                 <w:noProof/>
               </w:rPr>
-              <w:instrText xml:space="preserve"> PAGEREF _Toc241670506 \h </w:instrText>
+              <w:instrText xml:space="preserve"> PAGEREF _Toc241692047 \h </w:instrText>
             </w:r>
             <w:r>
               <w:rPr>
@@ -3575,7 +3575,7 @@
               <w:rPr>
                 <w:noProof/>
               </w:rPr>
-              <w:t>55</w:t>
+              <w:t>56</w:t>
             </w:r>
             <w:r>
               <w:rPr>
@@ -3600,7 +3600,7 @@
               <w14:ligatures w14:val="standardContextual"/>
             </w:rPr>
           </w:pPr>
-          <w:hyperlink w:anchor="_Toc241670507" w:history="1">
+          <w:hyperlink w:anchor="_Toc241692048" w:history="1">
             <w:r>
               <w:rPr>
                 <w:rStyle w:val="Hiperligao"/>
@@ -3624,7 +3624,7 @@
               <w:rPr>
                 <w:noProof/>
               </w:rPr>
-              <w:instrText xml:space="preserve"> PAGEREF _Toc241670507 \h </w:instrText>
+              <w:instrText xml:space="preserve"> PAGEREF _Toc241692048 \h </w:instrText>
             </w:r>
             <w:r>
               <w:rPr>
@@ -3641,7 +3641,7 @@
               <w:rPr>
                 <w:noProof/>
               </w:rPr>
-              <w:t>56</w:t>
+              <w:t>57</w:t>
             </w:r>
             <w:r>
               <w:rPr>
@@ -3666,7 +3666,7 @@
               <w14:ligatures w14:val="standardContextual"/>
             </w:rPr>
           </w:pPr>
-          <w:hyperlink w:anchor="_Toc241670508" w:history="1">
+          <w:hyperlink w:anchor="_Toc241692049" w:history="1">
             <w:r>
               <w:rPr>
                 <w:rStyle w:val="Hiperligao"/>
@@ -3690,7 +3690,7 @@
               <w:rPr>
                 <w:noProof/>
               </w:rPr>
-              <w:instrText xml:space="preserve"> PAGEREF _Toc241670508 \h </w:instrText>
+              <w:instrText xml:space="preserve"> PAGEREF _Toc241692049 \h </w:instrText>
             </w:r>
             <w:r>
               <w:rPr>
@@ -3707,7 +3707,7 @@
               <w:rPr>
                 <w:noProof/>
               </w:rPr>
-              <w:t>57</w:t>
+              <w:t>58</w:t>
             </w:r>
             <w:r>
               <w:rPr>
@@ -3732,7 +3732,7 @@
               <w14:ligatures w14:val="standardContextual"/>
             </w:rPr>
           </w:pPr>
-          <w:hyperlink w:anchor="_Toc241670509" w:history="1">
+          <w:hyperlink w:anchor="_Toc241692050" w:history="1">
             <w:r>
               <w:rPr>
                 <w:rStyle w:val="Hiperligao"/>
@@ -3756,7 +3756,7 @@
               <w:rPr>
                 <w:noProof/>
               </w:rPr>
-              <w:instrText xml:space="preserve"> PAGEREF _Toc241670509 \h </w:instrText>
+              <w:instrText xml:space="preserve"> PAGEREF _Toc241692050 \h </w:instrText>
             </w:r>
             <w:r>
               <w:rPr>
@@ -3773,7 +3773,7 @@
               <w:rPr>
                 <w:noProof/>
               </w:rPr>
-              <w:t>58</w:t>
+              <w:t>59</w:t>
             </w:r>
             <w:r>
               <w:rPr>
@@ -3798,7 +3798,7 @@
               <w14:ligatures w14:val="standardContextual"/>
             </w:rPr>
           </w:pPr>
-          <w:hyperlink w:anchor="_Toc241670510" w:history="1">
+          <w:hyperlink w:anchor="_Toc241692051" w:history="1">
             <w:r>
               <w:rPr>
                 <w:rStyle w:val="Hiperligao"/>
@@ -3822,7 +3822,7 @@
               <w:rPr>
                 <w:noProof/>
               </w:rPr>
-              <w:instrText xml:space="preserve"> PAGEREF _Toc241670510 \h </w:instrText>
+              <w:instrText xml:space="preserve"> PAGEREF _Toc241692051 \h </w:instrText>
             </w:r>
             <w:r>
               <w:rPr>
@@ -3839,7 +3839,7 @@
               <w:rPr>
                 <w:noProof/>
               </w:rPr>
-              <w:t>59</w:t>
+              <w:t>60</w:t>
             </w:r>
             <w:r>
               <w:rPr>
@@ -3864,7 +3864,7 @@
               <w14:ligatures w14:val="standardContextual"/>
             </w:rPr>
           </w:pPr>
-          <w:hyperlink w:anchor="_Toc241670511" w:history="1">
+          <w:hyperlink w:anchor="_Toc241692052" w:history="1">
             <w:r>
               <w:rPr>
                 <w:rStyle w:val="Hiperligao"/>
@@ -3888,7 +3888,7 @@
               <w:rPr>
                 <w:noProof/>
               </w:rPr>
-              <w:instrText xml:space="preserve"> PAGEREF _Toc241670511 \h </w:instrText>
+              <w:instrText xml:space="preserve"> PAGEREF _Toc241692052 \h </w:instrText>
             </w:r>
             <w:r>
               <w:rPr>
@@ -3905,7 +3905,7 @@
               <w:rPr>
                 <w:noProof/>
               </w:rPr>
-              <w:t>61</w:t>
+              <w:t>62</w:t>
             </w:r>
             <w:r>
               <w:rPr>
@@ -3930,7 +3930,7 @@
               <w14:ligatures w14:val="standardContextual"/>
             </w:rPr>
           </w:pPr>
-          <w:hyperlink w:anchor="_Toc241670512" w:history="1">
+          <w:hyperlink w:anchor="_Toc241692053" w:history="1">
             <w:r>
               <w:rPr>
                 <w:rStyle w:val="Hiperligao"/>
@@ -3954,7 +3954,7 @@
               <w:rPr>
                 <w:noProof/>
               </w:rPr>
-              <w:instrText xml:space="preserve"> PAGEREF _Toc241670512 \h </w:instrText>
+              <w:instrText xml:space="preserve"> PAGEREF _Toc241692053 \h </w:instrText>
             </w:r>
             <w:r>
               <w:rPr>
@@ -3971,7 +3971,7 @@
               <w:rPr>
                 <w:noProof/>
               </w:rPr>
-              <w:t>61</w:t>
+              <w:t>62</w:t>
             </w:r>
             <w:r>
               <w:rPr>
@@ -3996,7 +3996,7 @@
               <w14:ligatures w14:val="standardContextual"/>
             </w:rPr>
           </w:pPr>
-          <w:hyperlink w:anchor="_Toc241670513" w:history="1">
+          <w:hyperlink w:anchor="_Toc241692054" w:history="1">
             <w:r>
               <w:rPr>
                 <w:rStyle w:val="Hiperligao"/>
@@ -4020,7 +4020,7 @@
               <w:rPr>
                 <w:noProof/>
               </w:rPr>
-              <w:instrText xml:space="preserve"> PAGEREF _Toc241670513 \h </w:instrText>
+              <w:instrText xml:space="preserve"> PAGEREF _Toc241692054 \h </w:instrText>
             </w:r>
             <w:r>
               <w:rPr>
@@ -4037,7 +4037,7 @@
               <w:rPr>
                 <w:noProof/>
               </w:rPr>
-              <w:t>62</w:t>
+              <w:t>63</w:t>
             </w:r>
             <w:r>
               <w:rPr>
@@ -4062,7 +4062,7 @@
               <w14:ligatures w14:val="standardContextual"/>
             </w:rPr>
           </w:pPr>
-          <w:hyperlink w:anchor="_Toc241670514" w:history="1">
+          <w:hyperlink w:anchor="_Toc241692055" w:history="1">
             <w:r>
               <w:rPr>
                 <w:rStyle w:val="Hiperligao"/>
@@ -4086,7 +4086,7 @@
               <w:rPr>
                 <w:noProof/>
               </w:rPr>
-              <w:instrText xml:space="preserve"> PAGEREF _Toc241670514 \h </w:instrText>
+              <w:instrText xml:space="preserve"> PAGEREF _Toc241692055 \h </w:instrText>
             </w:r>
             <w:r>
               <w:rPr>
@@ -4103,7 +4103,7 @@
               <w:rPr>
                 <w:noProof/>
               </w:rPr>
-              <w:t>63</w:t>
+              <w:t>64</w:t>
             </w:r>
             <w:r>
               <w:rPr>
@@ -4128,7 +4128,7 @@
               <w14:ligatures w14:val="standardContextual"/>
             </w:rPr>
           </w:pPr>
-          <w:hyperlink w:anchor="_Toc241670515" w:history="1">
+          <w:hyperlink w:anchor="_Toc241692056" w:history="1">
             <w:r>
               <w:rPr>
                 <w:rStyle w:val="Hiperligao"/>
@@ -4152,7 +4152,7 @@
               <w:rPr>
                 <w:noProof/>
               </w:rPr>
-              <w:instrText xml:space="preserve"> PAGEREF _Toc241670515 \h </w:instrText>
+              <w:instrText xml:space="preserve"> PAGEREF _Toc241692056 \h </w:instrText>
             </w:r>
             <w:r>
               <w:rPr>
@@ -4169,7 +4169,7 @@
               <w:rPr>
                 <w:noProof/>
               </w:rPr>
-              <w:t>64</w:t>
+              <w:t>65</w:t>
             </w:r>
             <w:r>
               <w:rPr>
@@ -4194,7 +4194,7 @@
               <w14:ligatures w14:val="standardContextual"/>
             </w:rPr>
           </w:pPr>
-          <w:hyperlink w:anchor="_Toc241670516" w:history="1">
+          <w:hyperlink w:anchor="_Toc241692057" w:history="1">
             <w:r>
               <w:rPr>
                 <w:rStyle w:val="Hiperligao"/>
@@ -4218,7 +4218,7 @@
               <w:rPr>
                 <w:noProof/>
               </w:rPr>
-              <w:instrText xml:space="preserve"> PAGEREF _Toc241670516 \h </w:instrText>
+              <w:instrText xml:space="preserve"> PAGEREF _Toc241692057 \h </w:instrText>
             </w:r>
             <w:r>
               <w:rPr>
@@ -4235,7 +4235,7 @@
               <w:rPr>
                 <w:noProof/>
               </w:rPr>
-              <w:t>64</w:t>
+              <w:t>65</w:t>
             </w:r>
             <w:r>
               <w:rPr>
@@ -4266,7 +4266,7 @@
       <w:pPr>
         <w:pStyle w:val="Ttulo1"/>
       </w:pPr>
-      <w:bookmarkStart w:id="0" w:name="_Toc241670454"/>
+      <w:bookmarkStart w:id="0" w:name="_Toc241691995"/>
       <w:r>
         <w:lastRenderedPageBreak/>
         <w:t>Your role at a glance</w:t>
@@ -4347,7 +4347,7 @@
       <w:pPr>
         <w:pStyle w:val="Ttulo2"/>
       </w:pPr>
-      <w:bookmarkStart w:id="1" w:name="_Toc241670455"/>
+      <w:bookmarkStart w:id="1" w:name="_Toc241691996"/>
       <w:r>
         <w:t>You can / You cannot</w:t>
       </w:r>
@@ -5195,7 +5195,7 @@
       <w:pPr>
         <w:pStyle w:val="Ttulo2"/>
       </w:pPr>
-      <w:bookmarkStart w:id="2" w:name="_Toc241670456"/>
+      <w:bookmarkStart w:id="2" w:name="_Toc241691997"/>
       <w:r>
         <w:t>Where your access comes from</w:t>
       </w:r>
@@ -5305,7 +5305,7 @@
       <w:pPr>
         <w:pStyle w:val="Ttulo2"/>
       </w:pPr>
-      <w:bookmarkStart w:id="3" w:name="_Toc241670457"/>
+      <w:bookmarkStart w:id="3" w:name="_Toc241691998"/>
       <w:r>
         <w:t>How to sign in, change your password, and sign out</w:t>
       </w:r>
@@ -5419,7 +5419,7 @@
           <w:noProof/>
         </w:rPr>
         <w:drawing>
-          <wp:inline distT="0" distB="0" distL="0" distR="0" wp14:anchorId="299539B9" wp14:editId="5CD443A0">
+          <wp:inline distT="0" distB="0" distL="0" distR="0" wp14:anchorId="4A1E0541" wp14:editId="7CBC7509">
             <wp:extent cx="5715000" cy="3571875"/>
             <wp:effectExtent l="0" t="0" r="0" b="0"/>
             <wp:docPr id="1" name="01-login.png" descr="The sign-in page with Email, Password, Remember me and the Sign in button." title="The sign-in page with Email, Password, Remember me and the Sign in button."/>
@@ -5534,7 +5534,7 @@
         </w:rPr>
         <w:lastRenderedPageBreak/>
         <w:drawing>
-          <wp:inline distT="0" distB="0" distL="0" distR="0" wp14:anchorId="56332DA9" wp14:editId="046B92C0">
+          <wp:inline distT="0" distB="0" distL="0" distR="0" wp14:anchorId="64E2E615" wp14:editId="6FA1B1BB">
             <wp:extent cx="5715000" cy="3571875"/>
             <wp:effectExtent l="0" t="0" r="0" b="0"/>
             <wp:docPr id="2" name="03-user-menu.png" descr="The account menu open, with Settings and Log out." title="The account menu open, with Settings and Log out."/>
@@ -5586,7 +5586,7 @@
       <w:pPr>
         <w:pStyle w:val="Ttulo2"/>
       </w:pPr>
-      <w:bookmarkStart w:id="4" w:name="_Toc241670458"/>
+      <w:bookmarkStart w:id="4" w:name="_Toc241691999"/>
       <w:r>
         <w:t>The sidebar</w:t>
       </w:r>
@@ -6127,7 +6127,7 @@
         </w:rPr>
         <w:lastRenderedPageBreak/>
         <w:drawing>
-          <wp:inline distT="0" distB="0" distL="0" distR="0" wp14:anchorId="2DE987DF" wp14:editId="730E51B9">
+          <wp:inline distT="0" distB="0" distL="0" distR="0" wp14:anchorId="292C47AC" wp14:editId="22C66B53">
             <wp:extent cx="5715000" cy="5133975"/>
             <wp:effectExtent l="0" t="0" r="0" b="0"/>
             <wp:docPr id="3" name="01-dashboard-sidebar.png" descr="The full Administrator sidebar, including Data Modeling and Migration." title="The full Administrator sidebar, including Data Modeling and Migration."/>
@@ -6180,7 +6180,7 @@
         <w:pStyle w:val="Ttulo1"/>
         <w:pageBreakBefore/>
       </w:pPr>
-      <w:bookmarkStart w:id="5" w:name="_Toc241670459"/>
+      <w:bookmarkStart w:id="5" w:name="_Toc241692000"/>
       <w:r>
         <w:lastRenderedPageBreak/>
         <w:t>Settings</w:t>
@@ -6210,7 +6210,7 @@
           <w:noProof/>
         </w:rPr>
         <w:drawing>
-          <wp:inline distT="0" distB="0" distL="0" distR="0" wp14:anchorId="07620CA3" wp14:editId="578B8861">
+          <wp:inline distT="0" distB="0" distL="0" distR="0" wp14:anchorId="311020D3" wp14:editId="52C8180A">
             <wp:extent cx="5715000" cy="3571875"/>
             <wp:effectExtent l="0" t="0" r="0" b="0"/>
             <wp:docPr id="4" name="04-settings.png" descr="The Settings page with the Language, Theme and Color palette cards." title="The Settings page with the Language, Theme and Color palette cards."/>
@@ -7559,7 +7559,7 @@
         <w:pStyle w:val="Ttulo1"/>
         <w:pageBreakBefore/>
       </w:pPr>
-      <w:bookmarkStart w:id="6" w:name="_Toc241670460"/>
+      <w:bookmarkStart w:id="6" w:name="_Toc241692001"/>
       <w:r>
         <w:lastRenderedPageBreak/>
         <w:t>Dashboard</w:t>
@@ -7592,7 +7592,7 @@
           <w:noProof/>
         </w:rPr>
         <w:drawing>
-          <wp:inline distT="0" distB="0" distL="0" distR="0" wp14:anchorId="1EFBCFCD" wp14:editId="3D5FA7CA">
+          <wp:inline distT="0" distB="0" distL="0" distR="0" wp14:anchorId="614F2C38" wp14:editId="35605276">
             <wp:extent cx="5715000" cy="5133975"/>
             <wp:effectExtent l="0" t="0" r="0" b="0"/>
             <wp:docPr id="5" name="01-dashboard-sidebar.png" descr="The Administrator dashboard with summary cards and the Recent Maps list." title="The Administrator dashboard with summary cards and the Recent Maps list."/>
@@ -8101,7 +8101,7 @@
         <w:pStyle w:val="Ttulo1"/>
         <w:pageBreakBefore/>
       </w:pPr>
-      <w:bookmarkStart w:id="7" w:name="_Toc241670461"/>
+      <w:bookmarkStart w:id="7" w:name="_Toc241692002"/>
       <w:r>
         <w:lastRenderedPageBreak/>
         <w:t>Maps</w:t>
@@ -8131,7 +8131,7 @@
           <w:noProof/>
         </w:rPr>
         <w:drawing>
-          <wp:inline distT="0" distB="0" distL="0" distR="0" wp14:anchorId="19B4D2B1" wp14:editId="49038FC4">
+          <wp:inline distT="0" distB="0" distL="0" distR="0" wp14:anchorId="4B4844D8" wp14:editId="2E85F35A">
             <wp:extent cx="5715000" cy="3429000"/>
             <wp:effectExtent l="0" t="0" r="0" b="0"/>
             <wp:docPr id="6" name="02-maps-all.png" descr="The Maps list, All tab, with every row icon and the Workbooks section above." title="The Maps list, All tab, with every row icon and the Workbooks section above."/>
@@ -8183,7 +8183,7 @@
       <w:pPr>
         <w:pStyle w:val="Ttulo2"/>
       </w:pPr>
-      <w:bookmarkStart w:id="8" w:name="_Toc241670462"/>
+      <w:bookmarkStart w:id="8" w:name="_Toc241692003"/>
       <w:r>
         <w:t>The list</w:t>
       </w:r>
@@ -9387,7 +9387,7 @@
       <w:pPr>
         <w:pStyle w:val="Ttulo2"/>
       </w:pPr>
-      <w:bookmarkStart w:id="9" w:name="_Toc241670463"/>
+      <w:bookmarkStart w:id="9" w:name="_Toc241692004"/>
       <w:r>
         <w:t>Workbooks</w:t>
       </w:r>
@@ -9801,7 +9801,7 @@
       <w:pPr>
         <w:pStyle w:val="Ttulo2"/>
       </w:pPr>
-      <w:bookmarkStart w:id="10" w:name="_Toc241670464"/>
+      <w:bookmarkStart w:id="10" w:name="_Toc241692005"/>
       <w:r>
         <w:t>Share a map</w:t>
       </w:r>
@@ -9824,7 +9824,7 @@
         </w:rPr>
         <w:lastRenderedPageBreak/>
         <w:drawing>
-          <wp:inline distT="0" distB="0" distL="0" distR="0" wp14:anchorId="28AF2646" wp14:editId="625C1DA0">
+          <wp:inline distT="0" distB="0" distL="0" distR="0" wp14:anchorId="63D59836" wp14:editId="143D4BA0">
             <wp:extent cx="3743325" cy="3895725"/>
             <wp:effectExtent l="0" t="0" r="0" b="0"/>
             <wp:docPr id="7" name="03-share-dialog.png" descr="The Share map dialog with a search box and Can view, Can export and Can edit buttons." title="The Share map dialog with a search box and Can view, Can export and Can edit buttons."/>
@@ -10301,7 +10301,7 @@
       <w:pPr>
         <w:pStyle w:val="Ttulo2"/>
       </w:pPr>
-      <w:bookmarkStart w:id="11" w:name="_Toc241670465"/>
+      <w:bookmarkStart w:id="11" w:name="_Toc241692006"/>
       <w:r>
         <w:lastRenderedPageBreak/>
         <w:t>Share a whole workbook</w:t>
@@ -10357,7 +10357,7 @@
       <w:pPr>
         <w:pStyle w:val="Ttulo2"/>
       </w:pPr>
-      <w:bookmarkStart w:id="12" w:name="_Toc241670466"/>
+      <w:bookmarkStart w:id="12" w:name="_Toc241692007"/>
       <w:r>
         <w:t>Copy a map</w:t>
       </w:r>
@@ -10372,7 +10372,7 @@
       <w:pPr>
         <w:pStyle w:val="Ttulo2"/>
       </w:pPr>
-      <w:bookmarkStart w:id="13" w:name="_Toc241670467"/>
+      <w:bookmarkStart w:id="13" w:name="_Toc241692008"/>
       <w:r>
         <w:t>Example: give a colleague read access</w:t>
       </w:r>
@@ -10503,7 +10503,7 @@
         <w:pStyle w:val="Ttulo1"/>
         <w:pageBreakBefore/>
       </w:pPr>
-      <w:bookmarkStart w:id="14" w:name="_Toc241670468"/>
+      <w:bookmarkStart w:id="14" w:name="_Toc241692009"/>
       <w:r>
         <w:lastRenderedPageBreak/>
         <w:t>Map builder</w:t>
@@ -10536,7 +10536,7 @@
           <w:noProof/>
         </w:rPr>
         <w:drawing>
-          <wp:inline distT="0" distB="0" distL="0" distR="0" wp14:anchorId="02E966EF" wp14:editId="4F1E9034">
+          <wp:inline distT="0" distB="0" distL="0" distR="0" wp14:anchorId="0E8B0435" wp14:editId="062D18E2">
             <wp:extent cx="5715000" cy="3571875"/>
             <wp:effectExtent l="0" t="0" r="0" b="0"/>
             <wp:docPr id="8" name="05-builder-overview.png" descr="The map builder with the Business Areas tree, the columns canvas and the Properties panel." title="The map builder with the Business Areas tree, the columns canvas and the Properties panel."/>
@@ -10588,7 +10588,7 @@
       <w:pPr>
         <w:pStyle w:val="Ttulo2"/>
       </w:pPr>
-      <w:bookmarkStart w:id="15" w:name="_Toc241670469"/>
+      <w:bookmarkStart w:id="15" w:name="_Toc241692010"/>
       <w:r>
         <w:t>The screen</w:t>
       </w:r>
@@ -10748,7 +10748,7 @@
       <w:pPr>
         <w:pStyle w:val="Ttulo2"/>
       </w:pPr>
-      <w:bookmarkStart w:id="16" w:name="_Toc241670470"/>
+      <w:bookmarkStart w:id="16" w:name="_Toc241692011"/>
       <w:r>
         <w:t>The toolbar</w:t>
       </w:r>
@@ -11964,7 +11964,7 @@
       <w:pPr>
         <w:pStyle w:val="Ttulo2"/>
       </w:pPr>
-      <w:bookmarkStart w:id="17" w:name="_Toc241670471"/>
+      <w:bookmarkStart w:id="17" w:name="_Toc241692012"/>
       <w:r>
         <w:t>Build a map</w:t>
       </w:r>
@@ -12171,7 +12171,7 @@
       <w:pPr>
         <w:pStyle w:val="Ttulo2"/>
       </w:pPr>
-      <w:bookmarkStart w:id="18" w:name="_Toc241670472"/>
+      <w:bookmarkStart w:id="18" w:name="_Toc241692013"/>
       <w:r>
         <w:lastRenderedPageBreak/>
         <w:t>Configure a column</w:t>
@@ -14990,7 +14990,7 @@
           <w:noProof/>
         </w:rPr>
         <w:drawing>
-          <wp:inline distT="0" distB="0" distL="0" distR="0" wp14:anchorId="628EE944" wp14:editId="1F97C666">
+          <wp:inline distT="0" distB="0" distL="0" distR="0" wp14:anchorId="0B204F5A" wp14:editId="7190DA7A">
             <wp:extent cx="5715000" cy="3571875"/>
             <wp:effectExtent l="0" t="0" r="0" b="0"/>
             <wp:docPr id="9" name="08-builder-column-aggregation.png" descr="The Configure column dialog with the Aggregation list open." title="The Configure column dialog with the Aggregation list open."/>
@@ -15042,7 +15042,7 @@
       <w:pPr>
         <w:pStyle w:val="Ttulo2"/>
       </w:pPr>
-      <w:bookmarkStart w:id="19" w:name="_Toc241670473"/>
+      <w:bookmarkStart w:id="19" w:name="_Toc241692014"/>
       <w:r>
         <w:lastRenderedPageBreak/>
         <w:t>The Properties tab</w:t>
@@ -15890,7 +15890,7 @@
       <w:pPr>
         <w:pStyle w:val="Ttulo2"/>
       </w:pPr>
-      <w:bookmarkStart w:id="20" w:name="_Toc241670474"/>
+      <w:bookmarkStart w:id="20" w:name="_Toc241692015"/>
       <w:r>
         <w:t>The Conditions tab</w:t>
       </w:r>
@@ -17433,7 +17433,7 @@
       <w:pPr>
         <w:pStyle w:val="Ttulo2"/>
       </w:pPr>
-      <w:bookmarkStart w:id="21" w:name="_Toc241670475"/>
+      <w:bookmarkStart w:id="21" w:name="_Toc241692016"/>
       <w:r>
         <w:t>The Sort tab</w:t>
       </w:r>
@@ -17878,7 +17878,7 @@
       <w:pPr>
         <w:pStyle w:val="Ttulo2"/>
       </w:pPr>
-      <w:bookmarkStart w:id="22" w:name="_Toc241670476"/>
+      <w:bookmarkStart w:id="22" w:name="_Toc241692017"/>
       <w:r>
         <w:t>The Parameters tab</w:t>
       </w:r>
@@ -18788,7 +18788,7 @@
       <w:pPr>
         <w:pStyle w:val="Ttulo2"/>
       </w:pPr>
-      <w:bookmarkStart w:id="23" w:name="_Toc241670477"/>
+      <w:bookmarkStart w:id="23" w:name="_Toc241692018"/>
       <w:r>
         <w:t>The Calculated Fields tab</w:t>
       </w:r>
@@ -19686,7 +19686,7 @@
       <w:pPr>
         <w:pStyle w:val="Ttulo2"/>
       </w:pPr>
-      <w:bookmarkStart w:id="24" w:name="_Toc241670478"/>
+      <w:bookmarkStart w:id="24" w:name="_Toc241692019"/>
       <w:r>
         <w:t>Conditional formatting</w:t>
       </w:r>
@@ -21080,7 +21080,7 @@
       <w:pPr>
         <w:pStyle w:val="Ttulo2"/>
       </w:pPr>
-      <w:bookmarkStart w:id="25" w:name="_Toc241670479"/>
+      <w:bookmarkStart w:id="25" w:name="_Toc241692020"/>
       <w:r>
         <w:t>Run a map and read the result</w:t>
       </w:r>
@@ -22149,7 +22149,7 @@
           <w:noProof/>
         </w:rPr>
         <w:drawing>
-          <wp:inline distT="0" distB="0" distL="0" distR="0" wp14:anchorId="1CA2F1BA" wp14:editId="322028AA">
+          <wp:inline distT="0" distB="0" distL="0" distR="0" wp14:anchorId="5D1A6FA8" wp14:editId="5A3A6B41">
             <wp:extent cx="5715000" cy="3571875"/>
             <wp:effectExtent l="0" t="0" r="0" b="0"/>
             <wp:docPr id="10" name="03-viewer-results.png" descr="Run results with the SQL and Plan buttons beside the Excel, CSV and PDF buttons." title="Run results with the SQL and Plan buttons beside the Excel, CSV and PDF buttons."/>
@@ -22216,7 +22216,7 @@
       <w:pPr>
         <w:pStyle w:val="Ttulo2"/>
       </w:pPr>
-      <w:bookmarkStart w:id="26" w:name="_Toc241670480"/>
+      <w:bookmarkStart w:id="26" w:name="_Toc241692021"/>
       <w:r>
         <w:t>Refusals and errors</w:t>
       </w:r>
@@ -22855,7 +22855,7 @@
         <w:pStyle w:val="Ttulo1"/>
         <w:pageBreakBefore/>
       </w:pPr>
-      <w:bookmarkStart w:id="27" w:name="_Toc241670481"/>
+      <w:bookmarkStart w:id="27" w:name="_Toc241692022"/>
       <w:r>
         <w:lastRenderedPageBreak/>
         <w:t>The map viewer</w:t>
@@ -22888,7 +22888,7 @@
           <w:noProof/>
         </w:rPr>
         <w:drawing>
-          <wp:inline distT="0" distB="0" distL="0" distR="0" wp14:anchorId="16C4CF29" wp14:editId="174C23BA">
+          <wp:inline distT="0" distB="0" distL="0" distR="0" wp14:anchorId="0E3173AF" wp14:editId="1A2FB69A">
             <wp:extent cx="5715000" cy="3571875"/>
             <wp:effectExtent l="0" t="0" r="0" b="0"/>
             <wp:docPr id="11" name="25-viewer-results.png" descr="The map viewer after a completed run, with the results grid and export buttons." title="The map viewer after a completed run, with the results grid and export buttons."/>
@@ -23493,7 +23493,7 @@
         <w:pStyle w:val="Ttulo1"/>
         <w:pageBreakBefore/>
       </w:pPr>
-      <w:bookmarkStart w:id="28" w:name="_Toc241670482"/>
+      <w:bookmarkStart w:id="28" w:name="_Toc241692023"/>
       <w:r>
         <w:lastRenderedPageBreak/>
         <w:t>Runs</w:t>
@@ -23523,7 +23523,7 @@
           <w:noProof/>
         </w:rPr>
         <w:drawing>
-          <wp:inline distT="0" distB="0" distL="0" distR="0" wp14:anchorId="5F034327" wp14:editId="1B340BEF">
+          <wp:inline distT="0" distB="0" distL="0" distR="0" wp14:anchorId="337CE400" wp14:editId="5943945D">
             <wp:extent cx="5715000" cy="3571875"/>
             <wp:effectExtent l="0" t="0" r="0" b="0"/>
             <wp:docPr id="12" name="04-runs-every-user.png" descr="The Runs page with every user's runs shown." title="The Runs page with every user's runs shown."/>
@@ -24853,7 +24853,7 @@
         <w:pStyle w:val="Ttulo1"/>
         <w:pageBreakBefore/>
       </w:pPr>
-      <w:bookmarkStart w:id="29" w:name="_Toc241670483"/>
+      <w:bookmarkStart w:id="29" w:name="_Toc241692024"/>
       <w:r>
         <w:lastRenderedPageBreak/>
         <w:t>Exports</w:t>
@@ -24883,7 +24883,7 @@
           <w:noProof/>
         </w:rPr>
         <w:drawing>
-          <wp:inline distT="0" distB="0" distL="0" distR="0" wp14:anchorId="36BA7E5B" wp14:editId="2B8E3B2E">
+          <wp:inline distT="0" distB="0" distL="0" distR="0" wp14:anchorId="109F8EC0" wp14:editId="543422DB">
             <wp:extent cx="5715000" cy="3571875"/>
             <wp:effectExtent l="0" t="0" r="0" b="0"/>
             <wp:docPr id="13" name="05-exports.png" descr="The Exports page listing export jobs with their status and download buttons." title="The Exports page listing export jobs with their status and download buttons."/>
@@ -25564,7 +25564,7 @@
         <w:pStyle w:val="Ttulo1"/>
         <w:pageBreakBefore/>
       </w:pPr>
-      <w:bookmarkStart w:id="30" w:name="_Toc241670484"/>
+      <w:bookmarkStart w:id="30" w:name="_Toc241692025"/>
       <w:r>
         <w:lastRenderedPageBreak/>
         <w:t>Schedules</w:t>
@@ -25597,7 +25597,7 @@
           <w:noProof/>
         </w:rPr>
         <w:drawing>
-          <wp:inline distT="0" distB="0" distL="0" distR="0" wp14:anchorId="0A81308D" wp14:editId="193046B9">
+          <wp:inline distT="0" distB="0" distL="0" distR="0" wp14:anchorId="6F2A13DB" wp14:editId="3C48B2C4">
             <wp:extent cx="5715000" cy="3571875"/>
             <wp:effectExtent l="0" t="0" r="0" b="0"/>
             <wp:docPr id="14" name="38-schedules-list.png" descr="The Schedules page with a paused schedule and its action icons." title="The Schedules page with a paused schedule and its action icons."/>
@@ -26304,7 +26304,7 @@
       <w:pPr>
         <w:pStyle w:val="Ttulo2"/>
       </w:pPr>
-      <w:bookmarkStart w:id="31" w:name="_Toc241670485"/>
+      <w:bookmarkStart w:id="31" w:name="_Toc241692026"/>
       <w:r>
         <w:lastRenderedPageBreak/>
         <w:t>New Schedule and Edit Schedule</w:t>
@@ -27740,7 +27740,7 @@
         </w:rPr>
         <w:lastRenderedPageBreak/>
         <w:drawing>
-          <wp:inline distT="0" distB="0" distL="0" distR="0" wp14:anchorId="6C15F534" wp14:editId="216CCF78">
+          <wp:inline distT="0" distB="0" distL="0" distR="0" wp14:anchorId="4BFEECEF" wp14:editId="0DD45D9A">
             <wp:extent cx="3743325" cy="4676775"/>
             <wp:effectExtent l="0" t="0" r="0" b="0"/>
             <wp:docPr id="15" name="34-schedule-custom-cron.png" descr="The New Schedule dialog with a custom frequency and the cron expression field." title="The New Schedule dialog with a custom frequency and the cron expression field."/>
@@ -27792,7 +27792,7 @@
       <w:pPr>
         <w:pStyle w:val="Ttulo2"/>
       </w:pPr>
-      <w:bookmarkStart w:id="32" w:name="_Toc241670486"/>
+      <w:bookmarkStart w:id="32" w:name="_Toc241692027"/>
       <w:r>
         <w:t>Execution History</w:t>
       </w:r>
@@ -28241,7 +28241,7 @@
       <w:pPr>
         <w:pStyle w:val="Ttulo2"/>
       </w:pPr>
-      <w:bookmarkStart w:id="33" w:name="_Toc241670487"/>
+      <w:bookmarkStart w:id="33" w:name="_Toc241692028"/>
       <w:r>
         <w:t>Example: a weekly result</w:t>
       </w:r>
@@ -28447,7 +28447,7 @@
         <w:pStyle w:val="Ttulo1"/>
         <w:pageBreakBefore/>
       </w:pPr>
-      <w:bookmarkStart w:id="34" w:name="_Toc241670488"/>
+      <w:bookmarkStart w:id="34" w:name="_Toc241692029"/>
       <w:r>
         <w:lastRenderedPageBreak/>
         <w:t>Business Areas</w:t>
@@ -28480,7 +28480,7 @@
           <w:noProof/>
         </w:rPr>
         <w:drawing>
-          <wp:inline distT="0" distB="0" distL="0" distR="0" wp14:anchorId="665FE092" wp14:editId="073720CD">
+          <wp:inline distT="0" distB="0" distL="0" distR="0" wp14:anchorId="27178914" wp14:editId="4CF29D94">
             <wp:extent cx="5715000" cy="3571875"/>
             <wp:effectExtent l="0" t="0" r="0" b="0"/>
             <wp:docPr id="16" name="06-business-areas.png" descr="The Business Areas page listing areas, with the New Business Area button and row icons." title="The Business Areas page listing areas, with the New Business Area button and row icons."/>
@@ -28994,7 +28994,7 @@
         </w:rPr>
         <w:lastRenderedPageBreak/>
         <w:drawing>
-          <wp:inline distT="0" distB="0" distL="0" distR="0" wp14:anchorId="68F21131" wp14:editId="298A71E6">
+          <wp:inline distT="0" distB="0" distL="0" distR="0" wp14:anchorId="12942464" wp14:editId="5844B9D6">
             <wp:extent cx="3324225" cy="2047875"/>
             <wp:effectExtent l="0" t="0" r="0" b="0"/>
             <wp:docPr id="17" name="07-business-areas-new.png" descr="The New Business Area dialog with Name and Description fields." title="The New Business Area dialog with Name and Description fields."/>
@@ -29046,7 +29046,7 @@
       <w:pPr>
         <w:pStyle w:val="Ttulo2"/>
       </w:pPr>
-      <w:bookmarkStart w:id="35" w:name="_Toc241670489"/>
+      <w:bookmarkStart w:id="35" w:name="_Toc241692030"/>
       <w:r>
         <w:t>Create a business area</w:t>
       </w:r>
@@ -29150,7 +29150,7 @@
       <w:pPr>
         <w:pStyle w:val="Ttulo2"/>
       </w:pPr>
-      <w:bookmarkStart w:id="36" w:name="_Toc241670490"/>
+      <w:bookmarkStart w:id="36" w:name="_Toc241692031"/>
       <w:r>
         <w:t>Grants</w:t>
       </w:r>
@@ -29182,7 +29182,7 @@
           <w:noProof/>
         </w:rPr>
         <w:drawing>
-          <wp:inline distT="0" distB="0" distL="0" distR="0" wp14:anchorId="3F404A03" wp14:editId="20643D8B">
+          <wp:inline distT="0" distB="0" distL="0" distR="0" wp14:anchorId="5F9A38B5" wp14:editId="3A7E5C29">
             <wp:extent cx="5715000" cy="3571875"/>
             <wp:effectExtent l="0" t="0" r="0" b="0"/>
             <wp:docPr id="18" name="09-business-areas-grants-permission.png" descr="The Manage grants dialog with the Permission list open." title="The Manage grants dialog with the Permission list open."/>
@@ -30287,6 +30287,26 @@
       </w:r>
     </w:p>
     <w:p>
+      <w:pPr>
+        <w:pBdr>
+          <w:left w:val="single" w:sz="24" w:space="8" w:color="2E6DA4"/>
+        </w:pBdr>
+        <w:shd w:val="clear" w:color="auto" w:fill="E8F0F8"/>
+        <w:spacing w:before="120" w:after="160"/>
+        <w:ind w:left="200" w:right="200"/>
+      </w:pPr>
+      <w:r>
+        <w:rPr>
+          <w:b/>
+          <w:bCs/>
+        </w:rPr>
+        <w:t>Note:</w:t>
+      </w:r>
+      <w:r>
+        <w:t xml:space="preserve"> A Manager never changes folders, items, joins, hierarchies or the area, whatever grant they hold. For a Manager, CREATE, EDIT and DELETE only let them create maps.</w:t>
+      </w:r>
+    </w:p>
+    <w:p>
       <w:r>
         <w:t xml:space="preserve">Example: give a colleague the right to build maps in the business area </w:t>
       </w:r>
@@ -30400,6 +30420,7 @@
     </w:p>
     <w:p>
       <w:r>
+        <w:lastRenderedPageBreak/>
         <w:t xml:space="preserve">To give several people the same level, tick them all before you click </w:t>
       </w:r>
       <w:r>
@@ -30418,7 +30439,7 @@
         <w:pStyle w:val="Ttulo1"/>
         <w:pageBreakBefore/>
       </w:pPr>
-      <w:bookmarkStart w:id="37" w:name="_Toc241670491"/>
+      <w:bookmarkStart w:id="37" w:name="_Toc241692032"/>
       <w:r>
         <w:lastRenderedPageBreak/>
         <w:t>Folders</w:t>
@@ -30481,7 +30502,7 @@
           <w:noProof/>
         </w:rPr>
         <w:drawing>
-          <wp:inline distT="0" distB="0" distL="0" distR="0" wp14:anchorId="4099B8EA" wp14:editId="6457C46B">
+          <wp:inline distT="0" distB="0" distL="0" distR="0" wp14:anchorId="1CA253A8" wp14:editId="1A7027CE">
             <wp:extent cx="5715000" cy="3571875"/>
             <wp:effectExtent l="0" t="0" r="0" b="0"/>
             <wp:docPr id="19" name="11-folders.png" descr="The Folders page with a business area chosen, showing the folder table and row icons." title="The Folders page with a business area chosen, showing the folder table and row icons."/>
@@ -31260,7 +31281,7 @@
       <w:pPr>
         <w:pStyle w:val="Ttulo2"/>
       </w:pPr>
-      <w:bookmarkStart w:id="38" w:name="_Toc241670492"/>
+      <w:bookmarkStart w:id="38" w:name="_Toc241692033"/>
       <w:r>
         <w:t>The folder wizard</w:t>
       </w:r>
@@ -32689,7 +32710,7 @@
         </w:rPr>
         <w:lastRenderedPageBreak/>
         <w:drawing>
-          <wp:inline distT="0" distB="0" distL="0" distR="0" wp14:anchorId="16172DCA" wp14:editId="12446DF6">
+          <wp:inline distT="0" distB="0" distL="0" distR="0" wp14:anchorId="5BB3C028" wp14:editId="19DFB2D3">
             <wp:extent cx="2238375" cy="5905500"/>
             <wp:effectExtent l="0" t="0" r="0" b="0"/>
             <wp:docPr id="20" name="15-folders-picked.png" descr="The New Folder dialog with a table picked and the Items to create checklist." title="The New Folder dialog with a table picked and the Items to create checklist."/>
@@ -32876,7 +32897,7 @@
       <w:pPr>
         <w:pStyle w:val="Ttulo2"/>
       </w:pPr>
-      <w:bookmarkStart w:id="39" w:name="_Toc241670493"/>
+      <w:bookmarkStart w:id="39" w:name="_Toc241692034"/>
       <w:r>
         <w:t>Share a folder into another business area</w:t>
       </w:r>
@@ -32986,7 +33007,7 @@
           <w:noProof/>
         </w:rPr>
         <w:drawing>
-          <wp:inline distT="0" distB="0" distL="0" distR="0" wp14:anchorId="663B2618" wp14:editId="06315B9C">
+          <wp:inline distT="0" distB="0" distL="0" distR="0" wp14:anchorId="35DBF888" wp14:editId="52DA55DE">
             <wp:extent cx="3324225" cy="1638300"/>
             <wp:effectExtent l="0" t="0" r="0" b="0"/>
             <wp:docPr id="21" name="16-folders-sharing.png" descr="The folder sharing dialog with the owner badge and the Share into list." title="The folder sharing dialog with the owner badge and the Share into list."/>
@@ -33039,7 +33060,7 @@
         <w:pStyle w:val="Ttulo1"/>
         <w:pageBreakBefore/>
       </w:pPr>
-      <w:bookmarkStart w:id="40" w:name="_Toc241670494"/>
+      <w:bookmarkStart w:id="40" w:name="_Toc241692035"/>
       <w:r>
         <w:lastRenderedPageBreak/>
         <w:t>Items</w:t>
@@ -33092,7 +33113,7 @@
           <w:noProof/>
         </w:rPr>
         <w:drawing>
-          <wp:inline distT="0" distB="0" distL="0" distR="0" wp14:anchorId="2E9430F0" wp14:editId="062622AF">
+          <wp:inline distT="0" distB="0" distL="0" distR="0" wp14:anchorId="1D1D0509" wp14:editId="7D56E682">
             <wp:extent cx="5715000" cy="3571875"/>
             <wp:effectExtent l="0" t="0" r="0" b="0"/>
             <wp:docPr id="22" name="17-items.png" descr="The Items page for a chosen folder, with Type, Column, Data Type and Aggregation columns." title="The Items page for a chosen folder, with Type, Column, Data Type and Aggregation columns."/>
@@ -35031,7 +35052,7 @@
         </w:rPr>
         <w:lastRenderedPageBreak/>
         <w:drawing>
-          <wp:inline distT="0" distB="0" distL="0" distR="0" wp14:anchorId="000D4F99" wp14:editId="19B340A7">
+          <wp:inline distT="0" distB="0" distL="0" distR="0" wp14:anchorId="09D60AEE" wp14:editId="736E101E">
             <wp:extent cx="5715000" cy="3571875"/>
             <wp:effectExtent l="0" t="0" r="0" b="0"/>
             <wp:docPr id="23" name="19-items-type-open.png" descr="The New Item dialog with the Item Type list open showing the item types." title="The New Item dialog with the Item Type list open showing the item types."/>
@@ -35084,7 +35105,7 @@
         <w:pStyle w:val="Ttulo1"/>
         <w:pageBreakBefore/>
       </w:pPr>
-      <w:bookmarkStart w:id="41" w:name="_Toc241670495"/>
+      <w:bookmarkStart w:id="41" w:name="_Toc241692036"/>
       <w:r>
         <w:lastRenderedPageBreak/>
         <w:t>Joins</w:t>
@@ -35117,7 +35138,7 @@
           <w:noProof/>
         </w:rPr>
         <w:drawing>
-          <wp:inline distT="0" distB="0" distL="0" distR="0" wp14:anchorId="0CC4169F" wp14:editId="59A48BA0">
+          <wp:inline distT="0" distB="0" distL="0" distR="0" wp14:anchorId="606D4FEC" wp14:editId="5CA008D8">
             <wp:extent cx="5715000" cy="3571875"/>
             <wp:effectExtent l="0" t="0" r="0" b="0"/>
             <wp:docPr id="24" name="20-joins.png" descr="The Joins page, including joins made of several column pairs." title="The Joins page, including joins made of several column pairs."/>
@@ -36772,7 +36793,7 @@
           <w:noProof/>
         </w:rPr>
         <w:drawing>
-          <wp:inline distT="0" distB="0" distL="0" distR="0" wp14:anchorId="188D53CF" wp14:editId="00D4F5EF">
+          <wp:inline distT="0" distB="0" distL="0" distR="0" wp14:anchorId="028026D5" wp14:editId="095E5D20">
             <wp:extent cx="5715000" cy="3571875"/>
             <wp:effectExtent l="0" t="0" r="0" b="0"/>
             <wp:docPr id="25" name="23-joins-select-open.png" descr="The New Join dialog with a select list open." title="The New Join dialog with a select list open."/>
@@ -36943,7 +36964,7 @@
         <w:pStyle w:val="Ttulo1"/>
         <w:pageBreakBefore/>
       </w:pPr>
-      <w:bookmarkStart w:id="42" w:name="_Toc241670496"/>
+      <w:bookmarkStart w:id="42" w:name="_Toc241692037"/>
       <w:r>
         <w:lastRenderedPageBreak/>
         <w:t>Hierarchies</w:t>
@@ -36976,7 +36997,7 @@
           <w:noProof/>
         </w:rPr>
         <w:drawing>
-          <wp:inline distT="0" distB="0" distL="0" distR="0" wp14:anchorId="04EB7B1D" wp14:editId="58DEBE3C">
+          <wp:inline distT="0" distB="0" distL="0" distR="0" wp14:anchorId="04273A65" wp14:editId="6FF7EDC6">
             <wp:extent cx="5715000" cy="3571875"/>
             <wp:effectExtent l="0" t="0" r="0" b="0"/>
             <wp:docPr id="26" name="24-hierarchies.png" descr="The Hierarchies page with the table showing the number of levels." title="The Hierarchies page with the table showing the number of levels."/>
@@ -38036,7 +38057,7 @@
           <w:noProof/>
         </w:rPr>
         <w:drawing>
-          <wp:inline distT="0" distB="0" distL="0" distR="0" wp14:anchorId="7434D9B2" wp14:editId="2A9070B6">
+          <wp:inline distT="0" distB="0" distL="0" distR="0" wp14:anchorId="1569C59D" wp14:editId="15CECE36">
             <wp:extent cx="4362450" cy="2762250"/>
             <wp:effectExtent l="0" t="0" r="0" b="0"/>
             <wp:docPr id="27" name="26-hierarchies-level-added.png" descr="The New Hierarchy dialog after adding a level, with folder and item selects." title="The New Hierarchy dialog after adding a level, with folder and item selects."/>
@@ -38089,7 +38110,7 @@
         <w:pStyle w:val="Ttulo1"/>
         <w:pageBreakBefore/>
       </w:pPr>
-      <w:bookmarkStart w:id="43" w:name="_Toc241670497"/>
+      <w:bookmarkStart w:id="43" w:name="_Toc241692038"/>
       <w:r>
         <w:lastRenderedPageBreak/>
         <w:t>Custom Functions</w:t>
@@ -38122,7 +38143,7 @@
           <w:noProof/>
         </w:rPr>
         <w:drawing>
-          <wp:inline distT="0" distB="0" distL="0" distR="0" wp14:anchorId="0240B117" wp14:editId="06D670F6">
+          <wp:inline distT="0" distB="0" distL="0" distR="0" wp14:anchorId="39C9AD9B" wp14:editId="0915F1CC">
             <wp:extent cx="5715000" cy="3571875"/>
             <wp:effectExtent l="0" t="0" r="0" b="0"/>
             <wp:docPr id="28" name="27-custom-functions.png" descr="The Custom Functions page with filter box, Refresh all, New Function and the function table." title="The Custom Functions page with filter box, Refresh all, New Function and the function table."/>
@@ -38842,7 +38863,7 @@
       <w:pPr>
         <w:pStyle w:val="Ttulo2"/>
       </w:pPr>
-      <w:bookmarkStart w:id="44" w:name="_Toc241670498"/>
+      <w:bookmarkStart w:id="44" w:name="_Toc241692039"/>
       <w:r>
         <w:lastRenderedPageBreak/>
         <w:t>The function form</w:t>
@@ -39813,7 +39834,7 @@
         </w:rPr>
         <w:lastRenderedPageBreak/>
         <w:drawing>
-          <wp:inline distT="0" distB="0" distL="0" distR="0" wp14:anchorId="6BB84A49" wp14:editId="1806B6D8">
+          <wp:inline distT="0" distB="0" distL="0" distR="0" wp14:anchorId="29E9D476" wp14:editId="0A8872EF">
             <wp:extent cx="4076700" cy="5905500"/>
             <wp:effectExtent l="0" t="0" r="0" b="0"/>
             <wp:docPr id="29" name="29-custom-functions-search-results.png" descr="The New Custom Function dialog listing database functions that match the search." title="The New Custom Function dialog listing database functions that match the search."/>
@@ -39866,7 +39887,7 @@
         <w:pStyle w:val="Ttulo1"/>
         <w:pageBreakBefore/>
       </w:pPr>
-      <w:bookmarkStart w:id="45" w:name="_Toc241670499"/>
+      <w:bookmarkStart w:id="45" w:name="_Toc241692040"/>
       <w:r>
         <w:lastRenderedPageBreak/>
         <w:t>Data Sources</w:t>
@@ -39899,7 +39920,7 @@
           <w:noProof/>
         </w:rPr>
         <w:drawing>
-          <wp:inline distT="0" distB="0" distL="0" distR="0" wp14:anchorId="54A1290D" wp14:editId="45B0B47C">
+          <wp:inline distT="0" distB="0" distL="0" distR="0" wp14:anchorId="2FADF9EA" wp14:editId="40595D99">
             <wp:extent cx="5715000" cy="3571875"/>
             <wp:effectExtent l="0" t="0" r="0" b="0"/>
             <wp:docPr id="30" name="30-data-sources.png" descr="The Data Sources page with a table of connections and five row icons." title="The Data Sources page with a table of connections and five row icons."/>
@@ -41279,7 +41300,7 @@
       <w:pPr>
         <w:pStyle w:val="Ttulo2"/>
       </w:pPr>
-      <w:bookmarkStart w:id="46" w:name="_Toc241670500"/>
+      <w:bookmarkStart w:id="46" w:name="_Toc241692041"/>
       <w:r>
         <w:t>Import tables</w:t>
       </w:r>
@@ -41441,7 +41462,7 @@
           <w:noProof/>
         </w:rPr>
         <w:drawing>
-          <wp:inline distT="0" distB="0" distL="0" distR="0" wp14:anchorId="2708CDF1" wp14:editId="17D168AD">
+          <wp:inline distT="0" distB="0" distL="0" distR="0" wp14:anchorId="3F689D62" wp14:editId="2B6A9A89">
             <wp:extent cx="3324225" cy="2286000"/>
             <wp:effectExtent l="0" t="0" r="0" b="0"/>
             <wp:docPr id="31" name="34-data-sources-import-dialog.png" descr="The Import Tables dialog with the Discover Tables button, before any table is found." title="The Import Tables dialog with the Discover Tables button, before any table is found."/>
@@ -41494,7 +41515,7 @@
         <w:pStyle w:val="Ttulo1"/>
         <w:pageBreakBefore/>
       </w:pPr>
-      <w:bookmarkStart w:id="47" w:name="_Toc241670501"/>
+      <w:bookmarkStart w:id="47" w:name="_Toc241692042"/>
       <w:r>
         <w:lastRenderedPageBreak/>
         <w:t>Users</w:t>
@@ -41524,7 +41545,7 @@
           <w:noProof/>
         </w:rPr>
         <w:drawing>
-          <wp:inline distT="0" distB="0" distL="0" distR="0" wp14:anchorId="57A96B52" wp14:editId="198704A7">
+          <wp:inline distT="0" distB="0" distL="0" distR="0" wp14:anchorId="33B73CC2" wp14:editId="17A2A0CA">
             <wp:extent cx="5715000" cy="3571875"/>
             <wp:effectExtent l="0" t="0" r="0" b="0"/>
             <wp:docPr id="32" name="35-users.png" descr="The Users page with the Credentials file and New User buttons and row icons." title="The Users page with the Credentials file and New User buttons and row icons."/>
@@ -42223,7 +42244,7 @@
       <w:pPr>
         <w:pStyle w:val="Ttulo2"/>
       </w:pPr>
-      <w:bookmarkStart w:id="48" w:name="_Toc241670502"/>
+      <w:bookmarkStart w:id="48" w:name="_Toc241692043"/>
       <w:r>
         <w:lastRenderedPageBreak/>
         <w:t>Create or change a user</w:t>
@@ -42819,7 +42840,7 @@
               <w:t>Can edit</w:t>
             </w:r>
             <w:r>
-              <w:t xml:space="preserve">. Works on business areas, folders, items, joins and hierarchies only where they hold a grant. Cannot use </w:t>
+              <w:t xml:space="preserve">. Cannot change business areas, folders, items, joins or hierarchies, whatever grant they hold. Cannot use </w:t>
             </w:r>
             <w:r>
               <w:rPr>
@@ -43041,7 +43062,7 @@
         </w:rPr>
         <w:lastRenderedPageBreak/>
         <w:drawing>
-          <wp:inline distT="0" distB="0" distL="0" distR="0" wp14:anchorId="6BCA48AA" wp14:editId="4A52A555">
+          <wp:inline distT="0" distB="0" distL="0" distR="0" wp14:anchorId="54FF35B4" wp14:editId="5DBC2FCD">
             <wp:extent cx="5715000" cy="3571875"/>
             <wp:effectExtent l="0" t="0" r="0" b="0"/>
             <wp:docPr id="33" name="37-users-role-open.png" descr="The New User dialog with the Role list open and each role described." title="The New User dialog with the Role list open and each role described."/>
@@ -43093,7 +43114,7 @@
       <w:pPr>
         <w:pStyle w:val="Ttulo2"/>
       </w:pPr>
-      <w:bookmarkStart w:id="49" w:name="_Toc241670503"/>
+      <w:bookmarkStart w:id="49" w:name="_Toc241692044"/>
       <w:r>
         <w:t>Deactivate, activate or delete</w:t>
       </w:r>
@@ -43185,7 +43206,7 @@
           <w:noProof/>
         </w:rPr>
         <w:drawing>
-          <wp:inline distT="0" distB="0" distL="0" distR="0" wp14:anchorId="5F9D8638" wp14:editId="3932F21A">
+          <wp:inline distT="0" distB="0" distL="0" distR="0" wp14:anchorId="1782BD84" wp14:editId="0DAD35F7">
             <wp:extent cx="3324225" cy="1076325"/>
             <wp:effectExtent l="0" t="0" r="0" b="0"/>
             <wp:docPr id="34" name="39-users-deactivate-dialog.png" descr="The confirmation dialog shown before deactivating a user." title="The confirmation dialog shown before deactivating a user."/>
@@ -43277,7 +43298,7 @@
       <w:pPr>
         <w:pStyle w:val="Ttulo2"/>
       </w:pPr>
-      <w:bookmarkStart w:id="50" w:name="_Toc241670504"/>
+      <w:bookmarkStart w:id="50" w:name="_Toc241692045"/>
       <w:r>
         <w:t>The credentials file</w:t>
       </w:r>
@@ -43302,7 +43323,7 @@
       <w:pPr>
         <w:pStyle w:val="Ttulo2"/>
       </w:pPr>
-      <w:bookmarkStart w:id="51" w:name="_Toc241670505"/>
+      <w:bookmarkStart w:id="51" w:name="_Toc241692046"/>
       <w:r>
         <w:lastRenderedPageBreak/>
         <w:t>Maps this user can open</w:t>
@@ -43345,7 +43366,7 @@
           <w:noProof/>
         </w:rPr>
         <w:drawing>
-          <wp:inline distT="0" distB="0" distL="0" distR="0" wp14:anchorId="727EAE87" wp14:editId="00FA5E25">
+          <wp:inline distT="0" distB="0" distL="0" distR="0" wp14:anchorId="48FC035F" wp14:editId="071A27A9">
             <wp:extent cx="4362450" cy="2190750"/>
             <wp:effectExtent l="0" t="0" r="0" b="0"/>
             <wp:docPr id="35" name="41-users-maps-dialog.png" descr="The Maps dialog for a user, with source badges and share-level selects." title="The Maps dialog for a user, with source badges and share-level selects."/>
@@ -44287,7 +44308,7 @@
         <w:pStyle w:val="Ttulo1"/>
         <w:pageBreakBefore/>
       </w:pPr>
-      <w:bookmarkStart w:id="52" w:name="_Toc241670506"/>
+      <w:bookmarkStart w:id="52" w:name="_Toc241692047"/>
       <w:r>
         <w:lastRenderedPageBreak/>
         <w:t>Security Policies</w:t>
@@ -44347,7 +44368,7 @@
           <w:noProof/>
         </w:rPr>
         <w:drawing>
-          <wp:inline distT="0" distB="0" distL="0" distR="0" wp14:anchorId="1FFA508A" wp14:editId="60F08038">
+          <wp:inline distT="0" distB="0" distL="0" distR="0" wp14:anchorId="11703133" wp14:editId="181C2ADA">
             <wp:extent cx="5715000" cy="3571875"/>
             <wp:effectExtent l="0" t="0" r="0" b="0"/>
             <wp:docPr id="36" name="43-security.png" descr="The Security Policies page with the Test and New Policy buttons." title="The Security Policies page with the Test and New Policy buttons."/>
@@ -44974,7 +44995,7 @@
       <w:pPr>
         <w:pStyle w:val="Ttulo2"/>
       </w:pPr>
-      <w:bookmarkStart w:id="53" w:name="_Toc241670507"/>
+      <w:bookmarkStart w:id="53" w:name="_Toc241692048"/>
       <w:r>
         <w:lastRenderedPageBreak/>
         <w:t>Write a policy</w:t>
@@ -46030,7 +46051,7 @@
         </w:rPr>
         <w:lastRenderedPageBreak/>
         <w:drawing>
-          <wp:inline distT="0" distB="0" distL="0" distR="0" wp14:anchorId="0573D1A1" wp14:editId="473DD139">
+          <wp:inline distT="0" distB="0" distL="0" distR="0" wp14:anchorId="0BA49EF4" wp14:editId="45729B21">
             <wp:extent cx="3324225" cy="4638675"/>
             <wp:effectExtent l="0" t="0" r="0" b="0"/>
             <wp:docPr id="37" name="46-security-validate.png" descr="The New Policy dialog after pressing Validate on a predicate." title="The New Policy dialog after pressing Validate on a predicate."/>
@@ -46082,7 +46103,7 @@
       <w:pPr>
         <w:pStyle w:val="Ttulo2"/>
       </w:pPr>
-      <w:bookmarkStart w:id="54" w:name="_Toc241670508"/>
+      <w:bookmarkStart w:id="54" w:name="_Toc241692049"/>
       <w:r>
         <w:t>Assign a policy</w:t>
       </w:r>
@@ -46472,7 +46493,7 @@
       <w:pPr>
         <w:pStyle w:val="Ttulo2"/>
       </w:pPr>
-      <w:bookmarkStart w:id="55" w:name="_Toc241670509"/>
+      <w:bookmarkStart w:id="55" w:name="_Toc241692050"/>
       <w:r>
         <w:lastRenderedPageBreak/>
         <w:t>Test a policy</w:t>
@@ -46547,7 +46568,7 @@
         <w:pStyle w:val="Ttulo1"/>
         <w:pageBreakBefore/>
       </w:pPr>
-      <w:bookmarkStart w:id="56" w:name="_Toc241670510"/>
+      <w:bookmarkStart w:id="56" w:name="_Toc241692051"/>
       <w:r>
         <w:lastRenderedPageBreak/>
         <w:t>Audit Log</w:t>
@@ -46580,7 +46601,7 @@
           <w:noProof/>
         </w:rPr>
         <w:drawing>
-          <wp:inline distT="0" distB="0" distL="0" distR="0" wp14:anchorId="29905957" wp14:editId="21C02C15">
+          <wp:inline distT="0" distB="0" distL="0" distR="0" wp14:anchorId="58B62C6F" wp14:editId="5FD38A4B">
             <wp:extent cx="5715000" cy="3571875"/>
             <wp:effectExtent l="0" t="0" r="0" b="0"/>
             <wp:docPr id="38" name="47-audit.png" descr="The Audit Log page with export button, statistic cards, daily chart and filters." title="The Audit Log page with export button, statistic cards, daily chart and filters."/>
@@ -47441,7 +47462,7 @@
         <w:pStyle w:val="Ttulo1"/>
         <w:pageBreakBefore/>
       </w:pPr>
-      <w:bookmarkStart w:id="57" w:name="_Toc241670511"/>
+      <w:bookmarkStart w:id="57" w:name="_Toc241692052"/>
       <w:r>
         <w:lastRenderedPageBreak/>
         <w:t>Migration</w:t>
@@ -47521,7 +47542,7 @@
           <w:noProof/>
         </w:rPr>
         <w:drawing>
-          <wp:inline distT="0" distB="0" distL="0" distR="0" wp14:anchorId="6467F46C" wp14:editId="0318C86D">
+          <wp:inline distT="0" distB="0" distL="0" distR="0" wp14:anchorId="516D55A2" wp14:editId="6A7B0163">
             <wp:extent cx="5715000" cy="3571875"/>
             <wp:effectExtent l="0" t="0" r="0" b="0"/>
             <wp:docPr id="39" name="50-migration.png" descr="The Migration page with the Source card, its buttons and help text." title="The Migration page with the Source card, its buttons and help text."/>
@@ -47598,7 +47619,7 @@
       <w:pPr>
         <w:pStyle w:val="Ttulo2"/>
       </w:pPr>
-      <w:bookmarkStart w:id="58" w:name="_Toc241670512"/>
+      <w:bookmarkStart w:id="58" w:name="_Toc241692053"/>
       <w:r>
         <w:t>Choose the source</w:t>
       </w:r>
@@ -48719,7 +48740,7 @@
       <w:pPr>
         <w:pStyle w:val="Ttulo2"/>
       </w:pPr>
-      <w:bookmarkStart w:id="59" w:name="_Toc241670513"/>
+      <w:bookmarkStart w:id="59" w:name="_Toc241692054"/>
       <w:r>
         <w:t>What each action does</w:t>
       </w:r>
@@ -49120,7 +49141,7 @@
       <w:pPr>
         <w:pStyle w:val="Ttulo2"/>
       </w:pPr>
-      <w:bookmarkStart w:id="60" w:name="_Toc241670514"/>
+      <w:bookmarkStart w:id="60" w:name="_Toc241692055"/>
       <w:r>
         <w:t>Do a migration safely</w:t>
       </w:r>
@@ -49362,7 +49383,7 @@
         <w:pStyle w:val="Ttulo1"/>
         <w:pageBreakBefore/>
       </w:pPr>
-      <w:bookmarkStart w:id="61" w:name="_Toc241670515"/>
+      <w:bookmarkStart w:id="61" w:name="_Toc241692056"/>
       <w:r>
         <w:lastRenderedPageBreak/>
         <w:t>Common questions</w:t>
@@ -49653,7 +49674,7 @@
       <w:pPr>
         <w:pStyle w:val="Ttulo2"/>
       </w:pPr>
-      <w:bookmarkStart w:id="62" w:name="_Toc241670516"/>
+      <w:bookmarkStart w:id="62" w:name="_Toc241692057"/>
       <w:r>
         <w:t>Glossary</w:t>
       </w:r>
@@ -50987,10 +51008,10 @@
 <file path=word/numbering.xml><?xml version="1.0" encoding="utf-8"?>
 <w:numbering xmlns:wpc="http://schemas.microsoft.com/office/word/2010/wordprocessingCanvas" xmlns:cx="http://schemas.microsoft.com/office/drawing/2014/chartex" xmlns:cx1="http://schemas.microsoft.com/office/drawing/2015/9/8/chartex" xmlns:cx2="http://schemas.microsoft.com/office/drawing/2015/10/21/chartex" xmlns:cx3="http://schemas.microsoft.com/office/drawing/2016/5/9/chartex" xmlns:cx4="http://schemas.microsoft.com/office/drawing/2016/5/10/chartex" xmlns:cx5="http://schemas.microsoft.com/office/drawing/2016/5/11/chartex" xmlns:cx6="http://schemas.microsoft.com/office/drawing/2016/5/12/chartex" xmlns:cx7="http://schemas.microsoft.com/office/drawing/2016/5/13/chartex" xmlns:cx8="http://schemas.microsoft.com/office/drawing/2016/5/14/chartex" xmlns:mc="http://schemas.openxmlformats.org/markup-compatibility/2006" xmlns:aink="http://schemas.microsoft.com/office/drawing/2016/ink" xmlns:am3d="http://schemas.microsoft.com/office/drawing/2017/model3d" xmlns:o="urn:schemas-microsoft-com:office:office" xmlns:oel="http://schemas.microsoft.com/office/2019/extlst" xmlns:r="http://schemas.openxmlformats.org/officeDocument/2006/relationships" xmlns:m="http://schemas.openxmlformats.org/officeDocument/2006/math" xmlns:v="urn:schemas-microsoft-com:vml" xmlns:wp14="http://schemas.microsoft.com/office/word/2010/wordprocessingDrawing" xmlns:wp="http://schemas.openxmlformats.org/drawingml/2006/wordprocessingDrawing" xmlns:w10="urn:schemas-microsoft-com:office:word" xmlns:w="http://schemas.openxmlformats.org/wordprocessingml/2006/main" xmlns:w14="http://schemas.microsoft.com/office/word/2010/wordml" xmlns:w15="http://schemas.microsoft.com/office/word/2012/wordml" xmlns:w16cex="http://schemas.microsoft.com/office/word/2018/wordml/cex" xmlns:w16cid="http://schemas.microsoft.com/office/word/2016/wordml/cid" xmlns:w16="http://schemas.microsoft.com/office/word/2018/wordml" xmlns:w16sdtdh="http://schemas.microsoft.com/office/word/2020/wordml/sdtdatahash" xmlns:w16se="http://schemas.microsoft.com/office/word/2015/wordml/symex" xmlns:wpg="http://schemas.microsoft.com/office/word/2010/wordprocessingGroup" xmlns:wpi="http://schemas.microsoft.com/office/word/2010/wordprocessingInk" xmlns:wne="http://schemas.microsoft.com/office/word/2006/wordml" xmlns:wps="http://schemas.microsoft.com/office/word/2010/wordprocessingShape" mc:Ignorable="w14 w15 w16se w16cid w16 w16cex w16sdtdh wp14">
   <w:abstractNum w:abstractNumId="0" w15:restartNumberingAfterBreak="0">
-    <w:nsid w:val="088F18DB"/>
+    <w:nsid w:val="00876738"/>
     <w:multiLevelType w:val="hybridMultilevel"/>
-    <w:tmpl w:val="8FEA78CE"/>
-    <w:lvl w:ilvl="0" w:tplc="F392E72E">
+    <w:tmpl w:val="574694A6"/>
+    <w:lvl w:ilvl="0" w:tplc="31363F52">
       <w:start w:val="1"/>
       <w:numFmt w:val="decimal"/>
       <w:lvlText w:val="%1."/>
@@ -50999,7 +51020,7 @@
         <w:ind w:left="360" w:hanging="300"/>
       </w:pPr>
     </w:lvl>
-    <w:lvl w:ilvl="1" w:tplc="9062A3F8" w:tentative="1">
+    <w:lvl w:ilvl="1" w:tplc="B0065648" w:tentative="1">
       <w:start w:val="1"/>
       <w:numFmt w:val="lowerLetter"/>
       <w:lvlText w:val="%2."/>
@@ -51008,47 +51029,47 @@
         <w:ind w:left="720" w:hanging="300"/>
       </w:pPr>
     </w:lvl>
-    <w:lvl w:ilvl="2" w:tplc="C958A76E">
+    <w:lvl w:ilvl="2" w:tplc="73AE5600">
       <w:numFmt w:val="decimal"/>
       <w:lvlText w:val=""/>
       <w:lvlJc w:val="left"/>
     </w:lvl>
-    <w:lvl w:ilvl="3" w:tplc="93FE00CA">
+    <w:lvl w:ilvl="3" w:tplc="BC267FC4">
       <w:numFmt w:val="decimal"/>
       <w:lvlText w:val=""/>
       <w:lvlJc w:val="left"/>
     </w:lvl>
-    <w:lvl w:ilvl="4" w:tplc="AC723F24">
+    <w:lvl w:ilvl="4" w:tplc="F3F232AE">
       <w:numFmt w:val="decimal"/>
       <w:lvlText w:val=""/>
       <w:lvlJc w:val="left"/>
     </w:lvl>
-    <w:lvl w:ilvl="5" w:tplc="DCDA34CA">
+    <w:lvl w:ilvl="5" w:tplc="9E165CAE">
       <w:numFmt w:val="decimal"/>
       <w:lvlText w:val=""/>
       <w:lvlJc w:val="left"/>
     </w:lvl>
-    <w:lvl w:ilvl="6" w:tplc="898EAE9A">
+    <w:lvl w:ilvl="6" w:tplc="E862A570">
       <w:numFmt w:val="decimal"/>
       <w:lvlText w:val=""/>
       <w:lvlJc w:val="left"/>
     </w:lvl>
-    <w:lvl w:ilvl="7" w:tplc="DC22ACFC">
+    <w:lvl w:ilvl="7" w:tplc="566E1C26">
       <w:numFmt w:val="decimal"/>
       <w:lvlText w:val=""/>
       <w:lvlJc w:val="left"/>
     </w:lvl>
-    <w:lvl w:ilvl="8" w:tplc="C0CABE5E">
+    <w:lvl w:ilvl="8" w:tplc="39DAC3C2">
       <w:numFmt w:val="decimal"/>
       <w:lvlText w:val=""/>
       <w:lvlJc w:val="left"/>
     </w:lvl>
   </w:abstractNum>
   <w:abstractNum w:abstractNumId="1" w15:restartNumberingAfterBreak="0">
-    <w:nsid w:val="0AFA5350"/>
+    <w:nsid w:val="063A0836"/>
     <w:multiLevelType w:val="hybridMultilevel"/>
-    <w:tmpl w:val="F47CDBCA"/>
-    <w:lvl w:ilvl="0" w:tplc="76180CD4">
+    <w:tmpl w:val="84343240"/>
+    <w:lvl w:ilvl="0" w:tplc="48D4531E">
       <w:start w:val="1"/>
       <w:numFmt w:val="decimal"/>
       <w:lvlText w:val="%1."/>
@@ -51057,7 +51078,7 @@
         <w:ind w:left="360" w:hanging="300"/>
       </w:pPr>
     </w:lvl>
-    <w:lvl w:ilvl="1" w:tplc="97DA1488" w:tentative="1">
+    <w:lvl w:ilvl="1" w:tplc="0C2C34BE" w:tentative="1">
       <w:start w:val="1"/>
       <w:numFmt w:val="lowerLetter"/>
       <w:lvlText w:val="%2."/>
@@ -51066,47 +51087,47 @@
         <w:ind w:left="720" w:hanging="300"/>
       </w:pPr>
     </w:lvl>
-    <w:lvl w:ilvl="2" w:tplc="FAA29D50">
+    <w:lvl w:ilvl="2" w:tplc="EA44CA38">
       <w:numFmt w:val="decimal"/>
       <w:lvlText w:val=""/>
       <w:lvlJc w:val="left"/>
     </w:lvl>
-    <w:lvl w:ilvl="3" w:tplc="B7A6F922">
+    <w:lvl w:ilvl="3" w:tplc="7C88EA30">
       <w:numFmt w:val="decimal"/>
       <w:lvlText w:val=""/>
       <w:lvlJc w:val="left"/>
     </w:lvl>
-    <w:lvl w:ilvl="4" w:tplc="58DA0658">
+    <w:lvl w:ilvl="4" w:tplc="F5E4D510">
       <w:numFmt w:val="decimal"/>
       <w:lvlText w:val=""/>
       <w:lvlJc w:val="left"/>
     </w:lvl>
-    <w:lvl w:ilvl="5" w:tplc="D8720F22">
+    <w:lvl w:ilvl="5" w:tplc="847C2472">
       <w:numFmt w:val="decimal"/>
       <w:lvlText w:val=""/>
       <w:lvlJc w:val="left"/>
     </w:lvl>
-    <w:lvl w:ilvl="6" w:tplc="F1749590">
+    <w:lvl w:ilvl="6" w:tplc="7D3CC82A">
       <w:numFmt w:val="decimal"/>
       <w:lvlText w:val=""/>
       <w:lvlJc w:val="left"/>
     </w:lvl>
-    <w:lvl w:ilvl="7" w:tplc="63ECCF54">
+    <w:lvl w:ilvl="7" w:tplc="727ED0EE">
       <w:numFmt w:val="decimal"/>
       <w:lvlText w:val=""/>
       <w:lvlJc w:val="left"/>
     </w:lvl>
-    <w:lvl w:ilvl="8" w:tplc="539041D8">
+    <w:lvl w:ilvl="8" w:tplc="E6E0A0A2">
       <w:numFmt w:val="decimal"/>
       <w:lvlText w:val=""/>
       <w:lvlJc w:val="left"/>
     </w:lvl>
   </w:abstractNum>
   <w:abstractNum w:abstractNumId="2" w15:restartNumberingAfterBreak="0">
-    <w:nsid w:val="0E492FA5"/>
+    <w:nsid w:val="129E65F9"/>
     <w:multiLevelType w:val="hybridMultilevel"/>
-    <w:tmpl w:val="06F2D736"/>
-    <w:lvl w:ilvl="0" w:tplc="F2BA7452">
+    <w:tmpl w:val="7E34F960"/>
+    <w:lvl w:ilvl="0" w:tplc="72D86060">
       <w:start w:val="1"/>
       <w:numFmt w:val="decimal"/>
       <w:lvlText w:val="%1."/>
@@ -51115,7 +51136,7 @@
         <w:ind w:left="360" w:hanging="300"/>
       </w:pPr>
     </w:lvl>
-    <w:lvl w:ilvl="1" w:tplc="D640E31E" w:tentative="1">
+    <w:lvl w:ilvl="1" w:tplc="CC64C192" w:tentative="1">
       <w:start w:val="1"/>
       <w:numFmt w:val="lowerLetter"/>
       <w:lvlText w:val="%2."/>
@@ -51124,47 +51145,47 @@
         <w:ind w:left="720" w:hanging="300"/>
       </w:pPr>
     </w:lvl>
-    <w:lvl w:ilvl="2" w:tplc="BBA8AC4C">
+    <w:lvl w:ilvl="2" w:tplc="B63815DC">
       <w:numFmt w:val="decimal"/>
       <w:lvlText w:val=""/>
       <w:lvlJc w:val="left"/>
     </w:lvl>
-    <w:lvl w:ilvl="3" w:tplc="8778A3A2">
+    <w:lvl w:ilvl="3" w:tplc="FA5097EA">
       <w:numFmt w:val="decimal"/>
       <w:lvlText w:val=""/>
       <w:lvlJc w:val="left"/>
     </w:lvl>
-    <w:lvl w:ilvl="4" w:tplc="E9FC0C96">
+    <w:lvl w:ilvl="4" w:tplc="7DE672E2">
       <w:numFmt w:val="decimal"/>
       <w:lvlText w:val=""/>
       <w:lvlJc w:val="left"/>
     </w:lvl>
-    <w:lvl w:ilvl="5" w:tplc="3556A654">
+    <w:lvl w:ilvl="5" w:tplc="D0388BBA">
       <w:numFmt w:val="decimal"/>
       <w:lvlText w:val=""/>
       <w:lvlJc w:val="left"/>
     </w:lvl>
-    <w:lvl w:ilvl="6" w:tplc="5AE69A0E">
+    <w:lvl w:ilvl="6" w:tplc="DBAC0242">
       <w:numFmt w:val="decimal"/>
       <w:lvlText w:val=""/>
       <w:lvlJc w:val="left"/>
     </w:lvl>
-    <w:lvl w:ilvl="7" w:tplc="B8D444C4">
+    <w:lvl w:ilvl="7" w:tplc="151E8850">
       <w:numFmt w:val="decimal"/>
       <w:lvlText w:val=""/>
       <w:lvlJc w:val="left"/>
     </w:lvl>
-    <w:lvl w:ilvl="8" w:tplc="7C3EB5E6">
+    <w:lvl w:ilvl="8" w:tplc="ED3E0EBC">
       <w:numFmt w:val="decimal"/>
       <w:lvlText w:val=""/>
       <w:lvlJc w:val="left"/>
     </w:lvl>
   </w:abstractNum>
   <w:abstractNum w:abstractNumId="3" w15:restartNumberingAfterBreak="0">
-    <w:nsid w:val="197C538F"/>
+    <w:nsid w:val="16415FB6"/>
     <w:multiLevelType w:val="hybridMultilevel"/>
-    <w:tmpl w:val="B748F90A"/>
-    <w:lvl w:ilvl="0" w:tplc="AE301114">
+    <w:tmpl w:val="1D4A1CB0"/>
+    <w:lvl w:ilvl="0" w:tplc="D8FE1B7E">
       <w:start w:val="1"/>
       <w:numFmt w:val="decimal"/>
       <w:lvlText w:val="%1."/>
@@ -51173,7 +51194,7 @@
         <w:ind w:left="360" w:hanging="300"/>
       </w:pPr>
     </w:lvl>
-    <w:lvl w:ilvl="1" w:tplc="A8B24D6C" w:tentative="1">
+    <w:lvl w:ilvl="1" w:tplc="36F4A206" w:tentative="1">
       <w:start w:val="1"/>
       <w:numFmt w:val="lowerLetter"/>
       <w:lvlText w:val="%2."/>
@@ -51182,47 +51203,47 @@
         <w:ind w:left="720" w:hanging="300"/>
       </w:pPr>
     </w:lvl>
-    <w:lvl w:ilvl="2" w:tplc="8D06C408">
+    <w:lvl w:ilvl="2" w:tplc="324AD18E">
       <w:numFmt w:val="decimal"/>
       <w:lvlText w:val=""/>
       <w:lvlJc w:val="left"/>
     </w:lvl>
-    <w:lvl w:ilvl="3" w:tplc="E5C2011C">
+    <w:lvl w:ilvl="3" w:tplc="B3FAF714">
       <w:numFmt w:val="decimal"/>
       <w:lvlText w:val=""/>
       <w:lvlJc w:val="left"/>
     </w:lvl>
-    <w:lvl w:ilvl="4" w:tplc="D632B882">
+    <w:lvl w:ilvl="4" w:tplc="40288AAA">
       <w:numFmt w:val="decimal"/>
       <w:lvlText w:val=""/>
       <w:lvlJc w:val="left"/>
     </w:lvl>
-    <w:lvl w:ilvl="5" w:tplc="EB467E5E">
+    <w:lvl w:ilvl="5" w:tplc="0D7E07B2">
       <w:numFmt w:val="decimal"/>
       <w:lvlText w:val=""/>
       <w:lvlJc w:val="left"/>
     </w:lvl>
-    <w:lvl w:ilvl="6" w:tplc="42DE99A2">
+    <w:lvl w:ilvl="6" w:tplc="7F963F36">
       <w:numFmt w:val="decimal"/>
       <w:lvlText w:val=""/>
       <w:lvlJc w:val="left"/>
     </w:lvl>
-    <w:lvl w:ilvl="7" w:tplc="5816D8EE">
+    <w:lvl w:ilvl="7" w:tplc="4964EED6">
       <w:numFmt w:val="decimal"/>
       <w:lvlText w:val=""/>
       <w:lvlJc w:val="left"/>
     </w:lvl>
-    <w:lvl w:ilvl="8" w:tplc="A2EE2A64">
+    <w:lvl w:ilvl="8" w:tplc="349CD578">
       <w:numFmt w:val="decimal"/>
       <w:lvlText w:val=""/>
       <w:lvlJc w:val="left"/>
     </w:lvl>
   </w:abstractNum>
   <w:abstractNum w:abstractNumId="4" w15:restartNumberingAfterBreak="0">
-    <w:nsid w:val="289A65B7"/>
+    <w:nsid w:val="22B25208"/>
     <w:multiLevelType w:val="hybridMultilevel"/>
-    <w:tmpl w:val="F1B2E7D4"/>
-    <w:lvl w:ilvl="0" w:tplc="6E368D06">
+    <w:tmpl w:val="9DA2BA64"/>
+    <w:lvl w:ilvl="0" w:tplc="155CF00C">
       <w:start w:val="1"/>
       <w:numFmt w:val="decimal"/>
       <w:lvlText w:val="%1."/>
@@ -51231,7 +51252,7 @@
         <w:ind w:left="360" w:hanging="300"/>
       </w:pPr>
     </w:lvl>
-    <w:lvl w:ilvl="1" w:tplc="ABA2F4A6" w:tentative="1">
+    <w:lvl w:ilvl="1" w:tplc="A4A4AB62" w:tentative="1">
       <w:start w:val="1"/>
       <w:numFmt w:val="lowerLetter"/>
       <w:lvlText w:val="%2."/>
@@ -51240,47 +51261,47 @@
         <w:ind w:left="720" w:hanging="300"/>
       </w:pPr>
     </w:lvl>
-    <w:lvl w:ilvl="2" w:tplc="1F649188">
+    <w:lvl w:ilvl="2" w:tplc="7372556C">
       <w:numFmt w:val="decimal"/>
       <w:lvlText w:val=""/>
       <w:lvlJc w:val="left"/>
     </w:lvl>
-    <w:lvl w:ilvl="3" w:tplc="759EB91C">
+    <w:lvl w:ilvl="3" w:tplc="A628E516">
       <w:numFmt w:val="decimal"/>
       <w:lvlText w:val=""/>
       <w:lvlJc w:val="left"/>
     </w:lvl>
-    <w:lvl w:ilvl="4" w:tplc="D51C424A">
+    <w:lvl w:ilvl="4" w:tplc="FB3EFC16">
       <w:numFmt w:val="decimal"/>
       <w:lvlText w:val=""/>
       <w:lvlJc w:val="left"/>
     </w:lvl>
-    <w:lvl w:ilvl="5" w:tplc="733EB6D6">
+    <w:lvl w:ilvl="5" w:tplc="A3CEB992">
       <w:numFmt w:val="decimal"/>
       <w:lvlText w:val=""/>
       <w:lvlJc w:val="left"/>
     </w:lvl>
-    <w:lvl w:ilvl="6" w:tplc="D6CE5B5C">
+    <w:lvl w:ilvl="6" w:tplc="911415C0">
       <w:numFmt w:val="decimal"/>
       <w:lvlText w:val=""/>
       <w:lvlJc w:val="left"/>
     </w:lvl>
-    <w:lvl w:ilvl="7" w:tplc="6E9E2F84">
+    <w:lvl w:ilvl="7" w:tplc="BB7AD15A">
       <w:numFmt w:val="decimal"/>
       <w:lvlText w:val=""/>
       <w:lvlJc w:val="left"/>
     </w:lvl>
-    <w:lvl w:ilvl="8" w:tplc="32764AA4">
+    <w:lvl w:ilvl="8" w:tplc="06761A6E">
       <w:numFmt w:val="decimal"/>
       <w:lvlText w:val=""/>
       <w:lvlJc w:val="left"/>
     </w:lvl>
   </w:abstractNum>
   <w:abstractNum w:abstractNumId="5" w15:restartNumberingAfterBreak="0">
-    <w:nsid w:val="30403CBD"/>
+    <w:nsid w:val="24727370"/>
     <w:multiLevelType w:val="hybridMultilevel"/>
-    <w:tmpl w:val="C7BAC4C8"/>
-    <w:lvl w:ilvl="0" w:tplc="CDCC9B6C">
+    <w:tmpl w:val="E3745824"/>
+    <w:lvl w:ilvl="0" w:tplc="F006C04A">
       <w:start w:val="1"/>
       <w:numFmt w:val="decimal"/>
       <w:lvlText w:val="%1."/>
@@ -51289,7 +51310,7 @@
         <w:ind w:left="360" w:hanging="300"/>
       </w:pPr>
     </w:lvl>
-    <w:lvl w:ilvl="1" w:tplc="EBB288B0" w:tentative="1">
+    <w:lvl w:ilvl="1" w:tplc="5B9A9F3A" w:tentative="1">
       <w:start w:val="1"/>
       <w:numFmt w:val="lowerLetter"/>
       <w:lvlText w:val="%2."/>
@@ -51298,47 +51319,47 @@
         <w:ind w:left="720" w:hanging="300"/>
       </w:pPr>
     </w:lvl>
-    <w:lvl w:ilvl="2" w:tplc="66B8274E">
+    <w:lvl w:ilvl="2" w:tplc="EADA632C">
       <w:numFmt w:val="decimal"/>
       <w:lvlText w:val=""/>
       <w:lvlJc w:val="left"/>
     </w:lvl>
-    <w:lvl w:ilvl="3" w:tplc="46AA66F0">
+    <w:lvl w:ilvl="3" w:tplc="E9366C38">
       <w:numFmt w:val="decimal"/>
       <w:lvlText w:val=""/>
       <w:lvlJc w:val="left"/>
     </w:lvl>
-    <w:lvl w:ilvl="4" w:tplc="88FC9D78">
+    <w:lvl w:ilvl="4" w:tplc="19BE1452">
       <w:numFmt w:val="decimal"/>
       <w:lvlText w:val=""/>
       <w:lvlJc w:val="left"/>
     </w:lvl>
-    <w:lvl w:ilvl="5" w:tplc="9A1A656C">
+    <w:lvl w:ilvl="5" w:tplc="F0C67C60">
       <w:numFmt w:val="decimal"/>
       <w:lvlText w:val=""/>
       <w:lvlJc w:val="left"/>
     </w:lvl>
-    <w:lvl w:ilvl="6" w:tplc="3F16B79E">
+    <w:lvl w:ilvl="6" w:tplc="D51C2204">
       <w:numFmt w:val="decimal"/>
       <w:lvlText w:val=""/>
       <w:lvlJc w:val="left"/>
     </w:lvl>
-    <w:lvl w:ilvl="7" w:tplc="CEDEC578">
+    <w:lvl w:ilvl="7" w:tplc="63CE733E">
       <w:numFmt w:val="decimal"/>
       <w:lvlText w:val=""/>
       <w:lvlJc w:val="left"/>
     </w:lvl>
-    <w:lvl w:ilvl="8" w:tplc="2252240C">
+    <w:lvl w:ilvl="8" w:tplc="95B4BB88">
       <w:numFmt w:val="decimal"/>
       <w:lvlText w:val=""/>
       <w:lvlJc w:val="left"/>
     </w:lvl>
   </w:abstractNum>
   <w:abstractNum w:abstractNumId="6" w15:restartNumberingAfterBreak="0">
-    <w:nsid w:val="383B5C6E"/>
+    <w:nsid w:val="24F756EA"/>
     <w:multiLevelType w:val="hybridMultilevel"/>
-    <w:tmpl w:val="4D38E320"/>
-    <w:lvl w:ilvl="0" w:tplc="FB242A4A">
+    <w:tmpl w:val="376EC74C"/>
+    <w:lvl w:ilvl="0" w:tplc="301C0A18">
       <w:start w:val="1"/>
       <w:numFmt w:val="decimal"/>
       <w:lvlText w:val="%1."/>
@@ -51347,7 +51368,7 @@
         <w:ind w:left="360" w:hanging="300"/>
       </w:pPr>
     </w:lvl>
-    <w:lvl w:ilvl="1" w:tplc="DE80614A" w:tentative="1">
+    <w:lvl w:ilvl="1" w:tplc="A38CC210" w:tentative="1">
       <w:start w:val="1"/>
       <w:numFmt w:val="lowerLetter"/>
       <w:lvlText w:val="%2."/>
@@ -51356,47 +51377,47 @@
         <w:ind w:left="720" w:hanging="300"/>
       </w:pPr>
     </w:lvl>
-    <w:lvl w:ilvl="2" w:tplc="AEFEB6D2">
+    <w:lvl w:ilvl="2" w:tplc="71D8DC50">
       <w:numFmt w:val="decimal"/>
       <w:lvlText w:val=""/>
       <w:lvlJc w:val="left"/>
     </w:lvl>
-    <w:lvl w:ilvl="3" w:tplc="06900C3A">
+    <w:lvl w:ilvl="3" w:tplc="A5C26F60">
       <w:numFmt w:val="decimal"/>
       <w:lvlText w:val=""/>
       <w:lvlJc w:val="left"/>
     </w:lvl>
-    <w:lvl w:ilvl="4" w:tplc="757EF75C">
+    <w:lvl w:ilvl="4" w:tplc="354AA1EA">
       <w:numFmt w:val="decimal"/>
       <w:lvlText w:val=""/>
       <w:lvlJc w:val="left"/>
     </w:lvl>
-    <w:lvl w:ilvl="5" w:tplc="2918F362">
+    <w:lvl w:ilvl="5" w:tplc="3AF8CC54">
       <w:numFmt w:val="decimal"/>
       <w:lvlText w:val=""/>
       <w:lvlJc w:val="left"/>
     </w:lvl>
-    <w:lvl w:ilvl="6" w:tplc="A352F028">
+    <w:lvl w:ilvl="6" w:tplc="422E516C">
       <w:numFmt w:val="decimal"/>
       <w:lvlText w:val=""/>
       <w:lvlJc w:val="left"/>
     </w:lvl>
-    <w:lvl w:ilvl="7" w:tplc="E43A16FE">
+    <w:lvl w:ilvl="7" w:tplc="23F82ABE">
       <w:numFmt w:val="decimal"/>
       <w:lvlText w:val=""/>
       <w:lvlJc w:val="left"/>
     </w:lvl>
-    <w:lvl w:ilvl="8" w:tplc="550C3902">
+    <w:lvl w:ilvl="8" w:tplc="20EC61A8">
       <w:numFmt w:val="decimal"/>
       <w:lvlText w:val=""/>
       <w:lvlJc w:val="left"/>
     </w:lvl>
   </w:abstractNum>
   <w:abstractNum w:abstractNumId="7" w15:restartNumberingAfterBreak="0">
-    <w:nsid w:val="478212B4"/>
+    <w:nsid w:val="28092643"/>
     <w:multiLevelType w:val="hybridMultilevel"/>
-    <w:tmpl w:val="57747616"/>
-    <w:lvl w:ilvl="0" w:tplc="ACBC2346">
+    <w:tmpl w:val="1CCE54F2"/>
+    <w:lvl w:ilvl="0" w:tplc="43740E10">
       <w:start w:val="1"/>
       <w:numFmt w:val="decimal"/>
       <w:lvlText w:val="%1."/>
@@ -51405,7 +51426,7 @@
         <w:ind w:left="360" w:hanging="300"/>
       </w:pPr>
     </w:lvl>
-    <w:lvl w:ilvl="1" w:tplc="A7DAEAEE" w:tentative="1">
+    <w:lvl w:ilvl="1" w:tplc="0068D8F6" w:tentative="1">
       <w:start w:val="1"/>
       <w:numFmt w:val="lowerLetter"/>
       <w:lvlText w:val="%2."/>
@@ -51414,47 +51435,47 @@
         <w:ind w:left="720" w:hanging="300"/>
       </w:pPr>
     </w:lvl>
-    <w:lvl w:ilvl="2" w:tplc="60E4871A">
+    <w:lvl w:ilvl="2" w:tplc="113C808C">
       <w:numFmt w:val="decimal"/>
       <w:lvlText w:val=""/>
       <w:lvlJc w:val="left"/>
     </w:lvl>
-    <w:lvl w:ilvl="3" w:tplc="6EAE8088">
+    <w:lvl w:ilvl="3" w:tplc="E7DA224C">
       <w:numFmt w:val="decimal"/>
       <w:lvlText w:val=""/>
       <w:lvlJc w:val="left"/>
     </w:lvl>
-    <w:lvl w:ilvl="4" w:tplc="835CE932">
+    <w:lvl w:ilvl="4" w:tplc="03D45E60">
       <w:numFmt w:val="decimal"/>
       <w:lvlText w:val=""/>
       <w:lvlJc w:val="left"/>
     </w:lvl>
-    <w:lvl w:ilvl="5" w:tplc="CD4EE738">
+    <w:lvl w:ilvl="5" w:tplc="18A856FC">
       <w:numFmt w:val="decimal"/>
       <w:lvlText w:val=""/>
       <w:lvlJc w:val="left"/>
     </w:lvl>
-    <w:lvl w:ilvl="6" w:tplc="E368C554">
+    <w:lvl w:ilvl="6" w:tplc="56CC57AE">
       <w:numFmt w:val="decimal"/>
       <w:lvlText w:val=""/>
       <w:lvlJc w:val="left"/>
     </w:lvl>
-    <w:lvl w:ilvl="7" w:tplc="E4808FAC">
+    <w:lvl w:ilvl="7" w:tplc="266E8F1E">
       <w:numFmt w:val="decimal"/>
       <w:lvlText w:val=""/>
       <w:lvlJc w:val="left"/>
     </w:lvl>
-    <w:lvl w:ilvl="8" w:tplc="56C408F8">
+    <w:lvl w:ilvl="8" w:tplc="1EF8683A">
       <w:numFmt w:val="decimal"/>
       <w:lvlText w:val=""/>
       <w:lvlJc w:val="left"/>
     </w:lvl>
   </w:abstractNum>
   <w:abstractNum w:abstractNumId="8" w15:restartNumberingAfterBreak="0">
-    <w:nsid w:val="4FC051ED"/>
+    <w:nsid w:val="298C0F41"/>
     <w:multiLevelType w:val="hybridMultilevel"/>
-    <w:tmpl w:val="58C2882A"/>
-    <w:lvl w:ilvl="0" w:tplc="57D60F88">
+    <w:tmpl w:val="E0CC997A"/>
+    <w:lvl w:ilvl="0" w:tplc="5AC23648">
       <w:start w:val="1"/>
       <w:numFmt w:val="decimal"/>
       <w:lvlText w:val="%1."/>
@@ -51463,7 +51484,7 @@
         <w:ind w:left="360" w:hanging="300"/>
       </w:pPr>
     </w:lvl>
-    <w:lvl w:ilvl="1" w:tplc="3EE2F96E" w:tentative="1">
+    <w:lvl w:ilvl="1" w:tplc="E7A2CA38" w:tentative="1">
       <w:start w:val="1"/>
       <w:numFmt w:val="lowerLetter"/>
       <w:lvlText w:val="%2."/>
@@ -51472,47 +51493,105 @@
         <w:ind w:left="720" w:hanging="300"/>
       </w:pPr>
     </w:lvl>
-    <w:lvl w:ilvl="2" w:tplc="9BE64F54">
+    <w:lvl w:ilvl="2" w:tplc="6456AD30">
       <w:numFmt w:val="decimal"/>
       <w:lvlText w:val=""/>
       <w:lvlJc w:val="left"/>
     </w:lvl>
-    <w:lvl w:ilvl="3" w:tplc="9BDAA300">
+    <w:lvl w:ilvl="3" w:tplc="84E24AB0">
       <w:numFmt w:val="decimal"/>
       <w:lvlText w:val=""/>
       <w:lvlJc w:val="left"/>
     </w:lvl>
-    <w:lvl w:ilvl="4" w:tplc="B2F25BE4">
+    <w:lvl w:ilvl="4" w:tplc="BA0610BC">
       <w:numFmt w:val="decimal"/>
       <w:lvlText w:val=""/>
       <w:lvlJc w:val="left"/>
     </w:lvl>
-    <w:lvl w:ilvl="5" w:tplc="D62AB202">
+    <w:lvl w:ilvl="5" w:tplc="3D44B630">
       <w:numFmt w:val="decimal"/>
       <w:lvlText w:val=""/>
       <w:lvlJc w:val="left"/>
     </w:lvl>
-    <w:lvl w:ilvl="6" w:tplc="68FA9D7C">
+    <w:lvl w:ilvl="6" w:tplc="DCFA1BCA">
       <w:numFmt w:val="decimal"/>
       <w:lvlText w:val=""/>
       <w:lvlJc w:val="left"/>
     </w:lvl>
-    <w:lvl w:ilvl="7" w:tplc="21D0A1A2">
+    <w:lvl w:ilvl="7" w:tplc="63C01AF0">
       <w:numFmt w:val="decimal"/>
       <w:lvlText w:val=""/>
       <w:lvlJc w:val="left"/>
     </w:lvl>
-    <w:lvl w:ilvl="8" w:tplc="6C0453AC">
+    <w:lvl w:ilvl="8" w:tplc="B98A6AF6">
       <w:numFmt w:val="decimal"/>
       <w:lvlText w:val=""/>
       <w:lvlJc w:val="left"/>
     </w:lvl>
   </w:abstractNum>
   <w:abstractNum w:abstractNumId="9" w15:restartNumberingAfterBreak="0">
-    <w:nsid w:val="50E52B15"/>
+    <w:nsid w:val="2BA16F37"/>
     <w:multiLevelType w:val="hybridMultilevel"/>
-    <w:tmpl w:val="1318EB14"/>
-    <w:lvl w:ilvl="0" w:tplc="168C649C">
+    <w:tmpl w:val="AF1EB818"/>
+    <w:lvl w:ilvl="0" w:tplc="162274F4">
+      <w:start w:val="1"/>
+      <w:numFmt w:val="bullet"/>
+      <w:lvlText w:val="•"/>
+      <w:lvlJc w:val="left"/>
+      <w:pPr>
+        <w:ind w:left="360" w:hanging="260"/>
+      </w:pPr>
+    </w:lvl>
+    <w:lvl w:ilvl="1" w:tplc="51F6A560" w:tentative="1">
+      <w:start w:val="1"/>
+      <w:numFmt w:val="bullet"/>
+      <w:lvlText w:val="–"/>
+      <w:lvlJc w:val="left"/>
+      <w:pPr>
+        <w:ind w:left="720" w:hanging="260"/>
+      </w:pPr>
+    </w:lvl>
+    <w:lvl w:ilvl="2" w:tplc="EE4689C8">
+      <w:numFmt w:val="decimal"/>
+      <w:lvlText w:val=""/>
+      <w:lvlJc w:val="left"/>
+    </w:lvl>
+    <w:lvl w:ilvl="3" w:tplc="53401714">
+      <w:numFmt w:val="decimal"/>
+      <w:lvlText w:val=""/>
+      <w:lvlJc w:val="left"/>
+    </w:lvl>
+    <w:lvl w:ilvl="4" w:tplc="C93238A2">
+      <w:numFmt w:val="decimal"/>
+      <w:lvlText w:val=""/>
+      <w:lvlJc w:val="left"/>
+    </w:lvl>
+    <w:lvl w:ilvl="5" w:tplc="F064BFF0">
+      <w:numFmt w:val="decimal"/>
+      <w:lvlText w:val=""/>
+      <w:lvlJc w:val="left"/>
+    </w:lvl>
+    <w:lvl w:ilvl="6" w:tplc="E1E47B14">
+      <w:numFmt w:val="decimal"/>
+      <w:lvlText w:val=""/>
+      <w:lvlJc w:val="left"/>
+    </w:lvl>
+    <w:lvl w:ilvl="7" w:tplc="0A720792">
+      <w:numFmt w:val="decimal"/>
+      <w:lvlText w:val=""/>
+      <w:lvlJc w:val="left"/>
+    </w:lvl>
+    <w:lvl w:ilvl="8" w:tplc="F0CECD02">
+      <w:numFmt w:val="decimal"/>
+      <w:lvlText w:val=""/>
+      <w:lvlJc w:val="left"/>
+    </w:lvl>
+  </w:abstractNum>
+  <w:abstractNum w:abstractNumId="10" w15:restartNumberingAfterBreak="0">
+    <w:nsid w:val="2EA94FF8"/>
+    <w:multiLevelType w:val="hybridMultilevel"/>
+    <w:tmpl w:val="43242896"/>
+    <w:lvl w:ilvl="0" w:tplc="788AD014">
       <w:start w:val="1"/>
       <w:numFmt w:val="decimal"/>
       <w:lvlText w:val="%1."/>
@@ -51521,7 +51600,7 @@
         <w:ind w:left="360" w:hanging="300"/>
       </w:pPr>
     </w:lvl>
-    <w:lvl w:ilvl="1" w:tplc="092E7472" w:tentative="1">
+    <w:lvl w:ilvl="1" w:tplc="050CEA5C" w:tentative="1">
       <w:start w:val="1"/>
       <w:numFmt w:val="lowerLetter"/>
       <w:lvlText w:val="%2."/>
@@ -51530,47 +51609,47 @@
         <w:ind w:left="720" w:hanging="300"/>
       </w:pPr>
     </w:lvl>
-    <w:lvl w:ilvl="2" w:tplc="B86213A0">
+    <w:lvl w:ilvl="2" w:tplc="7EF04B74">
       <w:numFmt w:val="decimal"/>
       <w:lvlText w:val=""/>
       <w:lvlJc w:val="left"/>
     </w:lvl>
-    <w:lvl w:ilvl="3" w:tplc="397EFA8E">
+    <w:lvl w:ilvl="3" w:tplc="32AE828E">
       <w:numFmt w:val="decimal"/>
       <w:lvlText w:val=""/>
       <w:lvlJc w:val="left"/>
     </w:lvl>
-    <w:lvl w:ilvl="4" w:tplc="AF2CD98A">
+    <w:lvl w:ilvl="4" w:tplc="1EEED008">
       <w:numFmt w:val="decimal"/>
       <w:lvlText w:val=""/>
       <w:lvlJc w:val="left"/>
     </w:lvl>
-    <w:lvl w:ilvl="5" w:tplc="25B60274">
+    <w:lvl w:ilvl="5" w:tplc="58A638FC">
       <w:numFmt w:val="decimal"/>
       <w:lvlText w:val=""/>
       <w:lvlJc w:val="left"/>
     </w:lvl>
-    <w:lvl w:ilvl="6" w:tplc="90D24742">
+    <w:lvl w:ilvl="6" w:tplc="8328F7B6">
       <w:numFmt w:val="decimal"/>
       <w:lvlText w:val=""/>
       <w:lvlJc w:val="left"/>
     </w:lvl>
-    <w:lvl w:ilvl="7" w:tplc="01F0A8FA">
+    <w:lvl w:ilvl="7" w:tplc="9FDAD97E">
       <w:numFmt w:val="decimal"/>
       <w:lvlText w:val=""/>
       <w:lvlJc w:val="left"/>
     </w:lvl>
-    <w:lvl w:ilvl="8" w:tplc="1C2AD052">
+    <w:lvl w:ilvl="8" w:tplc="4F90D114">
       <w:numFmt w:val="decimal"/>
       <w:lvlText w:val=""/>
       <w:lvlJc w:val="left"/>
     </w:lvl>
   </w:abstractNum>
-  <w:abstractNum w:abstractNumId="10" w15:restartNumberingAfterBreak="0">
-    <w:nsid w:val="54CF5D01"/>
+  <w:abstractNum w:abstractNumId="11" w15:restartNumberingAfterBreak="0">
+    <w:nsid w:val="300C6C07"/>
     <w:multiLevelType w:val="hybridMultilevel"/>
-    <w:tmpl w:val="87B8FD8C"/>
-    <w:lvl w:ilvl="0" w:tplc="7ED4F46A" w:tentative="1">
+    <w:tmpl w:val="2348D316"/>
+    <w:lvl w:ilvl="0" w:tplc="ABD6ADE8" w:tentative="1">
       <w:start w:val="1"/>
       <w:numFmt w:val="bullet"/>
       <w:lvlText w:val="●"/>
@@ -51579,7 +51658,7 @@
         <w:ind w:left="720" w:hanging="360"/>
       </w:pPr>
     </w:lvl>
-    <w:lvl w:ilvl="1" w:tplc="09F6A438" w:tentative="1">
+    <w:lvl w:ilvl="1" w:tplc="3B8835CE" w:tentative="1">
       <w:start w:val="1"/>
       <w:numFmt w:val="bullet"/>
       <w:lvlText w:val="○"/>
@@ -51588,7 +51667,7 @@
         <w:ind w:left="1440" w:hanging="360"/>
       </w:pPr>
     </w:lvl>
-    <w:lvl w:ilvl="2" w:tplc="9E0A8370" w:tentative="1">
+    <w:lvl w:ilvl="2" w:tplc="9D4C1C10" w:tentative="1">
       <w:start w:val="1"/>
       <w:numFmt w:val="bullet"/>
       <w:lvlText w:val="■"/>
@@ -51597,7 +51676,7 @@
         <w:ind w:left="2160" w:hanging="360"/>
       </w:pPr>
     </w:lvl>
-    <w:lvl w:ilvl="3" w:tplc="F8940452" w:tentative="1">
+    <w:lvl w:ilvl="3" w:tplc="15EA0C64" w:tentative="1">
       <w:start w:val="1"/>
       <w:numFmt w:val="bullet"/>
       <w:lvlText w:val="●"/>
@@ -51606,7 +51685,7 @@
         <w:ind w:left="2880" w:hanging="360"/>
       </w:pPr>
     </w:lvl>
-    <w:lvl w:ilvl="4" w:tplc="03D07A42" w:tentative="1">
+    <w:lvl w:ilvl="4" w:tplc="BB426F44" w:tentative="1">
       <w:start w:val="1"/>
       <w:numFmt w:val="bullet"/>
       <w:lvlText w:val="○"/>
@@ -51615,7 +51694,7 @@
         <w:ind w:left="3600" w:hanging="360"/>
       </w:pPr>
     </w:lvl>
-    <w:lvl w:ilvl="5" w:tplc="9252CC32" w:tentative="1">
+    <w:lvl w:ilvl="5" w:tplc="2758E7C0" w:tentative="1">
       <w:start w:val="1"/>
       <w:numFmt w:val="bullet"/>
       <w:lvlText w:val="■"/>
@@ -51624,7 +51703,7 @@
         <w:ind w:left="4320" w:hanging="360"/>
       </w:pPr>
     </w:lvl>
-    <w:lvl w:ilvl="6" w:tplc="224E8CC6" w:tentative="1">
+    <w:lvl w:ilvl="6" w:tplc="3BD2464E" w:tentative="1">
       <w:start w:val="1"/>
       <w:numFmt w:val="bullet"/>
       <w:lvlText w:val="●"/>
@@ -51633,7 +51712,7 @@
         <w:ind w:left="5040" w:hanging="360"/>
       </w:pPr>
     </w:lvl>
-    <w:lvl w:ilvl="7" w:tplc="EB942D58" w:tentative="1">
+    <w:lvl w:ilvl="7" w:tplc="AC12B954" w:tentative="1">
       <w:start w:val="1"/>
       <w:numFmt w:val="bullet"/>
       <w:lvlText w:val="●"/>
@@ -51642,7 +51721,7 @@
         <w:ind w:left="5760" w:hanging="360"/>
       </w:pPr>
     </w:lvl>
-    <w:lvl w:ilvl="8" w:tplc="FBA824A8" w:tentative="1">
+    <w:lvl w:ilvl="8" w:tplc="68AAB1D0" w:tentative="1">
       <w:start w:val="1"/>
       <w:numFmt w:val="bullet"/>
       <w:lvlText w:val="●"/>
@@ -51652,11 +51731,11 @@
       </w:pPr>
     </w:lvl>
   </w:abstractNum>
-  <w:abstractNum w:abstractNumId="11" w15:restartNumberingAfterBreak="0">
-    <w:nsid w:val="64FB4929"/>
+  <w:abstractNum w:abstractNumId="12" w15:restartNumberingAfterBreak="0">
+    <w:nsid w:val="59B07C55"/>
     <w:multiLevelType w:val="hybridMultilevel"/>
-    <w:tmpl w:val="E468FE0E"/>
-    <w:lvl w:ilvl="0" w:tplc="1A7E9A82">
+    <w:tmpl w:val="4DB699E2"/>
+    <w:lvl w:ilvl="0" w:tplc="E7622678">
       <w:start w:val="1"/>
       <w:numFmt w:val="decimal"/>
       <w:lvlText w:val="%1."/>
@@ -51665,7 +51744,7 @@
         <w:ind w:left="360" w:hanging="300"/>
       </w:pPr>
     </w:lvl>
-    <w:lvl w:ilvl="1" w:tplc="E310757E" w:tentative="1">
+    <w:lvl w:ilvl="1" w:tplc="54FCA18A" w:tentative="1">
       <w:start w:val="1"/>
       <w:numFmt w:val="lowerLetter"/>
       <w:lvlText w:val="%2."/>
@@ -51674,105 +51753,47 @@
         <w:ind w:left="720" w:hanging="300"/>
       </w:pPr>
     </w:lvl>
-    <w:lvl w:ilvl="2" w:tplc="ED4AE120">
+    <w:lvl w:ilvl="2" w:tplc="C9EA91F4">
       <w:numFmt w:val="decimal"/>
       <w:lvlText w:val=""/>
       <w:lvlJc w:val="left"/>
     </w:lvl>
-    <w:lvl w:ilvl="3" w:tplc="2EFCDBC0">
+    <w:lvl w:ilvl="3" w:tplc="E17857E6">
       <w:numFmt w:val="decimal"/>
       <w:lvlText w:val=""/>
       <w:lvlJc w:val="left"/>
     </w:lvl>
-    <w:lvl w:ilvl="4" w:tplc="EE24684E">
+    <w:lvl w:ilvl="4" w:tplc="66BA74DE">
       <w:numFmt w:val="decimal"/>
       <w:lvlText w:val=""/>
       <w:lvlJc w:val="left"/>
     </w:lvl>
-    <w:lvl w:ilvl="5" w:tplc="DCC4092E">
+    <w:lvl w:ilvl="5" w:tplc="E61C8534">
       <w:numFmt w:val="decimal"/>
       <w:lvlText w:val=""/>
       <w:lvlJc w:val="left"/>
     </w:lvl>
-    <w:lvl w:ilvl="6" w:tplc="7ECE2A02">
+    <w:lvl w:ilvl="6" w:tplc="BDE0BB64">
       <w:numFmt w:val="decimal"/>
       <w:lvlText w:val=""/>
       <w:lvlJc w:val="left"/>
     </w:lvl>
-    <w:lvl w:ilvl="7" w:tplc="DCA8BAC6">
+    <w:lvl w:ilvl="7" w:tplc="A0A42798">
       <w:numFmt w:val="decimal"/>
       <w:lvlText w:val=""/>
       <w:lvlJc w:val="left"/>
     </w:lvl>
-    <w:lvl w:ilvl="8" w:tplc="CCAEEA08">
-      <w:numFmt w:val="decimal"/>
-      <w:lvlText w:val=""/>
-      <w:lvlJc w:val="left"/>
-    </w:lvl>
-  </w:abstractNum>
-  <w:abstractNum w:abstractNumId="12" w15:restartNumberingAfterBreak="0">
-    <w:nsid w:val="6795088F"/>
-    <w:multiLevelType w:val="hybridMultilevel"/>
-    <w:tmpl w:val="082AAD64"/>
-    <w:lvl w:ilvl="0" w:tplc="85CEDA5C">
-      <w:start w:val="1"/>
-      <w:numFmt w:val="bullet"/>
-      <w:lvlText w:val="•"/>
-      <w:lvlJc w:val="left"/>
-      <w:pPr>
-        <w:ind w:left="360" w:hanging="260"/>
-      </w:pPr>
-    </w:lvl>
-    <w:lvl w:ilvl="1" w:tplc="B8040218" w:tentative="1">
-      <w:start w:val="1"/>
-      <w:numFmt w:val="bullet"/>
-      <w:lvlText w:val="–"/>
-      <w:lvlJc w:val="left"/>
-      <w:pPr>
-        <w:ind w:left="720" w:hanging="260"/>
-      </w:pPr>
-    </w:lvl>
-    <w:lvl w:ilvl="2" w:tplc="8DF69462">
-      <w:numFmt w:val="decimal"/>
-      <w:lvlText w:val=""/>
-      <w:lvlJc w:val="left"/>
-    </w:lvl>
-    <w:lvl w:ilvl="3" w:tplc="EFE81D48">
-      <w:numFmt w:val="decimal"/>
-      <w:lvlText w:val=""/>
-      <w:lvlJc w:val="left"/>
-    </w:lvl>
-    <w:lvl w:ilvl="4" w:tplc="9E164926">
-      <w:numFmt w:val="decimal"/>
-      <w:lvlText w:val=""/>
-      <w:lvlJc w:val="left"/>
-    </w:lvl>
-    <w:lvl w:ilvl="5" w:tplc="B3F0AF0A">
-      <w:numFmt w:val="decimal"/>
-      <w:lvlText w:val=""/>
-      <w:lvlJc w:val="left"/>
-    </w:lvl>
-    <w:lvl w:ilvl="6" w:tplc="8A1A71A2">
-      <w:numFmt w:val="decimal"/>
-      <w:lvlText w:val=""/>
-      <w:lvlJc w:val="left"/>
-    </w:lvl>
-    <w:lvl w:ilvl="7" w:tplc="B33E023C">
-      <w:numFmt w:val="decimal"/>
-      <w:lvlText w:val=""/>
-      <w:lvlJc w:val="left"/>
-    </w:lvl>
-    <w:lvl w:ilvl="8" w:tplc="FEBAC25E">
+    <w:lvl w:ilvl="8" w:tplc="55749C80">
       <w:numFmt w:val="decimal"/>
       <w:lvlText w:val=""/>
       <w:lvlJc w:val="left"/>
     </w:lvl>
   </w:abstractNum>
   <w:abstractNum w:abstractNumId="13" w15:restartNumberingAfterBreak="0">
-    <w:nsid w:val="6B417E09"/>
+    <w:nsid w:val="72C7034B"/>
     <w:multiLevelType w:val="hybridMultilevel"/>
-    <w:tmpl w:val="F5461762"/>
-    <w:lvl w:ilvl="0" w:tplc="5D96C20E">
+    <w:tmpl w:val="E2069534"/>
+    <w:lvl w:ilvl="0" w:tplc="5CB88E38">
       <w:start w:val="1"/>
       <w:numFmt w:val="decimal"/>
       <w:lvlText w:val="%1."/>
@@ -51781,7 +51802,7 @@
         <w:ind w:left="360" w:hanging="300"/>
       </w:pPr>
     </w:lvl>
-    <w:lvl w:ilvl="1" w:tplc="3A94A266" w:tentative="1">
+    <w:lvl w:ilvl="1" w:tplc="A72E086E" w:tentative="1">
       <w:start w:val="1"/>
       <w:numFmt w:val="lowerLetter"/>
       <w:lvlText w:val="%2."/>
@@ -51790,47 +51811,47 @@
         <w:ind w:left="720" w:hanging="300"/>
       </w:pPr>
     </w:lvl>
-    <w:lvl w:ilvl="2" w:tplc="93D847D8">
+    <w:lvl w:ilvl="2" w:tplc="BB9E1926">
       <w:numFmt w:val="decimal"/>
       <w:lvlText w:val=""/>
       <w:lvlJc w:val="left"/>
     </w:lvl>
-    <w:lvl w:ilvl="3" w:tplc="BD2CD634">
+    <w:lvl w:ilvl="3" w:tplc="2CC0304E">
       <w:numFmt w:val="decimal"/>
       <w:lvlText w:val=""/>
       <w:lvlJc w:val="left"/>
     </w:lvl>
-    <w:lvl w:ilvl="4" w:tplc="11540490">
+    <w:lvl w:ilvl="4" w:tplc="9774D1D6">
       <w:numFmt w:val="decimal"/>
       <w:lvlText w:val=""/>
       <w:lvlJc w:val="left"/>
     </w:lvl>
-    <w:lvl w:ilvl="5" w:tplc="6C9E4254">
+    <w:lvl w:ilvl="5" w:tplc="81B22BC2">
       <w:numFmt w:val="decimal"/>
       <w:lvlText w:val=""/>
       <w:lvlJc w:val="left"/>
     </w:lvl>
-    <w:lvl w:ilvl="6" w:tplc="0D0CD8B4">
+    <w:lvl w:ilvl="6" w:tplc="131EDB4C">
       <w:numFmt w:val="decimal"/>
       <w:lvlText w:val=""/>
       <w:lvlJc w:val="left"/>
     </w:lvl>
-    <w:lvl w:ilvl="7" w:tplc="FC6C8526">
+    <w:lvl w:ilvl="7" w:tplc="72E42F0C">
       <w:numFmt w:val="decimal"/>
       <w:lvlText w:val=""/>
       <w:lvlJc w:val="left"/>
     </w:lvl>
-    <w:lvl w:ilvl="8" w:tplc="71E6F428">
+    <w:lvl w:ilvl="8" w:tplc="3E886EBE">
       <w:numFmt w:val="decimal"/>
       <w:lvlText w:val=""/>
       <w:lvlJc w:val="left"/>
     </w:lvl>
   </w:abstractNum>
   <w:abstractNum w:abstractNumId="14" w15:restartNumberingAfterBreak="0">
-    <w:nsid w:val="6CF307F5"/>
+    <w:nsid w:val="786B64BD"/>
     <w:multiLevelType w:val="hybridMultilevel"/>
-    <w:tmpl w:val="CA72FC16"/>
-    <w:lvl w:ilvl="0" w:tplc="97587FA0">
+    <w:tmpl w:val="FF680090"/>
+    <w:lvl w:ilvl="0" w:tplc="E0A83E22">
       <w:start w:val="1"/>
       <w:numFmt w:val="decimal"/>
       <w:lvlText w:val="%1."/>
@@ -51839,7 +51860,7 @@
         <w:ind w:left="360" w:hanging="300"/>
       </w:pPr>
     </w:lvl>
-    <w:lvl w:ilvl="1" w:tplc="86A4AA70" w:tentative="1">
+    <w:lvl w:ilvl="1" w:tplc="1C5A0D50" w:tentative="1">
       <w:start w:val="1"/>
       <w:numFmt w:val="lowerLetter"/>
       <w:lvlText w:val="%2."/>
@@ -51848,128 +51869,128 @@
         <w:ind w:left="720" w:hanging="300"/>
       </w:pPr>
     </w:lvl>
-    <w:lvl w:ilvl="2" w:tplc="394A572E">
+    <w:lvl w:ilvl="2" w:tplc="3776170A">
       <w:numFmt w:val="decimal"/>
       <w:lvlText w:val=""/>
       <w:lvlJc w:val="left"/>
     </w:lvl>
-    <w:lvl w:ilvl="3" w:tplc="E1808D16">
+    <w:lvl w:ilvl="3" w:tplc="48D21E22">
       <w:numFmt w:val="decimal"/>
       <w:lvlText w:val=""/>
       <w:lvlJc w:val="left"/>
     </w:lvl>
-    <w:lvl w:ilvl="4" w:tplc="F8C66BB8">
+    <w:lvl w:ilvl="4" w:tplc="4DA8B0F6">
       <w:numFmt w:val="decimal"/>
       <w:lvlText w:val=""/>
       <w:lvlJc w:val="left"/>
     </w:lvl>
-    <w:lvl w:ilvl="5" w:tplc="0D640056">
+    <w:lvl w:ilvl="5" w:tplc="8190D128">
       <w:numFmt w:val="decimal"/>
       <w:lvlText w:val=""/>
       <w:lvlJc w:val="left"/>
     </w:lvl>
-    <w:lvl w:ilvl="6" w:tplc="46DCE4EE">
+    <w:lvl w:ilvl="6" w:tplc="6390E8AA">
       <w:numFmt w:val="decimal"/>
       <w:lvlText w:val=""/>
       <w:lvlJc w:val="left"/>
     </w:lvl>
-    <w:lvl w:ilvl="7" w:tplc="2D50CC8E">
+    <w:lvl w:ilvl="7" w:tplc="6F2E9FEA">
       <w:numFmt w:val="decimal"/>
       <w:lvlText w:val=""/>
       <w:lvlJc w:val="left"/>
     </w:lvl>
-    <w:lvl w:ilvl="8" w:tplc="F448114E">
+    <w:lvl w:ilvl="8" w:tplc="85963D38">
       <w:numFmt w:val="decimal"/>
       <w:lvlText w:val=""/>
       <w:lvlJc w:val="left"/>
     </w:lvl>
   </w:abstractNum>
-  <w:num w:numId="1" w16cid:durableId="1155684681">
+  <w:num w:numId="1" w16cid:durableId="1028142968">
+    <w:abstractNumId w:val="11"/>
+    <w:lvlOverride w:ilvl="0">
+      <w:startOverride w:val="1"/>
+    </w:lvlOverride>
+  </w:num>
+  <w:num w:numId="2" w16cid:durableId="788670437">
+    <w:abstractNumId w:val="9"/>
+    <w:lvlOverride w:ilvl="0">
+      <w:startOverride w:val="1"/>
+    </w:lvlOverride>
+  </w:num>
+  <w:num w:numId="3" w16cid:durableId="1020930737">
+    <w:abstractNumId w:val="4"/>
+    <w:lvlOverride w:ilvl="0">
+      <w:startOverride w:val="1"/>
+    </w:lvlOverride>
+  </w:num>
+  <w:num w:numId="4" w16cid:durableId="374429401">
+    <w:abstractNumId w:val="8"/>
+    <w:lvlOverride w:ilvl="0">
+      <w:startOverride w:val="1"/>
+    </w:lvlOverride>
+  </w:num>
+  <w:num w:numId="5" w16cid:durableId="673070772">
+    <w:abstractNumId w:val="6"/>
+    <w:lvlOverride w:ilvl="0">
+      <w:startOverride w:val="1"/>
+    </w:lvlOverride>
+  </w:num>
+  <w:num w:numId="6" w16cid:durableId="1486122148">
     <w:abstractNumId w:val="10"/>
     <w:lvlOverride w:ilvl="0">
       <w:startOverride w:val="1"/>
     </w:lvlOverride>
   </w:num>
-  <w:num w:numId="2" w16cid:durableId="1133988337">
+  <w:num w:numId="7" w16cid:durableId="7877932">
+    <w:abstractNumId w:val="0"/>
+    <w:lvlOverride w:ilvl="0">
+      <w:startOverride w:val="1"/>
+    </w:lvlOverride>
+  </w:num>
+  <w:num w:numId="8" w16cid:durableId="1645696979">
+    <w:abstractNumId w:val="13"/>
+    <w:lvlOverride w:ilvl="0">
+      <w:startOverride w:val="1"/>
+    </w:lvlOverride>
+  </w:num>
+  <w:num w:numId="9" w16cid:durableId="310601574">
+    <w:abstractNumId w:val="3"/>
+    <w:lvlOverride w:ilvl="0">
+      <w:startOverride w:val="1"/>
+    </w:lvlOverride>
+  </w:num>
+  <w:num w:numId="10" w16cid:durableId="2006476256">
+    <w:abstractNumId w:val="14"/>
+    <w:lvlOverride w:ilvl="0">
+      <w:startOverride w:val="1"/>
+    </w:lvlOverride>
+  </w:num>
+  <w:num w:numId="11" w16cid:durableId="383261544">
     <w:abstractNumId w:val="12"/>
     <w:lvlOverride w:ilvl="0">
       <w:startOverride w:val="1"/>
     </w:lvlOverride>
   </w:num>
-  <w:num w:numId="3" w16cid:durableId="372732216">
-    <w:abstractNumId w:val="7"/>
-    <w:lvlOverride w:ilvl="0">
-      <w:startOverride w:val="1"/>
-    </w:lvlOverride>
-  </w:num>
-  <w:num w:numId="4" w16cid:durableId="1977251182">
-    <w:abstractNumId w:val="3"/>
-    <w:lvlOverride w:ilvl="0">
-      <w:startOverride w:val="1"/>
-    </w:lvlOverride>
-  </w:num>
-  <w:num w:numId="5" w16cid:durableId="1903978585">
-    <w:abstractNumId w:val="14"/>
-    <w:lvlOverride w:ilvl="0">
-      <w:startOverride w:val="1"/>
-    </w:lvlOverride>
-  </w:num>
-  <w:num w:numId="6" w16cid:durableId="1029646535">
+  <w:num w:numId="12" w16cid:durableId="2102602284">
     <w:abstractNumId w:val="5"/>
     <w:lvlOverride w:ilvl="0">
       <w:startOverride w:val="1"/>
     </w:lvlOverride>
   </w:num>
-  <w:num w:numId="7" w16cid:durableId="544025264">
-    <w:abstractNumId w:val="0"/>
-    <w:lvlOverride w:ilvl="0">
-      <w:startOverride w:val="1"/>
-    </w:lvlOverride>
-  </w:num>
-  <w:num w:numId="8" w16cid:durableId="310260262">
-    <w:abstractNumId w:val="11"/>
-    <w:lvlOverride w:ilvl="0">
-      <w:startOverride w:val="1"/>
-    </w:lvlOverride>
-  </w:num>
-  <w:num w:numId="9" w16cid:durableId="1374430279">
-    <w:abstractNumId w:val="13"/>
-    <w:lvlOverride w:ilvl="0">
-      <w:startOverride w:val="1"/>
-    </w:lvlOverride>
-  </w:num>
-  <w:num w:numId="10" w16cid:durableId="2002854380">
-    <w:abstractNumId w:val="4"/>
-    <w:lvlOverride w:ilvl="0">
-      <w:startOverride w:val="1"/>
-    </w:lvlOverride>
-  </w:num>
-  <w:num w:numId="11" w16cid:durableId="2070810240">
+  <w:num w:numId="13" w16cid:durableId="1651903151">
     <w:abstractNumId w:val="1"/>
     <w:lvlOverride w:ilvl="0">
       <w:startOverride w:val="1"/>
     </w:lvlOverride>
   </w:num>
-  <w:num w:numId="12" w16cid:durableId="2016154026">
-    <w:abstractNumId w:val="9"/>
-    <w:lvlOverride w:ilvl="0">
-      <w:startOverride w:val="1"/>
-    </w:lvlOverride>
-  </w:num>
-  <w:num w:numId="13" w16cid:durableId="307050990">
+  <w:num w:numId="14" w16cid:durableId="818152633">
     <w:abstractNumId w:val="2"/>
     <w:lvlOverride w:ilvl="0">
       <w:startOverride w:val="1"/>
     </w:lvlOverride>
   </w:num>
-  <w:num w:numId="14" w16cid:durableId="436608397">
-    <w:abstractNumId w:val="8"/>
-    <w:lvlOverride w:ilvl="0">
-      <w:startOverride w:val="1"/>
-    </w:lvlOverride>
-  </w:num>
-  <w:num w:numId="15" w16cid:durableId="400100524">
-    <w:abstractNumId w:val="6"/>
+  <w:num w:numId="15" w16cid:durableId="1403599698">
+    <w:abstractNumId w:val="7"/>
     <w:lvlOverride w:ilvl="0">
       <w:startOverride w:val="1"/>
     </w:lvlOverride>
@@ -52649,7 +52670,7 @@
     <w:autoRedefine/>
     <w:uiPriority w:val="39"/>
     <w:unhideWhenUsed/>
-    <w:rsid w:val="00B63419"/>
+    <w:rsid w:val="001D6DFA"/>
     <w:pPr>
       <w:spacing w:after="100"/>
     </w:pPr>
@@ -52661,7 +52682,7 @@
     <w:autoRedefine/>
     <w:uiPriority w:val="39"/>
     <w:unhideWhenUsed/>
-    <w:rsid w:val="00B63419"/>
+    <w:rsid w:val="001D6DFA"/>
     <w:pPr>
       <w:spacing w:after="100"/>
       <w:ind w:left="210"/>

</xml_diff>

<commit_message>
chore(release): 2.1.0 — the MANAGER role, corrected
MINOR, not MAJOR: the rights the MANAGER loses (data model, custom functions,
data sources) came from a misreading of the role, not a feature anyone
relied on. The 32 role manuals are rebuilt so their covers say 2.1.0.

Co-Authored-By: Claude Opus 5.5 <noreply@anthropic.com>
</commit_message>
<xml_diff>
--- a/discoverer-neo/docs/user-guide/manual/Discoverer-Neo-ADMIN-Guide-Full-en.docx
+++ b/discoverer-neo/docs/user-guide/manual/Discoverer-Neo-ADMIN-Guide-Full-en.docx
@@ -54,7 +54,7 @@
           <w:sz w:val="22"/>
           <w:szCs w:val="22"/>
         </w:rPr>
-        <w:t>Version 2.0.1</w:t>
+        <w:t>Version 2.1.0</w:t>
       </w:r>
     </w:p>
     <w:p>
@@ -74,7 +74,7 @@
     <w:sdt>
       <w:sdtPr>
         <w:alias w:val="Contents"/>
-        <w:id w:val="-1280724178"/>
+        <w:id w:val="1468855827"/>
       </w:sdtPr>
       <w:sdtEndPr/>
       <w:sdtContent>
@@ -102,7 +102,7 @@
           <w:r>
             <w:fldChar w:fldCharType="separate"/>
           </w:r>
-          <w:hyperlink w:anchor="_Toc241691995" w:history="1">
+          <w:hyperlink w:anchor="_Toc241695883" w:history="1">
             <w:r>
               <w:rPr>
                 <w:rStyle w:val="Hiperligao"/>
@@ -126,7 +126,7 @@
               <w:rPr>
                 <w:noProof/>
               </w:rPr>
-              <w:instrText xml:space="preserve"> PAGEREF _Toc241691995 \h </w:instrText>
+              <w:instrText xml:space="preserve"> PAGEREF _Toc241695883 \h </w:instrText>
             </w:r>
             <w:r>
               <w:rPr>
@@ -168,7 +168,7 @@
               <w14:ligatures w14:val="standardContextual"/>
             </w:rPr>
           </w:pPr>
-          <w:hyperlink w:anchor="_Toc241691996" w:history="1">
+          <w:hyperlink w:anchor="_Toc241695884" w:history="1">
             <w:r>
               <w:rPr>
                 <w:rStyle w:val="Hiperligao"/>
@@ -192,7 +192,7 @@
               <w:rPr>
                 <w:noProof/>
               </w:rPr>
-              <w:instrText xml:space="preserve"> PAGEREF _Toc241691996 \h </w:instrText>
+              <w:instrText xml:space="preserve"> PAGEREF _Toc241695884 \h </w:instrText>
             </w:r>
             <w:r>
               <w:rPr>
@@ -234,7 +234,7 @@
               <w14:ligatures w14:val="standardContextual"/>
             </w:rPr>
           </w:pPr>
-          <w:hyperlink w:anchor="_Toc241691997" w:history="1">
+          <w:hyperlink w:anchor="_Toc241695885" w:history="1">
             <w:r>
               <w:rPr>
                 <w:rStyle w:val="Hiperligao"/>
@@ -258,7 +258,7 @@
               <w:rPr>
                 <w:noProof/>
               </w:rPr>
-              <w:instrText xml:space="preserve"> PAGEREF _Toc241691997 \h </w:instrText>
+              <w:instrText xml:space="preserve"> PAGEREF _Toc241695885 \h </w:instrText>
             </w:r>
             <w:r>
               <w:rPr>
@@ -300,7 +300,7 @@
               <w14:ligatures w14:val="standardContextual"/>
             </w:rPr>
           </w:pPr>
-          <w:hyperlink w:anchor="_Toc241691998" w:history="1">
+          <w:hyperlink w:anchor="_Toc241695886" w:history="1">
             <w:r>
               <w:rPr>
                 <w:rStyle w:val="Hiperligao"/>
@@ -324,7 +324,7 @@
               <w:rPr>
                 <w:noProof/>
               </w:rPr>
-              <w:instrText xml:space="preserve"> PAGEREF _Toc241691998 \h </w:instrText>
+              <w:instrText xml:space="preserve"> PAGEREF _Toc241695886 \h </w:instrText>
             </w:r>
             <w:r>
               <w:rPr>
@@ -366,7 +366,7 @@
               <w14:ligatures w14:val="standardContextual"/>
             </w:rPr>
           </w:pPr>
-          <w:hyperlink w:anchor="_Toc241691999" w:history="1">
+          <w:hyperlink w:anchor="_Toc241695887" w:history="1">
             <w:r>
               <w:rPr>
                 <w:rStyle w:val="Hiperligao"/>
@@ -390,7 +390,7 @@
               <w:rPr>
                 <w:noProof/>
               </w:rPr>
-              <w:instrText xml:space="preserve"> PAGEREF _Toc241691999 \h </w:instrText>
+              <w:instrText xml:space="preserve"> PAGEREF _Toc241695887 \h </w:instrText>
             </w:r>
             <w:r>
               <w:rPr>
@@ -432,7 +432,7 @@
               <w14:ligatures w14:val="standardContextual"/>
             </w:rPr>
           </w:pPr>
-          <w:hyperlink w:anchor="_Toc241692000" w:history="1">
+          <w:hyperlink w:anchor="_Toc241695888" w:history="1">
             <w:r>
               <w:rPr>
                 <w:rStyle w:val="Hiperligao"/>
@@ -456,7 +456,7 @@
               <w:rPr>
                 <w:noProof/>
               </w:rPr>
-              <w:instrText xml:space="preserve"> PAGEREF _Toc241692000 \h </w:instrText>
+              <w:instrText xml:space="preserve"> PAGEREF _Toc241695888 \h </w:instrText>
             </w:r>
             <w:r>
               <w:rPr>
@@ -498,7 +498,7 @@
               <w14:ligatures w14:val="standardContextual"/>
             </w:rPr>
           </w:pPr>
-          <w:hyperlink w:anchor="_Toc241692001" w:history="1">
+          <w:hyperlink w:anchor="_Toc241695889" w:history="1">
             <w:r>
               <w:rPr>
                 <w:rStyle w:val="Hiperligao"/>
@@ -522,7 +522,7 @@
               <w:rPr>
                 <w:noProof/>
               </w:rPr>
-              <w:instrText xml:space="preserve"> PAGEREF _Toc241692001 \h </w:instrText>
+              <w:instrText xml:space="preserve"> PAGEREF _Toc241695889 \h </w:instrText>
             </w:r>
             <w:r>
               <w:rPr>
@@ -564,7 +564,7 @@
               <w14:ligatures w14:val="standardContextual"/>
             </w:rPr>
           </w:pPr>
-          <w:hyperlink w:anchor="_Toc241692002" w:history="1">
+          <w:hyperlink w:anchor="_Toc241695890" w:history="1">
             <w:r>
               <w:rPr>
                 <w:rStyle w:val="Hiperligao"/>
@@ -588,7 +588,7 @@
               <w:rPr>
                 <w:noProof/>
               </w:rPr>
-              <w:instrText xml:space="preserve"> PAGEREF _Toc241692002 \h </w:instrText>
+              <w:instrText xml:space="preserve"> PAGEREF _Toc241695890 \h </w:instrText>
             </w:r>
             <w:r>
               <w:rPr>
@@ -630,7 +630,7 @@
               <w14:ligatures w14:val="standardContextual"/>
             </w:rPr>
           </w:pPr>
-          <w:hyperlink w:anchor="_Toc241692003" w:history="1">
+          <w:hyperlink w:anchor="_Toc241695891" w:history="1">
             <w:r>
               <w:rPr>
                 <w:rStyle w:val="Hiperligao"/>
@@ -654,7 +654,7 @@
               <w:rPr>
                 <w:noProof/>
               </w:rPr>
-              <w:instrText xml:space="preserve"> PAGEREF _Toc241692003 \h </w:instrText>
+              <w:instrText xml:space="preserve"> PAGEREF _Toc241695891 \h </w:instrText>
             </w:r>
             <w:r>
               <w:rPr>
@@ -696,7 +696,7 @@
               <w14:ligatures w14:val="standardContextual"/>
             </w:rPr>
           </w:pPr>
-          <w:hyperlink w:anchor="_Toc241692004" w:history="1">
+          <w:hyperlink w:anchor="_Toc241695892" w:history="1">
             <w:r>
               <w:rPr>
                 <w:rStyle w:val="Hiperligao"/>
@@ -720,7 +720,7 @@
               <w:rPr>
                 <w:noProof/>
               </w:rPr>
-              <w:instrText xml:space="preserve"> PAGEREF _Toc241692004 \h </w:instrText>
+              <w:instrText xml:space="preserve"> PAGEREF _Toc241695892 \h </w:instrText>
             </w:r>
             <w:r>
               <w:rPr>
@@ -762,7 +762,7 @@
               <w14:ligatures w14:val="standardContextual"/>
             </w:rPr>
           </w:pPr>
-          <w:hyperlink w:anchor="_Toc241692005" w:history="1">
+          <w:hyperlink w:anchor="_Toc241695893" w:history="1">
             <w:r>
               <w:rPr>
                 <w:rStyle w:val="Hiperligao"/>
@@ -786,7 +786,7 @@
               <w:rPr>
                 <w:noProof/>
               </w:rPr>
-              <w:instrText xml:space="preserve"> PAGEREF _Toc241692005 \h </w:instrText>
+              <w:instrText xml:space="preserve"> PAGEREF _Toc241695893 \h </w:instrText>
             </w:r>
             <w:r>
               <w:rPr>
@@ -828,7 +828,7 @@
               <w14:ligatures w14:val="standardContextual"/>
             </w:rPr>
           </w:pPr>
-          <w:hyperlink w:anchor="_Toc241692006" w:history="1">
+          <w:hyperlink w:anchor="_Toc241695894" w:history="1">
             <w:r>
               <w:rPr>
                 <w:rStyle w:val="Hiperligao"/>
@@ -852,7 +852,7 @@
               <w:rPr>
                 <w:noProof/>
               </w:rPr>
-              <w:instrText xml:space="preserve"> PAGEREF _Toc241692006 \h </w:instrText>
+              <w:instrText xml:space="preserve"> PAGEREF _Toc241695894 \h </w:instrText>
             </w:r>
             <w:r>
               <w:rPr>
@@ -894,7 +894,7 @@
               <w14:ligatures w14:val="standardContextual"/>
             </w:rPr>
           </w:pPr>
-          <w:hyperlink w:anchor="_Toc241692007" w:history="1">
+          <w:hyperlink w:anchor="_Toc241695895" w:history="1">
             <w:r>
               <w:rPr>
                 <w:rStyle w:val="Hiperligao"/>
@@ -918,7 +918,7 @@
               <w:rPr>
                 <w:noProof/>
               </w:rPr>
-              <w:instrText xml:space="preserve"> PAGEREF _Toc241692007 \h </w:instrText>
+              <w:instrText xml:space="preserve"> PAGEREF _Toc241695895 \h </w:instrText>
             </w:r>
             <w:r>
               <w:rPr>
@@ -960,7 +960,7 @@
               <w14:ligatures w14:val="standardContextual"/>
             </w:rPr>
           </w:pPr>
-          <w:hyperlink w:anchor="_Toc241692008" w:history="1">
+          <w:hyperlink w:anchor="_Toc241695896" w:history="1">
             <w:r>
               <w:rPr>
                 <w:rStyle w:val="Hiperligao"/>
@@ -984,7 +984,7 @@
               <w:rPr>
                 <w:noProof/>
               </w:rPr>
-              <w:instrText xml:space="preserve"> PAGEREF _Toc241692008 \h </w:instrText>
+              <w:instrText xml:space="preserve"> PAGEREF _Toc241695896 \h </w:instrText>
             </w:r>
             <w:r>
               <w:rPr>
@@ -1026,7 +1026,7 @@
               <w14:ligatures w14:val="standardContextual"/>
             </w:rPr>
           </w:pPr>
-          <w:hyperlink w:anchor="_Toc241692009" w:history="1">
+          <w:hyperlink w:anchor="_Toc241695897" w:history="1">
             <w:r>
               <w:rPr>
                 <w:rStyle w:val="Hiperligao"/>
@@ -1050,7 +1050,7 @@
               <w:rPr>
                 <w:noProof/>
               </w:rPr>
-              <w:instrText xml:space="preserve"> PAGEREF _Toc241692009 \h </w:instrText>
+              <w:instrText xml:space="preserve"> PAGEREF _Toc241695897 \h </w:instrText>
             </w:r>
             <w:r>
               <w:rPr>
@@ -1092,7 +1092,7 @@
               <w14:ligatures w14:val="standardContextual"/>
             </w:rPr>
           </w:pPr>
-          <w:hyperlink w:anchor="_Toc241692010" w:history="1">
+          <w:hyperlink w:anchor="_Toc241695898" w:history="1">
             <w:r>
               <w:rPr>
                 <w:rStyle w:val="Hiperligao"/>
@@ -1116,7 +1116,7 @@
               <w:rPr>
                 <w:noProof/>
               </w:rPr>
-              <w:instrText xml:space="preserve"> PAGEREF _Toc241692010 \h </w:instrText>
+              <w:instrText xml:space="preserve"> PAGEREF _Toc241695898 \h </w:instrText>
             </w:r>
             <w:r>
               <w:rPr>
@@ -1158,7 +1158,7 @@
               <w14:ligatures w14:val="standardContextual"/>
             </w:rPr>
           </w:pPr>
-          <w:hyperlink w:anchor="_Toc241692011" w:history="1">
+          <w:hyperlink w:anchor="_Toc241695899" w:history="1">
             <w:r>
               <w:rPr>
                 <w:rStyle w:val="Hiperligao"/>
@@ -1182,7 +1182,7 @@
               <w:rPr>
                 <w:noProof/>
               </w:rPr>
-              <w:instrText xml:space="preserve"> PAGEREF _Toc241692011 \h </w:instrText>
+              <w:instrText xml:space="preserve"> PAGEREF _Toc241695899 \h </w:instrText>
             </w:r>
             <w:r>
               <w:rPr>
@@ -1224,7 +1224,7 @@
               <w14:ligatures w14:val="standardContextual"/>
             </w:rPr>
           </w:pPr>
-          <w:hyperlink w:anchor="_Toc241692012" w:history="1">
+          <w:hyperlink w:anchor="_Toc241695900" w:history="1">
             <w:r>
               <w:rPr>
                 <w:rStyle w:val="Hiperligao"/>
@@ -1248,7 +1248,7 @@
               <w:rPr>
                 <w:noProof/>
               </w:rPr>
-              <w:instrText xml:space="preserve"> PAGEREF _Toc241692012 \h </w:instrText>
+              <w:instrText xml:space="preserve"> PAGEREF _Toc241695900 \h </w:instrText>
             </w:r>
             <w:r>
               <w:rPr>
@@ -1290,7 +1290,7 @@
               <w14:ligatures w14:val="standardContextual"/>
             </w:rPr>
           </w:pPr>
-          <w:hyperlink w:anchor="_Toc241692013" w:history="1">
+          <w:hyperlink w:anchor="_Toc241695901" w:history="1">
             <w:r>
               <w:rPr>
                 <w:rStyle w:val="Hiperligao"/>
@@ -1314,7 +1314,7 @@
               <w:rPr>
                 <w:noProof/>
               </w:rPr>
-              <w:instrText xml:space="preserve"> PAGEREF _Toc241692013 \h </w:instrText>
+              <w:instrText xml:space="preserve"> PAGEREF _Toc241695901 \h </w:instrText>
             </w:r>
             <w:r>
               <w:rPr>
@@ -1356,7 +1356,7 @@
               <w14:ligatures w14:val="standardContextual"/>
             </w:rPr>
           </w:pPr>
-          <w:hyperlink w:anchor="_Toc241692014" w:history="1">
+          <w:hyperlink w:anchor="_Toc241695902" w:history="1">
             <w:r>
               <w:rPr>
                 <w:rStyle w:val="Hiperligao"/>
@@ -1380,7 +1380,7 @@
               <w:rPr>
                 <w:noProof/>
               </w:rPr>
-              <w:instrText xml:space="preserve"> PAGEREF _Toc241692014 \h </w:instrText>
+              <w:instrText xml:space="preserve"> PAGEREF _Toc241695902 \h </w:instrText>
             </w:r>
             <w:r>
               <w:rPr>
@@ -1422,7 +1422,7 @@
               <w14:ligatures w14:val="standardContextual"/>
             </w:rPr>
           </w:pPr>
-          <w:hyperlink w:anchor="_Toc241692015" w:history="1">
+          <w:hyperlink w:anchor="_Toc241695903" w:history="1">
             <w:r>
               <w:rPr>
                 <w:rStyle w:val="Hiperligao"/>
@@ -1446,7 +1446,7 @@
               <w:rPr>
                 <w:noProof/>
               </w:rPr>
-              <w:instrText xml:space="preserve"> PAGEREF _Toc241692015 \h </w:instrText>
+              <w:instrText xml:space="preserve"> PAGEREF _Toc241695903 \h </w:instrText>
             </w:r>
             <w:r>
               <w:rPr>
@@ -1488,7 +1488,7 @@
               <w14:ligatures w14:val="standardContextual"/>
             </w:rPr>
           </w:pPr>
-          <w:hyperlink w:anchor="_Toc241692016" w:history="1">
+          <w:hyperlink w:anchor="_Toc241695904" w:history="1">
             <w:r>
               <w:rPr>
                 <w:rStyle w:val="Hiperligao"/>
@@ -1512,7 +1512,7 @@
               <w:rPr>
                 <w:noProof/>
               </w:rPr>
-              <w:instrText xml:space="preserve"> PAGEREF _Toc241692016 \h </w:instrText>
+              <w:instrText xml:space="preserve"> PAGEREF _Toc241695904 \h </w:instrText>
             </w:r>
             <w:r>
               <w:rPr>
@@ -1554,7 +1554,7 @@
               <w14:ligatures w14:val="standardContextual"/>
             </w:rPr>
           </w:pPr>
-          <w:hyperlink w:anchor="_Toc241692017" w:history="1">
+          <w:hyperlink w:anchor="_Toc241695905" w:history="1">
             <w:r>
               <w:rPr>
                 <w:rStyle w:val="Hiperligao"/>
@@ -1578,7 +1578,7 @@
               <w:rPr>
                 <w:noProof/>
               </w:rPr>
-              <w:instrText xml:space="preserve"> PAGEREF _Toc241692017 \h </w:instrText>
+              <w:instrText xml:space="preserve"> PAGEREF _Toc241695905 \h </w:instrText>
             </w:r>
             <w:r>
               <w:rPr>
@@ -1620,7 +1620,7 @@
               <w14:ligatures w14:val="standardContextual"/>
             </w:rPr>
           </w:pPr>
-          <w:hyperlink w:anchor="_Toc241692018" w:history="1">
+          <w:hyperlink w:anchor="_Toc241695906" w:history="1">
             <w:r>
               <w:rPr>
                 <w:rStyle w:val="Hiperligao"/>
@@ -1644,7 +1644,7 @@
               <w:rPr>
                 <w:noProof/>
               </w:rPr>
-              <w:instrText xml:space="preserve"> PAGEREF _Toc241692018 \h </w:instrText>
+              <w:instrText xml:space="preserve"> PAGEREF _Toc241695906 \h </w:instrText>
             </w:r>
             <w:r>
               <w:rPr>
@@ -1686,7 +1686,7 @@
               <w14:ligatures w14:val="standardContextual"/>
             </w:rPr>
           </w:pPr>
-          <w:hyperlink w:anchor="_Toc241692019" w:history="1">
+          <w:hyperlink w:anchor="_Toc241695907" w:history="1">
             <w:r>
               <w:rPr>
                 <w:rStyle w:val="Hiperligao"/>
@@ -1710,7 +1710,7 @@
               <w:rPr>
                 <w:noProof/>
               </w:rPr>
-              <w:instrText xml:space="preserve"> PAGEREF _Toc241692019 \h </w:instrText>
+              <w:instrText xml:space="preserve"> PAGEREF _Toc241695907 \h </w:instrText>
             </w:r>
             <w:r>
               <w:rPr>
@@ -1752,7 +1752,7 @@
               <w14:ligatures w14:val="standardContextual"/>
             </w:rPr>
           </w:pPr>
-          <w:hyperlink w:anchor="_Toc241692020" w:history="1">
+          <w:hyperlink w:anchor="_Toc241695908" w:history="1">
             <w:r>
               <w:rPr>
                 <w:rStyle w:val="Hiperligao"/>
@@ -1776,7 +1776,7 @@
               <w:rPr>
                 <w:noProof/>
               </w:rPr>
-              <w:instrText xml:space="preserve"> PAGEREF _Toc241692020 \h </w:instrText>
+              <w:instrText xml:space="preserve"> PAGEREF _Toc241695908 \h </w:instrText>
             </w:r>
             <w:r>
               <w:rPr>
@@ -1818,7 +1818,7 @@
               <w14:ligatures w14:val="standardContextual"/>
             </w:rPr>
           </w:pPr>
-          <w:hyperlink w:anchor="_Toc241692021" w:history="1">
+          <w:hyperlink w:anchor="_Toc241695909" w:history="1">
             <w:r>
               <w:rPr>
                 <w:rStyle w:val="Hiperligao"/>
@@ -1842,7 +1842,7 @@
               <w:rPr>
                 <w:noProof/>
               </w:rPr>
-              <w:instrText xml:space="preserve"> PAGEREF _Toc241692021 \h </w:instrText>
+              <w:instrText xml:space="preserve"> PAGEREF _Toc241695909 \h </w:instrText>
             </w:r>
             <w:r>
               <w:rPr>
@@ -1884,7 +1884,7 @@
               <w14:ligatures w14:val="standardContextual"/>
             </w:rPr>
           </w:pPr>
-          <w:hyperlink w:anchor="_Toc241692022" w:history="1">
+          <w:hyperlink w:anchor="_Toc241695910" w:history="1">
             <w:r>
               <w:rPr>
                 <w:rStyle w:val="Hiperligao"/>
@@ -1908,7 +1908,7 @@
               <w:rPr>
                 <w:noProof/>
               </w:rPr>
-              <w:instrText xml:space="preserve"> PAGEREF _Toc241692022 \h </w:instrText>
+              <w:instrText xml:space="preserve"> PAGEREF _Toc241695910 \h </w:instrText>
             </w:r>
             <w:r>
               <w:rPr>
@@ -1950,7 +1950,7 @@
               <w14:ligatures w14:val="standardContextual"/>
             </w:rPr>
           </w:pPr>
-          <w:hyperlink w:anchor="_Toc241692023" w:history="1">
+          <w:hyperlink w:anchor="_Toc241695911" w:history="1">
             <w:r>
               <w:rPr>
                 <w:rStyle w:val="Hiperligao"/>
@@ -1974,7 +1974,7 @@
               <w:rPr>
                 <w:noProof/>
               </w:rPr>
-              <w:instrText xml:space="preserve"> PAGEREF _Toc241692023 \h </w:instrText>
+              <w:instrText xml:space="preserve"> PAGEREF _Toc241695911 \h </w:instrText>
             </w:r>
             <w:r>
               <w:rPr>
@@ -2016,7 +2016,7 @@
               <w14:ligatures w14:val="standardContextual"/>
             </w:rPr>
           </w:pPr>
-          <w:hyperlink w:anchor="_Toc241692024" w:history="1">
+          <w:hyperlink w:anchor="_Toc241695912" w:history="1">
             <w:r>
               <w:rPr>
                 <w:rStyle w:val="Hiperligao"/>
@@ -2040,7 +2040,7 @@
               <w:rPr>
                 <w:noProof/>
               </w:rPr>
-              <w:instrText xml:space="preserve"> PAGEREF _Toc241692024 \h </w:instrText>
+              <w:instrText xml:space="preserve"> PAGEREF _Toc241695912 \h </w:instrText>
             </w:r>
             <w:r>
               <w:rPr>
@@ -2082,7 +2082,7 @@
               <w14:ligatures w14:val="standardContextual"/>
             </w:rPr>
           </w:pPr>
-          <w:hyperlink w:anchor="_Toc241692025" w:history="1">
+          <w:hyperlink w:anchor="_Toc241695913" w:history="1">
             <w:r>
               <w:rPr>
                 <w:rStyle w:val="Hiperligao"/>
@@ -2106,7 +2106,7 @@
               <w:rPr>
                 <w:noProof/>
               </w:rPr>
-              <w:instrText xml:space="preserve"> PAGEREF _Toc241692025 \h </w:instrText>
+              <w:instrText xml:space="preserve"> PAGEREF _Toc241695913 \h </w:instrText>
             </w:r>
             <w:r>
               <w:rPr>
@@ -2148,7 +2148,7 @@
               <w14:ligatures w14:val="standardContextual"/>
             </w:rPr>
           </w:pPr>
-          <w:hyperlink w:anchor="_Toc241692026" w:history="1">
+          <w:hyperlink w:anchor="_Toc241695914" w:history="1">
             <w:r>
               <w:rPr>
                 <w:rStyle w:val="Hiperligao"/>
@@ -2172,7 +2172,7 @@
               <w:rPr>
                 <w:noProof/>
               </w:rPr>
-              <w:instrText xml:space="preserve"> PAGEREF _Toc241692026 \h </w:instrText>
+              <w:instrText xml:space="preserve"> PAGEREF _Toc241695914 \h </w:instrText>
             </w:r>
             <w:r>
               <w:rPr>
@@ -2214,7 +2214,7 @@
               <w14:ligatures w14:val="standardContextual"/>
             </w:rPr>
           </w:pPr>
-          <w:hyperlink w:anchor="_Toc241692027" w:history="1">
+          <w:hyperlink w:anchor="_Toc241695915" w:history="1">
             <w:r>
               <w:rPr>
                 <w:rStyle w:val="Hiperligao"/>
@@ -2238,7 +2238,7 @@
               <w:rPr>
                 <w:noProof/>
               </w:rPr>
-              <w:instrText xml:space="preserve"> PAGEREF _Toc241692027 \h </w:instrText>
+              <w:instrText xml:space="preserve"> PAGEREF _Toc241695915 \h </w:instrText>
             </w:r>
             <w:r>
               <w:rPr>
@@ -2280,7 +2280,7 @@
               <w14:ligatures w14:val="standardContextual"/>
             </w:rPr>
           </w:pPr>
-          <w:hyperlink w:anchor="_Toc241692028" w:history="1">
+          <w:hyperlink w:anchor="_Toc241695916" w:history="1">
             <w:r>
               <w:rPr>
                 <w:rStyle w:val="Hiperligao"/>
@@ -2304,7 +2304,7 @@
               <w:rPr>
                 <w:noProof/>
               </w:rPr>
-              <w:instrText xml:space="preserve"> PAGEREF _Toc241692028 \h </w:instrText>
+              <w:instrText xml:space="preserve"> PAGEREF _Toc241695916 \h </w:instrText>
             </w:r>
             <w:r>
               <w:rPr>
@@ -2346,7 +2346,7 @@
               <w14:ligatures w14:val="standardContextual"/>
             </w:rPr>
           </w:pPr>
-          <w:hyperlink w:anchor="_Toc241692029" w:history="1">
+          <w:hyperlink w:anchor="_Toc241695917" w:history="1">
             <w:r>
               <w:rPr>
                 <w:rStyle w:val="Hiperligao"/>
@@ -2370,7 +2370,7 @@
               <w:rPr>
                 <w:noProof/>
               </w:rPr>
-              <w:instrText xml:space="preserve"> PAGEREF _Toc241692029 \h </w:instrText>
+              <w:instrText xml:space="preserve"> PAGEREF _Toc241695917 \h </w:instrText>
             </w:r>
             <w:r>
               <w:rPr>
@@ -2412,7 +2412,7 @@
               <w14:ligatures w14:val="standardContextual"/>
             </w:rPr>
           </w:pPr>
-          <w:hyperlink w:anchor="_Toc241692030" w:history="1">
+          <w:hyperlink w:anchor="_Toc241695918" w:history="1">
             <w:r>
               <w:rPr>
                 <w:rStyle w:val="Hiperligao"/>
@@ -2436,7 +2436,7 @@
               <w:rPr>
                 <w:noProof/>
               </w:rPr>
-              <w:instrText xml:space="preserve"> PAGEREF _Toc241692030 \h </w:instrText>
+              <w:instrText xml:space="preserve"> PAGEREF _Toc241695918 \h </w:instrText>
             </w:r>
             <w:r>
               <w:rPr>
@@ -2478,7 +2478,7 @@
               <w14:ligatures w14:val="standardContextual"/>
             </w:rPr>
           </w:pPr>
-          <w:hyperlink w:anchor="_Toc241692031" w:history="1">
+          <w:hyperlink w:anchor="_Toc241695919" w:history="1">
             <w:r>
               <w:rPr>
                 <w:rStyle w:val="Hiperligao"/>
@@ -2502,7 +2502,7 @@
               <w:rPr>
                 <w:noProof/>
               </w:rPr>
-              <w:instrText xml:space="preserve"> PAGEREF _Toc241692031 \h </w:instrText>
+              <w:instrText xml:space="preserve"> PAGEREF _Toc241695919 \h </w:instrText>
             </w:r>
             <w:r>
               <w:rPr>
@@ -2544,7 +2544,7 @@
               <w14:ligatures w14:val="standardContextual"/>
             </w:rPr>
           </w:pPr>
-          <w:hyperlink w:anchor="_Toc241692032" w:history="1">
+          <w:hyperlink w:anchor="_Toc241695920" w:history="1">
             <w:r>
               <w:rPr>
                 <w:rStyle w:val="Hiperligao"/>
@@ -2568,7 +2568,7 @@
               <w:rPr>
                 <w:noProof/>
               </w:rPr>
-              <w:instrText xml:space="preserve"> PAGEREF _Toc241692032 \h </w:instrText>
+              <w:instrText xml:space="preserve"> PAGEREF _Toc241695920 \h </w:instrText>
             </w:r>
             <w:r>
               <w:rPr>
@@ -2610,7 +2610,7 @@
               <w14:ligatures w14:val="standardContextual"/>
             </w:rPr>
           </w:pPr>
-          <w:hyperlink w:anchor="_Toc241692033" w:history="1">
+          <w:hyperlink w:anchor="_Toc241695921" w:history="1">
             <w:r>
               <w:rPr>
                 <w:rStyle w:val="Hiperligao"/>
@@ -2634,7 +2634,7 @@
               <w:rPr>
                 <w:noProof/>
               </w:rPr>
-              <w:instrText xml:space="preserve"> PAGEREF _Toc241692033 \h </w:instrText>
+              <w:instrText xml:space="preserve"> PAGEREF _Toc241695921 \h </w:instrText>
             </w:r>
             <w:r>
               <w:rPr>
@@ -2676,7 +2676,7 @@
               <w14:ligatures w14:val="standardContextual"/>
             </w:rPr>
           </w:pPr>
-          <w:hyperlink w:anchor="_Toc241692034" w:history="1">
+          <w:hyperlink w:anchor="_Toc241695922" w:history="1">
             <w:r>
               <w:rPr>
                 <w:rStyle w:val="Hiperligao"/>
@@ -2700,7 +2700,7 @@
               <w:rPr>
                 <w:noProof/>
               </w:rPr>
-              <w:instrText xml:space="preserve"> PAGEREF _Toc241692034 \h </w:instrText>
+              <w:instrText xml:space="preserve"> PAGEREF _Toc241695922 \h </w:instrText>
             </w:r>
             <w:r>
               <w:rPr>
@@ -2742,7 +2742,7 @@
               <w14:ligatures w14:val="standardContextual"/>
             </w:rPr>
           </w:pPr>
-          <w:hyperlink w:anchor="_Toc241692035" w:history="1">
+          <w:hyperlink w:anchor="_Toc241695923" w:history="1">
             <w:r>
               <w:rPr>
                 <w:rStyle w:val="Hiperligao"/>
@@ -2766,7 +2766,7 @@
               <w:rPr>
                 <w:noProof/>
               </w:rPr>
-              <w:instrText xml:space="preserve"> PAGEREF _Toc241692035 \h </w:instrText>
+              <w:instrText xml:space="preserve"> PAGEREF _Toc241695923 \h </w:instrText>
             </w:r>
             <w:r>
               <w:rPr>
@@ -2808,7 +2808,7 @@
               <w14:ligatures w14:val="standardContextual"/>
             </w:rPr>
           </w:pPr>
-          <w:hyperlink w:anchor="_Toc241692036" w:history="1">
+          <w:hyperlink w:anchor="_Toc241695924" w:history="1">
             <w:r>
               <w:rPr>
                 <w:rStyle w:val="Hiperligao"/>
@@ -2832,7 +2832,7 @@
               <w:rPr>
                 <w:noProof/>
               </w:rPr>
-              <w:instrText xml:space="preserve"> PAGEREF _Toc241692036 \h </w:instrText>
+              <w:instrText xml:space="preserve"> PAGEREF _Toc241695924 \h </w:instrText>
             </w:r>
             <w:r>
               <w:rPr>
@@ -2874,7 +2874,7 @@
               <w14:ligatures w14:val="standardContextual"/>
             </w:rPr>
           </w:pPr>
-          <w:hyperlink w:anchor="_Toc241692037" w:history="1">
+          <w:hyperlink w:anchor="_Toc241695925" w:history="1">
             <w:r>
               <w:rPr>
                 <w:rStyle w:val="Hiperligao"/>
@@ -2898,7 +2898,7 @@
               <w:rPr>
                 <w:noProof/>
               </w:rPr>
-              <w:instrText xml:space="preserve"> PAGEREF _Toc241692037 \h </w:instrText>
+              <w:instrText xml:space="preserve"> PAGEREF _Toc241695925 \h </w:instrText>
             </w:r>
             <w:r>
               <w:rPr>
@@ -2940,7 +2940,7 @@
               <w14:ligatures w14:val="standardContextual"/>
             </w:rPr>
           </w:pPr>
-          <w:hyperlink w:anchor="_Toc241692038" w:history="1">
+          <w:hyperlink w:anchor="_Toc241695926" w:history="1">
             <w:r>
               <w:rPr>
                 <w:rStyle w:val="Hiperligao"/>
@@ -2964,7 +2964,7 @@
               <w:rPr>
                 <w:noProof/>
               </w:rPr>
-              <w:instrText xml:space="preserve"> PAGEREF _Toc241692038 \h </w:instrText>
+              <w:instrText xml:space="preserve"> PAGEREF _Toc241695926 \h </w:instrText>
             </w:r>
             <w:r>
               <w:rPr>
@@ -3006,7 +3006,7 @@
               <w14:ligatures w14:val="standardContextual"/>
             </w:rPr>
           </w:pPr>
-          <w:hyperlink w:anchor="_Toc241692039" w:history="1">
+          <w:hyperlink w:anchor="_Toc241695927" w:history="1">
             <w:r>
               <w:rPr>
                 <w:rStyle w:val="Hiperligao"/>
@@ -3030,7 +3030,7 @@
               <w:rPr>
                 <w:noProof/>
               </w:rPr>
-              <w:instrText xml:space="preserve"> PAGEREF _Toc241692039 \h </w:instrText>
+              <w:instrText xml:space="preserve"> PAGEREF _Toc241695927 \h </w:instrText>
             </w:r>
             <w:r>
               <w:rPr>
@@ -3072,7 +3072,7 @@
               <w14:ligatures w14:val="standardContextual"/>
             </w:rPr>
           </w:pPr>
-          <w:hyperlink w:anchor="_Toc241692040" w:history="1">
+          <w:hyperlink w:anchor="_Toc241695928" w:history="1">
             <w:r>
               <w:rPr>
                 <w:rStyle w:val="Hiperligao"/>
@@ -3096,7 +3096,7 @@
               <w:rPr>
                 <w:noProof/>
               </w:rPr>
-              <w:instrText xml:space="preserve"> PAGEREF _Toc241692040 \h </w:instrText>
+              <w:instrText xml:space="preserve"> PAGEREF _Toc241695928 \h </w:instrText>
             </w:r>
             <w:r>
               <w:rPr>
@@ -3138,7 +3138,7 @@
               <w14:ligatures w14:val="standardContextual"/>
             </w:rPr>
           </w:pPr>
-          <w:hyperlink w:anchor="_Toc241692041" w:history="1">
+          <w:hyperlink w:anchor="_Toc241695929" w:history="1">
             <w:r>
               <w:rPr>
                 <w:rStyle w:val="Hiperligao"/>
@@ -3162,7 +3162,7 @@
               <w:rPr>
                 <w:noProof/>
               </w:rPr>
-              <w:instrText xml:space="preserve"> PAGEREF _Toc241692041 \h </w:instrText>
+              <w:instrText xml:space="preserve"> PAGEREF _Toc241695929 \h </w:instrText>
             </w:r>
             <w:r>
               <w:rPr>
@@ -3204,7 +3204,7 @@
               <w14:ligatures w14:val="standardContextual"/>
             </w:rPr>
           </w:pPr>
-          <w:hyperlink w:anchor="_Toc241692042" w:history="1">
+          <w:hyperlink w:anchor="_Toc241695930" w:history="1">
             <w:r>
               <w:rPr>
                 <w:rStyle w:val="Hiperligao"/>
@@ -3228,7 +3228,7 @@
               <w:rPr>
                 <w:noProof/>
               </w:rPr>
-              <w:instrText xml:space="preserve"> PAGEREF _Toc241692042 \h </w:instrText>
+              <w:instrText xml:space="preserve"> PAGEREF _Toc241695930 \h </w:instrText>
             </w:r>
             <w:r>
               <w:rPr>
@@ -3270,7 +3270,7 @@
               <w14:ligatures w14:val="standardContextual"/>
             </w:rPr>
           </w:pPr>
-          <w:hyperlink w:anchor="_Toc241692043" w:history="1">
+          <w:hyperlink w:anchor="_Toc241695931" w:history="1">
             <w:r>
               <w:rPr>
                 <w:rStyle w:val="Hiperligao"/>
@@ -3294,7 +3294,7 @@
               <w:rPr>
                 <w:noProof/>
               </w:rPr>
-              <w:instrText xml:space="preserve"> PAGEREF _Toc241692043 \h </w:instrText>
+              <w:instrText xml:space="preserve"> PAGEREF _Toc241695931 \h </w:instrText>
             </w:r>
             <w:r>
               <w:rPr>
@@ -3336,7 +3336,7 @@
               <w14:ligatures w14:val="standardContextual"/>
             </w:rPr>
           </w:pPr>
-          <w:hyperlink w:anchor="_Toc241692044" w:history="1">
+          <w:hyperlink w:anchor="_Toc241695932" w:history="1">
             <w:r>
               <w:rPr>
                 <w:rStyle w:val="Hiperligao"/>
@@ -3360,7 +3360,7 @@
               <w:rPr>
                 <w:noProof/>
               </w:rPr>
-              <w:instrText xml:space="preserve"> PAGEREF _Toc241692044 \h </w:instrText>
+              <w:instrText xml:space="preserve"> PAGEREF _Toc241695932 \h </w:instrText>
             </w:r>
             <w:r>
               <w:rPr>
@@ -3402,7 +3402,7 @@
               <w14:ligatures w14:val="standardContextual"/>
             </w:rPr>
           </w:pPr>
-          <w:hyperlink w:anchor="_Toc241692045" w:history="1">
+          <w:hyperlink w:anchor="_Toc241695933" w:history="1">
             <w:r>
               <w:rPr>
                 <w:rStyle w:val="Hiperligao"/>
@@ -3426,7 +3426,7 @@
               <w:rPr>
                 <w:noProof/>
               </w:rPr>
-              <w:instrText xml:space="preserve"> PAGEREF _Toc241692045 \h </w:instrText>
+              <w:instrText xml:space="preserve"> PAGEREF _Toc241695933 \h </w:instrText>
             </w:r>
             <w:r>
               <w:rPr>
@@ -3468,7 +3468,7 @@
               <w14:ligatures w14:val="standardContextual"/>
             </w:rPr>
           </w:pPr>
-          <w:hyperlink w:anchor="_Toc241692046" w:history="1">
+          <w:hyperlink w:anchor="_Toc241695934" w:history="1">
             <w:r>
               <w:rPr>
                 <w:rStyle w:val="Hiperligao"/>
@@ -3492,7 +3492,7 @@
               <w:rPr>
                 <w:noProof/>
               </w:rPr>
-              <w:instrText xml:space="preserve"> PAGEREF _Toc241692046 \h </w:instrText>
+              <w:instrText xml:space="preserve"> PAGEREF _Toc241695934 \h </w:instrText>
             </w:r>
             <w:r>
               <w:rPr>
@@ -3534,7 +3534,7 @@
               <w14:ligatures w14:val="standardContextual"/>
             </w:rPr>
           </w:pPr>
-          <w:hyperlink w:anchor="_Toc241692047" w:history="1">
+          <w:hyperlink w:anchor="_Toc241695935" w:history="1">
             <w:r>
               <w:rPr>
                 <w:rStyle w:val="Hiperligao"/>
@@ -3558,7 +3558,7 @@
               <w:rPr>
                 <w:noProof/>
               </w:rPr>
-              <w:instrText xml:space="preserve"> PAGEREF _Toc241692047 \h </w:instrText>
+              <w:instrText xml:space="preserve"> PAGEREF _Toc241695935 \h </w:instrText>
             </w:r>
             <w:r>
               <w:rPr>
@@ -3600,7 +3600,7 @@
               <w14:ligatures w14:val="standardContextual"/>
             </w:rPr>
           </w:pPr>
-          <w:hyperlink w:anchor="_Toc241692048" w:history="1">
+          <w:hyperlink w:anchor="_Toc241695936" w:history="1">
             <w:r>
               <w:rPr>
                 <w:rStyle w:val="Hiperligao"/>
@@ -3624,7 +3624,7 @@
               <w:rPr>
                 <w:noProof/>
               </w:rPr>
-              <w:instrText xml:space="preserve"> PAGEREF _Toc241692048 \h </w:instrText>
+              <w:instrText xml:space="preserve"> PAGEREF _Toc241695936 \h </w:instrText>
             </w:r>
             <w:r>
               <w:rPr>
@@ -3666,7 +3666,7 @@
               <w14:ligatures w14:val="standardContextual"/>
             </w:rPr>
           </w:pPr>
-          <w:hyperlink w:anchor="_Toc241692049" w:history="1">
+          <w:hyperlink w:anchor="_Toc241695937" w:history="1">
             <w:r>
               <w:rPr>
                 <w:rStyle w:val="Hiperligao"/>
@@ -3690,7 +3690,7 @@
               <w:rPr>
                 <w:noProof/>
               </w:rPr>
-              <w:instrText xml:space="preserve"> PAGEREF _Toc241692049 \h </w:instrText>
+              <w:instrText xml:space="preserve"> PAGEREF _Toc241695937 \h </w:instrText>
             </w:r>
             <w:r>
               <w:rPr>
@@ -3732,7 +3732,7 @@
               <w14:ligatures w14:val="standardContextual"/>
             </w:rPr>
           </w:pPr>
-          <w:hyperlink w:anchor="_Toc241692050" w:history="1">
+          <w:hyperlink w:anchor="_Toc241695938" w:history="1">
             <w:r>
               <w:rPr>
                 <w:rStyle w:val="Hiperligao"/>
@@ -3756,7 +3756,7 @@
               <w:rPr>
                 <w:noProof/>
               </w:rPr>
-              <w:instrText xml:space="preserve"> PAGEREF _Toc241692050 \h </w:instrText>
+              <w:instrText xml:space="preserve"> PAGEREF _Toc241695938 \h </w:instrText>
             </w:r>
             <w:r>
               <w:rPr>
@@ -3798,7 +3798,7 @@
               <w14:ligatures w14:val="standardContextual"/>
             </w:rPr>
           </w:pPr>
-          <w:hyperlink w:anchor="_Toc241692051" w:history="1">
+          <w:hyperlink w:anchor="_Toc241695939" w:history="1">
             <w:r>
               <w:rPr>
                 <w:rStyle w:val="Hiperligao"/>
@@ -3822,7 +3822,7 @@
               <w:rPr>
                 <w:noProof/>
               </w:rPr>
-              <w:instrText xml:space="preserve"> PAGEREF _Toc241692051 \h </w:instrText>
+              <w:instrText xml:space="preserve"> PAGEREF _Toc241695939 \h </w:instrText>
             </w:r>
             <w:r>
               <w:rPr>
@@ -3864,7 +3864,7 @@
               <w14:ligatures w14:val="standardContextual"/>
             </w:rPr>
           </w:pPr>
-          <w:hyperlink w:anchor="_Toc241692052" w:history="1">
+          <w:hyperlink w:anchor="_Toc241695940" w:history="1">
             <w:r>
               <w:rPr>
                 <w:rStyle w:val="Hiperligao"/>
@@ -3888,7 +3888,7 @@
               <w:rPr>
                 <w:noProof/>
               </w:rPr>
-              <w:instrText xml:space="preserve"> PAGEREF _Toc241692052 \h </w:instrText>
+              <w:instrText xml:space="preserve"> PAGEREF _Toc241695940 \h </w:instrText>
             </w:r>
             <w:r>
               <w:rPr>
@@ -3930,7 +3930,7 @@
               <w14:ligatures w14:val="standardContextual"/>
             </w:rPr>
           </w:pPr>
-          <w:hyperlink w:anchor="_Toc241692053" w:history="1">
+          <w:hyperlink w:anchor="_Toc241695941" w:history="1">
             <w:r>
               <w:rPr>
                 <w:rStyle w:val="Hiperligao"/>
@@ -3954,7 +3954,7 @@
               <w:rPr>
                 <w:noProof/>
               </w:rPr>
-              <w:instrText xml:space="preserve"> PAGEREF _Toc241692053 \h </w:instrText>
+              <w:instrText xml:space="preserve"> PAGEREF _Toc241695941 \h </w:instrText>
             </w:r>
             <w:r>
               <w:rPr>
@@ -3996,7 +3996,7 @@
               <w14:ligatures w14:val="standardContextual"/>
             </w:rPr>
           </w:pPr>
-          <w:hyperlink w:anchor="_Toc241692054" w:history="1">
+          <w:hyperlink w:anchor="_Toc241695942" w:history="1">
             <w:r>
               <w:rPr>
                 <w:rStyle w:val="Hiperligao"/>
@@ -4020,7 +4020,7 @@
               <w:rPr>
                 <w:noProof/>
               </w:rPr>
-              <w:instrText xml:space="preserve"> PAGEREF _Toc241692054 \h </w:instrText>
+              <w:instrText xml:space="preserve"> PAGEREF _Toc241695942 \h </w:instrText>
             </w:r>
             <w:r>
               <w:rPr>
@@ -4062,7 +4062,7 @@
               <w14:ligatures w14:val="standardContextual"/>
             </w:rPr>
           </w:pPr>
-          <w:hyperlink w:anchor="_Toc241692055" w:history="1">
+          <w:hyperlink w:anchor="_Toc241695943" w:history="1">
             <w:r>
               <w:rPr>
                 <w:rStyle w:val="Hiperligao"/>
@@ -4086,7 +4086,7 @@
               <w:rPr>
                 <w:noProof/>
               </w:rPr>
-              <w:instrText xml:space="preserve"> PAGEREF _Toc241692055 \h </w:instrText>
+              <w:instrText xml:space="preserve"> PAGEREF _Toc241695943 \h </w:instrText>
             </w:r>
             <w:r>
               <w:rPr>
@@ -4128,7 +4128,7 @@
               <w14:ligatures w14:val="standardContextual"/>
             </w:rPr>
           </w:pPr>
-          <w:hyperlink w:anchor="_Toc241692056" w:history="1">
+          <w:hyperlink w:anchor="_Toc241695944" w:history="1">
             <w:r>
               <w:rPr>
                 <w:rStyle w:val="Hiperligao"/>
@@ -4152,7 +4152,7 @@
               <w:rPr>
                 <w:noProof/>
               </w:rPr>
-              <w:instrText xml:space="preserve"> PAGEREF _Toc241692056 \h </w:instrText>
+              <w:instrText xml:space="preserve"> PAGEREF _Toc241695944 \h </w:instrText>
             </w:r>
             <w:r>
               <w:rPr>
@@ -4194,7 +4194,7 @@
               <w14:ligatures w14:val="standardContextual"/>
             </w:rPr>
           </w:pPr>
-          <w:hyperlink w:anchor="_Toc241692057" w:history="1">
+          <w:hyperlink w:anchor="_Toc241695945" w:history="1">
             <w:r>
               <w:rPr>
                 <w:rStyle w:val="Hiperligao"/>
@@ -4218,7 +4218,7 @@
               <w:rPr>
                 <w:noProof/>
               </w:rPr>
-              <w:instrText xml:space="preserve"> PAGEREF _Toc241692057 \h </w:instrText>
+              <w:instrText xml:space="preserve"> PAGEREF _Toc241695945 \h </w:instrText>
             </w:r>
             <w:r>
               <w:rPr>
@@ -4266,7 +4266,7 @@
       <w:pPr>
         <w:pStyle w:val="Ttulo1"/>
       </w:pPr>
-      <w:bookmarkStart w:id="0" w:name="_Toc241691995"/>
+      <w:bookmarkStart w:id="0" w:name="_Toc241695883"/>
       <w:r>
         <w:lastRenderedPageBreak/>
         <w:t>Your role at a glance</w:t>
@@ -4347,7 +4347,7 @@
       <w:pPr>
         <w:pStyle w:val="Ttulo2"/>
       </w:pPr>
-      <w:bookmarkStart w:id="1" w:name="_Toc241691996"/>
+      <w:bookmarkStart w:id="1" w:name="_Toc241695884"/>
       <w:r>
         <w:t>You can / You cannot</w:t>
       </w:r>
@@ -5195,7 +5195,7 @@
       <w:pPr>
         <w:pStyle w:val="Ttulo2"/>
       </w:pPr>
-      <w:bookmarkStart w:id="2" w:name="_Toc241691997"/>
+      <w:bookmarkStart w:id="2" w:name="_Toc241695885"/>
       <w:r>
         <w:t>Where your access comes from</w:t>
       </w:r>
@@ -5305,7 +5305,7 @@
       <w:pPr>
         <w:pStyle w:val="Ttulo2"/>
       </w:pPr>
-      <w:bookmarkStart w:id="3" w:name="_Toc241691998"/>
+      <w:bookmarkStart w:id="3" w:name="_Toc241695886"/>
       <w:r>
         <w:t>How to sign in, change your password, and sign out</w:t>
       </w:r>
@@ -5419,7 +5419,7 @@
           <w:noProof/>
         </w:rPr>
         <w:drawing>
-          <wp:inline distT="0" distB="0" distL="0" distR="0" wp14:anchorId="4A1E0541" wp14:editId="7CBC7509">
+          <wp:inline distT="0" distB="0" distL="0" distR="0" wp14:anchorId="417ABE8E" wp14:editId="1CED1C1D">
             <wp:extent cx="5715000" cy="3571875"/>
             <wp:effectExtent l="0" t="0" r="0" b="0"/>
             <wp:docPr id="1" name="01-login.png" descr="The sign-in page with Email, Password, Remember me and the Sign in button." title="The sign-in page with Email, Password, Remember me and the Sign in button."/>
@@ -5534,7 +5534,7 @@
         </w:rPr>
         <w:lastRenderedPageBreak/>
         <w:drawing>
-          <wp:inline distT="0" distB="0" distL="0" distR="0" wp14:anchorId="64E2E615" wp14:editId="6FA1B1BB">
+          <wp:inline distT="0" distB="0" distL="0" distR="0" wp14:anchorId="4F5C45CC" wp14:editId="21EE84F8">
             <wp:extent cx="5715000" cy="3571875"/>
             <wp:effectExtent l="0" t="0" r="0" b="0"/>
             <wp:docPr id="2" name="03-user-menu.png" descr="The account menu open, with Settings and Log out." title="The account menu open, with Settings and Log out."/>
@@ -5586,7 +5586,7 @@
       <w:pPr>
         <w:pStyle w:val="Ttulo2"/>
       </w:pPr>
-      <w:bookmarkStart w:id="4" w:name="_Toc241691999"/>
+      <w:bookmarkStart w:id="4" w:name="_Toc241695887"/>
       <w:r>
         <w:t>The sidebar</w:t>
       </w:r>
@@ -6127,7 +6127,7 @@
         </w:rPr>
         <w:lastRenderedPageBreak/>
         <w:drawing>
-          <wp:inline distT="0" distB="0" distL="0" distR="0" wp14:anchorId="292C47AC" wp14:editId="22C66B53">
+          <wp:inline distT="0" distB="0" distL="0" distR="0" wp14:anchorId="566FDA1C" wp14:editId="1C0F50F8">
             <wp:extent cx="5715000" cy="5133975"/>
             <wp:effectExtent l="0" t="0" r="0" b="0"/>
             <wp:docPr id="3" name="01-dashboard-sidebar.png" descr="The full Administrator sidebar, including Data Modeling and Migration." title="The full Administrator sidebar, including Data Modeling and Migration."/>
@@ -6180,7 +6180,7 @@
         <w:pStyle w:val="Ttulo1"/>
         <w:pageBreakBefore/>
       </w:pPr>
-      <w:bookmarkStart w:id="5" w:name="_Toc241692000"/>
+      <w:bookmarkStart w:id="5" w:name="_Toc241695888"/>
       <w:r>
         <w:lastRenderedPageBreak/>
         <w:t>Settings</w:t>
@@ -6210,7 +6210,7 @@
           <w:noProof/>
         </w:rPr>
         <w:drawing>
-          <wp:inline distT="0" distB="0" distL="0" distR="0" wp14:anchorId="311020D3" wp14:editId="52C8180A">
+          <wp:inline distT="0" distB="0" distL="0" distR="0" wp14:anchorId="12A20A0C" wp14:editId="6D681A91">
             <wp:extent cx="5715000" cy="3571875"/>
             <wp:effectExtent l="0" t="0" r="0" b="0"/>
             <wp:docPr id="4" name="04-settings.png" descr="The Settings page with the Language, Theme and Color palette cards." title="The Settings page with the Language, Theme and Color palette cards."/>
@@ -7559,7 +7559,7 @@
         <w:pStyle w:val="Ttulo1"/>
         <w:pageBreakBefore/>
       </w:pPr>
-      <w:bookmarkStart w:id="6" w:name="_Toc241692001"/>
+      <w:bookmarkStart w:id="6" w:name="_Toc241695889"/>
       <w:r>
         <w:lastRenderedPageBreak/>
         <w:t>Dashboard</w:t>
@@ -7592,7 +7592,7 @@
           <w:noProof/>
         </w:rPr>
         <w:drawing>
-          <wp:inline distT="0" distB="0" distL="0" distR="0" wp14:anchorId="614F2C38" wp14:editId="35605276">
+          <wp:inline distT="0" distB="0" distL="0" distR="0" wp14:anchorId="4DD00CF5" wp14:editId="418DFC94">
             <wp:extent cx="5715000" cy="5133975"/>
             <wp:effectExtent l="0" t="0" r="0" b="0"/>
             <wp:docPr id="5" name="01-dashboard-sidebar.png" descr="The Administrator dashboard with summary cards and the Recent Maps list." title="The Administrator dashboard with summary cards and the Recent Maps list."/>
@@ -8101,7 +8101,7 @@
         <w:pStyle w:val="Ttulo1"/>
         <w:pageBreakBefore/>
       </w:pPr>
-      <w:bookmarkStart w:id="7" w:name="_Toc241692002"/>
+      <w:bookmarkStart w:id="7" w:name="_Toc241695890"/>
       <w:r>
         <w:lastRenderedPageBreak/>
         <w:t>Maps</w:t>
@@ -8131,7 +8131,7 @@
           <w:noProof/>
         </w:rPr>
         <w:drawing>
-          <wp:inline distT="0" distB="0" distL="0" distR="0" wp14:anchorId="4B4844D8" wp14:editId="2E85F35A">
+          <wp:inline distT="0" distB="0" distL="0" distR="0" wp14:anchorId="7F1F90FB" wp14:editId="7909D781">
             <wp:extent cx="5715000" cy="3429000"/>
             <wp:effectExtent l="0" t="0" r="0" b="0"/>
             <wp:docPr id="6" name="02-maps-all.png" descr="The Maps list, All tab, with every row icon and the Workbooks section above." title="The Maps list, All tab, with every row icon and the Workbooks section above."/>
@@ -8183,7 +8183,7 @@
       <w:pPr>
         <w:pStyle w:val="Ttulo2"/>
       </w:pPr>
-      <w:bookmarkStart w:id="8" w:name="_Toc241692003"/>
+      <w:bookmarkStart w:id="8" w:name="_Toc241695891"/>
       <w:r>
         <w:t>The list</w:t>
       </w:r>
@@ -9387,7 +9387,7 @@
       <w:pPr>
         <w:pStyle w:val="Ttulo2"/>
       </w:pPr>
-      <w:bookmarkStart w:id="9" w:name="_Toc241692004"/>
+      <w:bookmarkStart w:id="9" w:name="_Toc241695892"/>
       <w:r>
         <w:t>Workbooks</w:t>
       </w:r>
@@ -9801,7 +9801,7 @@
       <w:pPr>
         <w:pStyle w:val="Ttulo2"/>
       </w:pPr>
-      <w:bookmarkStart w:id="10" w:name="_Toc241692005"/>
+      <w:bookmarkStart w:id="10" w:name="_Toc241695893"/>
       <w:r>
         <w:t>Share a map</w:t>
       </w:r>
@@ -9824,7 +9824,7 @@
         </w:rPr>
         <w:lastRenderedPageBreak/>
         <w:drawing>
-          <wp:inline distT="0" distB="0" distL="0" distR="0" wp14:anchorId="63D59836" wp14:editId="143D4BA0">
+          <wp:inline distT="0" distB="0" distL="0" distR="0" wp14:anchorId="099D667A" wp14:editId="76711E79">
             <wp:extent cx="3743325" cy="3895725"/>
             <wp:effectExtent l="0" t="0" r="0" b="0"/>
             <wp:docPr id="7" name="03-share-dialog.png" descr="The Share map dialog with a search box and Can view, Can export and Can edit buttons." title="The Share map dialog with a search box and Can view, Can export and Can edit buttons."/>
@@ -10301,7 +10301,7 @@
       <w:pPr>
         <w:pStyle w:val="Ttulo2"/>
       </w:pPr>
-      <w:bookmarkStart w:id="11" w:name="_Toc241692006"/>
+      <w:bookmarkStart w:id="11" w:name="_Toc241695894"/>
       <w:r>
         <w:lastRenderedPageBreak/>
         <w:t>Share a whole workbook</w:t>
@@ -10357,7 +10357,7 @@
       <w:pPr>
         <w:pStyle w:val="Ttulo2"/>
       </w:pPr>
-      <w:bookmarkStart w:id="12" w:name="_Toc241692007"/>
+      <w:bookmarkStart w:id="12" w:name="_Toc241695895"/>
       <w:r>
         <w:t>Copy a map</w:t>
       </w:r>
@@ -10372,7 +10372,7 @@
       <w:pPr>
         <w:pStyle w:val="Ttulo2"/>
       </w:pPr>
-      <w:bookmarkStart w:id="13" w:name="_Toc241692008"/>
+      <w:bookmarkStart w:id="13" w:name="_Toc241695896"/>
       <w:r>
         <w:t>Example: give a colleague read access</w:t>
       </w:r>
@@ -10503,7 +10503,7 @@
         <w:pStyle w:val="Ttulo1"/>
         <w:pageBreakBefore/>
       </w:pPr>
-      <w:bookmarkStart w:id="14" w:name="_Toc241692009"/>
+      <w:bookmarkStart w:id="14" w:name="_Toc241695897"/>
       <w:r>
         <w:lastRenderedPageBreak/>
         <w:t>Map builder</w:t>
@@ -10536,7 +10536,7 @@
           <w:noProof/>
         </w:rPr>
         <w:drawing>
-          <wp:inline distT="0" distB="0" distL="0" distR="0" wp14:anchorId="0E8B0435" wp14:editId="062D18E2">
+          <wp:inline distT="0" distB="0" distL="0" distR="0" wp14:anchorId="6CAB0516" wp14:editId="77EF0404">
             <wp:extent cx="5715000" cy="3571875"/>
             <wp:effectExtent l="0" t="0" r="0" b="0"/>
             <wp:docPr id="8" name="05-builder-overview.png" descr="The map builder with the Business Areas tree, the columns canvas and the Properties panel." title="The map builder with the Business Areas tree, the columns canvas and the Properties panel."/>
@@ -10588,7 +10588,7 @@
       <w:pPr>
         <w:pStyle w:val="Ttulo2"/>
       </w:pPr>
-      <w:bookmarkStart w:id="15" w:name="_Toc241692010"/>
+      <w:bookmarkStart w:id="15" w:name="_Toc241695898"/>
       <w:r>
         <w:t>The screen</w:t>
       </w:r>
@@ -10748,7 +10748,7 @@
       <w:pPr>
         <w:pStyle w:val="Ttulo2"/>
       </w:pPr>
-      <w:bookmarkStart w:id="16" w:name="_Toc241692011"/>
+      <w:bookmarkStart w:id="16" w:name="_Toc241695899"/>
       <w:r>
         <w:t>The toolbar</w:t>
       </w:r>
@@ -11964,7 +11964,7 @@
       <w:pPr>
         <w:pStyle w:val="Ttulo2"/>
       </w:pPr>
-      <w:bookmarkStart w:id="17" w:name="_Toc241692012"/>
+      <w:bookmarkStart w:id="17" w:name="_Toc241695900"/>
       <w:r>
         <w:t>Build a map</w:t>
       </w:r>
@@ -12171,7 +12171,7 @@
       <w:pPr>
         <w:pStyle w:val="Ttulo2"/>
       </w:pPr>
-      <w:bookmarkStart w:id="18" w:name="_Toc241692013"/>
+      <w:bookmarkStart w:id="18" w:name="_Toc241695901"/>
       <w:r>
         <w:lastRenderedPageBreak/>
         <w:t>Configure a column</w:t>
@@ -14990,7 +14990,7 @@
           <w:noProof/>
         </w:rPr>
         <w:drawing>
-          <wp:inline distT="0" distB="0" distL="0" distR="0" wp14:anchorId="0B204F5A" wp14:editId="7190DA7A">
+          <wp:inline distT="0" distB="0" distL="0" distR="0" wp14:anchorId="277A045E" wp14:editId="0F0647D1">
             <wp:extent cx="5715000" cy="3571875"/>
             <wp:effectExtent l="0" t="0" r="0" b="0"/>
             <wp:docPr id="9" name="08-builder-column-aggregation.png" descr="The Configure column dialog with the Aggregation list open." title="The Configure column dialog with the Aggregation list open."/>
@@ -15042,7 +15042,7 @@
       <w:pPr>
         <w:pStyle w:val="Ttulo2"/>
       </w:pPr>
-      <w:bookmarkStart w:id="19" w:name="_Toc241692014"/>
+      <w:bookmarkStart w:id="19" w:name="_Toc241695902"/>
       <w:r>
         <w:lastRenderedPageBreak/>
         <w:t>The Properties tab</w:t>
@@ -15890,7 +15890,7 @@
       <w:pPr>
         <w:pStyle w:val="Ttulo2"/>
       </w:pPr>
-      <w:bookmarkStart w:id="20" w:name="_Toc241692015"/>
+      <w:bookmarkStart w:id="20" w:name="_Toc241695903"/>
       <w:r>
         <w:t>The Conditions tab</w:t>
       </w:r>
@@ -17433,7 +17433,7 @@
       <w:pPr>
         <w:pStyle w:val="Ttulo2"/>
       </w:pPr>
-      <w:bookmarkStart w:id="21" w:name="_Toc241692016"/>
+      <w:bookmarkStart w:id="21" w:name="_Toc241695904"/>
       <w:r>
         <w:t>The Sort tab</w:t>
       </w:r>
@@ -17878,7 +17878,7 @@
       <w:pPr>
         <w:pStyle w:val="Ttulo2"/>
       </w:pPr>
-      <w:bookmarkStart w:id="22" w:name="_Toc241692017"/>
+      <w:bookmarkStart w:id="22" w:name="_Toc241695905"/>
       <w:r>
         <w:t>The Parameters tab</w:t>
       </w:r>
@@ -18788,7 +18788,7 @@
       <w:pPr>
         <w:pStyle w:val="Ttulo2"/>
       </w:pPr>
-      <w:bookmarkStart w:id="23" w:name="_Toc241692018"/>
+      <w:bookmarkStart w:id="23" w:name="_Toc241695906"/>
       <w:r>
         <w:t>The Calculated Fields tab</w:t>
       </w:r>
@@ -19686,7 +19686,7 @@
       <w:pPr>
         <w:pStyle w:val="Ttulo2"/>
       </w:pPr>
-      <w:bookmarkStart w:id="24" w:name="_Toc241692019"/>
+      <w:bookmarkStart w:id="24" w:name="_Toc241695907"/>
       <w:r>
         <w:t>Conditional formatting</w:t>
       </w:r>
@@ -21080,7 +21080,7 @@
       <w:pPr>
         <w:pStyle w:val="Ttulo2"/>
       </w:pPr>
-      <w:bookmarkStart w:id="25" w:name="_Toc241692020"/>
+      <w:bookmarkStart w:id="25" w:name="_Toc241695908"/>
       <w:r>
         <w:t>Run a map and read the result</w:t>
       </w:r>
@@ -22149,7 +22149,7 @@
           <w:noProof/>
         </w:rPr>
         <w:drawing>
-          <wp:inline distT="0" distB="0" distL="0" distR="0" wp14:anchorId="5D1A6FA8" wp14:editId="5A3A6B41">
+          <wp:inline distT="0" distB="0" distL="0" distR="0" wp14:anchorId="7EFDE334" wp14:editId="6D0250A0">
             <wp:extent cx="5715000" cy="3571875"/>
             <wp:effectExtent l="0" t="0" r="0" b="0"/>
             <wp:docPr id="10" name="03-viewer-results.png" descr="Run results with the SQL and Plan buttons beside the Excel, CSV and PDF buttons." title="Run results with the SQL and Plan buttons beside the Excel, CSV and PDF buttons."/>
@@ -22216,7 +22216,7 @@
       <w:pPr>
         <w:pStyle w:val="Ttulo2"/>
       </w:pPr>
-      <w:bookmarkStart w:id="26" w:name="_Toc241692021"/>
+      <w:bookmarkStart w:id="26" w:name="_Toc241695909"/>
       <w:r>
         <w:t>Refusals and errors</w:t>
       </w:r>
@@ -22855,7 +22855,7 @@
         <w:pStyle w:val="Ttulo1"/>
         <w:pageBreakBefore/>
       </w:pPr>
-      <w:bookmarkStart w:id="27" w:name="_Toc241692022"/>
+      <w:bookmarkStart w:id="27" w:name="_Toc241695910"/>
       <w:r>
         <w:lastRenderedPageBreak/>
         <w:t>The map viewer</w:t>
@@ -22888,7 +22888,7 @@
           <w:noProof/>
         </w:rPr>
         <w:drawing>
-          <wp:inline distT="0" distB="0" distL="0" distR="0" wp14:anchorId="0E3173AF" wp14:editId="1A2FB69A">
+          <wp:inline distT="0" distB="0" distL="0" distR="0" wp14:anchorId="0CDC0B61" wp14:editId="70AD4873">
             <wp:extent cx="5715000" cy="3571875"/>
             <wp:effectExtent l="0" t="0" r="0" b="0"/>
             <wp:docPr id="11" name="25-viewer-results.png" descr="The map viewer after a completed run, with the results grid and export buttons." title="The map viewer after a completed run, with the results grid and export buttons."/>
@@ -23493,7 +23493,7 @@
         <w:pStyle w:val="Ttulo1"/>
         <w:pageBreakBefore/>
       </w:pPr>
-      <w:bookmarkStart w:id="28" w:name="_Toc241692023"/>
+      <w:bookmarkStart w:id="28" w:name="_Toc241695911"/>
       <w:r>
         <w:lastRenderedPageBreak/>
         <w:t>Runs</w:t>
@@ -23523,7 +23523,7 @@
           <w:noProof/>
         </w:rPr>
         <w:drawing>
-          <wp:inline distT="0" distB="0" distL="0" distR="0" wp14:anchorId="337CE400" wp14:editId="5943945D">
+          <wp:inline distT="0" distB="0" distL="0" distR="0" wp14:anchorId="42C1572B" wp14:editId="0E39DBF9">
             <wp:extent cx="5715000" cy="3571875"/>
             <wp:effectExtent l="0" t="0" r="0" b="0"/>
             <wp:docPr id="12" name="04-runs-every-user.png" descr="The Runs page with every user's runs shown." title="The Runs page with every user's runs shown."/>
@@ -24853,7 +24853,7 @@
         <w:pStyle w:val="Ttulo1"/>
         <w:pageBreakBefore/>
       </w:pPr>
-      <w:bookmarkStart w:id="29" w:name="_Toc241692024"/>
+      <w:bookmarkStart w:id="29" w:name="_Toc241695912"/>
       <w:r>
         <w:lastRenderedPageBreak/>
         <w:t>Exports</w:t>
@@ -24883,7 +24883,7 @@
           <w:noProof/>
         </w:rPr>
         <w:drawing>
-          <wp:inline distT="0" distB="0" distL="0" distR="0" wp14:anchorId="109F8EC0" wp14:editId="543422DB">
+          <wp:inline distT="0" distB="0" distL="0" distR="0" wp14:anchorId="5CB8A0A5" wp14:editId="31F7B4D5">
             <wp:extent cx="5715000" cy="3571875"/>
             <wp:effectExtent l="0" t="0" r="0" b="0"/>
             <wp:docPr id="13" name="05-exports.png" descr="The Exports page listing export jobs with their status and download buttons." title="The Exports page listing export jobs with their status and download buttons."/>
@@ -25564,7 +25564,7 @@
         <w:pStyle w:val="Ttulo1"/>
         <w:pageBreakBefore/>
       </w:pPr>
-      <w:bookmarkStart w:id="30" w:name="_Toc241692025"/>
+      <w:bookmarkStart w:id="30" w:name="_Toc241695913"/>
       <w:r>
         <w:lastRenderedPageBreak/>
         <w:t>Schedules</w:t>
@@ -25597,7 +25597,7 @@
           <w:noProof/>
         </w:rPr>
         <w:drawing>
-          <wp:inline distT="0" distB="0" distL="0" distR="0" wp14:anchorId="6F2A13DB" wp14:editId="3C48B2C4">
+          <wp:inline distT="0" distB="0" distL="0" distR="0" wp14:anchorId="06E10F85" wp14:editId="031D2761">
             <wp:extent cx="5715000" cy="3571875"/>
             <wp:effectExtent l="0" t="0" r="0" b="0"/>
             <wp:docPr id="14" name="38-schedules-list.png" descr="The Schedules page with a paused schedule and its action icons." title="The Schedules page with a paused schedule and its action icons."/>
@@ -26304,7 +26304,7 @@
       <w:pPr>
         <w:pStyle w:val="Ttulo2"/>
       </w:pPr>
-      <w:bookmarkStart w:id="31" w:name="_Toc241692026"/>
+      <w:bookmarkStart w:id="31" w:name="_Toc241695914"/>
       <w:r>
         <w:lastRenderedPageBreak/>
         <w:t>New Schedule and Edit Schedule</w:t>
@@ -27740,7 +27740,7 @@
         </w:rPr>
         <w:lastRenderedPageBreak/>
         <w:drawing>
-          <wp:inline distT="0" distB="0" distL="0" distR="0" wp14:anchorId="4BFEECEF" wp14:editId="0DD45D9A">
+          <wp:inline distT="0" distB="0" distL="0" distR="0" wp14:anchorId="107C6159" wp14:editId="0EAF5427">
             <wp:extent cx="3743325" cy="4676775"/>
             <wp:effectExtent l="0" t="0" r="0" b="0"/>
             <wp:docPr id="15" name="34-schedule-custom-cron.png" descr="The New Schedule dialog with a custom frequency and the cron expression field." title="The New Schedule dialog with a custom frequency and the cron expression field."/>
@@ -27792,7 +27792,7 @@
       <w:pPr>
         <w:pStyle w:val="Ttulo2"/>
       </w:pPr>
-      <w:bookmarkStart w:id="32" w:name="_Toc241692027"/>
+      <w:bookmarkStart w:id="32" w:name="_Toc241695915"/>
       <w:r>
         <w:t>Execution History</w:t>
       </w:r>
@@ -28241,7 +28241,7 @@
       <w:pPr>
         <w:pStyle w:val="Ttulo2"/>
       </w:pPr>
-      <w:bookmarkStart w:id="33" w:name="_Toc241692028"/>
+      <w:bookmarkStart w:id="33" w:name="_Toc241695916"/>
       <w:r>
         <w:t>Example: a weekly result</w:t>
       </w:r>
@@ -28447,7 +28447,7 @@
         <w:pStyle w:val="Ttulo1"/>
         <w:pageBreakBefore/>
       </w:pPr>
-      <w:bookmarkStart w:id="34" w:name="_Toc241692029"/>
+      <w:bookmarkStart w:id="34" w:name="_Toc241695917"/>
       <w:r>
         <w:lastRenderedPageBreak/>
         <w:t>Business Areas</w:t>
@@ -28480,7 +28480,7 @@
           <w:noProof/>
         </w:rPr>
         <w:drawing>
-          <wp:inline distT="0" distB="0" distL="0" distR="0" wp14:anchorId="27178914" wp14:editId="4CF29D94">
+          <wp:inline distT="0" distB="0" distL="0" distR="0" wp14:anchorId="773C04DA" wp14:editId="5493113C">
             <wp:extent cx="5715000" cy="3571875"/>
             <wp:effectExtent l="0" t="0" r="0" b="0"/>
             <wp:docPr id="16" name="06-business-areas.png" descr="The Business Areas page listing areas, with the New Business Area button and row icons." title="The Business Areas page listing areas, with the New Business Area button and row icons."/>
@@ -28994,7 +28994,7 @@
         </w:rPr>
         <w:lastRenderedPageBreak/>
         <w:drawing>
-          <wp:inline distT="0" distB="0" distL="0" distR="0" wp14:anchorId="12942464" wp14:editId="5844B9D6">
+          <wp:inline distT="0" distB="0" distL="0" distR="0" wp14:anchorId="29091652" wp14:editId="5CAA145D">
             <wp:extent cx="3324225" cy="2047875"/>
             <wp:effectExtent l="0" t="0" r="0" b="0"/>
             <wp:docPr id="17" name="07-business-areas-new.png" descr="The New Business Area dialog with Name and Description fields." title="The New Business Area dialog with Name and Description fields."/>
@@ -29046,7 +29046,7 @@
       <w:pPr>
         <w:pStyle w:val="Ttulo2"/>
       </w:pPr>
-      <w:bookmarkStart w:id="35" w:name="_Toc241692030"/>
+      <w:bookmarkStart w:id="35" w:name="_Toc241695918"/>
       <w:r>
         <w:t>Create a business area</w:t>
       </w:r>
@@ -29150,7 +29150,7 @@
       <w:pPr>
         <w:pStyle w:val="Ttulo2"/>
       </w:pPr>
-      <w:bookmarkStart w:id="36" w:name="_Toc241692031"/>
+      <w:bookmarkStart w:id="36" w:name="_Toc241695919"/>
       <w:r>
         <w:t>Grants</w:t>
       </w:r>
@@ -29182,7 +29182,7 @@
           <w:noProof/>
         </w:rPr>
         <w:drawing>
-          <wp:inline distT="0" distB="0" distL="0" distR="0" wp14:anchorId="5F9A38B5" wp14:editId="3A7E5C29">
+          <wp:inline distT="0" distB="0" distL="0" distR="0" wp14:anchorId="03DC260E" wp14:editId="2FAC9AA3">
             <wp:extent cx="5715000" cy="3571875"/>
             <wp:effectExtent l="0" t="0" r="0" b="0"/>
             <wp:docPr id="18" name="09-business-areas-grants-permission.png" descr="The Manage grants dialog with the Permission list open." title="The Manage grants dialog with the Permission list open."/>
@@ -30439,7 +30439,7 @@
         <w:pStyle w:val="Ttulo1"/>
         <w:pageBreakBefore/>
       </w:pPr>
-      <w:bookmarkStart w:id="37" w:name="_Toc241692032"/>
+      <w:bookmarkStart w:id="37" w:name="_Toc241695920"/>
       <w:r>
         <w:lastRenderedPageBreak/>
         <w:t>Folders</w:t>
@@ -30502,7 +30502,7 @@
           <w:noProof/>
         </w:rPr>
         <w:drawing>
-          <wp:inline distT="0" distB="0" distL="0" distR="0" wp14:anchorId="1CA253A8" wp14:editId="1A7027CE">
+          <wp:inline distT="0" distB="0" distL="0" distR="0" wp14:anchorId="0BB537DC" wp14:editId="422CA1D4">
             <wp:extent cx="5715000" cy="3571875"/>
             <wp:effectExtent l="0" t="0" r="0" b="0"/>
             <wp:docPr id="19" name="11-folders.png" descr="The Folders page with a business area chosen, showing the folder table and row icons." title="The Folders page with a business area chosen, showing the folder table and row icons."/>
@@ -31281,7 +31281,7 @@
       <w:pPr>
         <w:pStyle w:val="Ttulo2"/>
       </w:pPr>
-      <w:bookmarkStart w:id="38" w:name="_Toc241692033"/>
+      <w:bookmarkStart w:id="38" w:name="_Toc241695921"/>
       <w:r>
         <w:t>The folder wizard</w:t>
       </w:r>
@@ -32710,7 +32710,7 @@
         </w:rPr>
         <w:lastRenderedPageBreak/>
         <w:drawing>
-          <wp:inline distT="0" distB="0" distL="0" distR="0" wp14:anchorId="5BB3C028" wp14:editId="19DFB2D3">
+          <wp:inline distT="0" distB="0" distL="0" distR="0" wp14:anchorId="4549109E" wp14:editId="1F0F45A2">
             <wp:extent cx="2238375" cy="5905500"/>
             <wp:effectExtent l="0" t="0" r="0" b="0"/>
             <wp:docPr id="20" name="15-folders-picked.png" descr="The New Folder dialog with a table picked and the Items to create checklist." title="The New Folder dialog with a table picked and the Items to create checklist."/>
@@ -32897,7 +32897,7 @@
       <w:pPr>
         <w:pStyle w:val="Ttulo2"/>
       </w:pPr>
-      <w:bookmarkStart w:id="39" w:name="_Toc241692034"/>
+      <w:bookmarkStart w:id="39" w:name="_Toc241695922"/>
       <w:r>
         <w:t>Share a folder into another business area</w:t>
       </w:r>
@@ -33007,7 +33007,7 @@
           <w:noProof/>
         </w:rPr>
         <w:drawing>
-          <wp:inline distT="0" distB="0" distL="0" distR="0" wp14:anchorId="35DBF888" wp14:editId="52DA55DE">
+          <wp:inline distT="0" distB="0" distL="0" distR="0" wp14:anchorId="27EF0F3A" wp14:editId="1927E077">
             <wp:extent cx="3324225" cy="1638300"/>
             <wp:effectExtent l="0" t="0" r="0" b="0"/>
             <wp:docPr id="21" name="16-folders-sharing.png" descr="The folder sharing dialog with the owner badge and the Share into list." title="The folder sharing dialog with the owner badge and the Share into list."/>
@@ -33060,7 +33060,7 @@
         <w:pStyle w:val="Ttulo1"/>
         <w:pageBreakBefore/>
       </w:pPr>
-      <w:bookmarkStart w:id="40" w:name="_Toc241692035"/>
+      <w:bookmarkStart w:id="40" w:name="_Toc241695923"/>
       <w:r>
         <w:lastRenderedPageBreak/>
         <w:t>Items</w:t>
@@ -33113,7 +33113,7 @@
           <w:noProof/>
         </w:rPr>
         <w:drawing>
-          <wp:inline distT="0" distB="0" distL="0" distR="0" wp14:anchorId="1D1D0509" wp14:editId="7D56E682">
+          <wp:inline distT="0" distB="0" distL="0" distR="0" wp14:anchorId="29DAF825" wp14:editId="506E5EC9">
             <wp:extent cx="5715000" cy="3571875"/>
             <wp:effectExtent l="0" t="0" r="0" b="0"/>
             <wp:docPr id="22" name="17-items.png" descr="The Items page for a chosen folder, with Type, Column, Data Type and Aggregation columns." title="The Items page for a chosen folder, with Type, Column, Data Type and Aggregation columns."/>
@@ -35052,7 +35052,7 @@
         </w:rPr>
         <w:lastRenderedPageBreak/>
         <w:drawing>
-          <wp:inline distT="0" distB="0" distL="0" distR="0" wp14:anchorId="09D60AEE" wp14:editId="736E101E">
+          <wp:inline distT="0" distB="0" distL="0" distR="0" wp14:anchorId="35371977" wp14:editId="1DD8B8E8">
             <wp:extent cx="5715000" cy="3571875"/>
             <wp:effectExtent l="0" t="0" r="0" b="0"/>
             <wp:docPr id="23" name="19-items-type-open.png" descr="The New Item dialog with the Item Type list open showing the item types." title="The New Item dialog with the Item Type list open showing the item types."/>
@@ -35105,7 +35105,7 @@
         <w:pStyle w:val="Ttulo1"/>
         <w:pageBreakBefore/>
       </w:pPr>
-      <w:bookmarkStart w:id="41" w:name="_Toc241692036"/>
+      <w:bookmarkStart w:id="41" w:name="_Toc241695924"/>
       <w:r>
         <w:lastRenderedPageBreak/>
         <w:t>Joins</w:t>
@@ -35138,7 +35138,7 @@
           <w:noProof/>
         </w:rPr>
         <w:drawing>
-          <wp:inline distT="0" distB="0" distL="0" distR="0" wp14:anchorId="606D4FEC" wp14:editId="5CA008D8">
+          <wp:inline distT="0" distB="0" distL="0" distR="0" wp14:anchorId="1E3A6B7C" wp14:editId="423A274C">
             <wp:extent cx="5715000" cy="3571875"/>
             <wp:effectExtent l="0" t="0" r="0" b="0"/>
             <wp:docPr id="24" name="20-joins.png" descr="The Joins page, including joins made of several column pairs." title="The Joins page, including joins made of several column pairs."/>
@@ -36793,7 +36793,7 @@
           <w:noProof/>
         </w:rPr>
         <w:drawing>
-          <wp:inline distT="0" distB="0" distL="0" distR="0" wp14:anchorId="028026D5" wp14:editId="095E5D20">
+          <wp:inline distT="0" distB="0" distL="0" distR="0" wp14:anchorId="4C0271BD" wp14:editId="14D2456A">
             <wp:extent cx="5715000" cy="3571875"/>
             <wp:effectExtent l="0" t="0" r="0" b="0"/>
             <wp:docPr id="25" name="23-joins-select-open.png" descr="The New Join dialog with a select list open." title="The New Join dialog with a select list open."/>
@@ -36964,7 +36964,7 @@
         <w:pStyle w:val="Ttulo1"/>
         <w:pageBreakBefore/>
       </w:pPr>
-      <w:bookmarkStart w:id="42" w:name="_Toc241692037"/>
+      <w:bookmarkStart w:id="42" w:name="_Toc241695925"/>
       <w:r>
         <w:lastRenderedPageBreak/>
         <w:t>Hierarchies</w:t>
@@ -36997,7 +36997,7 @@
           <w:noProof/>
         </w:rPr>
         <w:drawing>
-          <wp:inline distT="0" distB="0" distL="0" distR="0" wp14:anchorId="04273A65" wp14:editId="6FF7EDC6">
+          <wp:inline distT="0" distB="0" distL="0" distR="0" wp14:anchorId="61BDC09B" wp14:editId="4792F6FD">
             <wp:extent cx="5715000" cy="3571875"/>
             <wp:effectExtent l="0" t="0" r="0" b="0"/>
             <wp:docPr id="26" name="24-hierarchies.png" descr="The Hierarchies page with the table showing the number of levels." title="The Hierarchies page with the table showing the number of levels."/>
@@ -38057,7 +38057,7 @@
           <w:noProof/>
         </w:rPr>
         <w:drawing>
-          <wp:inline distT="0" distB="0" distL="0" distR="0" wp14:anchorId="1569C59D" wp14:editId="15CECE36">
+          <wp:inline distT="0" distB="0" distL="0" distR="0" wp14:anchorId="6C1A2B56" wp14:editId="42FD83DE">
             <wp:extent cx="4362450" cy="2762250"/>
             <wp:effectExtent l="0" t="0" r="0" b="0"/>
             <wp:docPr id="27" name="26-hierarchies-level-added.png" descr="The New Hierarchy dialog after adding a level, with folder and item selects." title="The New Hierarchy dialog after adding a level, with folder and item selects."/>
@@ -38110,7 +38110,7 @@
         <w:pStyle w:val="Ttulo1"/>
         <w:pageBreakBefore/>
       </w:pPr>
-      <w:bookmarkStart w:id="43" w:name="_Toc241692038"/>
+      <w:bookmarkStart w:id="43" w:name="_Toc241695926"/>
       <w:r>
         <w:lastRenderedPageBreak/>
         <w:t>Custom Functions</w:t>
@@ -38143,7 +38143,7 @@
           <w:noProof/>
         </w:rPr>
         <w:drawing>
-          <wp:inline distT="0" distB="0" distL="0" distR="0" wp14:anchorId="39C9AD9B" wp14:editId="0915F1CC">
+          <wp:inline distT="0" distB="0" distL="0" distR="0" wp14:anchorId="12B8BEC8" wp14:editId="547BBE0B">
             <wp:extent cx="5715000" cy="3571875"/>
             <wp:effectExtent l="0" t="0" r="0" b="0"/>
             <wp:docPr id="28" name="27-custom-functions.png" descr="The Custom Functions page with filter box, Refresh all, New Function and the function table." title="The Custom Functions page with filter box, Refresh all, New Function and the function table."/>
@@ -38863,7 +38863,7 @@
       <w:pPr>
         <w:pStyle w:val="Ttulo2"/>
       </w:pPr>
-      <w:bookmarkStart w:id="44" w:name="_Toc241692039"/>
+      <w:bookmarkStart w:id="44" w:name="_Toc241695927"/>
       <w:r>
         <w:lastRenderedPageBreak/>
         <w:t>The function form</w:t>
@@ -39834,7 +39834,7 @@
         </w:rPr>
         <w:lastRenderedPageBreak/>
         <w:drawing>
-          <wp:inline distT="0" distB="0" distL="0" distR="0" wp14:anchorId="29E9D476" wp14:editId="0A8872EF">
+          <wp:inline distT="0" distB="0" distL="0" distR="0" wp14:anchorId="2A369F76" wp14:editId="0C904830">
             <wp:extent cx="4076700" cy="5905500"/>
             <wp:effectExtent l="0" t="0" r="0" b="0"/>
             <wp:docPr id="29" name="29-custom-functions-search-results.png" descr="The New Custom Function dialog listing database functions that match the search." title="The New Custom Function dialog listing database functions that match the search."/>
@@ -39887,7 +39887,7 @@
         <w:pStyle w:val="Ttulo1"/>
         <w:pageBreakBefore/>
       </w:pPr>
-      <w:bookmarkStart w:id="45" w:name="_Toc241692040"/>
+      <w:bookmarkStart w:id="45" w:name="_Toc241695928"/>
       <w:r>
         <w:lastRenderedPageBreak/>
         <w:t>Data Sources</w:t>
@@ -39920,7 +39920,7 @@
           <w:noProof/>
         </w:rPr>
         <w:drawing>
-          <wp:inline distT="0" distB="0" distL="0" distR="0" wp14:anchorId="2FADF9EA" wp14:editId="40595D99">
+          <wp:inline distT="0" distB="0" distL="0" distR="0" wp14:anchorId="162E1682" wp14:editId="01222E21">
             <wp:extent cx="5715000" cy="3571875"/>
             <wp:effectExtent l="0" t="0" r="0" b="0"/>
             <wp:docPr id="30" name="30-data-sources.png" descr="The Data Sources page with a table of connections and five row icons." title="The Data Sources page with a table of connections and five row icons."/>
@@ -41300,7 +41300,7 @@
       <w:pPr>
         <w:pStyle w:val="Ttulo2"/>
       </w:pPr>
-      <w:bookmarkStart w:id="46" w:name="_Toc241692041"/>
+      <w:bookmarkStart w:id="46" w:name="_Toc241695929"/>
       <w:r>
         <w:t>Import tables</w:t>
       </w:r>
@@ -41462,7 +41462,7 @@
           <w:noProof/>
         </w:rPr>
         <w:drawing>
-          <wp:inline distT="0" distB="0" distL="0" distR="0" wp14:anchorId="3F689D62" wp14:editId="2B6A9A89">
+          <wp:inline distT="0" distB="0" distL="0" distR="0" wp14:anchorId="1750649C" wp14:editId="02306621">
             <wp:extent cx="3324225" cy="2286000"/>
             <wp:effectExtent l="0" t="0" r="0" b="0"/>
             <wp:docPr id="31" name="34-data-sources-import-dialog.png" descr="The Import Tables dialog with the Discover Tables button, before any table is found." title="The Import Tables dialog with the Discover Tables button, before any table is found."/>
@@ -41515,7 +41515,7 @@
         <w:pStyle w:val="Ttulo1"/>
         <w:pageBreakBefore/>
       </w:pPr>
-      <w:bookmarkStart w:id="47" w:name="_Toc241692042"/>
+      <w:bookmarkStart w:id="47" w:name="_Toc241695930"/>
       <w:r>
         <w:lastRenderedPageBreak/>
         <w:t>Users</w:t>
@@ -41545,7 +41545,7 @@
           <w:noProof/>
         </w:rPr>
         <w:drawing>
-          <wp:inline distT="0" distB="0" distL="0" distR="0" wp14:anchorId="33B73CC2" wp14:editId="17A2A0CA">
+          <wp:inline distT="0" distB="0" distL="0" distR="0" wp14:anchorId="15CABA79" wp14:editId="1D6071D1">
             <wp:extent cx="5715000" cy="3571875"/>
             <wp:effectExtent l="0" t="0" r="0" b="0"/>
             <wp:docPr id="32" name="35-users.png" descr="The Users page with the Credentials file and New User buttons and row icons." title="The Users page with the Credentials file and New User buttons and row icons."/>
@@ -42244,7 +42244,7 @@
       <w:pPr>
         <w:pStyle w:val="Ttulo2"/>
       </w:pPr>
-      <w:bookmarkStart w:id="48" w:name="_Toc241692043"/>
+      <w:bookmarkStart w:id="48" w:name="_Toc241695931"/>
       <w:r>
         <w:lastRenderedPageBreak/>
         <w:t>Create or change a user</w:t>
@@ -42840,7 +42840,27 @@
               <w:t>Can edit</w:t>
             </w:r>
             <w:r>
-              <w:t xml:space="preserve">. Cannot change business areas, folders, items, joins or hierarchies, whatever grant they hold. Cannot use </w:t>
+              <w:t xml:space="preserve">. Sees, edits, activates and deactivates MANAGER, USER and VIEWER accounts, but never sees administrators and cannot create or delete users or give the ADMIN role. Cannot change business areas, folders, items, joins or hierarchies, whatever grant they hold. Cannot use </w:t>
+            </w:r>
+            <w:r>
+              <w:rPr>
+                <w:b/>
+                <w:bCs/>
+              </w:rPr>
+              <w:t>Custom Functions</w:t>
+            </w:r>
+            <w:r>
+              <w:t xml:space="preserve">, </w:t>
+            </w:r>
+            <w:r>
+              <w:rPr>
+                <w:b/>
+                <w:bCs/>
+              </w:rPr>
+              <w:t>Data Sources</w:t>
+            </w:r>
+            <w:r>
+              <w:t xml:space="preserve">, </w:t>
             </w:r>
             <w:r>
               <w:rPr>
@@ -43062,7 +43082,7 @@
         </w:rPr>
         <w:lastRenderedPageBreak/>
         <w:drawing>
-          <wp:inline distT="0" distB="0" distL="0" distR="0" wp14:anchorId="54FF35B4" wp14:editId="5DBC2FCD">
+          <wp:inline distT="0" distB="0" distL="0" distR="0" wp14:anchorId="17FB1417" wp14:editId="163E782F">
             <wp:extent cx="5715000" cy="3571875"/>
             <wp:effectExtent l="0" t="0" r="0" b="0"/>
             <wp:docPr id="33" name="37-users-role-open.png" descr="The New User dialog with the Role list open and each role described." title="The New User dialog with the Role list open and each role described."/>
@@ -43114,7 +43134,7 @@
       <w:pPr>
         <w:pStyle w:val="Ttulo2"/>
       </w:pPr>
-      <w:bookmarkStart w:id="49" w:name="_Toc241692044"/>
+      <w:bookmarkStart w:id="49" w:name="_Toc241695932"/>
       <w:r>
         <w:t>Deactivate, activate or delete</w:t>
       </w:r>
@@ -43206,7 +43226,7 @@
           <w:noProof/>
         </w:rPr>
         <w:drawing>
-          <wp:inline distT="0" distB="0" distL="0" distR="0" wp14:anchorId="1782BD84" wp14:editId="0DAD35F7">
+          <wp:inline distT="0" distB="0" distL="0" distR="0" wp14:anchorId="75955948" wp14:editId="7D8F1C2C">
             <wp:extent cx="3324225" cy="1076325"/>
             <wp:effectExtent l="0" t="0" r="0" b="0"/>
             <wp:docPr id="34" name="39-users-deactivate-dialog.png" descr="The confirmation dialog shown before deactivating a user." title="The confirmation dialog shown before deactivating a user."/>
@@ -43298,7 +43318,7 @@
       <w:pPr>
         <w:pStyle w:val="Ttulo2"/>
       </w:pPr>
-      <w:bookmarkStart w:id="50" w:name="_Toc241692045"/>
+      <w:bookmarkStart w:id="50" w:name="_Toc241695933"/>
       <w:r>
         <w:t>The credentials file</w:t>
       </w:r>
@@ -43323,7 +43343,7 @@
       <w:pPr>
         <w:pStyle w:val="Ttulo2"/>
       </w:pPr>
-      <w:bookmarkStart w:id="51" w:name="_Toc241692046"/>
+      <w:bookmarkStart w:id="51" w:name="_Toc241695934"/>
       <w:r>
         <w:lastRenderedPageBreak/>
         <w:t>Maps this user can open</w:t>
@@ -43366,7 +43386,7 @@
           <w:noProof/>
         </w:rPr>
         <w:drawing>
-          <wp:inline distT="0" distB="0" distL="0" distR="0" wp14:anchorId="48FC035F" wp14:editId="071A27A9">
+          <wp:inline distT="0" distB="0" distL="0" distR="0" wp14:anchorId="7638B3B3" wp14:editId="7852D3A2">
             <wp:extent cx="4362450" cy="2190750"/>
             <wp:effectExtent l="0" t="0" r="0" b="0"/>
             <wp:docPr id="35" name="41-users-maps-dialog.png" descr="The Maps dialog for a user, with source badges and share-level selects." title="The Maps dialog for a user, with source badges and share-level selects."/>
@@ -44308,7 +44328,7 @@
         <w:pStyle w:val="Ttulo1"/>
         <w:pageBreakBefore/>
       </w:pPr>
-      <w:bookmarkStart w:id="52" w:name="_Toc241692047"/>
+      <w:bookmarkStart w:id="52" w:name="_Toc241695935"/>
       <w:r>
         <w:lastRenderedPageBreak/>
         <w:t>Security Policies</w:t>
@@ -44368,7 +44388,7 @@
           <w:noProof/>
         </w:rPr>
         <w:drawing>
-          <wp:inline distT="0" distB="0" distL="0" distR="0" wp14:anchorId="11703133" wp14:editId="181C2ADA">
+          <wp:inline distT="0" distB="0" distL="0" distR="0" wp14:anchorId="1C8DE690" wp14:editId="0AD2EDC5">
             <wp:extent cx="5715000" cy="3571875"/>
             <wp:effectExtent l="0" t="0" r="0" b="0"/>
             <wp:docPr id="36" name="43-security.png" descr="The Security Policies page with the Test and New Policy buttons." title="The Security Policies page with the Test and New Policy buttons."/>
@@ -44995,7 +45015,7 @@
       <w:pPr>
         <w:pStyle w:val="Ttulo2"/>
       </w:pPr>
-      <w:bookmarkStart w:id="53" w:name="_Toc241692048"/>
+      <w:bookmarkStart w:id="53" w:name="_Toc241695936"/>
       <w:r>
         <w:lastRenderedPageBreak/>
         <w:t>Write a policy</w:t>
@@ -46051,7 +46071,7 @@
         </w:rPr>
         <w:lastRenderedPageBreak/>
         <w:drawing>
-          <wp:inline distT="0" distB="0" distL="0" distR="0" wp14:anchorId="0BA49EF4" wp14:editId="45729B21">
+          <wp:inline distT="0" distB="0" distL="0" distR="0" wp14:anchorId="58F84EAB" wp14:editId="48EEE77D">
             <wp:extent cx="3324225" cy="4638675"/>
             <wp:effectExtent l="0" t="0" r="0" b="0"/>
             <wp:docPr id="37" name="46-security-validate.png" descr="The New Policy dialog after pressing Validate on a predicate." title="The New Policy dialog after pressing Validate on a predicate."/>
@@ -46103,7 +46123,7 @@
       <w:pPr>
         <w:pStyle w:val="Ttulo2"/>
       </w:pPr>
-      <w:bookmarkStart w:id="54" w:name="_Toc241692049"/>
+      <w:bookmarkStart w:id="54" w:name="_Toc241695937"/>
       <w:r>
         <w:t>Assign a policy</w:t>
       </w:r>
@@ -46493,7 +46513,7 @@
       <w:pPr>
         <w:pStyle w:val="Ttulo2"/>
       </w:pPr>
-      <w:bookmarkStart w:id="55" w:name="_Toc241692050"/>
+      <w:bookmarkStart w:id="55" w:name="_Toc241695938"/>
       <w:r>
         <w:lastRenderedPageBreak/>
         <w:t>Test a policy</w:t>
@@ -46568,7 +46588,7 @@
         <w:pStyle w:val="Ttulo1"/>
         <w:pageBreakBefore/>
       </w:pPr>
-      <w:bookmarkStart w:id="56" w:name="_Toc241692051"/>
+      <w:bookmarkStart w:id="56" w:name="_Toc241695939"/>
       <w:r>
         <w:lastRenderedPageBreak/>
         <w:t>Audit Log</w:t>
@@ -46601,7 +46621,7 @@
           <w:noProof/>
         </w:rPr>
         <w:drawing>
-          <wp:inline distT="0" distB="0" distL="0" distR="0" wp14:anchorId="58B62C6F" wp14:editId="5FD38A4B">
+          <wp:inline distT="0" distB="0" distL="0" distR="0" wp14:anchorId="1033796F" wp14:editId="21C654B1">
             <wp:extent cx="5715000" cy="3571875"/>
             <wp:effectExtent l="0" t="0" r="0" b="0"/>
             <wp:docPr id="38" name="47-audit.png" descr="The Audit Log page with export button, statistic cards, daily chart and filters." title="The Audit Log page with export button, statistic cards, daily chart and filters."/>
@@ -47462,7 +47482,7 @@
         <w:pStyle w:val="Ttulo1"/>
         <w:pageBreakBefore/>
       </w:pPr>
-      <w:bookmarkStart w:id="57" w:name="_Toc241692052"/>
+      <w:bookmarkStart w:id="57" w:name="_Toc241695940"/>
       <w:r>
         <w:lastRenderedPageBreak/>
         <w:t>Migration</w:t>
@@ -47542,7 +47562,7 @@
           <w:noProof/>
         </w:rPr>
         <w:drawing>
-          <wp:inline distT="0" distB="0" distL="0" distR="0" wp14:anchorId="516D55A2" wp14:editId="6A7B0163">
+          <wp:inline distT="0" distB="0" distL="0" distR="0" wp14:anchorId="50ABDB13" wp14:editId="6C003A65">
             <wp:extent cx="5715000" cy="3571875"/>
             <wp:effectExtent l="0" t="0" r="0" b="0"/>
             <wp:docPr id="39" name="50-migration.png" descr="The Migration page with the Source card, its buttons and help text." title="The Migration page with the Source card, its buttons and help text."/>
@@ -47619,7 +47639,7 @@
       <w:pPr>
         <w:pStyle w:val="Ttulo2"/>
       </w:pPr>
-      <w:bookmarkStart w:id="58" w:name="_Toc241692053"/>
+      <w:bookmarkStart w:id="58" w:name="_Toc241695941"/>
       <w:r>
         <w:t>Choose the source</w:t>
       </w:r>
@@ -48740,7 +48760,7 @@
       <w:pPr>
         <w:pStyle w:val="Ttulo2"/>
       </w:pPr>
-      <w:bookmarkStart w:id="59" w:name="_Toc241692054"/>
+      <w:bookmarkStart w:id="59" w:name="_Toc241695942"/>
       <w:r>
         <w:t>What each action does</w:t>
       </w:r>
@@ -49141,7 +49161,7 @@
       <w:pPr>
         <w:pStyle w:val="Ttulo2"/>
       </w:pPr>
-      <w:bookmarkStart w:id="60" w:name="_Toc241692055"/>
+      <w:bookmarkStart w:id="60" w:name="_Toc241695943"/>
       <w:r>
         <w:t>Do a migration safely</w:t>
       </w:r>
@@ -49383,7 +49403,7 @@
         <w:pStyle w:val="Ttulo1"/>
         <w:pageBreakBefore/>
       </w:pPr>
-      <w:bookmarkStart w:id="61" w:name="_Toc241692056"/>
+      <w:bookmarkStart w:id="61" w:name="_Toc241695944"/>
       <w:r>
         <w:lastRenderedPageBreak/>
         <w:t>Common questions</w:t>
@@ -49674,7 +49694,7 @@
       <w:pPr>
         <w:pStyle w:val="Ttulo2"/>
       </w:pPr>
-      <w:bookmarkStart w:id="62" w:name="_Toc241692057"/>
+      <w:bookmarkStart w:id="62" w:name="_Toc241695945"/>
       <w:r>
         <w:t>Glossary</w:t>
       </w:r>
@@ -50999,7 +51019,7 @@
         <w:sz w:val="16"/>
         <w:szCs w:val="16"/>
       </w:rPr>
-      <w:t>Discoverer Neo 2.0.1 · Complete guide · ADMIN</w:t>
+      <w:t>Discoverer Neo 2.1.0 · Complete guide · ADMIN</w:t>
     </w:r>
   </w:p>
 </w:hdr>
@@ -51008,10 +51028,10 @@
 <file path=word/numbering.xml><?xml version="1.0" encoding="utf-8"?>
 <w:numbering xmlns:wpc="http://schemas.microsoft.com/office/word/2010/wordprocessingCanvas" xmlns:cx="http://schemas.microsoft.com/office/drawing/2014/chartex" xmlns:cx1="http://schemas.microsoft.com/office/drawing/2015/9/8/chartex" xmlns:cx2="http://schemas.microsoft.com/office/drawing/2015/10/21/chartex" xmlns:cx3="http://schemas.microsoft.com/office/drawing/2016/5/9/chartex" xmlns:cx4="http://schemas.microsoft.com/office/drawing/2016/5/10/chartex" xmlns:cx5="http://schemas.microsoft.com/office/drawing/2016/5/11/chartex" xmlns:cx6="http://schemas.microsoft.com/office/drawing/2016/5/12/chartex" xmlns:cx7="http://schemas.microsoft.com/office/drawing/2016/5/13/chartex" xmlns:cx8="http://schemas.microsoft.com/office/drawing/2016/5/14/chartex" xmlns:mc="http://schemas.openxmlformats.org/markup-compatibility/2006" xmlns:aink="http://schemas.microsoft.com/office/drawing/2016/ink" xmlns:am3d="http://schemas.microsoft.com/office/drawing/2017/model3d" xmlns:o="urn:schemas-microsoft-com:office:office" xmlns:oel="http://schemas.microsoft.com/office/2019/extlst" xmlns:r="http://schemas.openxmlformats.org/officeDocument/2006/relationships" xmlns:m="http://schemas.openxmlformats.org/officeDocument/2006/math" xmlns:v="urn:schemas-microsoft-com:vml" xmlns:wp14="http://schemas.microsoft.com/office/word/2010/wordprocessingDrawing" xmlns:wp="http://schemas.openxmlformats.org/drawingml/2006/wordprocessingDrawing" xmlns:w10="urn:schemas-microsoft-com:office:word" xmlns:w="http://schemas.openxmlformats.org/wordprocessingml/2006/main" xmlns:w14="http://schemas.microsoft.com/office/word/2010/wordml" xmlns:w15="http://schemas.microsoft.com/office/word/2012/wordml" xmlns:w16cex="http://schemas.microsoft.com/office/word/2018/wordml/cex" xmlns:w16cid="http://schemas.microsoft.com/office/word/2016/wordml/cid" xmlns:w16="http://schemas.microsoft.com/office/word/2018/wordml" xmlns:w16sdtdh="http://schemas.microsoft.com/office/word/2020/wordml/sdtdatahash" xmlns:w16se="http://schemas.microsoft.com/office/word/2015/wordml/symex" xmlns:wpg="http://schemas.microsoft.com/office/word/2010/wordprocessingGroup" xmlns:wpi="http://schemas.microsoft.com/office/word/2010/wordprocessingInk" xmlns:wne="http://schemas.microsoft.com/office/word/2006/wordml" xmlns:wps="http://schemas.microsoft.com/office/word/2010/wordprocessingShape" mc:Ignorable="w14 w15 w16se w16cid w16 w16cex w16sdtdh wp14">
   <w:abstractNum w:abstractNumId="0" w15:restartNumberingAfterBreak="0">
-    <w:nsid w:val="00876738"/>
+    <w:nsid w:val="08072E52"/>
     <w:multiLevelType w:val="hybridMultilevel"/>
-    <w:tmpl w:val="574694A6"/>
-    <w:lvl w:ilvl="0" w:tplc="31363F52">
+    <w:tmpl w:val="52AC0C20"/>
+    <w:lvl w:ilvl="0" w:tplc="8E0CD718">
       <w:start w:val="1"/>
       <w:numFmt w:val="decimal"/>
       <w:lvlText w:val="%1."/>
@@ -51020,7 +51040,7 @@
         <w:ind w:left="360" w:hanging="300"/>
       </w:pPr>
     </w:lvl>
-    <w:lvl w:ilvl="1" w:tplc="B0065648" w:tentative="1">
+    <w:lvl w:ilvl="1" w:tplc="56F8E938" w:tentative="1">
       <w:start w:val="1"/>
       <w:numFmt w:val="lowerLetter"/>
       <w:lvlText w:val="%2."/>
@@ -51029,47 +51049,47 @@
         <w:ind w:left="720" w:hanging="300"/>
       </w:pPr>
     </w:lvl>
-    <w:lvl w:ilvl="2" w:tplc="73AE5600">
+    <w:lvl w:ilvl="2" w:tplc="A2C62714">
       <w:numFmt w:val="decimal"/>
       <w:lvlText w:val=""/>
       <w:lvlJc w:val="left"/>
     </w:lvl>
-    <w:lvl w:ilvl="3" w:tplc="BC267FC4">
+    <w:lvl w:ilvl="3" w:tplc="757C9CB0">
       <w:numFmt w:val="decimal"/>
       <w:lvlText w:val=""/>
       <w:lvlJc w:val="left"/>
     </w:lvl>
-    <w:lvl w:ilvl="4" w:tplc="F3F232AE">
+    <w:lvl w:ilvl="4" w:tplc="B9C40E1C">
       <w:numFmt w:val="decimal"/>
       <w:lvlText w:val=""/>
       <w:lvlJc w:val="left"/>
     </w:lvl>
-    <w:lvl w:ilvl="5" w:tplc="9E165CAE">
+    <w:lvl w:ilvl="5" w:tplc="84BECD9E">
       <w:numFmt w:val="decimal"/>
       <w:lvlText w:val=""/>
       <w:lvlJc w:val="left"/>
     </w:lvl>
-    <w:lvl w:ilvl="6" w:tplc="E862A570">
+    <w:lvl w:ilvl="6" w:tplc="B55074C4">
       <w:numFmt w:val="decimal"/>
       <w:lvlText w:val=""/>
       <w:lvlJc w:val="left"/>
     </w:lvl>
-    <w:lvl w:ilvl="7" w:tplc="566E1C26">
+    <w:lvl w:ilvl="7" w:tplc="047ECA34">
       <w:numFmt w:val="decimal"/>
       <w:lvlText w:val=""/>
       <w:lvlJc w:val="left"/>
     </w:lvl>
-    <w:lvl w:ilvl="8" w:tplc="39DAC3C2">
+    <w:lvl w:ilvl="8" w:tplc="CB121D16">
       <w:numFmt w:val="decimal"/>
       <w:lvlText w:val=""/>
       <w:lvlJc w:val="left"/>
     </w:lvl>
   </w:abstractNum>
   <w:abstractNum w:abstractNumId="1" w15:restartNumberingAfterBreak="0">
-    <w:nsid w:val="063A0836"/>
+    <w:nsid w:val="09C3354A"/>
     <w:multiLevelType w:val="hybridMultilevel"/>
-    <w:tmpl w:val="84343240"/>
-    <w:lvl w:ilvl="0" w:tplc="48D4531E">
+    <w:tmpl w:val="4F3C0DC4"/>
+    <w:lvl w:ilvl="0" w:tplc="571AE3AA">
       <w:start w:val="1"/>
       <w:numFmt w:val="decimal"/>
       <w:lvlText w:val="%1."/>
@@ -51078,7 +51098,7 @@
         <w:ind w:left="360" w:hanging="300"/>
       </w:pPr>
     </w:lvl>
-    <w:lvl w:ilvl="1" w:tplc="0C2C34BE" w:tentative="1">
+    <w:lvl w:ilvl="1" w:tplc="AD46C378" w:tentative="1">
       <w:start w:val="1"/>
       <w:numFmt w:val="lowerLetter"/>
       <w:lvlText w:val="%2."/>
@@ -51087,47 +51107,47 @@
         <w:ind w:left="720" w:hanging="300"/>
       </w:pPr>
     </w:lvl>
-    <w:lvl w:ilvl="2" w:tplc="EA44CA38">
+    <w:lvl w:ilvl="2" w:tplc="559A85DA">
       <w:numFmt w:val="decimal"/>
       <w:lvlText w:val=""/>
       <w:lvlJc w:val="left"/>
     </w:lvl>
-    <w:lvl w:ilvl="3" w:tplc="7C88EA30">
+    <w:lvl w:ilvl="3" w:tplc="7ECCD320">
       <w:numFmt w:val="decimal"/>
       <w:lvlText w:val=""/>
       <w:lvlJc w:val="left"/>
     </w:lvl>
-    <w:lvl w:ilvl="4" w:tplc="F5E4D510">
+    <w:lvl w:ilvl="4" w:tplc="F4C61798">
       <w:numFmt w:val="decimal"/>
       <w:lvlText w:val=""/>
       <w:lvlJc w:val="left"/>
     </w:lvl>
-    <w:lvl w:ilvl="5" w:tplc="847C2472">
+    <w:lvl w:ilvl="5" w:tplc="61E85648">
       <w:numFmt w:val="decimal"/>
       <w:lvlText w:val=""/>
       <w:lvlJc w:val="left"/>
     </w:lvl>
-    <w:lvl w:ilvl="6" w:tplc="7D3CC82A">
+    <w:lvl w:ilvl="6" w:tplc="5AC223A4">
       <w:numFmt w:val="decimal"/>
       <w:lvlText w:val=""/>
       <w:lvlJc w:val="left"/>
     </w:lvl>
-    <w:lvl w:ilvl="7" w:tplc="727ED0EE">
+    <w:lvl w:ilvl="7" w:tplc="947CD8DC">
       <w:numFmt w:val="decimal"/>
       <w:lvlText w:val=""/>
       <w:lvlJc w:val="left"/>
     </w:lvl>
-    <w:lvl w:ilvl="8" w:tplc="E6E0A0A2">
+    <w:lvl w:ilvl="8" w:tplc="0A40B98E">
       <w:numFmt w:val="decimal"/>
       <w:lvlText w:val=""/>
       <w:lvlJc w:val="left"/>
     </w:lvl>
   </w:abstractNum>
   <w:abstractNum w:abstractNumId="2" w15:restartNumberingAfterBreak="0">
-    <w:nsid w:val="129E65F9"/>
+    <w:nsid w:val="113E3A4F"/>
     <w:multiLevelType w:val="hybridMultilevel"/>
-    <w:tmpl w:val="7E34F960"/>
-    <w:lvl w:ilvl="0" w:tplc="72D86060">
+    <w:tmpl w:val="686A35A2"/>
+    <w:lvl w:ilvl="0" w:tplc="FF68D900">
       <w:start w:val="1"/>
       <w:numFmt w:val="decimal"/>
       <w:lvlText w:val="%1."/>
@@ -51136,7 +51156,7 @@
         <w:ind w:left="360" w:hanging="300"/>
       </w:pPr>
     </w:lvl>
-    <w:lvl w:ilvl="1" w:tplc="CC64C192" w:tentative="1">
+    <w:lvl w:ilvl="1" w:tplc="8E6C6BB0" w:tentative="1">
       <w:start w:val="1"/>
       <w:numFmt w:val="lowerLetter"/>
       <w:lvlText w:val="%2."/>
@@ -51145,47 +51165,47 @@
         <w:ind w:left="720" w:hanging="300"/>
       </w:pPr>
     </w:lvl>
-    <w:lvl w:ilvl="2" w:tplc="B63815DC">
+    <w:lvl w:ilvl="2" w:tplc="DB18E63E">
       <w:numFmt w:val="decimal"/>
       <w:lvlText w:val=""/>
       <w:lvlJc w:val="left"/>
     </w:lvl>
-    <w:lvl w:ilvl="3" w:tplc="FA5097EA">
+    <w:lvl w:ilvl="3" w:tplc="8116CEF0">
       <w:numFmt w:val="decimal"/>
       <w:lvlText w:val=""/>
       <w:lvlJc w:val="left"/>
     </w:lvl>
-    <w:lvl w:ilvl="4" w:tplc="7DE672E2">
+    <w:lvl w:ilvl="4" w:tplc="8C96D392">
       <w:numFmt w:val="decimal"/>
       <w:lvlText w:val=""/>
       <w:lvlJc w:val="left"/>
     </w:lvl>
-    <w:lvl w:ilvl="5" w:tplc="D0388BBA">
+    <w:lvl w:ilvl="5" w:tplc="445A877E">
       <w:numFmt w:val="decimal"/>
       <w:lvlText w:val=""/>
       <w:lvlJc w:val="left"/>
     </w:lvl>
-    <w:lvl w:ilvl="6" w:tplc="DBAC0242">
+    <w:lvl w:ilvl="6" w:tplc="7978569A">
       <w:numFmt w:val="decimal"/>
       <w:lvlText w:val=""/>
       <w:lvlJc w:val="left"/>
     </w:lvl>
-    <w:lvl w:ilvl="7" w:tplc="151E8850">
+    <w:lvl w:ilvl="7" w:tplc="ACB8907A">
       <w:numFmt w:val="decimal"/>
       <w:lvlText w:val=""/>
       <w:lvlJc w:val="left"/>
     </w:lvl>
-    <w:lvl w:ilvl="8" w:tplc="ED3E0EBC">
+    <w:lvl w:ilvl="8" w:tplc="0568AC78">
       <w:numFmt w:val="decimal"/>
       <w:lvlText w:val=""/>
       <w:lvlJc w:val="left"/>
     </w:lvl>
   </w:abstractNum>
   <w:abstractNum w:abstractNumId="3" w15:restartNumberingAfterBreak="0">
-    <w:nsid w:val="16415FB6"/>
+    <w:nsid w:val="141938A6"/>
     <w:multiLevelType w:val="hybridMultilevel"/>
-    <w:tmpl w:val="1D4A1CB0"/>
-    <w:lvl w:ilvl="0" w:tplc="D8FE1B7E">
+    <w:tmpl w:val="F4E22EF6"/>
+    <w:lvl w:ilvl="0" w:tplc="16BC884E">
       <w:start w:val="1"/>
       <w:numFmt w:val="decimal"/>
       <w:lvlText w:val="%1."/>
@@ -51194,7 +51214,7 @@
         <w:ind w:left="360" w:hanging="300"/>
       </w:pPr>
     </w:lvl>
-    <w:lvl w:ilvl="1" w:tplc="36F4A206" w:tentative="1">
+    <w:lvl w:ilvl="1" w:tplc="7E1C6A36" w:tentative="1">
       <w:start w:val="1"/>
       <w:numFmt w:val="lowerLetter"/>
       <w:lvlText w:val="%2."/>
@@ -51203,47 +51223,47 @@
         <w:ind w:left="720" w:hanging="300"/>
       </w:pPr>
     </w:lvl>
-    <w:lvl w:ilvl="2" w:tplc="324AD18E">
+    <w:lvl w:ilvl="2" w:tplc="1BC0ECB6">
       <w:numFmt w:val="decimal"/>
       <w:lvlText w:val=""/>
       <w:lvlJc w:val="left"/>
     </w:lvl>
-    <w:lvl w:ilvl="3" w:tplc="B3FAF714">
+    <w:lvl w:ilvl="3" w:tplc="823A4FEA">
       <w:numFmt w:val="decimal"/>
       <w:lvlText w:val=""/>
       <w:lvlJc w:val="left"/>
     </w:lvl>
-    <w:lvl w:ilvl="4" w:tplc="40288AAA">
+    <w:lvl w:ilvl="4" w:tplc="1D3E51EE">
       <w:numFmt w:val="decimal"/>
       <w:lvlText w:val=""/>
       <w:lvlJc w:val="left"/>
     </w:lvl>
-    <w:lvl w:ilvl="5" w:tplc="0D7E07B2">
+    <w:lvl w:ilvl="5" w:tplc="788C1A38">
       <w:numFmt w:val="decimal"/>
       <w:lvlText w:val=""/>
       <w:lvlJc w:val="left"/>
     </w:lvl>
-    <w:lvl w:ilvl="6" w:tplc="7F963F36">
+    <w:lvl w:ilvl="6" w:tplc="318C46E8">
       <w:numFmt w:val="decimal"/>
       <w:lvlText w:val=""/>
       <w:lvlJc w:val="left"/>
     </w:lvl>
-    <w:lvl w:ilvl="7" w:tplc="4964EED6">
+    <w:lvl w:ilvl="7" w:tplc="BC64D32C">
       <w:numFmt w:val="decimal"/>
       <w:lvlText w:val=""/>
       <w:lvlJc w:val="left"/>
     </w:lvl>
-    <w:lvl w:ilvl="8" w:tplc="349CD578">
+    <w:lvl w:ilvl="8" w:tplc="F7CAAD7E">
       <w:numFmt w:val="decimal"/>
       <w:lvlText w:val=""/>
       <w:lvlJc w:val="left"/>
     </w:lvl>
   </w:abstractNum>
   <w:abstractNum w:abstractNumId="4" w15:restartNumberingAfterBreak="0">
-    <w:nsid w:val="22B25208"/>
+    <w:nsid w:val="2897592D"/>
     <w:multiLevelType w:val="hybridMultilevel"/>
-    <w:tmpl w:val="9DA2BA64"/>
-    <w:lvl w:ilvl="0" w:tplc="155CF00C">
+    <w:tmpl w:val="C29A261A"/>
+    <w:lvl w:ilvl="0" w:tplc="1696CBEE">
       <w:start w:val="1"/>
       <w:numFmt w:val="decimal"/>
       <w:lvlText w:val="%1."/>
@@ -51252,7 +51272,7 @@
         <w:ind w:left="360" w:hanging="300"/>
       </w:pPr>
     </w:lvl>
-    <w:lvl w:ilvl="1" w:tplc="A4A4AB62" w:tentative="1">
+    <w:lvl w:ilvl="1" w:tplc="E9946F4E" w:tentative="1">
       <w:start w:val="1"/>
       <w:numFmt w:val="lowerLetter"/>
       <w:lvlText w:val="%2."/>
@@ -51261,47 +51281,105 @@
         <w:ind w:left="720" w:hanging="300"/>
       </w:pPr>
     </w:lvl>
-    <w:lvl w:ilvl="2" w:tplc="7372556C">
+    <w:lvl w:ilvl="2" w:tplc="A14A2BE6">
       <w:numFmt w:val="decimal"/>
       <w:lvlText w:val=""/>
       <w:lvlJc w:val="left"/>
     </w:lvl>
-    <w:lvl w:ilvl="3" w:tplc="A628E516">
+    <w:lvl w:ilvl="3" w:tplc="735AD73C">
       <w:numFmt w:val="decimal"/>
       <w:lvlText w:val=""/>
       <w:lvlJc w:val="left"/>
     </w:lvl>
-    <w:lvl w:ilvl="4" w:tplc="FB3EFC16">
+    <w:lvl w:ilvl="4" w:tplc="A7969BF0">
       <w:numFmt w:val="decimal"/>
       <w:lvlText w:val=""/>
       <w:lvlJc w:val="left"/>
     </w:lvl>
-    <w:lvl w:ilvl="5" w:tplc="A3CEB992">
+    <w:lvl w:ilvl="5" w:tplc="C29ECF4A">
       <w:numFmt w:val="decimal"/>
       <w:lvlText w:val=""/>
       <w:lvlJc w:val="left"/>
     </w:lvl>
-    <w:lvl w:ilvl="6" w:tplc="911415C0">
+    <w:lvl w:ilvl="6" w:tplc="CE18037C">
       <w:numFmt w:val="decimal"/>
       <w:lvlText w:val=""/>
       <w:lvlJc w:val="left"/>
     </w:lvl>
-    <w:lvl w:ilvl="7" w:tplc="BB7AD15A">
+    <w:lvl w:ilvl="7" w:tplc="EA5C8B0E">
       <w:numFmt w:val="decimal"/>
       <w:lvlText w:val=""/>
       <w:lvlJc w:val="left"/>
     </w:lvl>
-    <w:lvl w:ilvl="8" w:tplc="06761A6E">
+    <w:lvl w:ilvl="8" w:tplc="3782F248">
       <w:numFmt w:val="decimal"/>
       <w:lvlText w:val=""/>
       <w:lvlJc w:val="left"/>
     </w:lvl>
   </w:abstractNum>
   <w:abstractNum w:abstractNumId="5" w15:restartNumberingAfterBreak="0">
-    <w:nsid w:val="24727370"/>
+    <w:nsid w:val="30167582"/>
     <w:multiLevelType w:val="hybridMultilevel"/>
-    <w:tmpl w:val="E3745824"/>
-    <w:lvl w:ilvl="0" w:tplc="F006C04A">
+    <w:tmpl w:val="821A8AEE"/>
+    <w:lvl w:ilvl="0" w:tplc="61F6AFA6">
+      <w:start w:val="1"/>
+      <w:numFmt w:val="bullet"/>
+      <w:lvlText w:val="•"/>
+      <w:lvlJc w:val="left"/>
+      <w:pPr>
+        <w:ind w:left="360" w:hanging="260"/>
+      </w:pPr>
+    </w:lvl>
+    <w:lvl w:ilvl="1" w:tplc="1A046A1C" w:tentative="1">
+      <w:start w:val="1"/>
+      <w:numFmt w:val="bullet"/>
+      <w:lvlText w:val="–"/>
+      <w:lvlJc w:val="left"/>
+      <w:pPr>
+        <w:ind w:left="720" w:hanging="260"/>
+      </w:pPr>
+    </w:lvl>
+    <w:lvl w:ilvl="2" w:tplc="3D0C808A">
+      <w:numFmt w:val="decimal"/>
+      <w:lvlText w:val=""/>
+      <w:lvlJc w:val="left"/>
+    </w:lvl>
+    <w:lvl w:ilvl="3" w:tplc="CFE86EB8">
+      <w:numFmt w:val="decimal"/>
+      <w:lvlText w:val=""/>
+      <w:lvlJc w:val="left"/>
+    </w:lvl>
+    <w:lvl w:ilvl="4" w:tplc="00340C32">
+      <w:numFmt w:val="decimal"/>
+      <w:lvlText w:val=""/>
+      <w:lvlJc w:val="left"/>
+    </w:lvl>
+    <w:lvl w:ilvl="5" w:tplc="2336204A">
+      <w:numFmt w:val="decimal"/>
+      <w:lvlText w:val=""/>
+      <w:lvlJc w:val="left"/>
+    </w:lvl>
+    <w:lvl w:ilvl="6" w:tplc="0A885604">
+      <w:numFmt w:val="decimal"/>
+      <w:lvlText w:val=""/>
+      <w:lvlJc w:val="left"/>
+    </w:lvl>
+    <w:lvl w:ilvl="7" w:tplc="39422816">
+      <w:numFmt w:val="decimal"/>
+      <w:lvlText w:val=""/>
+      <w:lvlJc w:val="left"/>
+    </w:lvl>
+    <w:lvl w:ilvl="8" w:tplc="5360F0DA">
+      <w:numFmt w:val="decimal"/>
+      <w:lvlText w:val=""/>
+      <w:lvlJc w:val="left"/>
+    </w:lvl>
+  </w:abstractNum>
+  <w:abstractNum w:abstractNumId="6" w15:restartNumberingAfterBreak="0">
+    <w:nsid w:val="379D4F5A"/>
+    <w:multiLevelType w:val="hybridMultilevel"/>
+    <w:tmpl w:val="CC323BA0"/>
+    <w:lvl w:ilvl="0" w:tplc="EE20CAFC">
       <w:start w:val="1"/>
       <w:numFmt w:val="decimal"/>
       <w:lvlText w:val="%1."/>
@@ -51310,7 +51388,7 @@
         <w:ind w:left="360" w:hanging="300"/>
       </w:pPr>
     </w:lvl>
-    <w:lvl w:ilvl="1" w:tplc="5B9A9F3A" w:tentative="1">
+    <w:lvl w:ilvl="1" w:tplc="A1B4E484" w:tentative="1">
       <w:start w:val="1"/>
       <w:numFmt w:val="lowerLetter"/>
       <w:lvlText w:val="%2."/>
@@ -51319,337 +51397,47 @@
         <w:ind w:left="720" w:hanging="300"/>
       </w:pPr>
     </w:lvl>
-    <w:lvl w:ilvl="2" w:tplc="EADA632C">
+    <w:lvl w:ilvl="2" w:tplc="602CCEF2">
       <w:numFmt w:val="decimal"/>
       <w:lvlText w:val=""/>
       <w:lvlJc w:val="left"/>
     </w:lvl>
-    <w:lvl w:ilvl="3" w:tplc="E9366C38">
+    <w:lvl w:ilvl="3" w:tplc="C66479B2">
       <w:numFmt w:val="decimal"/>
       <w:lvlText w:val=""/>
       <w:lvlJc w:val="left"/>
     </w:lvl>
-    <w:lvl w:ilvl="4" w:tplc="19BE1452">
+    <w:lvl w:ilvl="4" w:tplc="0D5E39C4">
       <w:numFmt w:val="decimal"/>
       <w:lvlText w:val=""/>
       <w:lvlJc w:val="left"/>
     </w:lvl>
-    <w:lvl w:ilvl="5" w:tplc="F0C67C60">
+    <w:lvl w:ilvl="5" w:tplc="70DC1F9E">
       <w:numFmt w:val="decimal"/>
       <w:lvlText w:val=""/>
       <w:lvlJc w:val="left"/>
     </w:lvl>
-    <w:lvl w:ilvl="6" w:tplc="D51C2204">
+    <w:lvl w:ilvl="6" w:tplc="37CAB156">
       <w:numFmt w:val="decimal"/>
       <w:lvlText w:val=""/>
       <w:lvlJc w:val="left"/>
     </w:lvl>
-    <w:lvl w:ilvl="7" w:tplc="63CE733E">
+    <w:lvl w:ilvl="7" w:tplc="C904322E">
       <w:numFmt w:val="decimal"/>
       <w:lvlText w:val=""/>
       <w:lvlJc w:val="left"/>
     </w:lvl>
-    <w:lvl w:ilvl="8" w:tplc="95B4BB88">
-      <w:numFmt w:val="decimal"/>
-      <w:lvlText w:val=""/>
-      <w:lvlJc w:val="left"/>
-    </w:lvl>
-  </w:abstractNum>
-  <w:abstractNum w:abstractNumId="6" w15:restartNumberingAfterBreak="0">
-    <w:nsid w:val="24F756EA"/>
-    <w:multiLevelType w:val="hybridMultilevel"/>
-    <w:tmpl w:val="376EC74C"/>
-    <w:lvl w:ilvl="0" w:tplc="301C0A18">
-      <w:start w:val="1"/>
-      <w:numFmt w:val="decimal"/>
-      <w:lvlText w:val="%1."/>
-      <w:lvlJc w:val="left"/>
-      <w:pPr>
-        <w:ind w:left="360" w:hanging="300"/>
-      </w:pPr>
-    </w:lvl>
-    <w:lvl w:ilvl="1" w:tplc="A38CC210" w:tentative="1">
-      <w:start w:val="1"/>
-      <w:numFmt w:val="lowerLetter"/>
-      <w:lvlText w:val="%2."/>
-      <w:lvlJc w:val="left"/>
-      <w:pPr>
-        <w:ind w:left="720" w:hanging="300"/>
-      </w:pPr>
-    </w:lvl>
-    <w:lvl w:ilvl="2" w:tplc="71D8DC50">
-      <w:numFmt w:val="decimal"/>
-      <w:lvlText w:val=""/>
-      <w:lvlJc w:val="left"/>
-    </w:lvl>
-    <w:lvl w:ilvl="3" w:tplc="A5C26F60">
-      <w:numFmt w:val="decimal"/>
-      <w:lvlText w:val=""/>
-      <w:lvlJc w:val="left"/>
-    </w:lvl>
-    <w:lvl w:ilvl="4" w:tplc="354AA1EA">
-      <w:numFmt w:val="decimal"/>
-      <w:lvlText w:val=""/>
-      <w:lvlJc w:val="left"/>
-    </w:lvl>
-    <w:lvl w:ilvl="5" w:tplc="3AF8CC54">
-      <w:numFmt w:val="decimal"/>
-      <w:lvlText w:val=""/>
-      <w:lvlJc w:val="left"/>
-    </w:lvl>
-    <w:lvl w:ilvl="6" w:tplc="422E516C">
-      <w:numFmt w:val="decimal"/>
-      <w:lvlText w:val=""/>
-      <w:lvlJc w:val="left"/>
-    </w:lvl>
-    <w:lvl w:ilvl="7" w:tplc="23F82ABE">
-      <w:numFmt w:val="decimal"/>
-      <w:lvlText w:val=""/>
-      <w:lvlJc w:val="left"/>
-    </w:lvl>
-    <w:lvl w:ilvl="8" w:tplc="20EC61A8">
+    <w:lvl w:ilvl="8" w:tplc="6FD6D986">
       <w:numFmt w:val="decimal"/>
       <w:lvlText w:val=""/>
       <w:lvlJc w:val="left"/>
     </w:lvl>
   </w:abstractNum>
   <w:abstractNum w:abstractNumId="7" w15:restartNumberingAfterBreak="0">
-    <w:nsid w:val="28092643"/>
+    <w:nsid w:val="37F1499B"/>
     <w:multiLevelType w:val="hybridMultilevel"/>
-    <w:tmpl w:val="1CCE54F2"/>
-    <w:lvl w:ilvl="0" w:tplc="43740E10">
-      <w:start w:val="1"/>
-      <w:numFmt w:val="decimal"/>
-      <w:lvlText w:val="%1."/>
-      <w:lvlJc w:val="left"/>
-      <w:pPr>
-        <w:ind w:left="360" w:hanging="300"/>
-      </w:pPr>
-    </w:lvl>
-    <w:lvl w:ilvl="1" w:tplc="0068D8F6" w:tentative="1">
-      <w:start w:val="1"/>
-      <w:numFmt w:val="lowerLetter"/>
-      <w:lvlText w:val="%2."/>
-      <w:lvlJc w:val="left"/>
-      <w:pPr>
-        <w:ind w:left="720" w:hanging="300"/>
-      </w:pPr>
-    </w:lvl>
-    <w:lvl w:ilvl="2" w:tplc="113C808C">
-      <w:numFmt w:val="decimal"/>
-      <w:lvlText w:val=""/>
-      <w:lvlJc w:val="left"/>
-    </w:lvl>
-    <w:lvl w:ilvl="3" w:tplc="E7DA224C">
-      <w:numFmt w:val="decimal"/>
-      <w:lvlText w:val=""/>
-      <w:lvlJc w:val="left"/>
-    </w:lvl>
-    <w:lvl w:ilvl="4" w:tplc="03D45E60">
-      <w:numFmt w:val="decimal"/>
-      <w:lvlText w:val=""/>
-      <w:lvlJc w:val="left"/>
-    </w:lvl>
-    <w:lvl w:ilvl="5" w:tplc="18A856FC">
-      <w:numFmt w:val="decimal"/>
-      <w:lvlText w:val=""/>
-      <w:lvlJc w:val="left"/>
-    </w:lvl>
-    <w:lvl w:ilvl="6" w:tplc="56CC57AE">
-      <w:numFmt w:val="decimal"/>
-      <w:lvlText w:val=""/>
-      <w:lvlJc w:val="left"/>
-    </w:lvl>
-    <w:lvl w:ilvl="7" w:tplc="266E8F1E">
-      <w:numFmt w:val="decimal"/>
-      <w:lvlText w:val=""/>
-      <w:lvlJc w:val="left"/>
-    </w:lvl>
-    <w:lvl w:ilvl="8" w:tplc="1EF8683A">
-      <w:numFmt w:val="decimal"/>
-      <w:lvlText w:val=""/>
-      <w:lvlJc w:val="left"/>
-    </w:lvl>
-  </w:abstractNum>
-  <w:abstractNum w:abstractNumId="8" w15:restartNumberingAfterBreak="0">
-    <w:nsid w:val="298C0F41"/>
-    <w:multiLevelType w:val="hybridMultilevel"/>
-    <w:tmpl w:val="E0CC997A"/>
-    <w:lvl w:ilvl="0" w:tplc="5AC23648">
-      <w:start w:val="1"/>
-      <w:numFmt w:val="decimal"/>
-      <w:lvlText w:val="%1."/>
-      <w:lvlJc w:val="left"/>
-      <w:pPr>
-        <w:ind w:left="360" w:hanging="300"/>
-      </w:pPr>
-    </w:lvl>
-    <w:lvl w:ilvl="1" w:tplc="E7A2CA38" w:tentative="1">
-      <w:start w:val="1"/>
-      <w:numFmt w:val="lowerLetter"/>
-      <w:lvlText w:val="%2."/>
-      <w:lvlJc w:val="left"/>
-      <w:pPr>
-        <w:ind w:left="720" w:hanging="300"/>
-      </w:pPr>
-    </w:lvl>
-    <w:lvl w:ilvl="2" w:tplc="6456AD30">
-      <w:numFmt w:val="decimal"/>
-      <w:lvlText w:val=""/>
-      <w:lvlJc w:val="left"/>
-    </w:lvl>
-    <w:lvl w:ilvl="3" w:tplc="84E24AB0">
-      <w:numFmt w:val="decimal"/>
-      <w:lvlText w:val=""/>
-      <w:lvlJc w:val="left"/>
-    </w:lvl>
-    <w:lvl w:ilvl="4" w:tplc="BA0610BC">
-      <w:numFmt w:val="decimal"/>
-      <w:lvlText w:val=""/>
-      <w:lvlJc w:val="left"/>
-    </w:lvl>
-    <w:lvl w:ilvl="5" w:tplc="3D44B630">
-      <w:numFmt w:val="decimal"/>
-      <w:lvlText w:val=""/>
-      <w:lvlJc w:val="left"/>
-    </w:lvl>
-    <w:lvl w:ilvl="6" w:tplc="DCFA1BCA">
-      <w:numFmt w:val="decimal"/>
-      <w:lvlText w:val=""/>
-      <w:lvlJc w:val="left"/>
-    </w:lvl>
-    <w:lvl w:ilvl="7" w:tplc="63C01AF0">
-      <w:numFmt w:val="decimal"/>
-      <w:lvlText w:val=""/>
-      <w:lvlJc w:val="left"/>
-    </w:lvl>
-    <w:lvl w:ilvl="8" w:tplc="B98A6AF6">
-      <w:numFmt w:val="decimal"/>
-      <w:lvlText w:val=""/>
-      <w:lvlJc w:val="left"/>
-    </w:lvl>
-  </w:abstractNum>
-  <w:abstractNum w:abstractNumId="9" w15:restartNumberingAfterBreak="0">
-    <w:nsid w:val="2BA16F37"/>
-    <w:multiLevelType w:val="hybridMultilevel"/>
-    <w:tmpl w:val="AF1EB818"/>
-    <w:lvl w:ilvl="0" w:tplc="162274F4">
-      <w:start w:val="1"/>
-      <w:numFmt w:val="bullet"/>
-      <w:lvlText w:val="•"/>
-      <w:lvlJc w:val="left"/>
-      <w:pPr>
-        <w:ind w:left="360" w:hanging="260"/>
-      </w:pPr>
-    </w:lvl>
-    <w:lvl w:ilvl="1" w:tplc="51F6A560" w:tentative="1">
-      <w:start w:val="1"/>
-      <w:numFmt w:val="bullet"/>
-      <w:lvlText w:val="–"/>
-      <w:lvlJc w:val="left"/>
-      <w:pPr>
-        <w:ind w:left="720" w:hanging="260"/>
-      </w:pPr>
-    </w:lvl>
-    <w:lvl w:ilvl="2" w:tplc="EE4689C8">
-      <w:numFmt w:val="decimal"/>
-      <w:lvlText w:val=""/>
-      <w:lvlJc w:val="left"/>
-    </w:lvl>
-    <w:lvl w:ilvl="3" w:tplc="53401714">
-      <w:numFmt w:val="decimal"/>
-      <w:lvlText w:val=""/>
-      <w:lvlJc w:val="left"/>
-    </w:lvl>
-    <w:lvl w:ilvl="4" w:tplc="C93238A2">
-      <w:numFmt w:val="decimal"/>
-      <w:lvlText w:val=""/>
-      <w:lvlJc w:val="left"/>
-    </w:lvl>
-    <w:lvl w:ilvl="5" w:tplc="F064BFF0">
-      <w:numFmt w:val="decimal"/>
-      <w:lvlText w:val=""/>
-      <w:lvlJc w:val="left"/>
-    </w:lvl>
-    <w:lvl w:ilvl="6" w:tplc="E1E47B14">
-      <w:numFmt w:val="decimal"/>
-      <w:lvlText w:val=""/>
-      <w:lvlJc w:val="left"/>
-    </w:lvl>
-    <w:lvl w:ilvl="7" w:tplc="0A720792">
-      <w:numFmt w:val="decimal"/>
-      <w:lvlText w:val=""/>
-      <w:lvlJc w:val="left"/>
-    </w:lvl>
-    <w:lvl w:ilvl="8" w:tplc="F0CECD02">
-      <w:numFmt w:val="decimal"/>
-      <w:lvlText w:val=""/>
-      <w:lvlJc w:val="left"/>
-    </w:lvl>
-  </w:abstractNum>
-  <w:abstractNum w:abstractNumId="10" w15:restartNumberingAfterBreak="0">
-    <w:nsid w:val="2EA94FF8"/>
-    <w:multiLevelType w:val="hybridMultilevel"/>
-    <w:tmpl w:val="43242896"/>
-    <w:lvl w:ilvl="0" w:tplc="788AD014">
-      <w:start w:val="1"/>
-      <w:numFmt w:val="decimal"/>
-      <w:lvlText w:val="%1."/>
-      <w:lvlJc w:val="left"/>
-      <w:pPr>
-        <w:ind w:left="360" w:hanging="300"/>
-      </w:pPr>
-    </w:lvl>
-    <w:lvl w:ilvl="1" w:tplc="050CEA5C" w:tentative="1">
-      <w:start w:val="1"/>
-      <w:numFmt w:val="lowerLetter"/>
-      <w:lvlText w:val="%2."/>
-      <w:lvlJc w:val="left"/>
-      <w:pPr>
-        <w:ind w:left="720" w:hanging="300"/>
-      </w:pPr>
-    </w:lvl>
-    <w:lvl w:ilvl="2" w:tplc="7EF04B74">
-      <w:numFmt w:val="decimal"/>
-      <w:lvlText w:val=""/>
-      <w:lvlJc w:val="left"/>
-    </w:lvl>
-    <w:lvl w:ilvl="3" w:tplc="32AE828E">
-      <w:numFmt w:val="decimal"/>
-      <w:lvlText w:val=""/>
-      <w:lvlJc w:val="left"/>
-    </w:lvl>
-    <w:lvl w:ilvl="4" w:tplc="1EEED008">
-      <w:numFmt w:val="decimal"/>
-      <w:lvlText w:val=""/>
-      <w:lvlJc w:val="left"/>
-    </w:lvl>
-    <w:lvl w:ilvl="5" w:tplc="58A638FC">
-      <w:numFmt w:val="decimal"/>
-      <w:lvlText w:val=""/>
-      <w:lvlJc w:val="left"/>
-    </w:lvl>
-    <w:lvl w:ilvl="6" w:tplc="8328F7B6">
-      <w:numFmt w:val="decimal"/>
-      <w:lvlText w:val=""/>
-      <w:lvlJc w:val="left"/>
-    </w:lvl>
-    <w:lvl w:ilvl="7" w:tplc="9FDAD97E">
-      <w:numFmt w:val="decimal"/>
-      <w:lvlText w:val=""/>
-      <w:lvlJc w:val="left"/>
-    </w:lvl>
-    <w:lvl w:ilvl="8" w:tplc="4F90D114">
-      <w:numFmt w:val="decimal"/>
-      <w:lvlText w:val=""/>
-      <w:lvlJc w:val="left"/>
-    </w:lvl>
-  </w:abstractNum>
-  <w:abstractNum w:abstractNumId="11" w15:restartNumberingAfterBreak="0">
-    <w:nsid w:val="300C6C07"/>
-    <w:multiLevelType w:val="hybridMultilevel"/>
-    <w:tmpl w:val="2348D316"/>
-    <w:lvl w:ilvl="0" w:tplc="ABD6ADE8" w:tentative="1">
+    <w:tmpl w:val="EFECED08"/>
+    <w:lvl w:ilvl="0" w:tplc="FEC8CBCE" w:tentative="1">
       <w:start w:val="1"/>
       <w:numFmt w:val="bullet"/>
       <w:lvlText w:val="●"/>
@@ -51658,7 +51446,7 @@
         <w:ind w:left="720" w:hanging="360"/>
       </w:pPr>
     </w:lvl>
-    <w:lvl w:ilvl="1" w:tplc="3B8835CE" w:tentative="1">
+    <w:lvl w:ilvl="1" w:tplc="233E60FE" w:tentative="1">
       <w:start w:val="1"/>
       <w:numFmt w:val="bullet"/>
       <w:lvlText w:val="○"/>
@@ -51667,7 +51455,7 @@
         <w:ind w:left="1440" w:hanging="360"/>
       </w:pPr>
     </w:lvl>
-    <w:lvl w:ilvl="2" w:tplc="9D4C1C10" w:tentative="1">
+    <w:lvl w:ilvl="2" w:tplc="8E3ACA60" w:tentative="1">
       <w:start w:val="1"/>
       <w:numFmt w:val="bullet"/>
       <w:lvlText w:val="■"/>
@@ -51676,7 +51464,7 @@
         <w:ind w:left="2160" w:hanging="360"/>
       </w:pPr>
     </w:lvl>
-    <w:lvl w:ilvl="3" w:tplc="15EA0C64" w:tentative="1">
+    <w:lvl w:ilvl="3" w:tplc="5898363C" w:tentative="1">
       <w:start w:val="1"/>
       <w:numFmt w:val="bullet"/>
       <w:lvlText w:val="●"/>
@@ -51685,7 +51473,7 @@
         <w:ind w:left="2880" w:hanging="360"/>
       </w:pPr>
     </w:lvl>
-    <w:lvl w:ilvl="4" w:tplc="BB426F44" w:tentative="1">
+    <w:lvl w:ilvl="4" w:tplc="E8F6B586" w:tentative="1">
       <w:start w:val="1"/>
       <w:numFmt w:val="bullet"/>
       <w:lvlText w:val="○"/>
@@ -51694,7 +51482,7 @@
         <w:ind w:left="3600" w:hanging="360"/>
       </w:pPr>
     </w:lvl>
-    <w:lvl w:ilvl="5" w:tplc="2758E7C0" w:tentative="1">
+    <w:lvl w:ilvl="5" w:tplc="5492C58E" w:tentative="1">
       <w:start w:val="1"/>
       <w:numFmt w:val="bullet"/>
       <w:lvlText w:val="■"/>
@@ -51703,7 +51491,7 @@
         <w:ind w:left="4320" w:hanging="360"/>
       </w:pPr>
     </w:lvl>
-    <w:lvl w:ilvl="6" w:tplc="3BD2464E" w:tentative="1">
+    <w:lvl w:ilvl="6" w:tplc="8662E95C" w:tentative="1">
       <w:start w:val="1"/>
       <w:numFmt w:val="bullet"/>
       <w:lvlText w:val="●"/>
@@ -51712,7 +51500,7 @@
         <w:ind w:left="5040" w:hanging="360"/>
       </w:pPr>
     </w:lvl>
-    <w:lvl w:ilvl="7" w:tplc="AC12B954" w:tentative="1">
+    <w:lvl w:ilvl="7" w:tplc="14A8D932" w:tentative="1">
       <w:start w:val="1"/>
       <w:numFmt w:val="bullet"/>
       <w:lvlText w:val="●"/>
@@ -51721,7 +51509,7 @@
         <w:ind w:left="5760" w:hanging="360"/>
       </w:pPr>
     </w:lvl>
-    <w:lvl w:ilvl="8" w:tplc="68AAB1D0" w:tentative="1">
+    <w:lvl w:ilvl="8" w:tplc="11869422" w:tentative="1">
       <w:start w:val="1"/>
       <w:numFmt w:val="bullet"/>
       <w:lvlText w:val="●"/>
@@ -51731,11 +51519,11 @@
       </w:pPr>
     </w:lvl>
   </w:abstractNum>
-  <w:abstractNum w:abstractNumId="12" w15:restartNumberingAfterBreak="0">
-    <w:nsid w:val="59B07C55"/>
+  <w:abstractNum w:abstractNumId="8" w15:restartNumberingAfterBreak="0">
+    <w:nsid w:val="3A4233B9"/>
     <w:multiLevelType w:val="hybridMultilevel"/>
-    <w:tmpl w:val="4DB699E2"/>
-    <w:lvl w:ilvl="0" w:tplc="E7622678">
+    <w:tmpl w:val="EFA425CC"/>
+    <w:lvl w:ilvl="0" w:tplc="59DCA462">
       <w:start w:val="1"/>
       <w:numFmt w:val="decimal"/>
       <w:lvlText w:val="%1."/>
@@ -51744,7 +51532,7 @@
         <w:ind w:left="360" w:hanging="300"/>
       </w:pPr>
     </w:lvl>
-    <w:lvl w:ilvl="1" w:tplc="54FCA18A" w:tentative="1">
+    <w:lvl w:ilvl="1" w:tplc="C0E251C0" w:tentative="1">
       <w:start w:val="1"/>
       <w:numFmt w:val="lowerLetter"/>
       <w:lvlText w:val="%2."/>
@@ -51753,47 +51541,47 @@
         <w:ind w:left="720" w:hanging="300"/>
       </w:pPr>
     </w:lvl>
-    <w:lvl w:ilvl="2" w:tplc="C9EA91F4">
+    <w:lvl w:ilvl="2" w:tplc="B532EA4E">
       <w:numFmt w:val="decimal"/>
       <w:lvlText w:val=""/>
       <w:lvlJc w:val="left"/>
     </w:lvl>
-    <w:lvl w:ilvl="3" w:tplc="E17857E6">
+    <w:lvl w:ilvl="3" w:tplc="3946A4A2">
       <w:numFmt w:val="decimal"/>
       <w:lvlText w:val=""/>
       <w:lvlJc w:val="left"/>
     </w:lvl>
-    <w:lvl w:ilvl="4" w:tplc="66BA74DE">
+    <w:lvl w:ilvl="4" w:tplc="8E921CC4">
       <w:numFmt w:val="decimal"/>
       <w:lvlText w:val=""/>
       <w:lvlJc w:val="left"/>
     </w:lvl>
-    <w:lvl w:ilvl="5" w:tplc="E61C8534">
+    <w:lvl w:ilvl="5" w:tplc="D07E2E22">
       <w:numFmt w:val="decimal"/>
       <w:lvlText w:val=""/>
       <w:lvlJc w:val="left"/>
     </w:lvl>
-    <w:lvl w:ilvl="6" w:tplc="BDE0BB64">
+    <w:lvl w:ilvl="6" w:tplc="21D0A94A">
       <w:numFmt w:val="decimal"/>
       <w:lvlText w:val=""/>
       <w:lvlJc w:val="left"/>
     </w:lvl>
-    <w:lvl w:ilvl="7" w:tplc="A0A42798">
+    <w:lvl w:ilvl="7" w:tplc="267EFBB4">
       <w:numFmt w:val="decimal"/>
       <w:lvlText w:val=""/>
       <w:lvlJc w:val="left"/>
     </w:lvl>
-    <w:lvl w:ilvl="8" w:tplc="55749C80">
+    <w:lvl w:ilvl="8" w:tplc="F64685F2">
       <w:numFmt w:val="decimal"/>
       <w:lvlText w:val=""/>
       <w:lvlJc w:val="left"/>
     </w:lvl>
   </w:abstractNum>
-  <w:abstractNum w:abstractNumId="13" w15:restartNumberingAfterBreak="0">
-    <w:nsid w:val="72C7034B"/>
+  <w:abstractNum w:abstractNumId="9" w15:restartNumberingAfterBreak="0">
+    <w:nsid w:val="3F6D0A52"/>
     <w:multiLevelType w:val="hybridMultilevel"/>
-    <w:tmpl w:val="E2069534"/>
-    <w:lvl w:ilvl="0" w:tplc="5CB88E38">
+    <w:tmpl w:val="3F725206"/>
+    <w:lvl w:ilvl="0" w:tplc="276809FE">
       <w:start w:val="1"/>
       <w:numFmt w:val="decimal"/>
       <w:lvlText w:val="%1."/>
@@ -51802,7 +51590,7 @@
         <w:ind w:left="360" w:hanging="300"/>
       </w:pPr>
     </w:lvl>
-    <w:lvl w:ilvl="1" w:tplc="A72E086E" w:tentative="1">
+    <w:lvl w:ilvl="1" w:tplc="BE14967A" w:tentative="1">
       <w:start w:val="1"/>
       <w:numFmt w:val="lowerLetter"/>
       <w:lvlText w:val="%2."/>
@@ -51811,47 +51599,47 @@
         <w:ind w:left="720" w:hanging="300"/>
       </w:pPr>
     </w:lvl>
-    <w:lvl w:ilvl="2" w:tplc="BB9E1926">
+    <w:lvl w:ilvl="2" w:tplc="47805EE6">
       <w:numFmt w:val="decimal"/>
       <w:lvlText w:val=""/>
       <w:lvlJc w:val="left"/>
     </w:lvl>
-    <w:lvl w:ilvl="3" w:tplc="2CC0304E">
+    <w:lvl w:ilvl="3" w:tplc="025E23E4">
       <w:numFmt w:val="decimal"/>
       <w:lvlText w:val=""/>
       <w:lvlJc w:val="left"/>
     </w:lvl>
-    <w:lvl w:ilvl="4" w:tplc="9774D1D6">
+    <w:lvl w:ilvl="4" w:tplc="58C26544">
       <w:numFmt w:val="decimal"/>
       <w:lvlText w:val=""/>
       <w:lvlJc w:val="left"/>
     </w:lvl>
-    <w:lvl w:ilvl="5" w:tplc="81B22BC2">
+    <w:lvl w:ilvl="5" w:tplc="5CB8630E">
       <w:numFmt w:val="decimal"/>
       <w:lvlText w:val=""/>
       <w:lvlJc w:val="left"/>
     </w:lvl>
-    <w:lvl w:ilvl="6" w:tplc="131EDB4C">
+    <w:lvl w:ilvl="6" w:tplc="805EF5D6">
       <w:numFmt w:val="decimal"/>
       <w:lvlText w:val=""/>
       <w:lvlJc w:val="left"/>
     </w:lvl>
-    <w:lvl w:ilvl="7" w:tplc="72E42F0C">
+    <w:lvl w:ilvl="7" w:tplc="C5B43E94">
       <w:numFmt w:val="decimal"/>
       <w:lvlText w:val=""/>
       <w:lvlJc w:val="left"/>
     </w:lvl>
-    <w:lvl w:ilvl="8" w:tplc="3E886EBE">
+    <w:lvl w:ilvl="8" w:tplc="3A0678CA">
       <w:numFmt w:val="decimal"/>
       <w:lvlText w:val=""/>
       <w:lvlJc w:val="left"/>
     </w:lvl>
   </w:abstractNum>
-  <w:abstractNum w:abstractNumId="14" w15:restartNumberingAfterBreak="0">
-    <w:nsid w:val="786B64BD"/>
+  <w:abstractNum w:abstractNumId="10" w15:restartNumberingAfterBreak="0">
+    <w:nsid w:val="429932D9"/>
     <w:multiLevelType w:val="hybridMultilevel"/>
-    <w:tmpl w:val="FF680090"/>
-    <w:lvl w:ilvl="0" w:tplc="E0A83E22">
+    <w:tmpl w:val="DACC7B12"/>
+    <w:lvl w:ilvl="0" w:tplc="CE761618">
       <w:start w:val="1"/>
       <w:numFmt w:val="decimal"/>
       <w:lvlText w:val="%1."/>
@@ -51860,7 +51648,7 @@
         <w:ind w:left="360" w:hanging="300"/>
       </w:pPr>
     </w:lvl>
-    <w:lvl w:ilvl="1" w:tplc="1C5A0D50" w:tentative="1">
+    <w:lvl w:ilvl="1" w:tplc="06A66534" w:tentative="1">
       <w:start w:val="1"/>
       <w:numFmt w:val="lowerLetter"/>
       <w:lvlText w:val="%2."/>
@@ -51869,128 +51657,360 @@
         <w:ind w:left="720" w:hanging="300"/>
       </w:pPr>
     </w:lvl>
-    <w:lvl w:ilvl="2" w:tplc="3776170A">
+    <w:lvl w:ilvl="2" w:tplc="165057BA">
       <w:numFmt w:val="decimal"/>
       <w:lvlText w:val=""/>
       <w:lvlJc w:val="left"/>
     </w:lvl>
-    <w:lvl w:ilvl="3" w:tplc="48D21E22">
+    <w:lvl w:ilvl="3" w:tplc="16A66568">
       <w:numFmt w:val="decimal"/>
       <w:lvlText w:val=""/>
       <w:lvlJc w:val="left"/>
     </w:lvl>
-    <w:lvl w:ilvl="4" w:tplc="4DA8B0F6">
+    <w:lvl w:ilvl="4" w:tplc="DCAE9BFC">
       <w:numFmt w:val="decimal"/>
       <w:lvlText w:val=""/>
       <w:lvlJc w:val="left"/>
     </w:lvl>
-    <w:lvl w:ilvl="5" w:tplc="8190D128">
+    <w:lvl w:ilvl="5" w:tplc="83FE29EA">
       <w:numFmt w:val="decimal"/>
       <w:lvlText w:val=""/>
       <w:lvlJc w:val="left"/>
     </w:lvl>
-    <w:lvl w:ilvl="6" w:tplc="6390E8AA">
+    <w:lvl w:ilvl="6" w:tplc="50FA0FF4">
       <w:numFmt w:val="decimal"/>
       <w:lvlText w:val=""/>
       <w:lvlJc w:val="left"/>
     </w:lvl>
-    <w:lvl w:ilvl="7" w:tplc="6F2E9FEA">
+    <w:lvl w:ilvl="7" w:tplc="750CD220">
       <w:numFmt w:val="decimal"/>
       <w:lvlText w:val=""/>
       <w:lvlJc w:val="left"/>
     </w:lvl>
-    <w:lvl w:ilvl="8" w:tplc="85963D38">
+    <w:lvl w:ilvl="8" w:tplc="C39CCD36">
       <w:numFmt w:val="decimal"/>
       <w:lvlText w:val=""/>
       <w:lvlJc w:val="left"/>
     </w:lvl>
   </w:abstractNum>
-  <w:num w:numId="1" w16cid:durableId="1028142968">
+  <w:abstractNum w:abstractNumId="11" w15:restartNumberingAfterBreak="0">
+    <w:nsid w:val="445F27FC"/>
+    <w:multiLevelType w:val="hybridMultilevel"/>
+    <w:tmpl w:val="5710965C"/>
+    <w:lvl w:ilvl="0" w:tplc="C0389DC6">
+      <w:start w:val="1"/>
+      <w:numFmt w:val="decimal"/>
+      <w:lvlText w:val="%1."/>
+      <w:lvlJc w:val="left"/>
+      <w:pPr>
+        <w:ind w:left="360" w:hanging="300"/>
+      </w:pPr>
+    </w:lvl>
+    <w:lvl w:ilvl="1" w:tplc="435809AC" w:tentative="1">
+      <w:start w:val="1"/>
+      <w:numFmt w:val="lowerLetter"/>
+      <w:lvlText w:val="%2."/>
+      <w:lvlJc w:val="left"/>
+      <w:pPr>
+        <w:ind w:left="720" w:hanging="300"/>
+      </w:pPr>
+    </w:lvl>
+    <w:lvl w:ilvl="2" w:tplc="83D40450">
+      <w:numFmt w:val="decimal"/>
+      <w:lvlText w:val=""/>
+      <w:lvlJc w:val="left"/>
+    </w:lvl>
+    <w:lvl w:ilvl="3" w:tplc="DD3831F2">
+      <w:numFmt w:val="decimal"/>
+      <w:lvlText w:val=""/>
+      <w:lvlJc w:val="left"/>
+    </w:lvl>
+    <w:lvl w:ilvl="4" w:tplc="852EA59A">
+      <w:numFmt w:val="decimal"/>
+      <w:lvlText w:val=""/>
+      <w:lvlJc w:val="left"/>
+    </w:lvl>
+    <w:lvl w:ilvl="5" w:tplc="8CFC0BE8">
+      <w:numFmt w:val="decimal"/>
+      <w:lvlText w:val=""/>
+      <w:lvlJc w:val="left"/>
+    </w:lvl>
+    <w:lvl w:ilvl="6" w:tplc="1854BE78">
+      <w:numFmt w:val="decimal"/>
+      <w:lvlText w:val=""/>
+      <w:lvlJc w:val="left"/>
+    </w:lvl>
+    <w:lvl w:ilvl="7" w:tplc="B5CE41C4">
+      <w:numFmt w:val="decimal"/>
+      <w:lvlText w:val=""/>
+      <w:lvlJc w:val="left"/>
+    </w:lvl>
+    <w:lvl w:ilvl="8" w:tplc="78F0223C">
+      <w:numFmt w:val="decimal"/>
+      <w:lvlText w:val=""/>
+      <w:lvlJc w:val="left"/>
+    </w:lvl>
+  </w:abstractNum>
+  <w:abstractNum w:abstractNumId="12" w15:restartNumberingAfterBreak="0">
+    <w:nsid w:val="4CDB3672"/>
+    <w:multiLevelType w:val="hybridMultilevel"/>
+    <w:tmpl w:val="D9367842"/>
+    <w:lvl w:ilvl="0" w:tplc="01624EB4">
+      <w:start w:val="1"/>
+      <w:numFmt w:val="decimal"/>
+      <w:lvlText w:val="%1."/>
+      <w:lvlJc w:val="left"/>
+      <w:pPr>
+        <w:ind w:left="360" w:hanging="300"/>
+      </w:pPr>
+    </w:lvl>
+    <w:lvl w:ilvl="1" w:tplc="ACF48D40" w:tentative="1">
+      <w:start w:val="1"/>
+      <w:numFmt w:val="lowerLetter"/>
+      <w:lvlText w:val="%2."/>
+      <w:lvlJc w:val="left"/>
+      <w:pPr>
+        <w:ind w:left="720" w:hanging="300"/>
+      </w:pPr>
+    </w:lvl>
+    <w:lvl w:ilvl="2" w:tplc="77D6B700">
+      <w:numFmt w:val="decimal"/>
+      <w:lvlText w:val=""/>
+      <w:lvlJc w:val="left"/>
+    </w:lvl>
+    <w:lvl w:ilvl="3" w:tplc="24AE71E0">
+      <w:numFmt w:val="decimal"/>
+      <w:lvlText w:val=""/>
+      <w:lvlJc w:val="left"/>
+    </w:lvl>
+    <w:lvl w:ilvl="4" w:tplc="3FEA8082">
+      <w:numFmt w:val="decimal"/>
+      <w:lvlText w:val=""/>
+      <w:lvlJc w:val="left"/>
+    </w:lvl>
+    <w:lvl w:ilvl="5" w:tplc="8A0ED792">
+      <w:numFmt w:val="decimal"/>
+      <w:lvlText w:val=""/>
+      <w:lvlJc w:val="left"/>
+    </w:lvl>
+    <w:lvl w:ilvl="6" w:tplc="96501FB2">
+      <w:numFmt w:val="decimal"/>
+      <w:lvlText w:val=""/>
+      <w:lvlJc w:val="left"/>
+    </w:lvl>
+    <w:lvl w:ilvl="7" w:tplc="3BF80752">
+      <w:numFmt w:val="decimal"/>
+      <w:lvlText w:val=""/>
+      <w:lvlJc w:val="left"/>
+    </w:lvl>
+    <w:lvl w:ilvl="8" w:tplc="40543B70">
+      <w:numFmt w:val="decimal"/>
+      <w:lvlText w:val=""/>
+      <w:lvlJc w:val="left"/>
+    </w:lvl>
+  </w:abstractNum>
+  <w:abstractNum w:abstractNumId="13" w15:restartNumberingAfterBreak="0">
+    <w:nsid w:val="527B79E0"/>
+    <w:multiLevelType w:val="hybridMultilevel"/>
+    <w:tmpl w:val="B5D89B34"/>
+    <w:lvl w:ilvl="0" w:tplc="AFA4DC66">
+      <w:start w:val="1"/>
+      <w:numFmt w:val="decimal"/>
+      <w:lvlText w:val="%1."/>
+      <w:lvlJc w:val="left"/>
+      <w:pPr>
+        <w:ind w:left="360" w:hanging="300"/>
+      </w:pPr>
+    </w:lvl>
+    <w:lvl w:ilvl="1" w:tplc="B82E4408" w:tentative="1">
+      <w:start w:val="1"/>
+      <w:numFmt w:val="lowerLetter"/>
+      <w:lvlText w:val="%2."/>
+      <w:lvlJc w:val="left"/>
+      <w:pPr>
+        <w:ind w:left="720" w:hanging="300"/>
+      </w:pPr>
+    </w:lvl>
+    <w:lvl w:ilvl="2" w:tplc="48F66F62">
+      <w:numFmt w:val="decimal"/>
+      <w:lvlText w:val=""/>
+      <w:lvlJc w:val="left"/>
+    </w:lvl>
+    <w:lvl w:ilvl="3" w:tplc="8EA6E160">
+      <w:numFmt w:val="decimal"/>
+      <w:lvlText w:val=""/>
+      <w:lvlJc w:val="left"/>
+    </w:lvl>
+    <w:lvl w:ilvl="4" w:tplc="D262A7D6">
+      <w:numFmt w:val="decimal"/>
+      <w:lvlText w:val=""/>
+      <w:lvlJc w:val="left"/>
+    </w:lvl>
+    <w:lvl w:ilvl="5" w:tplc="2F2E8428">
+      <w:numFmt w:val="decimal"/>
+      <w:lvlText w:val=""/>
+      <w:lvlJc w:val="left"/>
+    </w:lvl>
+    <w:lvl w:ilvl="6" w:tplc="7042F45E">
+      <w:numFmt w:val="decimal"/>
+      <w:lvlText w:val=""/>
+      <w:lvlJc w:val="left"/>
+    </w:lvl>
+    <w:lvl w:ilvl="7" w:tplc="6BDEA7F2">
+      <w:numFmt w:val="decimal"/>
+      <w:lvlText w:val=""/>
+      <w:lvlJc w:val="left"/>
+    </w:lvl>
+    <w:lvl w:ilvl="8" w:tplc="75FCB858">
+      <w:numFmt w:val="decimal"/>
+      <w:lvlText w:val=""/>
+      <w:lvlJc w:val="left"/>
+    </w:lvl>
+  </w:abstractNum>
+  <w:abstractNum w:abstractNumId="14" w15:restartNumberingAfterBreak="0">
+    <w:nsid w:val="7BBD46B7"/>
+    <w:multiLevelType w:val="hybridMultilevel"/>
+    <w:tmpl w:val="27381C4E"/>
+    <w:lvl w:ilvl="0" w:tplc="38685EC8">
+      <w:start w:val="1"/>
+      <w:numFmt w:val="decimal"/>
+      <w:lvlText w:val="%1."/>
+      <w:lvlJc w:val="left"/>
+      <w:pPr>
+        <w:ind w:left="360" w:hanging="300"/>
+      </w:pPr>
+    </w:lvl>
+    <w:lvl w:ilvl="1" w:tplc="8A80F9AE" w:tentative="1">
+      <w:start w:val="1"/>
+      <w:numFmt w:val="lowerLetter"/>
+      <w:lvlText w:val="%2."/>
+      <w:lvlJc w:val="left"/>
+      <w:pPr>
+        <w:ind w:left="720" w:hanging="300"/>
+      </w:pPr>
+    </w:lvl>
+    <w:lvl w:ilvl="2" w:tplc="29E46522">
+      <w:numFmt w:val="decimal"/>
+      <w:lvlText w:val=""/>
+      <w:lvlJc w:val="left"/>
+    </w:lvl>
+    <w:lvl w:ilvl="3" w:tplc="5BF2BB68">
+      <w:numFmt w:val="decimal"/>
+      <w:lvlText w:val=""/>
+      <w:lvlJc w:val="left"/>
+    </w:lvl>
+    <w:lvl w:ilvl="4" w:tplc="F7ECA0EA">
+      <w:numFmt w:val="decimal"/>
+      <w:lvlText w:val=""/>
+      <w:lvlJc w:val="left"/>
+    </w:lvl>
+    <w:lvl w:ilvl="5" w:tplc="9C0ACA7E">
+      <w:numFmt w:val="decimal"/>
+      <w:lvlText w:val=""/>
+      <w:lvlJc w:val="left"/>
+    </w:lvl>
+    <w:lvl w:ilvl="6" w:tplc="E458BE22">
+      <w:numFmt w:val="decimal"/>
+      <w:lvlText w:val=""/>
+      <w:lvlJc w:val="left"/>
+    </w:lvl>
+    <w:lvl w:ilvl="7" w:tplc="B67A00CE">
+      <w:numFmt w:val="decimal"/>
+      <w:lvlText w:val=""/>
+      <w:lvlJc w:val="left"/>
+    </w:lvl>
+    <w:lvl w:ilvl="8" w:tplc="2B4C5902">
+      <w:numFmt w:val="decimal"/>
+      <w:lvlText w:val=""/>
+      <w:lvlJc w:val="left"/>
+    </w:lvl>
+  </w:abstractNum>
+  <w:num w:numId="1" w16cid:durableId="1400639309">
+    <w:abstractNumId w:val="7"/>
+    <w:lvlOverride w:ilvl="0">
+      <w:startOverride w:val="1"/>
+    </w:lvlOverride>
+  </w:num>
+  <w:num w:numId="2" w16cid:durableId="1493643431">
+    <w:abstractNumId w:val="5"/>
+    <w:lvlOverride w:ilvl="0">
+      <w:startOverride w:val="1"/>
+    </w:lvlOverride>
+  </w:num>
+  <w:num w:numId="3" w16cid:durableId="375786156">
+    <w:abstractNumId w:val="14"/>
+    <w:lvlOverride w:ilvl="0">
+      <w:startOverride w:val="1"/>
+    </w:lvlOverride>
+  </w:num>
+  <w:num w:numId="4" w16cid:durableId="1021056031">
+    <w:abstractNumId w:val="8"/>
+    <w:lvlOverride w:ilvl="0">
+      <w:startOverride w:val="1"/>
+    </w:lvlOverride>
+  </w:num>
+  <w:num w:numId="5" w16cid:durableId="56710358">
+    <w:abstractNumId w:val="12"/>
+    <w:lvlOverride w:ilvl="0">
+      <w:startOverride w:val="1"/>
+    </w:lvlOverride>
+  </w:num>
+  <w:num w:numId="6" w16cid:durableId="500002013">
+    <w:abstractNumId w:val="4"/>
+    <w:lvlOverride w:ilvl="0">
+      <w:startOverride w:val="1"/>
+    </w:lvlOverride>
+  </w:num>
+  <w:num w:numId="7" w16cid:durableId="1775899921">
+    <w:abstractNumId w:val="9"/>
+    <w:lvlOverride w:ilvl="0">
+      <w:startOverride w:val="1"/>
+    </w:lvlOverride>
+  </w:num>
+  <w:num w:numId="8" w16cid:durableId="1657370473">
+    <w:abstractNumId w:val="1"/>
+    <w:lvlOverride w:ilvl="0">
+      <w:startOverride w:val="1"/>
+    </w:lvlOverride>
+  </w:num>
+  <w:num w:numId="9" w16cid:durableId="864516196">
     <w:abstractNumId w:val="11"/>
     <w:lvlOverride w:ilvl="0">
       <w:startOverride w:val="1"/>
     </w:lvlOverride>
   </w:num>
-  <w:num w:numId="2" w16cid:durableId="788670437">
-    <w:abstractNumId w:val="9"/>
+  <w:num w:numId="10" w16cid:durableId="1135412378">
+    <w:abstractNumId w:val="0"/>
     <w:lvlOverride w:ilvl="0">
       <w:startOverride w:val="1"/>
     </w:lvlOverride>
   </w:num>
-  <w:num w:numId="3" w16cid:durableId="1020930737">
-    <w:abstractNumId w:val="4"/>
-    <w:lvlOverride w:ilvl="0">
-      <w:startOverride w:val="1"/>
-    </w:lvlOverride>
-  </w:num>
-  <w:num w:numId="4" w16cid:durableId="374429401">
-    <w:abstractNumId w:val="8"/>
-    <w:lvlOverride w:ilvl="0">
-      <w:startOverride w:val="1"/>
-    </w:lvlOverride>
-  </w:num>
-  <w:num w:numId="5" w16cid:durableId="673070772">
+  <w:num w:numId="11" w16cid:durableId="227083153">
     <w:abstractNumId w:val="6"/>
     <w:lvlOverride w:ilvl="0">
       <w:startOverride w:val="1"/>
     </w:lvlOverride>
   </w:num>
-  <w:num w:numId="6" w16cid:durableId="1486122148">
+  <w:num w:numId="12" w16cid:durableId="1769931422">
+    <w:abstractNumId w:val="2"/>
+    <w:lvlOverride w:ilvl="0">
+      <w:startOverride w:val="1"/>
+    </w:lvlOverride>
+  </w:num>
+  <w:num w:numId="13" w16cid:durableId="1890920210">
     <w:abstractNumId w:val="10"/>
     <w:lvlOverride w:ilvl="0">
       <w:startOverride w:val="1"/>
     </w:lvlOverride>
   </w:num>
-  <w:num w:numId="7" w16cid:durableId="7877932">
-    <w:abstractNumId w:val="0"/>
-    <w:lvlOverride w:ilvl="0">
-      <w:startOverride w:val="1"/>
-    </w:lvlOverride>
-  </w:num>
-  <w:num w:numId="8" w16cid:durableId="1645696979">
+  <w:num w:numId="14" w16cid:durableId="71393588">
     <w:abstractNumId w:val="13"/>
     <w:lvlOverride w:ilvl="0">
       <w:startOverride w:val="1"/>
     </w:lvlOverride>
   </w:num>
-  <w:num w:numId="9" w16cid:durableId="310601574">
+  <w:num w:numId="15" w16cid:durableId="800538868">
     <w:abstractNumId w:val="3"/>
-    <w:lvlOverride w:ilvl="0">
-      <w:startOverride w:val="1"/>
-    </w:lvlOverride>
-  </w:num>
-  <w:num w:numId="10" w16cid:durableId="2006476256">
-    <w:abstractNumId w:val="14"/>
-    <w:lvlOverride w:ilvl="0">
-      <w:startOverride w:val="1"/>
-    </w:lvlOverride>
-  </w:num>
-  <w:num w:numId="11" w16cid:durableId="383261544">
-    <w:abstractNumId w:val="12"/>
-    <w:lvlOverride w:ilvl="0">
-      <w:startOverride w:val="1"/>
-    </w:lvlOverride>
-  </w:num>
-  <w:num w:numId="12" w16cid:durableId="2102602284">
-    <w:abstractNumId w:val="5"/>
-    <w:lvlOverride w:ilvl="0">
-      <w:startOverride w:val="1"/>
-    </w:lvlOverride>
-  </w:num>
-  <w:num w:numId="13" w16cid:durableId="1651903151">
-    <w:abstractNumId w:val="1"/>
-    <w:lvlOverride w:ilvl="0">
-      <w:startOverride w:val="1"/>
-    </w:lvlOverride>
-  </w:num>
-  <w:num w:numId="14" w16cid:durableId="818152633">
-    <w:abstractNumId w:val="2"/>
-    <w:lvlOverride w:ilvl="0">
-      <w:startOverride w:val="1"/>
-    </w:lvlOverride>
-  </w:num>
-  <w:num w:numId="15" w16cid:durableId="1403599698">
-    <w:abstractNumId w:val="7"/>
     <w:lvlOverride w:ilvl="0">
       <w:startOverride w:val="1"/>
     </w:lvlOverride>
@@ -52670,7 +52690,7 @@
     <w:autoRedefine/>
     <w:uiPriority w:val="39"/>
     <w:unhideWhenUsed/>
-    <w:rsid w:val="001D6DFA"/>
+    <w:rsid w:val="002D47E6"/>
     <w:pPr>
       <w:spacing w:after="100"/>
     </w:pPr>
@@ -52682,7 +52702,7 @@
     <w:autoRedefine/>
     <w:uiPriority w:val="39"/>
     <w:unhideWhenUsed/>
-    <w:rsid w:val="001D6DFA"/>
+    <w:rsid w:val="002D47E6"/>
     <w:pPr>
       <w:spacing w:after="100"/>
       <w:ind w:left="210"/>

</xml_diff>

<commit_message>
docs: re-shoot every role-manual screenshot at 2.1.0
All 123 shots in each of the four locales are retaken, so the sidebar footer
says v2.1.0 everywhere (shots without the sidebar came out unchanged). The 32
role manuals are rebuilt from them.

Co-Authored-By: Claude Opus 5.5 <noreply@anthropic.com>
</commit_message>
<xml_diff>
--- a/discoverer-neo/docs/user-guide/manual/Discoverer-Neo-ADMIN-Guide-Full-en.docx
+++ b/discoverer-neo/docs/user-guide/manual/Discoverer-Neo-ADMIN-Guide-Full-en.docx
@@ -74,7 +74,7 @@
     <w:sdt>
       <w:sdtPr>
         <w:alias w:val="Contents"/>
-        <w:id w:val="1468855827"/>
+        <w:id w:val="-1377616551"/>
       </w:sdtPr>
       <w:sdtEndPr/>
       <w:sdtContent>
@@ -102,7 +102,7 @@
           <w:r>
             <w:fldChar w:fldCharType="separate"/>
           </w:r>
-          <w:hyperlink w:anchor="_Toc241695883" w:history="1">
+          <w:hyperlink w:anchor="_Toc241744755" w:history="1">
             <w:r>
               <w:rPr>
                 <w:rStyle w:val="Hiperligao"/>
@@ -126,7 +126,7 @@
               <w:rPr>
                 <w:noProof/>
               </w:rPr>
-              <w:instrText xml:space="preserve"> PAGEREF _Toc241695883 \h </w:instrText>
+              <w:instrText xml:space="preserve"> PAGEREF _Toc241744755 \h </w:instrText>
             </w:r>
             <w:r>
               <w:rPr>
@@ -168,7 +168,7 @@
               <w14:ligatures w14:val="standardContextual"/>
             </w:rPr>
           </w:pPr>
-          <w:hyperlink w:anchor="_Toc241695884" w:history="1">
+          <w:hyperlink w:anchor="_Toc241744756" w:history="1">
             <w:r>
               <w:rPr>
                 <w:rStyle w:val="Hiperligao"/>
@@ -192,7 +192,7 @@
               <w:rPr>
                 <w:noProof/>
               </w:rPr>
-              <w:instrText xml:space="preserve"> PAGEREF _Toc241695884 \h </w:instrText>
+              <w:instrText xml:space="preserve"> PAGEREF _Toc241744756 \h </w:instrText>
             </w:r>
             <w:r>
               <w:rPr>
@@ -234,7 +234,7 @@
               <w14:ligatures w14:val="standardContextual"/>
             </w:rPr>
           </w:pPr>
-          <w:hyperlink w:anchor="_Toc241695885" w:history="1">
+          <w:hyperlink w:anchor="_Toc241744757" w:history="1">
             <w:r>
               <w:rPr>
                 <w:rStyle w:val="Hiperligao"/>
@@ -258,7 +258,7 @@
               <w:rPr>
                 <w:noProof/>
               </w:rPr>
-              <w:instrText xml:space="preserve"> PAGEREF _Toc241695885 \h </w:instrText>
+              <w:instrText xml:space="preserve"> PAGEREF _Toc241744757 \h </w:instrText>
             </w:r>
             <w:r>
               <w:rPr>
@@ -300,7 +300,7 @@
               <w14:ligatures w14:val="standardContextual"/>
             </w:rPr>
           </w:pPr>
-          <w:hyperlink w:anchor="_Toc241695886" w:history="1">
+          <w:hyperlink w:anchor="_Toc241744758" w:history="1">
             <w:r>
               <w:rPr>
                 <w:rStyle w:val="Hiperligao"/>
@@ -324,7 +324,7 @@
               <w:rPr>
                 <w:noProof/>
               </w:rPr>
-              <w:instrText xml:space="preserve"> PAGEREF _Toc241695886 \h </w:instrText>
+              <w:instrText xml:space="preserve"> PAGEREF _Toc241744758 \h </w:instrText>
             </w:r>
             <w:r>
               <w:rPr>
@@ -366,7 +366,7 @@
               <w14:ligatures w14:val="standardContextual"/>
             </w:rPr>
           </w:pPr>
-          <w:hyperlink w:anchor="_Toc241695887" w:history="1">
+          <w:hyperlink w:anchor="_Toc241744759" w:history="1">
             <w:r>
               <w:rPr>
                 <w:rStyle w:val="Hiperligao"/>
@@ -390,7 +390,7 @@
               <w:rPr>
                 <w:noProof/>
               </w:rPr>
-              <w:instrText xml:space="preserve"> PAGEREF _Toc241695887 \h </w:instrText>
+              <w:instrText xml:space="preserve"> PAGEREF _Toc241744759 \h </w:instrText>
             </w:r>
             <w:r>
               <w:rPr>
@@ -432,7 +432,7 @@
               <w14:ligatures w14:val="standardContextual"/>
             </w:rPr>
           </w:pPr>
-          <w:hyperlink w:anchor="_Toc241695888" w:history="1">
+          <w:hyperlink w:anchor="_Toc241744760" w:history="1">
             <w:r>
               <w:rPr>
                 <w:rStyle w:val="Hiperligao"/>
@@ -456,7 +456,7 @@
               <w:rPr>
                 <w:noProof/>
               </w:rPr>
-              <w:instrText xml:space="preserve"> PAGEREF _Toc241695888 \h </w:instrText>
+              <w:instrText xml:space="preserve"> PAGEREF _Toc241744760 \h </w:instrText>
             </w:r>
             <w:r>
               <w:rPr>
@@ -498,7 +498,7 @@
               <w14:ligatures w14:val="standardContextual"/>
             </w:rPr>
           </w:pPr>
-          <w:hyperlink w:anchor="_Toc241695889" w:history="1">
+          <w:hyperlink w:anchor="_Toc241744761" w:history="1">
             <w:r>
               <w:rPr>
                 <w:rStyle w:val="Hiperligao"/>
@@ -522,7 +522,7 @@
               <w:rPr>
                 <w:noProof/>
               </w:rPr>
-              <w:instrText xml:space="preserve"> PAGEREF _Toc241695889 \h </w:instrText>
+              <w:instrText xml:space="preserve"> PAGEREF _Toc241744761 \h </w:instrText>
             </w:r>
             <w:r>
               <w:rPr>
@@ -564,7 +564,7 @@
               <w14:ligatures w14:val="standardContextual"/>
             </w:rPr>
           </w:pPr>
-          <w:hyperlink w:anchor="_Toc241695890" w:history="1">
+          <w:hyperlink w:anchor="_Toc241744762" w:history="1">
             <w:r>
               <w:rPr>
                 <w:rStyle w:val="Hiperligao"/>
@@ -588,7 +588,7 @@
               <w:rPr>
                 <w:noProof/>
               </w:rPr>
-              <w:instrText xml:space="preserve"> PAGEREF _Toc241695890 \h </w:instrText>
+              <w:instrText xml:space="preserve"> PAGEREF _Toc241744762 \h </w:instrText>
             </w:r>
             <w:r>
               <w:rPr>
@@ -630,7 +630,7 @@
               <w14:ligatures w14:val="standardContextual"/>
             </w:rPr>
           </w:pPr>
-          <w:hyperlink w:anchor="_Toc241695891" w:history="1">
+          <w:hyperlink w:anchor="_Toc241744763" w:history="1">
             <w:r>
               <w:rPr>
                 <w:rStyle w:val="Hiperligao"/>
@@ -654,7 +654,7 @@
               <w:rPr>
                 <w:noProof/>
               </w:rPr>
-              <w:instrText xml:space="preserve"> PAGEREF _Toc241695891 \h </w:instrText>
+              <w:instrText xml:space="preserve"> PAGEREF _Toc241744763 \h </w:instrText>
             </w:r>
             <w:r>
               <w:rPr>
@@ -696,7 +696,7 @@
               <w14:ligatures w14:val="standardContextual"/>
             </w:rPr>
           </w:pPr>
-          <w:hyperlink w:anchor="_Toc241695892" w:history="1">
+          <w:hyperlink w:anchor="_Toc241744764" w:history="1">
             <w:r>
               <w:rPr>
                 <w:rStyle w:val="Hiperligao"/>
@@ -720,7 +720,7 @@
               <w:rPr>
                 <w:noProof/>
               </w:rPr>
-              <w:instrText xml:space="preserve"> PAGEREF _Toc241695892 \h </w:instrText>
+              <w:instrText xml:space="preserve"> PAGEREF _Toc241744764 \h </w:instrText>
             </w:r>
             <w:r>
               <w:rPr>
@@ -762,7 +762,7 @@
               <w14:ligatures w14:val="standardContextual"/>
             </w:rPr>
           </w:pPr>
-          <w:hyperlink w:anchor="_Toc241695893" w:history="1">
+          <w:hyperlink w:anchor="_Toc241744765" w:history="1">
             <w:r>
               <w:rPr>
                 <w:rStyle w:val="Hiperligao"/>
@@ -786,7 +786,7 @@
               <w:rPr>
                 <w:noProof/>
               </w:rPr>
-              <w:instrText xml:space="preserve"> PAGEREF _Toc241695893 \h </w:instrText>
+              <w:instrText xml:space="preserve"> PAGEREF _Toc241744765 \h </w:instrText>
             </w:r>
             <w:r>
               <w:rPr>
@@ -828,7 +828,7 @@
               <w14:ligatures w14:val="standardContextual"/>
             </w:rPr>
           </w:pPr>
-          <w:hyperlink w:anchor="_Toc241695894" w:history="1">
+          <w:hyperlink w:anchor="_Toc241744766" w:history="1">
             <w:r>
               <w:rPr>
                 <w:rStyle w:val="Hiperligao"/>
@@ -852,7 +852,7 @@
               <w:rPr>
                 <w:noProof/>
               </w:rPr>
-              <w:instrText xml:space="preserve"> PAGEREF _Toc241695894 \h </w:instrText>
+              <w:instrText xml:space="preserve"> PAGEREF _Toc241744766 \h </w:instrText>
             </w:r>
             <w:r>
               <w:rPr>
@@ -894,7 +894,7 @@
               <w14:ligatures w14:val="standardContextual"/>
             </w:rPr>
           </w:pPr>
-          <w:hyperlink w:anchor="_Toc241695895" w:history="1">
+          <w:hyperlink w:anchor="_Toc241744767" w:history="1">
             <w:r>
               <w:rPr>
                 <w:rStyle w:val="Hiperligao"/>
@@ -918,7 +918,7 @@
               <w:rPr>
                 <w:noProof/>
               </w:rPr>
-              <w:instrText xml:space="preserve"> PAGEREF _Toc241695895 \h </w:instrText>
+              <w:instrText xml:space="preserve"> PAGEREF _Toc241744767 \h </w:instrText>
             </w:r>
             <w:r>
               <w:rPr>
@@ -960,7 +960,7 @@
               <w14:ligatures w14:val="standardContextual"/>
             </w:rPr>
           </w:pPr>
-          <w:hyperlink w:anchor="_Toc241695896" w:history="1">
+          <w:hyperlink w:anchor="_Toc241744768" w:history="1">
             <w:r>
               <w:rPr>
                 <w:rStyle w:val="Hiperligao"/>
@@ -984,7 +984,7 @@
               <w:rPr>
                 <w:noProof/>
               </w:rPr>
-              <w:instrText xml:space="preserve"> PAGEREF _Toc241695896 \h </w:instrText>
+              <w:instrText xml:space="preserve"> PAGEREF _Toc241744768 \h </w:instrText>
             </w:r>
             <w:r>
               <w:rPr>
@@ -1026,7 +1026,7 @@
               <w14:ligatures w14:val="standardContextual"/>
             </w:rPr>
           </w:pPr>
-          <w:hyperlink w:anchor="_Toc241695897" w:history="1">
+          <w:hyperlink w:anchor="_Toc241744769" w:history="1">
             <w:r>
               <w:rPr>
                 <w:rStyle w:val="Hiperligao"/>
@@ -1050,7 +1050,7 @@
               <w:rPr>
                 <w:noProof/>
               </w:rPr>
-              <w:instrText xml:space="preserve"> PAGEREF _Toc241695897 \h </w:instrText>
+              <w:instrText xml:space="preserve"> PAGEREF _Toc241744769 \h </w:instrText>
             </w:r>
             <w:r>
               <w:rPr>
@@ -1092,7 +1092,7 @@
               <w14:ligatures w14:val="standardContextual"/>
             </w:rPr>
           </w:pPr>
-          <w:hyperlink w:anchor="_Toc241695898" w:history="1">
+          <w:hyperlink w:anchor="_Toc241744770" w:history="1">
             <w:r>
               <w:rPr>
                 <w:rStyle w:val="Hiperligao"/>
@@ -1116,7 +1116,7 @@
               <w:rPr>
                 <w:noProof/>
               </w:rPr>
-              <w:instrText xml:space="preserve"> PAGEREF _Toc241695898 \h </w:instrText>
+              <w:instrText xml:space="preserve"> PAGEREF _Toc241744770 \h </w:instrText>
             </w:r>
             <w:r>
               <w:rPr>
@@ -1158,7 +1158,7 @@
               <w14:ligatures w14:val="standardContextual"/>
             </w:rPr>
           </w:pPr>
-          <w:hyperlink w:anchor="_Toc241695899" w:history="1">
+          <w:hyperlink w:anchor="_Toc241744771" w:history="1">
             <w:r>
               <w:rPr>
                 <w:rStyle w:val="Hiperligao"/>
@@ -1182,7 +1182,7 @@
               <w:rPr>
                 <w:noProof/>
               </w:rPr>
-              <w:instrText xml:space="preserve"> PAGEREF _Toc241695899 \h </w:instrText>
+              <w:instrText xml:space="preserve"> PAGEREF _Toc241744771 \h </w:instrText>
             </w:r>
             <w:r>
               <w:rPr>
@@ -1224,7 +1224,7 @@
               <w14:ligatures w14:val="standardContextual"/>
             </w:rPr>
           </w:pPr>
-          <w:hyperlink w:anchor="_Toc241695900" w:history="1">
+          <w:hyperlink w:anchor="_Toc241744772" w:history="1">
             <w:r>
               <w:rPr>
                 <w:rStyle w:val="Hiperligao"/>
@@ -1248,7 +1248,7 @@
               <w:rPr>
                 <w:noProof/>
               </w:rPr>
-              <w:instrText xml:space="preserve"> PAGEREF _Toc241695900 \h </w:instrText>
+              <w:instrText xml:space="preserve"> PAGEREF _Toc241744772 \h </w:instrText>
             </w:r>
             <w:r>
               <w:rPr>
@@ -1290,7 +1290,7 @@
               <w14:ligatures w14:val="standardContextual"/>
             </w:rPr>
           </w:pPr>
-          <w:hyperlink w:anchor="_Toc241695901" w:history="1">
+          <w:hyperlink w:anchor="_Toc241744773" w:history="1">
             <w:r>
               <w:rPr>
                 <w:rStyle w:val="Hiperligao"/>
@@ -1314,7 +1314,7 @@
               <w:rPr>
                 <w:noProof/>
               </w:rPr>
-              <w:instrText xml:space="preserve"> PAGEREF _Toc241695901 \h </w:instrText>
+              <w:instrText xml:space="preserve"> PAGEREF _Toc241744773 \h </w:instrText>
             </w:r>
             <w:r>
               <w:rPr>
@@ -1356,7 +1356,7 @@
               <w14:ligatures w14:val="standardContextual"/>
             </w:rPr>
           </w:pPr>
-          <w:hyperlink w:anchor="_Toc241695902" w:history="1">
+          <w:hyperlink w:anchor="_Toc241744774" w:history="1">
             <w:r>
               <w:rPr>
                 <w:rStyle w:val="Hiperligao"/>
@@ -1380,7 +1380,7 @@
               <w:rPr>
                 <w:noProof/>
               </w:rPr>
-              <w:instrText xml:space="preserve"> PAGEREF _Toc241695902 \h </w:instrText>
+              <w:instrText xml:space="preserve"> PAGEREF _Toc241744774 \h </w:instrText>
             </w:r>
             <w:r>
               <w:rPr>
@@ -1422,7 +1422,7 @@
               <w14:ligatures w14:val="standardContextual"/>
             </w:rPr>
           </w:pPr>
-          <w:hyperlink w:anchor="_Toc241695903" w:history="1">
+          <w:hyperlink w:anchor="_Toc241744775" w:history="1">
             <w:r>
               <w:rPr>
                 <w:rStyle w:val="Hiperligao"/>
@@ -1446,7 +1446,7 @@
               <w:rPr>
                 <w:noProof/>
               </w:rPr>
-              <w:instrText xml:space="preserve"> PAGEREF _Toc241695903 \h </w:instrText>
+              <w:instrText xml:space="preserve"> PAGEREF _Toc241744775 \h </w:instrText>
             </w:r>
             <w:r>
               <w:rPr>
@@ -1488,7 +1488,7 @@
               <w14:ligatures w14:val="standardContextual"/>
             </w:rPr>
           </w:pPr>
-          <w:hyperlink w:anchor="_Toc241695904" w:history="1">
+          <w:hyperlink w:anchor="_Toc241744776" w:history="1">
             <w:r>
               <w:rPr>
                 <w:rStyle w:val="Hiperligao"/>
@@ -1512,7 +1512,7 @@
               <w:rPr>
                 <w:noProof/>
               </w:rPr>
-              <w:instrText xml:space="preserve"> PAGEREF _Toc241695904 \h </w:instrText>
+              <w:instrText xml:space="preserve"> PAGEREF _Toc241744776 \h </w:instrText>
             </w:r>
             <w:r>
               <w:rPr>
@@ -1554,7 +1554,7 @@
               <w14:ligatures w14:val="standardContextual"/>
             </w:rPr>
           </w:pPr>
-          <w:hyperlink w:anchor="_Toc241695905" w:history="1">
+          <w:hyperlink w:anchor="_Toc241744777" w:history="1">
             <w:r>
               <w:rPr>
                 <w:rStyle w:val="Hiperligao"/>
@@ -1578,7 +1578,7 @@
               <w:rPr>
                 <w:noProof/>
               </w:rPr>
-              <w:instrText xml:space="preserve"> PAGEREF _Toc241695905 \h </w:instrText>
+              <w:instrText xml:space="preserve"> PAGEREF _Toc241744777 \h </w:instrText>
             </w:r>
             <w:r>
               <w:rPr>
@@ -1620,7 +1620,7 @@
               <w14:ligatures w14:val="standardContextual"/>
             </w:rPr>
           </w:pPr>
-          <w:hyperlink w:anchor="_Toc241695906" w:history="1">
+          <w:hyperlink w:anchor="_Toc241744778" w:history="1">
             <w:r>
               <w:rPr>
                 <w:rStyle w:val="Hiperligao"/>
@@ -1644,7 +1644,7 @@
               <w:rPr>
                 <w:noProof/>
               </w:rPr>
-              <w:instrText xml:space="preserve"> PAGEREF _Toc241695906 \h </w:instrText>
+              <w:instrText xml:space="preserve"> PAGEREF _Toc241744778 \h </w:instrText>
             </w:r>
             <w:r>
               <w:rPr>
@@ -1686,7 +1686,7 @@
               <w14:ligatures w14:val="standardContextual"/>
             </w:rPr>
           </w:pPr>
-          <w:hyperlink w:anchor="_Toc241695907" w:history="1">
+          <w:hyperlink w:anchor="_Toc241744779" w:history="1">
             <w:r>
               <w:rPr>
                 <w:rStyle w:val="Hiperligao"/>
@@ -1710,7 +1710,7 @@
               <w:rPr>
                 <w:noProof/>
               </w:rPr>
-              <w:instrText xml:space="preserve"> PAGEREF _Toc241695907 \h </w:instrText>
+              <w:instrText xml:space="preserve"> PAGEREF _Toc241744779 \h </w:instrText>
             </w:r>
             <w:r>
               <w:rPr>
@@ -1752,7 +1752,7 @@
               <w14:ligatures w14:val="standardContextual"/>
             </w:rPr>
           </w:pPr>
-          <w:hyperlink w:anchor="_Toc241695908" w:history="1">
+          <w:hyperlink w:anchor="_Toc241744780" w:history="1">
             <w:r>
               <w:rPr>
                 <w:rStyle w:val="Hiperligao"/>
@@ -1776,7 +1776,7 @@
               <w:rPr>
                 <w:noProof/>
               </w:rPr>
-              <w:instrText xml:space="preserve"> PAGEREF _Toc241695908 \h </w:instrText>
+              <w:instrText xml:space="preserve"> PAGEREF _Toc241744780 \h </w:instrText>
             </w:r>
             <w:r>
               <w:rPr>
@@ -1818,7 +1818,7 @@
               <w14:ligatures w14:val="standardContextual"/>
             </w:rPr>
           </w:pPr>
-          <w:hyperlink w:anchor="_Toc241695909" w:history="1">
+          <w:hyperlink w:anchor="_Toc241744781" w:history="1">
             <w:r>
               <w:rPr>
                 <w:rStyle w:val="Hiperligao"/>
@@ -1842,7 +1842,7 @@
               <w:rPr>
                 <w:noProof/>
               </w:rPr>
-              <w:instrText xml:space="preserve"> PAGEREF _Toc241695909 \h </w:instrText>
+              <w:instrText xml:space="preserve"> PAGEREF _Toc241744781 \h </w:instrText>
             </w:r>
             <w:r>
               <w:rPr>
@@ -1884,7 +1884,7 @@
               <w14:ligatures w14:val="standardContextual"/>
             </w:rPr>
           </w:pPr>
-          <w:hyperlink w:anchor="_Toc241695910" w:history="1">
+          <w:hyperlink w:anchor="_Toc241744782" w:history="1">
             <w:r>
               <w:rPr>
                 <w:rStyle w:val="Hiperligao"/>
@@ -1908,7 +1908,7 @@
               <w:rPr>
                 <w:noProof/>
               </w:rPr>
-              <w:instrText xml:space="preserve"> PAGEREF _Toc241695910 \h </w:instrText>
+              <w:instrText xml:space="preserve"> PAGEREF _Toc241744782 \h </w:instrText>
             </w:r>
             <w:r>
               <w:rPr>
@@ -1950,7 +1950,7 @@
               <w14:ligatures w14:val="standardContextual"/>
             </w:rPr>
           </w:pPr>
-          <w:hyperlink w:anchor="_Toc241695911" w:history="1">
+          <w:hyperlink w:anchor="_Toc241744783" w:history="1">
             <w:r>
               <w:rPr>
                 <w:rStyle w:val="Hiperligao"/>
@@ -1974,7 +1974,7 @@
               <w:rPr>
                 <w:noProof/>
               </w:rPr>
-              <w:instrText xml:space="preserve"> PAGEREF _Toc241695911 \h </w:instrText>
+              <w:instrText xml:space="preserve"> PAGEREF _Toc241744783 \h </w:instrText>
             </w:r>
             <w:r>
               <w:rPr>
@@ -2016,7 +2016,7 @@
               <w14:ligatures w14:val="standardContextual"/>
             </w:rPr>
           </w:pPr>
-          <w:hyperlink w:anchor="_Toc241695912" w:history="1">
+          <w:hyperlink w:anchor="_Toc241744784" w:history="1">
             <w:r>
               <w:rPr>
                 <w:rStyle w:val="Hiperligao"/>
@@ -2040,7 +2040,7 @@
               <w:rPr>
                 <w:noProof/>
               </w:rPr>
-              <w:instrText xml:space="preserve"> PAGEREF _Toc241695912 \h </w:instrText>
+              <w:instrText xml:space="preserve"> PAGEREF _Toc241744784 \h </w:instrText>
             </w:r>
             <w:r>
               <w:rPr>
@@ -2082,7 +2082,7 @@
               <w14:ligatures w14:val="standardContextual"/>
             </w:rPr>
           </w:pPr>
-          <w:hyperlink w:anchor="_Toc241695913" w:history="1">
+          <w:hyperlink w:anchor="_Toc241744785" w:history="1">
             <w:r>
               <w:rPr>
                 <w:rStyle w:val="Hiperligao"/>
@@ -2106,7 +2106,7 @@
               <w:rPr>
                 <w:noProof/>
               </w:rPr>
-              <w:instrText xml:space="preserve"> PAGEREF _Toc241695913 \h </w:instrText>
+              <w:instrText xml:space="preserve"> PAGEREF _Toc241744785 \h </w:instrText>
             </w:r>
             <w:r>
               <w:rPr>
@@ -2148,7 +2148,7 @@
               <w14:ligatures w14:val="standardContextual"/>
             </w:rPr>
           </w:pPr>
-          <w:hyperlink w:anchor="_Toc241695914" w:history="1">
+          <w:hyperlink w:anchor="_Toc241744786" w:history="1">
             <w:r>
               <w:rPr>
                 <w:rStyle w:val="Hiperligao"/>
@@ -2172,7 +2172,7 @@
               <w:rPr>
                 <w:noProof/>
               </w:rPr>
-              <w:instrText xml:space="preserve"> PAGEREF _Toc241695914 \h </w:instrText>
+              <w:instrText xml:space="preserve"> PAGEREF _Toc241744786 \h </w:instrText>
             </w:r>
             <w:r>
               <w:rPr>
@@ -2214,7 +2214,7 @@
               <w14:ligatures w14:val="standardContextual"/>
             </w:rPr>
           </w:pPr>
-          <w:hyperlink w:anchor="_Toc241695915" w:history="1">
+          <w:hyperlink w:anchor="_Toc241744787" w:history="1">
             <w:r>
               <w:rPr>
                 <w:rStyle w:val="Hiperligao"/>
@@ -2238,7 +2238,7 @@
               <w:rPr>
                 <w:noProof/>
               </w:rPr>
-              <w:instrText xml:space="preserve"> PAGEREF _Toc241695915 \h </w:instrText>
+              <w:instrText xml:space="preserve"> PAGEREF _Toc241744787 \h </w:instrText>
             </w:r>
             <w:r>
               <w:rPr>
@@ -2280,7 +2280,7 @@
               <w14:ligatures w14:val="standardContextual"/>
             </w:rPr>
           </w:pPr>
-          <w:hyperlink w:anchor="_Toc241695916" w:history="1">
+          <w:hyperlink w:anchor="_Toc241744788" w:history="1">
             <w:r>
               <w:rPr>
                 <w:rStyle w:val="Hiperligao"/>
@@ -2304,7 +2304,7 @@
               <w:rPr>
                 <w:noProof/>
               </w:rPr>
-              <w:instrText xml:space="preserve"> PAGEREF _Toc241695916 \h </w:instrText>
+              <w:instrText xml:space="preserve"> PAGEREF _Toc241744788 \h </w:instrText>
             </w:r>
             <w:r>
               <w:rPr>
@@ -2346,7 +2346,7 @@
               <w14:ligatures w14:val="standardContextual"/>
             </w:rPr>
           </w:pPr>
-          <w:hyperlink w:anchor="_Toc241695917" w:history="1">
+          <w:hyperlink w:anchor="_Toc241744789" w:history="1">
             <w:r>
               <w:rPr>
                 <w:rStyle w:val="Hiperligao"/>
@@ -2370,7 +2370,7 @@
               <w:rPr>
                 <w:noProof/>
               </w:rPr>
-              <w:instrText xml:space="preserve"> PAGEREF _Toc241695917 \h </w:instrText>
+              <w:instrText xml:space="preserve"> PAGEREF _Toc241744789 \h </w:instrText>
             </w:r>
             <w:r>
               <w:rPr>
@@ -2412,7 +2412,7 @@
               <w14:ligatures w14:val="standardContextual"/>
             </w:rPr>
           </w:pPr>
-          <w:hyperlink w:anchor="_Toc241695918" w:history="1">
+          <w:hyperlink w:anchor="_Toc241744790" w:history="1">
             <w:r>
               <w:rPr>
                 <w:rStyle w:val="Hiperligao"/>
@@ -2436,7 +2436,7 @@
               <w:rPr>
                 <w:noProof/>
               </w:rPr>
-              <w:instrText xml:space="preserve"> PAGEREF _Toc241695918 \h </w:instrText>
+              <w:instrText xml:space="preserve"> PAGEREF _Toc241744790 \h </w:instrText>
             </w:r>
             <w:r>
               <w:rPr>
@@ -2478,7 +2478,7 @@
               <w14:ligatures w14:val="standardContextual"/>
             </w:rPr>
           </w:pPr>
-          <w:hyperlink w:anchor="_Toc241695919" w:history="1">
+          <w:hyperlink w:anchor="_Toc241744791" w:history="1">
             <w:r>
               <w:rPr>
                 <w:rStyle w:val="Hiperligao"/>
@@ -2502,7 +2502,7 @@
               <w:rPr>
                 <w:noProof/>
               </w:rPr>
-              <w:instrText xml:space="preserve"> PAGEREF _Toc241695919 \h </w:instrText>
+              <w:instrText xml:space="preserve"> PAGEREF _Toc241744791 \h </w:instrText>
             </w:r>
             <w:r>
               <w:rPr>
@@ -2544,7 +2544,7 @@
               <w14:ligatures w14:val="standardContextual"/>
             </w:rPr>
           </w:pPr>
-          <w:hyperlink w:anchor="_Toc241695920" w:history="1">
+          <w:hyperlink w:anchor="_Toc241744792" w:history="1">
             <w:r>
               <w:rPr>
                 <w:rStyle w:val="Hiperligao"/>
@@ -2568,7 +2568,7 @@
               <w:rPr>
                 <w:noProof/>
               </w:rPr>
-              <w:instrText xml:space="preserve"> PAGEREF _Toc241695920 \h </w:instrText>
+              <w:instrText xml:space="preserve"> PAGEREF _Toc241744792 \h </w:instrText>
             </w:r>
             <w:r>
               <w:rPr>
@@ -2610,7 +2610,7 @@
               <w14:ligatures w14:val="standardContextual"/>
             </w:rPr>
           </w:pPr>
-          <w:hyperlink w:anchor="_Toc241695921" w:history="1">
+          <w:hyperlink w:anchor="_Toc241744793" w:history="1">
             <w:r>
               <w:rPr>
                 <w:rStyle w:val="Hiperligao"/>
@@ -2634,7 +2634,7 @@
               <w:rPr>
                 <w:noProof/>
               </w:rPr>
-              <w:instrText xml:space="preserve"> PAGEREF _Toc241695921 \h </w:instrText>
+              <w:instrText xml:space="preserve"> PAGEREF _Toc241744793 \h </w:instrText>
             </w:r>
             <w:r>
               <w:rPr>
@@ -2676,7 +2676,7 @@
               <w14:ligatures w14:val="standardContextual"/>
             </w:rPr>
           </w:pPr>
-          <w:hyperlink w:anchor="_Toc241695922" w:history="1">
+          <w:hyperlink w:anchor="_Toc241744794" w:history="1">
             <w:r>
               <w:rPr>
                 <w:rStyle w:val="Hiperligao"/>
@@ -2700,7 +2700,7 @@
               <w:rPr>
                 <w:noProof/>
               </w:rPr>
-              <w:instrText xml:space="preserve"> PAGEREF _Toc241695922 \h </w:instrText>
+              <w:instrText xml:space="preserve"> PAGEREF _Toc241744794 \h </w:instrText>
             </w:r>
             <w:r>
               <w:rPr>
@@ -2742,7 +2742,7 @@
               <w14:ligatures w14:val="standardContextual"/>
             </w:rPr>
           </w:pPr>
-          <w:hyperlink w:anchor="_Toc241695923" w:history="1">
+          <w:hyperlink w:anchor="_Toc241744795" w:history="1">
             <w:r>
               <w:rPr>
                 <w:rStyle w:val="Hiperligao"/>
@@ -2766,7 +2766,7 @@
               <w:rPr>
                 <w:noProof/>
               </w:rPr>
-              <w:instrText xml:space="preserve"> PAGEREF _Toc241695923 \h </w:instrText>
+              <w:instrText xml:space="preserve"> PAGEREF _Toc241744795 \h </w:instrText>
             </w:r>
             <w:r>
               <w:rPr>
@@ -2808,7 +2808,7 @@
               <w14:ligatures w14:val="standardContextual"/>
             </w:rPr>
           </w:pPr>
-          <w:hyperlink w:anchor="_Toc241695924" w:history="1">
+          <w:hyperlink w:anchor="_Toc241744796" w:history="1">
             <w:r>
               <w:rPr>
                 <w:rStyle w:val="Hiperligao"/>
@@ -2832,7 +2832,7 @@
               <w:rPr>
                 <w:noProof/>
               </w:rPr>
-              <w:instrText xml:space="preserve"> PAGEREF _Toc241695924 \h </w:instrText>
+              <w:instrText xml:space="preserve"> PAGEREF _Toc241744796 \h </w:instrText>
             </w:r>
             <w:r>
               <w:rPr>
@@ -2874,7 +2874,7 @@
               <w14:ligatures w14:val="standardContextual"/>
             </w:rPr>
           </w:pPr>
-          <w:hyperlink w:anchor="_Toc241695925" w:history="1">
+          <w:hyperlink w:anchor="_Toc241744797" w:history="1">
             <w:r>
               <w:rPr>
                 <w:rStyle w:val="Hiperligao"/>
@@ -2898,7 +2898,7 @@
               <w:rPr>
                 <w:noProof/>
               </w:rPr>
-              <w:instrText xml:space="preserve"> PAGEREF _Toc241695925 \h </w:instrText>
+              <w:instrText xml:space="preserve"> PAGEREF _Toc241744797 \h </w:instrText>
             </w:r>
             <w:r>
               <w:rPr>
@@ -2940,7 +2940,7 @@
               <w14:ligatures w14:val="standardContextual"/>
             </w:rPr>
           </w:pPr>
-          <w:hyperlink w:anchor="_Toc241695926" w:history="1">
+          <w:hyperlink w:anchor="_Toc241744798" w:history="1">
             <w:r>
               <w:rPr>
                 <w:rStyle w:val="Hiperligao"/>
@@ -2964,7 +2964,7 @@
               <w:rPr>
                 <w:noProof/>
               </w:rPr>
-              <w:instrText xml:space="preserve"> PAGEREF _Toc241695926 \h </w:instrText>
+              <w:instrText xml:space="preserve"> PAGEREF _Toc241744798 \h </w:instrText>
             </w:r>
             <w:r>
               <w:rPr>
@@ -3006,7 +3006,7 @@
               <w14:ligatures w14:val="standardContextual"/>
             </w:rPr>
           </w:pPr>
-          <w:hyperlink w:anchor="_Toc241695927" w:history="1">
+          <w:hyperlink w:anchor="_Toc241744799" w:history="1">
             <w:r>
               <w:rPr>
                 <w:rStyle w:val="Hiperligao"/>
@@ -3030,7 +3030,7 @@
               <w:rPr>
                 <w:noProof/>
               </w:rPr>
-              <w:instrText xml:space="preserve"> PAGEREF _Toc241695927 \h </w:instrText>
+              <w:instrText xml:space="preserve"> PAGEREF _Toc241744799 \h </w:instrText>
             </w:r>
             <w:r>
               <w:rPr>
@@ -3072,7 +3072,7 @@
               <w14:ligatures w14:val="standardContextual"/>
             </w:rPr>
           </w:pPr>
-          <w:hyperlink w:anchor="_Toc241695928" w:history="1">
+          <w:hyperlink w:anchor="_Toc241744800" w:history="1">
             <w:r>
               <w:rPr>
                 <w:rStyle w:val="Hiperligao"/>
@@ -3096,7 +3096,7 @@
               <w:rPr>
                 <w:noProof/>
               </w:rPr>
-              <w:instrText xml:space="preserve"> PAGEREF _Toc241695928 \h </w:instrText>
+              <w:instrText xml:space="preserve"> PAGEREF _Toc241744800 \h </w:instrText>
             </w:r>
             <w:r>
               <w:rPr>
@@ -3138,7 +3138,7 @@
               <w14:ligatures w14:val="standardContextual"/>
             </w:rPr>
           </w:pPr>
-          <w:hyperlink w:anchor="_Toc241695929" w:history="1">
+          <w:hyperlink w:anchor="_Toc241744801" w:history="1">
             <w:r>
               <w:rPr>
                 <w:rStyle w:val="Hiperligao"/>
@@ -3162,7 +3162,7 @@
               <w:rPr>
                 <w:noProof/>
               </w:rPr>
-              <w:instrText xml:space="preserve"> PAGEREF _Toc241695929 \h </w:instrText>
+              <w:instrText xml:space="preserve"> PAGEREF _Toc241744801 \h </w:instrText>
             </w:r>
             <w:r>
               <w:rPr>
@@ -3204,7 +3204,7 @@
               <w14:ligatures w14:val="standardContextual"/>
             </w:rPr>
           </w:pPr>
-          <w:hyperlink w:anchor="_Toc241695930" w:history="1">
+          <w:hyperlink w:anchor="_Toc241744802" w:history="1">
             <w:r>
               <w:rPr>
                 <w:rStyle w:val="Hiperligao"/>
@@ -3228,7 +3228,7 @@
               <w:rPr>
                 <w:noProof/>
               </w:rPr>
-              <w:instrText xml:space="preserve"> PAGEREF _Toc241695930 \h </w:instrText>
+              <w:instrText xml:space="preserve"> PAGEREF _Toc241744802 \h </w:instrText>
             </w:r>
             <w:r>
               <w:rPr>
@@ -3270,7 +3270,7 @@
               <w14:ligatures w14:val="standardContextual"/>
             </w:rPr>
           </w:pPr>
-          <w:hyperlink w:anchor="_Toc241695931" w:history="1">
+          <w:hyperlink w:anchor="_Toc241744803" w:history="1">
             <w:r>
               <w:rPr>
                 <w:rStyle w:val="Hiperligao"/>
@@ -3294,7 +3294,7 @@
               <w:rPr>
                 <w:noProof/>
               </w:rPr>
-              <w:instrText xml:space="preserve"> PAGEREF _Toc241695931 \h </w:instrText>
+              <w:instrText xml:space="preserve"> PAGEREF _Toc241744803 \h </w:instrText>
             </w:r>
             <w:r>
               <w:rPr>
@@ -3336,7 +3336,7 @@
               <w14:ligatures w14:val="standardContextual"/>
             </w:rPr>
           </w:pPr>
-          <w:hyperlink w:anchor="_Toc241695932" w:history="1">
+          <w:hyperlink w:anchor="_Toc241744804" w:history="1">
             <w:r>
               <w:rPr>
                 <w:rStyle w:val="Hiperligao"/>
@@ -3360,7 +3360,7 @@
               <w:rPr>
                 <w:noProof/>
               </w:rPr>
-              <w:instrText xml:space="preserve"> PAGEREF _Toc241695932 \h </w:instrText>
+              <w:instrText xml:space="preserve"> PAGEREF _Toc241744804 \h </w:instrText>
             </w:r>
             <w:r>
               <w:rPr>
@@ -3402,7 +3402,7 @@
               <w14:ligatures w14:val="standardContextual"/>
             </w:rPr>
           </w:pPr>
-          <w:hyperlink w:anchor="_Toc241695933" w:history="1">
+          <w:hyperlink w:anchor="_Toc241744805" w:history="1">
             <w:r>
               <w:rPr>
                 <w:rStyle w:val="Hiperligao"/>
@@ -3426,7 +3426,7 @@
               <w:rPr>
                 <w:noProof/>
               </w:rPr>
-              <w:instrText xml:space="preserve"> PAGEREF _Toc241695933 \h </w:instrText>
+              <w:instrText xml:space="preserve"> PAGEREF _Toc241744805 \h </w:instrText>
             </w:r>
             <w:r>
               <w:rPr>
@@ -3468,7 +3468,7 @@
               <w14:ligatures w14:val="standardContextual"/>
             </w:rPr>
           </w:pPr>
-          <w:hyperlink w:anchor="_Toc241695934" w:history="1">
+          <w:hyperlink w:anchor="_Toc241744806" w:history="1">
             <w:r>
               <w:rPr>
                 <w:rStyle w:val="Hiperligao"/>
@@ -3492,7 +3492,7 @@
               <w:rPr>
                 <w:noProof/>
               </w:rPr>
-              <w:instrText xml:space="preserve"> PAGEREF _Toc241695934 \h </w:instrText>
+              <w:instrText xml:space="preserve"> PAGEREF _Toc241744806 \h </w:instrText>
             </w:r>
             <w:r>
               <w:rPr>
@@ -3534,7 +3534,7 @@
               <w14:ligatures w14:val="standardContextual"/>
             </w:rPr>
           </w:pPr>
-          <w:hyperlink w:anchor="_Toc241695935" w:history="1">
+          <w:hyperlink w:anchor="_Toc241744807" w:history="1">
             <w:r>
               <w:rPr>
                 <w:rStyle w:val="Hiperligao"/>
@@ -3558,7 +3558,7 @@
               <w:rPr>
                 <w:noProof/>
               </w:rPr>
-              <w:instrText xml:space="preserve"> PAGEREF _Toc241695935 \h </w:instrText>
+              <w:instrText xml:space="preserve"> PAGEREF _Toc241744807 \h </w:instrText>
             </w:r>
             <w:r>
               <w:rPr>
@@ -3600,7 +3600,7 @@
               <w14:ligatures w14:val="standardContextual"/>
             </w:rPr>
           </w:pPr>
-          <w:hyperlink w:anchor="_Toc241695936" w:history="1">
+          <w:hyperlink w:anchor="_Toc241744808" w:history="1">
             <w:r>
               <w:rPr>
                 <w:rStyle w:val="Hiperligao"/>
@@ -3624,7 +3624,7 @@
               <w:rPr>
                 <w:noProof/>
               </w:rPr>
-              <w:instrText xml:space="preserve"> PAGEREF _Toc241695936 \h </w:instrText>
+              <w:instrText xml:space="preserve"> PAGEREF _Toc241744808 \h </w:instrText>
             </w:r>
             <w:r>
               <w:rPr>
@@ -3666,7 +3666,7 @@
               <w14:ligatures w14:val="standardContextual"/>
             </w:rPr>
           </w:pPr>
-          <w:hyperlink w:anchor="_Toc241695937" w:history="1">
+          <w:hyperlink w:anchor="_Toc241744809" w:history="1">
             <w:r>
               <w:rPr>
                 <w:rStyle w:val="Hiperligao"/>
@@ -3690,7 +3690,7 @@
               <w:rPr>
                 <w:noProof/>
               </w:rPr>
-              <w:instrText xml:space="preserve"> PAGEREF _Toc241695937 \h </w:instrText>
+              <w:instrText xml:space="preserve"> PAGEREF _Toc241744809 \h </w:instrText>
             </w:r>
             <w:r>
               <w:rPr>
@@ -3732,7 +3732,7 @@
               <w14:ligatures w14:val="standardContextual"/>
             </w:rPr>
           </w:pPr>
-          <w:hyperlink w:anchor="_Toc241695938" w:history="1">
+          <w:hyperlink w:anchor="_Toc241744810" w:history="1">
             <w:r>
               <w:rPr>
                 <w:rStyle w:val="Hiperligao"/>
@@ -3756,7 +3756,7 @@
               <w:rPr>
                 <w:noProof/>
               </w:rPr>
-              <w:instrText xml:space="preserve"> PAGEREF _Toc241695938 \h </w:instrText>
+              <w:instrText xml:space="preserve"> PAGEREF _Toc241744810 \h </w:instrText>
             </w:r>
             <w:r>
               <w:rPr>
@@ -3798,7 +3798,7 @@
               <w14:ligatures w14:val="standardContextual"/>
             </w:rPr>
           </w:pPr>
-          <w:hyperlink w:anchor="_Toc241695939" w:history="1">
+          <w:hyperlink w:anchor="_Toc241744811" w:history="1">
             <w:r>
               <w:rPr>
                 <w:rStyle w:val="Hiperligao"/>
@@ -3822,7 +3822,7 @@
               <w:rPr>
                 <w:noProof/>
               </w:rPr>
-              <w:instrText xml:space="preserve"> PAGEREF _Toc241695939 \h </w:instrText>
+              <w:instrText xml:space="preserve"> PAGEREF _Toc241744811 \h </w:instrText>
             </w:r>
             <w:r>
               <w:rPr>
@@ -3864,7 +3864,7 @@
               <w14:ligatures w14:val="standardContextual"/>
             </w:rPr>
           </w:pPr>
-          <w:hyperlink w:anchor="_Toc241695940" w:history="1">
+          <w:hyperlink w:anchor="_Toc241744812" w:history="1">
             <w:r>
               <w:rPr>
                 <w:rStyle w:val="Hiperligao"/>
@@ -3888,7 +3888,7 @@
               <w:rPr>
                 <w:noProof/>
               </w:rPr>
-              <w:instrText xml:space="preserve"> PAGEREF _Toc241695940 \h </w:instrText>
+              <w:instrText xml:space="preserve"> PAGEREF _Toc241744812 \h </w:instrText>
             </w:r>
             <w:r>
               <w:rPr>
@@ -3930,7 +3930,7 @@
               <w14:ligatures w14:val="standardContextual"/>
             </w:rPr>
           </w:pPr>
-          <w:hyperlink w:anchor="_Toc241695941" w:history="1">
+          <w:hyperlink w:anchor="_Toc241744813" w:history="1">
             <w:r>
               <w:rPr>
                 <w:rStyle w:val="Hiperligao"/>
@@ -3954,7 +3954,7 @@
               <w:rPr>
                 <w:noProof/>
               </w:rPr>
-              <w:instrText xml:space="preserve"> PAGEREF _Toc241695941 \h </w:instrText>
+              <w:instrText xml:space="preserve"> PAGEREF _Toc241744813 \h </w:instrText>
             </w:r>
             <w:r>
               <w:rPr>
@@ -3996,7 +3996,7 @@
               <w14:ligatures w14:val="standardContextual"/>
             </w:rPr>
           </w:pPr>
-          <w:hyperlink w:anchor="_Toc241695942" w:history="1">
+          <w:hyperlink w:anchor="_Toc241744814" w:history="1">
             <w:r>
               <w:rPr>
                 <w:rStyle w:val="Hiperligao"/>
@@ -4020,7 +4020,7 @@
               <w:rPr>
                 <w:noProof/>
               </w:rPr>
-              <w:instrText xml:space="preserve"> PAGEREF _Toc241695942 \h </w:instrText>
+              <w:instrText xml:space="preserve"> PAGEREF _Toc241744814 \h </w:instrText>
             </w:r>
             <w:r>
               <w:rPr>
@@ -4062,7 +4062,7 @@
               <w14:ligatures w14:val="standardContextual"/>
             </w:rPr>
           </w:pPr>
-          <w:hyperlink w:anchor="_Toc241695943" w:history="1">
+          <w:hyperlink w:anchor="_Toc241744815" w:history="1">
             <w:r>
               <w:rPr>
                 <w:rStyle w:val="Hiperligao"/>
@@ -4086,7 +4086,7 @@
               <w:rPr>
                 <w:noProof/>
               </w:rPr>
-              <w:instrText xml:space="preserve"> PAGEREF _Toc241695943 \h </w:instrText>
+              <w:instrText xml:space="preserve"> PAGEREF _Toc241744815 \h </w:instrText>
             </w:r>
             <w:r>
               <w:rPr>
@@ -4128,7 +4128,7 @@
               <w14:ligatures w14:val="standardContextual"/>
             </w:rPr>
           </w:pPr>
-          <w:hyperlink w:anchor="_Toc241695944" w:history="1">
+          <w:hyperlink w:anchor="_Toc241744816" w:history="1">
             <w:r>
               <w:rPr>
                 <w:rStyle w:val="Hiperligao"/>
@@ -4152,7 +4152,7 @@
               <w:rPr>
                 <w:noProof/>
               </w:rPr>
-              <w:instrText xml:space="preserve"> PAGEREF _Toc241695944 \h </w:instrText>
+              <w:instrText xml:space="preserve"> PAGEREF _Toc241744816 \h </w:instrText>
             </w:r>
             <w:r>
               <w:rPr>
@@ -4194,7 +4194,7 @@
               <w14:ligatures w14:val="standardContextual"/>
             </w:rPr>
           </w:pPr>
-          <w:hyperlink w:anchor="_Toc241695945" w:history="1">
+          <w:hyperlink w:anchor="_Toc241744817" w:history="1">
             <w:r>
               <w:rPr>
                 <w:rStyle w:val="Hiperligao"/>
@@ -4218,7 +4218,7 @@
               <w:rPr>
                 <w:noProof/>
               </w:rPr>
-              <w:instrText xml:space="preserve"> PAGEREF _Toc241695945 \h </w:instrText>
+              <w:instrText xml:space="preserve"> PAGEREF _Toc241744817 \h </w:instrText>
             </w:r>
             <w:r>
               <w:rPr>
@@ -4266,7 +4266,7 @@
       <w:pPr>
         <w:pStyle w:val="Ttulo1"/>
       </w:pPr>
-      <w:bookmarkStart w:id="0" w:name="_Toc241695883"/>
+      <w:bookmarkStart w:id="0" w:name="_Toc241744755"/>
       <w:r>
         <w:lastRenderedPageBreak/>
         <w:t>Your role at a glance</w:t>
@@ -4347,7 +4347,7 @@
       <w:pPr>
         <w:pStyle w:val="Ttulo2"/>
       </w:pPr>
-      <w:bookmarkStart w:id="1" w:name="_Toc241695884"/>
+      <w:bookmarkStart w:id="1" w:name="_Toc241744756"/>
       <w:r>
         <w:t>You can / You cannot</w:t>
       </w:r>
@@ -5195,7 +5195,7 @@
       <w:pPr>
         <w:pStyle w:val="Ttulo2"/>
       </w:pPr>
-      <w:bookmarkStart w:id="2" w:name="_Toc241695885"/>
+      <w:bookmarkStart w:id="2" w:name="_Toc241744757"/>
       <w:r>
         <w:t>Where your access comes from</w:t>
       </w:r>
@@ -5305,7 +5305,7 @@
       <w:pPr>
         <w:pStyle w:val="Ttulo2"/>
       </w:pPr>
-      <w:bookmarkStart w:id="3" w:name="_Toc241695886"/>
+      <w:bookmarkStart w:id="3" w:name="_Toc241744758"/>
       <w:r>
         <w:t>How to sign in, change your password, and sign out</w:t>
       </w:r>
@@ -5419,7 +5419,7 @@
           <w:noProof/>
         </w:rPr>
         <w:drawing>
-          <wp:inline distT="0" distB="0" distL="0" distR="0" wp14:anchorId="417ABE8E" wp14:editId="1CED1C1D">
+          <wp:inline distT="0" distB="0" distL="0" distR="0" wp14:anchorId="5E6B759C" wp14:editId="5B8BDCB4">
             <wp:extent cx="5715000" cy="3571875"/>
             <wp:effectExtent l="0" t="0" r="0" b="0"/>
             <wp:docPr id="1" name="01-login.png" descr="The sign-in page with Email, Password, Remember me and the Sign in button." title="The sign-in page with Email, Password, Remember me and the Sign in button."/>
@@ -5534,7 +5534,7 @@
         </w:rPr>
         <w:lastRenderedPageBreak/>
         <w:drawing>
-          <wp:inline distT="0" distB="0" distL="0" distR="0" wp14:anchorId="4F5C45CC" wp14:editId="21EE84F8">
+          <wp:inline distT="0" distB="0" distL="0" distR="0" wp14:anchorId="1F9EC8F9" wp14:editId="2990BB4B">
             <wp:extent cx="5715000" cy="3571875"/>
             <wp:effectExtent l="0" t="0" r="0" b="0"/>
             <wp:docPr id="2" name="03-user-menu.png" descr="The account menu open, with Settings and Log out." title="The account menu open, with Settings and Log out."/>
@@ -5586,7 +5586,7 @@
       <w:pPr>
         <w:pStyle w:val="Ttulo2"/>
       </w:pPr>
-      <w:bookmarkStart w:id="4" w:name="_Toc241695887"/>
+      <w:bookmarkStart w:id="4" w:name="_Toc241744759"/>
       <w:r>
         <w:t>The sidebar</w:t>
       </w:r>
@@ -6127,7 +6127,7 @@
         </w:rPr>
         <w:lastRenderedPageBreak/>
         <w:drawing>
-          <wp:inline distT="0" distB="0" distL="0" distR="0" wp14:anchorId="566FDA1C" wp14:editId="1C0F50F8">
+          <wp:inline distT="0" distB="0" distL="0" distR="0" wp14:anchorId="306E06FC" wp14:editId="080ECA1E">
             <wp:extent cx="5715000" cy="5133975"/>
             <wp:effectExtent l="0" t="0" r="0" b="0"/>
             <wp:docPr id="3" name="01-dashboard-sidebar.png" descr="The full Administrator sidebar, including Data Modeling and Migration." title="The full Administrator sidebar, including Data Modeling and Migration."/>
@@ -6180,7 +6180,7 @@
         <w:pStyle w:val="Ttulo1"/>
         <w:pageBreakBefore/>
       </w:pPr>
-      <w:bookmarkStart w:id="5" w:name="_Toc241695888"/>
+      <w:bookmarkStart w:id="5" w:name="_Toc241744760"/>
       <w:r>
         <w:lastRenderedPageBreak/>
         <w:t>Settings</w:t>
@@ -6210,7 +6210,7 @@
           <w:noProof/>
         </w:rPr>
         <w:drawing>
-          <wp:inline distT="0" distB="0" distL="0" distR="0" wp14:anchorId="12A20A0C" wp14:editId="6D681A91">
+          <wp:inline distT="0" distB="0" distL="0" distR="0" wp14:anchorId="3A6C88D6" wp14:editId="70CA4C76">
             <wp:extent cx="5715000" cy="3571875"/>
             <wp:effectExtent l="0" t="0" r="0" b="0"/>
             <wp:docPr id="4" name="04-settings.png" descr="The Settings page with the Language, Theme and Color palette cards." title="The Settings page with the Language, Theme and Color palette cards."/>
@@ -7559,7 +7559,7 @@
         <w:pStyle w:val="Ttulo1"/>
         <w:pageBreakBefore/>
       </w:pPr>
-      <w:bookmarkStart w:id="6" w:name="_Toc241695889"/>
+      <w:bookmarkStart w:id="6" w:name="_Toc241744761"/>
       <w:r>
         <w:lastRenderedPageBreak/>
         <w:t>Dashboard</w:t>
@@ -7592,7 +7592,7 @@
           <w:noProof/>
         </w:rPr>
         <w:drawing>
-          <wp:inline distT="0" distB="0" distL="0" distR="0" wp14:anchorId="4DD00CF5" wp14:editId="418DFC94">
+          <wp:inline distT="0" distB="0" distL="0" distR="0" wp14:anchorId="1BE43917" wp14:editId="1D6EE254">
             <wp:extent cx="5715000" cy="5133975"/>
             <wp:effectExtent l="0" t="0" r="0" b="0"/>
             <wp:docPr id="5" name="01-dashboard-sidebar.png" descr="The Administrator dashboard with summary cards and the Recent Maps list." title="The Administrator dashboard with summary cards and the Recent Maps list."/>
@@ -8101,7 +8101,7 @@
         <w:pStyle w:val="Ttulo1"/>
         <w:pageBreakBefore/>
       </w:pPr>
-      <w:bookmarkStart w:id="7" w:name="_Toc241695890"/>
+      <w:bookmarkStart w:id="7" w:name="_Toc241744762"/>
       <w:r>
         <w:lastRenderedPageBreak/>
         <w:t>Maps</w:t>
@@ -8131,7 +8131,7 @@
           <w:noProof/>
         </w:rPr>
         <w:drawing>
-          <wp:inline distT="0" distB="0" distL="0" distR="0" wp14:anchorId="7F1F90FB" wp14:editId="7909D781">
+          <wp:inline distT="0" distB="0" distL="0" distR="0" wp14:anchorId="41ED621E" wp14:editId="4AD9FC2E">
             <wp:extent cx="5715000" cy="3429000"/>
             <wp:effectExtent l="0" t="0" r="0" b="0"/>
             <wp:docPr id="6" name="02-maps-all.png" descr="The Maps list, All tab, with every row icon and the Workbooks section above." title="The Maps list, All tab, with every row icon and the Workbooks section above."/>
@@ -8183,7 +8183,7 @@
       <w:pPr>
         <w:pStyle w:val="Ttulo2"/>
       </w:pPr>
-      <w:bookmarkStart w:id="8" w:name="_Toc241695891"/>
+      <w:bookmarkStart w:id="8" w:name="_Toc241744763"/>
       <w:r>
         <w:t>The list</w:t>
       </w:r>
@@ -9387,7 +9387,7 @@
       <w:pPr>
         <w:pStyle w:val="Ttulo2"/>
       </w:pPr>
-      <w:bookmarkStart w:id="9" w:name="_Toc241695892"/>
+      <w:bookmarkStart w:id="9" w:name="_Toc241744764"/>
       <w:r>
         <w:t>Workbooks</w:t>
       </w:r>
@@ -9801,7 +9801,7 @@
       <w:pPr>
         <w:pStyle w:val="Ttulo2"/>
       </w:pPr>
-      <w:bookmarkStart w:id="10" w:name="_Toc241695893"/>
+      <w:bookmarkStart w:id="10" w:name="_Toc241744765"/>
       <w:r>
         <w:t>Share a map</w:t>
       </w:r>
@@ -9824,7 +9824,7 @@
         </w:rPr>
         <w:lastRenderedPageBreak/>
         <w:drawing>
-          <wp:inline distT="0" distB="0" distL="0" distR="0" wp14:anchorId="099D667A" wp14:editId="76711E79">
+          <wp:inline distT="0" distB="0" distL="0" distR="0" wp14:anchorId="27AC3E0A" wp14:editId="15D4CA7F">
             <wp:extent cx="3743325" cy="3895725"/>
             <wp:effectExtent l="0" t="0" r="0" b="0"/>
             <wp:docPr id="7" name="03-share-dialog.png" descr="The Share map dialog with a search box and Can view, Can export and Can edit buttons." title="The Share map dialog with a search box and Can view, Can export and Can edit buttons."/>
@@ -10301,7 +10301,7 @@
       <w:pPr>
         <w:pStyle w:val="Ttulo2"/>
       </w:pPr>
-      <w:bookmarkStart w:id="11" w:name="_Toc241695894"/>
+      <w:bookmarkStart w:id="11" w:name="_Toc241744766"/>
       <w:r>
         <w:lastRenderedPageBreak/>
         <w:t>Share a whole workbook</w:t>
@@ -10357,7 +10357,7 @@
       <w:pPr>
         <w:pStyle w:val="Ttulo2"/>
       </w:pPr>
-      <w:bookmarkStart w:id="12" w:name="_Toc241695895"/>
+      <w:bookmarkStart w:id="12" w:name="_Toc241744767"/>
       <w:r>
         <w:t>Copy a map</w:t>
       </w:r>
@@ -10372,7 +10372,7 @@
       <w:pPr>
         <w:pStyle w:val="Ttulo2"/>
       </w:pPr>
-      <w:bookmarkStart w:id="13" w:name="_Toc241695896"/>
+      <w:bookmarkStart w:id="13" w:name="_Toc241744768"/>
       <w:r>
         <w:t>Example: give a colleague read access</w:t>
       </w:r>
@@ -10503,7 +10503,7 @@
         <w:pStyle w:val="Ttulo1"/>
         <w:pageBreakBefore/>
       </w:pPr>
-      <w:bookmarkStart w:id="14" w:name="_Toc241695897"/>
+      <w:bookmarkStart w:id="14" w:name="_Toc241744769"/>
       <w:r>
         <w:lastRenderedPageBreak/>
         <w:t>Map builder</w:t>
@@ -10536,7 +10536,7 @@
           <w:noProof/>
         </w:rPr>
         <w:drawing>
-          <wp:inline distT="0" distB="0" distL="0" distR="0" wp14:anchorId="6CAB0516" wp14:editId="77EF0404">
+          <wp:inline distT="0" distB="0" distL="0" distR="0" wp14:anchorId="1F691AD8" wp14:editId="1E37867F">
             <wp:extent cx="5715000" cy="3571875"/>
             <wp:effectExtent l="0" t="0" r="0" b="0"/>
             <wp:docPr id="8" name="05-builder-overview.png" descr="The map builder with the Business Areas tree, the columns canvas and the Properties panel." title="The map builder with the Business Areas tree, the columns canvas and the Properties panel."/>
@@ -10588,7 +10588,7 @@
       <w:pPr>
         <w:pStyle w:val="Ttulo2"/>
       </w:pPr>
-      <w:bookmarkStart w:id="15" w:name="_Toc241695898"/>
+      <w:bookmarkStart w:id="15" w:name="_Toc241744770"/>
       <w:r>
         <w:t>The screen</w:t>
       </w:r>
@@ -10748,7 +10748,7 @@
       <w:pPr>
         <w:pStyle w:val="Ttulo2"/>
       </w:pPr>
-      <w:bookmarkStart w:id="16" w:name="_Toc241695899"/>
+      <w:bookmarkStart w:id="16" w:name="_Toc241744771"/>
       <w:r>
         <w:t>The toolbar</w:t>
       </w:r>
@@ -11964,7 +11964,7 @@
       <w:pPr>
         <w:pStyle w:val="Ttulo2"/>
       </w:pPr>
-      <w:bookmarkStart w:id="17" w:name="_Toc241695900"/>
+      <w:bookmarkStart w:id="17" w:name="_Toc241744772"/>
       <w:r>
         <w:t>Build a map</w:t>
       </w:r>
@@ -12171,7 +12171,7 @@
       <w:pPr>
         <w:pStyle w:val="Ttulo2"/>
       </w:pPr>
-      <w:bookmarkStart w:id="18" w:name="_Toc241695901"/>
+      <w:bookmarkStart w:id="18" w:name="_Toc241744773"/>
       <w:r>
         <w:lastRenderedPageBreak/>
         <w:t>Configure a column</w:t>
@@ -14990,7 +14990,7 @@
           <w:noProof/>
         </w:rPr>
         <w:drawing>
-          <wp:inline distT="0" distB="0" distL="0" distR="0" wp14:anchorId="277A045E" wp14:editId="0F0647D1">
+          <wp:inline distT="0" distB="0" distL="0" distR="0" wp14:anchorId="532F6830" wp14:editId="5CBCE02A">
             <wp:extent cx="5715000" cy="3571875"/>
             <wp:effectExtent l="0" t="0" r="0" b="0"/>
             <wp:docPr id="9" name="08-builder-column-aggregation.png" descr="The Configure column dialog with the Aggregation list open." title="The Configure column dialog with the Aggregation list open."/>
@@ -15042,7 +15042,7 @@
       <w:pPr>
         <w:pStyle w:val="Ttulo2"/>
       </w:pPr>
-      <w:bookmarkStart w:id="19" w:name="_Toc241695902"/>
+      <w:bookmarkStart w:id="19" w:name="_Toc241744774"/>
       <w:r>
         <w:lastRenderedPageBreak/>
         <w:t>The Properties tab</w:t>
@@ -15890,7 +15890,7 @@
       <w:pPr>
         <w:pStyle w:val="Ttulo2"/>
       </w:pPr>
-      <w:bookmarkStart w:id="20" w:name="_Toc241695903"/>
+      <w:bookmarkStart w:id="20" w:name="_Toc241744775"/>
       <w:r>
         <w:t>The Conditions tab</w:t>
       </w:r>
@@ -17433,7 +17433,7 @@
       <w:pPr>
         <w:pStyle w:val="Ttulo2"/>
       </w:pPr>
-      <w:bookmarkStart w:id="21" w:name="_Toc241695904"/>
+      <w:bookmarkStart w:id="21" w:name="_Toc241744776"/>
       <w:r>
         <w:t>The Sort tab</w:t>
       </w:r>
@@ -17878,7 +17878,7 @@
       <w:pPr>
         <w:pStyle w:val="Ttulo2"/>
       </w:pPr>
-      <w:bookmarkStart w:id="22" w:name="_Toc241695905"/>
+      <w:bookmarkStart w:id="22" w:name="_Toc241744777"/>
       <w:r>
         <w:t>The Parameters tab</w:t>
       </w:r>
@@ -18788,7 +18788,7 @@
       <w:pPr>
         <w:pStyle w:val="Ttulo2"/>
       </w:pPr>
-      <w:bookmarkStart w:id="23" w:name="_Toc241695906"/>
+      <w:bookmarkStart w:id="23" w:name="_Toc241744778"/>
       <w:r>
         <w:t>The Calculated Fields tab</w:t>
       </w:r>
@@ -19686,7 +19686,7 @@
       <w:pPr>
         <w:pStyle w:val="Ttulo2"/>
       </w:pPr>
-      <w:bookmarkStart w:id="24" w:name="_Toc241695907"/>
+      <w:bookmarkStart w:id="24" w:name="_Toc241744779"/>
       <w:r>
         <w:t>Conditional formatting</w:t>
       </w:r>
@@ -21080,7 +21080,7 @@
       <w:pPr>
         <w:pStyle w:val="Ttulo2"/>
       </w:pPr>
-      <w:bookmarkStart w:id="25" w:name="_Toc241695908"/>
+      <w:bookmarkStart w:id="25" w:name="_Toc241744780"/>
       <w:r>
         <w:t>Run a map and read the result</w:t>
       </w:r>
@@ -22149,7 +22149,7 @@
           <w:noProof/>
         </w:rPr>
         <w:drawing>
-          <wp:inline distT="0" distB="0" distL="0" distR="0" wp14:anchorId="7EFDE334" wp14:editId="6D0250A0">
+          <wp:inline distT="0" distB="0" distL="0" distR="0" wp14:anchorId="54F08638" wp14:editId="2A59FFD1">
             <wp:extent cx="5715000" cy="3571875"/>
             <wp:effectExtent l="0" t="0" r="0" b="0"/>
             <wp:docPr id="10" name="03-viewer-results.png" descr="Run results with the SQL and Plan buttons beside the Excel, CSV and PDF buttons." title="Run results with the SQL and Plan buttons beside the Excel, CSV and PDF buttons."/>
@@ -22216,7 +22216,7 @@
       <w:pPr>
         <w:pStyle w:val="Ttulo2"/>
       </w:pPr>
-      <w:bookmarkStart w:id="26" w:name="_Toc241695909"/>
+      <w:bookmarkStart w:id="26" w:name="_Toc241744781"/>
       <w:r>
         <w:t>Refusals and errors</w:t>
       </w:r>
@@ -22855,7 +22855,7 @@
         <w:pStyle w:val="Ttulo1"/>
         <w:pageBreakBefore/>
       </w:pPr>
-      <w:bookmarkStart w:id="27" w:name="_Toc241695910"/>
+      <w:bookmarkStart w:id="27" w:name="_Toc241744782"/>
       <w:r>
         <w:lastRenderedPageBreak/>
         <w:t>The map viewer</w:t>
@@ -22888,7 +22888,7 @@
           <w:noProof/>
         </w:rPr>
         <w:drawing>
-          <wp:inline distT="0" distB="0" distL="0" distR="0" wp14:anchorId="0CDC0B61" wp14:editId="70AD4873">
+          <wp:inline distT="0" distB="0" distL="0" distR="0" wp14:anchorId="59B7B6DD" wp14:editId="77EF1020">
             <wp:extent cx="5715000" cy="3571875"/>
             <wp:effectExtent l="0" t="0" r="0" b="0"/>
             <wp:docPr id="11" name="25-viewer-results.png" descr="The map viewer after a completed run, with the results grid and export buttons." title="The map viewer after a completed run, with the results grid and export buttons."/>
@@ -23493,7 +23493,7 @@
         <w:pStyle w:val="Ttulo1"/>
         <w:pageBreakBefore/>
       </w:pPr>
-      <w:bookmarkStart w:id="28" w:name="_Toc241695911"/>
+      <w:bookmarkStart w:id="28" w:name="_Toc241744783"/>
       <w:r>
         <w:lastRenderedPageBreak/>
         <w:t>Runs</w:t>
@@ -23523,7 +23523,7 @@
           <w:noProof/>
         </w:rPr>
         <w:drawing>
-          <wp:inline distT="0" distB="0" distL="0" distR="0" wp14:anchorId="42C1572B" wp14:editId="0E39DBF9">
+          <wp:inline distT="0" distB="0" distL="0" distR="0" wp14:anchorId="294AA5A5" wp14:editId="2FC174E6">
             <wp:extent cx="5715000" cy="3571875"/>
             <wp:effectExtent l="0" t="0" r="0" b="0"/>
             <wp:docPr id="12" name="04-runs-every-user.png" descr="The Runs page with every user's runs shown." title="The Runs page with every user's runs shown."/>
@@ -24853,7 +24853,7 @@
         <w:pStyle w:val="Ttulo1"/>
         <w:pageBreakBefore/>
       </w:pPr>
-      <w:bookmarkStart w:id="29" w:name="_Toc241695912"/>
+      <w:bookmarkStart w:id="29" w:name="_Toc241744784"/>
       <w:r>
         <w:lastRenderedPageBreak/>
         <w:t>Exports</w:t>
@@ -24883,7 +24883,7 @@
           <w:noProof/>
         </w:rPr>
         <w:drawing>
-          <wp:inline distT="0" distB="0" distL="0" distR="0" wp14:anchorId="5CB8A0A5" wp14:editId="31F7B4D5">
+          <wp:inline distT="0" distB="0" distL="0" distR="0" wp14:anchorId="2BAE59BF" wp14:editId="5AB5C515">
             <wp:extent cx="5715000" cy="3571875"/>
             <wp:effectExtent l="0" t="0" r="0" b="0"/>
             <wp:docPr id="13" name="05-exports.png" descr="The Exports page listing export jobs with their status and download buttons." title="The Exports page listing export jobs with their status and download buttons."/>
@@ -25564,7 +25564,7 @@
         <w:pStyle w:val="Ttulo1"/>
         <w:pageBreakBefore/>
       </w:pPr>
-      <w:bookmarkStart w:id="30" w:name="_Toc241695913"/>
+      <w:bookmarkStart w:id="30" w:name="_Toc241744785"/>
       <w:r>
         <w:lastRenderedPageBreak/>
         <w:t>Schedules</w:t>
@@ -25597,7 +25597,7 @@
           <w:noProof/>
         </w:rPr>
         <w:drawing>
-          <wp:inline distT="0" distB="0" distL="0" distR="0" wp14:anchorId="06E10F85" wp14:editId="031D2761">
+          <wp:inline distT="0" distB="0" distL="0" distR="0" wp14:anchorId="0A56A886" wp14:editId="398BD3C1">
             <wp:extent cx="5715000" cy="3571875"/>
             <wp:effectExtent l="0" t="0" r="0" b="0"/>
             <wp:docPr id="14" name="38-schedules-list.png" descr="The Schedules page with a paused schedule and its action icons." title="The Schedules page with a paused schedule and its action icons."/>
@@ -26304,7 +26304,7 @@
       <w:pPr>
         <w:pStyle w:val="Ttulo2"/>
       </w:pPr>
-      <w:bookmarkStart w:id="31" w:name="_Toc241695914"/>
+      <w:bookmarkStart w:id="31" w:name="_Toc241744786"/>
       <w:r>
         <w:lastRenderedPageBreak/>
         <w:t>New Schedule and Edit Schedule</w:t>
@@ -27740,7 +27740,7 @@
         </w:rPr>
         <w:lastRenderedPageBreak/>
         <w:drawing>
-          <wp:inline distT="0" distB="0" distL="0" distR="0" wp14:anchorId="107C6159" wp14:editId="0EAF5427">
+          <wp:inline distT="0" distB="0" distL="0" distR="0" wp14:anchorId="444759FF" wp14:editId="00545F09">
             <wp:extent cx="3743325" cy="4676775"/>
             <wp:effectExtent l="0" t="0" r="0" b="0"/>
             <wp:docPr id="15" name="34-schedule-custom-cron.png" descr="The New Schedule dialog with a custom frequency and the cron expression field." title="The New Schedule dialog with a custom frequency and the cron expression field."/>
@@ -27792,7 +27792,7 @@
       <w:pPr>
         <w:pStyle w:val="Ttulo2"/>
       </w:pPr>
-      <w:bookmarkStart w:id="32" w:name="_Toc241695915"/>
+      <w:bookmarkStart w:id="32" w:name="_Toc241744787"/>
       <w:r>
         <w:t>Execution History</w:t>
       </w:r>
@@ -28241,7 +28241,7 @@
       <w:pPr>
         <w:pStyle w:val="Ttulo2"/>
       </w:pPr>
-      <w:bookmarkStart w:id="33" w:name="_Toc241695916"/>
+      <w:bookmarkStart w:id="33" w:name="_Toc241744788"/>
       <w:r>
         <w:t>Example: a weekly result</w:t>
       </w:r>
@@ -28447,7 +28447,7 @@
         <w:pStyle w:val="Ttulo1"/>
         <w:pageBreakBefore/>
       </w:pPr>
-      <w:bookmarkStart w:id="34" w:name="_Toc241695917"/>
+      <w:bookmarkStart w:id="34" w:name="_Toc241744789"/>
       <w:r>
         <w:lastRenderedPageBreak/>
         <w:t>Business Areas</w:t>
@@ -28480,7 +28480,7 @@
           <w:noProof/>
         </w:rPr>
         <w:drawing>
-          <wp:inline distT="0" distB="0" distL="0" distR="0" wp14:anchorId="773C04DA" wp14:editId="5493113C">
+          <wp:inline distT="0" distB="0" distL="0" distR="0" wp14:anchorId="3FCE961D" wp14:editId="7361B911">
             <wp:extent cx="5715000" cy="3571875"/>
             <wp:effectExtent l="0" t="0" r="0" b="0"/>
             <wp:docPr id="16" name="06-business-areas.png" descr="The Business Areas page listing areas, with the New Business Area button and row icons." title="The Business Areas page listing areas, with the New Business Area button and row icons."/>
@@ -28994,7 +28994,7 @@
         </w:rPr>
         <w:lastRenderedPageBreak/>
         <w:drawing>
-          <wp:inline distT="0" distB="0" distL="0" distR="0" wp14:anchorId="29091652" wp14:editId="5CAA145D">
+          <wp:inline distT="0" distB="0" distL="0" distR="0" wp14:anchorId="0705A3EF" wp14:editId="7E6ECAE2">
             <wp:extent cx="3324225" cy="2047875"/>
             <wp:effectExtent l="0" t="0" r="0" b="0"/>
             <wp:docPr id="17" name="07-business-areas-new.png" descr="The New Business Area dialog with Name and Description fields." title="The New Business Area dialog with Name and Description fields."/>
@@ -29046,7 +29046,7 @@
       <w:pPr>
         <w:pStyle w:val="Ttulo2"/>
       </w:pPr>
-      <w:bookmarkStart w:id="35" w:name="_Toc241695918"/>
+      <w:bookmarkStart w:id="35" w:name="_Toc241744790"/>
       <w:r>
         <w:t>Create a business area</w:t>
       </w:r>
@@ -29150,7 +29150,7 @@
       <w:pPr>
         <w:pStyle w:val="Ttulo2"/>
       </w:pPr>
-      <w:bookmarkStart w:id="36" w:name="_Toc241695919"/>
+      <w:bookmarkStart w:id="36" w:name="_Toc241744791"/>
       <w:r>
         <w:t>Grants</w:t>
       </w:r>
@@ -29182,7 +29182,7 @@
           <w:noProof/>
         </w:rPr>
         <w:drawing>
-          <wp:inline distT="0" distB="0" distL="0" distR="0" wp14:anchorId="03DC260E" wp14:editId="2FAC9AA3">
+          <wp:inline distT="0" distB="0" distL="0" distR="0" wp14:anchorId="7B6A2FBE" wp14:editId="33B67EBD">
             <wp:extent cx="5715000" cy="3571875"/>
             <wp:effectExtent l="0" t="0" r="0" b="0"/>
             <wp:docPr id="18" name="09-business-areas-grants-permission.png" descr="The Manage grants dialog with the Permission list open." title="The Manage grants dialog with the Permission list open."/>
@@ -30439,7 +30439,7 @@
         <w:pStyle w:val="Ttulo1"/>
         <w:pageBreakBefore/>
       </w:pPr>
-      <w:bookmarkStart w:id="37" w:name="_Toc241695920"/>
+      <w:bookmarkStart w:id="37" w:name="_Toc241744792"/>
       <w:r>
         <w:lastRenderedPageBreak/>
         <w:t>Folders</w:t>
@@ -30502,7 +30502,7 @@
           <w:noProof/>
         </w:rPr>
         <w:drawing>
-          <wp:inline distT="0" distB="0" distL="0" distR="0" wp14:anchorId="0BB537DC" wp14:editId="422CA1D4">
+          <wp:inline distT="0" distB="0" distL="0" distR="0" wp14:anchorId="7B28F618" wp14:editId="6D75E3F6">
             <wp:extent cx="5715000" cy="3571875"/>
             <wp:effectExtent l="0" t="0" r="0" b="0"/>
             <wp:docPr id="19" name="11-folders.png" descr="The Folders page with a business area chosen, showing the folder table and row icons." title="The Folders page with a business area chosen, showing the folder table and row icons."/>
@@ -31281,7 +31281,7 @@
       <w:pPr>
         <w:pStyle w:val="Ttulo2"/>
       </w:pPr>
-      <w:bookmarkStart w:id="38" w:name="_Toc241695921"/>
+      <w:bookmarkStart w:id="38" w:name="_Toc241744793"/>
       <w:r>
         <w:t>The folder wizard</w:t>
       </w:r>
@@ -32710,7 +32710,7 @@
         </w:rPr>
         <w:lastRenderedPageBreak/>
         <w:drawing>
-          <wp:inline distT="0" distB="0" distL="0" distR="0" wp14:anchorId="4549109E" wp14:editId="1F0F45A2">
+          <wp:inline distT="0" distB="0" distL="0" distR="0" wp14:anchorId="5EB74E46" wp14:editId="3942C1A6">
             <wp:extent cx="2238375" cy="5905500"/>
             <wp:effectExtent l="0" t="0" r="0" b="0"/>
             <wp:docPr id="20" name="15-folders-picked.png" descr="The New Folder dialog with a table picked and the Items to create checklist." title="The New Folder dialog with a table picked and the Items to create checklist."/>
@@ -32897,7 +32897,7 @@
       <w:pPr>
         <w:pStyle w:val="Ttulo2"/>
       </w:pPr>
-      <w:bookmarkStart w:id="39" w:name="_Toc241695922"/>
+      <w:bookmarkStart w:id="39" w:name="_Toc241744794"/>
       <w:r>
         <w:t>Share a folder into another business area</w:t>
       </w:r>
@@ -33007,7 +33007,7 @@
           <w:noProof/>
         </w:rPr>
         <w:drawing>
-          <wp:inline distT="0" distB="0" distL="0" distR="0" wp14:anchorId="27EF0F3A" wp14:editId="1927E077">
+          <wp:inline distT="0" distB="0" distL="0" distR="0" wp14:anchorId="510BDE90" wp14:editId="4F660B4F">
             <wp:extent cx="3324225" cy="1638300"/>
             <wp:effectExtent l="0" t="0" r="0" b="0"/>
             <wp:docPr id="21" name="16-folders-sharing.png" descr="The folder sharing dialog with the owner badge and the Share into list." title="The folder sharing dialog with the owner badge and the Share into list."/>
@@ -33060,7 +33060,7 @@
         <w:pStyle w:val="Ttulo1"/>
         <w:pageBreakBefore/>
       </w:pPr>
-      <w:bookmarkStart w:id="40" w:name="_Toc241695923"/>
+      <w:bookmarkStart w:id="40" w:name="_Toc241744795"/>
       <w:r>
         <w:lastRenderedPageBreak/>
         <w:t>Items</w:t>
@@ -33113,7 +33113,7 @@
           <w:noProof/>
         </w:rPr>
         <w:drawing>
-          <wp:inline distT="0" distB="0" distL="0" distR="0" wp14:anchorId="29DAF825" wp14:editId="506E5EC9">
+          <wp:inline distT="0" distB="0" distL="0" distR="0" wp14:anchorId="18CCBD1A" wp14:editId="017F5B67">
             <wp:extent cx="5715000" cy="3571875"/>
             <wp:effectExtent l="0" t="0" r="0" b="0"/>
             <wp:docPr id="22" name="17-items.png" descr="The Items page for a chosen folder, with Type, Column, Data Type and Aggregation columns." title="The Items page for a chosen folder, with Type, Column, Data Type and Aggregation columns."/>
@@ -35052,7 +35052,7 @@
         </w:rPr>
         <w:lastRenderedPageBreak/>
         <w:drawing>
-          <wp:inline distT="0" distB="0" distL="0" distR="0" wp14:anchorId="35371977" wp14:editId="1DD8B8E8">
+          <wp:inline distT="0" distB="0" distL="0" distR="0" wp14:anchorId="0DE22070" wp14:editId="37032E00">
             <wp:extent cx="5715000" cy="3571875"/>
             <wp:effectExtent l="0" t="0" r="0" b="0"/>
             <wp:docPr id="23" name="19-items-type-open.png" descr="The New Item dialog with the Item Type list open showing the item types." title="The New Item dialog with the Item Type list open showing the item types."/>
@@ -35105,7 +35105,7 @@
         <w:pStyle w:val="Ttulo1"/>
         <w:pageBreakBefore/>
       </w:pPr>
-      <w:bookmarkStart w:id="41" w:name="_Toc241695924"/>
+      <w:bookmarkStart w:id="41" w:name="_Toc241744796"/>
       <w:r>
         <w:lastRenderedPageBreak/>
         <w:t>Joins</w:t>
@@ -35138,7 +35138,7 @@
           <w:noProof/>
         </w:rPr>
         <w:drawing>
-          <wp:inline distT="0" distB="0" distL="0" distR="0" wp14:anchorId="1E3A6B7C" wp14:editId="423A274C">
+          <wp:inline distT="0" distB="0" distL="0" distR="0" wp14:anchorId="100875A8" wp14:editId="2F9659F1">
             <wp:extent cx="5715000" cy="3571875"/>
             <wp:effectExtent l="0" t="0" r="0" b="0"/>
             <wp:docPr id="24" name="20-joins.png" descr="The Joins page, including joins made of several column pairs." title="The Joins page, including joins made of several column pairs."/>
@@ -36793,7 +36793,7 @@
           <w:noProof/>
         </w:rPr>
         <w:drawing>
-          <wp:inline distT="0" distB="0" distL="0" distR="0" wp14:anchorId="4C0271BD" wp14:editId="14D2456A">
+          <wp:inline distT="0" distB="0" distL="0" distR="0" wp14:anchorId="360536F6" wp14:editId="011A4EFE">
             <wp:extent cx="5715000" cy="3571875"/>
             <wp:effectExtent l="0" t="0" r="0" b="0"/>
             <wp:docPr id="25" name="23-joins-select-open.png" descr="The New Join dialog with a select list open." title="The New Join dialog with a select list open."/>
@@ -36964,7 +36964,7 @@
         <w:pStyle w:val="Ttulo1"/>
         <w:pageBreakBefore/>
       </w:pPr>
-      <w:bookmarkStart w:id="42" w:name="_Toc241695925"/>
+      <w:bookmarkStart w:id="42" w:name="_Toc241744797"/>
       <w:r>
         <w:lastRenderedPageBreak/>
         <w:t>Hierarchies</w:t>
@@ -36997,7 +36997,7 @@
           <w:noProof/>
         </w:rPr>
         <w:drawing>
-          <wp:inline distT="0" distB="0" distL="0" distR="0" wp14:anchorId="61BDC09B" wp14:editId="4792F6FD">
+          <wp:inline distT="0" distB="0" distL="0" distR="0" wp14:anchorId="69550EA8" wp14:editId="7F203F8F">
             <wp:extent cx="5715000" cy="3571875"/>
             <wp:effectExtent l="0" t="0" r="0" b="0"/>
             <wp:docPr id="26" name="24-hierarchies.png" descr="The Hierarchies page with the table showing the number of levels." title="The Hierarchies page with the table showing the number of levels."/>
@@ -38057,7 +38057,7 @@
           <w:noProof/>
         </w:rPr>
         <w:drawing>
-          <wp:inline distT="0" distB="0" distL="0" distR="0" wp14:anchorId="6C1A2B56" wp14:editId="42FD83DE">
+          <wp:inline distT="0" distB="0" distL="0" distR="0" wp14:anchorId="13335846" wp14:editId="33CE2AB4">
             <wp:extent cx="4362450" cy="2762250"/>
             <wp:effectExtent l="0" t="0" r="0" b="0"/>
             <wp:docPr id="27" name="26-hierarchies-level-added.png" descr="The New Hierarchy dialog after adding a level, with folder and item selects." title="The New Hierarchy dialog after adding a level, with folder and item selects."/>
@@ -38110,7 +38110,7 @@
         <w:pStyle w:val="Ttulo1"/>
         <w:pageBreakBefore/>
       </w:pPr>
-      <w:bookmarkStart w:id="43" w:name="_Toc241695926"/>
+      <w:bookmarkStart w:id="43" w:name="_Toc241744798"/>
       <w:r>
         <w:lastRenderedPageBreak/>
         <w:t>Custom Functions</w:t>
@@ -38143,7 +38143,7 @@
           <w:noProof/>
         </w:rPr>
         <w:drawing>
-          <wp:inline distT="0" distB="0" distL="0" distR="0" wp14:anchorId="12B8BEC8" wp14:editId="547BBE0B">
+          <wp:inline distT="0" distB="0" distL="0" distR="0" wp14:anchorId="07491ADA" wp14:editId="1A97E069">
             <wp:extent cx="5715000" cy="3571875"/>
             <wp:effectExtent l="0" t="0" r="0" b="0"/>
             <wp:docPr id="28" name="27-custom-functions.png" descr="The Custom Functions page with filter box, Refresh all, New Function and the function table." title="The Custom Functions page with filter box, Refresh all, New Function and the function table."/>
@@ -38863,7 +38863,7 @@
       <w:pPr>
         <w:pStyle w:val="Ttulo2"/>
       </w:pPr>
-      <w:bookmarkStart w:id="44" w:name="_Toc241695927"/>
+      <w:bookmarkStart w:id="44" w:name="_Toc241744799"/>
       <w:r>
         <w:lastRenderedPageBreak/>
         <w:t>The function form</w:t>
@@ -39834,7 +39834,7 @@
         </w:rPr>
         <w:lastRenderedPageBreak/>
         <w:drawing>
-          <wp:inline distT="0" distB="0" distL="0" distR="0" wp14:anchorId="2A369F76" wp14:editId="0C904830">
+          <wp:inline distT="0" distB="0" distL="0" distR="0" wp14:anchorId="4F88CCFF" wp14:editId="4E2D3CF6">
             <wp:extent cx="4076700" cy="5905500"/>
             <wp:effectExtent l="0" t="0" r="0" b="0"/>
             <wp:docPr id="29" name="29-custom-functions-search-results.png" descr="The New Custom Function dialog listing database functions that match the search." title="The New Custom Function dialog listing database functions that match the search."/>
@@ -39887,7 +39887,7 @@
         <w:pStyle w:val="Ttulo1"/>
         <w:pageBreakBefore/>
       </w:pPr>
-      <w:bookmarkStart w:id="45" w:name="_Toc241695928"/>
+      <w:bookmarkStart w:id="45" w:name="_Toc241744800"/>
       <w:r>
         <w:lastRenderedPageBreak/>
         <w:t>Data Sources</w:t>
@@ -39920,7 +39920,7 @@
           <w:noProof/>
         </w:rPr>
         <w:drawing>
-          <wp:inline distT="0" distB="0" distL="0" distR="0" wp14:anchorId="162E1682" wp14:editId="01222E21">
+          <wp:inline distT="0" distB="0" distL="0" distR="0" wp14:anchorId="3888798B" wp14:editId="66AB8A9B">
             <wp:extent cx="5715000" cy="3571875"/>
             <wp:effectExtent l="0" t="0" r="0" b="0"/>
             <wp:docPr id="30" name="30-data-sources.png" descr="The Data Sources page with a table of connections and five row icons." title="The Data Sources page with a table of connections and five row icons."/>
@@ -41300,7 +41300,7 @@
       <w:pPr>
         <w:pStyle w:val="Ttulo2"/>
       </w:pPr>
-      <w:bookmarkStart w:id="46" w:name="_Toc241695929"/>
+      <w:bookmarkStart w:id="46" w:name="_Toc241744801"/>
       <w:r>
         <w:t>Import tables</w:t>
       </w:r>
@@ -41462,7 +41462,7 @@
           <w:noProof/>
         </w:rPr>
         <w:drawing>
-          <wp:inline distT="0" distB="0" distL="0" distR="0" wp14:anchorId="1750649C" wp14:editId="02306621">
+          <wp:inline distT="0" distB="0" distL="0" distR="0" wp14:anchorId="5DF15697" wp14:editId="0E93C97B">
             <wp:extent cx="3324225" cy="2286000"/>
             <wp:effectExtent l="0" t="0" r="0" b="0"/>
             <wp:docPr id="31" name="34-data-sources-import-dialog.png" descr="The Import Tables dialog with the Discover Tables button, before any table is found." title="The Import Tables dialog with the Discover Tables button, before any table is found."/>
@@ -41515,7 +41515,7 @@
         <w:pStyle w:val="Ttulo1"/>
         <w:pageBreakBefore/>
       </w:pPr>
-      <w:bookmarkStart w:id="47" w:name="_Toc241695930"/>
+      <w:bookmarkStart w:id="47" w:name="_Toc241744802"/>
       <w:r>
         <w:lastRenderedPageBreak/>
         <w:t>Users</w:t>
@@ -41545,7 +41545,7 @@
           <w:noProof/>
         </w:rPr>
         <w:drawing>
-          <wp:inline distT="0" distB="0" distL="0" distR="0" wp14:anchorId="15CABA79" wp14:editId="1D6071D1">
+          <wp:inline distT="0" distB="0" distL="0" distR="0" wp14:anchorId="56A5395E" wp14:editId="1B96A225">
             <wp:extent cx="5715000" cy="3571875"/>
             <wp:effectExtent l="0" t="0" r="0" b="0"/>
             <wp:docPr id="32" name="35-users.png" descr="The Users page with the Credentials file and New User buttons and row icons." title="The Users page with the Credentials file and New User buttons and row icons."/>
@@ -42244,7 +42244,7 @@
       <w:pPr>
         <w:pStyle w:val="Ttulo2"/>
       </w:pPr>
-      <w:bookmarkStart w:id="48" w:name="_Toc241695931"/>
+      <w:bookmarkStart w:id="48" w:name="_Toc241744803"/>
       <w:r>
         <w:lastRenderedPageBreak/>
         <w:t>Create or change a user</w:t>
@@ -43082,7 +43082,7 @@
         </w:rPr>
         <w:lastRenderedPageBreak/>
         <w:drawing>
-          <wp:inline distT="0" distB="0" distL="0" distR="0" wp14:anchorId="17FB1417" wp14:editId="163E782F">
+          <wp:inline distT="0" distB="0" distL="0" distR="0" wp14:anchorId="7CD7147E" wp14:editId="623A28AC">
             <wp:extent cx="5715000" cy="3571875"/>
             <wp:effectExtent l="0" t="0" r="0" b="0"/>
             <wp:docPr id="33" name="37-users-role-open.png" descr="The New User dialog with the Role list open and each role described." title="The New User dialog with the Role list open and each role described."/>
@@ -43134,7 +43134,7 @@
       <w:pPr>
         <w:pStyle w:val="Ttulo2"/>
       </w:pPr>
-      <w:bookmarkStart w:id="49" w:name="_Toc241695932"/>
+      <w:bookmarkStart w:id="49" w:name="_Toc241744804"/>
       <w:r>
         <w:t>Deactivate, activate or delete</w:t>
       </w:r>
@@ -43226,7 +43226,7 @@
           <w:noProof/>
         </w:rPr>
         <w:drawing>
-          <wp:inline distT="0" distB="0" distL="0" distR="0" wp14:anchorId="75955948" wp14:editId="7D8F1C2C">
+          <wp:inline distT="0" distB="0" distL="0" distR="0" wp14:anchorId="6C3734E9" wp14:editId="1CF5B41A">
             <wp:extent cx="3324225" cy="1076325"/>
             <wp:effectExtent l="0" t="0" r="0" b="0"/>
             <wp:docPr id="34" name="39-users-deactivate-dialog.png" descr="The confirmation dialog shown before deactivating a user." title="The confirmation dialog shown before deactivating a user."/>
@@ -43318,7 +43318,7 @@
       <w:pPr>
         <w:pStyle w:val="Ttulo2"/>
       </w:pPr>
-      <w:bookmarkStart w:id="50" w:name="_Toc241695933"/>
+      <w:bookmarkStart w:id="50" w:name="_Toc241744805"/>
       <w:r>
         <w:t>The credentials file</w:t>
       </w:r>
@@ -43343,7 +43343,7 @@
       <w:pPr>
         <w:pStyle w:val="Ttulo2"/>
       </w:pPr>
-      <w:bookmarkStart w:id="51" w:name="_Toc241695934"/>
+      <w:bookmarkStart w:id="51" w:name="_Toc241744806"/>
       <w:r>
         <w:lastRenderedPageBreak/>
         <w:t>Maps this user can open</w:t>
@@ -43386,7 +43386,7 @@
           <w:noProof/>
         </w:rPr>
         <w:drawing>
-          <wp:inline distT="0" distB="0" distL="0" distR="0" wp14:anchorId="7638B3B3" wp14:editId="7852D3A2">
+          <wp:inline distT="0" distB="0" distL="0" distR="0" wp14:anchorId="190AFAD3" wp14:editId="55453F07">
             <wp:extent cx="4362450" cy="2190750"/>
             <wp:effectExtent l="0" t="0" r="0" b="0"/>
             <wp:docPr id="35" name="41-users-maps-dialog.png" descr="The Maps dialog for a user, with source badges and share-level selects." title="The Maps dialog for a user, with source badges and share-level selects."/>
@@ -44328,7 +44328,7 @@
         <w:pStyle w:val="Ttulo1"/>
         <w:pageBreakBefore/>
       </w:pPr>
-      <w:bookmarkStart w:id="52" w:name="_Toc241695935"/>
+      <w:bookmarkStart w:id="52" w:name="_Toc241744807"/>
       <w:r>
         <w:lastRenderedPageBreak/>
         <w:t>Security Policies</w:t>
@@ -44388,7 +44388,7 @@
           <w:noProof/>
         </w:rPr>
         <w:drawing>
-          <wp:inline distT="0" distB="0" distL="0" distR="0" wp14:anchorId="1C8DE690" wp14:editId="0AD2EDC5">
+          <wp:inline distT="0" distB="0" distL="0" distR="0" wp14:anchorId="5C8FC93B" wp14:editId="1327C689">
             <wp:extent cx="5715000" cy="3571875"/>
             <wp:effectExtent l="0" t="0" r="0" b="0"/>
             <wp:docPr id="36" name="43-security.png" descr="The Security Policies page with the Test and New Policy buttons." title="The Security Policies page with the Test and New Policy buttons."/>
@@ -45015,7 +45015,7 @@
       <w:pPr>
         <w:pStyle w:val="Ttulo2"/>
       </w:pPr>
-      <w:bookmarkStart w:id="53" w:name="_Toc241695936"/>
+      <w:bookmarkStart w:id="53" w:name="_Toc241744808"/>
       <w:r>
         <w:lastRenderedPageBreak/>
         <w:t>Write a policy</w:t>
@@ -46071,7 +46071,7 @@
         </w:rPr>
         <w:lastRenderedPageBreak/>
         <w:drawing>
-          <wp:inline distT="0" distB="0" distL="0" distR="0" wp14:anchorId="58F84EAB" wp14:editId="48EEE77D">
+          <wp:inline distT="0" distB="0" distL="0" distR="0" wp14:anchorId="77F83109" wp14:editId="077E1A1D">
             <wp:extent cx="3324225" cy="4638675"/>
             <wp:effectExtent l="0" t="0" r="0" b="0"/>
             <wp:docPr id="37" name="46-security-validate.png" descr="The New Policy dialog after pressing Validate on a predicate." title="The New Policy dialog after pressing Validate on a predicate."/>
@@ -46123,7 +46123,7 @@
       <w:pPr>
         <w:pStyle w:val="Ttulo2"/>
       </w:pPr>
-      <w:bookmarkStart w:id="54" w:name="_Toc241695937"/>
+      <w:bookmarkStart w:id="54" w:name="_Toc241744809"/>
       <w:r>
         <w:t>Assign a policy</w:t>
       </w:r>
@@ -46513,7 +46513,7 @@
       <w:pPr>
         <w:pStyle w:val="Ttulo2"/>
       </w:pPr>
-      <w:bookmarkStart w:id="55" w:name="_Toc241695938"/>
+      <w:bookmarkStart w:id="55" w:name="_Toc241744810"/>
       <w:r>
         <w:lastRenderedPageBreak/>
         <w:t>Test a policy</w:t>
@@ -46588,7 +46588,7 @@
         <w:pStyle w:val="Ttulo1"/>
         <w:pageBreakBefore/>
       </w:pPr>
-      <w:bookmarkStart w:id="56" w:name="_Toc241695939"/>
+      <w:bookmarkStart w:id="56" w:name="_Toc241744811"/>
       <w:r>
         <w:lastRenderedPageBreak/>
         <w:t>Audit Log</w:t>
@@ -46621,7 +46621,7 @@
           <w:noProof/>
         </w:rPr>
         <w:drawing>
-          <wp:inline distT="0" distB="0" distL="0" distR="0" wp14:anchorId="1033796F" wp14:editId="21C654B1">
+          <wp:inline distT="0" distB="0" distL="0" distR="0" wp14:anchorId="0BBC771F" wp14:editId="583296A9">
             <wp:extent cx="5715000" cy="3571875"/>
             <wp:effectExtent l="0" t="0" r="0" b="0"/>
             <wp:docPr id="38" name="47-audit.png" descr="The Audit Log page with export button, statistic cards, daily chart and filters." title="The Audit Log page with export button, statistic cards, daily chart and filters."/>
@@ -47482,7 +47482,7 @@
         <w:pStyle w:val="Ttulo1"/>
         <w:pageBreakBefore/>
       </w:pPr>
-      <w:bookmarkStart w:id="57" w:name="_Toc241695940"/>
+      <w:bookmarkStart w:id="57" w:name="_Toc241744812"/>
       <w:r>
         <w:lastRenderedPageBreak/>
         <w:t>Migration</w:t>
@@ -47562,7 +47562,7 @@
           <w:noProof/>
         </w:rPr>
         <w:drawing>
-          <wp:inline distT="0" distB="0" distL="0" distR="0" wp14:anchorId="50ABDB13" wp14:editId="6C003A65">
+          <wp:inline distT="0" distB="0" distL="0" distR="0" wp14:anchorId="27CAA64A" wp14:editId="245A3702">
             <wp:extent cx="5715000" cy="3571875"/>
             <wp:effectExtent l="0" t="0" r="0" b="0"/>
             <wp:docPr id="39" name="50-migration.png" descr="The Migration page with the Source card, its buttons and help text." title="The Migration page with the Source card, its buttons and help text."/>
@@ -47639,7 +47639,7 @@
       <w:pPr>
         <w:pStyle w:val="Ttulo2"/>
       </w:pPr>
-      <w:bookmarkStart w:id="58" w:name="_Toc241695941"/>
+      <w:bookmarkStart w:id="58" w:name="_Toc241744813"/>
       <w:r>
         <w:t>Choose the source</w:t>
       </w:r>
@@ -48760,7 +48760,7 @@
       <w:pPr>
         <w:pStyle w:val="Ttulo2"/>
       </w:pPr>
-      <w:bookmarkStart w:id="59" w:name="_Toc241695942"/>
+      <w:bookmarkStart w:id="59" w:name="_Toc241744814"/>
       <w:r>
         <w:t>What each action does</w:t>
       </w:r>
@@ -49161,7 +49161,7 @@
       <w:pPr>
         <w:pStyle w:val="Ttulo2"/>
       </w:pPr>
-      <w:bookmarkStart w:id="60" w:name="_Toc241695943"/>
+      <w:bookmarkStart w:id="60" w:name="_Toc241744815"/>
       <w:r>
         <w:t>Do a migration safely</w:t>
       </w:r>
@@ -49403,7 +49403,7 @@
         <w:pStyle w:val="Ttulo1"/>
         <w:pageBreakBefore/>
       </w:pPr>
-      <w:bookmarkStart w:id="61" w:name="_Toc241695944"/>
+      <w:bookmarkStart w:id="61" w:name="_Toc241744816"/>
       <w:r>
         <w:lastRenderedPageBreak/>
         <w:t>Common questions</w:t>
@@ -49694,7 +49694,7 @@
       <w:pPr>
         <w:pStyle w:val="Ttulo2"/>
       </w:pPr>
-      <w:bookmarkStart w:id="62" w:name="_Toc241695945"/>
+      <w:bookmarkStart w:id="62" w:name="_Toc241744817"/>
       <w:r>
         <w:t>Glossary</w:t>
       </w:r>
@@ -51028,10 +51028,68 @@
 <file path=word/numbering.xml><?xml version="1.0" encoding="utf-8"?>
 <w:numbering xmlns:wpc="http://schemas.microsoft.com/office/word/2010/wordprocessingCanvas" xmlns:cx="http://schemas.microsoft.com/office/drawing/2014/chartex" xmlns:cx1="http://schemas.microsoft.com/office/drawing/2015/9/8/chartex" xmlns:cx2="http://schemas.microsoft.com/office/drawing/2015/10/21/chartex" xmlns:cx3="http://schemas.microsoft.com/office/drawing/2016/5/9/chartex" xmlns:cx4="http://schemas.microsoft.com/office/drawing/2016/5/10/chartex" xmlns:cx5="http://schemas.microsoft.com/office/drawing/2016/5/11/chartex" xmlns:cx6="http://schemas.microsoft.com/office/drawing/2016/5/12/chartex" xmlns:cx7="http://schemas.microsoft.com/office/drawing/2016/5/13/chartex" xmlns:cx8="http://schemas.microsoft.com/office/drawing/2016/5/14/chartex" xmlns:mc="http://schemas.openxmlformats.org/markup-compatibility/2006" xmlns:aink="http://schemas.microsoft.com/office/drawing/2016/ink" xmlns:am3d="http://schemas.microsoft.com/office/drawing/2017/model3d" xmlns:o="urn:schemas-microsoft-com:office:office" xmlns:oel="http://schemas.microsoft.com/office/2019/extlst" xmlns:r="http://schemas.openxmlformats.org/officeDocument/2006/relationships" xmlns:m="http://schemas.openxmlformats.org/officeDocument/2006/math" xmlns:v="urn:schemas-microsoft-com:vml" xmlns:wp14="http://schemas.microsoft.com/office/word/2010/wordprocessingDrawing" xmlns:wp="http://schemas.openxmlformats.org/drawingml/2006/wordprocessingDrawing" xmlns:w10="urn:schemas-microsoft-com:office:word" xmlns:w="http://schemas.openxmlformats.org/wordprocessingml/2006/main" xmlns:w14="http://schemas.microsoft.com/office/word/2010/wordml" xmlns:w15="http://schemas.microsoft.com/office/word/2012/wordml" xmlns:w16cex="http://schemas.microsoft.com/office/word/2018/wordml/cex" xmlns:w16cid="http://schemas.microsoft.com/office/word/2016/wordml/cid" xmlns:w16="http://schemas.microsoft.com/office/word/2018/wordml" xmlns:w16sdtdh="http://schemas.microsoft.com/office/word/2020/wordml/sdtdatahash" xmlns:w16se="http://schemas.microsoft.com/office/word/2015/wordml/symex" xmlns:wpg="http://schemas.microsoft.com/office/word/2010/wordprocessingGroup" xmlns:wpi="http://schemas.microsoft.com/office/word/2010/wordprocessingInk" xmlns:wne="http://schemas.microsoft.com/office/word/2006/wordml" xmlns:wps="http://schemas.microsoft.com/office/word/2010/wordprocessingShape" mc:Ignorable="w14 w15 w16se w16cid w16 w16cex w16sdtdh wp14">
   <w:abstractNum w:abstractNumId="0" w15:restartNumberingAfterBreak="0">
-    <w:nsid w:val="08072E52"/>
+    <w:nsid w:val="000A3B95"/>
     <w:multiLevelType w:val="hybridMultilevel"/>
-    <w:tmpl w:val="52AC0C20"/>
-    <w:lvl w:ilvl="0" w:tplc="8E0CD718">
+    <w:tmpl w:val="0C6E160C"/>
+    <w:lvl w:ilvl="0" w:tplc="27A0791C">
+      <w:start w:val="1"/>
+      <w:numFmt w:val="bullet"/>
+      <w:lvlText w:val="•"/>
+      <w:lvlJc w:val="left"/>
+      <w:pPr>
+        <w:ind w:left="360" w:hanging="260"/>
+      </w:pPr>
+    </w:lvl>
+    <w:lvl w:ilvl="1" w:tplc="BF2A25D8" w:tentative="1">
+      <w:start w:val="1"/>
+      <w:numFmt w:val="bullet"/>
+      <w:lvlText w:val="–"/>
+      <w:lvlJc w:val="left"/>
+      <w:pPr>
+        <w:ind w:left="720" w:hanging="260"/>
+      </w:pPr>
+    </w:lvl>
+    <w:lvl w:ilvl="2" w:tplc="4C06FA44">
+      <w:numFmt w:val="decimal"/>
+      <w:lvlText w:val=""/>
+      <w:lvlJc w:val="left"/>
+    </w:lvl>
+    <w:lvl w:ilvl="3" w:tplc="A092A250">
+      <w:numFmt w:val="decimal"/>
+      <w:lvlText w:val=""/>
+      <w:lvlJc w:val="left"/>
+    </w:lvl>
+    <w:lvl w:ilvl="4" w:tplc="82B863F6">
+      <w:numFmt w:val="decimal"/>
+      <w:lvlText w:val=""/>
+      <w:lvlJc w:val="left"/>
+    </w:lvl>
+    <w:lvl w:ilvl="5" w:tplc="3120FB7A">
+      <w:numFmt w:val="decimal"/>
+      <w:lvlText w:val=""/>
+      <w:lvlJc w:val="left"/>
+    </w:lvl>
+    <w:lvl w:ilvl="6" w:tplc="0DCCC998">
+      <w:numFmt w:val="decimal"/>
+      <w:lvlText w:val=""/>
+      <w:lvlJc w:val="left"/>
+    </w:lvl>
+    <w:lvl w:ilvl="7" w:tplc="872E6174">
+      <w:numFmt w:val="decimal"/>
+      <w:lvlText w:val=""/>
+      <w:lvlJc w:val="left"/>
+    </w:lvl>
+    <w:lvl w:ilvl="8" w:tplc="2B26BB3A">
+      <w:numFmt w:val="decimal"/>
+      <w:lvlText w:val=""/>
+      <w:lvlJc w:val="left"/>
+    </w:lvl>
+  </w:abstractNum>
+  <w:abstractNum w:abstractNumId="1" w15:restartNumberingAfterBreak="0">
+    <w:nsid w:val="06372B3E"/>
+    <w:multiLevelType w:val="hybridMultilevel"/>
+    <w:tmpl w:val="57B04D62"/>
+    <w:lvl w:ilvl="0" w:tplc="120CC996">
       <w:start w:val="1"/>
       <w:numFmt w:val="decimal"/>
       <w:lvlText w:val="%1."/>
@@ -51040,7 +51098,7 @@
         <w:ind w:left="360" w:hanging="300"/>
       </w:pPr>
     </w:lvl>
-    <w:lvl w:ilvl="1" w:tplc="56F8E938" w:tentative="1">
+    <w:lvl w:ilvl="1" w:tplc="F872F6EC" w:tentative="1">
       <w:start w:val="1"/>
       <w:numFmt w:val="lowerLetter"/>
       <w:lvlText w:val="%2."/>
@@ -51049,47 +51107,47 @@
         <w:ind w:left="720" w:hanging="300"/>
       </w:pPr>
     </w:lvl>
-    <w:lvl w:ilvl="2" w:tplc="A2C62714">
+    <w:lvl w:ilvl="2" w:tplc="6B0ABF76">
       <w:numFmt w:val="decimal"/>
       <w:lvlText w:val=""/>
       <w:lvlJc w:val="left"/>
     </w:lvl>
-    <w:lvl w:ilvl="3" w:tplc="757C9CB0">
+    <w:lvl w:ilvl="3" w:tplc="862608A6">
       <w:numFmt w:val="decimal"/>
       <w:lvlText w:val=""/>
       <w:lvlJc w:val="left"/>
     </w:lvl>
-    <w:lvl w:ilvl="4" w:tplc="B9C40E1C">
+    <w:lvl w:ilvl="4" w:tplc="0E841872">
       <w:numFmt w:val="decimal"/>
       <w:lvlText w:val=""/>
       <w:lvlJc w:val="left"/>
     </w:lvl>
-    <w:lvl w:ilvl="5" w:tplc="84BECD9E">
+    <w:lvl w:ilvl="5" w:tplc="345C1D6C">
       <w:numFmt w:val="decimal"/>
       <w:lvlText w:val=""/>
       <w:lvlJc w:val="left"/>
     </w:lvl>
-    <w:lvl w:ilvl="6" w:tplc="B55074C4">
+    <w:lvl w:ilvl="6" w:tplc="027CC326">
       <w:numFmt w:val="decimal"/>
       <w:lvlText w:val=""/>
       <w:lvlJc w:val="left"/>
     </w:lvl>
-    <w:lvl w:ilvl="7" w:tplc="047ECA34">
+    <w:lvl w:ilvl="7" w:tplc="3212279C">
       <w:numFmt w:val="decimal"/>
       <w:lvlText w:val=""/>
       <w:lvlJc w:val="left"/>
     </w:lvl>
-    <w:lvl w:ilvl="8" w:tplc="CB121D16">
+    <w:lvl w:ilvl="8" w:tplc="F4B434F8">
       <w:numFmt w:val="decimal"/>
       <w:lvlText w:val=""/>
       <w:lvlJc w:val="left"/>
     </w:lvl>
   </w:abstractNum>
-  <w:abstractNum w:abstractNumId="1" w15:restartNumberingAfterBreak="0">
-    <w:nsid w:val="09C3354A"/>
+  <w:abstractNum w:abstractNumId="2" w15:restartNumberingAfterBreak="0">
+    <w:nsid w:val="154C4512"/>
     <w:multiLevelType w:val="hybridMultilevel"/>
-    <w:tmpl w:val="4F3C0DC4"/>
-    <w:lvl w:ilvl="0" w:tplc="571AE3AA">
+    <w:tmpl w:val="054A3B68"/>
+    <w:lvl w:ilvl="0" w:tplc="7F183D00">
       <w:start w:val="1"/>
       <w:numFmt w:val="decimal"/>
       <w:lvlText w:val="%1."/>
@@ -51098,7 +51156,7 @@
         <w:ind w:left="360" w:hanging="300"/>
       </w:pPr>
     </w:lvl>
-    <w:lvl w:ilvl="1" w:tplc="AD46C378" w:tentative="1">
+    <w:lvl w:ilvl="1" w:tplc="A99E99B6" w:tentative="1">
       <w:start w:val="1"/>
       <w:numFmt w:val="lowerLetter"/>
       <w:lvlText w:val="%2."/>
@@ -51107,47 +51165,47 @@
         <w:ind w:left="720" w:hanging="300"/>
       </w:pPr>
     </w:lvl>
-    <w:lvl w:ilvl="2" w:tplc="559A85DA">
+    <w:lvl w:ilvl="2" w:tplc="4A3081EC">
       <w:numFmt w:val="decimal"/>
       <w:lvlText w:val=""/>
       <w:lvlJc w:val="left"/>
     </w:lvl>
-    <w:lvl w:ilvl="3" w:tplc="7ECCD320">
+    <w:lvl w:ilvl="3" w:tplc="A1ACBD2C">
       <w:numFmt w:val="decimal"/>
       <w:lvlText w:val=""/>
       <w:lvlJc w:val="left"/>
     </w:lvl>
-    <w:lvl w:ilvl="4" w:tplc="F4C61798">
+    <w:lvl w:ilvl="4" w:tplc="BBCC0C1C">
       <w:numFmt w:val="decimal"/>
       <w:lvlText w:val=""/>
       <w:lvlJc w:val="left"/>
     </w:lvl>
-    <w:lvl w:ilvl="5" w:tplc="61E85648">
+    <w:lvl w:ilvl="5" w:tplc="DD2433C2">
       <w:numFmt w:val="decimal"/>
       <w:lvlText w:val=""/>
       <w:lvlJc w:val="left"/>
     </w:lvl>
-    <w:lvl w:ilvl="6" w:tplc="5AC223A4">
+    <w:lvl w:ilvl="6" w:tplc="F45C3706">
       <w:numFmt w:val="decimal"/>
       <w:lvlText w:val=""/>
       <w:lvlJc w:val="left"/>
     </w:lvl>
-    <w:lvl w:ilvl="7" w:tplc="947CD8DC">
+    <w:lvl w:ilvl="7" w:tplc="2EF85C4E">
       <w:numFmt w:val="decimal"/>
       <w:lvlText w:val=""/>
       <w:lvlJc w:val="left"/>
     </w:lvl>
-    <w:lvl w:ilvl="8" w:tplc="0A40B98E">
+    <w:lvl w:ilvl="8" w:tplc="B7887C80">
       <w:numFmt w:val="decimal"/>
       <w:lvlText w:val=""/>
       <w:lvlJc w:val="left"/>
     </w:lvl>
   </w:abstractNum>
-  <w:abstractNum w:abstractNumId="2" w15:restartNumberingAfterBreak="0">
-    <w:nsid w:val="113E3A4F"/>
+  <w:abstractNum w:abstractNumId="3" w15:restartNumberingAfterBreak="0">
+    <w:nsid w:val="18761780"/>
     <w:multiLevelType w:val="hybridMultilevel"/>
-    <w:tmpl w:val="686A35A2"/>
-    <w:lvl w:ilvl="0" w:tplc="FF68D900">
+    <w:tmpl w:val="794E173A"/>
+    <w:lvl w:ilvl="0" w:tplc="5F12BBD8">
       <w:start w:val="1"/>
       <w:numFmt w:val="decimal"/>
       <w:lvlText w:val="%1."/>
@@ -51156,7 +51214,7 @@
         <w:ind w:left="360" w:hanging="300"/>
       </w:pPr>
     </w:lvl>
-    <w:lvl w:ilvl="1" w:tplc="8E6C6BB0" w:tentative="1">
+    <w:lvl w:ilvl="1" w:tplc="FE745D40" w:tentative="1">
       <w:start w:val="1"/>
       <w:numFmt w:val="lowerLetter"/>
       <w:lvlText w:val="%2."/>
@@ -51165,47 +51223,47 @@
         <w:ind w:left="720" w:hanging="300"/>
       </w:pPr>
     </w:lvl>
-    <w:lvl w:ilvl="2" w:tplc="DB18E63E">
+    <w:lvl w:ilvl="2" w:tplc="C27CCA9C">
       <w:numFmt w:val="decimal"/>
       <w:lvlText w:val=""/>
       <w:lvlJc w:val="left"/>
     </w:lvl>
-    <w:lvl w:ilvl="3" w:tplc="8116CEF0">
+    <w:lvl w:ilvl="3" w:tplc="42A6554A">
       <w:numFmt w:val="decimal"/>
       <w:lvlText w:val=""/>
       <w:lvlJc w:val="left"/>
     </w:lvl>
-    <w:lvl w:ilvl="4" w:tplc="8C96D392">
+    <w:lvl w:ilvl="4" w:tplc="91D4FFA6">
       <w:numFmt w:val="decimal"/>
       <w:lvlText w:val=""/>
       <w:lvlJc w:val="left"/>
     </w:lvl>
-    <w:lvl w:ilvl="5" w:tplc="445A877E">
+    <w:lvl w:ilvl="5" w:tplc="269EE976">
       <w:numFmt w:val="decimal"/>
       <w:lvlText w:val=""/>
       <w:lvlJc w:val="left"/>
     </w:lvl>
-    <w:lvl w:ilvl="6" w:tplc="7978569A">
+    <w:lvl w:ilvl="6" w:tplc="F692CAB2">
       <w:numFmt w:val="decimal"/>
       <w:lvlText w:val=""/>
       <w:lvlJc w:val="left"/>
     </w:lvl>
-    <w:lvl w:ilvl="7" w:tplc="ACB8907A">
+    <w:lvl w:ilvl="7" w:tplc="B802D918">
       <w:numFmt w:val="decimal"/>
       <w:lvlText w:val=""/>
       <w:lvlJc w:val="left"/>
     </w:lvl>
-    <w:lvl w:ilvl="8" w:tplc="0568AC78">
+    <w:lvl w:ilvl="8" w:tplc="F964095C">
       <w:numFmt w:val="decimal"/>
       <w:lvlText w:val=""/>
       <w:lvlJc w:val="left"/>
     </w:lvl>
   </w:abstractNum>
-  <w:abstractNum w:abstractNumId="3" w15:restartNumberingAfterBreak="0">
-    <w:nsid w:val="141938A6"/>
+  <w:abstractNum w:abstractNumId="4" w15:restartNumberingAfterBreak="0">
+    <w:nsid w:val="2B6E52BC"/>
     <w:multiLevelType w:val="hybridMultilevel"/>
-    <w:tmpl w:val="F4E22EF6"/>
-    <w:lvl w:ilvl="0" w:tplc="16BC884E">
+    <w:tmpl w:val="8B861758"/>
+    <w:lvl w:ilvl="0" w:tplc="1486CC74">
       <w:start w:val="1"/>
       <w:numFmt w:val="decimal"/>
       <w:lvlText w:val="%1."/>
@@ -51214,7 +51272,7 @@
         <w:ind w:left="360" w:hanging="300"/>
       </w:pPr>
     </w:lvl>
-    <w:lvl w:ilvl="1" w:tplc="7E1C6A36" w:tentative="1">
+    <w:lvl w:ilvl="1" w:tplc="28BC0FA0" w:tentative="1">
       <w:start w:val="1"/>
       <w:numFmt w:val="lowerLetter"/>
       <w:lvlText w:val="%2."/>
@@ -51223,47 +51281,47 @@
         <w:ind w:left="720" w:hanging="300"/>
       </w:pPr>
     </w:lvl>
-    <w:lvl w:ilvl="2" w:tplc="1BC0ECB6">
+    <w:lvl w:ilvl="2" w:tplc="D00AB7CE">
       <w:numFmt w:val="decimal"/>
       <w:lvlText w:val=""/>
       <w:lvlJc w:val="left"/>
     </w:lvl>
-    <w:lvl w:ilvl="3" w:tplc="823A4FEA">
+    <w:lvl w:ilvl="3" w:tplc="0BA6414E">
       <w:numFmt w:val="decimal"/>
       <w:lvlText w:val=""/>
       <w:lvlJc w:val="left"/>
     </w:lvl>
-    <w:lvl w:ilvl="4" w:tplc="1D3E51EE">
+    <w:lvl w:ilvl="4" w:tplc="D8EEAACA">
       <w:numFmt w:val="decimal"/>
       <w:lvlText w:val=""/>
       <w:lvlJc w:val="left"/>
     </w:lvl>
-    <w:lvl w:ilvl="5" w:tplc="788C1A38">
+    <w:lvl w:ilvl="5" w:tplc="B6069E12">
       <w:numFmt w:val="decimal"/>
       <w:lvlText w:val=""/>
       <w:lvlJc w:val="left"/>
     </w:lvl>
-    <w:lvl w:ilvl="6" w:tplc="318C46E8">
+    <w:lvl w:ilvl="6" w:tplc="9A4CF6EE">
       <w:numFmt w:val="decimal"/>
       <w:lvlText w:val=""/>
       <w:lvlJc w:val="left"/>
     </w:lvl>
-    <w:lvl w:ilvl="7" w:tplc="BC64D32C">
+    <w:lvl w:ilvl="7" w:tplc="AAE6BBAE">
       <w:numFmt w:val="decimal"/>
       <w:lvlText w:val=""/>
       <w:lvlJc w:val="left"/>
     </w:lvl>
-    <w:lvl w:ilvl="8" w:tplc="F7CAAD7E">
+    <w:lvl w:ilvl="8" w:tplc="8702E882">
       <w:numFmt w:val="decimal"/>
       <w:lvlText w:val=""/>
       <w:lvlJc w:val="left"/>
     </w:lvl>
   </w:abstractNum>
-  <w:abstractNum w:abstractNumId="4" w15:restartNumberingAfterBreak="0">
-    <w:nsid w:val="2897592D"/>
+  <w:abstractNum w:abstractNumId="5" w15:restartNumberingAfterBreak="0">
+    <w:nsid w:val="2E0F3B49"/>
     <w:multiLevelType w:val="hybridMultilevel"/>
-    <w:tmpl w:val="C29A261A"/>
-    <w:lvl w:ilvl="0" w:tplc="1696CBEE">
+    <w:tmpl w:val="1D3A7A7A"/>
+    <w:lvl w:ilvl="0" w:tplc="2A7C59C8">
       <w:start w:val="1"/>
       <w:numFmt w:val="decimal"/>
       <w:lvlText w:val="%1."/>
@@ -51272,7 +51330,7 @@
         <w:ind w:left="360" w:hanging="300"/>
       </w:pPr>
     </w:lvl>
-    <w:lvl w:ilvl="1" w:tplc="E9946F4E" w:tentative="1">
+    <w:lvl w:ilvl="1" w:tplc="E2E02936" w:tentative="1">
       <w:start w:val="1"/>
       <w:numFmt w:val="lowerLetter"/>
       <w:lvlText w:val="%2."/>
@@ -51281,105 +51339,47 @@
         <w:ind w:left="720" w:hanging="300"/>
       </w:pPr>
     </w:lvl>
-    <w:lvl w:ilvl="2" w:tplc="A14A2BE6">
+    <w:lvl w:ilvl="2" w:tplc="4FF6E290">
       <w:numFmt w:val="decimal"/>
       <w:lvlText w:val=""/>
       <w:lvlJc w:val="left"/>
     </w:lvl>
-    <w:lvl w:ilvl="3" w:tplc="735AD73C">
+    <w:lvl w:ilvl="3" w:tplc="5DA61F30">
       <w:numFmt w:val="decimal"/>
       <w:lvlText w:val=""/>
       <w:lvlJc w:val="left"/>
     </w:lvl>
-    <w:lvl w:ilvl="4" w:tplc="A7969BF0">
+    <w:lvl w:ilvl="4" w:tplc="F21CB066">
       <w:numFmt w:val="decimal"/>
       <w:lvlText w:val=""/>
       <w:lvlJc w:val="left"/>
     </w:lvl>
-    <w:lvl w:ilvl="5" w:tplc="C29ECF4A">
+    <w:lvl w:ilvl="5" w:tplc="E452AEDC">
       <w:numFmt w:val="decimal"/>
       <w:lvlText w:val=""/>
       <w:lvlJc w:val="left"/>
     </w:lvl>
-    <w:lvl w:ilvl="6" w:tplc="CE18037C">
+    <w:lvl w:ilvl="6" w:tplc="C8E0BAAC">
       <w:numFmt w:val="decimal"/>
       <w:lvlText w:val=""/>
       <w:lvlJc w:val="left"/>
     </w:lvl>
-    <w:lvl w:ilvl="7" w:tplc="EA5C8B0E">
+    <w:lvl w:ilvl="7" w:tplc="DEF4F112">
       <w:numFmt w:val="decimal"/>
       <w:lvlText w:val=""/>
       <w:lvlJc w:val="left"/>
     </w:lvl>
-    <w:lvl w:ilvl="8" w:tplc="3782F248">
-      <w:numFmt w:val="decimal"/>
-      <w:lvlText w:val=""/>
-      <w:lvlJc w:val="left"/>
-    </w:lvl>
-  </w:abstractNum>
-  <w:abstractNum w:abstractNumId="5" w15:restartNumberingAfterBreak="0">
-    <w:nsid w:val="30167582"/>
-    <w:multiLevelType w:val="hybridMultilevel"/>
-    <w:tmpl w:val="821A8AEE"/>
-    <w:lvl w:ilvl="0" w:tplc="61F6AFA6">
-      <w:start w:val="1"/>
-      <w:numFmt w:val="bullet"/>
-      <w:lvlText w:val="•"/>
-      <w:lvlJc w:val="left"/>
-      <w:pPr>
-        <w:ind w:left="360" w:hanging="260"/>
-      </w:pPr>
-    </w:lvl>
-    <w:lvl w:ilvl="1" w:tplc="1A046A1C" w:tentative="1">
-      <w:start w:val="1"/>
-      <w:numFmt w:val="bullet"/>
-      <w:lvlText w:val="–"/>
-      <w:lvlJc w:val="left"/>
-      <w:pPr>
-        <w:ind w:left="720" w:hanging="260"/>
-      </w:pPr>
-    </w:lvl>
-    <w:lvl w:ilvl="2" w:tplc="3D0C808A">
-      <w:numFmt w:val="decimal"/>
-      <w:lvlText w:val=""/>
-      <w:lvlJc w:val="left"/>
-    </w:lvl>
-    <w:lvl w:ilvl="3" w:tplc="CFE86EB8">
-      <w:numFmt w:val="decimal"/>
-      <w:lvlText w:val=""/>
-      <w:lvlJc w:val="left"/>
-    </w:lvl>
-    <w:lvl w:ilvl="4" w:tplc="00340C32">
-      <w:numFmt w:val="decimal"/>
-      <w:lvlText w:val=""/>
-      <w:lvlJc w:val="left"/>
-    </w:lvl>
-    <w:lvl w:ilvl="5" w:tplc="2336204A">
-      <w:numFmt w:val="decimal"/>
-      <w:lvlText w:val=""/>
-      <w:lvlJc w:val="left"/>
-    </w:lvl>
-    <w:lvl w:ilvl="6" w:tplc="0A885604">
-      <w:numFmt w:val="decimal"/>
-      <w:lvlText w:val=""/>
-      <w:lvlJc w:val="left"/>
-    </w:lvl>
-    <w:lvl w:ilvl="7" w:tplc="39422816">
-      <w:numFmt w:val="decimal"/>
-      <w:lvlText w:val=""/>
-      <w:lvlJc w:val="left"/>
-    </w:lvl>
-    <w:lvl w:ilvl="8" w:tplc="5360F0DA">
+    <w:lvl w:ilvl="8" w:tplc="C7E40A34">
       <w:numFmt w:val="decimal"/>
       <w:lvlText w:val=""/>
       <w:lvlJc w:val="left"/>
     </w:lvl>
   </w:abstractNum>
   <w:abstractNum w:abstractNumId="6" w15:restartNumberingAfterBreak="0">
-    <w:nsid w:val="379D4F5A"/>
+    <w:nsid w:val="31AA13E0"/>
     <w:multiLevelType w:val="hybridMultilevel"/>
-    <w:tmpl w:val="CC323BA0"/>
-    <w:lvl w:ilvl="0" w:tplc="EE20CAFC">
+    <w:tmpl w:val="66728790"/>
+    <w:lvl w:ilvl="0" w:tplc="29CE42AA">
       <w:start w:val="1"/>
       <w:numFmt w:val="decimal"/>
       <w:lvlText w:val="%1."/>
@@ -51388,7 +51388,7 @@
         <w:ind w:left="360" w:hanging="300"/>
       </w:pPr>
     </w:lvl>
-    <w:lvl w:ilvl="1" w:tplc="A1B4E484" w:tentative="1">
+    <w:lvl w:ilvl="1" w:tplc="DBC0E6EA" w:tentative="1">
       <w:start w:val="1"/>
       <w:numFmt w:val="lowerLetter"/>
       <w:lvlText w:val="%2."/>
@@ -51397,47 +51397,47 @@
         <w:ind w:left="720" w:hanging="300"/>
       </w:pPr>
     </w:lvl>
-    <w:lvl w:ilvl="2" w:tplc="602CCEF2">
+    <w:lvl w:ilvl="2" w:tplc="1ED073E0">
       <w:numFmt w:val="decimal"/>
       <w:lvlText w:val=""/>
       <w:lvlJc w:val="left"/>
     </w:lvl>
-    <w:lvl w:ilvl="3" w:tplc="C66479B2">
+    <w:lvl w:ilvl="3" w:tplc="CE0C4D78">
       <w:numFmt w:val="decimal"/>
       <w:lvlText w:val=""/>
       <w:lvlJc w:val="left"/>
     </w:lvl>
-    <w:lvl w:ilvl="4" w:tplc="0D5E39C4">
+    <w:lvl w:ilvl="4" w:tplc="722C99BE">
       <w:numFmt w:val="decimal"/>
       <w:lvlText w:val=""/>
       <w:lvlJc w:val="left"/>
     </w:lvl>
-    <w:lvl w:ilvl="5" w:tplc="70DC1F9E">
+    <w:lvl w:ilvl="5" w:tplc="B04615B8">
       <w:numFmt w:val="decimal"/>
       <w:lvlText w:val=""/>
       <w:lvlJc w:val="left"/>
     </w:lvl>
-    <w:lvl w:ilvl="6" w:tplc="37CAB156">
+    <w:lvl w:ilvl="6" w:tplc="B40CA3B4">
       <w:numFmt w:val="decimal"/>
       <w:lvlText w:val=""/>
       <w:lvlJc w:val="left"/>
     </w:lvl>
-    <w:lvl w:ilvl="7" w:tplc="C904322E">
+    <w:lvl w:ilvl="7" w:tplc="A372C8A8">
       <w:numFmt w:val="decimal"/>
       <w:lvlText w:val=""/>
       <w:lvlJc w:val="left"/>
     </w:lvl>
-    <w:lvl w:ilvl="8" w:tplc="6FD6D986">
+    <w:lvl w:ilvl="8" w:tplc="66C4F50A">
       <w:numFmt w:val="decimal"/>
       <w:lvlText w:val=""/>
       <w:lvlJc w:val="left"/>
     </w:lvl>
   </w:abstractNum>
   <w:abstractNum w:abstractNumId="7" w15:restartNumberingAfterBreak="0">
-    <w:nsid w:val="37F1499B"/>
+    <w:nsid w:val="337A13B5"/>
     <w:multiLevelType w:val="hybridMultilevel"/>
-    <w:tmpl w:val="EFECED08"/>
-    <w:lvl w:ilvl="0" w:tplc="FEC8CBCE" w:tentative="1">
+    <w:tmpl w:val="943E79AC"/>
+    <w:lvl w:ilvl="0" w:tplc="384E6F70" w:tentative="1">
       <w:start w:val="1"/>
       <w:numFmt w:val="bullet"/>
       <w:lvlText w:val="●"/>
@@ -51446,7 +51446,7 @@
         <w:ind w:left="720" w:hanging="360"/>
       </w:pPr>
     </w:lvl>
-    <w:lvl w:ilvl="1" w:tplc="233E60FE" w:tentative="1">
+    <w:lvl w:ilvl="1" w:tplc="A268045E" w:tentative="1">
       <w:start w:val="1"/>
       <w:numFmt w:val="bullet"/>
       <w:lvlText w:val="○"/>
@@ -51455,7 +51455,7 @@
         <w:ind w:left="1440" w:hanging="360"/>
       </w:pPr>
     </w:lvl>
-    <w:lvl w:ilvl="2" w:tplc="8E3ACA60" w:tentative="1">
+    <w:lvl w:ilvl="2" w:tplc="087E2082" w:tentative="1">
       <w:start w:val="1"/>
       <w:numFmt w:val="bullet"/>
       <w:lvlText w:val="■"/>
@@ -51464,7 +51464,7 @@
         <w:ind w:left="2160" w:hanging="360"/>
       </w:pPr>
     </w:lvl>
-    <w:lvl w:ilvl="3" w:tplc="5898363C" w:tentative="1">
+    <w:lvl w:ilvl="3" w:tplc="6C2EA2D8" w:tentative="1">
       <w:start w:val="1"/>
       <w:numFmt w:val="bullet"/>
       <w:lvlText w:val="●"/>
@@ -51473,7 +51473,7 @@
         <w:ind w:left="2880" w:hanging="360"/>
       </w:pPr>
     </w:lvl>
-    <w:lvl w:ilvl="4" w:tplc="E8F6B586" w:tentative="1">
+    <w:lvl w:ilvl="4" w:tplc="DBACD530" w:tentative="1">
       <w:start w:val="1"/>
       <w:numFmt w:val="bullet"/>
       <w:lvlText w:val="○"/>
@@ -51482,7 +51482,7 @@
         <w:ind w:left="3600" w:hanging="360"/>
       </w:pPr>
     </w:lvl>
-    <w:lvl w:ilvl="5" w:tplc="5492C58E" w:tentative="1">
+    <w:lvl w:ilvl="5" w:tplc="19AA0CB0" w:tentative="1">
       <w:start w:val="1"/>
       <w:numFmt w:val="bullet"/>
       <w:lvlText w:val="■"/>
@@ -51491,7 +51491,7 @@
         <w:ind w:left="4320" w:hanging="360"/>
       </w:pPr>
     </w:lvl>
-    <w:lvl w:ilvl="6" w:tplc="8662E95C" w:tentative="1">
+    <w:lvl w:ilvl="6" w:tplc="194A9FA8" w:tentative="1">
       <w:start w:val="1"/>
       <w:numFmt w:val="bullet"/>
       <w:lvlText w:val="●"/>
@@ -51500,7 +51500,7 @@
         <w:ind w:left="5040" w:hanging="360"/>
       </w:pPr>
     </w:lvl>
-    <w:lvl w:ilvl="7" w:tplc="14A8D932" w:tentative="1">
+    <w:lvl w:ilvl="7" w:tplc="656C5440" w:tentative="1">
       <w:start w:val="1"/>
       <w:numFmt w:val="bullet"/>
       <w:lvlText w:val="●"/>
@@ -51509,7 +51509,7 @@
         <w:ind w:left="5760" w:hanging="360"/>
       </w:pPr>
     </w:lvl>
-    <w:lvl w:ilvl="8" w:tplc="11869422" w:tentative="1">
+    <w:lvl w:ilvl="8" w:tplc="85AA6472" w:tentative="1">
       <w:start w:val="1"/>
       <w:numFmt w:val="bullet"/>
       <w:lvlText w:val="●"/>
@@ -51520,10 +51520,10 @@
     </w:lvl>
   </w:abstractNum>
   <w:abstractNum w:abstractNumId="8" w15:restartNumberingAfterBreak="0">
-    <w:nsid w:val="3A4233B9"/>
+    <w:nsid w:val="4C0D5118"/>
     <w:multiLevelType w:val="hybridMultilevel"/>
-    <w:tmpl w:val="EFA425CC"/>
-    <w:lvl w:ilvl="0" w:tplc="59DCA462">
+    <w:tmpl w:val="85BE701A"/>
+    <w:lvl w:ilvl="0" w:tplc="1A8CAE12">
       <w:start w:val="1"/>
       <w:numFmt w:val="decimal"/>
       <w:lvlText w:val="%1."/>
@@ -51532,7 +51532,7 @@
         <w:ind w:left="360" w:hanging="300"/>
       </w:pPr>
     </w:lvl>
-    <w:lvl w:ilvl="1" w:tplc="C0E251C0" w:tentative="1">
+    <w:lvl w:ilvl="1" w:tplc="56207936" w:tentative="1">
       <w:start w:val="1"/>
       <w:numFmt w:val="lowerLetter"/>
       <w:lvlText w:val="%2."/>
@@ -51541,47 +51541,47 @@
         <w:ind w:left="720" w:hanging="300"/>
       </w:pPr>
     </w:lvl>
-    <w:lvl w:ilvl="2" w:tplc="B532EA4E">
+    <w:lvl w:ilvl="2" w:tplc="76924772">
       <w:numFmt w:val="decimal"/>
       <w:lvlText w:val=""/>
       <w:lvlJc w:val="left"/>
     </w:lvl>
-    <w:lvl w:ilvl="3" w:tplc="3946A4A2">
+    <w:lvl w:ilvl="3" w:tplc="39748430">
       <w:numFmt w:val="decimal"/>
       <w:lvlText w:val=""/>
       <w:lvlJc w:val="left"/>
     </w:lvl>
-    <w:lvl w:ilvl="4" w:tplc="8E921CC4">
+    <w:lvl w:ilvl="4" w:tplc="89A0272C">
       <w:numFmt w:val="decimal"/>
       <w:lvlText w:val=""/>
       <w:lvlJc w:val="left"/>
     </w:lvl>
-    <w:lvl w:ilvl="5" w:tplc="D07E2E22">
+    <w:lvl w:ilvl="5" w:tplc="1CFC3A26">
       <w:numFmt w:val="decimal"/>
       <w:lvlText w:val=""/>
       <w:lvlJc w:val="left"/>
     </w:lvl>
-    <w:lvl w:ilvl="6" w:tplc="21D0A94A">
+    <w:lvl w:ilvl="6" w:tplc="26423CBA">
       <w:numFmt w:val="decimal"/>
       <w:lvlText w:val=""/>
       <w:lvlJc w:val="left"/>
     </w:lvl>
-    <w:lvl w:ilvl="7" w:tplc="267EFBB4">
+    <w:lvl w:ilvl="7" w:tplc="FD26242E">
       <w:numFmt w:val="decimal"/>
       <w:lvlText w:val=""/>
       <w:lvlJc w:val="left"/>
     </w:lvl>
-    <w:lvl w:ilvl="8" w:tplc="F64685F2">
+    <w:lvl w:ilvl="8" w:tplc="44FCE5AA">
       <w:numFmt w:val="decimal"/>
       <w:lvlText w:val=""/>
       <w:lvlJc w:val="left"/>
     </w:lvl>
   </w:abstractNum>
   <w:abstractNum w:abstractNumId="9" w15:restartNumberingAfterBreak="0">
-    <w:nsid w:val="3F6D0A52"/>
+    <w:nsid w:val="53082EF1"/>
     <w:multiLevelType w:val="hybridMultilevel"/>
-    <w:tmpl w:val="3F725206"/>
-    <w:lvl w:ilvl="0" w:tplc="276809FE">
+    <w:tmpl w:val="1DB2ADEE"/>
+    <w:lvl w:ilvl="0" w:tplc="2F2C1204">
       <w:start w:val="1"/>
       <w:numFmt w:val="decimal"/>
       <w:lvlText w:val="%1."/>
@@ -51590,7 +51590,7 @@
         <w:ind w:left="360" w:hanging="300"/>
       </w:pPr>
     </w:lvl>
-    <w:lvl w:ilvl="1" w:tplc="BE14967A" w:tentative="1">
+    <w:lvl w:ilvl="1" w:tplc="89C619AE" w:tentative="1">
       <w:start w:val="1"/>
       <w:numFmt w:val="lowerLetter"/>
       <w:lvlText w:val="%2."/>
@@ -51599,47 +51599,47 @@
         <w:ind w:left="720" w:hanging="300"/>
       </w:pPr>
     </w:lvl>
-    <w:lvl w:ilvl="2" w:tplc="47805EE6">
+    <w:lvl w:ilvl="2" w:tplc="6CF0B072">
       <w:numFmt w:val="decimal"/>
       <w:lvlText w:val=""/>
       <w:lvlJc w:val="left"/>
     </w:lvl>
-    <w:lvl w:ilvl="3" w:tplc="025E23E4">
+    <w:lvl w:ilvl="3" w:tplc="71207B64">
       <w:numFmt w:val="decimal"/>
       <w:lvlText w:val=""/>
       <w:lvlJc w:val="left"/>
     </w:lvl>
-    <w:lvl w:ilvl="4" w:tplc="58C26544">
+    <w:lvl w:ilvl="4" w:tplc="25988810">
       <w:numFmt w:val="decimal"/>
       <w:lvlText w:val=""/>
       <w:lvlJc w:val="left"/>
     </w:lvl>
-    <w:lvl w:ilvl="5" w:tplc="5CB8630E">
+    <w:lvl w:ilvl="5" w:tplc="4EAED146">
       <w:numFmt w:val="decimal"/>
       <w:lvlText w:val=""/>
       <w:lvlJc w:val="left"/>
     </w:lvl>
-    <w:lvl w:ilvl="6" w:tplc="805EF5D6">
+    <w:lvl w:ilvl="6" w:tplc="2400738C">
       <w:numFmt w:val="decimal"/>
       <w:lvlText w:val=""/>
       <w:lvlJc w:val="left"/>
     </w:lvl>
-    <w:lvl w:ilvl="7" w:tplc="C5B43E94">
+    <w:lvl w:ilvl="7" w:tplc="61EC2CD2">
       <w:numFmt w:val="decimal"/>
       <w:lvlText w:val=""/>
       <w:lvlJc w:val="left"/>
     </w:lvl>
-    <w:lvl w:ilvl="8" w:tplc="3A0678CA">
+    <w:lvl w:ilvl="8" w:tplc="C6B47C02">
       <w:numFmt w:val="decimal"/>
       <w:lvlText w:val=""/>
       <w:lvlJc w:val="left"/>
     </w:lvl>
   </w:abstractNum>
   <w:abstractNum w:abstractNumId="10" w15:restartNumberingAfterBreak="0">
-    <w:nsid w:val="429932D9"/>
+    <w:nsid w:val="5B896576"/>
     <w:multiLevelType w:val="hybridMultilevel"/>
-    <w:tmpl w:val="DACC7B12"/>
-    <w:lvl w:ilvl="0" w:tplc="CE761618">
+    <w:tmpl w:val="56A4600E"/>
+    <w:lvl w:ilvl="0" w:tplc="94341232">
       <w:start w:val="1"/>
       <w:numFmt w:val="decimal"/>
       <w:lvlText w:val="%1."/>
@@ -51648,7 +51648,7 @@
         <w:ind w:left="360" w:hanging="300"/>
       </w:pPr>
     </w:lvl>
-    <w:lvl w:ilvl="1" w:tplc="06A66534" w:tentative="1">
+    <w:lvl w:ilvl="1" w:tplc="8B7CBA88" w:tentative="1">
       <w:start w:val="1"/>
       <w:numFmt w:val="lowerLetter"/>
       <w:lvlText w:val="%2."/>
@@ -51657,47 +51657,47 @@
         <w:ind w:left="720" w:hanging="300"/>
       </w:pPr>
     </w:lvl>
-    <w:lvl w:ilvl="2" w:tplc="165057BA">
+    <w:lvl w:ilvl="2" w:tplc="90D608AC">
       <w:numFmt w:val="decimal"/>
       <w:lvlText w:val=""/>
       <w:lvlJc w:val="left"/>
     </w:lvl>
-    <w:lvl w:ilvl="3" w:tplc="16A66568">
+    <w:lvl w:ilvl="3" w:tplc="22C676AE">
       <w:numFmt w:val="decimal"/>
       <w:lvlText w:val=""/>
       <w:lvlJc w:val="left"/>
     </w:lvl>
-    <w:lvl w:ilvl="4" w:tplc="DCAE9BFC">
+    <w:lvl w:ilvl="4" w:tplc="6A1C4570">
       <w:numFmt w:val="decimal"/>
       <w:lvlText w:val=""/>
       <w:lvlJc w:val="left"/>
     </w:lvl>
-    <w:lvl w:ilvl="5" w:tplc="83FE29EA">
+    <w:lvl w:ilvl="5" w:tplc="3A24F1E4">
       <w:numFmt w:val="decimal"/>
       <w:lvlText w:val=""/>
       <w:lvlJc w:val="left"/>
     </w:lvl>
-    <w:lvl w:ilvl="6" w:tplc="50FA0FF4">
+    <w:lvl w:ilvl="6" w:tplc="5CE648A8">
       <w:numFmt w:val="decimal"/>
       <w:lvlText w:val=""/>
       <w:lvlJc w:val="left"/>
     </w:lvl>
-    <w:lvl w:ilvl="7" w:tplc="750CD220">
+    <w:lvl w:ilvl="7" w:tplc="EC6EC164">
       <w:numFmt w:val="decimal"/>
       <w:lvlText w:val=""/>
       <w:lvlJc w:val="left"/>
     </w:lvl>
-    <w:lvl w:ilvl="8" w:tplc="C39CCD36">
+    <w:lvl w:ilvl="8" w:tplc="A154ADB4">
       <w:numFmt w:val="decimal"/>
       <w:lvlText w:val=""/>
       <w:lvlJc w:val="left"/>
     </w:lvl>
   </w:abstractNum>
   <w:abstractNum w:abstractNumId="11" w15:restartNumberingAfterBreak="0">
-    <w:nsid w:val="445F27FC"/>
+    <w:nsid w:val="6D390398"/>
     <w:multiLevelType w:val="hybridMultilevel"/>
-    <w:tmpl w:val="5710965C"/>
-    <w:lvl w:ilvl="0" w:tplc="C0389DC6">
+    <w:tmpl w:val="23FE2E34"/>
+    <w:lvl w:ilvl="0" w:tplc="DA965316">
       <w:start w:val="1"/>
       <w:numFmt w:val="decimal"/>
       <w:lvlText w:val="%1."/>
@@ -51706,7 +51706,7 @@
         <w:ind w:left="360" w:hanging="300"/>
       </w:pPr>
     </w:lvl>
-    <w:lvl w:ilvl="1" w:tplc="435809AC" w:tentative="1">
+    <w:lvl w:ilvl="1" w:tplc="DE9A70BC" w:tentative="1">
       <w:start w:val="1"/>
       <w:numFmt w:val="lowerLetter"/>
       <w:lvlText w:val="%2."/>
@@ -51715,47 +51715,47 @@
         <w:ind w:left="720" w:hanging="300"/>
       </w:pPr>
     </w:lvl>
-    <w:lvl w:ilvl="2" w:tplc="83D40450">
+    <w:lvl w:ilvl="2" w:tplc="7BF4D718">
       <w:numFmt w:val="decimal"/>
       <w:lvlText w:val=""/>
       <w:lvlJc w:val="left"/>
     </w:lvl>
-    <w:lvl w:ilvl="3" w:tplc="DD3831F2">
+    <w:lvl w:ilvl="3" w:tplc="368CEC6E">
       <w:numFmt w:val="decimal"/>
       <w:lvlText w:val=""/>
       <w:lvlJc w:val="left"/>
     </w:lvl>
-    <w:lvl w:ilvl="4" w:tplc="852EA59A">
+    <w:lvl w:ilvl="4" w:tplc="CA22F0AE">
       <w:numFmt w:val="decimal"/>
       <w:lvlText w:val=""/>
       <w:lvlJc w:val="left"/>
     </w:lvl>
-    <w:lvl w:ilvl="5" w:tplc="8CFC0BE8">
+    <w:lvl w:ilvl="5" w:tplc="FAD0BD24">
       <w:numFmt w:val="decimal"/>
       <w:lvlText w:val=""/>
       <w:lvlJc w:val="left"/>
     </w:lvl>
-    <w:lvl w:ilvl="6" w:tplc="1854BE78">
+    <w:lvl w:ilvl="6" w:tplc="BAE22132">
       <w:numFmt w:val="decimal"/>
       <w:lvlText w:val=""/>
       <w:lvlJc w:val="left"/>
     </w:lvl>
-    <w:lvl w:ilvl="7" w:tplc="B5CE41C4">
+    <w:lvl w:ilvl="7" w:tplc="DD3CE8A2">
       <w:numFmt w:val="decimal"/>
       <w:lvlText w:val=""/>
       <w:lvlJc w:val="left"/>
     </w:lvl>
-    <w:lvl w:ilvl="8" w:tplc="78F0223C">
+    <w:lvl w:ilvl="8" w:tplc="3AEA74A2">
       <w:numFmt w:val="decimal"/>
       <w:lvlText w:val=""/>
       <w:lvlJc w:val="left"/>
     </w:lvl>
   </w:abstractNum>
   <w:abstractNum w:abstractNumId="12" w15:restartNumberingAfterBreak="0">
-    <w:nsid w:val="4CDB3672"/>
+    <w:nsid w:val="6E520012"/>
     <w:multiLevelType w:val="hybridMultilevel"/>
-    <w:tmpl w:val="D9367842"/>
-    <w:lvl w:ilvl="0" w:tplc="01624EB4">
+    <w:tmpl w:val="9B6AAC60"/>
+    <w:lvl w:ilvl="0" w:tplc="8AD0B7CA">
       <w:start w:val="1"/>
       <w:numFmt w:val="decimal"/>
       <w:lvlText w:val="%1."/>
@@ -51764,7 +51764,7 @@
         <w:ind w:left="360" w:hanging="300"/>
       </w:pPr>
     </w:lvl>
-    <w:lvl w:ilvl="1" w:tplc="ACF48D40" w:tentative="1">
+    <w:lvl w:ilvl="1" w:tplc="69C657DA" w:tentative="1">
       <w:start w:val="1"/>
       <w:numFmt w:val="lowerLetter"/>
       <w:lvlText w:val="%2."/>
@@ -51773,47 +51773,47 @@
         <w:ind w:left="720" w:hanging="300"/>
       </w:pPr>
     </w:lvl>
-    <w:lvl w:ilvl="2" w:tplc="77D6B700">
+    <w:lvl w:ilvl="2" w:tplc="DEA0514C">
       <w:numFmt w:val="decimal"/>
       <w:lvlText w:val=""/>
       <w:lvlJc w:val="left"/>
     </w:lvl>
-    <w:lvl w:ilvl="3" w:tplc="24AE71E0">
+    <w:lvl w:ilvl="3" w:tplc="64163886">
       <w:numFmt w:val="decimal"/>
       <w:lvlText w:val=""/>
       <w:lvlJc w:val="left"/>
     </w:lvl>
-    <w:lvl w:ilvl="4" w:tplc="3FEA8082">
+    <w:lvl w:ilvl="4" w:tplc="E0583C0E">
       <w:numFmt w:val="decimal"/>
       <w:lvlText w:val=""/>
       <w:lvlJc w:val="left"/>
     </w:lvl>
-    <w:lvl w:ilvl="5" w:tplc="8A0ED792">
+    <w:lvl w:ilvl="5" w:tplc="373C7212">
       <w:numFmt w:val="decimal"/>
       <w:lvlText w:val=""/>
       <w:lvlJc w:val="left"/>
     </w:lvl>
-    <w:lvl w:ilvl="6" w:tplc="96501FB2">
+    <w:lvl w:ilvl="6" w:tplc="8E5E1E96">
       <w:numFmt w:val="decimal"/>
       <w:lvlText w:val=""/>
       <w:lvlJc w:val="left"/>
     </w:lvl>
-    <w:lvl w:ilvl="7" w:tplc="3BF80752">
+    <w:lvl w:ilvl="7" w:tplc="D1C2BF48">
       <w:numFmt w:val="decimal"/>
       <w:lvlText w:val=""/>
       <w:lvlJc w:val="left"/>
     </w:lvl>
-    <w:lvl w:ilvl="8" w:tplc="40543B70">
+    <w:lvl w:ilvl="8" w:tplc="B4000F54">
       <w:numFmt w:val="decimal"/>
       <w:lvlText w:val=""/>
       <w:lvlJc w:val="left"/>
     </w:lvl>
   </w:abstractNum>
   <w:abstractNum w:abstractNumId="13" w15:restartNumberingAfterBreak="0">
-    <w:nsid w:val="527B79E0"/>
+    <w:nsid w:val="76A72A94"/>
     <w:multiLevelType w:val="hybridMultilevel"/>
-    <w:tmpl w:val="B5D89B34"/>
-    <w:lvl w:ilvl="0" w:tplc="AFA4DC66">
+    <w:tmpl w:val="2F600288"/>
+    <w:lvl w:ilvl="0" w:tplc="8BE66F90">
       <w:start w:val="1"/>
       <w:numFmt w:val="decimal"/>
       <w:lvlText w:val="%1."/>
@@ -51822,7 +51822,7 @@
         <w:ind w:left="360" w:hanging="300"/>
       </w:pPr>
     </w:lvl>
-    <w:lvl w:ilvl="1" w:tplc="B82E4408" w:tentative="1">
+    <w:lvl w:ilvl="1" w:tplc="6B90FDDA" w:tentative="1">
       <w:start w:val="1"/>
       <w:numFmt w:val="lowerLetter"/>
       <w:lvlText w:val="%2."/>
@@ -51831,47 +51831,47 @@
         <w:ind w:left="720" w:hanging="300"/>
       </w:pPr>
     </w:lvl>
-    <w:lvl w:ilvl="2" w:tplc="48F66F62">
+    <w:lvl w:ilvl="2" w:tplc="26E8FFC6">
       <w:numFmt w:val="decimal"/>
       <w:lvlText w:val=""/>
       <w:lvlJc w:val="left"/>
     </w:lvl>
-    <w:lvl w:ilvl="3" w:tplc="8EA6E160">
+    <w:lvl w:ilvl="3" w:tplc="0E9A969C">
       <w:numFmt w:val="decimal"/>
       <w:lvlText w:val=""/>
       <w:lvlJc w:val="left"/>
     </w:lvl>
-    <w:lvl w:ilvl="4" w:tplc="D262A7D6">
+    <w:lvl w:ilvl="4" w:tplc="84BC8F64">
       <w:numFmt w:val="decimal"/>
       <w:lvlText w:val=""/>
       <w:lvlJc w:val="left"/>
     </w:lvl>
-    <w:lvl w:ilvl="5" w:tplc="2F2E8428">
+    <w:lvl w:ilvl="5" w:tplc="5C6C1D46">
       <w:numFmt w:val="decimal"/>
       <w:lvlText w:val=""/>
       <w:lvlJc w:val="left"/>
     </w:lvl>
-    <w:lvl w:ilvl="6" w:tplc="7042F45E">
+    <w:lvl w:ilvl="6" w:tplc="89224A50">
       <w:numFmt w:val="decimal"/>
       <w:lvlText w:val=""/>
       <w:lvlJc w:val="left"/>
     </w:lvl>
-    <w:lvl w:ilvl="7" w:tplc="6BDEA7F2">
+    <w:lvl w:ilvl="7" w:tplc="6B0E7A40">
       <w:numFmt w:val="decimal"/>
       <w:lvlText w:val=""/>
       <w:lvlJc w:val="left"/>
     </w:lvl>
-    <w:lvl w:ilvl="8" w:tplc="75FCB858">
+    <w:lvl w:ilvl="8" w:tplc="7A32685E">
       <w:numFmt w:val="decimal"/>
       <w:lvlText w:val=""/>
       <w:lvlJc w:val="left"/>
     </w:lvl>
   </w:abstractNum>
   <w:abstractNum w:abstractNumId="14" w15:restartNumberingAfterBreak="0">
-    <w:nsid w:val="7BBD46B7"/>
+    <w:nsid w:val="78F80E4D"/>
     <w:multiLevelType w:val="hybridMultilevel"/>
-    <w:tmpl w:val="27381C4E"/>
-    <w:lvl w:ilvl="0" w:tplc="38685EC8">
+    <w:tmpl w:val="BF2EC434"/>
+    <w:lvl w:ilvl="0" w:tplc="80B8ADF0">
       <w:start w:val="1"/>
       <w:numFmt w:val="decimal"/>
       <w:lvlText w:val="%1."/>
@@ -51880,7 +51880,7 @@
         <w:ind w:left="360" w:hanging="300"/>
       </w:pPr>
     </w:lvl>
-    <w:lvl w:ilvl="1" w:tplc="8A80F9AE" w:tentative="1">
+    <w:lvl w:ilvl="1" w:tplc="5468B2C4" w:tentative="1">
       <w:start w:val="1"/>
       <w:numFmt w:val="lowerLetter"/>
       <w:lvlText w:val="%2."/>
@@ -51889,128 +51889,128 @@
         <w:ind w:left="720" w:hanging="300"/>
       </w:pPr>
     </w:lvl>
-    <w:lvl w:ilvl="2" w:tplc="29E46522">
+    <w:lvl w:ilvl="2" w:tplc="BEBEFDDE">
       <w:numFmt w:val="decimal"/>
       <w:lvlText w:val=""/>
       <w:lvlJc w:val="left"/>
     </w:lvl>
-    <w:lvl w:ilvl="3" w:tplc="5BF2BB68">
+    <w:lvl w:ilvl="3" w:tplc="ED2099B2">
       <w:numFmt w:val="decimal"/>
       <w:lvlText w:val=""/>
       <w:lvlJc w:val="left"/>
     </w:lvl>
-    <w:lvl w:ilvl="4" w:tplc="F7ECA0EA">
+    <w:lvl w:ilvl="4" w:tplc="B9600862">
       <w:numFmt w:val="decimal"/>
       <w:lvlText w:val=""/>
       <w:lvlJc w:val="left"/>
     </w:lvl>
-    <w:lvl w:ilvl="5" w:tplc="9C0ACA7E">
+    <w:lvl w:ilvl="5" w:tplc="EBA47730">
       <w:numFmt w:val="decimal"/>
       <w:lvlText w:val=""/>
       <w:lvlJc w:val="left"/>
     </w:lvl>
-    <w:lvl w:ilvl="6" w:tplc="E458BE22">
+    <w:lvl w:ilvl="6" w:tplc="CF3CD68C">
       <w:numFmt w:val="decimal"/>
       <w:lvlText w:val=""/>
       <w:lvlJc w:val="left"/>
     </w:lvl>
-    <w:lvl w:ilvl="7" w:tplc="B67A00CE">
+    <w:lvl w:ilvl="7" w:tplc="49A474F2">
       <w:numFmt w:val="decimal"/>
       <w:lvlText w:val=""/>
       <w:lvlJc w:val="left"/>
     </w:lvl>
-    <w:lvl w:ilvl="8" w:tplc="2B4C5902">
+    <w:lvl w:ilvl="8" w:tplc="077A0E70">
       <w:numFmt w:val="decimal"/>
       <w:lvlText w:val=""/>
       <w:lvlJc w:val="left"/>
     </w:lvl>
   </w:abstractNum>
-  <w:num w:numId="1" w16cid:durableId="1400639309">
+  <w:num w:numId="1" w16cid:durableId="219945585">
     <w:abstractNumId w:val="7"/>
     <w:lvlOverride w:ilvl="0">
       <w:startOverride w:val="1"/>
     </w:lvlOverride>
   </w:num>
-  <w:num w:numId="2" w16cid:durableId="1493643431">
+  <w:num w:numId="2" w16cid:durableId="232739464">
+    <w:abstractNumId w:val="0"/>
+    <w:lvlOverride w:ilvl="0">
+      <w:startOverride w:val="1"/>
+    </w:lvlOverride>
+  </w:num>
+  <w:num w:numId="3" w16cid:durableId="871381808">
+    <w:abstractNumId w:val="6"/>
+    <w:lvlOverride w:ilvl="0">
+      <w:startOverride w:val="1"/>
+    </w:lvlOverride>
+  </w:num>
+  <w:num w:numId="4" w16cid:durableId="214044019">
+    <w:abstractNumId w:val="12"/>
+    <w:lvlOverride w:ilvl="0">
+      <w:startOverride w:val="1"/>
+    </w:lvlOverride>
+  </w:num>
+  <w:num w:numId="5" w16cid:durableId="1181435389">
+    <w:abstractNumId w:val="2"/>
+    <w:lvlOverride w:ilvl="0">
+      <w:startOverride w:val="1"/>
+    </w:lvlOverride>
+  </w:num>
+  <w:num w:numId="6" w16cid:durableId="789516934">
+    <w:abstractNumId w:val="10"/>
+    <w:lvlOverride w:ilvl="0">
+      <w:startOverride w:val="1"/>
+    </w:lvlOverride>
+  </w:num>
+  <w:num w:numId="7" w16cid:durableId="727220106">
+    <w:abstractNumId w:val="11"/>
+    <w:lvlOverride w:ilvl="0">
+      <w:startOverride w:val="1"/>
+    </w:lvlOverride>
+  </w:num>
+  <w:num w:numId="8" w16cid:durableId="1246644908">
+    <w:abstractNumId w:val="3"/>
+    <w:lvlOverride w:ilvl="0">
+      <w:startOverride w:val="1"/>
+    </w:lvlOverride>
+  </w:num>
+  <w:num w:numId="9" w16cid:durableId="581066520">
+    <w:abstractNumId w:val="13"/>
+    <w:lvlOverride w:ilvl="0">
+      <w:startOverride w:val="1"/>
+    </w:lvlOverride>
+  </w:num>
+  <w:num w:numId="10" w16cid:durableId="339159573">
     <w:abstractNumId w:val="5"/>
     <w:lvlOverride w:ilvl="0">
       <w:startOverride w:val="1"/>
     </w:lvlOverride>
   </w:num>
-  <w:num w:numId="3" w16cid:durableId="375786156">
+  <w:num w:numId="11" w16cid:durableId="653292488">
     <w:abstractNumId w:val="14"/>
     <w:lvlOverride w:ilvl="0">
       <w:startOverride w:val="1"/>
     </w:lvlOverride>
   </w:num>
-  <w:num w:numId="4" w16cid:durableId="1021056031">
+  <w:num w:numId="12" w16cid:durableId="1308557965">
+    <w:abstractNumId w:val="4"/>
+    <w:lvlOverride w:ilvl="0">
+      <w:startOverride w:val="1"/>
+    </w:lvlOverride>
+  </w:num>
+  <w:num w:numId="13" w16cid:durableId="325473193">
     <w:abstractNumId w:val="8"/>
     <w:lvlOverride w:ilvl="0">
       <w:startOverride w:val="1"/>
     </w:lvlOverride>
   </w:num>
-  <w:num w:numId="5" w16cid:durableId="56710358">
-    <w:abstractNumId w:val="12"/>
-    <w:lvlOverride w:ilvl="0">
-      <w:startOverride w:val="1"/>
-    </w:lvlOverride>
-  </w:num>
-  <w:num w:numId="6" w16cid:durableId="500002013">
-    <w:abstractNumId w:val="4"/>
-    <w:lvlOverride w:ilvl="0">
-      <w:startOverride w:val="1"/>
-    </w:lvlOverride>
-  </w:num>
-  <w:num w:numId="7" w16cid:durableId="1775899921">
-    <w:abstractNumId w:val="9"/>
-    <w:lvlOverride w:ilvl="0">
-      <w:startOverride w:val="1"/>
-    </w:lvlOverride>
-  </w:num>
-  <w:num w:numId="8" w16cid:durableId="1657370473">
+  <w:num w:numId="14" w16cid:durableId="1370455423">
     <w:abstractNumId w:val="1"/>
     <w:lvlOverride w:ilvl="0">
       <w:startOverride w:val="1"/>
     </w:lvlOverride>
   </w:num>
-  <w:num w:numId="9" w16cid:durableId="864516196">
-    <w:abstractNumId w:val="11"/>
-    <w:lvlOverride w:ilvl="0">
-      <w:startOverride w:val="1"/>
-    </w:lvlOverride>
-  </w:num>
-  <w:num w:numId="10" w16cid:durableId="1135412378">
-    <w:abstractNumId w:val="0"/>
-    <w:lvlOverride w:ilvl="0">
-      <w:startOverride w:val="1"/>
-    </w:lvlOverride>
-  </w:num>
-  <w:num w:numId="11" w16cid:durableId="227083153">
-    <w:abstractNumId w:val="6"/>
-    <w:lvlOverride w:ilvl="0">
-      <w:startOverride w:val="1"/>
-    </w:lvlOverride>
-  </w:num>
-  <w:num w:numId="12" w16cid:durableId="1769931422">
-    <w:abstractNumId w:val="2"/>
-    <w:lvlOverride w:ilvl="0">
-      <w:startOverride w:val="1"/>
-    </w:lvlOverride>
-  </w:num>
-  <w:num w:numId="13" w16cid:durableId="1890920210">
-    <w:abstractNumId w:val="10"/>
-    <w:lvlOverride w:ilvl="0">
-      <w:startOverride w:val="1"/>
-    </w:lvlOverride>
-  </w:num>
-  <w:num w:numId="14" w16cid:durableId="71393588">
-    <w:abstractNumId w:val="13"/>
-    <w:lvlOverride w:ilvl="0">
-      <w:startOverride w:val="1"/>
-    </w:lvlOverride>
-  </w:num>
-  <w:num w:numId="15" w16cid:durableId="800538868">
-    <w:abstractNumId w:val="3"/>
+  <w:num w:numId="15" w16cid:durableId="994917867">
+    <w:abstractNumId w:val="9"/>
     <w:lvlOverride w:ilvl="0">
       <w:startOverride w:val="1"/>
     </w:lvlOverride>
@@ -52690,7 +52690,7 @@
     <w:autoRedefine/>
     <w:uiPriority w:val="39"/>
     <w:unhideWhenUsed/>
-    <w:rsid w:val="002D47E6"/>
+    <w:rsid w:val="007D0DEA"/>
     <w:pPr>
       <w:spacing w:after="100"/>
     </w:pPr>
@@ -52702,7 +52702,7 @@
     <w:autoRedefine/>
     <w:uiPriority w:val="39"/>
     <w:unhideWhenUsed/>
-    <w:rsid w:val="002D47E6"/>
+    <w:rsid w:val="007D0DEA"/>
     <w:pPr>
       <w:spacing w:after="100"/>
       <w:ind w:left="210"/>

</xml_diff>

<commit_message>
docs: rebuild the role manuals at 2.1.1
Co-Authored-By: Claude Opus 5.5 <noreply@anthropic.com>
</commit_message>
<xml_diff>
--- a/discoverer-neo/docs/user-guide/manual/Discoverer-Neo-ADMIN-Guide-Full-en.docx
+++ b/discoverer-neo/docs/user-guide/manual/Discoverer-Neo-ADMIN-Guide-Full-en.docx
@@ -54,7 +54,7 @@
           <w:sz w:val="22"/>
           <w:szCs w:val="22"/>
         </w:rPr>
-        <w:t>Version 2.1.0</w:t>
+        <w:t>Version 2.1.1</w:t>
       </w:r>
     </w:p>
     <w:p>
@@ -74,7 +74,7 @@
     <w:sdt>
       <w:sdtPr>
         <w:alias w:val="Contents"/>
-        <w:id w:val="-1377616551"/>
+        <w:id w:val="-960337330"/>
       </w:sdtPr>
       <w:sdtEndPr/>
       <w:sdtContent>
@@ -102,7 +102,7 @@
           <w:r>
             <w:fldChar w:fldCharType="separate"/>
           </w:r>
-          <w:hyperlink w:anchor="_Toc241744755" w:history="1">
+          <w:hyperlink w:anchor="_Toc241747595" w:history="1">
             <w:r>
               <w:rPr>
                 <w:rStyle w:val="Hiperligao"/>
@@ -126,7 +126,7 @@
               <w:rPr>
                 <w:noProof/>
               </w:rPr>
-              <w:instrText xml:space="preserve"> PAGEREF _Toc241744755 \h </w:instrText>
+              <w:instrText xml:space="preserve"> PAGEREF _Toc241747595 \h </w:instrText>
             </w:r>
             <w:r>
               <w:rPr>
@@ -168,7 +168,7 @@
               <w14:ligatures w14:val="standardContextual"/>
             </w:rPr>
           </w:pPr>
-          <w:hyperlink w:anchor="_Toc241744756" w:history="1">
+          <w:hyperlink w:anchor="_Toc241747596" w:history="1">
             <w:r>
               <w:rPr>
                 <w:rStyle w:val="Hiperligao"/>
@@ -192,7 +192,7 @@
               <w:rPr>
                 <w:noProof/>
               </w:rPr>
-              <w:instrText xml:space="preserve"> PAGEREF _Toc241744756 \h </w:instrText>
+              <w:instrText xml:space="preserve"> PAGEREF _Toc241747596 \h </w:instrText>
             </w:r>
             <w:r>
               <w:rPr>
@@ -234,7 +234,7 @@
               <w14:ligatures w14:val="standardContextual"/>
             </w:rPr>
           </w:pPr>
-          <w:hyperlink w:anchor="_Toc241744757" w:history="1">
+          <w:hyperlink w:anchor="_Toc241747597" w:history="1">
             <w:r>
               <w:rPr>
                 <w:rStyle w:val="Hiperligao"/>
@@ -258,7 +258,7 @@
               <w:rPr>
                 <w:noProof/>
               </w:rPr>
-              <w:instrText xml:space="preserve"> PAGEREF _Toc241744757 \h </w:instrText>
+              <w:instrText xml:space="preserve"> PAGEREF _Toc241747597 \h </w:instrText>
             </w:r>
             <w:r>
               <w:rPr>
@@ -300,7 +300,7 @@
               <w14:ligatures w14:val="standardContextual"/>
             </w:rPr>
           </w:pPr>
-          <w:hyperlink w:anchor="_Toc241744758" w:history="1">
+          <w:hyperlink w:anchor="_Toc241747598" w:history="1">
             <w:r>
               <w:rPr>
                 <w:rStyle w:val="Hiperligao"/>
@@ -324,7 +324,7 @@
               <w:rPr>
                 <w:noProof/>
               </w:rPr>
-              <w:instrText xml:space="preserve"> PAGEREF _Toc241744758 \h </w:instrText>
+              <w:instrText xml:space="preserve"> PAGEREF _Toc241747598 \h </w:instrText>
             </w:r>
             <w:r>
               <w:rPr>
@@ -366,7 +366,7 @@
               <w14:ligatures w14:val="standardContextual"/>
             </w:rPr>
           </w:pPr>
-          <w:hyperlink w:anchor="_Toc241744759" w:history="1">
+          <w:hyperlink w:anchor="_Toc241747599" w:history="1">
             <w:r>
               <w:rPr>
                 <w:rStyle w:val="Hiperligao"/>
@@ -390,7 +390,7 @@
               <w:rPr>
                 <w:noProof/>
               </w:rPr>
-              <w:instrText xml:space="preserve"> PAGEREF _Toc241744759 \h </w:instrText>
+              <w:instrText xml:space="preserve"> PAGEREF _Toc241747599 \h </w:instrText>
             </w:r>
             <w:r>
               <w:rPr>
@@ -432,7 +432,7 @@
               <w14:ligatures w14:val="standardContextual"/>
             </w:rPr>
           </w:pPr>
-          <w:hyperlink w:anchor="_Toc241744760" w:history="1">
+          <w:hyperlink w:anchor="_Toc241747600" w:history="1">
             <w:r>
               <w:rPr>
                 <w:rStyle w:val="Hiperligao"/>
@@ -456,7 +456,7 @@
               <w:rPr>
                 <w:noProof/>
               </w:rPr>
-              <w:instrText xml:space="preserve"> PAGEREF _Toc241744760 \h </w:instrText>
+              <w:instrText xml:space="preserve"> PAGEREF _Toc241747600 \h </w:instrText>
             </w:r>
             <w:r>
               <w:rPr>
@@ -498,7 +498,7 @@
               <w14:ligatures w14:val="standardContextual"/>
             </w:rPr>
           </w:pPr>
-          <w:hyperlink w:anchor="_Toc241744761" w:history="1">
+          <w:hyperlink w:anchor="_Toc241747601" w:history="1">
             <w:r>
               <w:rPr>
                 <w:rStyle w:val="Hiperligao"/>
@@ -522,7 +522,7 @@
               <w:rPr>
                 <w:noProof/>
               </w:rPr>
-              <w:instrText xml:space="preserve"> PAGEREF _Toc241744761 \h </w:instrText>
+              <w:instrText xml:space="preserve"> PAGEREF _Toc241747601 \h </w:instrText>
             </w:r>
             <w:r>
               <w:rPr>
@@ -564,7 +564,7 @@
               <w14:ligatures w14:val="standardContextual"/>
             </w:rPr>
           </w:pPr>
-          <w:hyperlink w:anchor="_Toc241744762" w:history="1">
+          <w:hyperlink w:anchor="_Toc241747602" w:history="1">
             <w:r>
               <w:rPr>
                 <w:rStyle w:val="Hiperligao"/>
@@ -588,7 +588,7 @@
               <w:rPr>
                 <w:noProof/>
               </w:rPr>
-              <w:instrText xml:space="preserve"> PAGEREF _Toc241744762 \h </w:instrText>
+              <w:instrText xml:space="preserve"> PAGEREF _Toc241747602 \h </w:instrText>
             </w:r>
             <w:r>
               <w:rPr>
@@ -630,7 +630,7 @@
               <w14:ligatures w14:val="standardContextual"/>
             </w:rPr>
           </w:pPr>
-          <w:hyperlink w:anchor="_Toc241744763" w:history="1">
+          <w:hyperlink w:anchor="_Toc241747603" w:history="1">
             <w:r>
               <w:rPr>
                 <w:rStyle w:val="Hiperligao"/>
@@ -654,7 +654,7 @@
               <w:rPr>
                 <w:noProof/>
               </w:rPr>
-              <w:instrText xml:space="preserve"> PAGEREF _Toc241744763 \h </w:instrText>
+              <w:instrText xml:space="preserve"> PAGEREF _Toc241747603 \h </w:instrText>
             </w:r>
             <w:r>
               <w:rPr>
@@ -696,7 +696,7 @@
               <w14:ligatures w14:val="standardContextual"/>
             </w:rPr>
           </w:pPr>
-          <w:hyperlink w:anchor="_Toc241744764" w:history="1">
+          <w:hyperlink w:anchor="_Toc241747604" w:history="1">
             <w:r>
               <w:rPr>
                 <w:rStyle w:val="Hiperligao"/>
@@ -720,7 +720,7 @@
               <w:rPr>
                 <w:noProof/>
               </w:rPr>
-              <w:instrText xml:space="preserve"> PAGEREF _Toc241744764 \h </w:instrText>
+              <w:instrText xml:space="preserve"> PAGEREF _Toc241747604 \h </w:instrText>
             </w:r>
             <w:r>
               <w:rPr>
@@ -762,7 +762,7 @@
               <w14:ligatures w14:val="standardContextual"/>
             </w:rPr>
           </w:pPr>
-          <w:hyperlink w:anchor="_Toc241744765" w:history="1">
+          <w:hyperlink w:anchor="_Toc241747605" w:history="1">
             <w:r>
               <w:rPr>
                 <w:rStyle w:val="Hiperligao"/>
@@ -786,7 +786,7 @@
               <w:rPr>
                 <w:noProof/>
               </w:rPr>
-              <w:instrText xml:space="preserve"> PAGEREF _Toc241744765 \h </w:instrText>
+              <w:instrText xml:space="preserve"> PAGEREF _Toc241747605 \h </w:instrText>
             </w:r>
             <w:r>
               <w:rPr>
@@ -828,7 +828,7 @@
               <w14:ligatures w14:val="standardContextual"/>
             </w:rPr>
           </w:pPr>
-          <w:hyperlink w:anchor="_Toc241744766" w:history="1">
+          <w:hyperlink w:anchor="_Toc241747606" w:history="1">
             <w:r>
               <w:rPr>
                 <w:rStyle w:val="Hiperligao"/>
@@ -852,7 +852,7 @@
               <w:rPr>
                 <w:noProof/>
               </w:rPr>
-              <w:instrText xml:space="preserve"> PAGEREF _Toc241744766 \h </w:instrText>
+              <w:instrText xml:space="preserve"> PAGEREF _Toc241747606 \h </w:instrText>
             </w:r>
             <w:r>
               <w:rPr>
@@ -894,7 +894,7 @@
               <w14:ligatures w14:val="standardContextual"/>
             </w:rPr>
           </w:pPr>
-          <w:hyperlink w:anchor="_Toc241744767" w:history="1">
+          <w:hyperlink w:anchor="_Toc241747607" w:history="1">
             <w:r>
               <w:rPr>
                 <w:rStyle w:val="Hiperligao"/>
@@ -918,7 +918,7 @@
               <w:rPr>
                 <w:noProof/>
               </w:rPr>
-              <w:instrText xml:space="preserve"> PAGEREF _Toc241744767 \h </w:instrText>
+              <w:instrText xml:space="preserve"> PAGEREF _Toc241747607 \h </w:instrText>
             </w:r>
             <w:r>
               <w:rPr>
@@ -960,7 +960,7 @@
               <w14:ligatures w14:val="standardContextual"/>
             </w:rPr>
           </w:pPr>
-          <w:hyperlink w:anchor="_Toc241744768" w:history="1">
+          <w:hyperlink w:anchor="_Toc241747608" w:history="1">
             <w:r>
               <w:rPr>
                 <w:rStyle w:val="Hiperligao"/>
@@ -984,7 +984,7 @@
               <w:rPr>
                 <w:noProof/>
               </w:rPr>
-              <w:instrText xml:space="preserve"> PAGEREF _Toc241744768 \h </w:instrText>
+              <w:instrText xml:space="preserve"> PAGEREF _Toc241747608 \h </w:instrText>
             </w:r>
             <w:r>
               <w:rPr>
@@ -1026,7 +1026,7 @@
               <w14:ligatures w14:val="standardContextual"/>
             </w:rPr>
           </w:pPr>
-          <w:hyperlink w:anchor="_Toc241744769" w:history="1">
+          <w:hyperlink w:anchor="_Toc241747609" w:history="1">
             <w:r>
               <w:rPr>
                 <w:rStyle w:val="Hiperligao"/>
@@ -1050,7 +1050,7 @@
               <w:rPr>
                 <w:noProof/>
               </w:rPr>
-              <w:instrText xml:space="preserve"> PAGEREF _Toc241744769 \h </w:instrText>
+              <w:instrText xml:space="preserve"> PAGEREF _Toc241747609 \h </w:instrText>
             </w:r>
             <w:r>
               <w:rPr>
@@ -1092,7 +1092,7 @@
               <w14:ligatures w14:val="standardContextual"/>
             </w:rPr>
           </w:pPr>
-          <w:hyperlink w:anchor="_Toc241744770" w:history="1">
+          <w:hyperlink w:anchor="_Toc241747610" w:history="1">
             <w:r>
               <w:rPr>
                 <w:rStyle w:val="Hiperligao"/>
@@ -1116,7 +1116,7 @@
               <w:rPr>
                 <w:noProof/>
               </w:rPr>
-              <w:instrText xml:space="preserve"> PAGEREF _Toc241744770 \h </w:instrText>
+              <w:instrText xml:space="preserve"> PAGEREF _Toc241747610 \h </w:instrText>
             </w:r>
             <w:r>
               <w:rPr>
@@ -1158,7 +1158,7 @@
               <w14:ligatures w14:val="standardContextual"/>
             </w:rPr>
           </w:pPr>
-          <w:hyperlink w:anchor="_Toc241744771" w:history="1">
+          <w:hyperlink w:anchor="_Toc241747611" w:history="1">
             <w:r>
               <w:rPr>
                 <w:rStyle w:val="Hiperligao"/>
@@ -1182,7 +1182,7 @@
               <w:rPr>
                 <w:noProof/>
               </w:rPr>
-              <w:instrText xml:space="preserve"> PAGEREF _Toc241744771 \h </w:instrText>
+              <w:instrText xml:space="preserve"> PAGEREF _Toc241747611 \h </w:instrText>
             </w:r>
             <w:r>
               <w:rPr>
@@ -1224,7 +1224,7 @@
               <w14:ligatures w14:val="standardContextual"/>
             </w:rPr>
           </w:pPr>
-          <w:hyperlink w:anchor="_Toc241744772" w:history="1">
+          <w:hyperlink w:anchor="_Toc241747612" w:history="1">
             <w:r>
               <w:rPr>
                 <w:rStyle w:val="Hiperligao"/>
@@ -1248,7 +1248,7 @@
               <w:rPr>
                 <w:noProof/>
               </w:rPr>
-              <w:instrText xml:space="preserve"> PAGEREF _Toc241744772 \h </w:instrText>
+              <w:instrText xml:space="preserve"> PAGEREF _Toc241747612 \h </w:instrText>
             </w:r>
             <w:r>
               <w:rPr>
@@ -1290,7 +1290,7 @@
               <w14:ligatures w14:val="standardContextual"/>
             </w:rPr>
           </w:pPr>
-          <w:hyperlink w:anchor="_Toc241744773" w:history="1">
+          <w:hyperlink w:anchor="_Toc241747613" w:history="1">
             <w:r>
               <w:rPr>
                 <w:rStyle w:val="Hiperligao"/>
@@ -1314,7 +1314,7 @@
               <w:rPr>
                 <w:noProof/>
               </w:rPr>
-              <w:instrText xml:space="preserve"> PAGEREF _Toc241744773 \h </w:instrText>
+              <w:instrText xml:space="preserve"> PAGEREF _Toc241747613 \h </w:instrText>
             </w:r>
             <w:r>
               <w:rPr>
@@ -1356,7 +1356,7 @@
               <w14:ligatures w14:val="standardContextual"/>
             </w:rPr>
           </w:pPr>
-          <w:hyperlink w:anchor="_Toc241744774" w:history="1">
+          <w:hyperlink w:anchor="_Toc241747614" w:history="1">
             <w:r>
               <w:rPr>
                 <w:rStyle w:val="Hiperligao"/>
@@ -1380,7 +1380,7 @@
               <w:rPr>
                 <w:noProof/>
               </w:rPr>
-              <w:instrText xml:space="preserve"> PAGEREF _Toc241744774 \h </w:instrText>
+              <w:instrText xml:space="preserve"> PAGEREF _Toc241747614 \h </w:instrText>
             </w:r>
             <w:r>
               <w:rPr>
@@ -1422,7 +1422,7 @@
               <w14:ligatures w14:val="standardContextual"/>
             </w:rPr>
           </w:pPr>
-          <w:hyperlink w:anchor="_Toc241744775" w:history="1">
+          <w:hyperlink w:anchor="_Toc241747615" w:history="1">
             <w:r>
               <w:rPr>
                 <w:rStyle w:val="Hiperligao"/>
@@ -1446,7 +1446,7 @@
               <w:rPr>
                 <w:noProof/>
               </w:rPr>
-              <w:instrText xml:space="preserve"> PAGEREF _Toc241744775 \h </w:instrText>
+              <w:instrText xml:space="preserve"> PAGEREF _Toc241747615 \h </w:instrText>
             </w:r>
             <w:r>
               <w:rPr>
@@ -1488,7 +1488,7 @@
               <w14:ligatures w14:val="standardContextual"/>
             </w:rPr>
           </w:pPr>
-          <w:hyperlink w:anchor="_Toc241744776" w:history="1">
+          <w:hyperlink w:anchor="_Toc241747616" w:history="1">
             <w:r>
               <w:rPr>
                 <w:rStyle w:val="Hiperligao"/>
@@ -1512,7 +1512,7 @@
               <w:rPr>
                 <w:noProof/>
               </w:rPr>
-              <w:instrText xml:space="preserve"> PAGEREF _Toc241744776 \h </w:instrText>
+              <w:instrText xml:space="preserve"> PAGEREF _Toc241747616 \h </w:instrText>
             </w:r>
             <w:r>
               <w:rPr>
@@ -1554,7 +1554,7 @@
               <w14:ligatures w14:val="standardContextual"/>
             </w:rPr>
           </w:pPr>
-          <w:hyperlink w:anchor="_Toc241744777" w:history="1">
+          <w:hyperlink w:anchor="_Toc241747617" w:history="1">
             <w:r>
               <w:rPr>
                 <w:rStyle w:val="Hiperligao"/>
@@ -1578,7 +1578,7 @@
               <w:rPr>
                 <w:noProof/>
               </w:rPr>
-              <w:instrText xml:space="preserve"> PAGEREF _Toc241744777 \h </w:instrText>
+              <w:instrText xml:space="preserve"> PAGEREF _Toc241747617 \h </w:instrText>
             </w:r>
             <w:r>
               <w:rPr>
@@ -1620,7 +1620,7 @@
               <w14:ligatures w14:val="standardContextual"/>
             </w:rPr>
           </w:pPr>
-          <w:hyperlink w:anchor="_Toc241744778" w:history="1">
+          <w:hyperlink w:anchor="_Toc241747618" w:history="1">
             <w:r>
               <w:rPr>
                 <w:rStyle w:val="Hiperligao"/>
@@ -1644,7 +1644,7 @@
               <w:rPr>
                 <w:noProof/>
               </w:rPr>
-              <w:instrText xml:space="preserve"> PAGEREF _Toc241744778 \h </w:instrText>
+              <w:instrText xml:space="preserve"> PAGEREF _Toc241747618 \h </w:instrText>
             </w:r>
             <w:r>
               <w:rPr>
@@ -1686,7 +1686,7 @@
               <w14:ligatures w14:val="standardContextual"/>
             </w:rPr>
           </w:pPr>
-          <w:hyperlink w:anchor="_Toc241744779" w:history="1">
+          <w:hyperlink w:anchor="_Toc241747619" w:history="1">
             <w:r>
               <w:rPr>
                 <w:rStyle w:val="Hiperligao"/>
@@ -1710,7 +1710,7 @@
               <w:rPr>
                 <w:noProof/>
               </w:rPr>
-              <w:instrText xml:space="preserve"> PAGEREF _Toc241744779 \h </w:instrText>
+              <w:instrText xml:space="preserve"> PAGEREF _Toc241747619 \h </w:instrText>
             </w:r>
             <w:r>
               <w:rPr>
@@ -1752,7 +1752,7 @@
               <w14:ligatures w14:val="standardContextual"/>
             </w:rPr>
           </w:pPr>
-          <w:hyperlink w:anchor="_Toc241744780" w:history="1">
+          <w:hyperlink w:anchor="_Toc241747620" w:history="1">
             <w:r>
               <w:rPr>
                 <w:rStyle w:val="Hiperligao"/>
@@ -1776,7 +1776,7 @@
               <w:rPr>
                 <w:noProof/>
               </w:rPr>
-              <w:instrText xml:space="preserve"> PAGEREF _Toc241744780 \h </w:instrText>
+              <w:instrText xml:space="preserve"> PAGEREF _Toc241747620 \h </w:instrText>
             </w:r>
             <w:r>
               <w:rPr>
@@ -1818,7 +1818,7 @@
               <w14:ligatures w14:val="standardContextual"/>
             </w:rPr>
           </w:pPr>
-          <w:hyperlink w:anchor="_Toc241744781" w:history="1">
+          <w:hyperlink w:anchor="_Toc241747621" w:history="1">
             <w:r>
               <w:rPr>
                 <w:rStyle w:val="Hiperligao"/>
@@ -1842,7 +1842,7 @@
               <w:rPr>
                 <w:noProof/>
               </w:rPr>
-              <w:instrText xml:space="preserve"> PAGEREF _Toc241744781 \h </w:instrText>
+              <w:instrText xml:space="preserve"> PAGEREF _Toc241747621 \h </w:instrText>
             </w:r>
             <w:r>
               <w:rPr>
@@ -1884,7 +1884,7 @@
               <w14:ligatures w14:val="standardContextual"/>
             </w:rPr>
           </w:pPr>
-          <w:hyperlink w:anchor="_Toc241744782" w:history="1">
+          <w:hyperlink w:anchor="_Toc241747622" w:history="1">
             <w:r>
               <w:rPr>
                 <w:rStyle w:val="Hiperligao"/>
@@ -1908,7 +1908,7 @@
               <w:rPr>
                 <w:noProof/>
               </w:rPr>
-              <w:instrText xml:space="preserve"> PAGEREF _Toc241744782 \h </w:instrText>
+              <w:instrText xml:space="preserve"> PAGEREF _Toc241747622 \h </w:instrText>
             </w:r>
             <w:r>
               <w:rPr>
@@ -1950,7 +1950,7 @@
               <w14:ligatures w14:val="standardContextual"/>
             </w:rPr>
           </w:pPr>
-          <w:hyperlink w:anchor="_Toc241744783" w:history="1">
+          <w:hyperlink w:anchor="_Toc241747623" w:history="1">
             <w:r>
               <w:rPr>
                 <w:rStyle w:val="Hiperligao"/>
@@ -1974,7 +1974,7 @@
               <w:rPr>
                 <w:noProof/>
               </w:rPr>
-              <w:instrText xml:space="preserve"> PAGEREF _Toc241744783 \h </w:instrText>
+              <w:instrText xml:space="preserve"> PAGEREF _Toc241747623 \h </w:instrText>
             </w:r>
             <w:r>
               <w:rPr>
@@ -2016,7 +2016,7 @@
               <w14:ligatures w14:val="standardContextual"/>
             </w:rPr>
           </w:pPr>
-          <w:hyperlink w:anchor="_Toc241744784" w:history="1">
+          <w:hyperlink w:anchor="_Toc241747624" w:history="1">
             <w:r>
               <w:rPr>
                 <w:rStyle w:val="Hiperligao"/>
@@ -2040,7 +2040,7 @@
               <w:rPr>
                 <w:noProof/>
               </w:rPr>
-              <w:instrText xml:space="preserve"> PAGEREF _Toc241744784 \h </w:instrText>
+              <w:instrText xml:space="preserve"> PAGEREF _Toc241747624 \h </w:instrText>
             </w:r>
             <w:r>
               <w:rPr>
@@ -2082,7 +2082,7 @@
               <w14:ligatures w14:val="standardContextual"/>
             </w:rPr>
           </w:pPr>
-          <w:hyperlink w:anchor="_Toc241744785" w:history="1">
+          <w:hyperlink w:anchor="_Toc241747625" w:history="1">
             <w:r>
               <w:rPr>
                 <w:rStyle w:val="Hiperligao"/>
@@ -2106,7 +2106,7 @@
               <w:rPr>
                 <w:noProof/>
               </w:rPr>
-              <w:instrText xml:space="preserve"> PAGEREF _Toc241744785 \h </w:instrText>
+              <w:instrText xml:space="preserve"> PAGEREF _Toc241747625 \h </w:instrText>
             </w:r>
             <w:r>
               <w:rPr>
@@ -2148,7 +2148,7 @@
               <w14:ligatures w14:val="standardContextual"/>
             </w:rPr>
           </w:pPr>
-          <w:hyperlink w:anchor="_Toc241744786" w:history="1">
+          <w:hyperlink w:anchor="_Toc241747626" w:history="1">
             <w:r>
               <w:rPr>
                 <w:rStyle w:val="Hiperligao"/>
@@ -2172,7 +2172,7 @@
               <w:rPr>
                 <w:noProof/>
               </w:rPr>
-              <w:instrText xml:space="preserve"> PAGEREF _Toc241744786 \h </w:instrText>
+              <w:instrText xml:space="preserve"> PAGEREF _Toc241747626 \h </w:instrText>
             </w:r>
             <w:r>
               <w:rPr>
@@ -2214,7 +2214,7 @@
               <w14:ligatures w14:val="standardContextual"/>
             </w:rPr>
           </w:pPr>
-          <w:hyperlink w:anchor="_Toc241744787" w:history="1">
+          <w:hyperlink w:anchor="_Toc241747627" w:history="1">
             <w:r>
               <w:rPr>
                 <w:rStyle w:val="Hiperligao"/>
@@ -2238,7 +2238,7 @@
               <w:rPr>
                 <w:noProof/>
               </w:rPr>
-              <w:instrText xml:space="preserve"> PAGEREF _Toc241744787 \h </w:instrText>
+              <w:instrText xml:space="preserve"> PAGEREF _Toc241747627 \h </w:instrText>
             </w:r>
             <w:r>
               <w:rPr>
@@ -2280,7 +2280,7 @@
               <w14:ligatures w14:val="standardContextual"/>
             </w:rPr>
           </w:pPr>
-          <w:hyperlink w:anchor="_Toc241744788" w:history="1">
+          <w:hyperlink w:anchor="_Toc241747628" w:history="1">
             <w:r>
               <w:rPr>
                 <w:rStyle w:val="Hiperligao"/>
@@ -2304,7 +2304,7 @@
               <w:rPr>
                 <w:noProof/>
               </w:rPr>
-              <w:instrText xml:space="preserve"> PAGEREF _Toc241744788 \h </w:instrText>
+              <w:instrText xml:space="preserve"> PAGEREF _Toc241747628 \h </w:instrText>
             </w:r>
             <w:r>
               <w:rPr>
@@ -2346,7 +2346,7 @@
               <w14:ligatures w14:val="standardContextual"/>
             </w:rPr>
           </w:pPr>
-          <w:hyperlink w:anchor="_Toc241744789" w:history="1">
+          <w:hyperlink w:anchor="_Toc241747629" w:history="1">
             <w:r>
               <w:rPr>
                 <w:rStyle w:val="Hiperligao"/>
@@ -2370,7 +2370,7 @@
               <w:rPr>
                 <w:noProof/>
               </w:rPr>
-              <w:instrText xml:space="preserve"> PAGEREF _Toc241744789 \h </w:instrText>
+              <w:instrText xml:space="preserve"> PAGEREF _Toc241747629 \h </w:instrText>
             </w:r>
             <w:r>
               <w:rPr>
@@ -2412,7 +2412,7 @@
               <w14:ligatures w14:val="standardContextual"/>
             </w:rPr>
           </w:pPr>
-          <w:hyperlink w:anchor="_Toc241744790" w:history="1">
+          <w:hyperlink w:anchor="_Toc241747630" w:history="1">
             <w:r>
               <w:rPr>
                 <w:rStyle w:val="Hiperligao"/>
@@ -2436,7 +2436,7 @@
               <w:rPr>
                 <w:noProof/>
               </w:rPr>
-              <w:instrText xml:space="preserve"> PAGEREF _Toc241744790 \h </w:instrText>
+              <w:instrText xml:space="preserve"> PAGEREF _Toc241747630 \h </w:instrText>
             </w:r>
             <w:r>
               <w:rPr>
@@ -2478,7 +2478,7 @@
               <w14:ligatures w14:val="standardContextual"/>
             </w:rPr>
           </w:pPr>
-          <w:hyperlink w:anchor="_Toc241744791" w:history="1">
+          <w:hyperlink w:anchor="_Toc241747631" w:history="1">
             <w:r>
               <w:rPr>
                 <w:rStyle w:val="Hiperligao"/>
@@ -2502,7 +2502,7 @@
               <w:rPr>
                 <w:noProof/>
               </w:rPr>
-              <w:instrText xml:space="preserve"> PAGEREF _Toc241744791 \h </w:instrText>
+              <w:instrText xml:space="preserve"> PAGEREF _Toc241747631 \h </w:instrText>
             </w:r>
             <w:r>
               <w:rPr>
@@ -2544,7 +2544,7 @@
               <w14:ligatures w14:val="standardContextual"/>
             </w:rPr>
           </w:pPr>
-          <w:hyperlink w:anchor="_Toc241744792" w:history="1">
+          <w:hyperlink w:anchor="_Toc241747632" w:history="1">
             <w:r>
               <w:rPr>
                 <w:rStyle w:val="Hiperligao"/>
@@ -2568,7 +2568,7 @@
               <w:rPr>
                 <w:noProof/>
               </w:rPr>
-              <w:instrText xml:space="preserve"> PAGEREF _Toc241744792 \h </w:instrText>
+              <w:instrText xml:space="preserve"> PAGEREF _Toc241747632 \h </w:instrText>
             </w:r>
             <w:r>
               <w:rPr>
@@ -2610,7 +2610,7 @@
               <w14:ligatures w14:val="standardContextual"/>
             </w:rPr>
           </w:pPr>
-          <w:hyperlink w:anchor="_Toc241744793" w:history="1">
+          <w:hyperlink w:anchor="_Toc241747633" w:history="1">
             <w:r>
               <w:rPr>
                 <w:rStyle w:val="Hiperligao"/>
@@ -2634,7 +2634,7 @@
               <w:rPr>
                 <w:noProof/>
               </w:rPr>
-              <w:instrText xml:space="preserve"> PAGEREF _Toc241744793 \h </w:instrText>
+              <w:instrText xml:space="preserve"> PAGEREF _Toc241747633 \h </w:instrText>
             </w:r>
             <w:r>
               <w:rPr>
@@ -2676,7 +2676,7 @@
               <w14:ligatures w14:val="standardContextual"/>
             </w:rPr>
           </w:pPr>
-          <w:hyperlink w:anchor="_Toc241744794" w:history="1">
+          <w:hyperlink w:anchor="_Toc241747634" w:history="1">
             <w:r>
               <w:rPr>
                 <w:rStyle w:val="Hiperligao"/>
@@ -2700,7 +2700,7 @@
               <w:rPr>
                 <w:noProof/>
               </w:rPr>
-              <w:instrText xml:space="preserve"> PAGEREF _Toc241744794 \h </w:instrText>
+              <w:instrText xml:space="preserve"> PAGEREF _Toc241747634 \h </w:instrText>
             </w:r>
             <w:r>
               <w:rPr>
@@ -2742,7 +2742,7 @@
               <w14:ligatures w14:val="standardContextual"/>
             </w:rPr>
           </w:pPr>
-          <w:hyperlink w:anchor="_Toc241744795" w:history="1">
+          <w:hyperlink w:anchor="_Toc241747635" w:history="1">
             <w:r>
               <w:rPr>
                 <w:rStyle w:val="Hiperligao"/>
@@ -2766,7 +2766,7 @@
               <w:rPr>
                 <w:noProof/>
               </w:rPr>
-              <w:instrText xml:space="preserve"> PAGEREF _Toc241744795 \h </w:instrText>
+              <w:instrText xml:space="preserve"> PAGEREF _Toc241747635 \h </w:instrText>
             </w:r>
             <w:r>
               <w:rPr>
@@ -2808,7 +2808,7 @@
               <w14:ligatures w14:val="standardContextual"/>
             </w:rPr>
           </w:pPr>
-          <w:hyperlink w:anchor="_Toc241744796" w:history="1">
+          <w:hyperlink w:anchor="_Toc241747636" w:history="1">
             <w:r>
               <w:rPr>
                 <w:rStyle w:val="Hiperligao"/>
@@ -2832,7 +2832,7 @@
               <w:rPr>
                 <w:noProof/>
               </w:rPr>
-              <w:instrText xml:space="preserve"> PAGEREF _Toc241744796 \h </w:instrText>
+              <w:instrText xml:space="preserve"> PAGEREF _Toc241747636 \h </w:instrText>
             </w:r>
             <w:r>
               <w:rPr>
@@ -2874,7 +2874,7 @@
               <w14:ligatures w14:val="standardContextual"/>
             </w:rPr>
           </w:pPr>
-          <w:hyperlink w:anchor="_Toc241744797" w:history="1">
+          <w:hyperlink w:anchor="_Toc241747637" w:history="1">
             <w:r>
               <w:rPr>
                 <w:rStyle w:val="Hiperligao"/>
@@ -2898,7 +2898,7 @@
               <w:rPr>
                 <w:noProof/>
               </w:rPr>
-              <w:instrText xml:space="preserve"> PAGEREF _Toc241744797 \h </w:instrText>
+              <w:instrText xml:space="preserve"> PAGEREF _Toc241747637 \h </w:instrText>
             </w:r>
             <w:r>
               <w:rPr>
@@ -2940,7 +2940,7 @@
               <w14:ligatures w14:val="standardContextual"/>
             </w:rPr>
           </w:pPr>
-          <w:hyperlink w:anchor="_Toc241744798" w:history="1">
+          <w:hyperlink w:anchor="_Toc241747638" w:history="1">
             <w:r>
               <w:rPr>
                 <w:rStyle w:val="Hiperligao"/>
@@ -2964,7 +2964,7 @@
               <w:rPr>
                 <w:noProof/>
               </w:rPr>
-              <w:instrText xml:space="preserve"> PAGEREF _Toc241744798 \h </w:instrText>
+              <w:instrText xml:space="preserve"> PAGEREF _Toc241747638 \h </w:instrText>
             </w:r>
             <w:r>
               <w:rPr>
@@ -3006,7 +3006,7 @@
               <w14:ligatures w14:val="standardContextual"/>
             </w:rPr>
           </w:pPr>
-          <w:hyperlink w:anchor="_Toc241744799" w:history="1">
+          <w:hyperlink w:anchor="_Toc241747639" w:history="1">
             <w:r>
               <w:rPr>
                 <w:rStyle w:val="Hiperligao"/>
@@ -3030,7 +3030,7 @@
               <w:rPr>
                 <w:noProof/>
               </w:rPr>
-              <w:instrText xml:space="preserve"> PAGEREF _Toc241744799 \h </w:instrText>
+              <w:instrText xml:space="preserve"> PAGEREF _Toc241747639 \h </w:instrText>
             </w:r>
             <w:r>
               <w:rPr>
@@ -3072,7 +3072,7 @@
               <w14:ligatures w14:val="standardContextual"/>
             </w:rPr>
           </w:pPr>
-          <w:hyperlink w:anchor="_Toc241744800" w:history="1">
+          <w:hyperlink w:anchor="_Toc241747640" w:history="1">
             <w:r>
               <w:rPr>
                 <w:rStyle w:val="Hiperligao"/>
@@ -3096,7 +3096,7 @@
               <w:rPr>
                 <w:noProof/>
               </w:rPr>
-              <w:instrText xml:space="preserve"> PAGEREF _Toc241744800 \h </w:instrText>
+              <w:instrText xml:space="preserve"> PAGEREF _Toc241747640 \h </w:instrText>
             </w:r>
             <w:r>
               <w:rPr>
@@ -3138,7 +3138,7 @@
               <w14:ligatures w14:val="standardContextual"/>
             </w:rPr>
           </w:pPr>
-          <w:hyperlink w:anchor="_Toc241744801" w:history="1">
+          <w:hyperlink w:anchor="_Toc241747641" w:history="1">
             <w:r>
               <w:rPr>
                 <w:rStyle w:val="Hiperligao"/>
@@ -3162,7 +3162,7 @@
               <w:rPr>
                 <w:noProof/>
               </w:rPr>
-              <w:instrText xml:space="preserve"> PAGEREF _Toc241744801 \h </w:instrText>
+              <w:instrText xml:space="preserve"> PAGEREF _Toc241747641 \h </w:instrText>
             </w:r>
             <w:r>
               <w:rPr>
@@ -3204,7 +3204,7 @@
               <w14:ligatures w14:val="standardContextual"/>
             </w:rPr>
           </w:pPr>
-          <w:hyperlink w:anchor="_Toc241744802" w:history="1">
+          <w:hyperlink w:anchor="_Toc241747642" w:history="1">
             <w:r>
               <w:rPr>
                 <w:rStyle w:val="Hiperligao"/>
@@ -3228,7 +3228,7 @@
               <w:rPr>
                 <w:noProof/>
               </w:rPr>
-              <w:instrText xml:space="preserve"> PAGEREF _Toc241744802 \h </w:instrText>
+              <w:instrText xml:space="preserve"> PAGEREF _Toc241747642 \h </w:instrText>
             </w:r>
             <w:r>
               <w:rPr>
@@ -3270,7 +3270,7 @@
               <w14:ligatures w14:val="standardContextual"/>
             </w:rPr>
           </w:pPr>
-          <w:hyperlink w:anchor="_Toc241744803" w:history="1">
+          <w:hyperlink w:anchor="_Toc241747643" w:history="1">
             <w:r>
               <w:rPr>
                 <w:rStyle w:val="Hiperligao"/>
@@ -3294,7 +3294,7 @@
               <w:rPr>
                 <w:noProof/>
               </w:rPr>
-              <w:instrText xml:space="preserve"> PAGEREF _Toc241744803 \h </w:instrText>
+              <w:instrText xml:space="preserve"> PAGEREF _Toc241747643 \h </w:instrText>
             </w:r>
             <w:r>
               <w:rPr>
@@ -3336,7 +3336,7 @@
               <w14:ligatures w14:val="standardContextual"/>
             </w:rPr>
           </w:pPr>
-          <w:hyperlink w:anchor="_Toc241744804" w:history="1">
+          <w:hyperlink w:anchor="_Toc241747644" w:history="1">
             <w:r>
               <w:rPr>
                 <w:rStyle w:val="Hiperligao"/>
@@ -3360,7 +3360,7 @@
               <w:rPr>
                 <w:noProof/>
               </w:rPr>
-              <w:instrText xml:space="preserve"> PAGEREF _Toc241744804 \h </w:instrText>
+              <w:instrText xml:space="preserve"> PAGEREF _Toc241747644 \h </w:instrText>
             </w:r>
             <w:r>
               <w:rPr>
@@ -3402,7 +3402,7 @@
               <w14:ligatures w14:val="standardContextual"/>
             </w:rPr>
           </w:pPr>
-          <w:hyperlink w:anchor="_Toc241744805" w:history="1">
+          <w:hyperlink w:anchor="_Toc241747645" w:history="1">
             <w:r>
               <w:rPr>
                 <w:rStyle w:val="Hiperligao"/>
@@ -3426,7 +3426,7 @@
               <w:rPr>
                 <w:noProof/>
               </w:rPr>
-              <w:instrText xml:space="preserve"> PAGEREF _Toc241744805 \h </w:instrText>
+              <w:instrText xml:space="preserve"> PAGEREF _Toc241747645 \h </w:instrText>
             </w:r>
             <w:r>
               <w:rPr>
@@ -3468,7 +3468,7 @@
               <w14:ligatures w14:val="standardContextual"/>
             </w:rPr>
           </w:pPr>
-          <w:hyperlink w:anchor="_Toc241744806" w:history="1">
+          <w:hyperlink w:anchor="_Toc241747646" w:history="1">
             <w:r>
               <w:rPr>
                 <w:rStyle w:val="Hiperligao"/>
@@ -3492,7 +3492,7 @@
               <w:rPr>
                 <w:noProof/>
               </w:rPr>
-              <w:instrText xml:space="preserve"> PAGEREF _Toc241744806 \h </w:instrText>
+              <w:instrText xml:space="preserve"> PAGEREF _Toc241747646 \h </w:instrText>
             </w:r>
             <w:r>
               <w:rPr>
@@ -3534,7 +3534,7 @@
               <w14:ligatures w14:val="standardContextual"/>
             </w:rPr>
           </w:pPr>
-          <w:hyperlink w:anchor="_Toc241744807" w:history="1">
+          <w:hyperlink w:anchor="_Toc241747647" w:history="1">
             <w:r>
               <w:rPr>
                 <w:rStyle w:val="Hiperligao"/>
@@ -3558,7 +3558,7 @@
               <w:rPr>
                 <w:noProof/>
               </w:rPr>
-              <w:instrText xml:space="preserve"> PAGEREF _Toc241744807 \h </w:instrText>
+              <w:instrText xml:space="preserve"> PAGEREF _Toc241747647 \h </w:instrText>
             </w:r>
             <w:r>
               <w:rPr>
@@ -3600,7 +3600,7 @@
               <w14:ligatures w14:val="standardContextual"/>
             </w:rPr>
           </w:pPr>
-          <w:hyperlink w:anchor="_Toc241744808" w:history="1">
+          <w:hyperlink w:anchor="_Toc241747648" w:history="1">
             <w:r>
               <w:rPr>
                 <w:rStyle w:val="Hiperligao"/>
@@ -3624,7 +3624,7 @@
               <w:rPr>
                 <w:noProof/>
               </w:rPr>
-              <w:instrText xml:space="preserve"> PAGEREF _Toc241744808 \h </w:instrText>
+              <w:instrText xml:space="preserve"> PAGEREF _Toc241747648 \h </w:instrText>
             </w:r>
             <w:r>
               <w:rPr>
@@ -3666,7 +3666,7 @@
               <w14:ligatures w14:val="standardContextual"/>
             </w:rPr>
           </w:pPr>
-          <w:hyperlink w:anchor="_Toc241744809" w:history="1">
+          <w:hyperlink w:anchor="_Toc241747649" w:history="1">
             <w:r>
               <w:rPr>
                 <w:rStyle w:val="Hiperligao"/>
@@ -3690,7 +3690,7 @@
               <w:rPr>
                 <w:noProof/>
               </w:rPr>
-              <w:instrText xml:space="preserve"> PAGEREF _Toc241744809 \h </w:instrText>
+              <w:instrText xml:space="preserve"> PAGEREF _Toc241747649 \h </w:instrText>
             </w:r>
             <w:r>
               <w:rPr>
@@ -3732,7 +3732,7 @@
               <w14:ligatures w14:val="standardContextual"/>
             </w:rPr>
           </w:pPr>
-          <w:hyperlink w:anchor="_Toc241744810" w:history="1">
+          <w:hyperlink w:anchor="_Toc241747650" w:history="1">
             <w:r>
               <w:rPr>
                 <w:rStyle w:val="Hiperligao"/>
@@ -3756,7 +3756,7 @@
               <w:rPr>
                 <w:noProof/>
               </w:rPr>
-              <w:instrText xml:space="preserve"> PAGEREF _Toc241744810 \h </w:instrText>
+              <w:instrText xml:space="preserve"> PAGEREF _Toc241747650 \h </w:instrText>
             </w:r>
             <w:r>
               <w:rPr>
@@ -3798,7 +3798,7 @@
               <w14:ligatures w14:val="standardContextual"/>
             </w:rPr>
           </w:pPr>
-          <w:hyperlink w:anchor="_Toc241744811" w:history="1">
+          <w:hyperlink w:anchor="_Toc241747651" w:history="1">
             <w:r>
               <w:rPr>
                 <w:rStyle w:val="Hiperligao"/>
@@ -3822,7 +3822,7 @@
               <w:rPr>
                 <w:noProof/>
               </w:rPr>
-              <w:instrText xml:space="preserve"> PAGEREF _Toc241744811 \h </w:instrText>
+              <w:instrText xml:space="preserve"> PAGEREF _Toc241747651 \h </w:instrText>
             </w:r>
             <w:r>
               <w:rPr>
@@ -3864,7 +3864,7 @@
               <w14:ligatures w14:val="standardContextual"/>
             </w:rPr>
           </w:pPr>
-          <w:hyperlink w:anchor="_Toc241744812" w:history="1">
+          <w:hyperlink w:anchor="_Toc241747652" w:history="1">
             <w:r>
               <w:rPr>
                 <w:rStyle w:val="Hiperligao"/>
@@ -3888,7 +3888,7 @@
               <w:rPr>
                 <w:noProof/>
               </w:rPr>
-              <w:instrText xml:space="preserve"> PAGEREF _Toc241744812 \h </w:instrText>
+              <w:instrText xml:space="preserve"> PAGEREF _Toc241747652 \h </w:instrText>
             </w:r>
             <w:r>
               <w:rPr>
@@ -3930,7 +3930,7 @@
               <w14:ligatures w14:val="standardContextual"/>
             </w:rPr>
           </w:pPr>
-          <w:hyperlink w:anchor="_Toc241744813" w:history="1">
+          <w:hyperlink w:anchor="_Toc241747653" w:history="1">
             <w:r>
               <w:rPr>
                 <w:rStyle w:val="Hiperligao"/>
@@ -3954,7 +3954,7 @@
               <w:rPr>
                 <w:noProof/>
               </w:rPr>
-              <w:instrText xml:space="preserve"> PAGEREF _Toc241744813 \h </w:instrText>
+              <w:instrText xml:space="preserve"> PAGEREF _Toc241747653 \h </w:instrText>
             </w:r>
             <w:r>
               <w:rPr>
@@ -3996,7 +3996,7 @@
               <w14:ligatures w14:val="standardContextual"/>
             </w:rPr>
           </w:pPr>
-          <w:hyperlink w:anchor="_Toc241744814" w:history="1">
+          <w:hyperlink w:anchor="_Toc241747654" w:history="1">
             <w:r>
               <w:rPr>
                 <w:rStyle w:val="Hiperligao"/>
@@ -4020,7 +4020,7 @@
               <w:rPr>
                 <w:noProof/>
               </w:rPr>
-              <w:instrText xml:space="preserve"> PAGEREF _Toc241744814 \h </w:instrText>
+              <w:instrText xml:space="preserve"> PAGEREF _Toc241747654 \h </w:instrText>
             </w:r>
             <w:r>
               <w:rPr>
@@ -4062,7 +4062,7 @@
               <w14:ligatures w14:val="standardContextual"/>
             </w:rPr>
           </w:pPr>
-          <w:hyperlink w:anchor="_Toc241744815" w:history="1">
+          <w:hyperlink w:anchor="_Toc241747655" w:history="1">
             <w:r>
               <w:rPr>
                 <w:rStyle w:val="Hiperligao"/>
@@ -4086,7 +4086,7 @@
               <w:rPr>
                 <w:noProof/>
               </w:rPr>
-              <w:instrText xml:space="preserve"> PAGEREF _Toc241744815 \h </w:instrText>
+              <w:instrText xml:space="preserve"> PAGEREF _Toc241747655 \h </w:instrText>
             </w:r>
             <w:r>
               <w:rPr>
@@ -4128,7 +4128,7 @@
               <w14:ligatures w14:val="standardContextual"/>
             </w:rPr>
           </w:pPr>
-          <w:hyperlink w:anchor="_Toc241744816" w:history="1">
+          <w:hyperlink w:anchor="_Toc241747656" w:history="1">
             <w:r>
               <w:rPr>
                 <w:rStyle w:val="Hiperligao"/>
@@ -4152,7 +4152,7 @@
               <w:rPr>
                 <w:noProof/>
               </w:rPr>
-              <w:instrText xml:space="preserve"> PAGEREF _Toc241744816 \h </w:instrText>
+              <w:instrText xml:space="preserve"> PAGEREF _Toc241747656 \h </w:instrText>
             </w:r>
             <w:r>
               <w:rPr>
@@ -4194,7 +4194,7 @@
               <w14:ligatures w14:val="standardContextual"/>
             </w:rPr>
           </w:pPr>
-          <w:hyperlink w:anchor="_Toc241744817" w:history="1">
+          <w:hyperlink w:anchor="_Toc241747657" w:history="1">
             <w:r>
               <w:rPr>
                 <w:rStyle w:val="Hiperligao"/>
@@ -4218,7 +4218,7 @@
               <w:rPr>
                 <w:noProof/>
               </w:rPr>
-              <w:instrText xml:space="preserve"> PAGEREF _Toc241744817 \h </w:instrText>
+              <w:instrText xml:space="preserve"> PAGEREF _Toc241747657 \h </w:instrText>
             </w:r>
             <w:r>
               <w:rPr>
@@ -4266,7 +4266,7 @@
       <w:pPr>
         <w:pStyle w:val="Ttulo1"/>
       </w:pPr>
-      <w:bookmarkStart w:id="0" w:name="_Toc241744755"/>
+      <w:bookmarkStart w:id="0" w:name="_Toc241747595"/>
       <w:r>
         <w:lastRenderedPageBreak/>
         <w:t>Your role at a glance</w:t>
@@ -4347,7 +4347,7 @@
       <w:pPr>
         <w:pStyle w:val="Ttulo2"/>
       </w:pPr>
-      <w:bookmarkStart w:id="1" w:name="_Toc241744756"/>
+      <w:bookmarkStart w:id="1" w:name="_Toc241747596"/>
       <w:r>
         <w:t>You can / You cannot</w:t>
       </w:r>
@@ -5195,7 +5195,7 @@
       <w:pPr>
         <w:pStyle w:val="Ttulo2"/>
       </w:pPr>
-      <w:bookmarkStart w:id="2" w:name="_Toc241744757"/>
+      <w:bookmarkStart w:id="2" w:name="_Toc241747597"/>
       <w:r>
         <w:t>Where your access comes from</w:t>
       </w:r>
@@ -5305,7 +5305,7 @@
       <w:pPr>
         <w:pStyle w:val="Ttulo2"/>
       </w:pPr>
-      <w:bookmarkStart w:id="3" w:name="_Toc241744758"/>
+      <w:bookmarkStart w:id="3" w:name="_Toc241747598"/>
       <w:r>
         <w:t>How to sign in, change your password, and sign out</w:t>
       </w:r>
@@ -5419,7 +5419,7 @@
           <w:noProof/>
         </w:rPr>
         <w:drawing>
-          <wp:inline distT="0" distB="0" distL="0" distR="0" wp14:anchorId="5E6B759C" wp14:editId="5B8BDCB4">
+          <wp:inline distT="0" distB="0" distL="0" distR="0" wp14:anchorId="4D379925" wp14:editId="68FB0465">
             <wp:extent cx="5715000" cy="3571875"/>
             <wp:effectExtent l="0" t="0" r="0" b="0"/>
             <wp:docPr id="1" name="01-login.png" descr="The sign-in page with Email, Password, Remember me and the Sign in button." title="The sign-in page with Email, Password, Remember me and the Sign in button."/>
@@ -5534,7 +5534,7 @@
         </w:rPr>
         <w:lastRenderedPageBreak/>
         <w:drawing>
-          <wp:inline distT="0" distB="0" distL="0" distR="0" wp14:anchorId="1F9EC8F9" wp14:editId="2990BB4B">
+          <wp:inline distT="0" distB="0" distL="0" distR="0" wp14:anchorId="00E47C60" wp14:editId="58840EA5">
             <wp:extent cx="5715000" cy="3571875"/>
             <wp:effectExtent l="0" t="0" r="0" b="0"/>
             <wp:docPr id="2" name="03-user-menu.png" descr="The account menu open, with Settings and Log out." title="The account menu open, with Settings and Log out."/>
@@ -5586,7 +5586,7 @@
       <w:pPr>
         <w:pStyle w:val="Ttulo2"/>
       </w:pPr>
-      <w:bookmarkStart w:id="4" w:name="_Toc241744759"/>
+      <w:bookmarkStart w:id="4" w:name="_Toc241747599"/>
       <w:r>
         <w:t>The sidebar</w:t>
       </w:r>
@@ -6127,7 +6127,7 @@
         </w:rPr>
         <w:lastRenderedPageBreak/>
         <w:drawing>
-          <wp:inline distT="0" distB="0" distL="0" distR="0" wp14:anchorId="306E06FC" wp14:editId="080ECA1E">
+          <wp:inline distT="0" distB="0" distL="0" distR="0" wp14:anchorId="5D32AA61" wp14:editId="7BBF39C1">
             <wp:extent cx="5715000" cy="5133975"/>
             <wp:effectExtent l="0" t="0" r="0" b="0"/>
             <wp:docPr id="3" name="01-dashboard-sidebar.png" descr="The full Administrator sidebar, including Data Modeling and Migration." title="The full Administrator sidebar, including Data Modeling and Migration."/>
@@ -6180,7 +6180,7 @@
         <w:pStyle w:val="Ttulo1"/>
         <w:pageBreakBefore/>
       </w:pPr>
-      <w:bookmarkStart w:id="5" w:name="_Toc241744760"/>
+      <w:bookmarkStart w:id="5" w:name="_Toc241747600"/>
       <w:r>
         <w:lastRenderedPageBreak/>
         <w:t>Settings</w:t>
@@ -6210,7 +6210,7 @@
           <w:noProof/>
         </w:rPr>
         <w:drawing>
-          <wp:inline distT="0" distB="0" distL="0" distR="0" wp14:anchorId="3A6C88D6" wp14:editId="70CA4C76">
+          <wp:inline distT="0" distB="0" distL="0" distR="0" wp14:anchorId="72179E3E" wp14:editId="0F1E978E">
             <wp:extent cx="5715000" cy="3571875"/>
             <wp:effectExtent l="0" t="0" r="0" b="0"/>
             <wp:docPr id="4" name="04-settings.png" descr="The Settings page with the Language, Theme and Color palette cards." title="The Settings page with the Language, Theme and Color palette cards."/>
@@ -7559,7 +7559,7 @@
         <w:pStyle w:val="Ttulo1"/>
         <w:pageBreakBefore/>
       </w:pPr>
-      <w:bookmarkStart w:id="6" w:name="_Toc241744761"/>
+      <w:bookmarkStart w:id="6" w:name="_Toc241747601"/>
       <w:r>
         <w:lastRenderedPageBreak/>
         <w:t>Dashboard</w:t>
@@ -7592,7 +7592,7 @@
           <w:noProof/>
         </w:rPr>
         <w:drawing>
-          <wp:inline distT="0" distB="0" distL="0" distR="0" wp14:anchorId="1BE43917" wp14:editId="1D6EE254">
+          <wp:inline distT="0" distB="0" distL="0" distR="0" wp14:anchorId="23A8CCC6" wp14:editId="1DC48586">
             <wp:extent cx="5715000" cy="5133975"/>
             <wp:effectExtent l="0" t="0" r="0" b="0"/>
             <wp:docPr id="5" name="01-dashboard-sidebar.png" descr="The Administrator dashboard with summary cards and the Recent Maps list." title="The Administrator dashboard with summary cards and the Recent Maps list."/>
@@ -8101,7 +8101,7 @@
         <w:pStyle w:val="Ttulo1"/>
         <w:pageBreakBefore/>
       </w:pPr>
-      <w:bookmarkStart w:id="7" w:name="_Toc241744762"/>
+      <w:bookmarkStart w:id="7" w:name="_Toc241747602"/>
       <w:r>
         <w:lastRenderedPageBreak/>
         <w:t>Maps</w:t>
@@ -8131,7 +8131,7 @@
           <w:noProof/>
         </w:rPr>
         <w:drawing>
-          <wp:inline distT="0" distB="0" distL="0" distR="0" wp14:anchorId="41ED621E" wp14:editId="4AD9FC2E">
+          <wp:inline distT="0" distB="0" distL="0" distR="0" wp14:anchorId="174324FF" wp14:editId="05EF10C6">
             <wp:extent cx="5715000" cy="3429000"/>
             <wp:effectExtent l="0" t="0" r="0" b="0"/>
             <wp:docPr id="6" name="02-maps-all.png" descr="The Maps list, All tab, with every row icon and the Workbooks section above." title="The Maps list, All tab, with every row icon and the Workbooks section above."/>
@@ -8183,7 +8183,7 @@
       <w:pPr>
         <w:pStyle w:val="Ttulo2"/>
       </w:pPr>
-      <w:bookmarkStart w:id="8" w:name="_Toc241744763"/>
+      <w:bookmarkStart w:id="8" w:name="_Toc241747603"/>
       <w:r>
         <w:t>The list</w:t>
       </w:r>
@@ -9387,7 +9387,7 @@
       <w:pPr>
         <w:pStyle w:val="Ttulo2"/>
       </w:pPr>
-      <w:bookmarkStart w:id="9" w:name="_Toc241744764"/>
+      <w:bookmarkStart w:id="9" w:name="_Toc241747604"/>
       <w:r>
         <w:t>Workbooks</w:t>
       </w:r>
@@ -9801,7 +9801,7 @@
       <w:pPr>
         <w:pStyle w:val="Ttulo2"/>
       </w:pPr>
-      <w:bookmarkStart w:id="10" w:name="_Toc241744765"/>
+      <w:bookmarkStart w:id="10" w:name="_Toc241747605"/>
       <w:r>
         <w:t>Share a map</w:t>
       </w:r>
@@ -9824,7 +9824,7 @@
         </w:rPr>
         <w:lastRenderedPageBreak/>
         <w:drawing>
-          <wp:inline distT="0" distB="0" distL="0" distR="0" wp14:anchorId="27AC3E0A" wp14:editId="15D4CA7F">
+          <wp:inline distT="0" distB="0" distL="0" distR="0" wp14:anchorId="3F633001" wp14:editId="5B35796B">
             <wp:extent cx="3743325" cy="3895725"/>
             <wp:effectExtent l="0" t="0" r="0" b="0"/>
             <wp:docPr id="7" name="03-share-dialog.png" descr="The Share map dialog with a search box and Can view, Can export and Can edit buttons." title="The Share map dialog with a search box and Can view, Can export and Can edit buttons."/>
@@ -10301,7 +10301,7 @@
       <w:pPr>
         <w:pStyle w:val="Ttulo2"/>
       </w:pPr>
-      <w:bookmarkStart w:id="11" w:name="_Toc241744766"/>
+      <w:bookmarkStart w:id="11" w:name="_Toc241747606"/>
       <w:r>
         <w:lastRenderedPageBreak/>
         <w:t>Share a whole workbook</w:t>
@@ -10357,7 +10357,7 @@
       <w:pPr>
         <w:pStyle w:val="Ttulo2"/>
       </w:pPr>
-      <w:bookmarkStart w:id="12" w:name="_Toc241744767"/>
+      <w:bookmarkStart w:id="12" w:name="_Toc241747607"/>
       <w:r>
         <w:t>Copy a map</w:t>
       </w:r>
@@ -10372,7 +10372,7 @@
       <w:pPr>
         <w:pStyle w:val="Ttulo2"/>
       </w:pPr>
-      <w:bookmarkStart w:id="13" w:name="_Toc241744768"/>
+      <w:bookmarkStart w:id="13" w:name="_Toc241747608"/>
       <w:r>
         <w:t>Example: give a colleague read access</w:t>
       </w:r>
@@ -10503,7 +10503,7 @@
         <w:pStyle w:val="Ttulo1"/>
         <w:pageBreakBefore/>
       </w:pPr>
-      <w:bookmarkStart w:id="14" w:name="_Toc241744769"/>
+      <w:bookmarkStart w:id="14" w:name="_Toc241747609"/>
       <w:r>
         <w:lastRenderedPageBreak/>
         <w:t>Map builder</w:t>
@@ -10536,7 +10536,7 @@
           <w:noProof/>
         </w:rPr>
         <w:drawing>
-          <wp:inline distT="0" distB="0" distL="0" distR="0" wp14:anchorId="1F691AD8" wp14:editId="1E37867F">
+          <wp:inline distT="0" distB="0" distL="0" distR="0" wp14:anchorId="2D7FDCA8" wp14:editId="1D40EA42">
             <wp:extent cx="5715000" cy="3571875"/>
             <wp:effectExtent l="0" t="0" r="0" b="0"/>
             <wp:docPr id="8" name="05-builder-overview.png" descr="The map builder with the Business Areas tree, the columns canvas and the Properties panel." title="The map builder with the Business Areas tree, the columns canvas and the Properties panel."/>
@@ -10588,7 +10588,7 @@
       <w:pPr>
         <w:pStyle w:val="Ttulo2"/>
       </w:pPr>
-      <w:bookmarkStart w:id="15" w:name="_Toc241744770"/>
+      <w:bookmarkStart w:id="15" w:name="_Toc241747610"/>
       <w:r>
         <w:t>The screen</w:t>
       </w:r>
@@ -10748,7 +10748,7 @@
       <w:pPr>
         <w:pStyle w:val="Ttulo2"/>
       </w:pPr>
-      <w:bookmarkStart w:id="16" w:name="_Toc241744771"/>
+      <w:bookmarkStart w:id="16" w:name="_Toc241747611"/>
       <w:r>
         <w:t>The toolbar</w:t>
       </w:r>
@@ -11964,7 +11964,7 @@
       <w:pPr>
         <w:pStyle w:val="Ttulo2"/>
       </w:pPr>
-      <w:bookmarkStart w:id="17" w:name="_Toc241744772"/>
+      <w:bookmarkStart w:id="17" w:name="_Toc241747612"/>
       <w:r>
         <w:t>Build a map</w:t>
       </w:r>
@@ -12171,7 +12171,7 @@
       <w:pPr>
         <w:pStyle w:val="Ttulo2"/>
       </w:pPr>
-      <w:bookmarkStart w:id="18" w:name="_Toc241744773"/>
+      <w:bookmarkStart w:id="18" w:name="_Toc241747613"/>
       <w:r>
         <w:lastRenderedPageBreak/>
         <w:t>Configure a column</w:t>
@@ -14990,7 +14990,7 @@
           <w:noProof/>
         </w:rPr>
         <w:drawing>
-          <wp:inline distT="0" distB="0" distL="0" distR="0" wp14:anchorId="532F6830" wp14:editId="5CBCE02A">
+          <wp:inline distT="0" distB="0" distL="0" distR="0" wp14:anchorId="5E67958E" wp14:editId="46E14F8A">
             <wp:extent cx="5715000" cy="3571875"/>
             <wp:effectExtent l="0" t="0" r="0" b="0"/>
             <wp:docPr id="9" name="08-builder-column-aggregation.png" descr="The Configure column dialog with the Aggregation list open." title="The Configure column dialog with the Aggregation list open."/>
@@ -15042,7 +15042,7 @@
       <w:pPr>
         <w:pStyle w:val="Ttulo2"/>
       </w:pPr>
-      <w:bookmarkStart w:id="19" w:name="_Toc241744774"/>
+      <w:bookmarkStart w:id="19" w:name="_Toc241747614"/>
       <w:r>
         <w:lastRenderedPageBreak/>
         <w:t>The Properties tab</w:t>
@@ -15890,7 +15890,7 @@
       <w:pPr>
         <w:pStyle w:val="Ttulo2"/>
       </w:pPr>
-      <w:bookmarkStart w:id="20" w:name="_Toc241744775"/>
+      <w:bookmarkStart w:id="20" w:name="_Toc241747615"/>
       <w:r>
         <w:t>The Conditions tab</w:t>
       </w:r>
@@ -17433,7 +17433,7 @@
       <w:pPr>
         <w:pStyle w:val="Ttulo2"/>
       </w:pPr>
-      <w:bookmarkStart w:id="21" w:name="_Toc241744776"/>
+      <w:bookmarkStart w:id="21" w:name="_Toc241747616"/>
       <w:r>
         <w:t>The Sort tab</w:t>
       </w:r>
@@ -17878,7 +17878,7 @@
       <w:pPr>
         <w:pStyle w:val="Ttulo2"/>
       </w:pPr>
-      <w:bookmarkStart w:id="22" w:name="_Toc241744777"/>
+      <w:bookmarkStart w:id="22" w:name="_Toc241747617"/>
       <w:r>
         <w:t>The Parameters tab</w:t>
       </w:r>
@@ -18788,7 +18788,7 @@
       <w:pPr>
         <w:pStyle w:val="Ttulo2"/>
       </w:pPr>
-      <w:bookmarkStart w:id="23" w:name="_Toc241744778"/>
+      <w:bookmarkStart w:id="23" w:name="_Toc241747618"/>
       <w:r>
         <w:t>The Calculated Fields tab</w:t>
       </w:r>
@@ -19686,7 +19686,7 @@
       <w:pPr>
         <w:pStyle w:val="Ttulo2"/>
       </w:pPr>
-      <w:bookmarkStart w:id="24" w:name="_Toc241744779"/>
+      <w:bookmarkStart w:id="24" w:name="_Toc241747619"/>
       <w:r>
         <w:t>Conditional formatting</w:t>
       </w:r>
@@ -21080,7 +21080,7 @@
       <w:pPr>
         <w:pStyle w:val="Ttulo2"/>
       </w:pPr>
-      <w:bookmarkStart w:id="25" w:name="_Toc241744780"/>
+      <w:bookmarkStart w:id="25" w:name="_Toc241747620"/>
       <w:r>
         <w:t>Run a map and read the result</w:t>
       </w:r>
@@ -22149,7 +22149,7 @@
           <w:noProof/>
         </w:rPr>
         <w:drawing>
-          <wp:inline distT="0" distB="0" distL="0" distR="0" wp14:anchorId="54F08638" wp14:editId="2A59FFD1">
+          <wp:inline distT="0" distB="0" distL="0" distR="0" wp14:anchorId="4CB52AA3" wp14:editId="5D319052">
             <wp:extent cx="5715000" cy="3571875"/>
             <wp:effectExtent l="0" t="0" r="0" b="0"/>
             <wp:docPr id="10" name="03-viewer-results.png" descr="Run results with the SQL and Plan buttons beside the Excel, CSV and PDF buttons." title="Run results with the SQL and Plan buttons beside the Excel, CSV and PDF buttons."/>
@@ -22216,7 +22216,7 @@
       <w:pPr>
         <w:pStyle w:val="Ttulo2"/>
       </w:pPr>
-      <w:bookmarkStart w:id="26" w:name="_Toc241744781"/>
+      <w:bookmarkStart w:id="26" w:name="_Toc241747621"/>
       <w:r>
         <w:t>Refusals and errors</w:t>
       </w:r>
@@ -22855,7 +22855,7 @@
         <w:pStyle w:val="Ttulo1"/>
         <w:pageBreakBefore/>
       </w:pPr>
-      <w:bookmarkStart w:id="27" w:name="_Toc241744782"/>
+      <w:bookmarkStart w:id="27" w:name="_Toc241747622"/>
       <w:r>
         <w:lastRenderedPageBreak/>
         <w:t>The map viewer</w:t>
@@ -22888,7 +22888,7 @@
           <w:noProof/>
         </w:rPr>
         <w:drawing>
-          <wp:inline distT="0" distB="0" distL="0" distR="0" wp14:anchorId="59B7B6DD" wp14:editId="77EF1020">
+          <wp:inline distT="0" distB="0" distL="0" distR="0" wp14:anchorId="517A8336" wp14:editId="64089E42">
             <wp:extent cx="5715000" cy="3571875"/>
             <wp:effectExtent l="0" t="0" r="0" b="0"/>
             <wp:docPr id="11" name="25-viewer-results.png" descr="The map viewer after a completed run, with the results grid and export buttons." title="The map viewer after a completed run, with the results grid and export buttons."/>
@@ -23493,7 +23493,7 @@
         <w:pStyle w:val="Ttulo1"/>
         <w:pageBreakBefore/>
       </w:pPr>
-      <w:bookmarkStart w:id="28" w:name="_Toc241744783"/>
+      <w:bookmarkStart w:id="28" w:name="_Toc241747623"/>
       <w:r>
         <w:lastRenderedPageBreak/>
         <w:t>Runs</w:t>
@@ -23523,7 +23523,7 @@
           <w:noProof/>
         </w:rPr>
         <w:drawing>
-          <wp:inline distT="0" distB="0" distL="0" distR="0" wp14:anchorId="294AA5A5" wp14:editId="2FC174E6">
+          <wp:inline distT="0" distB="0" distL="0" distR="0" wp14:anchorId="39AC3C8B" wp14:editId="1F9B6FEC">
             <wp:extent cx="5715000" cy="3571875"/>
             <wp:effectExtent l="0" t="0" r="0" b="0"/>
             <wp:docPr id="12" name="04-runs-every-user.png" descr="The Runs page with every user's runs shown." title="The Runs page with every user's runs shown."/>
@@ -24853,7 +24853,7 @@
         <w:pStyle w:val="Ttulo1"/>
         <w:pageBreakBefore/>
       </w:pPr>
-      <w:bookmarkStart w:id="29" w:name="_Toc241744784"/>
+      <w:bookmarkStart w:id="29" w:name="_Toc241747624"/>
       <w:r>
         <w:lastRenderedPageBreak/>
         <w:t>Exports</w:t>
@@ -24883,7 +24883,7 @@
           <w:noProof/>
         </w:rPr>
         <w:drawing>
-          <wp:inline distT="0" distB="0" distL="0" distR="0" wp14:anchorId="2BAE59BF" wp14:editId="5AB5C515">
+          <wp:inline distT="0" distB="0" distL="0" distR="0" wp14:anchorId="292178E4" wp14:editId="04279999">
             <wp:extent cx="5715000" cy="3571875"/>
             <wp:effectExtent l="0" t="0" r="0" b="0"/>
             <wp:docPr id="13" name="05-exports.png" descr="The Exports page listing export jobs with their status and download buttons." title="The Exports page listing export jobs with their status and download buttons."/>
@@ -25564,7 +25564,7 @@
         <w:pStyle w:val="Ttulo1"/>
         <w:pageBreakBefore/>
       </w:pPr>
-      <w:bookmarkStart w:id="30" w:name="_Toc241744785"/>
+      <w:bookmarkStart w:id="30" w:name="_Toc241747625"/>
       <w:r>
         <w:lastRenderedPageBreak/>
         <w:t>Schedules</w:t>
@@ -25597,7 +25597,7 @@
           <w:noProof/>
         </w:rPr>
         <w:drawing>
-          <wp:inline distT="0" distB="0" distL="0" distR="0" wp14:anchorId="0A56A886" wp14:editId="398BD3C1">
+          <wp:inline distT="0" distB="0" distL="0" distR="0" wp14:anchorId="7E3C4318" wp14:editId="68E6D89E">
             <wp:extent cx="5715000" cy="3571875"/>
             <wp:effectExtent l="0" t="0" r="0" b="0"/>
             <wp:docPr id="14" name="38-schedules-list.png" descr="The Schedules page with a paused schedule and its action icons." title="The Schedules page with a paused schedule and its action icons."/>
@@ -26304,7 +26304,7 @@
       <w:pPr>
         <w:pStyle w:val="Ttulo2"/>
       </w:pPr>
-      <w:bookmarkStart w:id="31" w:name="_Toc241744786"/>
+      <w:bookmarkStart w:id="31" w:name="_Toc241747626"/>
       <w:r>
         <w:lastRenderedPageBreak/>
         <w:t>New Schedule and Edit Schedule</w:t>
@@ -27740,7 +27740,7 @@
         </w:rPr>
         <w:lastRenderedPageBreak/>
         <w:drawing>
-          <wp:inline distT="0" distB="0" distL="0" distR="0" wp14:anchorId="444759FF" wp14:editId="00545F09">
+          <wp:inline distT="0" distB="0" distL="0" distR="0" wp14:anchorId="7B110AA0" wp14:editId="57D1852C">
             <wp:extent cx="3743325" cy="4676775"/>
             <wp:effectExtent l="0" t="0" r="0" b="0"/>
             <wp:docPr id="15" name="34-schedule-custom-cron.png" descr="The New Schedule dialog with a custom frequency and the cron expression field." title="The New Schedule dialog with a custom frequency and the cron expression field."/>
@@ -27792,7 +27792,7 @@
       <w:pPr>
         <w:pStyle w:val="Ttulo2"/>
       </w:pPr>
-      <w:bookmarkStart w:id="32" w:name="_Toc241744787"/>
+      <w:bookmarkStart w:id="32" w:name="_Toc241747627"/>
       <w:r>
         <w:t>Execution History</w:t>
       </w:r>
@@ -28241,7 +28241,7 @@
       <w:pPr>
         <w:pStyle w:val="Ttulo2"/>
       </w:pPr>
-      <w:bookmarkStart w:id="33" w:name="_Toc241744788"/>
+      <w:bookmarkStart w:id="33" w:name="_Toc241747628"/>
       <w:r>
         <w:t>Example: a weekly result</w:t>
       </w:r>
@@ -28447,7 +28447,7 @@
         <w:pStyle w:val="Ttulo1"/>
         <w:pageBreakBefore/>
       </w:pPr>
-      <w:bookmarkStart w:id="34" w:name="_Toc241744789"/>
+      <w:bookmarkStart w:id="34" w:name="_Toc241747629"/>
       <w:r>
         <w:lastRenderedPageBreak/>
         <w:t>Business Areas</w:t>
@@ -28480,7 +28480,7 @@
           <w:noProof/>
         </w:rPr>
         <w:drawing>
-          <wp:inline distT="0" distB="0" distL="0" distR="0" wp14:anchorId="3FCE961D" wp14:editId="7361B911">
+          <wp:inline distT="0" distB="0" distL="0" distR="0" wp14:anchorId="1BEEDC4D" wp14:editId="35863E5B">
             <wp:extent cx="5715000" cy="3571875"/>
             <wp:effectExtent l="0" t="0" r="0" b="0"/>
             <wp:docPr id="16" name="06-business-areas.png" descr="The Business Areas page listing areas, with the New Business Area button and row icons." title="The Business Areas page listing areas, with the New Business Area button and row icons."/>
@@ -28994,7 +28994,7 @@
         </w:rPr>
         <w:lastRenderedPageBreak/>
         <w:drawing>
-          <wp:inline distT="0" distB="0" distL="0" distR="0" wp14:anchorId="0705A3EF" wp14:editId="7E6ECAE2">
+          <wp:inline distT="0" distB="0" distL="0" distR="0" wp14:anchorId="7A12EE5D" wp14:editId="434F66A9">
             <wp:extent cx="3324225" cy="2047875"/>
             <wp:effectExtent l="0" t="0" r="0" b="0"/>
             <wp:docPr id="17" name="07-business-areas-new.png" descr="The New Business Area dialog with Name and Description fields." title="The New Business Area dialog with Name and Description fields."/>
@@ -29046,7 +29046,7 @@
       <w:pPr>
         <w:pStyle w:val="Ttulo2"/>
       </w:pPr>
-      <w:bookmarkStart w:id="35" w:name="_Toc241744790"/>
+      <w:bookmarkStart w:id="35" w:name="_Toc241747630"/>
       <w:r>
         <w:t>Create a business area</w:t>
       </w:r>
@@ -29150,7 +29150,7 @@
       <w:pPr>
         <w:pStyle w:val="Ttulo2"/>
       </w:pPr>
-      <w:bookmarkStart w:id="36" w:name="_Toc241744791"/>
+      <w:bookmarkStart w:id="36" w:name="_Toc241747631"/>
       <w:r>
         <w:t>Grants</w:t>
       </w:r>
@@ -29182,7 +29182,7 @@
           <w:noProof/>
         </w:rPr>
         <w:drawing>
-          <wp:inline distT="0" distB="0" distL="0" distR="0" wp14:anchorId="7B6A2FBE" wp14:editId="33B67EBD">
+          <wp:inline distT="0" distB="0" distL="0" distR="0" wp14:anchorId="58224B6B" wp14:editId="36B42289">
             <wp:extent cx="5715000" cy="3571875"/>
             <wp:effectExtent l="0" t="0" r="0" b="0"/>
             <wp:docPr id="18" name="09-business-areas-grants-permission.png" descr="The Manage grants dialog with the Permission list open." title="The Manage grants dialog with the Permission list open."/>
@@ -30439,7 +30439,7 @@
         <w:pStyle w:val="Ttulo1"/>
         <w:pageBreakBefore/>
       </w:pPr>
-      <w:bookmarkStart w:id="37" w:name="_Toc241744792"/>
+      <w:bookmarkStart w:id="37" w:name="_Toc241747632"/>
       <w:r>
         <w:lastRenderedPageBreak/>
         <w:t>Folders</w:t>
@@ -30502,7 +30502,7 @@
           <w:noProof/>
         </w:rPr>
         <w:drawing>
-          <wp:inline distT="0" distB="0" distL="0" distR="0" wp14:anchorId="7B28F618" wp14:editId="6D75E3F6">
+          <wp:inline distT="0" distB="0" distL="0" distR="0" wp14:anchorId="379DB35E" wp14:editId="37F6EF92">
             <wp:extent cx="5715000" cy="3571875"/>
             <wp:effectExtent l="0" t="0" r="0" b="0"/>
             <wp:docPr id="19" name="11-folders.png" descr="The Folders page with a business area chosen, showing the folder table and row icons." title="The Folders page with a business area chosen, showing the folder table and row icons."/>
@@ -31281,7 +31281,7 @@
       <w:pPr>
         <w:pStyle w:val="Ttulo2"/>
       </w:pPr>
-      <w:bookmarkStart w:id="38" w:name="_Toc241744793"/>
+      <w:bookmarkStart w:id="38" w:name="_Toc241747633"/>
       <w:r>
         <w:t>The folder wizard</w:t>
       </w:r>
@@ -32710,7 +32710,7 @@
         </w:rPr>
         <w:lastRenderedPageBreak/>
         <w:drawing>
-          <wp:inline distT="0" distB="0" distL="0" distR="0" wp14:anchorId="5EB74E46" wp14:editId="3942C1A6">
+          <wp:inline distT="0" distB="0" distL="0" distR="0" wp14:anchorId="17518663" wp14:editId="2D9D4F58">
             <wp:extent cx="2238375" cy="5905500"/>
             <wp:effectExtent l="0" t="0" r="0" b="0"/>
             <wp:docPr id="20" name="15-folders-picked.png" descr="The New Folder dialog with a table picked and the Items to create checklist." title="The New Folder dialog with a table picked and the Items to create checklist."/>
@@ -32897,7 +32897,7 @@
       <w:pPr>
         <w:pStyle w:val="Ttulo2"/>
       </w:pPr>
-      <w:bookmarkStart w:id="39" w:name="_Toc241744794"/>
+      <w:bookmarkStart w:id="39" w:name="_Toc241747634"/>
       <w:r>
         <w:t>Share a folder into another business area</w:t>
       </w:r>
@@ -33007,7 +33007,7 @@
           <w:noProof/>
         </w:rPr>
         <w:drawing>
-          <wp:inline distT="0" distB="0" distL="0" distR="0" wp14:anchorId="510BDE90" wp14:editId="4F660B4F">
+          <wp:inline distT="0" distB="0" distL="0" distR="0" wp14:anchorId="06F9B279" wp14:editId="344074B8">
             <wp:extent cx="3324225" cy="1638300"/>
             <wp:effectExtent l="0" t="0" r="0" b="0"/>
             <wp:docPr id="21" name="16-folders-sharing.png" descr="The folder sharing dialog with the owner badge and the Share into list." title="The folder sharing dialog with the owner badge and the Share into list."/>
@@ -33060,7 +33060,7 @@
         <w:pStyle w:val="Ttulo1"/>
         <w:pageBreakBefore/>
       </w:pPr>
-      <w:bookmarkStart w:id="40" w:name="_Toc241744795"/>
+      <w:bookmarkStart w:id="40" w:name="_Toc241747635"/>
       <w:r>
         <w:lastRenderedPageBreak/>
         <w:t>Items</w:t>
@@ -33113,7 +33113,7 @@
           <w:noProof/>
         </w:rPr>
         <w:drawing>
-          <wp:inline distT="0" distB="0" distL="0" distR="0" wp14:anchorId="18CCBD1A" wp14:editId="017F5B67">
+          <wp:inline distT="0" distB="0" distL="0" distR="0" wp14:anchorId="27CA897E" wp14:editId="200967AA">
             <wp:extent cx="5715000" cy="3571875"/>
             <wp:effectExtent l="0" t="0" r="0" b="0"/>
             <wp:docPr id="22" name="17-items.png" descr="The Items page for a chosen folder, with Type, Column, Data Type and Aggregation columns." title="The Items page for a chosen folder, with Type, Column, Data Type and Aggregation columns."/>
@@ -35052,7 +35052,7 @@
         </w:rPr>
         <w:lastRenderedPageBreak/>
         <w:drawing>
-          <wp:inline distT="0" distB="0" distL="0" distR="0" wp14:anchorId="0DE22070" wp14:editId="37032E00">
+          <wp:inline distT="0" distB="0" distL="0" distR="0" wp14:anchorId="23DAA3C6" wp14:editId="15C9B38E">
             <wp:extent cx="5715000" cy="3571875"/>
             <wp:effectExtent l="0" t="0" r="0" b="0"/>
             <wp:docPr id="23" name="19-items-type-open.png" descr="The New Item dialog with the Item Type list open showing the item types." title="The New Item dialog with the Item Type list open showing the item types."/>
@@ -35105,7 +35105,7 @@
         <w:pStyle w:val="Ttulo1"/>
         <w:pageBreakBefore/>
       </w:pPr>
-      <w:bookmarkStart w:id="41" w:name="_Toc241744796"/>
+      <w:bookmarkStart w:id="41" w:name="_Toc241747636"/>
       <w:r>
         <w:lastRenderedPageBreak/>
         <w:t>Joins</w:t>
@@ -35138,7 +35138,7 @@
           <w:noProof/>
         </w:rPr>
         <w:drawing>
-          <wp:inline distT="0" distB="0" distL="0" distR="0" wp14:anchorId="100875A8" wp14:editId="2F9659F1">
+          <wp:inline distT="0" distB="0" distL="0" distR="0" wp14:anchorId="75FA1324" wp14:editId="15BD5400">
             <wp:extent cx="5715000" cy="3571875"/>
             <wp:effectExtent l="0" t="0" r="0" b="0"/>
             <wp:docPr id="24" name="20-joins.png" descr="The Joins page, including joins made of several column pairs." title="The Joins page, including joins made of several column pairs."/>
@@ -36793,7 +36793,7 @@
           <w:noProof/>
         </w:rPr>
         <w:drawing>
-          <wp:inline distT="0" distB="0" distL="0" distR="0" wp14:anchorId="360536F6" wp14:editId="011A4EFE">
+          <wp:inline distT="0" distB="0" distL="0" distR="0" wp14:anchorId="1B4C4AA9" wp14:editId="58D8F3E2">
             <wp:extent cx="5715000" cy="3571875"/>
             <wp:effectExtent l="0" t="0" r="0" b="0"/>
             <wp:docPr id="25" name="23-joins-select-open.png" descr="The New Join dialog with a select list open." title="The New Join dialog with a select list open."/>
@@ -36964,7 +36964,7 @@
         <w:pStyle w:val="Ttulo1"/>
         <w:pageBreakBefore/>
       </w:pPr>
-      <w:bookmarkStart w:id="42" w:name="_Toc241744797"/>
+      <w:bookmarkStart w:id="42" w:name="_Toc241747637"/>
       <w:r>
         <w:lastRenderedPageBreak/>
         <w:t>Hierarchies</w:t>
@@ -36997,7 +36997,7 @@
           <w:noProof/>
         </w:rPr>
         <w:drawing>
-          <wp:inline distT="0" distB="0" distL="0" distR="0" wp14:anchorId="69550EA8" wp14:editId="7F203F8F">
+          <wp:inline distT="0" distB="0" distL="0" distR="0" wp14:anchorId="161111AD" wp14:editId="27DFD4E5">
             <wp:extent cx="5715000" cy="3571875"/>
             <wp:effectExtent l="0" t="0" r="0" b="0"/>
             <wp:docPr id="26" name="24-hierarchies.png" descr="The Hierarchies page with the table showing the number of levels." title="The Hierarchies page with the table showing the number of levels."/>
@@ -38057,7 +38057,7 @@
           <w:noProof/>
         </w:rPr>
         <w:drawing>
-          <wp:inline distT="0" distB="0" distL="0" distR="0" wp14:anchorId="13335846" wp14:editId="33CE2AB4">
+          <wp:inline distT="0" distB="0" distL="0" distR="0" wp14:anchorId="50F70DC3" wp14:editId="30D7D100">
             <wp:extent cx="4362450" cy="2762250"/>
             <wp:effectExtent l="0" t="0" r="0" b="0"/>
             <wp:docPr id="27" name="26-hierarchies-level-added.png" descr="The New Hierarchy dialog after adding a level, with folder and item selects." title="The New Hierarchy dialog after adding a level, with folder and item selects."/>
@@ -38110,7 +38110,7 @@
         <w:pStyle w:val="Ttulo1"/>
         <w:pageBreakBefore/>
       </w:pPr>
-      <w:bookmarkStart w:id="43" w:name="_Toc241744798"/>
+      <w:bookmarkStart w:id="43" w:name="_Toc241747638"/>
       <w:r>
         <w:lastRenderedPageBreak/>
         <w:t>Custom Functions</w:t>
@@ -38143,7 +38143,7 @@
           <w:noProof/>
         </w:rPr>
         <w:drawing>
-          <wp:inline distT="0" distB="0" distL="0" distR="0" wp14:anchorId="07491ADA" wp14:editId="1A97E069">
+          <wp:inline distT="0" distB="0" distL="0" distR="0" wp14:anchorId="6279BAB3" wp14:editId="72FC4CBA">
             <wp:extent cx="5715000" cy="3571875"/>
             <wp:effectExtent l="0" t="0" r="0" b="0"/>
             <wp:docPr id="28" name="27-custom-functions.png" descr="The Custom Functions page with filter box, Refresh all, New Function and the function table." title="The Custom Functions page with filter box, Refresh all, New Function and the function table."/>
@@ -38863,7 +38863,7 @@
       <w:pPr>
         <w:pStyle w:val="Ttulo2"/>
       </w:pPr>
-      <w:bookmarkStart w:id="44" w:name="_Toc241744799"/>
+      <w:bookmarkStart w:id="44" w:name="_Toc241747639"/>
       <w:r>
         <w:lastRenderedPageBreak/>
         <w:t>The function form</w:t>
@@ -39834,7 +39834,7 @@
         </w:rPr>
         <w:lastRenderedPageBreak/>
         <w:drawing>
-          <wp:inline distT="0" distB="0" distL="0" distR="0" wp14:anchorId="4F88CCFF" wp14:editId="4E2D3CF6">
+          <wp:inline distT="0" distB="0" distL="0" distR="0" wp14:anchorId="54186465" wp14:editId="46D05507">
             <wp:extent cx="4076700" cy="5905500"/>
             <wp:effectExtent l="0" t="0" r="0" b="0"/>
             <wp:docPr id="29" name="29-custom-functions-search-results.png" descr="The New Custom Function dialog listing database functions that match the search." title="The New Custom Function dialog listing database functions that match the search."/>
@@ -39887,7 +39887,7 @@
         <w:pStyle w:val="Ttulo1"/>
         <w:pageBreakBefore/>
       </w:pPr>
-      <w:bookmarkStart w:id="45" w:name="_Toc241744800"/>
+      <w:bookmarkStart w:id="45" w:name="_Toc241747640"/>
       <w:r>
         <w:lastRenderedPageBreak/>
         <w:t>Data Sources</w:t>
@@ -39920,7 +39920,7 @@
           <w:noProof/>
         </w:rPr>
         <w:drawing>
-          <wp:inline distT="0" distB="0" distL="0" distR="0" wp14:anchorId="3888798B" wp14:editId="66AB8A9B">
+          <wp:inline distT="0" distB="0" distL="0" distR="0" wp14:anchorId="415ABB52" wp14:editId="50D10118">
             <wp:extent cx="5715000" cy="3571875"/>
             <wp:effectExtent l="0" t="0" r="0" b="0"/>
             <wp:docPr id="30" name="30-data-sources.png" descr="The Data Sources page with a table of connections and five row icons." title="The Data Sources page with a table of connections and five row icons."/>
@@ -41300,7 +41300,7 @@
       <w:pPr>
         <w:pStyle w:val="Ttulo2"/>
       </w:pPr>
-      <w:bookmarkStart w:id="46" w:name="_Toc241744801"/>
+      <w:bookmarkStart w:id="46" w:name="_Toc241747641"/>
       <w:r>
         <w:t>Import tables</w:t>
       </w:r>
@@ -41462,7 +41462,7 @@
           <w:noProof/>
         </w:rPr>
         <w:drawing>
-          <wp:inline distT="0" distB="0" distL="0" distR="0" wp14:anchorId="5DF15697" wp14:editId="0E93C97B">
+          <wp:inline distT="0" distB="0" distL="0" distR="0" wp14:anchorId="7D23DA6B" wp14:editId="637F3FDE">
             <wp:extent cx="3324225" cy="2286000"/>
             <wp:effectExtent l="0" t="0" r="0" b="0"/>
             <wp:docPr id="31" name="34-data-sources-import-dialog.png" descr="The Import Tables dialog with the Discover Tables button, before any table is found." title="The Import Tables dialog with the Discover Tables button, before any table is found."/>
@@ -41515,7 +41515,7 @@
         <w:pStyle w:val="Ttulo1"/>
         <w:pageBreakBefore/>
       </w:pPr>
-      <w:bookmarkStart w:id="47" w:name="_Toc241744802"/>
+      <w:bookmarkStart w:id="47" w:name="_Toc241747642"/>
       <w:r>
         <w:lastRenderedPageBreak/>
         <w:t>Users</w:t>
@@ -41545,7 +41545,7 @@
           <w:noProof/>
         </w:rPr>
         <w:drawing>
-          <wp:inline distT="0" distB="0" distL="0" distR="0" wp14:anchorId="56A5395E" wp14:editId="1B96A225">
+          <wp:inline distT="0" distB="0" distL="0" distR="0" wp14:anchorId="23C21160" wp14:editId="67214EAA">
             <wp:extent cx="5715000" cy="3571875"/>
             <wp:effectExtent l="0" t="0" r="0" b="0"/>
             <wp:docPr id="32" name="35-users.png" descr="The Users page with the Credentials file and New User buttons and row icons." title="The Users page with the Credentials file and New User buttons and row icons."/>
@@ -42244,7 +42244,7 @@
       <w:pPr>
         <w:pStyle w:val="Ttulo2"/>
       </w:pPr>
-      <w:bookmarkStart w:id="48" w:name="_Toc241744803"/>
+      <w:bookmarkStart w:id="48" w:name="_Toc241747643"/>
       <w:r>
         <w:lastRenderedPageBreak/>
         <w:t>Create or change a user</w:t>
@@ -43082,7 +43082,7 @@
         </w:rPr>
         <w:lastRenderedPageBreak/>
         <w:drawing>
-          <wp:inline distT="0" distB="0" distL="0" distR="0" wp14:anchorId="7CD7147E" wp14:editId="623A28AC">
+          <wp:inline distT="0" distB="0" distL="0" distR="0" wp14:anchorId="03D3B1D8" wp14:editId="6B5A5607">
             <wp:extent cx="5715000" cy="3571875"/>
             <wp:effectExtent l="0" t="0" r="0" b="0"/>
             <wp:docPr id="33" name="37-users-role-open.png" descr="The New User dialog with the Role list open and each role described." title="The New User dialog with the Role list open and each role described."/>
@@ -43134,7 +43134,7 @@
       <w:pPr>
         <w:pStyle w:val="Ttulo2"/>
       </w:pPr>
-      <w:bookmarkStart w:id="49" w:name="_Toc241744804"/>
+      <w:bookmarkStart w:id="49" w:name="_Toc241747644"/>
       <w:r>
         <w:t>Deactivate, activate or delete</w:t>
       </w:r>
@@ -43226,7 +43226,7 @@
           <w:noProof/>
         </w:rPr>
         <w:drawing>
-          <wp:inline distT="0" distB="0" distL="0" distR="0" wp14:anchorId="6C3734E9" wp14:editId="1CF5B41A">
+          <wp:inline distT="0" distB="0" distL="0" distR="0" wp14:anchorId="03A32AFB" wp14:editId="25B489F8">
             <wp:extent cx="3324225" cy="1076325"/>
             <wp:effectExtent l="0" t="0" r="0" b="0"/>
             <wp:docPr id="34" name="39-users-deactivate-dialog.png" descr="The confirmation dialog shown before deactivating a user." title="The confirmation dialog shown before deactivating a user."/>
@@ -43318,7 +43318,7 @@
       <w:pPr>
         <w:pStyle w:val="Ttulo2"/>
       </w:pPr>
-      <w:bookmarkStart w:id="50" w:name="_Toc241744805"/>
+      <w:bookmarkStart w:id="50" w:name="_Toc241747645"/>
       <w:r>
         <w:t>The credentials file</w:t>
       </w:r>
@@ -43343,7 +43343,7 @@
       <w:pPr>
         <w:pStyle w:val="Ttulo2"/>
       </w:pPr>
-      <w:bookmarkStart w:id="51" w:name="_Toc241744806"/>
+      <w:bookmarkStart w:id="51" w:name="_Toc241747646"/>
       <w:r>
         <w:lastRenderedPageBreak/>
         <w:t>Maps this user can open</w:t>
@@ -43386,7 +43386,7 @@
           <w:noProof/>
         </w:rPr>
         <w:drawing>
-          <wp:inline distT="0" distB="0" distL="0" distR="0" wp14:anchorId="190AFAD3" wp14:editId="55453F07">
+          <wp:inline distT="0" distB="0" distL="0" distR="0" wp14:anchorId="1A1DBE12" wp14:editId="02117D41">
             <wp:extent cx="4362450" cy="2190750"/>
             <wp:effectExtent l="0" t="0" r="0" b="0"/>
             <wp:docPr id="35" name="41-users-maps-dialog.png" descr="The Maps dialog for a user, with source badges and share-level selects." title="The Maps dialog for a user, with source badges and share-level selects."/>
@@ -44328,7 +44328,7 @@
         <w:pStyle w:val="Ttulo1"/>
         <w:pageBreakBefore/>
       </w:pPr>
-      <w:bookmarkStart w:id="52" w:name="_Toc241744807"/>
+      <w:bookmarkStart w:id="52" w:name="_Toc241747647"/>
       <w:r>
         <w:lastRenderedPageBreak/>
         <w:t>Security Policies</w:t>
@@ -44388,7 +44388,7 @@
           <w:noProof/>
         </w:rPr>
         <w:drawing>
-          <wp:inline distT="0" distB="0" distL="0" distR="0" wp14:anchorId="5C8FC93B" wp14:editId="1327C689">
+          <wp:inline distT="0" distB="0" distL="0" distR="0" wp14:anchorId="73FEC961" wp14:editId="108072DF">
             <wp:extent cx="5715000" cy="3571875"/>
             <wp:effectExtent l="0" t="0" r="0" b="0"/>
             <wp:docPr id="36" name="43-security.png" descr="The Security Policies page with the Test and New Policy buttons." title="The Security Policies page with the Test and New Policy buttons."/>
@@ -45015,7 +45015,7 @@
       <w:pPr>
         <w:pStyle w:val="Ttulo2"/>
       </w:pPr>
-      <w:bookmarkStart w:id="53" w:name="_Toc241744808"/>
+      <w:bookmarkStart w:id="53" w:name="_Toc241747648"/>
       <w:r>
         <w:lastRenderedPageBreak/>
         <w:t>Write a policy</w:t>
@@ -46071,7 +46071,7 @@
         </w:rPr>
         <w:lastRenderedPageBreak/>
         <w:drawing>
-          <wp:inline distT="0" distB="0" distL="0" distR="0" wp14:anchorId="77F83109" wp14:editId="077E1A1D">
+          <wp:inline distT="0" distB="0" distL="0" distR="0" wp14:anchorId="2AC39D52" wp14:editId="2D771122">
             <wp:extent cx="3324225" cy="4638675"/>
             <wp:effectExtent l="0" t="0" r="0" b="0"/>
             <wp:docPr id="37" name="46-security-validate.png" descr="The New Policy dialog after pressing Validate on a predicate." title="The New Policy dialog after pressing Validate on a predicate."/>
@@ -46123,7 +46123,7 @@
       <w:pPr>
         <w:pStyle w:val="Ttulo2"/>
       </w:pPr>
-      <w:bookmarkStart w:id="54" w:name="_Toc241744809"/>
+      <w:bookmarkStart w:id="54" w:name="_Toc241747649"/>
       <w:r>
         <w:t>Assign a policy</w:t>
       </w:r>
@@ -46513,7 +46513,7 @@
       <w:pPr>
         <w:pStyle w:val="Ttulo2"/>
       </w:pPr>
-      <w:bookmarkStart w:id="55" w:name="_Toc241744810"/>
+      <w:bookmarkStart w:id="55" w:name="_Toc241747650"/>
       <w:r>
         <w:lastRenderedPageBreak/>
         <w:t>Test a policy</w:t>
@@ -46588,7 +46588,7 @@
         <w:pStyle w:val="Ttulo1"/>
         <w:pageBreakBefore/>
       </w:pPr>
-      <w:bookmarkStart w:id="56" w:name="_Toc241744811"/>
+      <w:bookmarkStart w:id="56" w:name="_Toc241747651"/>
       <w:r>
         <w:lastRenderedPageBreak/>
         <w:t>Audit Log</w:t>
@@ -46621,7 +46621,7 @@
           <w:noProof/>
         </w:rPr>
         <w:drawing>
-          <wp:inline distT="0" distB="0" distL="0" distR="0" wp14:anchorId="0BBC771F" wp14:editId="583296A9">
+          <wp:inline distT="0" distB="0" distL="0" distR="0" wp14:anchorId="4BD8FD9F" wp14:editId="5E86A669">
             <wp:extent cx="5715000" cy="3571875"/>
             <wp:effectExtent l="0" t="0" r="0" b="0"/>
             <wp:docPr id="38" name="47-audit.png" descr="The Audit Log page with export button, statistic cards, daily chart and filters." title="The Audit Log page with export button, statistic cards, daily chart and filters."/>
@@ -47482,7 +47482,7 @@
         <w:pStyle w:val="Ttulo1"/>
         <w:pageBreakBefore/>
       </w:pPr>
-      <w:bookmarkStart w:id="57" w:name="_Toc241744812"/>
+      <w:bookmarkStart w:id="57" w:name="_Toc241747652"/>
       <w:r>
         <w:lastRenderedPageBreak/>
         <w:t>Migration</w:t>
@@ -47562,7 +47562,7 @@
           <w:noProof/>
         </w:rPr>
         <w:drawing>
-          <wp:inline distT="0" distB="0" distL="0" distR="0" wp14:anchorId="27CAA64A" wp14:editId="245A3702">
+          <wp:inline distT="0" distB="0" distL="0" distR="0" wp14:anchorId="6EAAE854" wp14:editId="2D9FC4B8">
             <wp:extent cx="5715000" cy="3571875"/>
             <wp:effectExtent l="0" t="0" r="0" b="0"/>
             <wp:docPr id="39" name="50-migration.png" descr="The Migration page with the Source card, its buttons and help text." title="The Migration page with the Source card, its buttons and help text."/>
@@ -47639,7 +47639,7 @@
       <w:pPr>
         <w:pStyle w:val="Ttulo2"/>
       </w:pPr>
-      <w:bookmarkStart w:id="58" w:name="_Toc241744813"/>
+      <w:bookmarkStart w:id="58" w:name="_Toc241747653"/>
       <w:r>
         <w:t>Choose the source</w:t>
       </w:r>
@@ -48760,7 +48760,7 @@
       <w:pPr>
         <w:pStyle w:val="Ttulo2"/>
       </w:pPr>
-      <w:bookmarkStart w:id="59" w:name="_Toc241744814"/>
+      <w:bookmarkStart w:id="59" w:name="_Toc241747654"/>
       <w:r>
         <w:t>What each action does</w:t>
       </w:r>
@@ -49161,7 +49161,7 @@
       <w:pPr>
         <w:pStyle w:val="Ttulo2"/>
       </w:pPr>
-      <w:bookmarkStart w:id="60" w:name="_Toc241744815"/>
+      <w:bookmarkStart w:id="60" w:name="_Toc241747655"/>
       <w:r>
         <w:t>Do a migration safely</w:t>
       </w:r>
@@ -49403,7 +49403,7 @@
         <w:pStyle w:val="Ttulo1"/>
         <w:pageBreakBefore/>
       </w:pPr>
-      <w:bookmarkStart w:id="61" w:name="_Toc241744816"/>
+      <w:bookmarkStart w:id="61" w:name="_Toc241747656"/>
       <w:r>
         <w:lastRenderedPageBreak/>
         <w:t>Common questions</w:t>
@@ -49694,7 +49694,7 @@
       <w:pPr>
         <w:pStyle w:val="Ttulo2"/>
       </w:pPr>
-      <w:bookmarkStart w:id="62" w:name="_Toc241744817"/>
+      <w:bookmarkStart w:id="62" w:name="_Toc241747657"/>
       <w:r>
         <w:t>Glossary</w:t>
       </w:r>
@@ -51019,7 +51019,7 @@
         <w:sz w:val="16"/>
         <w:szCs w:val="16"/>
       </w:rPr>
-      <w:t>Discoverer Neo 2.1.0 · Complete guide · ADMIN</w:t>
+      <w:t>Discoverer Neo 2.1.1 · Complete guide · ADMIN</w:t>
     </w:r>
   </w:p>
 </w:hdr>
@@ -51028,68 +51028,10 @@
 <file path=word/numbering.xml><?xml version="1.0" encoding="utf-8"?>
 <w:numbering xmlns:wpc="http://schemas.microsoft.com/office/word/2010/wordprocessingCanvas" xmlns:cx="http://schemas.microsoft.com/office/drawing/2014/chartex" xmlns:cx1="http://schemas.microsoft.com/office/drawing/2015/9/8/chartex" xmlns:cx2="http://schemas.microsoft.com/office/drawing/2015/10/21/chartex" xmlns:cx3="http://schemas.microsoft.com/office/drawing/2016/5/9/chartex" xmlns:cx4="http://schemas.microsoft.com/office/drawing/2016/5/10/chartex" xmlns:cx5="http://schemas.microsoft.com/office/drawing/2016/5/11/chartex" xmlns:cx6="http://schemas.microsoft.com/office/drawing/2016/5/12/chartex" xmlns:cx7="http://schemas.microsoft.com/office/drawing/2016/5/13/chartex" xmlns:cx8="http://schemas.microsoft.com/office/drawing/2016/5/14/chartex" xmlns:mc="http://schemas.openxmlformats.org/markup-compatibility/2006" xmlns:aink="http://schemas.microsoft.com/office/drawing/2016/ink" xmlns:am3d="http://schemas.microsoft.com/office/drawing/2017/model3d" xmlns:o="urn:schemas-microsoft-com:office:office" xmlns:oel="http://schemas.microsoft.com/office/2019/extlst" xmlns:r="http://schemas.openxmlformats.org/officeDocument/2006/relationships" xmlns:m="http://schemas.openxmlformats.org/officeDocument/2006/math" xmlns:v="urn:schemas-microsoft-com:vml" xmlns:wp14="http://schemas.microsoft.com/office/word/2010/wordprocessingDrawing" xmlns:wp="http://schemas.openxmlformats.org/drawingml/2006/wordprocessingDrawing" xmlns:w10="urn:schemas-microsoft-com:office:word" xmlns:w="http://schemas.openxmlformats.org/wordprocessingml/2006/main" xmlns:w14="http://schemas.microsoft.com/office/word/2010/wordml" xmlns:w15="http://schemas.microsoft.com/office/word/2012/wordml" xmlns:w16cex="http://schemas.microsoft.com/office/word/2018/wordml/cex" xmlns:w16cid="http://schemas.microsoft.com/office/word/2016/wordml/cid" xmlns:w16="http://schemas.microsoft.com/office/word/2018/wordml" xmlns:w16sdtdh="http://schemas.microsoft.com/office/word/2020/wordml/sdtdatahash" xmlns:w16se="http://schemas.microsoft.com/office/word/2015/wordml/symex" xmlns:wpg="http://schemas.microsoft.com/office/word/2010/wordprocessingGroup" xmlns:wpi="http://schemas.microsoft.com/office/word/2010/wordprocessingInk" xmlns:wne="http://schemas.microsoft.com/office/word/2006/wordml" xmlns:wps="http://schemas.microsoft.com/office/word/2010/wordprocessingShape" mc:Ignorable="w14 w15 w16se w16cid w16 w16cex w16sdtdh wp14">
   <w:abstractNum w:abstractNumId="0" w15:restartNumberingAfterBreak="0">
-    <w:nsid w:val="000A3B95"/>
+    <w:nsid w:val="047C2DC4"/>
     <w:multiLevelType w:val="hybridMultilevel"/>
-    <w:tmpl w:val="0C6E160C"/>
-    <w:lvl w:ilvl="0" w:tplc="27A0791C">
-      <w:start w:val="1"/>
-      <w:numFmt w:val="bullet"/>
-      <w:lvlText w:val="•"/>
-      <w:lvlJc w:val="left"/>
-      <w:pPr>
-        <w:ind w:left="360" w:hanging="260"/>
-      </w:pPr>
-    </w:lvl>
-    <w:lvl w:ilvl="1" w:tplc="BF2A25D8" w:tentative="1">
-      <w:start w:val="1"/>
-      <w:numFmt w:val="bullet"/>
-      <w:lvlText w:val="–"/>
-      <w:lvlJc w:val="left"/>
-      <w:pPr>
-        <w:ind w:left="720" w:hanging="260"/>
-      </w:pPr>
-    </w:lvl>
-    <w:lvl w:ilvl="2" w:tplc="4C06FA44">
-      <w:numFmt w:val="decimal"/>
-      <w:lvlText w:val=""/>
-      <w:lvlJc w:val="left"/>
-    </w:lvl>
-    <w:lvl w:ilvl="3" w:tplc="A092A250">
-      <w:numFmt w:val="decimal"/>
-      <w:lvlText w:val=""/>
-      <w:lvlJc w:val="left"/>
-    </w:lvl>
-    <w:lvl w:ilvl="4" w:tplc="82B863F6">
-      <w:numFmt w:val="decimal"/>
-      <w:lvlText w:val=""/>
-      <w:lvlJc w:val="left"/>
-    </w:lvl>
-    <w:lvl w:ilvl="5" w:tplc="3120FB7A">
-      <w:numFmt w:val="decimal"/>
-      <w:lvlText w:val=""/>
-      <w:lvlJc w:val="left"/>
-    </w:lvl>
-    <w:lvl w:ilvl="6" w:tplc="0DCCC998">
-      <w:numFmt w:val="decimal"/>
-      <w:lvlText w:val=""/>
-      <w:lvlJc w:val="left"/>
-    </w:lvl>
-    <w:lvl w:ilvl="7" w:tplc="872E6174">
-      <w:numFmt w:val="decimal"/>
-      <w:lvlText w:val=""/>
-      <w:lvlJc w:val="left"/>
-    </w:lvl>
-    <w:lvl w:ilvl="8" w:tplc="2B26BB3A">
-      <w:numFmt w:val="decimal"/>
-      <w:lvlText w:val=""/>
-      <w:lvlJc w:val="left"/>
-    </w:lvl>
-  </w:abstractNum>
-  <w:abstractNum w:abstractNumId="1" w15:restartNumberingAfterBreak="0">
-    <w:nsid w:val="06372B3E"/>
-    <w:multiLevelType w:val="hybridMultilevel"/>
-    <w:tmpl w:val="57B04D62"/>
-    <w:lvl w:ilvl="0" w:tplc="120CC996">
+    <w:tmpl w:val="CA6664E0"/>
+    <w:lvl w:ilvl="0" w:tplc="59069396">
       <w:start w:val="1"/>
       <w:numFmt w:val="decimal"/>
       <w:lvlText w:val="%1."/>
@@ -51098,7 +51040,7 @@
         <w:ind w:left="360" w:hanging="300"/>
       </w:pPr>
     </w:lvl>
-    <w:lvl w:ilvl="1" w:tplc="F872F6EC" w:tentative="1">
+    <w:lvl w:ilvl="1" w:tplc="906ACC4A" w:tentative="1">
       <w:start w:val="1"/>
       <w:numFmt w:val="lowerLetter"/>
       <w:lvlText w:val="%2."/>
@@ -51107,337 +51049,47 @@
         <w:ind w:left="720" w:hanging="300"/>
       </w:pPr>
     </w:lvl>
-    <w:lvl w:ilvl="2" w:tplc="6B0ABF76">
+    <w:lvl w:ilvl="2" w:tplc="ED882F9C">
       <w:numFmt w:val="decimal"/>
       <w:lvlText w:val=""/>
       <w:lvlJc w:val="left"/>
     </w:lvl>
-    <w:lvl w:ilvl="3" w:tplc="862608A6">
+    <w:lvl w:ilvl="3" w:tplc="01649CCC">
       <w:numFmt w:val="decimal"/>
       <w:lvlText w:val=""/>
       <w:lvlJc w:val="left"/>
     </w:lvl>
-    <w:lvl w:ilvl="4" w:tplc="0E841872">
+    <w:lvl w:ilvl="4" w:tplc="E92AA726">
       <w:numFmt w:val="decimal"/>
       <w:lvlText w:val=""/>
       <w:lvlJc w:val="left"/>
     </w:lvl>
-    <w:lvl w:ilvl="5" w:tplc="345C1D6C">
+    <w:lvl w:ilvl="5" w:tplc="0E76120E">
       <w:numFmt w:val="decimal"/>
       <w:lvlText w:val=""/>
       <w:lvlJc w:val="left"/>
     </w:lvl>
-    <w:lvl w:ilvl="6" w:tplc="027CC326">
+    <w:lvl w:ilvl="6" w:tplc="FDD2EB96">
       <w:numFmt w:val="decimal"/>
       <w:lvlText w:val=""/>
       <w:lvlJc w:val="left"/>
     </w:lvl>
-    <w:lvl w:ilvl="7" w:tplc="3212279C">
+    <w:lvl w:ilvl="7" w:tplc="718A2976">
       <w:numFmt w:val="decimal"/>
       <w:lvlText w:val=""/>
       <w:lvlJc w:val="left"/>
     </w:lvl>
-    <w:lvl w:ilvl="8" w:tplc="F4B434F8">
+    <w:lvl w:ilvl="8" w:tplc="1A22FF72">
       <w:numFmt w:val="decimal"/>
       <w:lvlText w:val=""/>
       <w:lvlJc w:val="left"/>
     </w:lvl>
   </w:abstractNum>
-  <w:abstractNum w:abstractNumId="2" w15:restartNumberingAfterBreak="0">
-    <w:nsid w:val="154C4512"/>
+  <w:abstractNum w:abstractNumId="1" w15:restartNumberingAfterBreak="0">
+    <w:nsid w:val="1A1B2F5A"/>
     <w:multiLevelType w:val="hybridMultilevel"/>
-    <w:tmpl w:val="054A3B68"/>
-    <w:lvl w:ilvl="0" w:tplc="7F183D00">
-      <w:start w:val="1"/>
-      <w:numFmt w:val="decimal"/>
-      <w:lvlText w:val="%1."/>
-      <w:lvlJc w:val="left"/>
-      <w:pPr>
-        <w:ind w:left="360" w:hanging="300"/>
-      </w:pPr>
-    </w:lvl>
-    <w:lvl w:ilvl="1" w:tplc="A99E99B6" w:tentative="1">
-      <w:start w:val="1"/>
-      <w:numFmt w:val="lowerLetter"/>
-      <w:lvlText w:val="%2."/>
-      <w:lvlJc w:val="left"/>
-      <w:pPr>
-        <w:ind w:left="720" w:hanging="300"/>
-      </w:pPr>
-    </w:lvl>
-    <w:lvl w:ilvl="2" w:tplc="4A3081EC">
-      <w:numFmt w:val="decimal"/>
-      <w:lvlText w:val=""/>
-      <w:lvlJc w:val="left"/>
-    </w:lvl>
-    <w:lvl w:ilvl="3" w:tplc="A1ACBD2C">
-      <w:numFmt w:val="decimal"/>
-      <w:lvlText w:val=""/>
-      <w:lvlJc w:val="left"/>
-    </w:lvl>
-    <w:lvl w:ilvl="4" w:tplc="BBCC0C1C">
-      <w:numFmt w:val="decimal"/>
-      <w:lvlText w:val=""/>
-      <w:lvlJc w:val="left"/>
-    </w:lvl>
-    <w:lvl w:ilvl="5" w:tplc="DD2433C2">
-      <w:numFmt w:val="decimal"/>
-      <w:lvlText w:val=""/>
-      <w:lvlJc w:val="left"/>
-    </w:lvl>
-    <w:lvl w:ilvl="6" w:tplc="F45C3706">
-      <w:numFmt w:val="decimal"/>
-      <w:lvlText w:val=""/>
-      <w:lvlJc w:val="left"/>
-    </w:lvl>
-    <w:lvl w:ilvl="7" w:tplc="2EF85C4E">
-      <w:numFmt w:val="decimal"/>
-      <w:lvlText w:val=""/>
-      <w:lvlJc w:val="left"/>
-    </w:lvl>
-    <w:lvl w:ilvl="8" w:tplc="B7887C80">
-      <w:numFmt w:val="decimal"/>
-      <w:lvlText w:val=""/>
-      <w:lvlJc w:val="left"/>
-    </w:lvl>
-  </w:abstractNum>
-  <w:abstractNum w:abstractNumId="3" w15:restartNumberingAfterBreak="0">
-    <w:nsid w:val="18761780"/>
-    <w:multiLevelType w:val="hybridMultilevel"/>
-    <w:tmpl w:val="794E173A"/>
-    <w:lvl w:ilvl="0" w:tplc="5F12BBD8">
-      <w:start w:val="1"/>
-      <w:numFmt w:val="decimal"/>
-      <w:lvlText w:val="%1."/>
-      <w:lvlJc w:val="left"/>
-      <w:pPr>
-        <w:ind w:left="360" w:hanging="300"/>
-      </w:pPr>
-    </w:lvl>
-    <w:lvl w:ilvl="1" w:tplc="FE745D40" w:tentative="1">
-      <w:start w:val="1"/>
-      <w:numFmt w:val="lowerLetter"/>
-      <w:lvlText w:val="%2."/>
-      <w:lvlJc w:val="left"/>
-      <w:pPr>
-        <w:ind w:left="720" w:hanging="300"/>
-      </w:pPr>
-    </w:lvl>
-    <w:lvl w:ilvl="2" w:tplc="C27CCA9C">
-      <w:numFmt w:val="decimal"/>
-      <w:lvlText w:val=""/>
-      <w:lvlJc w:val="left"/>
-    </w:lvl>
-    <w:lvl w:ilvl="3" w:tplc="42A6554A">
-      <w:numFmt w:val="decimal"/>
-      <w:lvlText w:val=""/>
-      <w:lvlJc w:val="left"/>
-    </w:lvl>
-    <w:lvl w:ilvl="4" w:tplc="91D4FFA6">
-      <w:numFmt w:val="decimal"/>
-      <w:lvlText w:val=""/>
-      <w:lvlJc w:val="left"/>
-    </w:lvl>
-    <w:lvl w:ilvl="5" w:tplc="269EE976">
-      <w:numFmt w:val="decimal"/>
-      <w:lvlText w:val=""/>
-      <w:lvlJc w:val="left"/>
-    </w:lvl>
-    <w:lvl w:ilvl="6" w:tplc="F692CAB2">
-      <w:numFmt w:val="decimal"/>
-      <w:lvlText w:val=""/>
-      <w:lvlJc w:val="left"/>
-    </w:lvl>
-    <w:lvl w:ilvl="7" w:tplc="B802D918">
-      <w:numFmt w:val="decimal"/>
-      <w:lvlText w:val=""/>
-      <w:lvlJc w:val="left"/>
-    </w:lvl>
-    <w:lvl w:ilvl="8" w:tplc="F964095C">
-      <w:numFmt w:val="decimal"/>
-      <w:lvlText w:val=""/>
-      <w:lvlJc w:val="left"/>
-    </w:lvl>
-  </w:abstractNum>
-  <w:abstractNum w:abstractNumId="4" w15:restartNumberingAfterBreak="0">
-    <w:nsid w:val="2B6E52BC"/>
-    <w:multiLevelType w:val="hybridMultilevel"/>
-    <w:tmpl w:val="8B861758"/>
-    <w:lvl w:ilvl="0" w:tplc="1486CC74">
-      <w:start w:val="1"/>
-      <w:numFmt w:val="decimal"/>
-      <w:lvlText w:val="%1."/>
-      <w:lvlJc w:val="left"/>
-      <w:pPr>
-        <w:ind w:left="360" w:hanging="300"/>
-      </w:pPr>
-    </w:lvl>
-    <w:lvl w:ilvl="1" w:tplc="28BC0FA0" w:tentative="1">
-      <w:start w:val="1"/>
-      <w:numFmt w:val="lowerLetter"/>
-      <w:lvlText w:val="%2."/>
-      <w:lvlJc w:val="left"/>
-      <w:pPr>
-        <w:ind w:left="720" w:hanging="300"/>
-      </w:pPr>
-    </w:lvl>
-    <w:lvl w:ilvl="2" w:tplc="D00AB7CE">
-      <w:numFmt w:val="decimal"/>
-      <w:lvlText w:val=""/>
-      <w:lvlJc w:val="left"/>
-    </w:lvl>
-    <w:lvl w:ilvl="3" w:tplc="0BA6414E">
-      <w:numFmt w:val="decimal"/>
-      <w:lvlText w:val=""/>
-      <w:lvlJc w:val="left"/>
-    </w:lvl>
-    <w:lvl w:ilvl="4" w:tplc="D8EEAACA">
-      <w:numFmt w:val="decimal"/>
-      <w:lvlText w:val=""/>
-      <w:lvlJc w:val="left"/>
-    </w:lvl>
-    <w:lvl w:ilvl="5" w:tplc="B6069E12">
-      <w:numFmt w:val="decimal"/>
-      <w:lvlText w:val=""/>
-      <w:lvlJc w:val="left"/>
-    </w:lvl>
-    <w:lvl w:ilvl="6" w:tplc="9A4CF6EE">
-      <w:numFmt w:val="decimal"/>
-      <w:lvlText w:val=""/>
-      <w:lvlJc w:val="left"/>
-    </w:lvl>
-    <w:lvl w:ilvl="7" w:tplc="AAE6BBAE">
-      <w:numFmt w:val="decimal"/>
-      <w:lvlText w:val=""/>
-      <w:lvlJc w:val="left"/>
-    </w:lvl>
-    <w:lvl w:ilvl="8" w:tplc="8702E882">
-      <w:numFmt w:val="decimal"/>
-      <w:lvlText w:val=""/>
-      <w:lvlJc w:val="left"/>
-    </w:lvl>
-  </w:abstractNum>
-  <w:abstractNum w:abstractNumId="5" w15:restartNumberingAfterBreak="0">
-    <w:nsid w:val="2E0F3B49"/>
-    <w:multiLevelType w:val="hybridMultilevel"/>
-    <w:tmpl w:val="1D3A7A7A"/>
-    <w:lvl w:ilvl="0" w:tplc="2A7C59C8">
-      <w:start w:val="1"/>
-      <w:numFmt w:val="decimal"/>
-      <w:lvlText w:val="%1."/>
-      <w:lvlJc w:val="left"/>
-      <w:pPr>
-        <w:ind w:left="360" w:hanging="300"/>
-      </w:pPr>
-    </w:lvl>
-    <w:lvl w:ilvl="1" w:tplc="E2E02936" w:tentative="1">
-      <w:start w:val="1"/>
-      <w:numFmt w:val="lowerLetter"/>
-      <w:lvlText w:val="%2."/>
-      <w:lvlJc w:val="left"/>
-      <w:pPr>
-        <w:ind w:left="720" w:hanging="300"/>
-      </w:pPr>
-    </w:lvl>
-    <w:lvl w:ilvl="2" w:tplc="4FF6E290">
-      <w:numFmt w:val="decimal"/>
-      <w:lvlText w:val=""/>
-      <w:lvlJc w:val="left"/>
-    </w:lvl>
-    <w:lvl w:ilvl="3" w:tplc="5DA61F30">
-      <w:numFmt w:val="decimal"/>
-      <w:lvlText w:val=""/>
-      <w:lvlJc w:val="left"/>
-    </w:lvl>
-    <w:lvl w:ilvl="4" w:tplc="F21CB066">
-      <w:numFmt w:val="decimal"/>
-      <w:lvlText w:val=""/>
-      <w:lvlJc w:val="left"/>
-    </w:lvl>
-    <w:lvl w:ilvl="5" w:tplc="E452AEDC">
-      <w:numFmt w:val="decimal"/>
-      <w:lvlText w:val=""/>
-      <w:lvlJc w:val="left"/>
-    </w:lvl>
-    <w:lvl w:ilvl="6" w:tplc="C8E0BAAC">
-      <w:numFmt w:val="decimal"/>
-      <w:lvlText w:val=""/>
-      <w:lvlJc w:val="left"/>
-    </w:lvl>
-    <w:lvl w:ilvl="7" w:tplc="DEF4F112">
-      <w:numFmt w:val="decimal"/>
-      <w:lvlText w:val=""/>
-      <w:lvlJc w:val="left"/>
-    </w:lvl>
-    <w:lvl w:ilvl="8" w:tplc="C7E40A34">
-      <w:numFmt w:val="decimal"/>
-      <w:lvlText w:val=""/>
-      <w:lvlJc w:val="left"/>
-    </w:lvl>
-  </w:abstractNum>
-  <w:abstractNum w:abstractNumId="6" w15:restartNumberingAfterBreak="0">
-    <w:nsid w:val="31AA13E0"/>
-    <w:multiLevelType w:val="hybridMultilevel"/>
-    <w:tmpl w:val="66728790"/>
-    <w:lvl w:ilvl="0" w:tplc="29CE42AA">
-      <w:start w:val="1"/>
-      <w:numFmt w:val="decimal"/>
-      <w:lvlText w:val="%1."/>
-      <w:lvlJc w:val="left"/>
-      <w:pPr>
-        <w:ind w:left="360" w:hanging="300"/>
-      </w:pPr>
-    </w:lvl>
-    <w:lvl w:ilvl="1" w:tplc="DBC0E6EA" w:tentative="1">
-      <w:start w:val="1"/>
-      <w:numFmt w:val="lowerLetter"/>
-      <w:lvlText w:val="%2."/>
-      <w:lvlJc w:val="left"/>
-      <w:pPr>
-        <w:ind w:left="720" w:hanging="300"/>
-      </w:pPr>
-    </w:lvl>
-    <w:lvl w:ilvl="2" w:tplc="1ED073E0">
-      <w:numFmt w:val="decimal"/>
-      <w:lvlText w:val=""/>
-      <w:lvlJc w:val="left"/>
-    </w:lvl>
-    <w:lvl w:ilvl="3" w:tplc="CE0C4D78">
-      <w:numFmt w:val="decimal"/>
-      <w:lvlText w:val=""/>
-      <w:lvlJc w:val="left"/>
-    </w:lvl>
-    <w:lvl w:ilvl="4" w:tplc="722C99BE">
-      <w:numFmt w:val="decimal"/>
-      <w:lvlText w:val=""/>
-      <w:lvlJc w:val="left"/>
-    </w:lvl>
-    <w:lvl w:ilvl="5" w:tplc="B04615B8">
-      <w:numFmt w:val="decimal"/>
-      <w:lvlText w:val=""/>
-      <w:lvlJc w:val="left"/>
-    </w:lvl>
-    <w:lvl w:ilvl="6" w:tplc="B40CA3B4">
-      <w:numFmt w:val="decimal"/>
-      <w:lvlText w:val=""/>
-      <w:lvlJc w:val="left"/>
-    </w:lvl>
-    <w:lvl w:ilvl="7" w:tplc="A372C8A8">
-      <w:numFmt w:val="decimal"/>
-      <w:lvlText w:val=""/>
-      <w:lvlJc w:val="left"/>
-    </w:lvl>
-    <w:lvl w:ilvl="8" w:tplc="66C4F50A">
-      <w:numFmt w:val="decimal"/>
-      <w:lvlText w:val=""/>
-      <w:lvlJc w:val="left"/>
-    </w:lvl>
-  </w:abstractNum>
-  <w:abstractNum w:abstractNumId="7" w15:restartNumberingAfterBreak="0">
-    <w:nsid w:val="337A13B5"/>
-    <w:multiLevelType w:val="hybridMultilevel"/>
-    <w:tmpl w:val="943E79AC"/>
-    <w:lvl w:ilvl="0" w:tplc="384E6F70" w:tentative="1">
+    <w:tmpl w:val="8A6498D8"/>
+    <w:lvl w:ilvl="0" w:tplc="04EC1F2C" w:tentative="1">
       <w:start w:val="1"/>
       <w:numFmt w:val="bullet"/>
       <w:lvlText w:val="●"/>
@@ -51446,7 +51098,7 @@
         <w:ind w:left="720" w:hanging="360"/>
       </w:pPr>
     </w:lvl>
-    <w:lvl w:ilvl="1" w:tplc="A268045E" w:tentative="1">
+    <w:lvl w:ilvl="1" w:tplc="3FC8260A" w:tentative="1">
       <w:start w:val="1"/>
       <w:numFmt w:val="bullet"/>
       <w:lvlText w:val="○"/>
@@ -51455,7 +51107,7 @@
         <w:ind w:left="1440" w:hanging="360"/>
       </w:pPr>
     </w:lvl>
-    <w:lvl w:ilvl="2" w:tplc="087E2082" w:tentative="1">
+    <w:lvl w:ilvl="2" w:tplc="C4BE36DE" w:tentative="1">
       <w:start w:val="1"/>
       <w:numFmt w:val="bullet"/>
       <w:lvlText w:val="■"/>
@@ -51464,7 +51116,7 @@
         <w:ind w:left="2160" w:hanging="360"/>
       </w:pPr>
     </w:lvl>
-    <w:lvl w:ilvl="3" w:tplc="6C2EA2D8" w:tentative="1">
+    <w:lvl w:ilvl="3" w:tplc="3CF4F110" w:tentative="1">
       <w:start w:val="1"/>
       <w:numFmt w:val="bullet"/>
       <w:lvlText w:val="●"/>
@@ -51473,7 +51125,7 @@
         <w:ind w:left="2880" w:hanging="360"/>
       </w:pPr>
     </w:lvl>
-    <w:lvl w:ilvl="4" w:tplc="DBACD530" w:tentative="1">
+    <w:lvl w:ilvl="4" w:tplc="AD88AEE2" w:tentative="1">
       <w:start w:val="1"/>
       <w:numFmt w:val="bullet"/>
       <w:lvlText w:val="○"/>
@@ -51482,7 +51134,7 @@
         <w:ind w:left="3600" w:hanging="360"/>
       </w:pPr>
     </w:lvl>
-    <w:lvl w:ilvl="5" w:tplc="19AA0CB0" w:tentative="1">
+    <w:lvl w:ilvl="5" w:tplc="7F183138" w:tentative="1">
       <w:start w:val="1"/>
       <w:numFmt w:val="bullet"/>
       <w:lvlText w:val="■"/>
@@ -51491,7 +51143,7 @@
         <w:ind w:left="4320" w:hanging="360"/>
       </w:pPr>
     </w:lvl>
-    <w:lvl w:ilvl="6" w:tplc="194A9FA8" w:tentative="1">
+    <w:lvl w:ilvl="6" w:tplc="936E4C90" w:tentative="1">
       <w:start w:val="1"/>
       <w:numFmt w:val="bullet"/>
       <w:lvlText w:val="●"/>
@@ -51500,7 +51152,7 @@
         <w:ind w:left="5040" w:hanging="360"/>
       </w:pPr>
     </w:lvl>
-    <w:lvl w:ilvl="7" w:tplc="656C5440" w:tentative="1">
+    <w:lvl w:ilvl="7" w:tplc="C4707E78" w:tentative="1">
       <w:start w:val="1"/>
       <w:numFmt w:val="bullet"/>
       <w:lvlText w:val="●"/>
@@ -51509,7 +51161,7 @@
         <w:ind w:left="5760" w:hanging="360"/>
       </w:pPr>
     </w:lvl>
-    <w:lvl w:ilvl="8" w:tplc="85AA6472" w:tentative="1">
+    <w:lvl w:ilvl="8" w:tplc="65886924" w:tentative="1">
       <w:start w:val="1"/>
       <w:numFmt w:val="bullet"/>
       <w:lvlText w:val="●"/>
@@ -51519,11 +51171,11 @@
       </w:pPr>
     </w:lvl>
   </w:abstractNum>
-  <w:abstractNum w:abstractNumId="8" w15:restartNumberingAfterBreak="0">
-    <w:nsid w:val="4C0D5118"/>
+  <w:abstractNum w:abstractNumId="2" w15:restartNumberingAfterBreak="0">
+    <w:nsid w:val="1CC32520"/>
     <w:multiLevelType w:val="hybridMultilevel"/>
-    <w:tmpl w:val="85BE701A"/>
-    <w:lvl w:ilvl="0" w:tplc="1A8CAE12">
+    <w:tmpl w:val="EC0C1960"/>
+    <w:lvl w:ilvl="0" w:tplc="D8F0FABC">
       <w:start w:val="1"/>
       <w:numFmt w:val="decimal"/>
       <w:lvlText w:val="%1."/>
@@ -51532,7 +51184,7 @@
         <w:ind w:left="360" w:hanging="300"/>
       </w:pPr>
     </w:lvl>
-    <w:lvl w:ilvl="1" w:tplc="56207936" w:tentative="1">
+    <w:lvl w:ilvl="1" w:tplc="A30CAF7C" w:tentative="1">
       <w:start w:val="1"/>
       <w:numFmt w:val="lowerLetter"/>
       <w:lvlText w:val="%2."/>
@@ -51541,47 +51193,47 @@
         <w:ind w:left="720" w:hanging="300"/>
       </w:pPr>
     </w:lvl>
-    <w:lvl w:ilvl="2" w:tplc="76924772">
+    <w:lvl w:ilvl="2" w:tplc="B92AFF8C">
       <w:numFmt w:val="decimal"/>
       <w:lvlText w:val=""/>
       <w:lvlJc w:val="left"/>
     </w:lvl>
-    <w:lvl w:ilvl="3" w:tplc="39748430">
+    <w:lvl w:ilvl="3" w:tplc="59E660B0">
       <w:numFmt w:val="decimal"/>
       <w:lvlText w:val=""/>
       <w:lvlJc w:val="left"/>
     </w:lvl>
-    <w:lvl w:ilvl="4" w:tplc="89A0272C">
+    <w:lvl w:ilvl="4" w:tplc="95660604">
       <w:numFmt w:val="decimal"/>
       <w:lvlText w:val=""/>
       <w:lvlJc w:val="left"/>
     </w:lvl>
-    <w:lvl w:ilvl="5" w:tplc="1CFC3A26">
+    <w:lvl w:ilvl="5" w:tplc="14AA3276">
       <w:numFmt w:val="decimal"/>
       <w:lvlText w:val=""/>
       <w:lvlJc w:val="left"/>
     </w:lvl>
-    <w:lvl w:ilvl="6" w:tplc="26423CBA">
+    <w:lvl w:ilvl="6" w:tplc="3BE29996">
       <w:numFmt w:val="decimal"/>
       <w:lvlText w:val=""/>
       <w:lvlJc w:val="left"/>
     </w:lvl>
-    <w:lvl w:ilvl="7" w:tplc="FD26242E">
+    <w:lvl w:ilvl="7" w:tplc="A5B48332">
       <w:numFmt w:val="decimal"/>
       <w:lvlText w:val=""/>
       <w:lvlJc w:val="left"/>
     </w:lvl>
-    <w:lvl w:ilvl="8" w:tplc="44FCE5AA">
+    <w:lvl w:ilvl="8" w:tplc="B58A21B0">
       <w:numFmt w:val="decimal"/>
       <w:lvlText w:val=""/>
       <w:lvlJc w:val="left"/>
     </w:lvl>
   </w:abstractNum>
-  <w:abstractNum w:abstractNumId="9" w15:restartNumberingAfterBreak="0">
-    <w:nsid w:val="53082EF1"/>
+  <w:abstractNum w:abstractNumId="3" w15:restartNumberingAfterBreak="0">
+    <w:nsid w:val="30D63602"/>
     <w:multiLevelType w:val="hybridMultilevel"/>
-    <w:tmpl w:val="1DB2ADEE"/>
-    <w:lvl w:ilvl="0" w:tplc="2F2C1204">
+    <w:tmpl w:val="315AC9A6"/>
+    <w:lvl w:ilvl="0" w:tplc="9EACB524">
       <w:start w:val="1"/>
       <w:numFmt w:val="decimal"/>
       <w:lvlText w:val="%1."/>
@@ -51590,7 +51242,7 @@
         <w:ind w:left="360" w:hanging="300"/>
       </w:pPr>
     </w:lvl>
-    <w:lvl w:ilvl="1" w:tplc="89C619AE" w:tentative="1">
+    <w:lvl w:ilvl="1" w:tplc="CBFADF66" w:tentative="1">
       <w:start w:val="1"/>
       <w:numFmt w:val="lowerLetter"/>
       <w:lvlText w:val="%2."/>
@@ -51599,47 +51251,105 @@
         <w:ind w:left="720" w:hanging="300"/>
       </w:pPr>
     </w:lvl>
-    <w:lvl w:ilvl="2" w:tplc="6CF0B072">
+    <w:lvl w:ilvl="2" w:tplc="00842AD2">
       <w:numFmt w:val="decimal"/>
       <w:lvlText w:val=""/>
       <w:lvlJc w:val="left"/>
     </w:lvl>
-    <w:lvl w:ilvl="3" w:tplc="71207B64">
+    <w:lvl w:ilvl="3" w:tplc="28967D4A">
       <w:numFmt w:val="decimal"/>
       <w:lvlText w:val=""/>
       <w:lvlJc w:val="left"/>
     </w:lvl>
-    <w:lvl w:ilvl="4" w:tplc="25988810">
+    <w:lvl w:ilvl="4" w:tplc="0F4E7C92">
       <w:numFmt w:val="decimal"/>
       <w:lvlText w:val=""/>
       <w:lvlJc w:val="left"/>
     </w:lvl>
-    <w:lvl w:ilvl="5" w:tplc="4EAED146">
+    <w:lvl w:ilvl="5" w:tplc="4D484EB6">
       <w:numFmt w:val="decimal"/>
       <w:lvlText w:val=""/>
       <w:lvlJc w:val="left"/>
     </w:lvl>
-    <w:lvl w:ilvl="6" w:tplc="2400738C">
+    <w:lvl w:ilvl="6" w:tplc="FC28458C">
       <w:numFmt w:val="decimal"/>
       <w:lvlText w:val=""/>
       <w:lvlJc w:val="left"/>
     </w:lvl>
-    <w:lvl w:ilvl="7" w:tplc="61EC2CD2">
+    <w:lvl w:ilvl="7" w:tplc="96BAE7E6">
       <w:numFmt w:val="decimal"/>
       <w:lvlText w:val=""/>
       <w:lvlJc w:val="left"/>
     </w:lvl>
-    <w:lvl w:ilvl="8" w:tplc="C6B47C02">
+    <w:lvl w:ilvl="8" w:tplc="DF263386">
       <w:numFmt w:val="decimal"/>
       <w:lvlText w:val=""/>
       <w:lvlJc w:val="left"/>
     </w:lvl>
   </w:abstractNum>
-  <w:abstractNum w:abstractNumId="10" w15:restartNumberingAfterBreak="0">
-    <w:nsid w:val="5B896576"/>
+  <w:abstractNum w:abstractNumId="4" w15:restartNumberingAfterBreak="0">
+    <w:nsid w:val="325B0F4E"/>
     <w:multiLevelType w:val="hybridMultilevel"/>
-    <w:tmpl w:val="56A4600E"/>
-    <w:lvl w:ilvl="0" w:tplc="94341232">
+    <w:tmpl w:val="C1BA799C"/>
+    <w:lvl w:ilvl="0" w:tplc="B2B2D5A0">
+      <w:start w:val="1"/>
+      <w:numFmt w:val="bullet"/>
+      <w:lvlText w:val="•"/>
+      <w:lvlJc w:val="left"/>
+      <w:pPr>
+        <w:ind w:left="360" w:hanging="260"/>
+      </w:pPr>
+    </w:lvl>
+    <w:lvl w:ilvl="1" w:tplc="D958A342" w:tentative="1">
+      <w:start w:val="1"/>
+      <w:numFmt w:val="bullet"/>
+      <w:lvlText w:val="–"/>
+      <w:lvlJc w:val="left"/>
+      <w:pPr>
+        <w:ind w:left="720" w:hanging="260"/>
+      </w:pPr>
+    </w:lvl>
+    <w:lvl w:ilvl="2" w:tplc="AF944C4E">
+      <w:numFmt w:val="decimal"/>
+      <w:lvlText w:val=""/>
+      <w:lvlJc w:val="left"/>
+    </w:lvl>
+    <w:lvl w:ilvl="3" w:tplc="D31A0A8A">
+      <w:numFmt w:val="decimal"/>
+      <w:lvlText w:val=""/>
+      <w:lvlJc w:val="left"/>
+    </w:lvl>
+    <w:lvl w:ilvl="4" w:tplc="C6CC2868">
+      <w:numFmt w:val="decimal"/>
+      <w:lvlText w:val=""/>
+      <w:lvlJc w:val="left"/>
+    </w:lvl>
+    <w:lvl w:ilvl="5" w:tplc="9A5A06EC">
+      <w:numFmt w:val="decimal"/>
+      <w:lvlText w:val=""/>
+      <w:lvlJc w:val="left"/>
+    </w:lvl>
+    <w:lvl w:ilvl="6" w:tplc="CF7698DA">
+      <w:numFmt w:val="decimal"/>
+      <w:lvlText w:val=""/>
+      <w:lvlJc w:val="left"/>
+    </w:lvl>
+    <w:lvl w:ilvl="7" w:tplc="925411B8">
+      <w:numFmt w:val="decimal"/>
+      <w:lvlText w:val=""/>
+      <w:lvlJc w:val="left"/>
+    </w:lvl>
+    <w:lvl w:ilvl="8" w:tplc="3C0E2ED6">
+      <w:numFmt w:val="decimal"/>
+      <w:lvlText w:val=""/>
+      <w:lvlJc w:val="left"/>
+    </w:lvl>
+  </w:abstractNum>
+  <w:abstractNum w:abstractNumId="5" w15:restartNumberingAfterBreak="0">
+    <w:nsid w:val="356635C5"/>
+    <w:multiLevelType w:val="hybridMultilevel"/>
+    <w:tmpl w:val="EF52B4B4"/>
+    <w:lvl w:ilvl="0" w:tplc="DFE4AB82">
       <w:start w:val="1"/>
       <w:numFmt w:val="decimal"/>
       <w:lvlText w:val="%1."/>
@@ -51648,7 +51358,7 @@
         <w:ind w:left="360" w:hanging="300"/>
       </w:pPr>
     </w:lvl>
-    <w:lvl w:ilvl="1" w:tplc="8B7CBA88" w:tentative="1">
+    <w:lvl w:ilvl="1" w:tplc="42F8ADD8" w:tentative="1">
       <w:start w:val="1"/>
       <w:numFmt w:val="lowerLetter"/>
       <w:lvlText w:val="%2."/>
@@ -51657,47 +51367,47 @@
         <w:ind w:left="720" w:hanging="300"/>
       </w:pPr>
     </w:lvl>
-    <w:lvl w:ilvl="2" w:tplc="90D608AC">
+    <w:lvl w:ilvl="2" w:tplc="B86EC91E">
       <w:numFmt w:val="decimal"/>
       <w:lvlText w:val=""/>
       <w:lvlJc w:val="left"/>
     </w:lvl>
-    <w:lvl w:ilvl="3" w:tplc="22C676AE">
+    <w:lvl w:ilvl="3" w:tplc="03702EEC">
       <w:numFmt w:val="decimal"/>
       <w:lvlText w:val=""/>
       <w:lvlJc w:val="left"/>
     </w:lvl>
-    <w:lvl w:ilvl="4" w:tplc="6A1C4570">
+    <w:lvl w:ilvl="4" w:tplc="7EE201EA">
       <w:numFmt w:val="decimal"/>
       <w:lvlText w:val=""/>
       <w:lvlJc w:val="left"/>
     </w:lvl>
-    <w:lvl w:ilvl="5" w:tplc="3A24F1E4">
+    <w:lvl w:ilvl="5" w:tplc="A808D3FE">
       <w:numFmt w:val="decimal"/>
       <w:lvlText w:val=""/>
       <w:lvlJc w:val="left"/>
     </w:lvl>
-    <w:lvl w:ilvl="6" w:tplc="5CE648A8">
+    <w:lvl w:ilvl="6" w:tplc="65284D62">
       <w:numFmt w:val="decimal"/>
       <w:lvlText w:val=""/>
       <w:lvlJc w:val="left"/>
     </w:lvl>
-    <w:lvl w:ilvl="7" w:tplc="EC6EC164">
+    <w:lvl w:ilvl="7" w:tplc="0A56D178">
       <w:numFmt w:val="decimal"/>
       <w:lvlText w:val=""/>
       <w:lvlJc w:val="left"/>
     </w:lvl>
-    <w:lvl w:ilvl="8" w:tplc="A154ADB4">
+    <w:lvl w:ilvl="8" w:tplc="8C7E2D58">
       <w:numFmt w:val="decimal"/>
       <w:lvlText w:val=""/>
       <w:lvlJc w:val="left"/>
     </w:lvl>
   </w:abstractNum>
-  <w:abstractNum w:abstractNumId="11" w15:restartNumberingAfterBreak="0">
-    <w:nsid w:val="6D390398"/>
+  <w:abstractNum w:abstractNumId="6" w15:restartNumberingAfterBreak="0">
+    <w:nsid w:val="35AD776B"/>
     <w:multiLevelType w:val="hybridMultilevel"/>
-    <w:tmpl w:val="23FE2E34"/>
-    <w:lvl w:ilvl="0" w:tplc="DA965316">
+    <w:tmpl w:val="05A88066"/>
+    <w:lvl w:ilvl="0" w:tplc="293C659C">
       <w:start w:val="1"/>
       <w:numFmt w:val="decimal"/>
       <w:lvlText w:val="%1."/>
@@ -51706,7 +51416,7 @@
         <w:ind w:left="360" w:hanging="300"/>
       </w:pPr>
     </w:lvl>
-    <w:lvl w:ilvl="1" w:tplc="DE9A70BC" w:tentative="1">
+    <w:lvl w:ilvl="1" w:tplc="8C24E2B8" w:tentative="1">
       <w:start w:val="1"/>
       <w:numFmt w:val="lowerLetter"/>
       <w:lvlText w:val="%2."/>
@@ -51715,47 +51425,47 @@
         <w:ind w:left="720" w:hanging="300"/>
       </w:pPr>
     </w:lvl>
-    <w:lvl w:ilvl="2" w:tplc="7BF4D718">
+    <w:lvl w:ilvl="2" w:tplc="305249C6">
       <w:numFmt w:val="decimal"/>
       <w:lvlText w:val=""/>
       <w:lvlJc w:val="left"/>
     </w:lvl>
-    <w:lvl w:ilvl="3" w:tplc="368CEC6E">
+    <w:lvl w:ilvl="3" w:tplc="BA26E69A">
       <w:numFmt w:val="decimal"/>
       <w:lvlText w:val=""/>
       <w:lvlJc w:val="left"/>
     </w:lvl>
-    <w:lvl w:ilvl="4" w:tplc="CA22F0AE">
+    <w:lvl w:ilvl="4" w:tplc="32740018">
       <w:numFmt w:val="decimal"/>
       <w:lvlText w:val=""/>
       <w:lvlJc w:val="left"/>
     </w:lvl>
-    <w:lvl w:ilvl="5" w:tplc="FAD0BD24">
+    <w:lvl w:ilvl="5" w:tplc="FF168A84">
       <w:numFmt w:val="decimal"/>
       <w:lvlText w:val=""/>
       <w:lvlJc w:val="left"/>
     </w:lvl>
-    <w:lvl w:ilvl="6" w:tplc="BAE22132">
+    <w:lvl w:ilvl="6" w:tplc="808027C6">
       <w:numFmt w:val="decimal"/>
       <w:lvlText w:val=""/>
       <w:lvlJc w:val="left"/>
     </w:lvl>
-    <w:lvl w:ilvl="7" w:tplc="DD3CE8A2">
+    <w:lvl w:ilvl="7" w:tplc="41EEC5AE">
       <w:numFmt w:val="decimal"/>
       <w:lvlText w:val=""/>
       <w:lvlJc w:val="left"/>
     </w:lvl>
-    <w:lvl w:ilvl="8" w:tplc="3AEA74A2">
+    <w:lvl w:ilvl="8" w:tplc="290AC53C">
       <w:numFmt w:val="decimal"/>
       <w:lvlText w:val=""/>
       <w:lvlJc w:val="left"/>
     </w:lvl>
   </w:abstractNum>
-  <w:abstractNum w:abstractNumId="12" w15:restartNumberingAfterBreak="0">
-    <w:nsid w:val="6E520012"/>
+  <w:abstractNum w:abstractNumId="7" w15:restartNumberingAfterBreak="0">
+    <w:nsid w:val="398A1041"/>
     <w:multiLevelType w:val="hybridMultilevel"/>
-    <w:tmpl w:val="9B6AAC60"/>
-    <w:lvl w:ilvl="0" w:tplc="8AD0B7CA">
+    <w:tmpl w:val="9976D304"/>
+    <w:lvl w:ilvl="0" w:tplc="D60E55AC">
       <w:start w:val="1"/>
       <w:numFmt w:val="decimal"/>
       <w:lvlText w:val="%1."/>
@@ -51764,7 +51474,7 @@
         <w:ind w:left="360" w:hanging="300"/>
       </w:pPr>
     </w:lvl>
-    <w:lvl w:ilvl="1" w:tplc="69C657DA" w:tentative="1">
+    <w:lvl w:ilvl="1" w:tplc="23D28212" w:tentative="1">
       <w:start w:val="1"/>
       <w:numFmt w:val="lowerLetter"/>
       <w:lvlText w:val="%2."/>
@@ -51773,47 +51483,47 @@
         <w:ind w:left="720" w:hanging="300"/>
       </w:pPr>
     </w:lvl>
-    <w:lvl w:ilvl="2" w:tplc="DEA0514C">
+    <w:lvl w:ilvl="2" w:tplc="840C3CDE">
       <w:numFmt w:val="decimal"/>
       <w:lvlText w:val=""/>
       <w:lvlJc w:val="left"/>
     </w:lvl>
-    <w:lvl w:ilvl="3" w:tplc="64163886">
+    <w:lvl w:ilvl="3" w:tplc="98C8D7BA">
       <w:numFmt w:val="decimal"/>
       <w:lvlText w:val=""/>
       <w:lvlJc w:val="left"/>
     </w:lvl>
-    <w:lvl w:ilvl="4" w:tplc="E0583C0E">
+    <w:lvl w:ilvl="4" w:tplc="AD005F8E">
       <w:numFmt w:val="decimal"/>
       <w:lvlText w:val=""/>
       <w:lvlJc w:val="left"/>
     </w:lvl>
-    <w:lvl w:ilvl="5" w:tplc="373C7212">
+    <w:lvl w:ilvl="5" w:tplc="2BF01FEA">
       <w:numFmt w:val="decimal"/>
       <w:lvlText w:val=""/>
       <w:lvlJc w:val="left"/>
     </w:lvl>
-    <w:lvl w:ilvl="6" w:tplc="8E5E1E96">
+    <w:lvl w:ilvl="6" w:tplc="D68EA26C">
       <w:numFmt w:val="decimal"/>
       <w:lvlText w:val=""/>
       <w:lvlJc w:val="left"/>
     </w:lvl>
-    <w:lvl w:ilvl="7" w:tplc="D1C2BF48">
+    <w:lvl w:ilvl="7" w:tplc="B734E1E2">
       <w:numFmt w:val="decimal"/>
       <w:lvlText w:val=""/>
       <w:lvlJc w:val="left"/>
     </w:lvl>
-    <w:lvl w:ilvl="8" w:tplc="B4000F54">
+    <w:lvl w:ilvl="8" w:tplc="277AD8B0">
       <w:numFmt w:val="decimal"/>
       <w:lvlText w:val=""/>
       <w:lvlJc w:val="left"/>
     </w:lvl>
   </w:abstractNum>
-  <w:abstractNum w:abstractNumId="13" w15:restartNumberingAfterBreak="0">
-    <w:nsid w:val="76A72A94"/>
+  <w:abstractNum w:abstractNumId="8" w15:restartNumberingAfterBreak="0">
+    <w:nsid w:val="442E5303"/>
     <w:multiLevelType w:val="hybridMultilevel"/>
-    <w:tmpl w:val="2F600288"/>
-    <w:lvl w:ilvl="0" w:tplc="8BE66F90">
+    <w:tmpl w:val="D564DF70"/>
+    <w:lvl w:ilvl="0" w:tplc="45785FFE">
       <w:start w:val="1"/>
       <w:numFmt w:val="decimal"/>
       <w:lvlText w:val="%1."/>
@@ -51822,7 +51532,7 @@
         <w:ind w:left="360" w:hanging="300"/>
       </w:pPr>
     </w:lvl>
-    <w:lvl w:ilvl="1" w:tplc="6B90FDDA" w:tentative="1">
+    <w:lvl w:ilvl="1" w:tplc="055C0C70" w:tentative="1">
       <w:start w:val="1"/>
       <w:numFmt w:val="lowerLetter"/>
       <w:lvlText w:val="%2."/>
@@ -51831,47 +51541,47 @@
         <w:ind w:left="720" w:hanging="300"/>
       </w:pPr>
     </w:lvl>
-    <w:lvl w:ilvl="2" w:tplc="26E8FFC6">
+    <w:lvl w:ilvl="2" w:tplc="90548FB6">
       <w:numFmt w:val="decimal"/>
       <w:lvlText w:val=""/>
       <w:lvlJc w:val="left"/>
     </w:lvl>
-    <w:lvl w:ilvl="3" w:tplc="0E9A969C">
+    <w:lvl w:ilvl="3" w:tplc="CE8C49C4">
       <w:numFmt w:val="decimal"/>
       <w:lvlText w:val=""/>
       <w:lvlJc w:val="left"/>
     </w:lvl>
-    <w:lvl w:ilvl="4" w:tplc="84BC8F64">
+    <w:lvl w:ilvl="4" w:tplc="7B5CED50">
       <w:numFmt w:val="decimal"/>
       <w:lvlText w:val=""/>
       <w:lvlJc w:val="left"/>
     </w:lvl>
-    <w:lvl w:ilvl="5" w:tplc="5C6C1D46">
+    <w:lvl w:ilvl="5" w:tplc="CB8C405A">
       <w:numFmt w:val="decimal"/>
       <w:lvlText w:val=""/>
       <w:lvlJc w:val="left"/>
     </w:lvl>
-    <w:lvl w:ilvl="6" w:tplc="89224A50">
+    <w:lvl w:ilvl="6" w:tplc="28941E96">
       <w:numFmt w:val="decimal"/>
       <w:lvlText w:val=""/>
       <w:lvlJc w:val="left"/>
     </w:lvl>
-    <w:lvl w:ilvl="7" w:tplc="6B0E7A40">
+    <w:lvl w:ilvl="7" w:tplc="EA9A9D78">
       <w:numFmt w:val="decimal"/>
       <w:lvlText w:val=""/>
       <w:lvlJc w:val="left"/>
     </w:lvl>
-    <w:lvl w:ilvl="8" w:tplc="7A32685E">
+    <w:lvl w:ilvl="8" w:tplc="9CC6F454">
       <w:numFmt w:val="decimal"/>
       <w:lvlText w:val=""/>
       <w:lvlJc w:val="left"/>
     </w:lvl>
   </w:abstractNum>
-  <w:abstractNum w:abstractNumId="14" w15:restartNumberingAfterBreak="0">
-    <w:nsid w:val="78F80E4D"/>
+  <w:abstractNum w:abstractNumId="9" w15:restartNumberingAfterBreak="0">
+    <w:nsid w:val="50173918"/>
     <w:multiLevelType w:val="hybridMultilevel"/>
-    <w:tmpl w:val="BF2EC434"/>
-    <w:lvl w:ilvl="0" w:tplc="80B8ADF0">
+    <w:tmpl w:val="FCA26BCE"/>
+    <w:lvl w:ilvl="0" w:tplc="3AD2D38E">
       <w:start w:val="1"/>
       <w:numFmt w:val="decimal"/>
       <w:lvlText w:val="%1."/>
@@ -51880,7 +51590,7 @@
         <w:ind w:left="360" w:hanging="300"/>
       </w:pPr>
     </w:lvl>
-    <w:lvl w:ilvl="1" w:tplc="5468B2C4" w:tentative="1">
+    <w:lvl w:ilvl="1" w:tplc="6F94D85C" w:tentative="1">
       <w:start w:val="1"/>
       <w:numFmt w:val="lowerLetter"/>
       <w:lvlText w:val="%2."/>
@@ -51889,128 +51599,418 @@
         <w:ind w:left="720" w:hanging="300"/>
       </w:pPr>
     </w:lvl>
-    <w:lvl w:ilvl="2" w:tplc="BEBEFDDE">
+    <w:lvl w:ilvl="2" w:tplc="C1CC698C">
       <w:numFmt w:val="decimal"/>
       <w:lvlText w:val=""/>
       <w:lvlJc w:val="left"/>
     </w:lvl>
-    <w:lvl w:ilvl="3" w:tplc="ED2099B2">
+    <w:lvl w:ilvl="3" w:tplc="9710D7DA">
       <w:numFmt w:val="decimal"/>
       <w:lvlText w:val=""/>
       <w:lvlJc w:val="left"/>
     </w:lvl>
-    <w:lvl w:ilvl="4" w:tplc="B9600862">
+    <w:lvl w:ilvl="4" w:tplc="4FC6E844">
       <w:numFmt w:val="decimal"/>
       <w:lvlText w:val=""/>
       <w:lvlJc w:val="left"/>
     </w:lvl>
-    <w:lvl w:ilvl="5" w:tplc="EBA47730">
+    <w:lvl w:ilvl="5" w:tplc="2A02183C">
       <w:numFmt w:val="decimal"/>
       <w:lvlText w:val=""/>
       <w:lvlJc w:val="left"/>
     </w:lvl>
-    <w:lvl w:ilvl="6" w:tplc="CF3CD68C">
+    <w:lvl w:ilvl="6" w:tplc="0BD093FA">
       <w:numFmt w:val="decimal"/>
       <w:lvlText w:val=""/>
       <w:lvlJc w:val="left"/>
     </w:lvl>
-    <w:lvl w:ilvl="7" w:tplc="49A474F2">
+    <w:lvl w:ilvl="7" w:tplc="5866C2BA">
       <w:numFmt w:val="decimal"/>
       <w:lvlText w:val=""/>
       <w:lvlJc w:val="left"/>
     </w:lvl>
-    <w:lvl w:ilvl="8" w:tplc="077A0E70">
+    <w:lvl w:ilvl="8" w:tplc="FE0CC172">
       <w:numFmt w:val="decimal"/>
       <w:lvlText w:val=""/>
       <w:lvlJc w:val="left"/>
     </w:lvl>
   </w:abstractNum>
-  <w:num w:numId="1" w16cid:durableId="219945585">
-    <w:abstractNumId w:val="7"/>
+  <w:abstractNum w:abstractNumId="10" w15:restartNumberingAfterBreak="0">
+    <w:nsid w:val="6FEA455A"/>
+    <w:multiLevelType w:val="hybridMultilevel"/>
+    <w:tmpl w:val="B88C698E"/>
+    <w:lvl w:ilvl="0" w:tplc="CF9C51A6">
+      <w:start w:val="1"/>
+      <w:numFmt w:val="decimal"/>
+      <w:lvlText w:val="%1."/>
+      <w:lvlJc w:val="left"/>
+      <w:pPr>
+        <w:ind w:left="360" w:hanging="300"/>
+      </w:pPr>
+    </w:lvl>
+    <w:lvl w:ilvl="1" w:tplc="B024E8D6" w:tentative="1">
+      <w:start w:val="1"/>
+      <w:numFmt w:val="lowerLetter"/>
+      <w:lvlText w:val="%2."/>
+      <w:lvlJc w:val="left"/>
+      <w:pPr>
+        <w:ind w:left="720" w:hanging="300"/>
+      </w:pPr>
+    </w:lvl>
+    <w:lvl w:ilvl="2" w:tplc="12C8D092">
+      <w:numFmt w:val="decimal"/>
+      <w:lvlText w:val=""/>
+      <w:lvlJc w:val="left"/>
+    </w:lvl>
+    <w:lvl w:ilvl="3" w:tplc="123AB3EC">
+      <w:numFmt w:val="decimal"/>
+      <w:lvlText w:val=""/>
+      <w:lvlJc w:val="left"/>
+    </w:lvl>
+    <w:lvl w:ilvl="4" w:tplc="E8F6B7A0">
+      <w:numFmt w:val="decimal"/>
+      <w:lvlText w:val=""/>
+      <w:lvlJc w:val="left"/>
+    </w:lvl>
+    <w:lvl w:ilvl="5" w:tplc="1B5A94FA">
+      <w:numFmt w:val="decimal"/>
+      <w:lvlText w:val=""/>
+      <w:lvlJc w:val="left"/>
+    </w:lvl>
+    <w:lvl w:ilvl="6" w:tplc="CCB60020">
+      <w:numFmt w:val="decimal"/>
+      <w:lvlText w:val=""/>
+      <w:lvlJc w:val="left"/>
+    </w:lvl>
+    <w:lvl w:ilvl="7" w:tplc="3F98FBCE">
+      <w:numFmt w:val="decimal"/>
+      <w:lvlText w:val=""/>
+      <w:lvlJc w:val="left"/>
+    </w:lvl>
+    <w:lvl w:ilvl="8" w:tplc="D0E8DC58">
+      <w:numFmt w:val="decimal"/>
+      <w:lvlText w:val=""/>
+      <w:lvlJc w:val="left"/>
+    </w:lvl>
+  </w:abstractNum>
+  <w:abstractNum w:abstractNumId="11" w15:restartNumberingAfterBreak="0">
+    <w:nsid w:val="717A2D14"/>
+    <w:multiLevelType w:val="hybridMultilevel"/>
+    <w:tmpl w:val="06B00342"/>
+    <w:lvl w:ilvl="0" w:tplc="7890CBF0">
+      <w:start w:val="1"/>
+      <w:numFmt w:val="decimal"/>
+      <w:lvlText w:val="%1."/>
+      <w:lvlJc w:val="left"/>
+      <w:pPr>
+        <w:ind w:left="360" w:hanging="300"/>
+      </w:pPr>
+    </w:lvl>
+    <w:lvl w:ilvl="1" w:tplc="697AD8F2" w:tentative="1">
+      <w:start w:val="1"/>
+      <w:numFmt w:val="lowerLetter"/>
+      <w:lvlText w:val="%2."/>
+      <w:lvlJc w:val="left"/>
+      <w:pPr>
+        <w:ind w:left="720" w:hanging="300"/>
+      </w:pPr>
+    </w:lvl>
+    <w:lvl w:ilvl="2" w:tplc="39BA272C">
+      <w:numFmt w:val="decimal"/>
+      <w:lvlText w:val=""/>
+      <w:lvlJc w:val="left"/>
+    </w:lvl>
+    <w:lvl w:ilvl="3" w:tplc="0C00D75A">
+      <w:numFmt w:val="decimal"/>
+      <w:lvlText w:val=""/>
+      <w:lvlJc w:val="left"/>
+    </w:lvl>
+    <w:lvl w:ilvl="4" w:tplc="445864C2">
+      <w:numFmt w:val="decimal"/>
+      <w:lvlText w:val=""/>
+      <w:lvlJc w:val="left"/>
+    </w:lvl>
+    <w:lvl w:ilvl="5" w:tplc="C722F0EC">
+      <w:numFmt w:val="decimal"/>
+      <w:lvlText w:val=""/>
+      <w:lvlJc w:val="left"/>
+    </w:lvl>
+    <w:lvl w:ilvl="6" w:tplc="4BE63DDA">
+      <w:numFmt w:val="decimal"/>
+      <w:lvlText w:val=""/>
+      <w:lvlJc w:val="left"/>
+    </w:lvl>
+    <w:lvl w:ilvl="7" w:tplc="686A1854">
+      <w:numFmt w:val="decimal"/>
+      <w:lvlText w:val=""/>
+      <w:lvlJc w:val="left"/>
+    </w:lvl>
+    <w:lvl w:ilvl="8" w:tplc="A4BEAA0A">
+      <w:numFmt w:val="decimal"/>
+      <w:lvlText w:val=""/>
+      <w:lvlJc w:val="left"/>
+    </w:lvl>
+  </w:abstractNum>
+  <w:abstractNum w:abstractNumId="12" w15:restartNumberingAfterBreak="0">
+    <w:nsid w:val="71B926A6"/>
+    <w:multiLevelType w:val="hybridMultilevel"/>
+    <w:tmpl w:val="B6F41BC0"/>
+    <w:lvl w:ilvl="0" w:tplc="EFE84D96">
+      <w:start w:val="1"/>
+      <w:numFmt w:val="decimal"/>
+      <w:lvlText w:val="%1."/>
+      <w:lvlJc w:val="left"/>
+      <w:pPr>
+        <w:ind w:left="360" w:hanging="300"/>
+      </w:pPr>
+    </w:lvl>
+    <w:lvl w:ilvl="1" w:tplc="FCACFE66" w:tentative="1">
+      <w:start w:val="1"/>
+      <w:numFmt w:val="lowerLetter"/>
+      <w:lvlText w:val="%2."/>
+      <w:lvlJc w:val="left"/>
+      <w:pPr>
+        <w:ind w:left="720" w:hanging="300"/>
+      </w:pPr>
+    </w:lvl>
+    <w:lvl w:ilvl="2" w:tplc="2364182A">
+      <w:numFmt w:val="decimal"/>
+      <w:lvlText w:val=""/>
+      <w:lvlJc w:val="left"/>
+    </w:lvl>
+    <w:lvl w:ilvl="3" w:tplc="67DE3EF0">
+      <w:numFmt w:val="decimal"/>
+      <w:lvlText w:val=""/>
+      <w:lvlJc w:val="left"/>
+    </w:lvl>
+    <w:lvl w:ilvl="4" w:tplc="F6E67578">
+      <w:numFmt w:val="decimal"/>
+      <w:lvlText w:val=""/>
+      <w:lvlJc w:val="left"/>
+    </w:lvl>
+    <w:lvl w:ilvl="5" w:tplc="19CE49A0">
+      <w:numFmt w:val="decimal"/>
+      <w:lvlText w:val=""/>
+      <w:lvlJc w:val="left"/>
+    </w:lvl>
+    <w:lvl w:ilvl="6" w:tplc="EBFA9B50">
+      <w:numFmt w:val="decimal"/>
+      <w:lvlText w:val=""/>
+      <w:lvlJc w:val="left"/>
+    </w:lvl>
+    <w:lvl w:ilvl="7" w:tplc="C44AD402">
+      <w:numFmt w:val="decimal"/>
+      <w:lvlText w:val=""/>
+      <w:lvlJc w:val="left"/>
+    </w:lvl>
+    <w:lvl w:ilvl="8" w:tplc="CD76D0C8">
+      <w:numFmt w:val="decimal"/>
+      <w:lvlText w:val=""/>
+      <w:lvlJc w:val="left"/>
+    </w:lvl>
+  </w:abstractNum>
+  <w:abstractNum w:abstractNumId="13" w15:restartNumberingAfterBreak="0">
+    <w:nsid w:val="757D17D4"/>
+    <w:multiLevelType w:val="hybridMultilevel"/>
+    <w:tmpl w:val="CAA2361C"/>
+    <w:lvl w:ilvl="0" w:tplc="42A2D12E">
+      <w:start w:val="1"/>
+      <w:numFmt w:val="decimal"/>
+      <w:lvlText w:val="%1."/>
+      <w:lvlJc w:val="left"/>
+      <w:pPr>
+        <w:ind w:left="360" w:hanging="300"/>
+      </w:pPr>
+    </w:lvl>
+    <w:lvl w:ilvl="1" w:tplc="9162D5B0" w:tentative="1">
+      <w:start w:val="1"/>
+      <w:numFmt w:val="lowerLetter"/>
+      <w:lvlText w:val="%2."/>
+      <w:lvlJc w:val="left"/>
+      <w:pPr>
+        <w:ind w:left="720" w:hanging="300"/>
+      </w:pPr>
+    </w:lvl>
+    <w:lvl w:ilvl="2" w:tplc="47EEE3E4">
+      <w:numFmt w:val="decimal"/>
+      <w:lvlText w:val=""/>
+      <w:lvlJc w:val="left"/>
+    </w:lvl>
+    <w:lvl w:ilvl="3" w:tplc="2F6C9C44">
+      <w:numFmt w:val="decimal"/>
+      <w:lvlText w:val=""/>
+      <w:lvlJc w:val="left"/>
+    </w:lvl>
+    <w:lvl w:ilvl="4" w:tplc="73502760">
+      <w:numFmt w:val="decimal"/>
+      <w:lvlText w:val=""/>
+      <w:lvlJc w:val="left"/>
+    </w:lvl>
+    <w:lvl w:ilvl="5" w:tplc="10BE9638">
+      <w:numFmt w:val="decimal"/>
+      <w:lvlText w:val=""/>
+      <w:lvlJc w:val="left"/>
+    </w:lvl>
+    <w:lvl w:ilvl="6" w:tplc="58C27070">
+      <w:numFmt w:val="decimal"/>
+      <w:lvlText w:val=""/>
+      <w:lvlJc w:val="left"/>
+    </w:lvl>
+    <w:lvl w:ilvl="7" w:tplc="100CE3EC">
+      <w:numFmt w:val="decimal"/>
+      <w:lvlText w:val=""/>
+      <w:lvlJc w:val="left"/>
+    </w:lvl>
+    <w:lvl w:ilvl="8" w:tplc="654EE278">
+      <w:numFmt w:val="decimal"/>
+      <w:lvlText w:val=""/>
+      <w:lvlJc w:val="left"/>
+    </w:lvl>
+  </w:abstractNum>
+  <w:abstractNum w:abstractNumId="14" w15:restartNumberingAfterBreak="0">
+    <w:nsid w:val="7E5B2B8A"/>
+    <w:multiLevelType w:val="hybridMultilevel"/>
+    <w:tmpl w:val="266A01E0"/>
+    <w:lvl w:ilvl="0" w:tplc="68865E38">
+      <w:start w:val="1"/>
+      <w:numFmt w:val="decimal"/>
+      <w:lvlText w:val="%1."/>
+      <w:lvlJc w:val="left"/>
+      <w:pPr>
+        <w:ind w:left="360" w:hanging="300"/>
+      </w:pPr>
+    </w:lvl>
+    <w:lvl w:ilvl="1" w:tplc="201408D2" w:tentative="1">
+      <w:start w:val="1"/>
+      <w:numFmt w:val="lowerLetter"/>
+      <w:lvlText w:val="%2."/>
+      <w:lvlJc w:val="left"/>
+      <w:pPr>
+        <w:ind w:left="720" w:hanging="300"/>
+      </w:pPr>
+    </w:lvl>
+    <w:lvl w:ilvl="2" w:tplc="B1F2027E">
+      <w:numFmt w:val="decimal"/>
+      <w:lvlText w:val=""/>
+      <w:lvlJc w:val="left"/>
+    </w:lvl>
+    <w:lvl w:ilvl="3" w:tplc="0B8EB63E">
+      <w:numFmt w:val="decimal"/>
+      <w:lvlText w:val=""/>
+      <w:lvlJc w:val="left"/>
+    </w:lvl>
+    <w:lvl w:ilvl="4" w:tplc="F85A294C">
+      <w:numFmt w:val="decimal"/>
+      <w:lvlText w:val=""/>
+      <w:lvlJc w:val="left"/>
+    </w:lvl>
+    <w:lvl w:ilvl="5" w:tplc="8D30D240">
+      <w:numFmt w:val="decimal"/>
+      <w:lvlText w:val=""/>
+      <w:lvlJc w:val="left"/>
+    </w:lvl>
+    <w:lvl w:ilvl="6" w:tplc="9BB291D8">
+      <w:numFmt w:val="decimal"/>
+      <w:lvlText w:val=""/>
+      <w:lvlJc w:val="left"/>
+    </w:lvl>
+    <w:lvl w:ilvl="7" w:tplc="A86EFDD6">
+      <w:numFmt w:val="decimal"/>
+      <w:lvlText w:val=""/>
+      <w:lvlJc w:val="left"/>
+    </w:lvl>
+    <w:lvl w:ilvl="8" w:tplc="AE2EBCE6">
+      <w:numFmt w:val="decimal"/>
+      <w:lvlText w:val=""/>
+      <w:lvlJc w:val="left"/>
+    </w:lvl>
+  </w:abstractNum>
+  <w:num w:numId="1" w16cid:durableId="1790933907">
+    <w:abstractNumId w:val="1"/>
     <w:lvlOverride w:ilvl="0">
       <w:startOverride w:val="1"/>
     </w:lvlOverride>
   </w:num>
-  <w:num w:numId="2" w16cid:durableId="232739464">
+  <w:num w:numId="2" w16cid:durableId="158929772">
+    <w:abstractNumId w:val="4"/>
+    <w:lvlOverride w:ilvl="0">
+      <w:startOverride w:val="1"/>
+    </w:lvlOverride>
+  </w:num>
+  <w:num w:numId="3" w16cid:durableId="1390419736">
+    <w:abstractNumId w:val="11"/>
+    <w:lvlOverride w:ilvl="0">
+      <w:startOverride w:val="1"/>
+    </w:lvlOverride>
+  </w:num>
+  <w:num w:numId="4" w16cid:durableId="1465809532">
+    <w:abstractNumId w:val="9"/>
+    <w:lvlOverride w:ilvl="0">
+      <w:startOverride w:val="1"/>
+    </w:lvlOverride>
+  </w:num>
+  <w:num w:numId="5" w16cid:durableId="104158296">
+    <w:abstractNumId w:val="3"/>
+    <w:lvlOverride w:ilvl="0">
+      <w:startOverride w:val="1"/>
+    </w:lvlOverride>
+  </w:num>
+  <w:num w:numId="6" w16cid:durableId="1797408343">
+    <w:abstractNumId w:val="2"/>
+    <w:lvlOverride w:ilvl="0">
+      <w:startOverride w:val="1"/>
+    </w:lvlOverride>
+  </w:num>
+  <w:num w:numId="7" w16cid:durableId="1485471350">
+    <w:abstractNumId w:val="14"/>
+    <w:lvlOverride w:ilvl="0">
+      <w:startOverride w:val="1"/>
+    </w:lvlOverride>
+  </w:num>
+  <w:num w:numId="8" w16cid:durableId="376588878">
+    <w:abstractNumId w:val="8"/>
+    <w:lvlOverride w:ilvl="0">
+      <w:startOverride w:val="1"/>
+    </w:lvlOverride>
+  </w:num>
+  <w:num w:numId="9" w16cid:durableId="1003122430">
+    <w:abstractNumId w:val="13"/>
+    <w:lvlOverride w:ilvl="0">
+      <w:startOverride w:val="1"/>
+    </w:lvlOverride>
+  </w:num>
+  <w:num w:numId="10" w16cid:durableId="326591804">
     <w:abstractNumId w:val="0"/>
     <w:lvlOverride w:ilvl="0">
       <w:startOverride w:val="1"/>
     </w:lvlOverride>
   </w:num>
-  <w:num w:numId="3" w16cid:durableId="871381808">
+  <w:num w:numId="11" w16cid:durableId="691418581">
+    <w:abstractNumId w:val="10"/>
+    <w:lvlOverride w:ilvl="0">
+      <w:startOverride w:val="1"/>
+    </w:lvlOverride>
+  </w:num>
+  <w:num w:numId="12" w16cid:durableId="1449545785">
+    <w:abstractNumId w:val="5"/>
+    <w:lvlOverride w:ilvl="0">
+      <w:startOverride w:val="1"/>
+    </w:lvlOverride>
+  </w:num>
+  <w:num w:numId="13" w16cid:durableId="2005622364">
+    <w:abstractNumId w:val="12"/>
+    <w:lvlOverride w:ilvl="0">
+      <w:startOverride w:val="1"/>
+    </w:lvlOverride>
+  </w:num>
+  <w:num w:numId="14" w16cid:durableId="556673348">
     <w:abstractNumId w:val="6"/>
     <w:lvlOverride w:ilvl="0">
       <w:startOverride w:val="1"/>
     </w:lvlOverride>
   </w:num>
-  <w:num w:numId="4" w16cid:durableId="214044019">
-    <w:abstractNumId w:val="12"/>
-    <w:lvlOverride w:ilvl="0">
-      <w:startOverride w:val="1"/>
-    </w:lvlOverride>
-  </w:num>
-  <w:num w:numId="5" w16cid:durableId="1181435389">
-    <w:abstractNumId w:val="2"/>
-    <w:lvlOverride w:ilvl="0">
-      <w:startOverride w:val="1"/>
-    </w:lvlOverride>
-  </w:num>
-  <w:num w:numId="6" w16cid:durableId="789516934">
-    <w:abstractNumId w:val="10"/>
-    <w:lvlOverride w:ilvl="0">
-      <w:startOverride w:val="1"/>
-    </w:lvlOverride>
-  </w:num>
-  <w:num w:numId="7" w16cid:durableId="727220106">
-    <w:abstractNumId w:val="11"/>
-    <w:lvlOverride w:ilvl="0">
-      <w:startOverride w:val="1"/>
-    </w:lvlOverride>
-  </w:num>
-  <w:num w:numId="8" w16cid:durableId="1246644908">
-    <w:abstractNumId w:val="3"/>
-    <w:lvlOverride w:ilvl="0">
-      <w:startOverride w:val="1"/>
-    </w:lvlOverride>
-  </w:num>
-  <w:num w:numId="9" w16cid:durableId="581066520">
-    <w:abstractNumId w:val="13"/>
-    <w:lvlOverride w:ilvl="0">
-      <w:startOverride w:val="1"/>
-    </w:lvlOverride>
-  </w:num>
-  <w:num w:numId="10" w16cid:durableId="339159573">
-    <w:abstractNumId w:val="5"/>
-    <w:lvlOverride w:ilvl="0">
-      <w:startOverride w:val="1"/>
-    </w:lvlOverride>
-  </w:num>
-  <w:num w:numId="11" w16cid:durableId="653292488">
-    <w:abstractNumId w:val="14"/>
-    <w:lvlOverride w:ilvl="0">
-      <w:startOverride w:val="1"/>
-    </w:lvlOverride>
-  </w:num>
-  <w:num w:numId="12" w16cid:durableId="1308557965">
-    <w:abstractNumId w:val="4"/>
-    <w:lvlOverride w:ilvl="0">
-      <w:startOverride w:val="1"/>
-    </w:lvlOverride>
-  </w:num>
-  <w:num w:numId="13" w16cid:durableId="325473193">
-    <w:abstractNumId w:val="8"/>
-    <w:lvlOverride w:ilvl="0">
-      <w:startOverride w:val="1"/>
-    </w:lvlOverride>
-  </w:num>
-  <w:num w:numId="14" w16cid:durableId="1370455423">
-    <w:abstractNumId w:val="1"/>
-    <w:lvlOverride w:ilvl="0">
-      <w:startOverride w:val="1"/>
-    </w:lvlOverride>
-  </w:num>
-  <w:num w:numId="15" w16cid:durableId="994917867">
-    <w:abstractNumId w:val="9"/>
+  <w:num w:numId="15" w16cid:durableId="1652713469">
+    <w:abstractNumId w:val="7"/>
     <w:lvlOverride w:ilvl="0">
       <w:startOverride w:val="1"/>
     </w:lvlOverride>
@@ -52690,7 +52690,7 @@
     <w:autoRedefine/>
     <w:uiPriority w:val="39"/>
     <w:unhideWhenUsed/>
-    <w:rsid w:val="007D0DEA"/>
+    <w:rsid w:val="0018093E"/>
     <w:pPr>
       <w:spacing w:after="100"/>
     </w:pPr>
@@ -52702,7 +52702,7 @@
     <w:autoRedefine/>
     <w:uiPriority w:val="39"/>
     <w:unhideWhenUsed/>
-    <w:rsid w:val="007D0DEA"/>
+    <w:rsid w:val="0018093E"/>
     <w:pPr>
       <w:spacing w:after="100"/>
       <w:ind w:left="210"/>

</xml_diff>